<commit_message>
Strengthen Submission 2 interpretation and evidence traceability
</commit_message>
<xml_diff>
--- a/paper/Jawe_OPG_nonreceipt_KZN.docx
+++ b/paper/Jawe_OPG_nonreceipt_KZN.docx
@@ -53,7 +53,7 @@
           <w:sz w:val="18"/>
           <w:szCs w:val="18"/>
         </w:rPr>
-        <w:t xml:space="preserve">ICT Honours (21634436), PRIC401</w:t>
+        <w:t xml:space="preserve">ICT Honours (21634436), APRE402</w:t>
       </w:r>
     </w:p>
     <w:p>
@@ -1195,7 +1195,7 @@
           <w:sz w:val="20"/>
           <w:szCs w:val="20"/>
         </w:rPr>
-        <w:t xml:space="preserve">Table II connects five source predictors to the literature without assuming association directions. Schooling does not measure OPG awareness; office distance does not record an application journey; sex does not measure discrimination. Applications, documents, travel expenditure, waiting, stigma and stress are unmeasured, preventing identification of administrative-burden mechanisms.</w:t>
+        <w:t xml:space="preserve">Table II connects five source predictors to access concepts without assuming association directions. These proxies do not record the experience of applying for OPG: schooling does not measure awareness, office distance does not record a journey, and sex does not measure discrimination. Applications, documents, travel expenditure, waiting, stigma and stress remain unmeasured. Constructs motivate proxies; fitted associations cannot identify the proposed burden mechanisms.</w:t>
       </w:r>
     </w:p>
     <w:p>
@@ -5853,7 +5853,7 @@
           <w:sz w:val="20"/>
           <w:szCs w:val="20"/>
         </w:rPr>
-        <w:t xml:space="preserve">Non-recipients are younger on the unweighted mean, more often men, more educated and more often urban formal residents in this selected cohort. Weighted mean ages are closer than unweighted means. These comparisons can reflect resources and selection into the observable denominator, rather than a measured access mechanism. They do not establish that changing a characteristic would change receipt.</w:t>
+        <w:t xml:space="preserve">Non-recipients are younger on the unweighted mean, more often men, more educated and more often urban formal residents in this selected cohort. Weighted mean ages are closer than unweighted means.</w:t>
       </w:r>
     </w:p>
     <w:p>
@@ -5895,7 +5895,7 @@
           <w:sz w:val="20"/>
           <w:szCs w:val="20"/>
         </w:rPr>
-        <w:t xml:space="preserve">Table VI covers all screening assumptions, grouping only scenarios with identical results. Relative to primary, S1b/S1d add two people and two events. S2a, S2b, S2c and S2d add 59/4, 60/2, 8/0 and 68/2 people/events respectively. S3 adds 19 people and 15 events; S4b removes six people without removing events. Weighted prevalence ranges from 7.12% to 9.06%, with grant compatibility producing the largest change. Comparable AUC does not imply unchanged populations or probability error.</w:t>
+        <w:t xml:space="preserve">Table VI covers all screening assumptions, grouping only scenarios with identical results. Relative to primary, S1b/S1d add two people and two events. S2a, S2b, S2c and S2d add 59/4, 60/2, 8/0 and 68/2 people/events respectively. S3 adds 19 people and 15 events; S4b removes six people without removing events. Weighted prevalence ranges from 7.12% to 9.06%.</w:t>
       </w:r>
     </w:p>
     <w:p>
@@ -8945,7 +8945,7 @@
           <w:sz w:val="20"/>
           <w:szCs w:val="20"/>
         </w:rPr>
-        <w:t xml:space="preserve">Table VII reports primary held-out performance and fixed-prediction uncertainty. All five retained folds converge. Figure 4 shows quantile calibration: the highest bin has mean prediction 0.188 and 35/203 events (17.2%); the lowest has mean prediction 0.0107 and 3/206 events (1.5%). Most adults in even the highest bin report receipt.</w:t>
+        <w:t xml:space="preserve">Table VII reports primary held-out performance and fixed-prediction uncertainty. All five retained folds converge. Figure 4 shows quantile calibration: the highest bin has mean prediction 0.188 and 35/203 events (17.2%); the lowest has mean prediction 0.0107 and 3/206 events (1.5%).</w:t>
       </w:r>
     </w:p>
     <w:p>
@@ -9780,20 +9780,6 @@
           <w:szCs w:val="16"/>
         </w:rPr>
         <w:t xml:space="preserve">Pooled unweighted OOF predictions: 1,013 people, 67 events. Intervals are percentile bounds from 1,000 household resamples of fixed predictions; all reported intervals have zero invalid resamples. Models and imputation are not refitted. The intercept-only reference uses training-fold prevalence. Dashes indicate unavailable metrics/intervals in the frozen output, rather than zero or asserted chance performance.</w:t>
-      </w:r>
-    </w:p>
-    <w:p>
-      <w:pPr>
-        <w:spacing w:after="80" w:before="0" w:line="230"/>
-        <w:jc w:val="both"/>
-      </w:pPr>
-      <w:r>
-        <w:rPr>
-          <w:rFonts w:ascii="Times New Roman" w:cs="Times New Roman" w:eastAsia="Times New Roman" w:hAnsi="Times New Roman"/>
-          <w:sz w:val="20"/>
-          <w:szCs w:val="20"/>
-        </w:rPr>
-        <w:t xml:space="preserve">Average precision exceeds cohort prevalence, but Brier improvement is small and the slope interval includes 1 and substantially lower values. Household grouping prevents training on co-residents [19]; fixed-prediction resampling does not repeat model development.</w:t>
       </w:r>
     </w:p>
     <w:p>
@@ -11713,7 +11699,7 @@
           <w:sz w:val="20"/>
           <w:szCs w:val="20"/>
         </w:rPr>
-        <w:t xml:space="preserve">Across screen, model and validation sensitivities AUC ranges from 0.736 to 0.763. Brier scores and calibration slopes vary with event prevalence and evaluation basis. Neither sensitivity analysis nor internal partitioning supplies external validation.</w:t>
+        <w:t xml:space="preserve">Across screen, model and validation sensitivities AUC ranges from 0.736 to 0.763; Brier scores and calibration slopes also vary.</w:t>
       </w:r>
     </w:p>
     <w:p>
@@ -12780,7 +12766,21 @@
           <w:sz w:val="20"/>
           <w:szCs w:val="20"/>
         </w:rPr>
-        <w:t xml:space="preserve">Receipt is usual within these rules, but the denominator matters: 187 unresolved adults exceed 67 non-recipients. The estimate concerns adults whose resources, partnerships and answers can be resolved, rather than everyone legally entitled. Partnership alternatives change headcounts more than prevalence; retaining disability-grant recipients changes weighted prevalence more than threshold alternatives. Sensitivities expose this dependence. High receipt cannot demonstrate low administrative burden because recipients may also face costs [6], [13], [14]. The approximate interval omits strata; unresolved screening is a separate uncertainty.</w:t>
+        <w:t xml:space="preserve">RQ1 estimates reported non-receipt among apparently eligible, screen-PASS adults with resolved receipt in historical KwaZulu-Natal LCS: 67/1,013, or 6.61% unweighted and 7.49% person-weighted. It does not estimate unlawful denial or non-receipt among all legally entitled adults. The 187 unresolved adults exceed the 67 observed events; their exclusion changes the estimand, independently of sampling uncertainty. A stable point estimate under selected alternatives cannot establish what this unresolved group would report.</w:t>
+      </w:r>
+    </w:p>
+    <w:p>
+      <w:pPr>
+        <w:spacing w:after="80" w:before="0" w:line="230"/>
+        <w:jc w:val="both"/>
+      </w:pPr>
+      <w:r>
+        <w:rPr>
+          <w:rFonts w:ascii="Times New Roman" w:cs="Times New Roman" w:eastAsia="Times New Roman" w:hAnsi="Times New Roman"/>
+          <w:sz w:val="20"/>
+          <w:szCs w:val="20"/>
+        </w:rPr>
+        <w:t xml:space="preserve">Screen assumptions differ substantively. S2d adds 68 people but only two events, reducing weighted prevalence to 7.12%; partnership choices change the denominator more than the rate. S3 retains incompatible own-grant recipients, adds 19 people/15 events and raises prevalence to 9.06%, the largest tested shift. Similar AUC cannot establish equivalent populations or validate those screen choices. Ralston’s rural age-eligible person comparison [3] and Godfrey’s household-level grant analysis [4] use different units, programme scopes, screens and geography; their percentages are not directly comparable. The present study complements those receipt analyses with an explicit provincial resource-screen denominator. High receipt also coexists with access costs [13], [14]; it cannot demonstrate low administrative burden.</w:t>
       </w:r>
     </w:p>
     <w:p>
@@ -12822,7 +12822,7 @@
           <w:sz w:val="20"/>
           <w:szCs w:val="20"/>
         </w:rPr>
-        <w:t xml:space="preserve">The five domains provide moderate ranking information and a small improvement in probability error. Average precision must be interpreted beside the low event prevalence [16]. AUC alone would overstate how reliably a high score identifies a non-recipient. The slope interval is too wide for a strong claim about probability scaling with 67 events [17], [18]. Full-data odds ratios concentrate information in sex and schooling; the place/access terms are imprecise.</w:t>
+        <w:t xml:space="preserve">RQ2 provides four distinct assessments. AUC 0.752 describes pairwise ranking of held-out non-recipients against recipients, rather than classification accuracy. AP 0.203 summarises precision–recall ranking across thresholds relative to 6.61% event prevalence; it is not precision at an operational cutoff [16]. Brier improvement from 0.0618 to 0.0578 is an absolute reduction of approximately 0.0040 in squared probability error, a modest gain. Calibration-in-the-large is a recalibration intercept with the predicted logit as an offset (slope fixed at 1); its ideal value is zero. The estimate 0.020 and interval spanning zero do not establish perfect agreement. Slope 0.836 suggests possibly overly extreme predictions, but its 0.591–1.133 interval includes the ideal value 1 [17]. With 67 events, probability scaling and subgroup associations remain uncertain [18]; most adults even in the highest calibration bin report receipt.</w:t>
       </w:r>
     </w:p>
     <w:p>
@@ -12836,7 +12836,21 @@
           <w:sz w:val="20"/>
           <w:szCs w:val="20"/>
         </w:rPr>
-        <w:t xml:space="preserve">Schooling was a plausible information-resource proxy, yet lower schooling accompanies reported receipt in the screened cohort. It may mark fewer alternative resources after screening, or conditioning on the screen may alter associations. The survey cannot distinguish those explanations. Recorded schooling, distance and settlement do not directly test administrative-burden theory. No fitted coefficient determines legal eligibility or identifies why a person reports non-receipt. Weighting descriptions, weighting a sensitivity fit and weighting existing performance metrics answer different questions; their numerical differences do not demonstrate that one model is superior.</w:t>
+        <w:t xml:space="preserve">Table II separates theoretical constructs from observed proxies. Schooling motivates a possible learning-cost connection, while distance and settlement motivate compliance-cost hypotheses [13], [14]. Full-fit odds ratios, including the female and lower-schooling associations, describe the screened cohort; they are neither OOF effects nor estimates of burden. Lower schooling accompanies receipt, contrary to a simple information-barrier expectation. Fewer alternative resources among less-educated adults, or selection induced by screening, could explain that direction; neither hypothesis is tested here. Imprecise office/settlement associations cannot establish the presence or absence of compliance costs. Psychological costs have no direct measure. Without awareness, visits, document demands or administrative decisions, the model cannot identify why non-receipt occurs.</w:t>
+      </w:r>
+    </w:p>
+    <w:p>
+      <w:pPr>
+        <w:spacing w:after="80" w:before="0" w:line="230"/>
+        <w:jc w:val="both"/>
+      </w:pPr>
+      <w:r>
+        <w:rPr>
+          <w:rFonts w:ascii="Times New Roman" w:cs="Times New Roman" w:eastAsia="Times New Roman" w:hAnsi="Times New Roman"/>
+          <w:sz w:val="20"/>
+          <w:szCs w:val="20"/>
+        </w:rPr>
+        <w:t xml:space="preserve">Table VIII distinguishes sample, specification and evaluation changes. S7 excludes 21 people/four events (992/63); its lower Brier score concerns a different sample and cannot establish whether imputation is preferable. S8 replaces welfare access with marriage and gives similar performance. S9 uses frequency weights in fitting with unweighted evaluation, not a full survey-design model. S10 instead reweights the same primary OOF predictions, increasing Brier to 0.0641 without retraining. S11 changes fold grouping to derived PSU and gives similar performance. S8–S11 retain 1,013 people/67 events. These comparisons support a transparent internal benchmark; they do not establish model superiority or external validity [19], [20].</w:t>
       </w:r>
     </w:p>
     <w:p>
@@ -12878,7 +12892,21 @@
           <w:sz w:val="20"/>
           <w:szCs w:val="20"/>
         </w:rPr>
-        <w:t xml:space="preserve">The CLI and interface expose classifications, reasons and probabilities with provenance. Parity and repeated bytes support correctness/reproducibility; JSON reload agreement supports inference, while OOF evaluation supports internal prediction. Uploaded records may overlap training data. The owner walkthrough confirms the synthetic workflow, not participant usability or nontechnical clarity. RQ3 is supported for computational inspectability; human interpretation remains untested and the synthetic-data task protocol remains future work.</w:t>
+        <w:t xml:space="preserve">RQ3 has six verification layers: synthetic cases assess specified rule decisions; repeated bytes assess repeatability; UI–CLI agreement assesses software-path parity; JSON reload assesses inference serialization; the owner walkthrough assesses a functional synthetic workflow; participant testing would assess human usability. Table IX supports the first five within their tested conditions. Automated agreement cannot establish independent user ease, acceptance or field performance. Saved rule sources, run records and validation reports expose versions, checksums and tested conditions for inspection.</w:t>
+      </w:r>
+    </w:p>
+    <w:p>
+      <w:pPr>
+        <w:spacing w:after="80" w:before="0" w:line="230"/>
+        <w:jc w:val="both"/>
+      </w:pPr>
+      <w:r>
+        <w:rPr>
+          <w:rFonts w:ascii="Times New Roman" w:cs="Times New Roman" w:eastAsia="Times New Roman" w:hAnsi="Times New Roman"/>
+          <w:sz w:val="20"/>
+          <w:szCs w:val="20"/>
+        </w:rPr>
+        <w:t xml:space="preserve">Synthetic demonstration, schema checks, session-memory uploads and identifier-suppressed audit exports provide demonstrated controls. Historical OOF evaluation remains separate from frozen full-data app predictions; uploaded records may overlap training data. Serialization agreement therefore verifies inference, not new predictive accuracy. RQ3 is supported for computational inspectability; clarity to representative users remains untested, with the synthetic-data task protocol retained for future work.</w:t>
       </w:r>
     </w:p>
     <w:p>
@@ -12920,7 +12948,7 @@
           <w:sz w:val="20"/>
           <w:szCs w:val="20"/>
         </w:rPr>
-        <w:t xml:space="preserve">The target is a screened KwaZulu-Natal LCS 2014/2015 population. Provinces differ in settlement, access and administration; later periods differ in policy, thresholds, coverage and reporting. Administrative application, award and payment records measure different events from survey-reported receipt and introduce their own missingness/linkage errors. The historical upload schema restricts supported context, but passing validation does not establish suitability for contemporary applicants. No independent province, period or administrative sample has been evaluated. Transport requires a compatible outcome, justified target-context screening rules and independent discrimination/calibration assessment [19], [20]. Deploying software does not supply that evidence.</w:t>
+        <w:t xml:space="preserve">The target is a screened KwaZulu-Natal LCS 2014/2015 population. Provinces differ in settlement, access and administration; later periods differ in policy, thresholds, coverage and reporting. Administrative application, award and payment records measure different events from survey-reported receipt and introduce missingness/linkage errors. No independent province, period or administrative sample has been evaluated. Transfer requires comparable population and outcome definitions, justified target-period screening rules, and independent discrimination/calibration assessment [19], [20]. Passing the historical upload schema or deploying software does not establish suitability for contemporary applicants.</w:t>
       </w:r>
     </w:p>
     <w:p>
@@ -13018,7 +13046,7 @@
           <w:sz w:val="20"/>
           <w:szCs w:val="20"/>
         </w:rPr>
-        <w:t xml:space="preserve">Historical screened non-receipt is 6.6% unweighted and 7.5% person-weighted; alternatives yield 7.1%–9.1%. Grant compatibility matters more than the ceiling, and unresolved cases make the denominator central. Five domains/six slopes provide moderate internal ranking with a small probability-error improvement. Verified software reproduces and exposes screening, receipt and scores. Participant usability, causes, legal entitlement and performance elsewhere remain unestablished.</w:t>
+        <w:t xml:space="preserve">Historical screened non-receipt is 6.6% unweighted and 7.5% person-weighted; alternatives yield 7.1%–9.1%. Grant compatibility matters more than the ceiling, and unresolved cases make the denominator central. Five domains/six slopes give AUC 0.752, AP 0.203 and Brier 0.0578: moderate internal ranking with a small probability-error improvement. The software reproduces and exposes screening, receipt and scores within tested conditions. The contribution is an inspectable historical research benchmark. Participant usability, causes, legal entitlement and performance elsewhere remain unestablished.</w:t>
       </w:r>
     </w:p>
     <w:p>

</xml_diff>

<commit_message>
Rewrite the research paper in clear active language
</commit_message>
<xml_diff>
--- a/paper/Jawe_OPG_nonreceipt_KZN.docx
+++ b/paper/Jawe_OPG_nonreceipt_KZN.docx
@@ -89,7 +89,7 @@
           <w:sz w:val="18"/>
           <w:szCs w:val="18"/>
         </w:rPr>
-        <w:t xml:space="preserve">Abstract—Reported non-receipt of South Africa’s Older Person’s Grant (OPG) was examined among adults aged 60 or older in KwaZulu-Natal using the Living Conditions Survey 2014/2015. Administrative-burden theory motivates candidate predictors while distinguishing observable screening, reported receipt and prediction from legal entitlement. A documented screen identified 1,013 adults with resolved receipt, including 67 non-recipients: 6.6% unweighted and 7.5% person-weighted. Across screening alternatives the weighted rate ranged from 7.1% to 9.1%. A logistic model with five predictor domains and six slopes achieved household-held-out AUC 0.752, average precision 0.203 and Brier score 0.0578, compared with 0.0618 for an intercept-only reference. Correctness and reproducibility evidence includes 22 original synthetic screening cases, 220 automated tests, agreement on all 15,388 reference records, and 50 checks of synthetic report files from a Windows walkthrough. A local Streamlit interface exposes rules, reason codes, frozen scores and audited exports. Participant usability has not been evaluated. Neither the historical screen nor the model establishes statutory eligibility, causes of non-receipt or external validity.</w:t>
+        <w:t xml:space="preserve">Abstract—I studied South Africa’s Older Person’s Grant (OPG) and reported non-receipt (respondents say they receive no OPG). I used the Living Conditions Survey (LCS) 2014/2015 for adults aged 60 or older in KwaZulu-Natal (KZN). I used administrative-burden theory (learning about services, meeting requirements and dealing with officials can make access difficult) to choose predictors (survey characteristics used to estimate non-receipt). I used screening (checking survey answers against research rules) to identify apparently eligible adults (people who pass those checks). This cannot establish legal entitlement (a right to the grant under all its legal conditions). Among 1,013 adults who pass and give clear receipt answers, 67 report non-receipt: 6.6% unweighted (counting each person equally) and 7.5% person-weighted (allowing for how many people each respondent represents). Alternative screening rules give weighted rates of 7.1%–9.1%. Logistic regression (a model for two outcomes) uses five characteristics. I tested it on households I did not use to build it. AUC (area under the receiver operating characteristic curve; how well the model ranks non-recipients above recipients) is 0.752; average precision (AP; the share of true non-recipients in ranked selections, averaged as more are found) is 0.203. I obtained a Brier score (the average squared gap between predicted chances and recorded outcomes) of 0.0578. Predicting only the non-receipt rate of the group used to build the model gives 0.0618. Checks support reproducibility (repeated runs give the same results). App screens show rules, decisions, scores and reports. I have not tested how easily participants use it. These results do not establish entitlement, explain non-receipt, or show that the model works elsewhere.</w:t>
       </w:r>
     </w:p>
     <w:p>
@@ -159,7 +159,7 @@
           <w:sz w:val="20"/>
           <w:szCs w:val="20"/>
         </w:rPr>
-        <w:t xml:space="preserve">The Older Person’s Grant supports older adults and their households in South Africa. Research in KwaZulu-Natal describes its role in household livelihoods [1], while recent work examines protection during a crisis [2]. Receipt patterns and barriers to accessing grants are separate questions [3], [4]. A transparent survey screen can identify adults who appear to satisfy observable conditions and nevertheless report non-receipt, without establishing their legal entitlement.</w:t>
+        <w:t xml:space="preserve">The Older Person’s Grant (OPG) supports households [1], including during crises [2]. Other work examines receipt and access barriers [3], [4]. I ask who appears eligible but reports receiving no OPG.</w:t>
       </w:r>
     </w:p>
     <w:p>
@@ -173,7 +173,7 @@
           <w:sz w:val="20"/>
           <w:szCs w:val="20"/>
         </w:rPr>
-        <w:t xml:space="preserve">Age eligibility, resource eligibility and reported receipt are different states. A person reporting no OPG may have resources above the programme threshold, may not have applied, may await a decision, or may have incomplete survey information [5]. Income, marital circumstances and missing partner resources can therefore change who enters the apparently eligible denominator. The research problem is both substantive and measurement-related: an explicit population definition is needed before either a non-receipt percentage or a prediction can be interpreted.</w:t>
+        <w:t xml:space="preserve">I separate screening, reported receipt (a respondent’s grant answer) and legal entitlement. Passing my screen does not mean approval by the South African Social Security Agency [5]. Non-receipt can reflect high income, no application, a pending decision or incomplete information. I must define who passes before calculating a percentage; missing spouse income can change that group.</w:t>
       </w:r>
     </w:p>
     <w:p>
@@ -187,7 +187,21 @@
           <w:sz w:val="20"/>
           <w:szCs w:val="20"/>
         </w:rPr>
-        <w:t xml:space="preserve">The aim is to develop and evaluate an interpretable computational artefact for analysing reported OPG non-receipt among apparently eligible older adults in KwaZulu-Natal using LCS 2014/2015. The four objectives are to document the person-level cohort, describe non-receipt using person weights, internally validate a parsimonious probability model, and evaluate the artefact’s correctness, reproducibility and clarity. Three research questions organise the completed study. RQ1 asks what proportion of the screened population reports OPG non-receipt and how it changes under alternative eligibility assumptions. RQ2 asks how well a small logistic model distinguishes recipients from non-recipients and estimates probabilities in held-out households. RQ3 asks whether a computational artefact can reproduce the analysis and clearly explain screening decisions and model outputs. The contribution combines a versioned screen, survey-weighted description, internally validated prediction and a local research interface. “Apparently eligible” refers to observable research rules, rather than a South African Social Security Agency decision under the full legal test [5].</w:t>
+        <w:t xml:space="preserve">My aim is to develop and evaluate an interpretable research tool (software whose rules and results you can inspect) for analysing reported OPG non-receipt among apparently eligible older adults in KwaZulu-Natal using the Living Conditions Survey (LCS) 2014/2015. I set four objectives: document the people included, describe non-receipt using survey weights (how many people each respondent represents), test predictions on excluded households, and check correctness, reproducibility (whether repeated runs produce the same results) and clarity.</w:t>
+      </w:r>
+    </w:p>
+    <w:p>
+      <w:pPr>
+        <w:spacing w:after="80" w:before="0" w:line="230"/>
+        <w:jc w:val="both"/>
+      </w:pPr>
+      <w:r>
+        <w:rPr>
+          <w:rFonts w:ascii="Times New Roman" w:cs="Times New Roman" w:eastAsia="Times New Roman" w:hAnsi="Times New Roman"/>
+          <w:sz w:val="20"/>
+          <w:szCs w:val="20"/>
+        </w:rPr>
+        <w:t xml:space="preserve">Research questions (RQs) guide the study. RQ1 asks what proportion of screened adults reports non-receipt and how that proportion changes under different screening assumptions. RQ2 asks how well logistic regression separates recipients from non-recipients and estimates chances in excluded households. RQ3 asks whether the tool can repeat the analysis and clearly explain screening decisions and model results. I combine documented rules, weighted percentages, tested predictions and a local interface to answer them.</w:t>
       </w:r>
     </w:p>
     <w:p>
@@ -215,7 +229,7 @@
           <w:sz w:val="20"/>
           <w:szCs w:val="20"/>
         </w:rPr>
-        <w:t xml:space="preserve">II. Related Work and Conceptual Framework</w:t>
+        <w:t xml:space="preserve">II. Related Work and How I Chose Predictors</w:t>
       </w:r>
     </w:p>
     <w:p>
@@ -257,7 +271,7 @@
           <w:sz w:val="20"/>
           <w:szCs w:val="20"/>
         </w:rPr>
-        <w:t xml:space="preserve">The approved proposal reported a structured review with thematic narrative synthesis. Searches covered Scopus, Dimensions, IEEE Xplore, SABINET/African Journals Online, Google Scholar and Statistics South Africa/DataFirst resources, using social assistance, eligibility, take-up, non-receipt, exclusion and prediction concepts. Its reported selection was 511 records, 136 duplicates removed, 375 title/abstract screenings, 222 exclusions, 153 full-text assessments and 55 retained sources after 98 further exclusions. These are earlier reported counts, not a new search or 55 OPG-specific studies. Programme, setting, unit and outcome guided synthesis; heterogeneous access stages preclude a pooled estimate.</w:t>
+        <w:t xml:space="preserve">My proposal reported a structured literature review (a search using specified sources and selection steps). It searched Scopus, Dimensions, IEEE Xplore, SABINET/African Journals Online, Google Scholar and Statistics South Africa/DataFirst for grant, access, non-receipt and prediction research. It reported 511 records: 136 duplicates removed, 375 titles/abstracts screened, 222 excluded, 153 full texts assessed, 98 further exclusions and 55 retained sources. These are earlier reported counts, not a new search or 55 OPG studies. I compare grants, places, people/households and measured outcomes; they cannot supply one combined percentage.</w:t>
       </w:r>
     </w:p>
     <w:p>
@@ -271,7 +285,7 @@
           <w:sz w:val="20"/>
           <w:szCs w:val="20"/>
         </w:rPr>
-        <w:t xml:space="preserve">Table I distinguishes evidence by programme and analytical unit. Ralston’s age-eligible rural Agincourt adults [3] and Godfrey’s Msunduzi household proportions [4] differ from a resource-screened provincial person-level cohort. Livelihood/crisis studies explain OPG’s importance [1], [2], while other-grant studies distinguish contact, application, receipt and payment continuity [6], [7], [8].</w:t>
+        <w:t xml:space="preserve">Table I distinguishes individual receipt [3] from household proportions [4], and my provincial resource screen from both. Other-grant studies separate enquiry, application, receipt and uninterrupted payment [6], [7], [8].</w:t>
       </w:r>
     </w:p>
     <w:p>
@@ -394,7 +408,7 @@
                 <w:sz w:val="18"/>
                 <w:szCs w:val="18"/>
               </w:rPr>
-              <w:t xml:space="preserve">Programme/unit/outcome</w:t>
+              <w:t xml:space="preserve">Grant / people studied / measure</w:t>
             </w:r>
           </w:p>
         </w:tc>
@@ -564,7 +578,7 @@
                 <w:sz w:val="18"/>
                 <w:szCs w:val="18"/>
               </w:rPr>
-              <w:t xml:space="preserve">Person-level precedent; age eligibility and Agincourt setting differ from the provincial resource screen.</w:t>
+              <w:t xml:space="preserve">Selection by age in rural Agincourt differs from my resource screen.</w:t>
             </w:r>
           </w:p>
         </w:tc>
@@ -693,7 +707,7 @@
                 <w:sz w:val="18"/>
                 <w:szCs w:val="18"/>
               </w:rPr>
-              <w:t xml:space="preserve">Local context; household associations cannot be transferred directly to an individual outcome.</w:t>
+              <w:t xml:space="preserve">Local household findings cannot directly explain individual receipt.</w:t>
             </w:r>
           </w:p>
         </w:tc>
@@ -781,7 +795,7 @@
                 <w:sz w:val="18"/>
                 <w:szCs w:val="18"/>
               </w:rPr>
-              <w:t xml:space="preserve">CSG; enquiry/application and infant receipt</w:t>
+              <w:t xml:space="preserve">Child Support Grant (CSG); enquiry/application and infant receipt</w:t>
             </w:r>
           </w:p>
         </w:tc>
@@ -822,7 +836,7 @@
                 <w:sz w:val="18"/>
                 <w:szCs w:val="18"/>
               </w:rPr>
-              <w:t xml:space="preserve">Separate access stages; other grant and age groups do not estimate OPG non-receipt.</w:t>
+              <w:t xml:space="preserve">Separates access steps; cannot estimate OPG non-receipt.</w:t>
             </w:r>
           </w:p>
         </w:tc>
@@ -951,7 +965,7 @@
                 <w:sz w:val="18"/>
                 <w:szCs w:val="18"/>
               </w:rPr>
-              <w:t xml:space="preserve">Motivate burden mechanisms; receipt can coexist with costly access.</w:t>
+              <w:t xml:space="preserve">Receipt can still require costly effort.</w:t>
             </w:r>
           </w:p>
         </w:tc>
@@ -1039,7 +1053,7 @@
                 <w:sz w:val="18"/>
                 <w:szCs w:val="18"/>
               </w:rPr>
-              <w:t xml:space="preserve">Proxy targeting; resource measurement</w:t>
+              <w:t xml:space="preserve">Targeting assistance using survey measures; resources</w:t>
             </w:r>
           </w:p>
         </w:tc>
@@ -1080,7 +1094,7 @@
                 <w:sz w:val="18"/>
                 <w:szCs w:val="18"/>
               </w:rPr>
-              <w:t xml:space="preserve">Motivates sensitivity to income assumptions; Tanzania does not establish South African thresholds.</w:t>
+              <w:t xml:space="preserve">Supports checking income assumptions; cannot set South African legal limits.</w:t>
             </w:r>
           </w:p>
         </w:tc>
@@ -1097,7 +1111,7 @@
           <w:sz w:val="20"/>
           <w:szCs w:val="20"/>
         </w:rPr>
-        <w:t xml:space="preserve">Gazeaud’s measurement-error analysis motivates examining resource assumptions without quantifying LCS error or defining South African legal eligibility [11]. Mabala’s logistic analysis concerns a different grant and young applicants, illustrating why the population and event must be stated before comparing predictive findings [12]. The research gap is the integration of transparent screening, weighted description, grouped prediction and inspectable software for this historical KwaZulu-Natal cohort. It does not imply that OPG receipt or grant access has never been studied.</w:t>
+        <w:t xml:space="preserve">Gazeaud supports checking income assumptions [11], without quantifying LCS errors or defining South African eligibility. Mabala models another grant for younger applicants [12]; its findings cannot directly predict OPG receipt. My contribution combines an explicit screen, weighted description, testing on excluded households and inspectable software for this historical KwaZulu-Natal group.</w:t>
       </w:r>
     </w:p>
     <w:p>
@@ -1139,7 +1153,7 @@
           <w:sz w:val="20"/>
           <w:szCs w:val="20"/>
         </w:rPr>
-        <w:t xml:space="preserve">Administrative-burden theory distinguishes learning, compliance and psychological costs in citizen–state interactions [13]. South African grant studies describe documentation, repeated visits, interruptions and difficult encounters with administration [8], [9], [10], [14]. Child Support Grant research in KwaZulu-Natal and elsewhere motivates possible access mechanisms [6], [7]; it does not establish their prevalence or effects among older OPG applicants. Digital access conditions may introduce further constraints [15]. Receiving a grant can coexist with substantial access costs, so a low non-receipt rate does not demonstrate that burden is small.</w:t>
+        <w:t xml:space="preserve">Administrative-burden theory (an account of the effort and stress involved in accessing services) identifies learning costs (effort to find and understand information), compliance costs (effort to meet requirements) and psychological costs (stress, stigma or loss of dignity) [13]. Grant studies describe paperwork, repeated visits, interrupted payments and difficult encounters [8], [9], [10], [14]. Child Support Grant research suggests barriers [6], [7], without establishing their effects among older OPG applicants. Digital access can create difficulties [15]. Low non-receipt therefore does not show that access is easy.</w:t>
       </w:r>
     </w:p>
     <w:p>
@@ -1153,7 +1167,7 @@
           <w:sz w:val="20"/>
           <w:szCs w:val="20"/>
         </w:rPr>
-        <w:t xml:space="preserve">Statutory entitlement, observable eligibility, reported receipt and prediction remain distinct. LCS cannot establish full legal entitlement. The research screen applies observable age, resources, partnership and grant-compatibility rules; among PASS adults with resolved answers, non-receipt is Y = 1 and receipt Y = 0. Prediction concerns that reported outcome. Missing screen information and contradictory receipt answers remain unresolved. The screen therefore selects a population narrower than all older adults or applicants.</w:t>
+        <w:t xml:space="preserve">LCS does not record every legal condition or application experience. My screen checks age, resources, partnership and other-grant rules. I record PASS (the person meets the research conditions), FAIL (a known condition is not met) or UNRESOLVED (I lack enough information to decide). I then check receipt separately. Only adults who pass with clear receipt answers enter the prediction study. Unclear or contradictory answers stay unresolved.</w:t>
       </w:r>
     </w:p>
     <w:p>
@@ -1181,7 +1195,7 @@
           <w:sz w:val="20"/>
           <w:szCs w:val="20"/>
         </w:rPr>
-        <w:t xml:space="preserve">C. Translating concepts into predictors and an artefact</w:t>
+        <w:t xml:space="preserve">C. Connecting access concepts to predictors and the tool</w:t>
       </w:r>
     </w:p>
     <w:p>
@@ -1195,7 +1209,7 @@
           <w:sz w:val="20"/>
           <w:szCs w:val="20"/>
         </w:rPr>
-        <w:t xml:space="preserve">Table II connects five source predictors to access concepts without assuming association directions. These proxies do not record the experience of applying for OPG: schooling does not measure awareness, office distance does not record a journey, and sex does not measure discrimination. Applications, documents, travel expenditure, waiting, stigma and stress remain unmeasured. Constructs motivate proxies; fitted associations cannot identify the proposed burden mechanisms.</w:t>
+        <w:t xml:space="preserve">Table II links five predictors to possible barriers. They are proxies (indirect indicators), not direct measures of grant awareness, journeys or discrimination. LCS does not record application paperwork, travel spending, waiting, stigma or stress. Theory guides my choices; the model cannot prove that barriers caused non-receipt.</w:t>
       </w:r>
     </w:p>
     <w:p>
@@ -1209,7 +1223,7 @@
           <wp:inline distT="0" distB="0" distL="0" distR="0">
             <wp:extent cx="3200400" cy="3105150"/>
             <wp:effectExtent t="0" r="0" b="0" l="0"/>
-            <wp:docPr id="1" name="Fig. 1. Conceptual measurement framework. Theory motivates proxy selection; arrows denote measurement and research workflow, rather than estimated causal effects. Legal entitlement is incompletely observed." descr="Fig. 1. Conceptual measurement framework. Theory motivates proxy selection; arrows denote measurement and research workflow, rather than estimated causal effects. Legal entitlement is incompletely observed." title="Fig. 1. Conceptual measurement framework. Theory motivates proxy selection; arrows denote measurement and research workflow, rather than estimated causal effects. Legal entitlement is incompletely observed."/>
+            <wp:docPr id="1" name="Fig. 1. How theory guides the choice of survey measures. Arrows show measurement choices and research steps; they do not show proven causes. The survey does not record every condition of legal entitlement." descr="Fig. 1. How theory guides the choice of survey measures. Arrows show measurement choices and research steps; they do not show proven causes. The survey does not record every condition of legal entitlement." title="Fig. 1. How theory guides the choice of survey measures. Arrows show measurement choices and research steps; they do not show proven causes. The survey does not record every condition of legal entitlement."/>
             <wp:cNvGraphicFramePr>
               <a:graphicFrameLocks xmlns:a="http://schemas.openxmlformats.org/drawingml/2006/main" noChangeAspect="1"/>
             </wp:cNvGraphicFramePr>
@@ -1260,7 +1274,7 @@
           <w:sz w:val="16"/>
           <w:szCs w:val="16"/>
         </w:rPr>
-        <w:t xml:space="preserve">Fig. 1. Conceptual measurement framework. Theory motivates proxy selection; arrows denote measurement and research workflow, rather than estimated causal effects. Legal entitlement is incompletely observed.</w:t>
+        <w:t xml:space="preserve">Fig. 1. How theory guides the choice of survey measures. Arrows show measurement choices and research steps; they do not show proven causes. The survey does not record every condition of legal entitlement.</w:t>
       </w:r>
     </w:p>
     <w:p>
@@ -1279,7 +1293,7 @@
           <w:sz w:val="16"/>
           <w:szCs w:val="16"/>
         </w:rPr>
-        <w:t xml:space="preserve">Table II. Literature-informed predictors and their limits</w:t>
+        <w:t xml:space="preserve">Table II. Predictors suggested by the literature and their limits</w:t>
       </w:r>
     </w:p>
     <w:tbl>
@@ -1512,7 +1526,7 @@
                 <w:sz w:val="18"/>
                 <w:szCs w:val="18"/>
               </w:rPr>
-              <w:t xml:space="preserve">Demographic receipt patterns [3]</w:t>
+              <w:t xml:space="preserve">Receipt differs across age groups [3]</w:t>
             </w:r>
           </w:p>
         </w:tc>
@@ -1553,7 +1567,7 @@
                 <w:sz w:val="18"/>
                 <w:szCs w:val="18"/>
               </w:rPr>
-              <w:t xml:space="preserve">Per decade above 60; no health or application history.</w:t>
+              <w:t xml:space="preserve">Each decade above 60; does not record health or application history.</w:t>
             </w:r>
           </w:p>
         </w:tc>
@@ -1641,7 +1655,7 @@
                 <w:sz w:val="18"/>
                 <w:szCs w:val="18"/>
               </w:rPr>
-              <w:t xml:space="preserve">Demographic differences [3], [4]</w:t>
+              <w:t xml:space="preserve">Receipt differs by sex [3], [4]</w:t>
             </w:r>
           </w:p>
         </w:tc>
@@ -1682,7 +1696,7 @@
                 <w:sz w:val="18"/>
                 <w:szCs w:val="18"/>
               </w:rPr>
-              <w:t xml:space="preserve">Female vs male; no social-role or discrimination measure.</w:t>
+              <w:t xml:space="preserve">Female compared with male; does not measure social roles or discrimination.</w:t>
             </w:r>
           </w:p>
         </w:tc>
@@ -1770,7 +1784,7 @@
                 <w:sz w:val="18"/>
                 <w:szCs w:val="18"/>
               </w:rPr>
-              <w:t xml:space="preserve">Possible information resources [10], [13]</w:t>
+              <w:t xml:space="preserve">May help people find and understand information [10], [13]</w:t>
             </w:r>
           </w:p>
         </w:tc>
@@ -1811,7 +1825,7 @@
                 <w:sz w:val="18"/>
                 <w:szCs w:val="18"/>
               </w:rPr>
-              <w:t xml:space="preserve">Below Grade 7 vs higher; no awareness or literacy measure.</w:t>
+              <w:t xml:space="preserve">Below Grade 7 compared with Grade 7 or above; does not measure awareness or literacy.</w:t>
             </w:r>
           </w:p>
         </w:tc>
@@ -1899,7 +1913,7 @@
                 <w:sz w:val="18"/>
                 <w:szCs w:val="18"/>
               </w:rPr>
-              <w:t xml:space="preserve">Service and access context [6], [14], [15]</w:t>
+              <w:t xml:space="preserve">Where people live may affect service access [6], [14], [15]</w:t>
             </w:r>
           </w:p>
         </w:tc>
@@ -1940,7 +1954,7 @@
                 <w:sz w:val="18"/>
                 <w:szCs w:val="18"/>
               </w:rPr>
-              <w:t xml:space="preserve">Two contrasts vs urban formal; no office-capacity measure.</w:t>
+              <w:t xml:space="preserve">Two settlement comparisons with formal urban areas; does not measure office capacity.</w:t>
             </w:r>
           </w:p>
         </w:tc>
@@ -2028,7 +2042,7 @@
                 <w:sz w:val="18"/>
                 <w:szCs w:val="18"/>
               </w:rPr>
-              <w:t xml:space="preserve">Potential access effort [10], [14]</w:t>
+              <w:t xml:space="preserve">Reaching an office may require effort [10], [14]</w:t>
             </w:r>
           </w:p>
         </w:tc>
@@ -2069,7 +2083,7 @@
                 <w:sz w:val="18"/>
                 <w:szCs w:val="18"/>
               </w:rPr>
-              <w:t xml:space="preserve">At least 5 km/unavailable vs nearer; no visits or travel costs.</w:t>
+              <w:t xml:space="preserve">At least 5 km/unavailable compared with nearer; does not record visits or travel costs.</w:t>
             </w:r>
           </w:p>
         </w:tc>
@@ -2086,7 +2100,21 @@
           <w:sz w:val="20"/>
           <w:szCs w:val="20"/>
         </w:rPr>
-        <w:t xml:space="preserve">Figure 1 places the observable screen before the separate receipt outcome. Administrative-burden concepts motivate predictor selection, while the survey’s lack of mechanism measures limits causal interpretation. The artefact operationalises these distinctions through separate screen statuses, receipt categories and model probabilities. Person-weighted estimates address prevalence in the screened survey population; household-held-out predictions address internal predictive performance. Frozen application scores are a third output. A probability never changes screening or observed receipt. Correctness and reproducibility can be tested computationally; participant usability requires human evidence. At low event prevalence, precision and calibration must accompany ROC area [16], [17]. Sample size and grouped validation constrain interpretation [18], [19]. Prediction-reporting principles from TRIPOD inform transparent reporting rather than a claim of clinical-checklist compliance [20].</w:t>
+        <w:t xml:space="preserve">Figure 1 separates screening, receipt and prediction; you can inspect each in the tool. Weighted percentages describe the screened population. Testing on excluded households checks prediction within this survey. The app scores uploads using saved model settings. These scores are separate from test results and never change screening or receipt.</w:t>
+      </w:r>
+    </w:p>
+    <w:p>
+      <w:pPr>
+        <w:spacing w:after="80" w:before="0" w:line="230"/>
+        <w:jc w:val="both"/>
+      </w:pPr>
+      <w:r>
+        <w:rPr>
+          <w:rFonts w:ascii="Times New Roman" w:cs="Times New Roman" w:eastAsia="Times New Roman" w:hAnsi="Times New Roman"/>
+          <w:sz w:val="20"/>
+          <w:szCs w:val="20"/>
+        </w:rPr>
+        <w:t xml:space="preserve">With few non-recipients, I assess precision (the share of selected likely non-recipients who report non-receipt) and calibration (whether predicted chances match observed rates), alongside ranking [16], [17]. The number of people studied and testing on excluded households limit conclusions [18], [19]. I use TRIPOD (guidance for reporting prediction models) to explain my methods and results [20]. Software checks support correctness and repeatability; participant usability (how easily people understand and complete tasks) needs people to try the app.</w:t>
       </w:r>
     </w:p>
     <w:p>
@@ -2156,7 +2184,7 @@
           <w:sz w:val="20"/>
           <w:szCs w:val="20"/>
         </w:rPr>
-        <w:t xml:space="preserve">The person, household and person-income files of Statistics South Africa’s LCS 2014/2015 were interpreted using the released metadata, questionnaire and COICOP codes [21], [22], [23]. The frame is sampled KwaZulu-Natal residents aged 60 or older in completed years; the person is the analytical unit. Records were linked using survey person and household keys, with duplicate, unmatched and row-count checks. The household survey does not represent institutionalised older adults. Historical screening uses the interview month, not present-day thresholds. Age and sex underwent unflagged hot-deck imputation before release; affected records cannot be isolated. This release-level treatment is distinct from subsequent training-fold predictor imputation.</w:t>
+        <w:t xml:space="preserve">I linked the LCS 2014/2015 person, household and person-income files by survey identifiers, checking duplicates, unmatched records and row counts. I used the questionnaire, metadata (information describing the data) and COICOP (Classification of Individual Consumption According to Purpose, grouping items by purpose) codes [21], [22], [23]. I studied sampled KwaZulu-Natal residents aged 60 or older in completed years. The survey excludes older adults living in institutions. I applied rules for the interview month. Before releasing the data, Statistics South Africa used hot-deck imputation (filling a missing answer with another respondent's answer) for age and sex without marking the affected records. I cannot identify those records. I handle missing model predictors separately.</w:t>
       </w:r>
     </w:p>
     <w:p>
@@ -2170,7 +2198,7 @@
           <w:sz w:val="20"/>
           <w:szCs w:val="20"/>
         </w:rPr>
-        <w:t xml:space="preserve">Table III separates measurement roles. Aggregating income items before linkage avoids duplicate person rows. Household/spouse keys supply context rather than predictors. Receipt defines the outcome; weights define description. The upload contract preserves these boundaries: accepting a screening field does not make it a model predictor.</w:t>
+        <w:t xml:space="preserve">Table III shows each field's use. I summed income before linking files to avoid duplicating people.</w:t>
       </w:r>
     </w:p>
     <w:p>
@@ -2189,7 +2217,7 @@
           <w:sz w:val="16"/>
           <w:szCs w:val="16"/>
         </w:rPr>
-        <w:t xml:space="preserve">Table III. Data operationalisation and leakage boundaries</w:t>
+        <w:t xml:space="preserve">Table III. How each data field enters the analysis</w:t>
       </w:r>
     </w:p>
     <w:tbl>
@@ -2334,7 +2362,7 @@
                 <w:sz w:val="18"/>
                 <w:szCs w:val="18"/>
               </w:rPr>
-              <w:t xml:space="preserve">Analytical role and restriction</w:t>
+              <w:t xml:space="preserve">Use and restriction</w:t>
             </w:r>
           </w:p>
         </w:tc>
@@ -2381,7 +2409,7 @@
                 <w:sz w:val="18"/>
                 <w:szCs w:val="18"/>
               </w:rPr>
-              <w:t xml:space="preserve">Person/household keys</w:t>
+              <w:t xml:space="preserve">Person/household identifiers</w:t>
             </w:r>
           </w:p>
         </w:tc>
@@ -2422,7 +2450,7 @@
                 <w:sz w:val="18"/>
                 <w:szCs w:val="18"/>
               </w:rPr>
-              <w:t xml:space="preserve">Household and person identifiers</w:t>
+              <w:t xml:space="preserve">Household and person codes</w:t>
             </w:r>
           </w:p>
         </w:tc>
@@ -2463,7 +2491,7 @@
                 <w:sz w:val="18"/>
                 <w:szCs w:val="18"/>
               </w:rPr>
-              <w:t xml:space="preserve">Linkage, spouse context and folds; no model or public-report keys.</w:t>
+              <w:t xml:space="preserve">Link files, identify spouses and keep households together for model checks; excluded from model inputs and public reports.</w:t>
             </w:r>
           </w:p>
         </w:tc>
@@ -2592,7 +2620,7 @@
                 <w:sz w:val="18"/>
                 <w:szCs w:val="18"/>
               </w:rPr>
-              <w:t xml:space="preserve">Age-60+ KZN frame; age also supplies one slope.</w:t>
+              <w:t xml:space="preserve">Select KZN adults aged 60+; model also uses age.</w:t>
             </w:r>
           </w:p>
         </w:tc>
@@ -2680,7 +2708,7 @@
                 <w:sz w:val="18"/>
                 <w:szCs w:val="18"/>
               </w:rPr>
-              <w:t xml:space="preserve">Marital/resident-partner responses; spouse pointer</w:t>
+              <w:t xml:space="preserve">Marital/resident-partner answers; spouse identifier</w:t>
             </w:r>
           </w:p>
         </w:tc>
@@ -2721,7 +2749,7 @@
                 <w:sz w:val="18"/>
                 <w:szCs w:val="18"/>
               </w:rPr>
-              <w:t xml:space="preserve">Resource rule and spouse link; no primary marital slope.</w:t>
+              <w:t xml:space="preserve">Select resource rule and link spouses; excluded from primary model.</w:t>
             </w:r>
           </w:p>
         </w:tc>
@@ -2809,7 +2837,7 @@
                 <w:sz w:val="18"/>
                 <w:szCs w:val="18"/>
               </w:rPr>
-              <w:t xml:space="preserve">Annualised income items and source schedule</w:t>
+              <w:t xml:space="preserve">Yearly income items and source schedule</w:t>
             </w:r>
           </w:p>
         </w:tc>
@@ -2850,7 +2878,7 @@
                 <w:sz w:val="18"/>
                 <w:szCs w:val="18"/>
               </w:rPr>
-              <w:t xml:space="preserve">Private-resource proxy; screening only; no household allocation.</w:t>
+              <w:t xml:space="preserve">Screen using estimated private resources; no allocation of household income.</w:t>
             </w:r>
           </w:p>
         </w:tc>
@@ -2938,7 +2966,7 @@
                 <w:sz w:val="18"/>
                 <w:szCs w:val="18"/>
               </w:rPr>
-              <w:t xml:space="preserve">General grant/OPG items with skips</w:t>
+              <w:t xml:space="preserve">General grant/OPG answers and skipped questions</w:t>
             </w:r>
           </w:p>
         </w:tc>
@@ -2979,7 +3007,7 @@
                 <w:sz w:val="18"/>
                 <w:szCs w:val="18"/>
               </w:rPr>
-              <w:t xml:space="preserve">Outcome after PASS; receipt/derived labels are not predictors.</w:t>
+              <w:t xml:space="preserve">Define outcome after PASS; exclude receipt and derived labels from predictors.</w:t>
             </w:r>
           </w:p>
         </w:tc>
@@ -3067,7 +3095,7 @@
                 <w:sz w:val="18"/>
                 <w:szCs w:val="18"/>
               </w:rPr>
-              <w:t xml:space="preserve">Own grant items; preceding-year OPG income</w:t>
+              <w:t xml:space="preserve">Own grants; preceding-year OPG income</w:t>
             </w:r>
           </w:p>
         </w:tc>
@@ -3108,7 +3136,7 @@
                 <w:sz w:val="18"/>
                 <w:szCs w:val="18"/>
               </w:rPr>
-              <w:t xml:space="preserve">Compatibility/period checks; not predictors.</w:t>
+              <w:t xml:space="preserve">Check incompatible grants and reporting periods; excluded from predictors.</w:t>
             </w:r>
           </w:p>
         </w:tc>
@@ -3237,7 +3265,7 @@
                 <w:sz w:val="18"/>
                 <w:szCs w:val="18"/>
               </w:rPr>
-              <w:t xml:space="preserve">Primary features; fitted imputation stays within training.</w:t>
+              <w:t xml:space="preserve">Primary predictors; fill missing values using training data only.</w:t>
             </w:r>
           </w:p>
         </w:tc>
@@ -3325,7 +3353,7 @@
                 <w:sz w:val="18"/>
                 <w:szCs w:val="18"/>
               </w:rPr>
-              <w:t xml:space="preserve">Person weight; derived PSU</w:t>
+              <w:t xml:space="preserve">Person weight; derived survey group</w:t>
             </w:r>
           </w:p>
         </w:tc>
@@ -3366,7 +3394,7 @@
                 <w:sz w:val="18"/>
                 <w:szCs w:val="18"/>
               </w:rPr>
-              <w:t xml:space="preserve">Description/named sensitivities; no primary model features.</w:t>
+              <w:t xml:space="preserve">Describe population and test alternatives; excluded from primary predictors.</w:t>
             </w:r>
           </w:p>
         </w:tc>
@@ -3391,7 +3419,7 @@
           <w:sz w:val="16"/>
           <w:szCs w:val="16"/>
         </w:rPr>
-        <w:t xml:space="preserve">Survey measurements are interpreted using the released metadata, questionnaire and COICOP definitions [21], [22], [23]. Upload names are normalized representations of these concepts. Screening/outcome fields are not imputed using predictive preprocessing.</w:t>
+        <w:t xml:space="preserve">I use the released documentation [21], [22], [23]. Filling missing model predictors never changes screening fields or receipt answers.</w:t>
       </w:r>
     </w:p>
     <w:p>
@@ -3419,7 +3447,7 @@
           <w:sz w:val="20"/>
           <w:szCs w:val="20"/>
         </w:rPr>
-        <w:t xml:space="preserve">B. Final observable rules and receipt outcome</w:t>
+        <w:t xml:space="preserve">B. Final screening rules and receipt outcome</w:t>
       </w:r>
     </w:p>
     <w:p>
@@ -3433,7 +3461,7 @@
           <w:sz w:val="20"/>
           <w:szCs w:val="20"/>
         </w:rPr>
-        <w:t xml:space="preserve">The resource proxy sums nominal annualised person-attributable income, excluding social-assistance codes to avoid making grant receipt itself a resource disqualification. Household totals are not allocated to individuals. A missing income row represents zero only when the released income-source convention supports no listed source; unexplained absence remains unresolved. Asset acquisitions are not an assessable asset stock. The proxy does not observe the complete statutory asset test, deemed income or permitted deductions.</w:t>
+        <w:t xml:space="preserve">I estimated private resources by summing yearly income amounts at their reported values. I excluded social-assistance income (payments from government support grants) so receiving a grant would not cause a failure. I did not divide household totals among individuals. A missing income record means zero only when the source indicator confirms no reported income; otherwise, I leave it unresolved. Asset purchases do not show total asset holdings. The data cannot establish the full legal asset test, income assigned under legal rules, or permitted deductions.</w:t>
       </w:r>
     </w:p>
     <w:p>
@@ -3447,7 +3475,7 @@
           <w:sz w:val="20"/>
           <w:szCs w:val="20"/>
         </w:rPr>
-        <w:t xml:space="preserve">The income ceiling is the private annual resource level at which the grant formula still pays R100 monthly. From the April 2014 maximum it is R61,800 for a single person and R123,600 for a couple; from April 2015 it is R64,680 and R129,360 [24], [25]. The interview-month ceiling applies, and an amount exactly at it passes. These are formula-derived research ceilings, rather than an unqualified assertion that income alone establishes statutory eligibility. Alternative threshold and income definitions are reported separately.</w:t>
+        <w:t xml:space="preserve">I set the income ceiling (the largest yearly private-resource amount that passes the research rule) where the grant formula still pays R100 monthly. From April 2014, the ceilings are R61,800 for a single person and R123,600 for a couple; from April 2015, they are R64,680 and R129,360 [24], [25]. I included amounts exactly at the interview-month ceiling. These research limits do not establish legal eligibility. I tested alternative thresholds and income definitions.</w:t>
       </w:r>
     </w:p>
     <w:p>
@@ -3461,7 +3489,7 @@
           <w:sz w:val="20"/>
           <w:szCs w:val="20"/>
         </w:rPr>
-        <w:t xml:space="preserve">A married adult is screened using combined applicant and spouse resources only when a resident spouse can be linked and relationship checks pass. Never-married, widowed and divorced adults use the single ceiling. Living-together, separated, absent-spouse and unresolvable-link cases remain unresolved in the primary analysis. This conservative choice avoids assuming that unavailable partner resources are zero or that ambiguous partners are single; named sensitivities relax it. An own disability or war-veterans grant fails the primary compatibility rule. Caregiver child grants and grant-in-aid do not exclude an adult or define the OPG outcome. A known failure takes precedence over unresolved items while retaining every reason.</w:t>
+        <w:t xml:space="preserve">For married adults, I combined applicant and spouse resources only when I could link a resident spouse and confirm the relationship. Never-married, widowed and divorced adults use the single ceiling. Living-together, separated, absent-spouse and failed-link cases remain unresolved in the primary analysis. I did not assume that unknown partner resources equal zero or that an ambiguous partnership means single. Alternative analyses relax these choices. An adult's own disability or war-veterans grant causes a failure. Caregiver child grants and grant-in-aid (an extra grant for people who need full-time care) do not exclude the adult or define OPG receipt. A known failure takes priority over missing information; the software retains all reasons.</w:t>
       </w:r>
     </w:p>
     <w:p>
@@ -3475,7 +3503,7 @@
           <w:sz w:val="20"/>
           <w:szCs w:val="20"/>
         </w:rPr>
-        <w:t xml:space="preserve">Among adults who pass, the general social-grant and OPG questions are interpreted together with structural skips. A consistent “no grant” response may define non-receipt even when the OPG follow-up is not applicable. Contradictory or unexplained answers leave receipt unresolved and exclude that record from the model. Current reported receipt is compared with preceding-year OPG income; disagreement is flagged without changing the primary outcome, because the periods differ. Rule version opg-kzn-primary-v1 identifies these decisions. A passing screen with resolved receipt is the final denominator.</w:t>
+        <w:t xml:space="preserve">For adults who pass, I read general-grant and OPG answers together, including structural skips (questions omitted because earlier answers make them inapplicable). A consistent “no grant” answer can establish non-receipt when the OPG follow-up does not apply. Contradictory or unexplained answers remain unresolved, excluding the person from modelling. I compared current receipt with preceding-year OPG income, flagging disagreements without changing the outcome because the periods differ. Rule version opg-kzn-primary-v1 records these decisions. The final denominator (the group used to calculate the proportion) contains adults who pass and have a clear receipt answer.</w:t>
       </w:r>
     </w:p>
     <w:p>
@@ -3517,7 +3545,21 @@
           <w:sz w:val="20"/>
           <w:szCs w:val="20"/>
         </w:rPr>
-        <w:t xml:space="preserve">RQ1 reports both the count proportion and the released person-weighted ratio p = Σ(wᵢYᵢ)/Σwᵢ within the final denominator. Recipient/non-recipient comparisons are descriptive, without causal interpretation. Stratum identifiers were not released. A with-replacement variance approximation clusters on derived primary sampling units (PSUs); it is explicitly not a full survey-design interval. Unresolved screening cases remain a separate excluded group, rather than being imputed into that ratio. Bounds assigning unresolved PASS receipt to each outcome are reported as sensitivity checks.</w:t>
+        <w:t xml:space="preserve">For RQ1, I calculated both the ordinary count proportion and the person-weighted proportion: p = Σ(wᵢYᵢ)/Σwᵢ. Here, wᵢ is a person's weight, Yᵢ equals 1 for non-receipt and 0 for receipt, and Σ means add across people. Group comparisons describe differences; they do not establish causes.</w:t>
+      </w:r>
+    </w:p>
+    <w:p>
+      <w:pPr>
+        <w:spacing w:after="80" w:before="0" w:line="230"/>
+        <w:jc w:val="both"/>
+      </w:pPr>
+      <w:r>
+        <w:rPr>
+          <w:rFonts w:ascii="Times New Roman" w:cs="Times New Roman" w:eastAsia="Times New Roman" w:hAnsi="Times New Roman"/>
+          <w:sz w:val="20"/>
+          <w:szCs w:val="20"/>
+        </w:rPr>
+        <w:t xml:space="preserve">The released files lack strata (groups defined before sampling). I used derived primary sampling units, or PSUs (estimated groups selected before households in the survey sample), to estimate sampling uncertainty (variation between possible samples). The calculation allows a group to be sampled more than once. This cannot reproduce the complete survey design. Adults with unresolved screening information stay outside the proportion. I also tested receipt bounds (the lowest and highest rates if all unclear PASS receipt answers mean receipt or all mean non-receipt).</w:t>
       </w:r>
     </w:p>
     <w:p>
@@ -3545,7 +3587,7 @@
           <w:sz w:val="20"/>
           <w:szCs w:val="20"/>
         </w:rPr>
-        <w:t xml:space="preserve">D. Predictive specification and internal validation</w:t>
+        <w:t xml:space="preserve">D. How I checked predictions</w:t>
       </w:r>
     </w:p>
     <w:p>
@@ -3559,7 +3601,7 @@
           <w:sz w:val="20"/>
           <w:szCs w:val="20"/>
         </w:rPr>
-        <w:t xml:space="preserve">The primary estimator is unweighted logistic regression without class balancing, stepwise selection or a decision threshold. Its inspectable terms describe conditional associations within the screened cohort. Age is linear per decade above 60; reference levels are male, Grade 7 or above, urban formal and an office nearer than 5 km. Five domains supply six slopes plus an intercept because settlement contributes two contrasts. In the attempted seven-slope model, rural formal had one non-recipient and no training events in the fold holding that person out. Logged decision D-052 combined traditional and rural formal for event support, without asserting theoretical equivalence. Marital status defines screening; income, receipt, derived labels and marital status are not primary predictors.</w:t>
+        <w:t xml:space="preserve">I used the unweighted logistic model to estimate probability (a chance from zero to one) of reported non-receipt. I did not rebalance recipients and non-recipients, automatically select variables, or choose a cutoff (a probability used to classify records). The model describes associations (differences that occur together in the data) after accounting for its other predictors. Age enters per decade above 60. Comparison categories are male, Grade 7 or above, urban formal and an office nearer than 5 km. Five predictors need six slopes (numbers setting each input's contribution) and an intercept (the model's baseline), because settlement needs two comparisons.</w:t>
       </w:r>
     </w:p>
     <w:p>
@@ -3573,7 +3615,35 @@
           <w:sz w:val="20"/>
           <w:szCs w:val="20"/>
         </w:rPr>
-        <w:t xml:space="preserve">Five folds keep all members of a household together, stratifying households by whether any member reports non-receipt, with seed 201415. Predictor imputation uses training-fold statistics after structural skips are interpreted; eligibility and outcomes are never imputed. Each included adult receives one out-of-fold (OOF) probability from a model that did not train on their household. Pooled unweighted metrics are average precision, ROC area, Brier score, calibration-in-the-large and calibration slope. The intercept-only reference predicts each training fold’s event rate. Intervals resample households 1,000 times around fixed OOF predictions without refitting; they omit uncertainty from repeating model development.</w:t>
+        <w:t xml:space="preserve">Only one rural-formal adult reported non-receipt in the attempted seven-slope model. The training group (records used to learn the model settings) had no such case in that category when I excluded that person for testing. Decision D-052 combined rural formal with traditional settlement to support estimation, without claiming that these settings are equivalent. Marital status affects screening; income, receipt, derived labels and marital status do not enter the primary model.</w:t>
+      </w:r>
+    </w:p>
+    <w:p>
+      <w:pPr>
+        <w:spacing w:after="80" w:before="0" w:line="230"/>
+        <w:jc w:val="both"/>
+      </w:pPr>
+      <w:r>
+        <w:rPr>
+          <w:rFonts w:ascii="Times New Roman" w:cs="Times New Roman" w:eastAsia="Times New Roman" w:hAnsi="Times New Roman"/>
+          <w:sz w:val="20"/>
+          <w:szCs w:val="20"/>
+        </w:rPr>
+        <w:t xml:space="preserve">I made five folds (groups I took turns excluding when training). I kept households together and balanced the five folds by whether any member reported non-receipt. Seed 201415 (a setting that makes random splits repeatable) fixes this division. After interpreting skipped questions, I filled missing predictors using training-group statistics only. I never filled missing eligibility or outcome information. Each adult receives one out-of-fold, or OOF, probability (a prediction from a model trained without that adult's household).</w:t>
+      </w:r>
+    </w:p>
+    <w:p>
+      <w:pPr>
+        <w:spacing w:after="80" w:before="0" w:line="230"/>
+        <w:jc w:val="both"/>
+      </w:pPr>
+      <w:r>
+        <w:rPr>
+          <w:rFonts w:ascii="Times New Roman" w:cs="Times New Roman" w:eastAsia="Times New Roman" w:hAnsi="Times New Roman"/>
+          <w:sz w:val="20"/>
+          <w:szCs w:val="20"/>
+        </w:rPr>
+        <w:t xml:space="preserve">Precision (non-recipients among selected records) and recall (selected non-recipients among all non-recipients) vary across ranking cutoffs. I assessed average precision (precision averaged across increases in recall), AUC (how often the model ranks a non-recipient above a recipient), and Brier score (average squared probability error). I also checked calibration slope (whether predicted chances vary too much or too little; 1 is ideal) and calibration-in-the-large (the overall correction needed when I fix that slope at 1; zero is ideal). The intercept-only reference model (one without predictors) uses the training group's non-receipt rate. Bootstrap intervals (ranges from drawing repeated samples of the existing records) use 1,000 household samples and fixed OOF predictions. Without refitting, these intervals omit uncertainty from repeating model development.</w:t>
       </w:r>
     </w:p>
     <w:p>
@@ -3601,7 +3671,7 @@
           <w:sz w:val="20"/>
           <w:szCs w:val="20"/>
         </w:rPr>
-        <w:t xml:space="preserve">E. Sensitivity programme</w:t>
+        <w:t xml:space="preserve">E. Testing alternative assumptions</w:t>
       </w:r>
     </w:p>
     <w:p>
@@ -3615,7 +3685,7 @@
           <w:sz w:val="20"/>
           <w:szCs w:val="20"/>
         </w:rPr>
-        <w:t xml:space="preserve">S1 varies thresholds, S2 partnership assumptions, S3 grant compatibility, S4 income definition, S5 receipt period and S6 unresolved-receipt bounds. Each scenario records denominator, events, unweighted/person-weighted prevalence and internally validated model performance. S7 uses complete cases; S8 substitutes a married indicator for welfare access; S9 fits using person weights as frequency weights, retaining unweighted fold imputation and unweighted metrics. S9 is not a full survey-design regression. S10 applies person weights to primary OOF metrics without refitting. S11 groups folds by derived PSU. Primary results are preserved separately from sensitivity outputs.</w:t>
+        <w:t xml:space="preserve">S1 changes thresholds, S2 partnership assumptions, S3 rules about other grants, S4 income definition, S5 receipt period and S6 unresolved-receipt bounds. Each records the denominator, non-recipients, ordinary/person-weighted rates and internally validated model performance. S7 uses complete cases (people with all required predictors present). S8 replaces welfare access with a married indicator. S9 uses frequency weights (treating person weights as repeated-record contributions), keeping unweighted missing-value treatment and evaluation. This is not a full survey-design regression. S10 weights primary OOF measures without refitting. S11 groups validation folds by derived PSU. I keep these results separate from the primary analysis.</w:t>
       </w:r>
     </w:p>
     <w:p>
@@ -3643,7 +3713,7 @@
           <w:sz w:val="20"/>
           <w:szCs w:val="20"/>
         </w:rPr>
-        <w:t xml:space="preserve">IV. Computational Artefact and Evaluation</w:t>
+        <w:t xml:space="preserve">IV. Software and Evaluation</w:t>
       </w:r>
     </w:p>
     <w:p>
@@ -3657,7 +3727,7 @@
           <w:sz w:val="20"/>
           <w:szCs w:val="20"/>
         </w:rPr>
-        <w:t xml:space="preserve">The offline command, python analysis/run_study.py, links the three survey files, applies the screen, computes the weighted description and fits the grouped-validation model. Run records preserve rule/model settings, input/output checksums, software versions, seed and fold assignments. A separate build freezes full-cohort coefficients and fitted preprocessing in a non-executable JSON artifact, opg-kzn-six-slope-v1. This preserves the original scientific pipeline while supplying reusable inference.</w:t>
+        <w:t xml:space="preserve">The command python analysis/run_study.py links files, screens adults and calculates results. Run records retain settings, versions, seed, folds and checksums (file fingerprints used to detect changes). I saved coefficients (the model's numerical settings) from a model trained on all included adults in JSON (a text format for named data). Version opg-kzn-six-slope-v1 stores those and missing-value settings, without program code. Uploads never retrain it.</w:t>
       </w:r>
     </w:p>
     <w:p>
@@ -3671,7 +3741,7 @@
           <w:sz w:val="20"/>
           <w:szCs w:val="20"/>
         </w:rPr>
-        <w:t xml:space="preserve">The local Streamlit interface has five sections: study context, upload/validation, eligibility/receipt, prediction/model and export/reproducibility. It accepts the normalized historical opg-screen-v1 CSV, retaining household members needed for spouse context. Validation rejects incompatible schema/context, duplicate keys, invalid categories and malformed numeric values, with limits of 20 MiB and 50,000 rows. Uploads use session memory. Generated row labels replace submitted identifiers in displays and reports; raw income and household pointers are omitted. Filters affect inspected/exported subsets while summary proportions retain the full uploaded resolved-pass denominator.</w:t>
+        <w:t xml:space="preserve">The local Streamlit app (software for building browser-based applications) has five sections: study context, upload/validation, eligibility/receipt, prediction/model and export/reproducibility. It accepts the historical opg-screen-v1 CSV (comma-separated table), including household members needed to check spouse resources. It rejects incorrect schema (required columns and allowed values), study context, duplicate identifiers, categories and numeric values. Limits are 20 MiB (mebibytes, each 1,048,576 bytes) and 50,000 rows. Uploads stay in memory during the current session (your interaction with the running app). Reports show generated row labels and omit submitted identifiers, raw income and household links. You can filter views and exports; summaries still include all uploaded adults who pass with resolved receipt.</w:t>
       </w:r>
     </w:p>
     <w:p>
@@ -3685,7 +3755,7 @@
           <wp:inline distT="0" distB="0" distL="0" distR="0">
             <wp:extent cx="3200400" cy="2343150"/>
             <wp:effectExtent t="0" r="0" b="0" l="0"/>
-            <wp:docPr id="1" name="Fig. 2. Research and local-interface paths. The shared screen preserves measurement decisions; held-out evaluation and frozen full-data scoring remain separate." descr="Fig. 2. Research and local-interface paths. The shared screen preserves measurement decisions; held-out evaluation and frozen full-data scoring remain separate." title="Fig. 2. Research and local-interface paths. The shared screen preserves measurement decisions; held-out evaluation and frozen full-data scoring remain separate."/>
+            <wp:docPr id="1" name="Fig. 2. Research and app workflows. Both use the same screening rules. Predictions for held-out households (households excluded from training) remain separate from app scores calculated using the model trained on all included adults." descr="Fig. 2. Research and app workflows. Both use the same screening rules. Predictions for held-out households (households excluded from training) remain separate from app scores calculated using the model trained on all included adults." title="Fig. 2. Research and app workflows. Both use the same screening rules. Predictions for held-out households (households excluded from training) remain separate from app scores calculated using the model trained on all included adults."/>
             <wp:cNvGraphicFramePr>
               <a:graphicFrameLocks xmlns:a="http://schemas.openxmlformats.org/drawingml/2006/main" noChangeAspect="1"/>
             </wp:cNvGraphicFramePr>
@@ -3736,7 +3806,7 @@
           <w:sz w:val="16"/>
           <w:szCs w:val="16"/>
         </w:rPr>
-        <w:t xml:space="preserve">Fig. 2. Research and local-interface paths. The shared screen preserves measurement decisions; held-out evaluation and frozen full-data scoring remain separate.</w:t>
+        <w:t xml:space="preserve">Fig. 2. Research and app workflows. Both use the same screening rules. Predictions for held-out households (households excluded from training) remain separate from app scores calculated using the model trained on all included adults.</w:t>
       </w:r>
     </w:p>
     <w:p>
@@ -3750,7 +3820,7 @@
           <w:sz w:val="20"/>
           <w:szCs w:val="20"/>
         </w:rPr>
-        <w:t xml:space="preserve">The app reuses the original rule engine and loads frozen coefficients and preprocessing; uploads never trigger fitting. Only the supported resolved-pass cohort is scored. Partly missing predictors use frozen training statistics; a record with all categorical predictors absent remains unscored. Integrity checks bind model/evaluation files to scientific and feature code. Historical aggregate OOF evaluation is labelled separately from full-data fitted upload scores with unknown training overlap. CSV, JSON and report-ZIP exports include classifications, reasons, supported scores, versions and an audit manifest. The downloadable MVP package uses synthetic data and excludes raw survey files, historical respondent outputs and Git history.</w:t>
+        <w:t xml:space="preserve">The app reuses screening rules, coefficients and missing-value settings; uploads never retrain it. It scores only supported adults who pass with resolved receipt. Saved training statistics fill partly missing predictors; records missing every categorical predictor (an input with named groups) remain unscored. Integrity checks link model/evaluation files to the scientific and predictor code. The app separately labels historical OOF evaluation and uploaded scores from the model trained on all included adults; uploaded records may overlap its training data. CSV, JSON and ZIP (compressed file bundle) reports include classifications, reasons, supported probabilities, versions and an audit manifest (a record of settings and file checksums). The downloadable minimum viable product, or MVP (the working prototype), uses invented data and excludes raw survey files, historical respondent outputs and Git version history.</w:t>
       </w:r>
     </w:p>
     <w:p>
@@ -3764,7 +3834,7 @@
           <w:sz w:val="20"/>
           <w:szCs w:val="20"/>
         </w:rPr>
-        <w:t xml:space="preserve">Evaluation examines independently specified synthetic screening cases, forbidden predictors, data linkage and traceability; repeated research outputs; CLI/native-UI record parity; inference serialization; invalid-input and stale-state behaviour; and report bytes/hashes. The project owner’s Windows walkthrough provides local functional evidence. A task protocol for three to five consenting synthetic-data users exists, but no participant study has been conducted, so usability and user acceptance are not claimed.</w:t>
+        <w:t xml:space="preserve">I checked expected screening decisions, excluded predictors, links, repeated runs, reports and saved predictions. I compared the CLI (command-line interface, where you type commands) with the UI (user interface, the app screens), including invalid inputs and outdated results. My Windows walkthrough shows local functionality. A task sheet for three to five consenting people exists, but no participant study has taken place.</w:t>
       </w:r>
     </w:p>
     <w:p>
@@ -3820,7 +3890,7 @@
           <w:sz w:val="20"/>
           <w:szCs w:val="20"/>
         </w:rPr>
-        <w:t xml:space="preserve">A. Cohort and reported non-receipt</w:t>
+        <w:t xml:space="preserve">A. Who passed and reported non-receipt?</w:t>
       </w:r>
     </w:p>
     <w:p>
@@ -3834,7 +3904,7 @@
           <w:sz w:val="20"/>
           <w:szCs w:val="20"/>
         </w:rPr>
-        <w:t xml:space="preserve">The source contains 15,388 people in 3,686 KwaZulu-Natal households. Table IV records the final denominator. Among 117 failures, 93 exceed the income ceiling and 25 report an own disability grant, with one overlapping record; no war-veterans grant is reported. Among 187 unresolved adults, 105 are married, mostly with a non-resident spouse, and 63 are recorded as living together. The unresolved group exceeds the non-recipient group.</w:t>
+        <w:t xml:space="preserve">The survey records 15,388 people in 3,686 KwaZulu-Natal households. Table IV shows my selection. Among 117 failures, 93 exceed the income ceiling and 25 report a disability grant; one meets both conditions. None reports a war-veterans grant. Among 187 unresolved adults, 105 are married, mostly with a non-resident spouse, and 63 report living together. Unresolved adults outnumber non-recipients.</w:t>
       </w:r>
     </w:p>
     <w:p>
@@ -3853,7 +3923,7 @@
           <w:sz w:val="16"/>
           <w:szCs w:val="16"/>
         </w:rPr>
-        <w:t xml:space="preserve">Table IV. KwaZulu-Natal cohort flow</w:t>
+        <w:t xml:space="preserve">Table IV. How I selected the KwaZulu-Natal study group</w:t>
       </w:r>
     </w:p>
     <w:tbl>
@@ -4926,7 +4996,7 @@
           <w:sz w:val="16"/>
           <w:szCs w:val="16"/>
         </w:rPr>
-        <w:t xml:space="preserve">Household counts are distinct within each row and can overlap between rows.</w:t>
+        <w:t xml:space="preserve">Each row counts distinct households. A household can appear in several rows.</w:t>
       </w:r>
     </w:p>
     <w:p>
@@ -4940,7 +5010,7 @@
           <wp:inline distT="0" distB="0" distL="0" distR="0">
             <wp:extent cx="3200400" cy="2466975"/>
             <wp:effectExtent t="0" r="0" b="0" l="0"/>
-            <wp:docPr id="1" name="Fig. 3. Observed person-level cohort construction. FAIL and UNRESOLVED are retained outside the final denominator. All 1,013 PASS records have resolved receipt; the three screening groups are mutually exclusive." descr="Fig. 3. Observed person-level cohort construction. FAIL and UNRESOLVED are retained outside the final denominator. All 1,013 PASS records have resolved receipt; the three screening groups are mutually exclusive." title="Fig. 3. Observed person-level cohort construction. FAIL and UNRESOLVED are retained outside the final denominator. All 1,013 PASS records have resolved receipt; the three screening groups are mutually exclusive."/>
+            <wp:docPr id="1" name="Fig. 3. FAIL, UNRESOLVED and PASS groups do not overlap. All 1,013 PASS adults resolve receipt and enter the final denominator." descr="Fig. 3. FAIL, UNRESOLVED and PASS groups do not overlap. All 1,013 PASS adults resolve receipt and enter the final denominator." title="Fig. 3. FAIL, UNRESOLVED and PASS groups do not overlap. All 1,013 PASS adults resolve receipt and enter the final denominator."/>
             <wp:cNvGraphicFramePr>
               <a:graphicFrameLocks xmlns:a="http://schemas.openxmlformats.org/drawingml/2006/main" noChangeAspect="1"/>
             </wp:cNvGraphicFramePr>
@@ -4991,7 +5061,7 @@
           <w:sz w:val="16"/>
           <w:szCs w:val="16"/>
         </w:rPr>
-        <w:t xml:space="preserve">Fig. 3. Observed person-level cohort construction. FAIL and UNRESOLVED are retained outside the final denominator. All 1,013 PASS records have resolved receipt; the three screening groups are mutually exclusive.</w:t>
+        <w:t xml:space="preserve">Fig. 3. FAIL, UNRESOLVED and PASS groups do not overlap. All 1,013 PASS adults resolve receipt and enter the final denominator.</w:t>
       </w:r>
     </w:p>
     <w:p>
@@ -5005,7 +5075,7 @@
           <w:sz w:val="20"/>
           <w:szCs w:val="20"/>
         </w:rPr>
-        <w:t xml:space="preserve">Reported non-receipt is 67/1,013, or 6.61% unweighted and 7.49% person-weighted. The approximation using 345 derived PSUs has standard error 1.3 percentage points and approximate normal 95% interval 4.9%–10.0%. All 1,013 pass-group answers are resolved and agree with preceding-year OPG income; those checks therefore produce no change. Table V compares all five predictor domains before imputation. The descriptive weights change the composition of each receipt group; those percentages are distinct from within-cohort non-receipt prevalence and predictive probabilities.</w:t>
+        <w:t xml:space="preserve">Of these 1,013 adults, 67 report non-receipt: 6.61% without weights and 7.49% with person weights. Using 345 derived PSUs gives a standard error (the estimated sampling variation of the percentage) of 1.3 percentage points. A bell-shaped sampling approximation gives a 95% confidence interval (a range that aims to cover the population percentage in 95% of repeated samples) of 4.9%–10.0%. The missing strata limit this approximation. All 1,013 PASS answers agree with preceding-year OPG income, so those checks change nothing. Table V compares five predictors before filling missing values. Average age and percentages describe each receipt group. Its percentages describe receipt-group composition, not non-receipt rates or predictions.</w:t>
       </w:r>
     </w:p>
     <w:p>
@@ -5024,7 +5094,7 @@
           <w:sz w:val="16"/>
           <w:szCs w:val="16"/>
         </w:rPr>
-        <w:t xml:space="preserve">Table V. Characteristics by reported receipt</w:t>
+        <w:t xml:space="preserve">Table V. Characteristics by receipt (U = unweighted; W = person-weighted)</w:t>
       </w:r>
     </w:p>
     <w:tbl>
@@ -5216,7 +5286,7 @@
                 <w:sz w:val="18"/>
                 <w:szCs w:val="18"/>
               </w:rPr>
-              <w:t xml:space="preserve">Age, mean years</w:t>
+              <w:t xml:space="preserve">Age, average years</w:t>
             </w:r>
           </w:p>
         </w:tc>
@@ -5839,7 +5909,7 @@
           <w:sz w:val="16"/>
           <w:szCs w:val="16"/>
         </w:rPr>
-        <w:t xml:space="preserve">Recipients n = 946; non-recipients n = 67. U reports unweighted means, or counts and within-group percentages; W reports person-weighted means/percentages. Denominators retain missing predictors: schooling is unassigned for three recipients; welfare access is missing for 14 recipients/four non-recipients. These pre-imputation summaries are descriptive and have no inferential intervals.</w:t>
+        <w:t xml:space="preserve">Recipients: 946 people; non-recipients: 67 people. U gives unweighted averages, or counts and percentages within each group. W gives person-weighted averages/percentages. Denominators retain missing predictors: three recipients lack schooling; 14 recipients/four non-recipients lack welfare-access values. These summaries have no uncertainty intervals.</w:t>
       </w:r>
     </w:p>
     <w:p>
@@ -5853,7 +5923,7 @@
           <w:sz w:val="20"/>
           <w:szCs w:val="20"/>
         </w:rPr>
-        <w:t xml:space="preserve">Non-recipients are younger on the unweighted mean, more often men, more educated and more often urban formal residents in this selected cohort. Weighted mean ages are closer than unweighted means.</w:t>
+        <w:t xml:space="preserve">Non-recipients are younger before weighting, more often men, more educated and more often urban formal residents. Weights bring average ages closer.</w:t>
       </w:r>
     </w:p>
     <w:p>
@@ -5881,7 +5951,7 @@
           <w:sz w:val="20"/>
           <w:szCs w:val="20"/>
         </w:rPr>
-        <w:t xml:space="preserve">B. Screening sensitivities</w:t>
+        <w:t xml:space="preserve">B. What changes when I alter screening rules?</w:t>
       </w:r>
     </w:p>
     <w:p>
@@ -5895,7 +5965,7 @@
           <w:sz w:val="20"/>
           <w:szCs w:val="20"/>
         </w:rPr>
-        <w:t xml:space="preserve">Table VI covers all screening assumptions, grouping only scenarios with identical results. Relative to primary, S1b/S1d add two people and two events. S2a, S2b, S2c and S2d add 59/4, 60/2, 8/0 and 68/2 people/events respectively. S3 adds 19 people and 15 events; S4b removes six people without removing events. Weighted prevalence ranges from 7.12% to 9.06%.</w:t>
+        <w:t xml:space="preserve">Table VI shows sensitivity analyses (repeating the analysis after changing assumptions). Events (adults reporting non-receipt) and N (people included) identify each group. Unw. and Wtd. abbreviate unweighted and person-weighted. Slope means calibration slope in Tables VI and VIII. Compared with S0, S1b/S1d add two people/two events. S2a, S2b, S2c and S2d add 59/4, 60/2, 8/0 and 68/2 people/events. S3 adds 19 people/15 events; S4b removes six people but no events. Weighted non-receipt ranges from 7.12% to 9.06%.</w:t>
       </w:r>
     </w:p>
     <w:p>
@@ -5914,7 +5984,7 @@
           <w:sz w:val="16"/>
           <w:szCs w:val="16"/>
         </w:rPr>
-        <w:t xml:space="preserve">Table VI. Screen sensitivities and OOF performance</w:t>
+        <w:t xml:space="preserve">Table VI. Changed screening rules and OOF performance</w:t>
       </w:r>
     </w:p>
     <w:tbl>
@@ -8889,7 +8959,7 @@
           <w:sz w:val="16"/>
           <w:szCs w:val="16"/>
         </w:rPr>
-        <w:t xml:space="preserve">Events are reported non-recipients. Unw./Wtd. are unweighted/person-weighted prevalence; performance is unweighted. S1b: 2015 ceiling throughout; S1d: zero-payout ceiling. S2a: living-together treated as couple; S2b: living-together as single; S2c: separated as single; S2d: both as single. S3: retain own disability/war-veterans grants (no veterans added). S4b: retain social-assistance income.</w:t>
+        <w:t xml:space="preserve">Events are reported non-recipients. Unw./Wtd. give unweighted/person-weighted non-receipt rates; performance uses no weights. S1b applies the 2015 ceiling throughout; S1d uses the zero-payout ceiling (the resource level where the grant formula pays zero). S2a/S2b treat living-together adults as couples/single. S2c treats separated adults as single; S2d treats both as single. S3 retains disability/war-veterans grant recipients (it adds no veterans). S4b retains social-assistance income.</w:t>
       </w:r>
     </w:p>
     <w:p>
@@ -8903,7 +8973,7 @@
           <w:sz w:val="20"/>
           <w:szCs w:val="20"/>
         </w:rPr>
-        <w:t xml:space="preserve">*No-change scenarios are S1a (2014 ceiling throughout), S1c (age-75 supplement), S4a (CPI income with nominal ceiling), S4c (exclude UIF/similar transfers), S5 (preceding-year receipt) and S6a/S6b (receipt bounds). Each retains the primary denominator, events and metrics; there are no unresolved PASS outcomes to bound.</w:t>
+        <w:t xml:space="preserve">*S1a (2014 ceiling throughout), S1c (age-75 supplement), S4a (income adjusted for price changes, with the ceiling unchanged), S4c (excluding UIF, the Unemployment Insurance Fund, and similar transfers), S5 (preceding-year receipt) and S6a/S6b (receipt bounds) change nothing. Each keeps the denominator, events and measures. No PASS adult has unresolved receipt to bound.</w:t>
       </w:r>
     </w:p>
     <w:p>
@@ -8931,7 +9001,7 @@
           <w:sz w:val="20"/>
           <w:szCs w:val="20"/>
         </w:rPr>
-        <w:t xml:space="preserve">C. Held-out prediction and modelling sensitivities</w:t>
+        <w:t xml:space="preserve">C. How well do held-out predictions work?</w:t>
       </w:r>
     </w:p>
     <w:p>
@@ -8945,7 +9015,7 @@
           <w:sz w:val="20"/>
           <w:szCs w:val="20"/>
         </w:rPr>
-        <w:t xml:space="preserve">Table VII reports primary held-out performance and fixed-prediction uncertainty. All five retained folds converge. Figure 4 shows quantile calibration: the highest bin has mean prediction 0.188 and 35/203 events (17.2%); the lowest has mean prediction 0.0107 and 3/206 events (1.5%).</w:t>
+        <w:t xml:space="preserve">All five folds converge (reach a stable fit). Figure 4 uses five similarly sized bins (groups). The highest bin has average prediction 0.188 and 35/203 non-recipients (17.2%); the lowest has average 0.0107 and 3/206 non-recipients (1.5%).</w:t>
       </w:r>
     </w:p>
     <w:p>
@@ -9156,7 +9226,7 @@
                 <w:sz w:val="18"/>
                 <w:szCs w:val="18"/>
               </w:rPr>
-              <w:t xml:space="preserve">ROC area</w:t>
+              <w:t xml:space="preserve">AUC</w:t>
             </w:r>
           </w:p>
         </w:tc>
@@ -9779,7 +9849,7 @@
           <w:sz w:val="16"/>
           <w:szCs w:val="16"/>
         </w:rPr>
-        <w:t xml:space="preserve">Pooled unweighted OOF predictions: 1,013 people, 67 events. Intervals are percentile bounds from 1,000 household resamples of fixed predictions; all reported intervals have zero invalid resamples. Models and imputation are not refitted. The intercept-only reference uses training-fold prevalence. Dashes indicate unavailable metrics/intervals in the frozen output, rather than zero or asserted chance performance.</w:t>
+        <w:t xml:space="preserve">I pool unweighted OOF predictions: 1,013 people/67 events. The intervals use percentile bounds (the middle 95% of resampled estimates) from 1,000 household resamples of fixed predictions. All reported intervals have zero invalid resamples. I do not refit models or missing-value settings. The intercept-only reference uses the training group's non-receipt rate. Dashes mean unavailable measures/intervals, rather than zero or chance performance.</w:t>
       </w:r>
     </w:p>
     <w:p>
@@ -9793,7 +9863,7 @@
           <wp:inline distT="0" distB="0" distL="0" distR="0">
             <wp:extent cx="3200400" cy="2286000"/>
             <wp:effectExtent t="0" r="0" b="0" l="0"/>
-            <wp:docPr id="1" name="Fig. 4. Unweighted OOF calibration from frozen quantile-bin aggregates. Labels give events/people; the diagonal denotes exact calibration. The displayed range is 0–0.22." descr="Fig. 4. Unweighted OOF calibration from frozen quantile-bin aggregates. Labels give events/people; the diagonal denotes exact calibration. The displayed range is 0–0.22." title="Fig. 4. Unweighted OOF calibration from frozen quantile-bin aggregates. Labels give events/people; the diagonal denotes exact calibration. The displayed range is 0–0.22."/>
+            <wp:docPr id="1" name="Fig. 4. Saved group summaries show unweighted OOF calibration. Labels give events/people; the diagonal shows exact agreement between average predictions and observed rates. Plot range: 0–0.22." descr="Fig. 4. Saved group summaries show unweighted OOF calibration. Labels give events/people; the diagonal shows exact agreement between average predictions and observed rates. Plot range: 0–0.22." title="Fig. 4. Saved group summaries show unweighted OOF calibration. Labels give events/people; the diagonal shows exact agreement between average predictions and observed rates. Plot range: 0–0.22."/>
             <wp:cNvGraphicFramePr>
               <a:graphicFrameLocks xmlns:a="http://schemas.openxmlformats.org/drawingml/2006/main" noChangeAspect="1"/>
             </wp:cNvGraphicFramePr>
@@ -9844,7 +9914,7 @@
           <w:sz w:val="16"/>
           <w:szCs w:val="16"/>
         </w:rPr>
-        <w:t xml:space="preserve">Fig. 4. Unweighted OOF calibration from frozen quantile-bin aggregates. Labels give events/people; the diagonal denotes exact calibration. The displayed range is 0–0.22.</w:t>
+        <w:t xml:space="preserve">Fig. 4. Saved group summaries show unweighted OOF calibration. Labels give events/people; the diagonal shows exact agreement between average predictions and observed rates. Plot range: 0–0.22.</w:t>
       </w:r>
     </w:p>
     <w:p>
@@ -9858,7 +9928,7 @@
           <w:sz w:val="20"/>
           <w:szCs w:val="20"/>
         </w:rPr>
-        <w:t xml:space="preserve">The full-cohort fit gives odds ratios 0.39 for women versus men (Wald interval 0.23–0.66) and 0.24 for schooling below Grade 7 versus higher (0.13–0.43). Age, settlement and welfare-distance intervals include 1. These are screened-sample associations from the full-data fit, not cross-validated effects or causes. Table VIII distinguishes further model and validation assumptions.</w:t>
+        <w:t xml:space="preserve">Odds (the chance of non-receipt divided by the chance of receipt) let me compare groups. The odds ratio (one group's odds divided by the other's) for women versus men is 0.39. Its Wald interval (a range calculated from a model term and its standard error) is 0.23–0.66. Schooling below Grade 7 versus Grade 7 or above gives 0.24 (0.13–0.43). I calculated these from the model trained on all included adults. Age, settlement and welfare-distance intervals include 1. These associations do not describe held-out effects or causes.</w:t>
       </w:r>
     </w:p>
     <w:p>
@@ -11203,7 +11273,7 @@
                 <w:sz w:val="18"/>
                 <w:szCs w:val="18"/>
               </w:rPr>
-              <w:t xml:space="preserve">S10 wtd. metrics</w:t>
+              <w:t xml:space="preserve">S10 wtd. measures</w:t>
             </w:r>
           </w:p>
         </w:tc>
@@ -11685,7 +11755,7 @@
           <w:sz w:val="16"/>
           <w:szCs w:val="16"/>
         </w:rPr>
-        <w:t xml:space="preserve">The prevalence column remains unweighted; S8–S11 retain weighted descriptive prevalence 7.49%. S9 uses frequency weights in fitting, with unweighted imputation and held-out metrics. S10 weights existing primary OOF predictions without refitting. S8 replaces welfare access, retaining six slopes. S7 removes 21 people/four events. S11 changes fold grouping, retaining the cohort.</w:t>
+        <w:t xml:space="preserve">The non-receipt-rate column uses no weights; S8–S11 keep the weighted non-receipt rate at 7.49%. S9 uses frequency weights when fitting, but no weights when filling missing values or checking predictions. S10 weights the primary OOF predictions without refitting. S8 replaces welfare access and keeps six slopes. S7 removes 21 people/four events. S11 changes fold grouping but keeps the study group.</w:t>
       </w:r>
     </w:p>
     <w:p>
@@ -11699,7 +11769,7 @@
           <w:sz w:val="20"/>
           <w:szCs w:val="20"/>
         </w:rPr>
-        <w:t xml:space="preserve">Across screen, model and validation sensitivities AUC ranges from 0.736 to 0.763; Brier scores and calibration slopes also vary.</w:t>
+        <w:t xml:space="preserve">Across alternatives, AUC ranges from 0.736 to 0.763; Brier and calibration slopes also change.</w:t>
       </w:r>
     </w:p>
     <w:p>
@@ -11727,7 +11797,7 @@
           <w:sz w:val="20"/>
           <w:szCs w:val="20"/>
         </w:rPr>
-        <w:t xml:space="preserve">D. Actual artefact evidence</w:t>
+        <w:t xml:space="preserve">D. How did I check the app?</w:t>
       </w:r>
     </w:p>
     <w:p>
@@ -11741,7 +11811,7 @@
           <w:sz w:val="20"/>
           <w:szCs w:val="20"/>
         </w:rPr>
-        <w:t xml:space="preserve">Table IX separates verification layers. The original 26 checks comprise 22 synthetic screening cases, two income-schedule checks, one forbidden-predictor check and one run trace. Boundary, spouse, grant and receipt cases match their specified decisions. Two research runs produced the same 14 files byte for byte, preserving the frozen cohort checksum.</w:t>
+        <w:t xml:space="preserve">The 26 checks in Table IX include 22 synthetic screening cases (invented records with specified expected decisions), two income-schedule checks, one forbidden-predictor check and one run trace. Boundary, spouse, grant and receipt decisions match their specifications. Two research runs produced 14 files with exactly matching contents and kept the study-group checksum.</w:t>
       </w:r>
     </w:p>
     <w:p>
@@ -12034,7 +12104,7 @@
                 <w:sz w:val="18"/>
                 <w:szCs w:val="18"/>
               </w:rPr>
-              <w:t xml:space="preserve">Rules, schedules, predictor exclusion and tracing.</w:t>
+              <w:t xml:space="preserve">Check rules, schedules, excluded predictors and run tracing.</w:t>
             </w:r>
           </w:p>
         </w:tc>
@@ -12163,7 +12233,7 @@
                 <w:sz w:val="18"/>
                 <w:szCs w:val="18"/>
               </w:rPr>
-              <w:t xml:space="preserve">Backend/UI/state/export behaviour; includes 18 native Streamlit tests.</w:t>
+              <w:t xml:space="preserve">Check software, app state and exports; includes 18 Streamlit interface tests.</w:t>
             </w:r>
           </w:p>
         </w:tc>
@@ -12210,7 +12280,7 @@
                 <w:sz w:val="18"/>
                 <w:szCs w:val="18"/>
               </w:rPr>
-              <w:t xml:space="preserve">Native UI–CLI parity</w:t>
+              <w:t xml:space="preserve">App–command agreement</w:t>
             </w:r>
           </w:p>
         </w:tc>
@@ -12292,7 +12362,7 @@
                 <w:sz w:val="18"/>
                 <w:szCs w:val="18"/>
               </w:rPr>
-              <w:t xml:space="preserve">Frame, screen, receipt, reasons and outcome agreement.</w:t>
+              <w:t xml:space="preserve">Both paths select the same people and give the same decisions, receipt, reasons and outcome.</w:t>
             </w:r>
           </w:p>
         </w:tc>
@@ -12339,7 +12409,7 @@
                 <w:sz w:val="18"/>
                 <w:szCs w:val="18"/>
               </w:rPr>
-              <w:t xml:space="preserve">JSON inference reload</w:t>
+              <w:t xml:space="preserve">Reloaded model scores</w:t>
             </w:r>
           </w:p>
         </w:tc>
@@ -12421,7 +12491,7 @@
                 <w:sz w:val="18"/>
                 <w:szCs w:val="18"/>
               </w:rPr>
-              <w:t xml:space="preserve">Full-fit serialization consistency; not OOF performance.</w:t>
+              <w:t xml:space="preserve">Reloading preserves saved-model scores; this does not assess OOF performance.</w:t>
             </w:r>
           </w:p>
         </w:tc>
@@ -12550,7 +12620,7 @@
                 <w:sz w:val="18"/>
                 <w:szCs w:val="18"/>
               </w:rPr>
-              <w:t xml:space="preserve">Synthetic local workflow and report consistency.</w:t>
+              <w:t xml:space="preserve">Check synthetic local use and report consistency.</w:t>
             </w:r>
           </w:p>
         </w:tc>
@@ -12696,7 +12766,7 @@
           <w:sz w:val="20"/>
           <w:szCs w:val="20"/>
         </w:rPr>
-        <w:t xml:space="preserve">The Windows walkthrough produced six synthetic classifications, two resolved passes, one recipient and one non-recipient. Both scores are 0.1853 because predictors match; the invented 50% rate is not survey prevalence. Screenshots and six extracted report files, rather than the ZIP container, were supplied. Regenerated outputs, hashes, summaries and model/source provenance passed 50 checks. This supports functional/export consistency, not independent execution attestation or representative usability; recruited-user task times, errors and ease ratings are unavailable.</w:t>
+        <w:t xml:space="preserve">The Windows walkthrough gives six synthetic classifications: two resolved passes, one recipient and one non-recipient. Matching predictors give both scores of 0.1853. The invented 50% rate is not the survey non-receipt rate. I provided screenshots and six extracted reports. The checks did not inspect the ZIP container. Regenerated outputs, checksums, summaries and model/source versions pass 50 checks. This checks functions/exports, not independent execution or representative task times, errors or ease.</w:t>
       </w:r>
     </w:p>
     <w:p>
@@ -12752,7 +12822,7 @@
           <w:sz w:val="20"/>
           <w:szCs w:val="20"/>
         </w:rPr>
-        <w:t xml:space="preserve">A. Denominator and grant access</w:t>
+        <w:t xml:space="preserve">A. Whose non-receipt does the study measure?</w:t>
       </w:r>
     </w:p>
     <w:p>
@@ -12766,7 +12836,7 @@
           <w:sz w:val="20"/>
           <w:szCs w:val="20"/>
         </w:rPr>
-        <w:t xml:space="preserve">RQ1 estimates reported non-receipt among apparently eligible, screen-PASS adults with resolved receipt in historical KwaZulu-Natal LCS: 67/1,013, or 6.61% unweighted and 7.49% person-weighted. It does not estimate unlawful denial or non-receipt among all legally entitled adults. The 187 unresolved adults exceed the 67 observed events; their exclusion changes the estimand, independently of sampling uncertainty. A stable point estimate under selected alternatives cannot establish what this unresolved group would report.</w:t>
+        <w:t xml:space="preserve">RQ1 measures non-receipt among historical KwaZulu-Natal adults who pass the screen and resolve receipt: 67/1,013, or 6.61% unweighted and 7.49% person-weighted. This does not measure unlawful denial or non-receipt among everyone legally entitled. The 187 unresolved adults outnumber the 67 events. Excluding them changes the population I describe, regardless of sampling uncertainty. Stable estimates cannot reveal their receipt.</w:t>
       </w:r>
     </w:p>
     <w:p>
@@ -12780,7 +12850,7 @@
           <w:sz w:val="20"/>
           <w:szCs w:val="20"/>
         </w:rPr>
-        <w:t xml:space="preserve">Screen assumptions differ substantively. S2d adds 68 people but only two events, reducing weighted prevalence to 7.12%; partnership choices change the denominator more than the rate. S3 retains incompatible own-grant recipients, adds 19 people/15 events and raises prevalence to 9.06%, the largest tested shift. Similar AUC cannot establish equivalent populations or validate those screen choices. Ralston’s rural age-eligible person comparison [3] and Godfrey’s household-level grant analysis [4] use different units, programme scopes, screens and geography; their percentages are not directly comparable. The present study complements those receipt analyses with an explicit provincial resource-screen denominator. High receipt also coexists with access costs [13], [14]; it cannot demonstrate low administrative burden.</w:t>
+        <w:t xml:space="preserve">S2d adds 68 people but only two events, reducing weighted non-receipt to 7.12%. Partnership rules mainly change the denominator. S3 retains adults with incompatible grants, adds 19 people/15 events and raises non-receipt to 9.06%, the largest tested change. Similar AUC cannot justify rules or establish equivalent populations. Ralston studies rural age-eligible people [3]; Godfrey studies households' grants [4]. Different units, programmes, screens and places prevent direct comparison of their percentages. I add a provincial estimate with an explicit resource screen. High receipt can involve access costs [13], [14]; it cannot prove low burden.</w:t>
       </w:r>
     </w:p>
     <w:p>
@@ -12808,7 +12878,7 @@
           <w:sz w:val="20"/>
           <w:szCs w:val="20"/>
         </w:rPr>
-        <w:t xml:space="preserve">B. Meaning and limits of prediction</w:t>
+        <w:t xml:space="preserve">B. What do the predictions tell you?</w:t>
       </w:r>
     </w:p>
     <w:p>
@@ -12822,7 +12892,7 @@
           <w:sz w:val="20"/>
           <w:szCs w:val="20"/>
         </w:rPr>
-        <w:t xml:space="preserve">RQ2 provides four distinct assessments. AUC 0.752 describes pairwise ranking of held-out non-recipients against recipients, rather than classification accuracy. AP 0.203 summarises precision–recall ranking across thresholds relative to 6.61% event prevalence; it is not precision at an operational cutoff [16]. Brier improvement from 0.0618 to 0.0578 is an absolute reduction of approximately 0.0040 in squared probability error, a modest gain. Calibration-in-the-large is a recalibration intercept with the predicted logit as an offset (slope fixed at 1); its ideal value is zero. The estimate 0.020 and interval spanning zero do not establish perfect agreement. Slope 0.836 suggests possibly overly extreme predictions, but its 0.591–1.133 interval includes the ideal value 1 [17]. With 67 events, probability scaling and subgroup associations remain uncertain [18]; most adults even in the highest calibration bin report receipt.</w:t>
+        <w:t xml:space="preserve">RQ2 assesses four properties. AUC 0.752 describes ranking held-out non-recipients above recipients, not classification accuracy. AP 0.203 summarises precision–recall ranking across cutoffs against a 6.61% event rate, not precision at one cutoff [16]. Brier falls from 0.0618 to 0.0578: a modest 0.0040 reduction in squared probability error. To check average bias, I estimate an intercept correction while fixing the calibration slope at 1. The ideal is zero. The estimate 0.020 and interval spanning zero do not prove perfect agreement. Slope 0.836 suggests that predictions may be too extreme, but its 0.591–1.133 interval includes the ideal 1 [17]. 67 events inform these checks [18]. Most adults in even the highest-risk bin report receipt.</w:t>
       </w:r>
     </w:p>
     <w:p>
@@ -12836,7 +12906,7 @@
           <w:sz w:val="20"/>
           <w:szCs w:val="20"/>
         </w:rPr>
-        <w:t xml:space="preserve">Table II separates theoretical constructs from observed proxies. Schooling motivates a possible learning-cost connection, while distance and settlement motivate compliance-cost hypotheses [13], [14]. Full-fit odds ratios, including the female and lower-schooling associations, describe the screened cohort; they are neither OOF effects nor estimates of burden. Lower schooling accompanies receipt, contrary to a simple information-barrier expectation. Fewer alternative resources among less-educated adults, or selection induced by screening, could explain that direction; neither hypothesis is tested here. Imprecise office/settlement associations cannot establish the presence or absence of compliance costs. Psychological costs have no direct measure. Without awareness, visits, document demands or administrative decisions, the model cannot identify why non-receipt occurs.</w:t>
+        <w:t xml:space="preserve">Table II separates concepts from measured predictors. Schooling suggests learning costs; distance/settlement suggest compliance costs [13], [14]. These odds ratios describe the screened group, not OOF effects or burden. Lower schooling accompanies receipt, against a simple information-barrier expectation. Fewer other resources or screening selection could explain this; I test neither explanation. Uncertain office/settlement associations neither confirm nor rule out compliance costs. I do not measure psychological costs. Without awareness, visits, document demands or administrative decisions, I cannot explain non-receipt.</w:t>
       </w:r>
     </w:p>
     <w:p>
@@ -12850,7 +12920,7 @@
           <w:sz w:val="20"/>
           <w:szCs w:val="20"/>
         </w:rPr>
-        <w:t xml:space="preserve">Table VIII distinguishes sample, specification and evaluation changes. S7 excludes 21 people/four events (992/63); its lower Brier score concerns a different sample and cannot establish whether imputation is preferable. S8 replaces welfare access with marriage and gives similar performance. S9 uses frequency weights in fitting with unweighted evaluation, not a full survey-design model. S10 instead reweights the same primary OOF predictions, increasing Brier to 0.0641 without retraining. S11 changes fold grouping to derived PSU and gives similar performance. S8–S11 retain 1,013 people/67 events. These comparisons support a transparent internal benchmark; they do not establish model superiority or external validity [19], [20].</w:t>
+        <w:t xml:space="preserve">Table VIII separates sample, predictor and evaluation changes. S7 removes 21 people/four events (992/63). Its lower Brier concerns a different sample and cannot establish whether filling missing values is better. S8 substitutes marriage for welfare access and performs similarly. S9 weights fitting but not evaluation; it does not model the full survey design. S10 reweights the same primary OOF predictions without retraining, raising Brier to 0.0641. S11 groups folds by derived PSU and also performs similarly. S8–S11 keep 1,013 people/67 events. These checks expose internal assumptions, rather than establish model superiority or reliability elsewhere [19], [20].</w:t>
       </w:r>
     </w:p>
     <w:p>
@@ -12878,7 +12948,7 @@
           <w:sz w:val="20"/>
           <w:szCs w:val="20"/>
         </w:rPr>
-        <w:t xml:space="preserve">C. What RQ3 establishes</w:t>
+        <w:t xml:space="preserve">C. What does RQ3 establish?</w:t>
       </w:r>
     </w:p>
     <w:p>
@@ -12892,7 +12962,7 @@
           <w:sz w:val="20"/>
           <w:szCs w:val="20"/>
         </w:rPr>
-        <w:t xml:space="preserve">RQ3 has six verification layers: synthetic cases assess specified rule decisions; repeated bytes assess repeatability; UI–CLI agreement assesses software-path parity; JSON reload assesses inference serialization; the owner walkthrough assesses a functional synthetic workflow; participant testing would assess human usability. Table IX supports the first five within their tested conditions. Automated agreement cannot establish independent user ease, acceptance or field performance. Saved rule sources, run records and validation reports expose versions, checksums and tested conditions for inspection.</w:t>
+        <w:t xml:space="preserve">RQ3 has six evidence layers. Synthetic cases check rule decisions; matching file contents check repeatability; UI–CLI agreement checks software paths; JSON reload checks saved-model predictions. The owner walkthrough checks a synthetic workflow; participant testing would assess human usability. Table IX supports the first five within tested conditions. Automated agreement cannot establish independent user ease, acceptance or field success. Saved sources and run/validation reports expose versions, checksums and test conditions.</w:t>
       </w:r>
     </w:p>
     <w:p>
@@ -12906,7 +12976,7 @@
           <w:sz w:val="20"/>
           <w:szCs w:val="20"/>
         </w:rPr>
-        <w:t xml:space="preserve">Synthetic demonstration, schema checks, session-memory uploads and identifier-suppressed audit exports provide demonstrated controls. Historical OOF evaluation remains separate from frozen full-data app predictions; uploaded records may overlap training data. Serialization agreement therefore verifies inference, not new predictive accuracy. RQ3 is supported for computational inspectability; clarity to representative users remains untested, with the synthetic-data task protocol retained for future work.</w:t>
+        <w:t xml:space="preserve">I separate historical OOF results from uploaded scores; uploads may overlap training data. Matching saved scores checks reloading, not new predictive accuracy. You can inspect the computations, but representative user clarity remains untested. The task sheet supports future testing.</w:t>
       </w:r>
     </w:p>
     <w:p>
@@ -12934,7 +13004,7 @@
           <w:sz w:val="20"/>
           <w:szCs w:val="20"/>
         </w:rPr>
-        <w:t xml:space="preserve">D. External validity</w:t>
+        <w:t xml:space="preserve">D. Could this work elsewhere?</w:t>
       </w:r>
     </w:p>
     <w:p>
@@ -12948,7 +13018,7 @@
           <w:sz w:val="20"/>
           <w:szCs w:val="20"/>
         </w:rPr>
-        <w:t xml:space="preserve">The target is a screened KwaZulu-Natal LCS 2014/2015 population. Provinces differ in settlement, access and administration; later periods differ in policy, thresholds, coverage and reporting. Administrative application, award and payment records measure different events from survey-reported receipt and introduce missingness/linkage errors. No independent province, period or administrative sample has been evaluated. Transfer requires comparable population and outcome definitions, justified target-period screening rules, and independent discrimination/calibration assessment [19], [20]. Passing the historical upload schema or deploying software does not establish suitability for contemporary applicants.</w:t>
+        <w:t xml:space="preserve">I study screened KwaZulu-Natal adults in LCS 2014/2015. Provinces and periods differ in settlement, services, policy and reporting. Application, award and payment records measure different events from reported receipt and can contain linking errors. I have tested no independent province, period or administrative sample. Transfer needs comparable populations/outcomes, justified period-specific rules and independent ranking/calibration checks [19], [20]. Making the app available cannot establish suitability for today's applicants.</w:t>
       </w:r>
     </w:p>
     <w:p>
@@ -12990,7 +13060,7 @@
           <w:sz w:val="20"/>
           <w:szCs w:val="20"/>
         </w:rPr>
-        <w:t xml:space="preserve">Legal eligibility is partially observed: the asset test, deemed income and deductions are absent from the resource proxy. Income and reported receipt may contain measurement error. Cross-sectional associations have no established temporal order. The small event count, unresolved denominator, missing strata and fixed-prediction rather than refitted bootstrap limit inference. Household sampling excludes institutionalised older adults. Formal participant usability and external validation remain outstanding.</w:t>
+        <w:t xml:space="preserve">I cannot fully observe legal eligibility: the survey-based resource measure omits assets, deemed income (income the law assigns rather than the survey observes) and deductions. Income and receipt reports may contain errors. Cross-sectional data (answers from one survey period rather than repeated follow-up of the same people) cannot establish the order of events. Few events, unresolved eligibility, missing strata and resampling fixed predictions without refitting limit inference. Household sampling excludes institutionalised older adults. I have not tested participant usability or another population.</w:t>
       </w:r>
     </w:p>
     <w:p>
@@ -13004,7 +13074,7 @@
           <w:sz w:val="20"/>
           <w:szCs w:val="20"/>
         </w:rPr>
-        <w:t xml:space="preserve">Survey use remains subject to access conditions and applicable disclosure requirements. Synthetic records support demonstration and interface testing; the downloadable local package excludes survey records. Result displays and report exports omit submitted identifiers and raw income. These controls do not establish that every historical repository file has been disclosure-reviewed. No DUT ethics determination is documented here, so none is claimed. The artefact explains this study’s measurement decisions and does not issue grant decisions or rank named applicants.</w:t>
+        <w:t xml:space="preserve">Survey access conditions and disclosure requirements (rules that limit sharing respondent information) apply. I demonstrate and test interfaces with synthetic records. The downloadable package excludes survey records. Displays and reports omit submitted identifiers and raw income. These controls do not show disclosure review of every historical repository file. The project records contain no DUT (Durban University of Technology) ethics determination (an institutional decision on the ethics requirements for this study). I therefore claim no approval. The app explains measurement choices; it neither decides grants nor ranks named applicants.</w:t>
       </w:r>
     </w:p>
     <w:p>
@@ -13046,7 +13116,7 @@
           <w:sz w:val="20"/>
           <w:szCs w:val="20"/>
         </w:rPr>
-        <w:t xml:space="preserve">Historical screened non-receipt is 6.6% unweighted and 7.5% person-weighted; alternatives yield 7.1%–9.1%. Grant compatibility matters more than the ceiling, and unresolved cases make the denominator central. Five domains/six slopes give AUC 0.752, AP 0.203 and Brier 0.0578: moderate internal ranking with a small probability-error improvement. The software reproduces and exposes screening, receipt and scores within tested conditions. The contribution is an inspectable historical research benchmark. Participant usability, causes, legal entitlement and performance elsewhere remain unestablished.</w:t>
+        <w:t xml:space="preserve">I estimate historical screened non-receipt at 6.6% unweighted and 7.5% person-weighted; alternatives give 7.1%–9.1%. Rules about other grants change results more than the ceiling, and unresolved cases make the denominator central. Five predictor groups/six slopes give AUC 0.752, AP 0.203 and Brier 0.0578: moderate internal ranking with slightly less probability error. You can inspect the software's reproduced screen, receipt categories and scores under tested conditions. I provide a historical benchmark (a documented result that later studies can compare with). I have not established human usability, causes, legal entitlement or performance elsewhere.</w:t>
       </w:r>
     </w:p>
     <w:p>

</xml_diff>

<commit_message>
Rewrite paper in clear professional research prose
</commit_message>
<xml_diff>
--- a/paper/Jawe_OPG_nonreceipt_KZN.docx
+++ b/paper/Jawe_OPG_nonreceipt_KZN.docx
@@ -89,7 +89,7 @@
           <w:sz w:val="18"/>
           <w:szCs w:val="18"/>
         </w:rPr>
-        <w:t xml:space="preserve">Abstract—I studied South Africa’s Older Person’s Grant (OPG) and reported non-receipt (respondents say they receive no OPG). I used the Living Conditions Survey (LCS) 2014/2015 for adults aged 60 or older in KwaZulu-Natal (KZN). I used administrative-burden theory (learning about services, meeting requirements and dealing with officials can make access difficult) to choose predictors (survey characteristics used to estimate non-receipt). I used screening (checking survey answers against research rules) to identify apparently eligible adults (people who pass those checks). This cannot establish legal entitlement (a right to the grant under all its legal conditions). Among 1,013 adults who pass and give clear receipt answers, 67 report non-receipt: 6.6% unweighted (counting each person equally) and 7.5% person-weighted (allowing for how many people each respondent represents). Alternative screening rules give weighted rates of 7.1%–9.1%. Logistic regression (a model for two outcomes) uses five characteristics. I tested it on households I did not use to build it. AUC (area under the receiver operating characteristic curve; how well the model ranks non-recipients above recipients) is 0.752; average precision (AP; the share of true non-recipients in ranked selections, averaged as more are found) is 0.203. I obtained a Brier score (the average squared gap between predicted chances and recorded outcomes) of 0.0578. Predicting only the non-receipt rate of the group used to build the model gives 0.0618. Checks support reproducibility (repeated runs give the same results). App screens show rules, decisions, scores and reports. I have not tested how easily participants use it. These results do not establish entitlement, explain non-receipt, or show that the model works elsewhere.</w:t>
+        <w:t xml:space="preserve">Abstract—This study analysed South Africa’s Older Person’s Grant (OPG) and reported non-receipt (respondents say they receive no OPG). It used the Living Conditions Survey (LCS) 2014/2015 for adults aged 60 or older in KwaZulu-Natal (KZN). The study used administrative-burden theory (accessing services requires information, effort and encounters with officials) to choose predictors (survey characteristics used to estimate non-receipt). Screening (checking survey answers against research rules) identified apparently eligible adults (people who pass those checks), without establishing legal entitlement (a right to the grant under all legal conditions). Among 1,013 adults who passed with clear receipt answers, 67 reported non-receipt: 6.6% unweighted (counting each person equally) and 7.5% person-weighted (allowing for how many people each respondent represents). Alternative screening rules gave weighted rates of 7.1%–9.1%. Logistic regression (a model for two outcomes) used five characteristics. The evaluation tested predictions on households excluded when building the model. AUC (area under the receiver operating characteristic curve; how well the model ranks non-recipients above recipients) was 0.752; average precision (AP; the proportion of actual non-recipients in ranked selections, averaged as more are identified) was 0.203. The Brier score (average squared gap between predicted chances and recorded outcomes) was 0.0578, compared with 0.0618 when predictions used only the non-receipt rate of the group used to build the model. Checks supported reproducibility (repeated runs give the same results). The application displays rules, decisions, scores and reports. No participant study tested ease of use. These results do not establish entitlement, explain non-receipt, or demonstrate performance elsewhere.</w:t>
       </w:r>
     </w:p>
     <w:p>
@@ -159,7 +159,7 @@
           <w:sz w:val="20"/>
           <w:szCs w:val="20"/>
         </w:rPr>
-        <w:t xml:space="preserve">The Older Person’s Grant (OPG) supports households [1], including during crises [2]. Other work examines receipt and access barriers [3], [4]. I ask who appears eligible but reports receiving no OPG.</w:t>
+        <w:t xml:space="preserve">The Older Person’s Grant (OPG) supports households [1], including during crises [2]. Other work examines receipt and access barriers [3], [4]. This study examines adults who appear eligible but report receiving no OPG.</w:t>
       </w:r>
     </w:p>
     <w:p>
@@ -173,7 +173,7 @@
           <w:sz w:val="20"/>
           <w:szCs w:val="20"/>
         </w:rPr>
-        <w:t xml:space="preserve">I separate screening, reported receipt (a respondent’s grant answer) and legal entitlement. Passing my screen does not mean approval by the South African Social Security Agency [5]. Non-receipt can reflect high income, no application, a pending decision or incomplete information. I must define who passes before calculating a percentage; missing spouse income can change that group.</w:t>
+        <w:t xml:space="preserve">The analysis separates screening, reported receipt (a respondent’s grant answer) and legal entitlement. Passing the research screen does not mean approval by the South African Social Security Agency [5]. Non-receipt can reflect high income, no application, a pending decision or incomplete information. The analysis must define the screened group before calculating its non-receipt percentage; missing spouse income can change that group.</w:t>
       </w:r>
     </w:p>
     <w:p>
@@ -187,7 +187,7 @@
           <w:sz w:val="20"/>
           <w:szCs w:val="20"/>
         </w:rPr>
-        <w:t xml:space="preserve">My aim is to develop and evaluate an interpretable research tool (software whose rules and results you can inspect) for analysing reported OPG non-receipt among apparently eligible older adults in KwaZulu-Natal using the Living Conditions Survey (LCS) 2014/2015. I set four objectives: document the people included, describe non-receipt using survey weights (how many people each respondent represents), test predictions on excluded households, and check correctness, reproducibility (whether repeated runs produce the same results) and clarity.</w:t>
+        <w:t xml:space="preserve">The study aims to develop and evaluate an interpretable research tool (software with inspectable rules and results) for analysing reported OPG non-receipt among apparently eligible older adults in KwaZulu-Natal using the Living Conditions Survey (LCS) 2014/2015. Four objectives guide the work: document the included population, describe non-receipt using survey weights (how many people each respondent represents), test predictions on excluded households, and assess correctness, reproducibility (whether repeated runs produce the same results) and clarity.</w:t>
       </w:r>
     </w:p>
     <w:p>
@@ -201,7 +201,7 @@
           <w:sz w:val="20"/>
           <w:szCs w:val="20"/>
         </w:rPr>
-        <w:t xml:space="preserve">Research questions (RQs) guide the study. RQ1 asks what proportion of screened adults reports non-receipt and how that proportion changes under different screening assumptions. RQ2 asks how well logistic regression separates recipients from non-recipients and estimates chances in excluded households. RQ3 asks whether the tool can repeat the analysis and clearly explain screening decisions and model results. I combine documented rules, weighted percentages, tested predictions and a local interface to answer them.</w:t>
+        <w:t xml:space="preserve">Research questions (RQs) guide the study. RQ1 asks what proportion of screened adults reports non-receipt and how that proportion changes under different screening assumptions. RQ2 asks how well logistic regression separates recipients from non-recipients and estimates chances in excluded households. RQ3 asks whether the tool can repeat the analysis and clearly explain screening decisions and model results. The study combines documented rules, weighted percentages, tested predictions and a local interface to address them.</w:t>
       </w:r>
     </w:p>
     <w:p>
@@ -229,7 +229,7 @@
           <w:sz w:val="20"/>
           <w:szCs w:val="20"/>
         </w:rPr>
-        <w:t xml:space="preserve">II. Related Work and How I Chose Predictors</w:t>
+        <w:t xml:space="preserve">II. Related Work and Predictor Selection</w:t>
       </w:r>
     </w:p>
     <w:p>
@@ -257,7 +257,7 @@
           <w:sz w:val="20"/>
           <w:szCs w:val="20"/>
         </w:rPr>
-        <w:t xml:space="preserve">A. Review approach, programme context and research gap</w:t>
+        <w:t xml:space="preserve">A. Review Approach, Programme Context and Research Gap</w:t>
       </w:r>
     </w:p>
     <w:p>
@@ -271,7 +271,7 @@
           <w:sz w:val="20"/>
           <w:szCs w:val="20"/>
         </w:rPr>
-        <w:t xml:space="preserve">My proposal reported a structured literature review (a search using specified sources and selection steps). It searched Scopus, Dimensions, IEEE Xplore, SABINET/African Journals Online, Google Scholar and Statistics South Africa/DataFirst for grant, access, non-receipt and prediction research. It reported 511 records: 136 duplicates removed, 375 titles/abstracts screened, 222 excluded, 153 full texts assessed, 98 further exclusions and 55 retained sources. These are earlier reported counts, not a new search or 55 OPG studies. I compare grants, places, people/households and measured outcomes; they cannot supply one combined percentage.</w:t>
+        <w:t xml:space="preserve">The earlier proposal reported a structured literature review (a search using specified sources and selection steps). It searched Scopus, Dimensions, IEEE Xplore, SABINET/African Journals Online, Google Scholar and Statistics South Africa/DataFirst for grant, access, non-receipt and prediction research. It reported 511 records: 136 duplicates removed, 375 titles/abstracts screened, 222 excluded, 153 full texts assessed, 98 further exclusions and 55 retained sources. These are earlier reported counts, rather than a new search or 55 OPG studies. The retained sources address different grants, places, people/households and measured outcomes; they cannot supply one combined percentage.</w:t>
       </w:r>
     </w:p>
     <w:p>
@@ -285,7 +285,7 @@
           <w:sz w:val="20"/>
           <w:szCs w:val="20"/>
         </w:rPr>
-        <w:t xml:space="preserve">Table I distinguishes individual receipt [3] from household proportions [4], and my provincial resource screen from both. Other-grant studies separate enquiry, application, receipt and uninterrupted payment [6], [7], [8].</w:t>
+        <w:t xml:space="preserve">Table I distinguishes individual receipt [3] from household proportions [4], and this study’s provincial resource screen from both. Other-grant studies separate enquiry, application, receipt and uninterrupted payment [6], [7], [8].</w:t>
       </w:r>
     </w:p>
     <w:p>
@@ -578,7 +578,7 @@
                 <w:sz w:val="18"/>
                 <w:szCs w:val="18"/>
               </w:rPr>
-              <w:t xml:space="preserve">Selection by age in rural Agincourt differs from my resource screen.</w:t>
+              <w:t xml:space="preserve">Selection by age in rural Agincourt differs from this study’s resource screen.</w:t>
             </w:r>
           </w:p>
         </w:tc>
@@ -1111,7 +1111,7 @@
           <w:sz w:val="20"/>
           <w:szCs w:val="20"/>
         </w:rPr>
-        <w:t xml:space="preserve">Gazeaud supports checking income assumptions [11], without quantifying LCS errors or defining South African eligibility. Mabala models another grant for younger applicants [12]; its findings cannot directly predict OPG receipt. My contribution combines an explicit screen, weighted description, testing on excluded households and inspectable software for this historical KwaZulu-Natal group.</w:t>
+        <w:t xml:space="preserve">Gazeaud supports checking income assumptions [11], without quantifying LCS errors or defining South African eligibility. Mabala models another grant for younger applicants [12]; its findings cannot directly predict OPG receipt. This study combines an explicit screen, weighted description, testing on excluded households and inspectable software for this historical KwaZulu-Natal group.</w:t>
       </w:r>
     </w:p>
     <w:p>
@@ -1139,7 +1139,7 @@
           <w:sz w:val="20"/>
           <w:szCs w:val="20"/>
         </w:rPr>
-        <w:t xml:space="preserve">B. Grant access and administrative burden</w:t>
+        <w:t xml:space="preserve">B. Grant Access and Administrative Burden</w:t>
       </w:r>
     </w:p>
     <w:p>
@@ -1153,7 +1153,7 @@
           <w:sz w:val="20"/>
           <w:szCs w:val="20"/>
         </w:rPr>
-        <w:t xml:space="preserve">Administrative-burden theory (an account of the effort and stress involved in accessing services) identifies learning costs (effort to find and understand information), compliance costs (effort to meet requirements) and psychological costs (stress, stigma or loss of dignity) [13]. Grant studies describe paperwork, repeated visits, interrupted payments and difficult encounters [8], [9], [10], [14]. Child Support Grant research suggests barriers [6], [7], without establishing their effects among older OPG applicants. Digital access can create difficulties [15]. Low non-receipt therefore does not show that access is easy.</w:t>
+        <w:t xml:space="preserve">Administrative-burden theory (an account of the effort and stress involved in accessing services) identifies learning costs (effort to find and understand information), compliance costs (effort to meet requirements) and psychological costs (stress, stigma or loss of dignity) [13]. Grant studies describe paperwork, repeated visits, interrupted payments and difficult encounters [8], [9], [10], [14]. Child Support Grant research suggests barriers [6], [7], without establishing their effects among older OPG applicants. Digital access can create difficulties [15]. Low non-receipt therefore does not demonstrate easy access.</w:t>
       </w:r>
     </w:p>
     <w:p>
@@ -1167,7 +1167,7 @@
           <w:sz w:val="20"/>
           <w:szCs w:val="20"/>
         </w:rPr>
-        <w:t xml:space="preserve">LCS does not record every legal condition or application experience. My screen checks age, resources, partnership and other-grant rules. I record PASS (the person meets the research conditions), FAIL (a known condition is not met) or UNRESOLVED (I lack enough information to decide). I then check receipt separately. Only adults who pass with clear receipt answers enter the prediction study. Unclear or contradictory answers stay unresolved.</w:t>
+        <w:t xml:space="preserve">LCS does not record every legal condition or application experience. The screen checks age, resources, partnership and other-grant rules. It assigns PASS (the person meets the research conditions), FAIL (a known condition is not met) or UNRESOLVED (available information cannot resolve the decision). The analysis then checks receipt separately. Only adults who pass with clear receipt answers enter the prediction study. Unclear or contradictory answers remain unresolved.</w:t>
       </w:r>
     </w:p>
     <w:p>
@@ -1195,7 +1195,7 @@
           <w:sz w:val="20"/>
           <w:szCs w:val="20"/>
         </w:rPr>
-        <w:t xml:space="preserve">C. Connecting access concepts to predictors and the tool</w:t>
+        <w:t xml:space="preserve">C. Predictor Selection and Software Design</w:t>
       </w:r>
     </w:p>
     <w:p>
@@ -1209,7 +1209,7 @@
           <w:sz w:val="20"/>
           <w:szCs w:val="20"/>
         </w:rPr>
-        <w:t xml:space="preserve">Table II links five predictors to possible barriers. They are proxies (indirect indicators), not direct measures of grant awareness, journeys or discrimination. LCS does not record application paperwork, travel spending, waiting, stigma or stress. Theory guides my choices; the model cannot prove that barriers caused non-receipt.</w:t>
+        <w:t xml:space="preserve">Table II links five predictors to possible barriers. They are proxies (indirect indicators), rather than direct measures of grant awareness, journeys or discrimination. LCS does not record application paperwork, travel spending, waiting, stigma or stress. The study used theory to choose predictors; the model cannot establish that barriers caused non-receipt.</w:t>
       </w:r>
     </w:p>
     <w:p>
@@ -1223,7 +1223,7 @@
           <wp:inline distT="0" distB="0" distL="0" distR="0">
             <wp:extent cx="3200400" cy="3105150"/>
             <wp:effectExtent t="0" r="0" b="0" l="0"/>
-            <wp:docPr id="1" name="Fig. 1. How theory guides the choice of survey measures. Arrows show measurement choices and research steps; they do not show proven causes. The survey does not record every condition of legal entitlement." descr="Fig. 1. How theory guides the choice of survey measures. Arrows show measurement choices and research steps; they do not show proven causes. The survey does not record every condition of legal entitlement." title="Fig. 1. How theory guides the choice of survey measures. Arrows show measurement choices and research steps; they do not show proven causes. The survey does not record every condition of legal entitlement."/>
+            <wp:docPr id="1" name="Fig. 1. Theory guides the choice of survey measures. Arrows show measurement choices and research steps; they do not show proven causes. The survey does not record every condition of legal entitlement." descr="Fig. 1. Theory guides the choice of survey measures. Arrows show measurement choices and research steps; they do not show proven causes. The survey does not record every condition of legal entitlement." title="Fig. 1. Theory guides the choice of survey measures. Arrows show measurement choices and research steps; they do not show proven causes. The survey does not record every condition of legal entitlement."/>
             <wp:cNvGraphicFramePr>
               <a:graphicFrameLocks xmlns:a="http://schemas.openxmlformats.org/drawingml/2006/main" noChangeAspect="1"/>
             </wp:cNvGraphicFramePr>
@@ -1274,7 +1274,7 @@
           <w:sz w:val="16"/>
           <w:szCs w:val="16"/>
         </w:rPr>
-        <w:t xml:space="preserve">Fig. 1. How theory guides the choice of survey measures. Arrows show measurement choices and research steps; they do not show proven causes. The survey does not record every condition of legal entitlement.</w:t>
+        <w:t xml:space="preserve">Fig. 1. Theory guides the choice of survey measures. Arrows show measurement choices and research steps; they do not show proven causes. The survey does not record every condition of legal entitlement.</w:t>
       </w:r>
     </w:p>
     <w:p>
@@ -2100,7 +2100,7 @@
           <w:sz w:val="20"/>
           <w:szCs w:val="20"/>
         </w:rPr>
-        <w:t xml:space="preserve">Figure 1 separates screening, receipt and prediction; you can inspect each in the tool. Weighted percentages describe the screened population. Testing on excluded households checks prediction within this survey. The app scores uploads using saved model settings. These scores are separate from test results and never change screening or receipt.</w:t>
+        <w:t xml:space="preserve">Figure 1 separates screening, receipt and prediction; the tool displays each for inspection. Weighted percentages describe the screened population. Testing on excluded households checks prediction within this survey. The application scores uploaded records using saved model settings. These scores remain separate from test results and never change screening or receipt.</w:t>
       </w:r>
     </w:p>
     <w:p>
@@ -2114,7 +2114,7 @@
           <w:sz w:val="20"/>
           <w:szCs w:val="20"/>
         </w:rPr>
-        <w:t xml:space="preserve">With few non-recipients, I assess precision (the share of selected likely non-recipients who report non-receipt) and calibration (whether predicted chances match observed rates), alongside ranking [16], [17]. The number of people studied and testing on excluded households limit conclusions [18], [19]. I use TRIPOD (guidance for reporting prediction models) to explain my methods and results [20]. Software checks support correctness and repeatability; participant usability (how easily people understand and complete tasks) needs people to try the app.</w:t>
+        <w:t xml:space="preserve">With few non-recipients, the evaluation assessed precision (the share of selected likely non-recipients who report non-receipt) and calibration (whether predicted chances match observed rates), alongside ranking [16], [17]. The number of people studied and testing on excluded households limit conclusions [18], [19]. The paper uses TRIPOD (guidance for reporting prediction models) to describe methods and results [20]. Software checks support correctness and repeatability; assessing participant usability (how easily people understand and complete tasks) requires participants to try the app.</w:t>
       </w:r>
     </w:p>
     <w:p>
@@ -2184,7 +2184,7 @@
           <w:sz w:val="20"/>
           <w:szCs w:val="20"/>
         </w:rPr>
-        <w:t xml:space="preserve">I linked the LCS 2014/2015 person, household and person-income files by survey identifiers, checking duplicates, unmatched records and row counts. I used the questionnaire, metadata (information describing the data) and COICOP (Classification of Individual Consumption According to Purpose, grouping items by purpose) codes [21], [22], [23]. I studied sampled KwaZulu-Natal residents aged 60 or older in completed years. The survey excludes older adults living in institutions. I applied rules for the interview month. Before releasing the data, Statistics South Africa used hot-deck imputation (filling a missing answer with another respondent's answer) for age and sex without marking the affected records. I cannot identify those records. I handle missing model predictors separately.</w:t>
+        <w:t xml:space="preserve">The analysis linked the LCS 2014/2015 person, household and person-income files through survey identifiers. Checks covered duplicates, unmatched records and row counts. The questionnaire, metadata (information describing the data) and COICOP (Classification of Individual Consumption According to Purpose, grouping items by purpose) codes guided interpretation [21], [22], [23]. The study covered sampled KwaZulu-Natal residents aged 60 or older in completed years. The survey excludes older adults living in institutions. Screening used the rules for each interview month. Before releasing the data, Statistics South Africa used hot-deck imputation (filling a missing answer with another respondent's answer) for age and sex. The released files do not identify these records. The model handled missing predictors separately.</w:t>
       </w:r>
     </w:p>
     <w:p>
@@ -2198,7 +2198,7 @@
           <w:sz w:val="20"/>
           <w:szCs w:val="20"/>
         </w:rPr>
-        <w:t xml:space="preserve">Table III shows each field's use. I summed income before linking files to avoid duplicating people.</w:t>
+        <w:t xml:space="preserve">Table III shows each field's role. Summing income before linkage avoided duplicate person records.</w:t>
       </w:r>
     </w:p>
     <w:p>
@@ -3419,7 +3419,7 @@
           <w:sz w:val="16"/>
           <w:szCs w:val="16"/>
         </w:rPr>
-        <w:t xml:space="preserve">I use the released documentation [21], [22], [23]. Filling missing model predictors never changes screening fields or receipt answers.</w:t>
+        <w:t xml:space="preserve">Released documentation supports these field uses [21], [22], [23]. Filling missing model predictors never changes screening fields or receipt answers.</w:t>
       </w:r>
     </w:p>
     <w:p>
@@ -3447,7 +3447,7 @@
           <w:sz w:val="20"/>
           <w:szCs w:val="20"/>
         </w:rPr>
-        <w:t xml:space="preserve">B. Final screening rules and receipt outcome</w:t>
+        <w:t xml:space="preserve">B. Screening rules and receipt outcome</w:t>
       </w:r>
     </w:p>
     <w:p>
@@ -3461,7 +3461,7 @@
           <w:sz w:val="20"/>
           <w:szCs w:val="20"/>
         </w:rPr>
-        <w:t xml:space="preserve">I estimated private resources by summing yearly income amounts at their reported values. I excluded social-assistance income (payments from government support grants) so receiving a grant would not cause a failure. I did not divide household totals among individuals. A missing income record means zero only when the source indicator confirms no reported income; otherwise, I leave it unresolved. Asset purchases do not show total asset holdings. The data cannot establish the full legal asset test, income assigned under legal rules, or permitted deductions.</w:t>
+        <w:t xml:space="preserve">The screen summed reported yearly income to estimate private resources. It excluded social-assistance income (payments from government support grants) so receiving a grant would not cause a failure. It did not divide household totals among individuals. A missing income record counts as zero only when the source indicator confirms no reported income; otherwise, the screen leaves it unresolved. Asset purchases do not measure total asset holdings. The data cannot establish the full legal asset test, income assigned under legal rules or permitted deductions.</w:t>
       </w:r>
     </w:p>
     <w:p>
@@ -3475,7 +3475,7 @@
           <w:sz w:val="20"/>
           <w:szCs w:val="20"/>
         </w:rPr>
-        <w:t xml:space="preserve">I set the income ceiling (the largest yearly private-resource amount that passes the research rule) where the grant formula still pays R100 monthly. From April 2014, the ceilings are R61,800 for a single person and R123,600 for a couple; from April 2015, they are R64,680 and R129,360 [24], [25]. I included amounts exactly at the interview-month ceiling. These research limits do not establish legal eligibility. I tested alternative thresholds and income definitions.</w:t>
+        <w:t xml:space="preserve">The income ceiling (the largest yearly private-resource amount that passes the research rule) corresponds to a formula payment of R100 monthly. From April 2014, the ceilings are R61,800 for a single person and R123,600 for a couple; from April 2015, they are R64,680 and R129,360 [24], [25]. The screen included amounts exactly at the interview-month ceiling. These research limits do not establish legal eligibility. The legal formula and couple-threshold interpretation remain unverified. Alternative analyses tested thresholds and income definitions.</w:t>
       </w:r>
     </w:p>
     <w:p>
@@ -3489,7 +3489,7 @@
           <w:sz w:val="20"/>
           <w:szCs w:val="20"/>
         </w:rPr>
-        <w:t xml:space="preserve">For married adults, I combined applicant and spouse resources only when I could link a resident spouse and confirm the relationship. Never-married, widowed and divorced adults use the single ceiling. Living-together, separated, absent-spouse and failed-link cases remain unresolved in the primary analysis. I did not assume that unknown partner resources equal zero or that an ambiguous partnership means single. Alternative analyses relax these choices. An adult's own disability or war-veterans grant causes a failure. Caregiver child grants and grant-in-aid (an extra grant for people who need full-time care) do not exclude the adult or define OPG receipt. A known failure takes priority over missing information; the software retains all reasons.</w:t>
+        <w:t xml:space="preserve">For married adults, the screen combined applicant and spouse resources only after linking a resident spouse and confirming the relationship. Never-married, widowed and divorced adults use the single ceiling. Living-together, separated, absent-spouse and failed-link cases remain unresolved in the primary analysis. The screen does not treat unknown partner resources as zero or classify ambiguous partnerships as single. Alternative analyses relaxed these choices. An adult's own disability or war-veterans grant causes a failure. Caregiver child grants and grant-in-aid (an extra grant for people who need full-time care) do not exclude the adult or define OPG receipt. A known failure takes priority over missing information; the software retains all reasons.</w:t>
       </w:r>
     </w:p>
     <w:p>
@@ -3503,7 +3503,7 @@
           <w:sz w:val="20"/>
           <w:szCs w:val="20"/>
         </w:rPr>
-        <w:t xml:space="preserve">For adults who pass, I read general-grant and OPG answers together, including structural skips (questions omitted because earlier answers make them inapplicable). A consistent “no grant” answer can establish non-receipt when the OPG follow-up does not apply. Contradictory or unexplained answers remain unresolved, excluding the person from modelling. I compared current receipt with preceding-year OPG income, flagging disagreements without changing the outcome because the periods differ. Rule version opg-kzn-primary-v1 records these decisions. The final denominator (the group used to calculate the proportion) contains adults who pass and have a clear receipt answer.</w:t>
+        <w:t xml:space="preserve">For adults who passed, the software interpreted general-grant and OPG answers together, including structural skips (questions omitted because earlier answers make them inapplicable). A consistent “no grant” answer can establish non-receipt when the OPG follow-up does not apply. Contradictory or unexplained answers remain unresolved and exclude the person from modelling. The analysis flagged disagreements between current receipt and preceding-year OPG income without changing the outcome because the periods differ. Rule version opg-kzn-primary-v1 records these decisions. The denominator (the group used to calculate the proportion) contains adults who pass and have a clear receipt answer.</w:t>
       </w:r>
     </w:p>
     <w:p>
@@ -3545,7 +3545,7 @@
           <w:sz w:val="20"/>
           <w:szCs w:val="20"/>
         </w:rPr>
-        <w:t xml:space="preserve">For RQ1, I calculated both the ordinary count proportion and the person-weighted proportion: p = Σ(wᵢYᵢ)/Σwᵢ. Here, wᵢ is a person's weight, Yᵢ equals 1 for non-receipt and 0 for receipt, and Σ means add across people. Group comparisons describe differences; they do not establish causes.</w:t>
+        <w:t xml:space="preserve">RQ1 used both the ordinary count proportion and the person-weighted proportion: p = Σ(wᵢYᵢ)/Σwᵢ. Here, wᵢ is a person's weight, Yᵢ equals 1 for non-receipt and 0 for receipt, and Σ means add across people. Group comparisons describe differences; they do not establish causes.</w:t>
       </w:r>
     </w:p>
     <w:p>
@@ -3559,7 +3559,7 @@
           <w:sz w:val="20"/>
           <w:szCs w:val="20"/>
         </w:rPr>
-        <w:t xml:space="preserve">The released files lack strata (groups defined before sampling). I used derived primary sampling units, or PSUs (estimated groups selected before households in the survey sample), to estimate sampling uncertainty (variation between possible samples). The calculation allows a group to be sampled more than once. This cannot reproduce the complete survey design. Adults with unresolved screening information stay outside the proportion. I also tested receipt bounds (the lowest and highest rates if all unclear PASS receipt answers mean receipt or all mean non-receipt).</w:t>
+        <w:t xml:space="preserve">The released files lack strata (groups defined before sampling). Derived primary sampling units, or PSUs (estimated groups selected before households in the survey sample), supported an estimate of sampling uncertainty (variation between possible samples). The calculation allows a group to be sampled more than once. It cannot reproduce the complete survey design. Adults with unresolved screening information remain outside the proportion. Receipt bounds (the lowest and highest rates if all unclear PASS receipt answers mean receipt or all mean non-receipt) tested the effect of unclear receipt answers.</w:t>
       </w:r>
     </w:p>
     <w:p>
@@ -3587,7 +3587,7 @@
           <w:sz w:val="20"/>
           <w:szCs w:val="20"/>
         </w:rPr>
-        <w:t xml:space="preserve">D. How I checked predictions</w:t>
+        <w:t xml:space="preserve">D. Model specification and validation</w:t>
       </w:r>
     </w:p>
     <w:p>
@@ -3601,7 +3601,7 @@
           <w:sz w:val="20"/>
           <w:szCs w:val="20"/>
         </w:rPr>
-        <w:t xml:space="preserve">I used the unweighted logistic model to estimate probability (a chance from zero to one) of reported non-receipt. I did not rebalance recipients and non-recipients, automatically select variables, or choose a cutoff (a probability used to classify records). The model describes associations (differences that occur together in the data) after accounting for its other predictors. Age enters per decade above 60. Comparison categories are male, Grade 7 or above, urban formal and an office nearer than 5 km. Five predictors need six slopes (numbers setting each input's contribution) and an intercept (the model's baseline), because settlement needs two comparisons.</w:t>
+        <w:t xml:space="preserve">The unweighted logistic model estimated probability (a chance from zero to one) of reported non-receipt. The analysis did not rebalance recipients and non-recipients, automatically select variables or choose a cutoff (a probability used to classify records). The model describes associations (differences that occur together in the data) after accounting for other predictors. Age enters per decade above 60. Comparison categories are male, Grade 7 or above, urban formal and an office nearer than 5 km. Five predictor groups require six slopes (numbers setting each input's contribution) and an intercept (the model's baseline), because settlement requires two comparisons.</w:t>
       </w:r>
     </w:p>
     <w:p>
@@ -3615,7 +3615,7 @@
           <w:sz w:val="20"/>
           <w:szCs w:val="20"/>
         </w:rPr>
-        <w:t xml:space="preserve">Only one rural-formal adult reported non-receipt in the attempted seven-slope model. The training group (records used to learn the model settings) had no such case in that category when I excluded that person for testing. Decision D-052 combined rural formal with traditional settlement to support estimation, without claiming that these settings are equivalent. Marital status affects screening; income, receipt, derived labels and marital status do not enter the primary model.</w:t>
+        <w:t xml:space="preserve">Only one rural-formal adult reported non-receipt in the attempted seven-slope model. Excluding that person for testing left the training group (records used to learn the model settings) with no such case in that category. Decision D-052 combined rural formal with traditional settlement to support estimation, without claiming that these settings are equivalent. Marital status affects screening; income, receipt, derived labels and marital status do not enter the primary model.</w:t>
       </w:r>
     </w:p>
     <w:p>
@@ -3629,7 +3629,7 @@
           <w:sz w:val="20"/>
           <w:szCs w:val="20"/>
         </w:rPr>
-        <w:t xml:space="preserve">I made five folds (groups I took turns excluding when training). I kept households together and balanced the five folds by whether any member reported non-receipt. Seed 201415 (a setting that makes random splits repeatable) fixes this division. After interpreting skipped questions, I filled missing predictors using training-group statistics only. I never filled missing eligibility or outcome information. Each adult receives one out-of-fold, or OOF, probability (a prediction from a model trained without that adult's household).</w:t>
+        <w:t xml:space="preserve">Validation used five folds (groups excluded in turn during training). The split kept households together and balanced the folds by whether any member reported non-receipt. Seed 201415 (a setting that makes random splits repeatable) fixes this division. After interpreting skipped questions, the software filled missing predictors using training-group statistics only. It never filled missing eligibility or outcome information. Each adult received one out-of-fold, or OOF, probability (a prediction from a model trained without that adult's household).</w:t>
       </w:r>
     </w:p>
     <w:p>
@@ -3643,7 +3643,7 @@
           <w:sz w:val="20"/>
           <w:szCs w:val="20"/>
         </w:rPr>
-        <w:t xml:space="preserve">Precision (non-recipients among selected records) and recall (selected non-recipients among all non-recipients) vary across ranking cutoffs. I assessed average precision (precision averaged across increases in recall), AUC (how often the model ranks a non-recipient above a recipient), and Brier score (average squared probability error). I also checked calibration slope (whether predicted chances vary too much or too little; 1 is ideal) and calibration-in-the-large (the overall correction needed when I fix that slope at 1; zero is ideal). The intercept-only reference model (one without predictors) uses the training group's non-receipt rate. Bootstrap intervals (ranges from drawing repeated samples of the existing records) use 1,000 household samples and fixed OOF predictions. Without refitting, these intervals omit uncertainty from repeating model development.</w:t>
+        <w:t xml:space="preserve">Precision (non-recipients among selected records) and recall (selected non-recipients among all non-recipients) vary across ranking cutoffs. Evaluation measured average precision (precision averaged across increases in recall), AUC (how often the model ranks a non-recipient above a recipient) and Brier score (average squared probability error). It also assessed calibration slope (whether predicted chances vary too much or too little; 1 is ideal) and calibration-in-the-large (the overall correction with the slope fixed at 1; zero is ideal). The intercept-only reference model (one without predictors) uses the training group's non-receipt rate. Bootstrap intervals (ranges from drawing repeated samples of the existing records) used 1,000 household samples and fixed OOF predictions. Without model refitting, these intervals omit uncertainty from repeating model development.</w:t>
       </w:r>
     </w:p>
     <w:p>
@@ -3671,7 +3671,7 @@
           <w:sz w:val="20"/>
           <w:szCs w:val="20"/>
         </w:rPr>
-        <w:t xml:space="preserve">E. Testing alternative assumptions</w:t>
+        <w:t xml:space="preserve">E. Alternative assumptions</w:t>
       </w:r>
     </w:p>
     <w:p>
@@ -3685,7 +3685,7 @@
           <w:sz w:val="20"/>
           <w:szCs w:val="20"/>
         </w:rPr>
-        <w:t xml:space="preserve">S1 changes thresholds, S2 partnership assumptions, S3 rules about other grants, S4 income definition, S5 receipt period and S6 unresolved-receipt bounds. Each records the denominator, non-recipients, ordinary/person-weighted rates and internally validated model performance. S7 uses complete cases (people with all required predictors present). S8 replaces welfare access with a married indicator. S9 uses frequency weights (treating person weights as repeated-record contributions), keeping unweighted missing-value treatment and evaluation. This is not a full survey-design regression. S10 weights primary OOF measures without refitting. S11 groups validation folds by derived PSU. I keep these results separate from the primary analysis.</w:t>
+        <w:t xml:space="preserve">S1 changes thresholds, S2 partnership assumptions, S3 rules about other grants, S4 income definition, S5 receipt period and S6 unresolved-receipt bounds. Each records the denominator, non-recipients, ordinary/person-weighted rates and internally validated model performance. S7 uses complete cases (people with all required predictors present). S8 replaces welfare access with a married indicator. S9 uses frequency weights (treating person weights as repeated-record contributions), keeping unweighted missing-value treatment and evaluation. This is not a full survey-design regression. S10 weights primary OOF measures without refitting. S11 groups validation folds by derived PSU. These results remain separate from the primary analysis.</w:t>
       </w:r>
     </w:p>
     <w:p>
@@ -3727,7 +3727,7 @@
           <w:sz w:val="20"/>
           <w:szCs w:val="20"/>
         </w:rPr>
-        <w:t xml:space="preserve">The command python analysis/run_study.py links files, screens adults and calculates results. Run records retain settings, versions, seed, folds and checksums (file fingerprints used to detect changes). I saved coefficients (the model's numerical settings) from a model trained on all included adults in JSON (a text format for named data). Version opg-kzn-six-slope-v1 stores those and missing-value settings, without program code. Uploads never retrain it.</w:t>
+        <w:t xml:space="preserve">The command python analysis/run_study.py links survey files, screens adults and calculates results. Run records retain settings, versions, seed, folds and checksums (file fingerprints used to detect changes). The saved model stores coefficients (numerical model settings) and missing-value settings in JSON (a text format for named data), without executable program code. Version opg-kzn-six-slope-v1 uses the model trained on all included adults. Uploads do not retrain it.</w:t>
       </w:r>
     </w:p>
     <w:p>
@@ -3741,7 +3741,7 @@
           <w:sz w:val="20"/>
           <w:szCs w:val="20"/>
         </w:rPr>
-        <w:t xml:space="preserve">The local Streamlit app (software for building browser-based applications) has five sections: study context, upload/validation, eligibility/receipt, prediction/model and export/reproducibility. It accepts the historical opg-screen-v1 CSV (comma-separated table), including household members needed to check spouse resources. It rejects incorrect schema (required columns and allowed values), study context, duplicate identifiers, categories and numeric values. Limits are 20 MiB (mebibytes, each 1,048,576 bytes) and 50,000 rows. Uploads stay in memory during the current session (your interaction with the running app). Reports show generated row labels and omit submitted identifiers, raw income and household links. You can filter views and exports; summaries still include all uploaded adults who pass with resolved receipt.</w:t>
+        <w:t xml:space="preserve">The local app uses Streamlit (a Python framework for browser-based applications) and has five sections: study context, upload/validation, eligibility/receipt, prediction/model and export/reproducibility. It accepts historical opg-screen-v1 CSV files (comma-separated tables), including household members needed to check spouse resources. Validation rejects incorrect schema (required columns and allowed values), study context, duplicate identifiers, categories and numeric values. Limits are 20 MiB (mebibytes, each 1,048,576 bytes) and 50,000 rows. Uploads stay in memory during the current session (interaction with the running app). Reports use generated row labels and omit submitted identifiers, raw income and household links. Users can filter views and exports; summary rates retain all uploaded adults who pass with resolved receipt.</w:t>
       </w:r>
     </w:p>
     <w:p>
@@ -3755,7 +3755,7 @@
           <wp:inline distT="0" distB="0" distL="0" distR="0">
             <wp:extent cx="3200400" cy="2343150"/>
             <wp:effectExtent t="0" r="0" b="0" l="0"/>
-            <wp:docPr id="1" name="Fig. 2. Research and app workflows. Both use the same screening rules. Predictions for held-out households (households excluded from training) remain separate from app scores calculated using the model trained on all included adults." descr="Fig. 2. Research and app workflows. Both use the same screening rules. Predictions for held-out households (households excluded from training) remain separate from app scores calculated using the model trained on all included adults." title="Fig. 2. Research and app workflows. Both use the same screening rules. Predictions for held-out households (households excluded from training) remain separate from app scores calculated using the model trained on all included adults."/>
+            <wp:docPr id="1" name="Fig. 2. Research and app workflows share screening rules. Held-out predictions (predictions for households excluded from training) remain separate from app scores calculated using the model trained on all included adults." descr="Fig. 2. Research and app workflows share screening rules. Held-out predictions (predictions for households excluded from training) remain separate from app scores calculated using the model trained on all included adults." title="Fig. 2. Research and app workflows share screening rules. Held-out predictions (predictions for households excluded from training) remain separate from app scores calculated using the model trained on all included adults."/>
             <wp:cNvGraphicFramePr>
               <a:graphicFrameLocks xmlns:a="http://schemas.openxmlformats.org/drawingml/2006/main" noChangeAspect="1"/>
             </wp:cNvGraphicFramePr>
@@ -3806,7 +3806,7 @@
           <w:sz w:val="16"/>
           <w:szCs w:val="16"/>
         </w:rPr>
-        <w:t xml:space="preserve">Fig. 2. Research and app workflows. Both use the same screening rules. Predictions for held-out households (households excluded from training) remain separate from app scores calculated using the model trained on all included adults.</w:t>
+        <w:t xml:space="preserve">Fig. 2. Research and app workflows share screening rules. Held-out predictions (predictions for households excluded from training) remain separate from app scores calculated using the model trained on all included adults.</w:t>
       </w:r>
     </w:p>
     <w:p>
@@ -3820,7 +3820,7 @@
           <w:sz w:val="20"/>
           <w:szCs w:val="20"/>
         </w:rPr>
-        <w:t xml:space="preserve">The app reuses screening rules, coefficients and missing-value settings; uploads never retrain it. It scores only supported adults who pass with resolved receipt. Saved training statistics fill partly missing predictors; records missing every categorical predictor (an input with named groups) remain unscored. Integrity checks link model/evaluation files to the scientific and predictor code. The app separately labels historical OOF evaluation and uploaded scores from the model trained on all included adults; uploaded records may overlap its training data. CSV, JSON and ZIP (compressed file bundle) reports include classifications, reasons, supported probabilities, versions and an audit manifest (a record of settings and file checksums). The downloadable minimum viable product, or MVP (the working prototype), uses invented data and excludes raw survey files, historical respondent outputs and Git version history.</w:t>
+        <w:t xml:space="preserve">The app reuses the screening rules and saved model settings. It scores only supported adults who pass with resolved receipt. Saved training statistics fill partly missing predictors; records missing every categorical predictor (an input with named groups) remain unscored. Integrity checks link model and evaluation files to the analysis and predictor code. The interface labels historical OOF results separately from uploaded scores; uploaded records may overlap training data. CSV, JSON and ZIP (compressed file bundle) reports contain classifications, reasons, supported probabilities, versions and an audit manifest (settings and file checksums). The downloadable minimum viable product, or MVP (the working prototype), uses invented data and excludes raw survey files, historical respondent outputs and Git version history.</w:t>
       </w:r>
     </w:p>
     <w:p>
@@ -3834,7 +3834,7 @@
           <w:sz w:val="20"/>
           <w:szCs w:val="20"/>
         </w:rPr>
-        <w:t xml:space="preserve">I checked expected screening decisions, excluded predictors, links, repeated runs, reports and saved predictions. I compared the CLI (command-line interface, where you type commands) with the UI (user interface, the app screens), including invalid inputs and outdated results. My Windows walkthrough shows local functionality. A task sheet for three to five consenting people exists, but no participant study has taken place.</w:t>
+        <w:t xml:space="preserve">Software checks compared screening decisions with expected results and tested excluded predictors, links, repeated runs, reports and saved predictions. Further checks compared the CLI (command-line interface, which accepts typed commands) with the UI (user interface, the app screens), including invalid inputs and outdated results. The owner's Windows walkthrough demonstrated local functionality. A task sheet supports future testing with three to five consenting participants; no participant study has taken place.</w:t>
       </w:r>
     </w:p>
     <w:p>
@@ -3890,7 +3890,7 @@
           <w:sz w:val="20"/>
           <w:szCs w:val="20"/>
         </w:rPr>
-        <w:t xml:space="preserve">A. Who passed and reported non-receipt?</w:t>
+        <w:t xml:space="preserve">A. Study group and reported non-receipt</w:t>
       </w:r>
     </w:p>
     <w:p>
@@ -3904,7 +3904,7 @@
           <w:sz w:val="20"/>
           <w:szCs w:val="20"/>
         </w:rPr>
-        <w:t xml:space="preserve">The survey records 15,388 people in 3,686 KwaZulu-Natal households. Table IV shows my selection. Among 117 failures, 93 exceed the income ceiling and 25 report a disability grant; one meets both conditions. None reports a war-veterans grant. Among 187 unresolved adults, 105 are married, mostly with a non-resident spouse, and 63 report living together. Unresolved adults outnumber non-recipients.</w:t>
+        <w:t xml:space="preserve">The survey included 15,388 people in 3,686 KwaZulu-Natal households. Table IV shows the selection steps. Among 117 failures, 93 exceeded the income ceiling and 25 reported a disability grant; one met both conditions. None reported a war-veterans grant. Among 187 unresolved adults, 105 were married, mostly with a non-resident spouse, and 63 reported living together. Unresolved adults outnumbered non-recipients.</w:t>
       </w:r>
     </w:p>
     <w:p>
@@ -3923,7 +3923,7 @@
           <w:sz w:val="16"/>
           <w:szCs w:val="16"/>
         </w:rPr>
-        <w:t xml:space="preserve">Table IV. How I selected the KwaZulu-Natal study group</w:t>
+        <w:t xml:space="preserve">Table IV. KwaZulu-Natal study group at each screening step</w:t>
       </w:r>
     </w:p>
     <w:tbl>
@@ -5075,7 +5075,7 @@
           <w:sz w:val="20"/>
           <w:szCs w:val="20"/>
         </w:rPr>
-        <w:t xml:space="preserve">Of these 1,013 adults, 67 report non-receipt: 6.61% without weights and 7.49% with person weights. Using 345 derived PSUs gives a standard error (the estimated sampling variation of the percentage) of 1.3 percentage points. A bell-shaped sampling approximation gives a 95% confidence interval (a range that aims to cover the population percentage in 95% of repeated samples) of 4.9%–10.0%. The missing strata limit this approximation. All 1,013 PASS answers agree with preceding-year OPG income, so those checks change nothing. Table V compares five predictors before filling missing values. Average age and percentages describe each receipt group. Its percentages describe receipt-group composition, not non-receipt rates or predictions.</w:t>
+        <w:t xml:space="preserve">Of these 1,013 adults, 67 reported non-receipt: 6.61% without weights and 7.49% with person weights. The calculation used 345 derived PSUs and gave a standard error (the estimated sampling variation of the percentage) of 1.3 percentage points. A bell-shaped sampling approximation gave a 95% confidence interval (a range that aims to cover the population percentage in 95% of repeated samples) of 4.9%–10.0%. Missing strata limit this approximation. All 1,013 PASS answers agreed with preceding-year OPG income, so those checks changed nothing. Table V compares five predictors before filling missing values. Average age and percentages describe each receipt group. The percentages describe receipt-group composition, not non-receipt rates or predictions.</w:t>
       </w:r>
     </w:p>
     <w:p>
@@ -5923,7 +5923,7 @@
           <w:sz w:val="20"/>
           <w:szCs w:val="20"/>
         </w:rPr>
-        <w:t xml:space="preserve">Non-recipients are younger before weighting, more often men, more educated and more often urban formal residents. Weights bring average ages closer.</w:t>
+        <w:t xml:space="preserve">Non-recipients were younger before weighting, more often men, more educated and more often urban formal residents. Weights brought average ages closer.</w:t>
       </w:r>
     </w:p>
     <w:p>
@@ -5951,7 +5951,7 @@
           <w:sz w:val="20"/>
           <w:szCs w:val="20"/>
         </w:rPr>
-        <w:t xml:space="preserve">B. What changes when I alter screening rules?</w:t>
+        <w:t xml:space="preserve">B. Screening sensitivity</w:t>
       </w:r>
     </w:p>
     <w:p>
@@ -5965,7 +5965,7 @@
           <w:sz w:val="20"/>
           <w:szCs w:val="20"/>
         </w:rPr>
-        <w:t xml:space="preserve">Table VI shows sensitivity analyses (repeating the analysis after changing assumptions). Events (adults reporting non-receipt) and N (people included) identify each group. Unw. and Wtd. abbreviate unweighted and person-weighted. Slope means calibration slope in Tables VI and VIII. Compared with S0, S1b/S1d add two people/two events. S2a, S2b, S2c and S2d add 59/4, 60/2, 8/0 and 68/2 people/events. S3 adds 19 people/15 events; S4b removes six people but no events. Weighted non-receipt ranges from 7.12% to 9.06%.</w:t>
+        <w:t xml:space="preserve">Table VI shows sensitivity analyses (repeating the analysis after changing assumptions). Events (adults reporting non-receipt) and N (people included) identify each group. Unw. and Wtd. abbreviate unweighted and person-weighted. Slope means calibration slope in Tables VI and VIII. Compared with S0, S1b/S1d added two people/two events. S2a, S2b, S2c and S2d added 59/4, 60/2, 8/0 and 68/2 people/events. S3 added 19 people/15 events; S4b removed six people but no events. Weighted non-receipt ranged from 7.12% to 9.06%.</w:t>
       </w:r>
     </w:p>
     <w:p>
@@ -9001,7 +9001,7 @@
           <w:sz w:val="20"/>
           <w:szCs w:val="20"/>
         </w:rPr>
-        <w:t xml:space="preserve">C. How well do held-out predictions work?</w:t>
+        <w:t xml:space="preserve">C. Held-out prediction</w:t>
       </w:r>
     </w:p>
     <w:p>
@@ -9015,7 +9015,7 @@
           <w:sz w:val="20"/>
           <w:szCs w:val="20"/>
         </w:rPr>
-        <w:t xml:space="preserve">All five folds converge (reach a stable fit). Figure 4 uses five similarly sized bins (groups). The highest bin has average prediction 0.188 and 35/203 non-recipients (17.2%); the lowest has average 0.0107 and 3/206 non-recipients (1.5%).</w:t>
+        <w:t xml:space="preserve">All five folds converged (reached a stable fit). Figure 4 uses five similarly sized bins (groups). The highest bin had average prediction 0.188 and 35/203 non-recipients (17.2%); the lowest had average 0.0107 and 3/206 non-recipients (1.5%).</w:t>
       </w:r>
     </w:p>
     <w:p>
@@ -9849,7 +9849,7 @@
           <w:sz w:val="16"/>
           <w:szCs w:val="16"/>
         </w:rPr>
-        <w:t xml:space="preserve">I pool unweighted OOF predictions: 1,013 people/67 events. The intervals use percentile bounds (the middle 95% of resampled estimates) from 1,000 household resamples of fixed predictions. All reported intervals have zero invalid resamples. I do not refit models or missing-value settings. The intercept-only reference uses the training group's non-receipt rate. Dashes mean unavailable measures/intervals, rather than zero or chance performance.</w:t>
+        <w:t xml:space="preserve">Estimates pool unweighted OOF predictions: 1,013 people/67 events. The intervals use percentile bounds (the middle 95% of resampled estimates) from 1,000 household resamples of fixed predictions. All reported intervals have zero invalid resamples. Resampling did not refit models or missing-value settings. The intercept-only reference uses the training group's non-receipt rate. Dashes mean unavailable measures/intervals, rather than zero or chance performance.</w:t>
       </w:r>
     </w:p>
     <w:p>
@@ -9928,7 +9928,7 @@
           <w:sz w:val="20"/>
           <w:szCs w:val="20"/>
         </w:rPr>
-        <w:t xml:space="preserve">Odds (the chance of non-receipt divided by the chance of receipt) let me compare groups. The odds ratio (one group's odds divided by the other's) for women versus men is 0.39. Its Wald interval (a range calculated from a model term and its standard error) is 0.23–0.66. Schooling below Grade 7 versus Grade 7 or above gives 0.24 (0.13–0.43). I calculated these from the model trained on all included adults. Age, settlement and welfare-distance intervals include 1. These associations do not describe held-out effects or causes.</w:t>
+        <w:t xml:space="preserve">Odds (the chance of non-receipt divided by the chance of receipt) support group comparisons. The odds ratio (one group's odds divided by the other's) for women versus men was 0.39. Its Wald interval (a range calculated from a model term and its standard error) was 0.23–0.66. Schooling below Grade 7 versus Grade 7 or above gave 0.24 (0.13–0.43). The model trained on all included adults produced these estimates. Age, settlement and welfare-distance intervals included 1. These associations describe odds, not probability reductions, held-out performance or causes.</w:t>
       </w:r>
     </w:p>
     <w:p>
@@ -11769,7 +11769,7 @@
           <w:sz w:val="20"/>
           <w:szCs w:val="20"/>
         </w:rPr>
-        <w:t xml:space="preserve">Across alternatives, AUC ranges from 0.736 to 0.763; Brier and calibration slopes also change.</w:t>
+        <w:t xml:space="preserve">Across alternatives, AUC ranged from 0.736 to 0.763; Brier and calibration slopes also changed.</w:t>
       </w:r>
     </w:p>
     <w:p>
@@ -11797,7 +11797,7 @@
           <w:sz w:val="20"/>
           <w:szCs w:val="20"/>
         </w:rPr>
-        <w:t xml:space="preserve">D. How did I check the app?</w:t>
+        <w:t xml:space="preserve">D. Software verification</w:t>
       </w:r>
     </w:p>
     <w:p>
@@ -11811,7 +11811,7 @@
           <w:sz w:val="20"/>
           <w:szCs w:val="20"/>
         </w:rPr>
-        <w:t xml:space="preserve">The 26 checks in Table IX include 22 synthetic screening cases (invented records with specified expected decisions), two income-schedule checks, one forbidden-predictor check and one run trace. Boundary, spouse, grant and receipt decisions match their specifications. Two research runs produced 14 files with exactly matching contents and kept the study-group checksum.</w:t>
+        <w:t xml:space="preserve">The 26 checks in Table IX included 22 synthetic screening cases (invented records with specified expected decisions), two income-schedule checks, one forbidden-predictor check and one run trace. Boundary, spouse, grant and receipt decisions matched their specifications. Two research runs produced 14 files with exactly matching contents and retained the study-group checksum.</w:t>
       </w:r>
     </w:p>
     <w:p>
@@ -12766,7 +12766,7 @@
           <w:sz w:val="20"/>
           <w:szCs w:val="20"/>
         </w:rPr>
-        <w:t xml:space="preserve">The Windows walkthrough gives six synthetic classifications: two resolved passes, one recipient and one non-recipient. Matching predictors give both scores of 0.1853. The invented 50% rate is not the survey non-receipt rate. I provided screenshots and six extracted reports. The checks did not inspect the ZIP container. Regenerated outputs, checksums, summaries and model/source versions pass 50 checks. This checks functions/exports, not independent execution or representative task times, errors or ease.</w:t>
+        <w:t xml:space="preserve">The owner's Windows walkthrough produced six synthetic classifications: two resolved passes, one recipient and one non-recipient. Matching predictors gave both scores of 0.1853. The invented 50% rate is not the survey non-receipt rate. Screenshots and six extracted reports documented the walkthrough. The checks did not inspect the ZIP container. Regenerated outputs, checksums, summaries and model/source versions passed 50 checks. This verifies functions and exports, not independent execution or representative task times, errors or ease.</w:t>
       </w:r>
     </w:p>
     <w:p>
@@ -12822,7 +12822,7 @@
           <w:sz w:val="20"/>
           <w:szCs w:val="20"/>
         </w:rPr>
-        <w:t xml:space="preserve">A. Whose non-receipt does the study measure?</w:t>
+        <w:t xml:space="preserve">A. Scope of measured non-receipt</w:t>
       </w:r>
     </w:p>
     <w:p>
@@ -12836,7 +12836,7 @@
           <w:sz w:val="20"/>
           <w:szCs w:val="20"/>
         </w:rPr>
-        <w:t xml:space="preserve">RQ1 measures non-receipt among historical KwaZulu-Natal adults who pass the screen and resolve receipt: 67/1,013, or 6.61% unweighted and 7.49% person-weighted. This does not measure unlawful denial or non-receipt among everyone legally entitled. The 187 unresolved adults outnumber the 67 events. Excluding them changes the population I describe, regardless of sampling uncertainty. Stable estimates cannot reveal their receipt.</w:t>
+        <w:t xml:space="preserve">RQ1 measures non-receipt among historical KwaZulu-Natal adults who pass the screen and resolve receipt: 67/1,013, or 6.61% unweighted and 7.49% person-weighted. This does not measure unlawful denial or non-receipt among everyone legally entitled. The 187 unresolved adults outnumbered the 67 events. Excluding them changes the population described, regardless of sampling uncertainty. Stable estimates cannot reveal their receipt.</w:t>
       </w:r>
     </w:p>
     <w:p>
@@ -12850,7 +12850,7 @@
           <w:sz w:val="20"/>
           <w:szCs w:val="20"/>
         </w:rPr>
-        <w:t xml:space="preserve">S2d adds 68 people but only two events, reducing weighted non-receipt to 7.12%. Partnership rules mainly change the denominator. S3 retains adults with incompatible grants, adds 19 people/15 events and raises non-receipt to 9.06%, the largest tested change. Similar AUC cannot justify rules or establish equivalent populations. Ralston studies rural age-eligible people [3]; Godfrey studies households' grants [4]. Different units, programmes, screens and places prevent direct comparison of their percentages. I add a provincial estimate with an explicit resource screen. High receipt can involve access costs [13], [14]; it cannot prove low burden.</w:t>
+        <w:t xml:space="preserve">S2d added 68 people but only two events, reducing weighted non-receipt to 7.12%. Partnership rules mainly changed the denominator. S3 retained adults with incompatible grants, added 19 people/15 events and raised non-receipt to 9.06%, the largest tested change. Similar AUC cannot justify screening rules or establish equivalent populations. Ralston studies rural age-eligible people [3]; Godfrey studies households' grants [4]. Different units, programmes, screens and places prevent direct comparison of their percentages. This study adds a provincial estimate with an explicit resource screen. High receipt can involve access costs [13], [14]; it cannot prove low burden.</w:t>
       </w:r>
     </w:p>
     <w:p>
@@ -12878,7 +12878,7 @@
           <w:sz w:val="20"/>
           <w:szCs w:val="20"/>
         </w:rPr>
-        <w:t xml:space="preserve">B. What do the predictions tell you?</w:t>
+        <w:t xml:space="preserve">B. Predictive performance and interpretation</w:t>
       </w:r>
     </w:p>
     <w:p>
@@ -12892,7 +12892,7 @@
           <w:sz w:val="20"/>
           <w:szCs w:val="20"/>
         </w:rPr>
-        <w:t xml:space="preserve">RQ2 assesses four properties. AUC 0.752 describes ranking held-out non-recipients above recipients, not classification accuracy. AP 0.203 summarises precision–recall ranking across cutoffs against a 6.61% event rate, not precision at one cutoff [16]. Brier falls from 0.0618 to 0.0578: a modest 0.0040 reduction in squared probability error. To check average bias, I estimate an intercept correction while fixing the calibration slope at 1. The ideal is zero. The estimate 0.020 and interval spanning zero do not prove perfect agreement. Slope 0.836 suggests that predictions may be too extreme, but its 0.591–1.133 interval includes the ideal 1 [17]. 67 events inform these checks [18]. Most adults in even the highest-risk bin report receipt.</w:t>
+        <w:t xml:space="preserve">RQ2 assesses four properties. AUC 0.752 describes ranking held-out non-recipients above recipients, not classification accuracy. AP 0.203 summarises precision–recall ranking across cutoffs against a 6.61% event rate, not precision at one cutoff [16]. Brier fell from 0.0618 to 0.0578: a modest 0.0040 reduction in squared probability error. An intercept correction, with calibration slope fixed at 1, checks average bias. The ideal correction is zero. The estimate 0.020 and interval spanning zero do not prove perfect agreement. Slope 0.836 suggests predictions may be too extreme, but its 0.591–1.133 interval includes the ideal 1 [17]. Only 67 events informed these checks [18]. Most adults in even the highest-risk bin reported receipt.</w:t>
       </w:r>
     </w:p>
     <w:p>
@@ -12906,7 +12906,7 @@
           <w:sz w:val="20"/>
           <w:szCs w:val="20"/>
         </w:rPr>
-        <w:t xml:space="preserve">Table II separates concepts from measured predictors. Schooling suggests learning costs; distance/settlement suggest compliance costs [13], [14]. These odds ratios describe the screened group, not OOF effects or burden. Lower schooling accompanies receipt, against a simple information-barrier expectation. Fewer other resources or screening selection could explain this; I test neither explanation. Uncertain office/settlement associations neither confirm nor rule out compliance costs. I do not measure psychological costs. Without awareness, visits, document demands or administrative decisions, I cannot explain non-receipt.</w:t>
+        <w:t xml:space="preserve">Table II separates concepts from measured predictors. Schooling suggests learning costs; distance/settlement suggest compliance costs [13], [14]. The odds ratios describe the screened group, not OOF effects or measured burden. Lower schooling accompanied receipt, contrary to a simple information-barrier expectation. Fewer other resources or screening selection could explain this; the analysis tested neither explanation. Uncertain office/settlement associations neither confirm nor rule out compliance costs. The survey does not measure psychological costs. Without awareness, visits, document demands or administrative decisions, this analysis cannot explain non-receipt.</w:t>
       </w:r>
     </w:p>
     <w:p>
@@ -12920,7 +12920,7 @@
           <w:sz w:val="20"/>
           <w:szCs w:val="20"/>
         </w:rPr>
-        <w:t xml:space="preserve">Table VIII separates sample, predictor and evaluation changes. S7 removes 21 people/four events (992/63). Its lower Brier concerns a different sample and cannot establish whether filling missing values is better. S8 substitutes marriage for welfare access and performs similarly. S9 weights fitting but not evaluation; it does not model the full survey design. S10 reweights the same primary OOF predictions without retraining, raising Brier to 0.0641. S11 groups folds by derived PSU and also performs similarly. S8–S11 keep 1,013 people/67 events. These checks expose internal assumptions, rather than establish model superiority or reliability elsewhere [19], [20].</w:t>
+        <w:t xml:space="preserve">Table VIII separates sample, predictor and evaluation changes. S7 removed 21 people/four events (992/63). Its lower Brier concerns a different sample and cannot establish whether filling missing values is better. S8 substituted marriage for welfare access and performed similarly. S9 weighted fitting but not evaluation; it does not model the full survey design. S10 reweighted the same primary OOF predictions without retraining, raising Brier to 0.0641. S11 grouped folds by derived PSU and also performed similarly. S8–S11 retained 1,013 people/67 events. These checks expose internal assumptions; they do not establish model superiority or reliability elsewhere [19], [20].</w:t>
       </w:r>
     </w:p>
     <w:p>
@@ -12948,7 +12948,7 @@
           <w:sz w:val="20"/>
           <w:szCs w:val="20"/>
         </w:rPr>
-        <w:t xml:space="preserve">C. What does RQ3 establish?</w:t>
+        <w:t xml:space="preserve">C. Reproducibility and usability</w:t>
       </w:r>
     </w:p>
     <w:p>
@@ -12962,7 +12962,7 @@
           <w:sz w:val="20"/>
           <w:szCs w:val="20"/>
         </w:rPr>
-        <w:t xml:space="preserve">RQ3 has six evidence layers. Synthetic cases check rule decisions; matching file contents check repeatability; UI–CLI agreement checks software paths; JSON reload checks saved-model predictions. The owner walkthrough checks a synthetic workflow; participant testing would assess human usability. Table IX supports the first five within tested conditions. Automated agreement cannot establish independent user ease, acceptance or field success. Saved sources and run/validation reports expose versions, checksums and test conditions.</w:t>
+        <w:t xml:space="preserve">RQ3 has six evidence layers. Synthetic cases check rule decisions; matching file contents check repeatability; UI–CLI agreement checks software paths; JSON reload checks saved-model predictions. The owner walkthrough checks a synthetic workflow; participant testing would assess human usability. Table IX supports the first five within tested conditions. Automated agreement cannot establish independent user ease, acceptance or field success. Saved sources and run/validation reports document versions, checksums and test conditions.</w:t>
       </w:r>
     </w:p>
     <w:p>
@@ -12976,7 +12976,7 @@
           <w:sz w:val="20"/>
           <w:szCs w:val="20"/>
         </w:rPr>
-        <w:t xml:space="preserve">I separate historical OOF results from uploaded scores; uploads may overlap training data. Matching saved scores checks reloading, not new predictive accuracy. You can inspect the computations, but representative user clarity remains untested. The task sheet supports future testing.</w:t>
+        <w:t xml:space="preserve">The app separates historical OOF results from uploaded scores; uploads may overlap training data. Matching saved scores checks reloading, not new predictive accuracy. The software exposes its computations, but representative user clarity remains untested. The task sheet supports future testing.</w:t>
       </w:r>
     </w:p>
     <w:p>
@@ -13004,7 +13004,7 @@
           <w:sz w:val="20"/>
           <w:szCs w:val="20"/>
         </w:rPr>
-        <w:t xml:space="preserve">D. Could this work elsewhere?</w:t>
+        <w:t xml:space="preserve">D. Transfer to other settings</w:t>
       </w:r>
     </w:p>
     <w:p>
@@ -13018,7 +13018,7 @@
           <w:sz w:val="20"/>
           <w:szCs w:val="20"/>
         </w:rPr>
-        <w:t xml:space="preserve">I study screened KwaZulu-Natal adults in LCS 2014/2015. Provinces and periods differ in settlement, services, policy and reporting. Application, award and payment records measure different events from reported receipt and can contain linking errors. I have tested no independent province, period or administrative sample. Transfer needs comparable populations/outcomes, justified period-specific rules and independent ranking/calibration checks [19], [20]. Making the app available cannot establish suitability for today's applicants.</w:t>
+        <w:t xml:space="preserve">This study analysed screened KwaZulu-Natal adults in LCS 2014/2015. Provinces and periods differ in settlement, services, policy and reporting. Application, award and payment records measure different events from reported receipt and can contain linking errors. The study did not test the model on an independent province, period or administrative sample. Transfer requires comparable populations/outcomes, justified period-specific rules and independent ranking/calibration checks [19], [20]. Making the app available cannot establish suitability for today's applicants.</w:t>
       </w:r>
     </w:p>
     <w:p>
@@ -13060,7 +13060,7 @@
           <w:sz w:val="20"/>
           <w:szCs w:val="20"/>
         </w:rPr>
-        <w:t xml:space="preserve">I cannot fully observe legal eligibility: the survey-based resource measure omits assets, deemed income (income the law assigns rather than the survey observes) and deductions. Income and receipt reports may contain errors. Cross-sectional data (answers from one survey period rather than repeated follow-up of the same people) cannot establish the order of events. Few events, unresolved eligibility, missing strata and resampling fixed predictions without refitting limit inference. Household sampling excludes institutionalised older adults. I have not tested participant usability or another population.</w:t>
+        <w:t xml:space="preserve">The survey cannot fully establish legal eligibility: its resource measure omits assets, deemed income (income the law assigns rather than the survey observes) and deductions. Income and receipt reports may contain errors. Cross-sectional data (answers from one survey period rather than repeated follow-up of the same people) cannot establish the order of events. Few events, unresolved eligibility, missing strata and resampling fixed predictions without refitting limit inference. Household sampling excludes institutionalised older adults. Participant usability and performance in another population remain untested.</w:t>
       </w:r>
     </w:p>
     <w:p>
@@ -13074,7 +13074,7 @@
           <w:sz w:val="20"/>
           <w:szCs w:val="20"/>
         </w:rPr>
-        <w:t xml:space="preserve">Survey access conditions and disclosure requirements (rules that limit sharing respondent information) apply. I demonstrate and test interfaces with synthetic records. The downloadable package excludes survey records. Displays and reports omit submitted identifiers and raw income. These controls do not show disclosure review of every historical repository file. The project records contain no DUT (Durban University of Technology) ethics determination (an institutional decision on the ethics requirements for this study). I therefore claim no approval. The app explains measurement choices; it neither decides grants nor ranks named applicants.</w:t>
+        <w:t xml:space="preserve">Survey access conditions and disclosure requirements (rules that limit sharing respondent information) apply. Interface demonstrations and tests use synthetic records. The downloadable package excludes survey records. Displays and reports omit submitted identifiers and raw income. These controls do not establish disclosure review of every historical repository file. The project records contain no DUT (Durban University of Technology) ethics determination (an institutional decision on the ethics requirements for this study). The paper therefore claims no approval. The app explains measurement choices; it neither decides grants nor ranks named applicants.</w:t>
       </w:r>
     </w:p>
     <w:p>
@@ -13116,7 +13116,7 @@
           <w:sz w:val="20"/>
           <w:szCs w:val="20"/>
         </w:rPr>
-        <w:t xml:space="preserve">I estimate historical screened non-receipt at 6.6% unweighted and 7.5% person-weighted; alternatives give 7.1%–9.1%. Rules about other grants change results more than the ceiling, and unresolved cases make the denominator central. Five predictor groups/six slopes give AUC 0.752, AP 0.203 and Brier 0.0578: moderate internal ranking with slightly less probability error. You can inspect the software's reproduced screen, receipt categories and scores under tested conditions. I provide a historical benchmark (a documented result that later studies can compare with). I have not established human usability, causes, legal entitlement or performance elsewhere.</w:t>
+        <w:t xml:space="preserve">Historical screened non-receipt was 6.6% unweighted and 7.5% person-weighted; alternatives gave 7.1%–9.1%. Rules about other grants changed results more than the ceiling, and unresolved cases made the denominator central. Five predictor groups/six slopes gave AUC 0.752, AP 0.203 and Brier 0.0578: moderate internal ranking with slightly less probability error. The software reproduces screening, receipt categories and scores for inspection under tested conditions. The study provides a historical benchmark (a documented result that later studies can compare with). It does not establish human usability, causes, legal entitlement or performance elsewhere.</w:t>
       </w:r>
     </w:p>
     <w:p>

</xml_diff>

<commit_message>
Trim basic definitions and integrate the literature review
</commit_message>
<xml_diff>
--- a/paper/Jawe_OPG_nonreceipt_KZN.docx
+++ b/paper/Jawe_OPG_nonreceipt_KZN.docx
@@ -89,7 +89,7 @@
           <w:sz w:val="18"/>
           <w:szCs w:val="18"/>
         </w:rPr>
-        <w:t xml:space="preserve">Abstract—This study analysed South Africa’s Older Person’s Grant (OPG) and reported non-receipt (respondents say they receive no OPG). It used the Living Conditions Survey (LCS) 2014/2015 for adults aged 60 or older in KwaZulu-Natal (KZN). The study used administrative-burden theory (accessing services requires information, effort and encounters with officials) to choose predictors (survey characteristics used to estimate non-receipt). Screening (checking survey answers against research rules) identified apparently eligible adults (people who pass those checks), without establishing legal entitlement (a right to the grant under all legal conditions). Among 1,013 adults who passed with clear receipt answers, 67 reported non-receipt: 6.6% unweighted (counting each person equally) and 7.5% person-weighted (allowing for how many people each respondent represents). Alternative screening rules gave weighted rates of 7.1%–9.1%. Logistic regression (a model for two outcomes) used five characteristics. The evaluation tested predictions on households excluded when building the model. AUC (area under the receiver operating characteristic curve; how well the model ranks non-recipients above recipients) was 0.752; average precision (AP; the proportion of actual non-recipients in ranked selections, averaged as more are identified) was 0.203. The Brier score (average squared gap between predicted chances and recorded outcomes) was 0.0578, compared with 0.0618 when predictions used only the non-receipt rate of the group used to build the model. Checks supported reproducibility (repeated runs give the same results). The application displays rules, decisions, scores and reports. No participant study tested ease of use. These results do not establish entitlement, explain non-receipt, or demonstrate performance elsewhere.</w:t>
+        <w:t xml:space="preserve">Abstract—This study analysed reported Older Person’s Grant (OPG) non-receipt among adults aged 60 or older in KwaZulu-Natal (KZN), using the Living Conditions Survey (LCS) 2014/2015. The study used administrative-burden theory to choose predictors and observable research rules to identify apparently eligible adults. Screening did not establish legal entitlement. Among 1,013 adults who passed with resolved receipt, 67 reported non-receipt: 6.6% unweighted and 7.5% person-weighted. Alternative screening rules gave weighted rates of 7.1%–9.1%. Logistic regression used five predictor groups and household-held-out validation. AUC (area under the receiver operating characteristic curve) was 0.752; average precision (AP) was 0.203. The Brier score was 0.0578, compared with 0.0618 for an intercept-only reference using training-group prevalence. Checks supported reproducibility. The application displays rules, decisions, scores and reports. No participant study tested ease of use. These results do not establish entitlement, explain non-receipt, or demonstrate performance elsewhere.</w:t>
       </w:r>
     </w:p>
     <w:p>
@@ -173,7 +173,7 @@
           <w:sz w:val="20"/>
           <w:szCs w:val="20"/>
         </w:rPr>
-        <w:t xml:space="preserve">The analysis separates screening, reported receipt (a respondent’s grant answer) and legal entitlement. Passing the research screen does not mean approval by the South African Social Security Agency [5]. Non-receipt can reflect high income, no application, a pending decision or incomplete information. The analysis must define the screened group before calculating its non-receipt percentage; missing spouse income can change that group.</w:t>
+        <w:t xml:space="preserve">The analysis separates screening, reported receipt and legal entitlement. Passing the research screen does not mean approval by the South African Social Security Agency [5]. Non-receipt can reflect high income, no application, a pending decision or incomplete information. The analysis must define the screened group before calculating its non-receipt percentage; missing spouse income can change that group.</w:t>
       </w:r>
     </w:p>
     <w:p>
@@ -187,7 +187,7 @@
           <w:sz w:val="20"/>
           <w:szCs w:val="20"/>
         </w:rPr>
-        <w:t xml:space="preserve">The study aims to develop and evaluate an interpretable research tool (software with inspectable rules and results) for analysing reported OPG non-receipt among apparently eligible older adults in KwaZulu-Natal using the Living Conditions Survey (LCS) 2014/2015. Four objectives guide the work: document the included population, describe non-receipt using survey weights (how many people each respondent represents), test predictions on excluded households, and assess correctness, reproducibility (whether repeated runs produce the same results) and clarity.</w:t>
+        <w:t xml:space="preserve">The study aims to develop and evaluate an interpretable research tool for analysing reported OPG non-receipt among apparently eligible older adults in KwaZulu-Natal using the Living Conditions Survey (LCS) 2014/2015. Four objectives guide the work: document the included population, describe non-receipt using survey weights, test predictions on excluded households, and assess correctness, reproducibility and clarity.</w:t>
       </w:r>
     </w:p>
     <w:p>
@@ -271,7 +271,7 @@
           <w:sz w:val="20"/>
           <w:szCs w:val="20"/>
         </w:rPr>
-        <w:t xml:space="preserve">The earlier proposal reported a structured literature review (a search using specified sources and selection steps). It searched Scopus, Dimensions, IEEE Xplore, SABINET/African Journals Online, Google Scholar and Statistics South Africa/DataFirst for grant, access, non-receipt and prediction research. It reported 511 records: 136 duplicates removed, 375 titles/abstracts screened, 222 excluded, 153 full texts assessed, 98 further exclusions and 55 retained sources. These are earlier reported counts, rather than a new search or 55 OPG studies. The retained sources address different grants, places, people/households and measured outcomes; they cannot supply one combined percentage.</w:t>
+        <w:t xml:space="preserve">The literature review covered grant access, non-receipt and prediction research from Scopus, Dimensions, IEEE Xplore, SABINET/African Journals Online, Google Scholar and Statistics South Africa/DataFirst. The recorded search summary lists 511 records: 136 duplicates removed, 375 titles/abstracts screened, 222 excluded, 153 full texts assessed, 98 further exclusions and 55 retained sources. These sources cover several grants and populations, rather than 55 OPG studies. Differences in grants, settings, units of analysis and outcomes prevent a pooled non-receipt estimate. Original search exports and detailed screening logs were unavailable for independent verification.</w:t>
       </w:r>
     </w:p>
     <w:p>
@@ -1153,7 +1153,7 @@
           <w:sz w:val="20"/>
           <w:szCs w:val="20"/>
         </w:rPr>
-        <w:t xml:space="preserve">Administrative-burden theory (an account of the effort and stress involved in accessing services) identifies learning costs (effort to find and understand information), compliance costs (effort to meet requirements) and psychological costs (stress, stigma or loss of dignity) [13]. Grant studies describe paperwork, repeated visits, interrupted payments and difficult encounters [8], [9], [10], [14]. Child Support Grant research suggests barriers [6], [7], without establishing their effects among older OPG applicants. Digital access can create difficulties [15]. Low non-receipt therefore does not demonstrate easy access.</w:t>
+        <w:t xml:space="preserve">Administrative-burden theory distinguishes learning, compliance and psychological costs [13]. Grant studies describe paperwork, repeated visits, interrupted payments and difficult encounters [8], [9], [10], [14]. Child Support Grant research suggests barriers [6], [7], without establishing their effects among older OPG applicants. Digital access can create difficulties [15]. Low non-receipt therefore does not demonstrate easy access.</w:t>
       </w:r>
     </w:p>
     <w:p>
@@ -1209,7 +1209,7 @@
           <w:sz w:val="20"/>
           <w:szCs w:val="20"/>
         </w:rPr>
-        <w:t xml:space="preserve">Table II links five predictors to possible barriers. They are proxies (indirect indicators), rather than direct measures of grant awareness, journeys or discrimination. LCS does not record application paperwork, travel spending, waiting, stigma or stress. The study used theory to choose predictors; the model cannot establish that barriers caused non-receipt.</w:t>
+        <w:t xml:space="preserve">Table II links five predictors to possible barriers. They are proxies, rather than direct measures of grant awareness, journeys or discrimination. LCS does not record application paperwork, travel spending, waiting, stigma or stress. The study used theory to choose predictors; the model cannot establish that barriers caused non-receipt.</w:t>
       </w:r>
     </w:p>
     <w:p>
@@ -2114,7 +2114,7 @@
           <w:sz w:val="20"/>
           <w:szCs w:val="20"/>
         </w:rPr>
-        <w:t xml:space="preserve">With few non-recipients, the evaluation assessed precision (the share of selected likely non-recipients who report non-receipt) and calibration (whether predicted chances match observed rates), alongside ranking [16], [17]. The number of people studied and testing on excluded households limit conclusions [18], [19]. The paper uses TRIPOD (guidance for reporting prediction models) to describe methods and results [20]. Software checks support correctness and repeatability; assessing participant usability (how easily people understand and complete tasks) requires participants to try the app.</w:t>
+        <w:t xml:space="preserve">With few non-recipients, the evaluation assessed precision and calibration, alongside ranking [16], [17]. The number of people studied and testing on excluded households limit conclusions [18], [19]. The paper uses TRIPOD (Transparent Reporting of a multivariable prediction model for Individual Prognosis Or Diagnosis) to describe methods and results [20]. Software checks support correctness and repeatability; assessing participant usability requires participants to try the app.</w:t>
       </w:r>
     </w:p>
     <w:p>
@@ -2184,7 +2184,7 @@
           <w:sz w:val="20"/>
           <w:szCs w:val="20"/>
         </w:rPr>
-        <w:t xml:space="preserve">The analysis linked the LCS 2014/2015 person, household and person-income files through survey identifiers. Checks covered duplicates, unmatched records and row counts. The questionnaire, metadata (information describing the data) and COICOP (Classification of Individual Consumption According to Purpose, grouping items by purpose) codes guided interpretation [21], [22], [23]. The study covered sampled KwaZulu-Natal residents aged 60 or older in completed years. The survey excludes older adults living in institutions. Screening used the rules for each interview month. Before releasing the data, Statistics South Africa used hot-deck imputation (filling a missing answer with another respondent's answer) for age and sex. The released files do not identify these records. The model handled missing predictors separately.</w:t>
+        <w:t xml:space="preserve">The analysis linked the LCS 2014/2015 person, household and person-income files through survey identifiers. Checks covered duplicates, unmatched records and row counts. The questionnaire, metadata and COICOP (Classification of Individual Consumption According to Purpose) codes guided interpretation [21], [22], [23]. The study covered sampled KwaZulu-Natal residents aged 60 or older in completed years. The survey excludes older adults living in institutions. Screening used the rules for each interview month. Before releasing the data, Statistics South Africa used hot-deck imputation for age and sex. The released files do not identify these records. The model handled missing predictors separately.</w:t>
       </w:r>
     </w:p>
     <w:p>
@@ -3461,7 +3461,7 @@
           <w:sz w:val="20"/>
           <w:szCs w:val="20"/>
         </w:rPr>
-        <w:t xml:space="preserve">The screen summed reported yearly income to estimate private resources. It excluded social-assistance income (payments from government support grants) so receiving a grant would not cause a failure. It did not divide household totals among individuals. A missing income record counts as zero only when the source indicator confirms no reported income; otherwise, the screen leaves it unresolved. Asset purchases do not measure total asset holdings. The data cannot establish the full legal asset test, income assigned under legal rules or permitted deductions.</w:t>
+        <w:t xml:space="preserve">The screen summed reported yearly income to estimate private resources. It excluded social-assistance income so receiving a grant would not cause a failure. It did not divide household totals among individuals. A missing income record counts as zero only when the source indicator confirms no reported income; otherwise, the screen leaves it unresolved. Asset purchases do not measure total asset holdings. The data cannot establish the full legal asset test, income assigned under legal rules or permitted deductions.</w:t>
       </w:r>
     </w:p>
     <w:p>
@@ -3475,7 +3475,7 @@
           <w:sz w:val="20"/>
           <w:szCs w:val="20"/>
         </w:rPr>
-        <w:t xml:space="preserve">The income ceiling (the largest yearly private-resource amount that passes the research rule) corresponds to a formula payment of R100 monthly. From April 2014, the ceilings are R61,800 for a single person and R123,600 for a couple; from April 2015, they are R64,680 and R129,360 [24], [25]. The screen included amounts exactly at the interview-month ceiling. These research limits do not establish legal eligibility. The legal formula and couple-threshold interpretation remain unverified. Alternative analyses tested thresholds and income definitions.</w:t>
+        <w:t xml:space="preserve">The income ceiling corresponds to a formula payment of R100 monthly. From April 2014, the ceilings are R61,800 for a single person and R123,600 for a couple; from April 2015, they are R64,680 and R129,360 [24], [25]. The screen included amounts exactly at the interview-month ceiling. These research limits do not establish legal eligibility. The legal formula and couple-threshold interpretation remain unverified. Alternative analyses tested thresholds and income definitions.</w:t>
       </w:r>
     </w:p>
     <w:p>
@@ -3503,7 +3503,7 @@
           <w:sz w:val="20"/>
           <w:szCs w:val="20"/>
         </w:rPr>
-        <w:t xml:space="preserve">For adults who passed, the software interpreted general-grant and OPG answers together, including structural skips (questions omitted because earlier answers make them inapplicable). A consistent “no grant” answer can establish non-receipt when the OPG follow-up does not apply. Contradictory or unexplained answers remain unresolved and exclude the person from modelling. The analysis flagged disagreements between current receipt and preceding-year OPG income without changing the outcome because the periods differ. Rule version opg-kzn-primary-v1 records these decisions. The denominator (the group used to calculate the proportion) contains adults who pass and have a clear receipt answer.</w:t>
+        <w:t xml:space="preserve">For adults who passed, the software interpreted general-grant and OPG answers together, including structural skips (questions omitted because earlier answers make them inapplicable). A consistent “no grant” answer can establish non-receipt when the OPG follow-up does not apply. Contradictory or unexplained answers remain unresolved and exclude the person from modelling. The analysis flagged disagreements between current receipt and preceding-year OPG income without changing the outcome because the periods differ. Rule version opg-kzn-primary-v1 records these decisions. The denominator contains adults who pass and have a clear receipt answer.</w:t>
       </w:r>
     </w:p>
     <w:p>
@@ -3545,7 +3545,7 @@
           <w:sz w:val="20"/>
           <w:szCs w:val="20"/>
         </w:rPr>
-        <w:t xml:space="preserve">RQ1 used both the ordinary count proportion and the person-weighted proportion: p = Σ(wᵢYᵢ)/Σwᵢ. Here, wᵢ is a person's weight, Yᵢ equals 1 for non-receipt and 0 for receipt, and Σ means add across people. Group comparisons describe differences; they do not establish causes.</w:t>
+        <w:t xml:space="preserve">RQ1 used both the ordinary count proportion and the person-weighted proportion: p = Σ(wᵢYᵢ)/Σwᵢ. Here, wᵢ is a person's weight and Yᵢ equals 1 for non-receipt and 0 for receipt. Group comparisons describe differences; they do not establish causes.</w:t>
       </w:r>
     </w:p>
     <w:p>
@@ -3559,7 +3559,7 @@
           <w:sz w:val="20"/>
           <w:szCs w:val="20"/>
         </w:rPr>
-        <w:t xml:space="preserve">The released files lack strata (groups defined before sampling). Derived primary sampling units, or PSUs (estimated groups selected before households in the survey sample), supported an estimate of sampling uncertainty (variation between possible samples). The calculation allows a group to be sampled more than once. It cannot reproduce the complete survey design. Adults with unresolved screening information remain outside the proportion. Receipt bounds (the lowest and highest rates if all unclear PASS receipt answers mean receipt or all mean non-receipt) tested the effect of unclear receipt answers.</w:t>
+        <w:t xml:space="preserve">The released files lack strata. Derived primary sampling units (PSUs) supported an estimate of sampling uncertainty. The calculation allows a group to be sampled more than once. It cannot reproduce the complete survey design. Adults with unresolved screening information remain outside the proportion. Receipt bounds (the lowest and highest rates if all unclear PASS receipt answers mean receipt or all mean non-receipt) tested the effect of unclear receipt answers.</w:t>
       </w:r>
     </w:p>
     <w:p>
@@ -3601,7 +3601,7 @@
           <w:sz w:val="20"/>
           <w:szCs w:val="20"/>
         </w:rPr>
-        <w:t xml:space="preserve">The unweighted logistic model estimated probability (a chance from zero to one) of reported non-receipt. The analysis did not rebalance recipients and non-recipients, automatically select variables or choose a cutoff (a probability used to classify records). The model describes associations (differences that occur together in the data) after accounting for other predictors. Age enters per decade above 60. Comparison categories are male, Grade 7 or above, urban formal and an office nearer than 5 km. Five predictor groups require six slopes (numbers setting each input's contribution) and an intercept (the model's baseline), because settlement requires two comparisons.</w:t>
+        <w:t xml:space="preserve">The unweighted logistic model estimated probability of reported non-receipt. The analysis did not rebalance recipients and non-recipients, automatically select variables or choose a cutoff. The model describes associations after accounting for other predictors. Age enters per decade above 60. Comparison categories are male, Grade 7 or above, urban formal and an office nearer than 5 km. Five predictor groups require six slopes and an intercept, because settlement requires two comparisons.</w:t>
       </w:r>
     </w:p>
     <w:p>
@@ -3615,7 +3615,7 @@
           <w:sz w:val="20"/>
           <w:szCs w:val="20"/>
         </w:rPr>
-        <w:t xml:space="preserve">Only one rural-formal adult reported non-receipt in the attempted seven-slope model. Excluding that person for testing left the training group (records used to learn the model settings) with no such case in that category. Decision D-052 combined rural formal with traditional settlement to support estimation, without claiming that these settings are equivalent. Marital status affects screening; income, receipt, derived labels and marital status do not enter the primary model.</w:t>
+        <w:t xml:space="preserve">Only one rural-formal adult reported non-receipt in the attempted seven-slope model. Excluding that person for testing left the training group with no such case in that category. Decision D-052 combined rural formal with traditional settlement to support estimation, without claiming that these settings are equivalent. Marital status affects screening; income, receipt, derived labels and marital status do not enter the primary model.</w:t>
       </w:r>
     </w:p>
     <w:p>
@@ -3629,7 +3629,7 @@
           <w:sz w:val="20"/>
           <w:szCs w:val="20"/>
         </w:rPr>
-        <w:t xml:space="preserve">Validation used five folds (groups excluded in turn during training). The split kept households together and balanced the folds by whether any member reported non-receipt. Seed 201415 (a setting that makes random splits repeatable) fixes this division. After interpreting skipped questions, the software filled missing predictors using training-group statistics only. It never filled missing eligibility or outcome information. Each adult received one out-of-fold, or OOF, probability (a prediction from a model trained without that adult's household).</w:t>
+        <w:t xml:space="preserve">Validation used five folds. The split kept households together and balanced the folds by whether any member reported non-receipt. Seed 201415 fixes this division. After interpreting skipped questions, the software filled missing predictors using training-group statistics only. It never filled missing eligibility or outcome information. Each adult received one out-of-fold (OOF) probability from a model trained without that adult's household.</w:t>
       </w:r>
     </w:p>
     <w:p>
@@ -3643,7 +3643,7 @@
           <w:sz w:val="20"/>
           <w:szCs w:val="20"/>
         </w:rPr>
-        <w:t xml:space="preserve">Precision (non-recipients among selected records) and recall (selected non-recipients among all non-recipients) vary across ranking cutoffs. Evaluation measured average precision (precision averaged across increases in recall), AUC (how often the model ranks a non-recipient above a recipient) and Brier score (average squared probability error). It also assessed calibration slope (whether predicted chances vary too much or too little; 1 is ideal) and calibration-in-the-large (the overall correction with the slope fixed at 1; zero is ideal). The intercept-only reference model (one without predictors) uses the training group's non-receipt rate. Bootstrap intervals (ranges from drawing repeated samples of the existing records) used 1,000 household samples and fixed OOF predictions. Without model refitting, these intervals omit uncertainty from repeating model development.</w:t>
+        <w:t xml:space="preserve">Evaluation measured average precision, AUC, Brier score, calibration slope and calibration-in-the-large. Ideal values are 1 for calibration slope and zero for calibration-in-the-large, which estimates an intercept correction with the slope fixed at 1. The intercept-only reference model uses the training group's non-receipt rate. Bootstrap intervals used 1,000 household samples and fixed OOF predictions. Without model refitting, these intervals omit uncertainty from repeating model development.</w:t>
       </w:r>
     </w:p>
     <w:p>
@@ -3685,7 +3685,7 @@
           <w:sz w:val="20"/>
           <w:szCs w:val="20"/>
         </w:rPr>
-        <w:t xml:space="preserve">S1 changes thresholds, S2 partnership assumptions, S3 rules about other grants, S4 income definition, S5 receipt period and S6 unresolved-receipt bounds. Each records the denominator, non-recipients, ordinary/person-weighted rates and internally validated model performance. S7 uses complete cases (people with all required predictors present). S8 replaces welfare access with a married indicator. S9 uses frequency weights (treating person weights as repeated-record contributions), keeping unweighted missing-value treatment and evaluation. This is not a full survey-design regression. S10 weights primary OOF measures without refitting. S11 groups validation folds by derived PSU. These results remain separate from the primary analysis.</w:t>
+        <w:t xml:space="preserve">S1 changes thresholds, S2 partnership assumptions, S3 rules about other grants, S4 income definition, S5 receipt period and S6 unresolved-receipt bounds. Each records the denominator, non-recipients, ordinary/person-weighted rates and internally validated model performance. S7 uses complete cases. S8 replaces welfare access with a married indicator. S9 uses frequency weights (treating person weights as repeated-record contributions), keeping unweighted missing-value treatment and evaluation. This is not a full survey-design regression. S10 weights primary OOF measures without refitting. S11 groups validation folds by derived PSU. These results remain separate from the primary analysis.</w:t>
       </w:r>
     </w:p>
     <w:p>
@@ -3727,7 +3727,7 @@
           <w:sz w:val="20"/>
           <w:szCs w:val="20"/>
         </w:rPr>
-        <w:t xml:space="preserve">The command python analysis/run_study.py links survey files, screens adults and calculates results. Run records retain settings, versions, seed, folds and checksums (file fingerprints used to detect changes). The saved model stores coefficients (numerical model settings) and missing-value settings in JSON (a text format for named data), without executable program code. Version opg-kzn-six-slope-v1 uses the model trained on all included adults. Uploads do not retrain it.</w:t>
+        <w:t xml:space="preserve">The command python analysis/run_study.py links survey files, screens adults and calculates results. Run records retain settings, versions, seed, folds and checksums. The saved model stores coefficients and missing-value settings in JSON, without executable program code. Version opg-kzn-six-slope-v1 uses the model trained on all included adults. Uploads do not retrain it.</w:t>
       </w:r>
     </w:p>
     <w:p>
@@ -3741,7 +3741,7 @@
           <w:sz w:val="20"/>
           <w:szCs w:val="20"/>
         </w:rPr>
-        <w:t xml:space="preserve">The local app uses Streamlit (a Python framework for browser-based applications) and has five sections: study context, upload/validation, eligibility/receipt, prediction/model and export/reproducibility. It accepts historical opg-screen-v1 CSV files (comma-separated tables), including household members needed to check spouse resources. Validation rejects incorrect schema (required columns and allowed values), study context, duplicate identifiers, categories and numeric values. Limits are 20 MiB (mebibytes, each 1,048,576 bytes) and 50,000 rows. Uploads stay in memory during the current session (interaction with the running app). Reports use generated row labels and omit submitted identifiers, raw income and household links. Users can filter views and exports; summary rates retain all uploaded adults who pass with resolved receipt.</w:t>
+        <w:t xml:space="preserve">The local Streamlit app has five sections: study context, upload/validation, eligibility/receipt, prediction/model and export/reproducibility. It accepts historical opg-screen-v1 CSV files, including household members needed to check spouse resources. Validation rejects incorrect schema, study context, duplicate identifiers, categories and numeric values. Limits are 20 MiB and 50,000 rows. Uploads stay in memory during the current session. Reports use generated row labels and omit submitted identifiers, raw income and household links. Users can filter views and exports; summary rates retain all uploaded adults who pass with resolved receipt.</w:t>
       </w:r>
     </w:p>
     <w:p>
@@ -3755,7 +3755,7 @@
           <wp:inline distT="0" distB="0" distL="0" distR="0">
             <wp:extent cx="3200400" cy="2343150"/>
             <wp:effectExtent t="0" r="0" b="0" l="0"/>
-            <wp:docPr id="1" name="Fig. 2. Research and app workflows share screening rules. Held-out predictions (predictions for households excluded from training) remain separate from app scores calculated using the model trained on all included adults." descr="Fig. 2. Research and app workflows share screening rules. Held-out predictions (predictions for households excluded from training) remain separate from app scores calculated using the model trained on all included adults." title="Fig. 2. Research and app workflows share screening rules. Held-out predictions (predictions for households excluded from training) remain separate from app scores calculated using the model trained on all included adults."/>
+            <wp:docPr id="1" name="Fig. 2. Research and app workflows share screening rules. Household-held-out predictions remain separate from app scores calculated using the model trained on all included adults." descr="Fig. 2. Research and app workflows share screening rules. Household-held-out predictions remain separate from app scores calculated using the model trained on all included adults." title="Fig. 2. Research and app workflows share screening rules. Household-held-out predictions remain separate from app scores calculated using the model trained on all included adults."/>
             <wp:cNvGraphicFramePr>
               <a:graphicFrameLocks xmlns:a="http://schemas.openxmlformats.org/drawingml/2006/main" noChangeAspect="1"/>
             </wp:cNvGraphicFramePr>
@@ -3806,7 +3806,7 @@
           <w:sz w:val="16"/>
           <w:szCs w:val="16"/>
         </w:rPr>
-        <w:t xml:space="preserve">Fig. 2. Research and app workflows share screening rules. Held-out predictions (predictions for households excluded from training) remain separate from app scores calculated using the model trained on all included adults.</w:t>
+        <w:t xml:space="preserve">Fig. 2. Research and app workflows share screening rules. Household-held-out predictions remain separate from app scores calculated using the model trained on all included adults.</w:t>
       </w:r>
     </w:p>
     <w:p>
@@ -3820,7 +3820,7 @@
           <w:sz w:val="20"/>
           <w:szCs w:val="20"/>
         </w:rPr>
-        <w:t xml:space="preserve">The app reuses the screening rules and saved model settings. It scores only supported adults who pass with resolved receipt. Saved training statistics fill partly missing predictors; records missing every categorical predictor (an input with named groups) remain unscored. Integrity checks link model and evaluation files to the analysis and predictor code. The interface labels historical OOF results separately from uploaded scores; uploaded records may overlap training data. CSV, JSON and ZIP (compressed file bundle) reports contain classifications, reasons, supported probabilities, versions and an audit manifest (settings and file checksums). The downloadable minimum viable product, or MVP (the working prototype), uses invented data and excludes raw survey files, historical respondent outputs and Git version history.</w:t>
+        <w:t xml:space="preserve">The app reuses the screening rules and saved model settings. It scores only supported adults who pass with resolved receipt. Saved training statistics fill partly missing predictors; records missing every categorical predictor remain unscored. Integrity checks link model and evaluation files to the analysis and predictor code. The interface labels historical OOF results separately from uploaded scores; uploaded records may overlap training data. CSV, JSON and ZIP reports contain classifications, reasons, supported probabilities, versions and an audit manifest (settings and file checksums). The downloadable minimum viable product, or MVP, uses invented data and excludes raw survey files, historical respondent outputs and Git version history.</w:t>
       </w:r>
     </w:p>
     <w:p>
@@ -3834,7 +3834,7 @@
           <w:sz w:val="20"/>
           <w:szCs w:val="20"/>
         </w:rPr>
-        <w:t xml:space="preserve">Software checks compared screening decisions with expected results and tested excluded predictors, links, repeated runs, reports and saved predictions. Further checks compared the CLI (command-line interface, which accepts typed commands) with the UI (user interface, the app screens), including invalid inputs and outdated results. The owner's Windows walkthrough demonstrated local functionality. A task sheet supports future testing with three to five consenting participants; no participant study has taken place.</w:t>
+        <w:t xml:space="preserve">Software checks compared screening decisions with expected results and tested excluded predictors, links, repeated runs, reports and saved predictions. Further checks compared the CLI (command-line interface) with the UI (user interface), including invalid inputs and outdated results. The owner's Windows walkthrough demonstrated local functionality. A task sheet supports future testing with three to five consenting participants; no participant study has taken place.</w:t>
       </w:r>
     </w:p>
     <w:p>
@@ -5075,7 +5075,7 @@
           <w:sz w:val="20"/>
           <w:szCs w:val="20"/>
         </w:rPr>
-        <w:t xml:space="preserve">Of these 1,013 adults, 67 reported non-receipt: 6.61% without weights and 7.49% with person weights. The calculation used 345 derived PSUs and gave a standard error (the estimated sampling variation of the percentage) of 1.3 percentage points. A bell-shaped sampling approximation gave a 95% confidence interval (a range that aims to cover the population percentage in 95% of repeated samples) of 4.9%–10.0%. Missing strata limit this approximation. All 1,013 PASS answers agreed with preceding-year OPG income, so those checks changed nothing. Table V compares five predictors before filling missing values. Average age and percentages describe each receipt group. The percentages describe receipt-group composition, not non-receipt rates or predictions.</w:t>
+        <w:t xml:space="preserve">Of these 1,013 adults, 67 reported non-receipt: 6.61% without weights and 7.49% with person weights. The calculation used 345 derived PSUs and gave a standard error of 1.3 percentage points. A bell-shaped sampling approximation gave a 95% confidence interval of 4.9%–10.0%. Missing strata limit this approximation. All 1,013 PASS answers agreed with preceding-year OPG income, so those checks changed nothing. Table V compares five predictors before filling missing values. Average age and percentages describe each receipt group. The percentages describe receipt-group composition, not non-receipt rates or predictions.</w:t>
       </w:r>
     </w:p>
     <w:p>
@@ -5965,7 +5965,7 @@
           <w:sz w:val="20"/>
           <w:szCs w:val="20"/>
         </w:rPr>
-        <w:t xml:space="preserve">Table VI shows sensitivity analyses (repeating the analysis after changing assumptions). Events (adults reporting non-receipt) and N (people included) identify each group. Unw. and Wtd. abbreviate unweighted and person-weighted. Slope means calibration slope in Tables VI and VIII. Compared with S0, S1b/S1d added two people/two events. S2a, S2b, S2c and S2d added 59/4, 60/2, 8/0 and 68/2 people/events. S3 added 19 people/15 events; S4b removed six people but no events. Weighted non-receipt ranged from 7.12% to 9.06%.</w:t>
+        <w:t xml:space="preserve">Table VI reports each scenario’s denominator and non-receipt events. Unw. and Wtd. abbreviate unweighted and person-weighted. Slope means calibration slope in Tables VI and VIII. Compared with S0, S1b/S1d added two people/two events. S2a, S2b, S2c and S2d added 59/4, 60/2, 8/0 and 68/2 people/events. S3 added 19 people/15 events; S4b removed six people but no events. Weighted non-receipt ranged from 7.12% to 9.06%.</w:t>
       </w:r>
     </w:p>
     <w:p>
@@ -9015,7 +9015,7 @@
           <w:sz w:val="20"/>
           <w:szCs w:val="20"/>
         </w:rPr>
-        <w:t xml:space="preserve">All five folds converged (reached a stable fit). Figure 4 uses five similarly sized bins (groups). The highest bin had average prediction 0.188 and 35/203 non-recipients (17.2%); the lowest had average 0.0107 and 3/206 non-recipients (1.5%).</w:t>
+        <w:t xml:space="preserve">All five folds converged. Figure 4 uses five similarly sized bins. The highest bin had average prediction 0.188 and 35/203 non-recipients (17.2%); the lowest had average 0.0107 and 3/206 non-recipients (1.5%).</w:t>
       </w:r>
     </w:p>
     <w:p>
@@ -9849,7 +9849,7 @@
           <w:sz w:val="16"/>
           <w:szCs w:val="16"/>
         </w:rPr>
-        <w:t xml:space="preserve">Estimates pool unweighted OOF predictions: 1,013 people/67 events. The intervals use percentile bounds (the middle 95% of resampled estimates) from 1,000 household resamples of fixed predictions. All reported intervals have zero invalid resamples. Resampling did not refit models or missing-value settings. The intercept-only reference uses the training group's non-receipt rate. Dashes mean unavailable measures/intervals, rather than zero or chance performance.</w:t>
+        <w:t xml:space="preserve">Estimates pool unweighted OOF predictions: 1,013 people/67 events. The intervals use percentile bounds from 1,000 household resamples of fixed predictions. All reported intervals have zero invalid resamples. Resampling did not refit models or missing-value settings. The intercept-only reference uses the training group's non-receipt rate. Dashes mean unavailable measures/intervals, rather than zero or chance performance.</w:t>
       </w:r>
     </w:p>
     <w:p>
@@ -9928,7 +9928,7 @@
           <w:sz w:val="20"/>
           <w:szCs w:val="20"/>
         </w:rPr>
-        <w:t xml:space="preserve">Odds (the chance of non-receipt divided by the chance of receipt) support group comparisons. The odds ratio (one group's odds divided by the other's) for women versus men was 0.39. Its Wald interval (a range calculated from a model term and its standard error) was 0.23–0.66. Schooling below Grade 7 versus Grade 7 or above gave 0.24 (0.13–0.43). The model trained on all included adults produced these estimates. Age, settlement and welfare-distance intervals included 1. These associations describe odds, not probability reductions, held-out performance or causes.</w:t>
+        <w:t xml:space="preserve">The odds ratio for women versus men was 0.39. Its Wald interval was 0.23–0.66. Schooling below Grade 7 versus Grade 7 or above gave 0.24 (0.13–0.43). The model trained on all included adults produced these estimates. Age, settlement and welfare-distance intervals included 1. These associations describe odds, not probability reductions, held-out performance or causes.</w:t>
       </w:r>
     </w:p>
     <w:p>
@@ -13060,7 +13060,7 @@
           <w:sz w:val="20"/>
           <w:szCs w:val="20"/>
         </w:rPr>
-        <w:t xml:space="preserve">The survey cannot fully establish legal eligibility: its resource measure omits assets, deemed income (income the law assigns rather than the survey observes) and deductions. Income and receipt reports may contain errors. Cross-sectional data (answers from one survey period rather than repeated follow-up of the same people) cannot establish the order of events. Few events, unresolved eligibility, missing strata and resampling fixed predictions without refitting limit inference. Household sampling excludes institutionalised older adults. Participant usability and performance in another population remain untested.</w:t>
+        <w:t xml:space="preserve">The survey cannot fully establish legal eligibility: its resource measure omits assets, deemed income (income the law assigns rather than the survey observes) and deductions. Income and receipt reports may contain errors. Cross-sectional data cannot establish the order of events. Few events, unresolved eligibility, missing strata and resampling fixed predictions without refitting limit inference. Household sampling excludes institutionalised older adults. Participant usability and performance in another population remain untested.</w:t>
       </w:r>
     </w:p>
     <w:p>
@@ -13074,7 +13074,7 @@
           <w:sz w:val="20"/>
           <w:szCs w:val="20"/>
         </w:rPr>
-        <w:t xml:space="preserve">Survey access conditions and disclosure requirements (rules that limit sharing respondent information) apply. Interface demonstrations and tests use synthetic records. The downloadable package excludes survey records. Displays and reports omit submitted identifiers and raw income. These controls do not establish disclosure review of every historical repository file. The project records contain no DUT (Durban University of Technology) ethics determination (an institutional decision on the ethics requirements for this study). The paper therefore claims no approval. The app explains measurement choices; it neither decides grants nor ranks named applicants.</w:t>
+        <w:t xml:space="preserve">Survey access conditions and disclosure requirements apply. Interface demonstrations and tests use synthetic records. The downloadable package excludes survey records. Displays and reports omit submitted identifiers and raw income. These controls do not establish disclosure review of every historical repository file. The project records contain no DUT (Durban University of Technology) ethics determination. The paper therefore claims no approval. The app explains measurement choices; it neither decides grants nor ranks named applicants.</w:t>
       </w:r>
     </w:p>
     <w:p>
@@ -13116,7 +13116,7 @@
           <w:sz w:val="20"/>
           <w:szCs w:val="20"/>
         </w:rPr>
-        <w:t xml:space="preserve">Historical screened non-receipt was 6.6% unweighted and 7.5% person-weighted; alternatives gave 7.1%–9.1%. Rules about other grants changed results more than the ceiling, and unresolved cases made the denominator central. Five predictor groups/six slopes gave AUC 0.752, AP 0.203 and Brier 0.0578: moderate internal ranking with slightly less probability error. The software reproduces screening, receipt categories and scores for inspection under tested conditions. The study provides a historical benchmark (a documented result that later studies can compare with). It does not establish human usability, causes, legal entitlement or performance elsewhere.</w:t>
+        <w:t xml:space="preserve">Historical screened non-receipt was 6.6% unweighted and 7.5% person-weighted; alternatives gave 7.1%–9.1%. Rules about other grants changed results more than the ceiling, and unresolved cases made the denominator central. Five predictor groups/six slopes gave AUC 0.752, AP 0.203 and Brier 0.0578: moderate internal ranking with slightly less probability error. The software reproduces screening, receipt categories and scores for inspection under tested conditions. The study provides a historical benchmark. It does not establish human usability, causes, legal entitlement or performance elsewhere.</w:t>
       </w:r>
     </w:p>
     <w:p>

</xml_diff>

<commit_message>
Address supervisor feedback point 1 in the literature review
</commit_message>
<xml_diff>
--- a/paper/Jawe_OPG_nonreceipt_KZN.docx
+++ b/paper/Jawe_OPG_nonreceipt_KZN.docx
@@ -271,7 +271,21 @@
           <w:sz w:val="20"/>
           <w:szCs w:val="20"/>
         </w:rPr>
-        <w:t xml:space="preserve">The literature review covered grant access, non-receipt and prediction research from Scopus, Dimensions, IEEE Xplore, SABINET/African Journals Online, Google Scholar and Statistics South Africa/DataFirst. The recorded search summary lists 511 records: 136 duplicates removed, 375 titles/abstracts screened, 222 excluded, 153 full texts assessed, 98 further exclusions and 55 retained sources. These sources cover several grants and populations, rather than 55 OPG studies. Differences in grants, settings, units of analysis and outcomes prevent a pooled non-receipt estimate. Original search exports and detailed screening logs were unavailable for independent verification.</w:t>
+        <w:t xml:space="preserve">The literature review used thematic narrative synthesis to examine grant access, eligibility measurement and prediction. Searches covered Scopus, Dimensions, IEEE Xplore, SABINET/African Journals Online, Google Scholar and Statistics South Africa/DataFirst. Search concepts included social assistance, eligibility, take-up, non-receipt, exclusion and prediction. Sources were considered for relevance to the research question, population, outcome and methodological contribution. Studies were compared by programme, setting, unit of analysis, outcome, findings and limitations. Differences in these features prevent a pooled non-receipt estimate.</w:t>
+      </w:r>
+    </w:p>
+    <w:p>
+      <w:pPr>
+        <w:spacing w:after="80" w:before="0" w:line="230"/>
+        <w:jc w:val="both"/>
+      </w:pPr>
+      <w:r>
+        <w:rPr>
+          <w:rFonts w:ascii="Times New Roman" w:cs="Times New Roman" w:eastAsia="Times New Roman" w:hAnsi="Times New Roman"/>
+          <w:sz w:val="20"/>
+          <w:szCs w:val="20"/>
+        </w:rPr>
+        <w:t xml:space="preserve">The recorded search summary lists 511 records: 136 duplicates removed, 375 titles/abstracts screened, 222 excluded, 153 full texts assessed, 98 further exclusions and 55 retained sources. These sources cover several grants and populations, rather than 55 OPG studies. The available record documents the search concepts, broad selection criteria and aggregate counts. It does not preserve database-specific query strings, search dates and filters, original exports or record-level screening and exclusion decisions. The full 55-source extraction register is also unavailable. These omissions prevent independent reproduction of the search and verification of each selection decision. The synthesis therefore provides contextual evidence without establishing exhaustive literature coverage.</w:t>
       </w:r>
     </w:p>
     <w:p>
@@ -1111,7 +1125,21 @@
           <w:sz w:val="20"/>
           <w:szCs w:val="20"/>
         </w:rPr>
-        <w:t xml:space="preserve">Gazeaud supports checking income assumptions [11], without quantifying LCS errors or defining South African eligibility. Mabala models another grant for younger applicants [12]; its findings cannot directly predict OPG receipt. This study combines an explicit screen, weighted description, testing on excluded households and inspectable software for this historical KwaZulu-Natal group.</w:t>
+        <w:t xml:space="preserve">Gazeaud supports checking income assumptions [11], without quantifying LCS errors or defining South African eligibility. Mabala models another grant for younger applicants [12]; its findings cannot directly predict OPG receipt.</w:t>
+      </w:r>
+    </w:p>
+    <w:p>
+      <w:pPr>
+        <w:spacing w:after="80" w:before="0" w:line="230"/>
+        <w:jc w:val="both"/>
+      </w:pPr>
+      <w:r>
+        <w:rPr>
+          <w:rFonts w:ascii="Times New Roman" w:cs="Times New Roman" w:eastAsia="Times New Roman" w:hAnsi="Times New Roman"/>
+          <w:sz w:val="20"/>
+          <w:szCs w:val="20"/>
+        </w:rPr>
+        <w:t xml:space="preserve">The research gap concerns how these separate strands can support a reproducible, person-level analysis of OPG non-receipt in KwaZulu-Natal. Ralston's age-based rural receipt analysis [3] and Godfrey's household receipt proportions [4] do not directly provide non-receipt estimates after the resource screen used here. Evidence on other grants informs possible access barriers, but does not establish their effects among older OPG applicants. The study addresses this integration gap by documenting the screening denominator, testing how alternative rules change non-receipt estimates, and evaluating an interpretable model on excluded households. Shared rules connect the research command and application so that decisions, probabilities and reports remain inspectable. The specific contribution is a historical workflow that connects transparent screening, person-weighted description, household-held-out prediction and reproducible software. This supports scrutiny of assumptions and results without establishing legal entitlement, causal barriers, participant usability or performance elsewhere.</w:t>
       </w:r>
     </w:p>
     <w:p>

</xml_diff>

<commit_message>
Integrate conceptual framework and discussion synthesis
</commit_message>
<xml_diff>
--- a/paper/Jawe_OPG_nonreceipt_KZN.docx
+++ b/paper/Jawe_OPG_nonreceipt_KZN.docx
@@ -1243,71 +1243,6 @@
     <w:p>
       <w:pPr>
         <w:keepNext/>
-        <w:spacing w:after="30" w:before="80" w:line="240" w:lineRule="auto"/>
-        <w:jc w:val="center"/>
-      </w:pPr>
-      <w:r>
-        <w:drawing>
-          <wp:inline distT="0" distB="0" distL="0" distR="0">
-            <wp:extent cx="3200400" cy="3105150"/>
-            <wp:effectExtent t="0" r="0" b="0" l="0"/>
-            <wp:docPr id="1" name="Fig. 1. Theory guides the choice of survey measures. Arrows show measurement choices and research steps; they do not show proven causes. The survey does not record every condition of legal entitlement." descr="Fig. 1. Theory guides the choice of survey measures. Arrows show measurement choices and research steps; they do not show proven causes. The survey does not record every condition of legal entitlement." title="Fig. 1. Theory guides the choice of survey measures. Arrows show measurement choices and research steps; they do not show proven causes. The survey does not record every condition of legal entitlement."/>
-            <wp:cNvGraphicFramePr>
-              <a:graphicFrameLocks xmlns:a="http://schemas.openxmlformats.org/drawingml/2006/main" noChangeAspect="1"/>
-            </wp:cNvGraphicFramePr>
-            <a:graphic xmlns:a="http://schemas.openxmlformats.org/drawingml/2006/main">
-              <a:graphicData uri="http://schemas.openxmlformats.org/drawingml/2006/picture">
-                <pic:pic xmlns:pic="http://schemas.openxmlformats.org/drawingml/2006/picture">
-                  <pic:nvPicPr>
-                    <pic:cNvPr id="0" name="" descr=""/>
-                    <pic:cNvPicPr>
-                      <a:picLocks noChangeAspect="1" noChangeArrowheads="1"/>
-                    </pic:cNvPicPr>
-                  </pic:nvPicPr>
-                  <pic:blipFill>
-                    <a:blip r:embed="rId7" cstate="none"/>
-                    <a:srcRect/>
-                    <a:stretch>
-                      <a:fillRect/>
-                    </a:stretch>
-                  </pic:blipFill>
-                  <pic:spPr bwMode="auto">
-                    <a:xfrm>
-                      <a:off x="0" y="0"/>
-                      <a:ext cx="3200400" cy="3105150"/>
-                    </a:xfrm>
-                    <a:prstGeom prst="rect">
-                      <a:avLst/>
-                    </a:prstGeom>
-                  </pic:spPr>
-                </pic:pic>
-              </a:graphicData>
-            </a:graphic>
-          </wp:inline>
-        </w:drawing>
-      </w:r>
-    </w:p>
-    <w:p>
-      <w:pPr>
-        <w:spacing w:after="80" w:before="0" w:line="190"/>
-        <w:jc w:val="both"/>
-        <w:rPr>
-          <w:sz w:val="16"/>
-          <w:szCs w:val="16"/>
-        </w:rPr>
-      </w:pPr>
-      <w:r>
-        <w:rPr>
-          <w:rFonts w:ascii="Times New Roman" w:cs="Times New Roman" w:eastAsia="Times New Roman" w:hAnsi="Times New Roman"/>
-          <w:sz w:val="16"/>
-          <w:szCs w:val="16"/>
-        </w:rPr>
-        <w:t xml:space="preserve">Fig. 1. Theory guides the choice of survey measures. Arrows show measurement choices and research steps; they do not show proven causes. The survey does not record every condition of legal entitlement.</w:t>
-      </w:r>
-    </w:p>
-    <w:p>
-      <w:pPr>
-        <w:keepNext/>
         <w:spacing w:after="50" w:before="100" w:line="190"/>
         <w:jc w:val="center"/>
         <w:rPr>
@@ -2128,7 +2063,35 @@
           <w:sz w:val="20"/>
           <w:szCs w:val="20"/>
         </w:rPr>
-        <w:t xml:space="preserve">Figure 1 separates screening, receipt and prediction; the tool displays each for inspection. Weighted percentages describe the screened population. Testing on excluded households checks prediction within this survey. The application scores uploaded records using saved model settings. These scores remain separate from test results and never change screening or receipt.</w:t>
+        <w:t xml:space="preserve">Few events motivate assessment of precision, calibration and ranking [16], [17]. Sample size and internal validation limit generalisation [18], [19]. Reporting follows TRIPOD (Transparent Reporting of a multivariable prediction model for Individual Prognosis Or Diagnosis) [20]. Software checks assess correctness and repeatability; usability requires participant evidence.</w:t>
+      </w:r>
+    </w:p>
+    <w:p>
+      <w:pPr>
+        <w:pStyle w:val="Heading2"/>
+        <w:keepNext/>
+        <w:spacing w:after="60" w:before="140" w:line="230"/>
+        <w:jc w:val="left"/>
+        <w:rPr>
+          <w:b w:val="false"/>
+          <w:bCs w:val="false"/>
+          <w:i/>
+          <w:iCs/>
+          <w:sz w:val="20"/>
+          <w:szCs w:val="20"/>
+        </w:rPr>
+      </w:pPr>
+      <w:r>
+        <w:rPr>
+          <w:rFonts w:ascii="Times New Roman" w:cs="Times New Roman" w:eastAsia="Times New Roman" w:hAnsi="Times New Roman"/>
+          <w:b w:val="false"/>
+          <w:bCs w:val="false"/>
+          <w:i/>
+          <w:iCs/>
+          <w:sz w:val="20"/>
+          <w:szCs w:val="20"/>
+        </w:rPr>
+        <w:t xml:space="preserve">D. Conceptual Framework</w:t>
       </w:r>
     </w:p>
     <w:p>
@@ -2142,7 +2105,100 @@
           <w:sz w:val="20"/>
           <w:szCs w:val="20"/>
         </w:rPr>
-        <w:t xml:space="preserve">With few non-recipients, the evaluation assessed precision and calibration, alongside ranking [16], [17]. The number of people studied and testing on excluded households limit conclusions [18], [19]. The paper uses TRIPOD (Transparent Reporting of a multivariable prediction model for Individual Prognosis Or Diagnosis) to describe methods and results [20]. Software checks support correctness and repeatability; assessing participant usability requires participants to try the app.</w:t>
+        <w:t xml:space="preserve">Reported OPG non-receipt among apparently eligible older adults motivates an administrative-burden perspective [13], [14]. Learning, compliance and psychological costs may obstruct access; high receipt does not establish low burden.</w:t>
+      </w:r>
+    </w:p>
+    <w:p>
+      <w:pPr>
+        <w:spacing w:after="80" w:before="0" w:line="230"/>
+        <w:jc w:val="both"/>
+      </w:pPr>
+      <w:r>
+        <w:rPr>
+          <w:rFonts w:ascii="Times New Roman" w:cs="Times New Roman" w:eastAsia="Times New Roman" w:hAnsi="Times New Roman"/>
+          <w:sz w:val="20"/>
+          <w:szCs w:val="20"/>
+        </w:rPr>
+        <w:t xml:space="preserve">Figure 1 separates theoretical constructs from LCS measurements. Schooling may reflect information resources; office distance and settlement relate to potential compliance effort. Age and sex provide demographic context. These proxies do not directly measure burden. Screening defines the denominator because age alone is insufficient and LCS cannot establish legal entitlement. Resource, partnership and other-grant rules define the population; incomplete information remains unresolved. Reported receipt defines a separate outcome.</w:t>
+      </w:r>
+    </w:p>
+    <w:p>
+      <w:pPr>
+        <w:spacing w:after="80" w:before="0" w:line="230"/>
+        <w:jc w:val="both"/>
+      </w:pPr>
+      <w:r>
+        <w:rPr>
+          <w:rFonts w:ascii="Times New Roman" w:cs="Times New Roman" w:eastAsia="Times New Roman" w:hAnsi="Times New Roman"/>
+          <w:sz w:val="20"/>
+          <w:szCs w:val="20"/>
+        </w:rPr>
+        <w:t xml:space="preserve">Person-weighted estimates describe non-receipt. Logistic regression describes associations; household-held-out validation tests predictions. Neither establishes causal mechanisms. The artefact implements the design through shared rules, separate receipt classifications, saved-model scoring and inspectable reports. Upload scores remain separate from held-out evaluation and never change screening or receipt.</w:t>
+      </w:r>
+    </w:p>
+    <w:p>
+      <w:pPr>
+        <w:keepNext/>
+        <w:spacing w:after="30" w:before="80" w:line="240" w:lineRule="auto"/>
+        <w:jc w:val="center"/>
+      </w:pPr>
+      <w:r>
+        <w:drawing>
+          <wp:inline distT="0" distB="0" distL="0" distR="0">
+            <wp:extent cx="3200400" cy="3429000"/>
+            <wp:effectExtent t="0" r="0" b="0" l="0"/>
+            <wp:docPr id="1" name="Fig. 1. Conceptual framework. Theory informs predictor selection; observable screening defines the population for separate descriptive and predictive analyses. The dashed boundary identifies the artefact’s implementation scope. Arrows show conceptual rationale or analytical dependencies, not causal effects." descr="Fig. 1. Conceptual framework. Theory informs predictor selection; observable screening defines the population for separate descriptive and predictive analyses. The dashed boundary identifies the artefact’s implementation scope. Arrows show conceptual rationale or analytical dependencies, not causal effects." title="Fig. 1. Conceptual framework. Theory informs predictor selection; observable screening defines the population for separate descriptive and predictive analyses. The dashed boundary identifies the artefact’s implementation scope. Arrows show conceptual rationale or analytical dependencies, not causal effects."/>
+            <wp:cNvGraphicFramePr>
+              <a:graphicFrameLocks xmlns:a="http://schemas.openxmlformats.org/drawingml/2006/main" noChangeAspect="1"/>
+            </wp:cNvGraphicFramePr>
+            <a:graphic xmlns:a="http://schemas.openxmlformats.org/drawingml/2006/main">
+              <a:graphicData uri="http://schemas.openxmlformats.org/drawingml/2006/picture">
+                <pic:pic xmlns:pic="http://schemas.openxmlformats.org/drawingml/2006/picture">
+                  <pic:nvPicPr>
+                    <pic:cNvPr id="0" name="" descr=""/>
+                    <pic:cNvPicPr>
+                      <a:picLocks noChangeAspect="1" noChangeArrowheads="1"/>
+                    </pic:cNvPicPr>
+                  </pic:nvPicPr>
+                  <pic:blipFill>
+                    <a:blip r:embed="rId7" cstate="none"/>
+                    <a:srcRect/>
+                    <a:stretch>
+                      <a:fillRect/>
+                    </a:stretch>
+                  </pic:blipFill>
+                  <pic:spPr bwMode="auto">
+                    <a:xfrm>
+                      <a:off x="0" y="0"/>
+                      <a:ext cx="3200400" cy="3429000"/>
+                    </a:xfrm>
+                    <a:prstGeom prst="rect">
+                      <a:avLst/>
+                    </a:prstGeom>
+                  </pic:spPr>
+                </pic:pic>
+              </a:graphicData>
+            </a:graphic>
+          </wp:inline>
+        </w:drawing>
+      </w:r>
+    </w:p>
+    <w:p>
+      <w:pPr>
+        <w:spacing w:after="80" w:before="0" w:line="190"/>
+        <w:jc w:val="both"/>
+        <w:rPr>
+          <w:sz w:val="16"/>
+          <w:szCs w:val="16"/>
+        </w:rPr>
+      </w:pPr>
+      <w:r>
+        <w:rPr>
+          <w:rFonts w:ascii="Times New Roman" w:cs="Times New Roman" w:eastAsia="Times New Roman" w:hAnsi="Times New Roman"/>
+          <w:sz w:val="16"/>
+          <w:szCs w:val="16"/>
+        </w:rPr>
+        <w:t xml:space="preserve">Fig. 1. Conceptual framework. Theory informs predictor selection; observable screening defines the population for separate descriptive and predictive analyses. The dashed boundary identifies the artefact’s implementation scope. Arrows show conceptual rationale or analytical dependencies, not causal effects.</w:t>
       </w:r>
     </w:p>
     <w:p>
@@ -12934,20 +12990,6 @@
           <w:sz w:val="20"/>
           <w:szCs w:val="20"/>
         </w:rPr>
-        <w:t xml:space="preserve">Table II separates concepts from measured predictors. Schooling suggests learning costs; distance/settlement suggest compliance costs [13], [14]. The odds ratios describe the screened group, not OOF effects or measured burden. Lower schooling accompanied receipt, contrary to a simple information-barrier expectation. Fewer other resources or screening selection could explain this; the analysis tested neither explanation. Uncertain office/settlement associations neither confirm nor rule out compliance costs. The survey does not measure psychological costs. Without awareness, visits, document demands or administrative decisions, this analysis cannot explain non-receipt.</w:t>
-      </w:r>
-    </w:p>
-    <w:p>
-      <w:pPr>
-        <w:spacing w:after="80" w:before="0" w:line="230"/>
-        <w:jc w:val="both"/>
-      </w:pPr>
-      <w:r>
-        <w:rPr>
-          <w:rFonts w:ascii="Times New Roman" w:cs="Times New Roman" w:eastAsia="Times New Roman" w:hAnsi="Times New Roman"/>
-          <w:sz w:val="20"/>
-          <w:szCs w:val="20"/>
-        </w:rPr>
         <w:t xml:space="preserve">Table VIII separates sample, predictor and evaluation changes. S7 removed 21 people/four events (992/63). Its lower Brier concerns a different sample and cannot establish whether filling missing values is better. S8 substituted marriage for welfare access and performed similarly. S9 weighted fitting but not evaluation; it does not model the full survey design. S10 reweighted the same primary OOF predictions without retraining, raising Brier to 0.0641. S11 grouped folds by derived PSU and also performed similarly. S8–S11 retained 1,013 people/67 events. These checks expose internal assumptions; they do not establish model superiority or reliability elsewhere [19], [20].</w:t>
       </w:r>
     </w:p>
@@ -13047,6 +13089,48 @@
           <w:szCs w:val="20"/>
         </w:rPr>
         <w:t xml:space="preserve">This study analysed screened KwaZulu-Natal adults in LCS 2014/2015. Provinces and periods differ in settlement, services, policy and reporting. Application, award and payment records measure different events from reported receipt and can contain linking errors. The study did not test the model on an independent province, period or administrative sample. Transfer requires comparable populations/outcomes, justified period-specific rules and independent ranking/calibration checks [19], [20]. Making the app available cannot establish suitability for today's applicants.</w:t>
+      </w:r>
+    </w:p>
+    <w:p>
+      <w:pPr>
+        <w:pStyle w:val="Heading2"/>
+        <w:keepNext/>
+        <w:spacing w:after="60" w:before="140" w:line="230"/>
+        <w:jc w:val="left"/>
+        <w:rPr>
+          <w:b w:val="false"/>
+          <w:bCs w:val="false"/>
+          <w:i/>
+          <w:iCs/>
+          <w:sz w:val="20"/>
+          <w:szCs w:val="20"/>
+        </w:rPr>
+      </w:pPr>
+      <w:r>
+        <w:rPr>
+          <w:rFonts w:ascii="Times New Roman" w:cs="Times New Roman" w:eastAsia="Times New Roman" w:hAnsi="Times New Roman"/>
+          <w:b w:val="false"/>
+          <w:bCs w:val="false"/>
+          <w:i/>
+          <w:iCs/>
+          <w:sz w:val="20"/>
+          <w:szCs w:val="20"/>
+        </w:rPr>
+        <w:t xml:space="preserve">E. Synthesis of the Conceptual Framework</w:t>
+      </w:r>
+    </w:p>
+    <w:p>
+      <w:pPr>
+        <w:spacing w:after="80" w:before="0" w:line="230"/>
+        <w:jc w:val="both"/>
+      </w:pPr>
+      <w:r>
+        <w:rPr>
+          <w:rFonts w:ascii="Times New Roman" w:cs="Times New Roman" w:eastAsia="Times New Roman" w:hAnsi="Times New Roman"/>
+          <w:sz w:val="20"/>
+          <w:szCs w:val="20"/>
+        </w:rPr>
+        <w:t xml:space="preserve">Returning to Figure 1, screening sensitivity supported an explicit denominator, and sex differences supported demographic comparison without confirming burden mechanisms [3], [4]. Lower schooling accompanied receipt, contrary to a simple expectation that fewer information resources increase non-receipt [13]. Screening selection or other resources could account for this; neither explanation was tested. Office-distance and settlement intervals included 1, leaving compliance-cost expectations unresolved. Psychological costs remained untested because LCS did not measure them. Proxy associations do not directly test the theory. The artefact contributes a reproducible implementation of these bounded measurement choices. Separate, traceable rules, outcomes and predictions support inspection despite measurement limits, without establishing causes, legal entitlement or participant usability.</w:t>
       </w:r>
     </w:p>
     <w:p>

</xml_diff>

<commit_message>
Clarify Table II theory links and correct its formatting
</commit_message>
<xml_diff>
--- a/paper/Jawe_OPG_nonreceipt_KZN.docx
+++ b/paper/Jawe_OPG_nonreceipt_KZN.docx
@@ -1237,7 +1237,7 @@
           <w:sz w:val="20"/>
           <w:szCs w:val="20"/>
         </w:rPr>
-        <w:t xml:space="preserve">Table II links five predictors to possible barriers. They are proxies, rather than direct measures of grant awareness, journeys or discrimination. LCS does not record application paperwork, travel spending, waiting, stigma or stress. The study used theory to choose predictors; the model cannot establish that barriers caused non-receipt.</w:t>
+        <w:t xml:space="preserve">Table II separates demographic context from circumstances relevant to learning and compliance costs. These predictors do not directly measure administrative burden or establish why a person reports non-receipt.</w:t>
       </w:r>
     </w:p>
     <w:p>
@@ -1256,19 +1256,19 @@
           <w:sz w:val="16"/>
           <w:szCs w:val="16"/>
         </w:rPr>
-        <w:t xml:space="preserve">Table II. Predictors suggested by the literature and their limits</w:t>
+        <w:t xml:space="preserve">Table II. Administrative-burden theory and predictor selection</w:t>
       </w:r>
     </w:p>
     <w:tbl>
       <w:tblPr>
         <w:tblW w:type="dxa" w:w="5040"/>
         <w:tblBorders>
-          <w:top w:val="single" w:color="auto" w:sz="4"/>
-          <w:left w:val="single" w:color="auto" w:sz="4"/>
-          <w:bottom w:val="single" w:color="auto" w:sz="4"/>
-          <w:right w:val="single" w:color="auto" w:sz="4"/>
-          <w:insideH w:val="single" w:color="auto" w:sz="4"/>
-          <w:insideV w:val="single" w:color="auto" w:sz="4"/>
+          <w:top w:val="none" w:color="000000" w:sz="0"/>
+          <w:left w:val="none" w:color="000000" w:sz="0"/>
+          <w:bottom w:val="none" w:color="000000" w:sz="0"/>
+          <w:right w:val="none" w:color="000000" w:sz="0"/>
+          <w:insideH w:val="none" w:color="000000" w:sz="0"/>
+          <w:insideV w:val="none" w:color="000000" w:sz="0"/>
         </w:tblBorders>
         <w:tblLayout w:type="fixed"/>
       </w:tblPr>
@@ -1286,18 +1286,18 @@
           <w:tcPr>
             <w:tcW w:type="dxa" w:w="900"/>
             <w:tcBorders>
-              <w:top w:val="single" w:color="808080" w:sz="4"/>
-              <w:left w:val="single" w:color="808080" w:sz="4"/>
-              <w:bottom w:val="single" w:color="808080" w:sz="4"/>
-              <w:right w:val="single" w:color="808080" w:sz="4"/>
-            </w:tcBorders>
-            <w:tcMar>
-              <w:top w:type="dxa" w:w="40"/>
-              <w:left w:type="dxa" w:w="45"/>
-              <w:bottom w:type="dxa" w:w="40"/>
-              <w:right w:type="dxa" w:w="45"/>
-            </w:tcMar>
-            <w:vAlign w:val="center"/>
+              <w:top w:val="single" w:color="000000" w:sz="6"/>
+              <w:left w:val="none" w:color="000000" w:sz="0"/>
+              <w:bottom w:val="single" w:color="000000" w:sz="6"/>
+              <w:right w:val="none" w:color="000000" w:sz="0"/>
+            </w:tcBorders>
+            <w:tcMar>
+              <w:top w:type="dxa" w:w="50"/>
+              <w:left w:type="dxa" w:w="45"/>
+              <w:bottom w:type="dxa" w:w="50"/>
+              <w:right w:type="dxa" w:w="45"/>
+            </w:tcMar>
+            <w:vAlign w:val="top"/>
           </w:tcPr>
           <w:p>
             <w:pPr>
@@ -1327,18 +1327,18 @@
           <w:tcPr>
             <w:tcW w:type="dxa" w:w="1800"/>
             <w:tcBorders>
-              <w:top w:val="single" w:color="808080" w:sz="4"/>
-              <w:left w:val="single" w:color="808080" w:sz="4"/>
-              <w:bottom w:val="single" w:color="808080" w:sz="4"/>
-              <w:right w:val="single" w:color="808080" w:sz="4"/>
-            </w:tcBorders>
-            <w:tcMar>
-              <w:top w:type="dxa" w:w="40"/>
-              <w:left w:type="dxa" w:w="45"/>
-              <w:bottom w:type="dxa" w:w="40"/>
-              <w:right w:type="dxa" w:w="45"/>
-            </w:tcMar>
-            <w:vAlign w:val="center"/>
+              <w:top w:val="single" w:color="000000" w:sz="6"/>
+              <w:left w:val="none" w:color="000000" w:sz="0"/>
+              <w:bottom w:val="single" w:color="000000" w:sz="6"/>
+              <w:right w:val="none" w:color="000000" w:sz="0"/>
+            </w:tcBorders>
+            <w:tcMar>
+              <w:top w:type="dxa" w:w="50"/>
+              <w:left w:type="dxa" w:w="45"/>
+              <w:bottom w:type="dxa" w:w="50"/>
+              <w:right w:type="dxa" w:w="45"/>
+            </w:tcMar>
+            <w:vAlign w:val="top"/>
           </w:tcPr>
           <w:p>
             <w:pPr>
@@ -1360,7 +1360,7 @@
                 <w:sz w:val="18"/>
                 <w:szCs w:val="18"/>
               </w:rPr>
-              <w:t xml:space="preserve">Conceptual connection</w:t>
+              <w:t xml:space="preserve">Theoretical role</w:t>
             </w:r>
           </w:p>
         </w:tc>
@@ -1368,18 +1368,18 @@
           <w:tcPr>
             <w:tcW w:type="dxa" w:w="2340"/>
             <w:tcBorders>
-              <w:top w:val="single" w:color="808080" w:sz="4"/>
-              <w:left w:val="single" w:color="808080" w:sz="4"/>
-              <w:bottom w:val="single" w:color="808080" w:sz="4"/>
-              <w:right w:val="single" w:color="808080" w:sz="4"/>
-            </w:tcBorders>
-            <w:tcMar>
-              <w:top w:type="dxa" w:w="40"/>
-              <w:left w:type="dxa" w:w="45"/>
-              <w:bottom w:type="dxa" w:w="40"/>
-              <w:right w:type="dxa" w:w="45"/>
-            </w:tcMar>
-            <w:vAlign w:val="center"/>
+              <w:top w:val="single" w:color="000000" w:sz="6"/>
+              <w:left w:val="none" w:color="000000" w:sz="0"/>
+              <w:bottom w:val="single" w:color="000000" w:sz="6"/>
+              <w:right w:val="none" w:color="000000" w:sz="0"/>
+            </w:tcBorders>
+            <w:tcMar>
+              <w:top w:type="dxa" w:w="50"/>
+              <w:left w:type="dxa" w:w="45"/>
+              <w:bottom w:type="dxa" w:w="50"/>
+              <w:right w:type="dxa" w:w="45"/>
+            </w:tcMar>
+            <w:vAlign w:val="top"/>
           </w:tcPr>
           <w:p>
             <w:pPr>
@@ -1401,7 +1401,7 @@
                 <w:sz w:val="18"/>
                 <w:szCs w:val="18"/>
               </w:rPr>
-              <w:t xml:space="preserve">Observable coding and limit</w:t>
+              <w:t xml:space="preserve">LCS coding and limit</w:t>
             </w:r>
           </w:p>
         </w:tc>
@@ -1415,18 +1415,18 @@
           <w:tcPr>
             <w:tcW w:type="dxa" w:w="900"/>
             <w:tcBorders>
-              <w:top w:val="single" w:color="808080" w:sz="4"/>
-              <w:left w:val="single" w:color="808080" w:sz="4"/>
-              <w:bottom w:val="single" w:color="808080" w:sz="4"/>
-              <w:right w:val="single" w:color="808080" w:sz="4"/>
-            </w:tcBorders>
-            <w:tcMar>
-              <w:top w:type="dxa" w:w="40"/>
-              <w:left w:type="dxa" w:w="45"/>
-              <w:bottom w:type="dxa" w:w="40"/>
-              <w:right w:type="dxa" w:w="45"/>
-            </w:tcMar>
-            <w:vAlign w:val="center"/>
+              <w:top w:val="none" w:color="000000" w:sz="0"/>
+              <w:left w:val="none" w:color="000000" w:sz="0"/>
+              <w:bottom w:val="none" w:color="000000" w:sz="0"/>
+              <w:right w:val="none" w:color="000000" w:sz="0"/>
+            </w:tcBorders>
+            <w:tcMar>
+              <w:top w:type="dxa" w:w="50"/>
+              <w:left w:type="dxa" w:w="45"/>
+              <w:bottom w:type="dxa" w:w="50"/>
+              <w:right w:type="dxa" w:w="45"/>
+            </w:tcMar>
+            <w:vAlign w:val="top"/>
           </w:tcPr>
           <w:p>
             <w:pPr>
@@ -1456,40 +1456,40 @@
           <w:tcPr>
             <w:tcW w:type="dxa" w:w="1800"/>
             <w:tcBorders>
-              <w:top w:val="single" w:color="808080" w:sz="4"/>
-              <w:left w:val="single" w:color="808080" w:sz="4"/>
-              <w:bottom w:val="single" w:color="808080" w:sz="4"/>
-              <w:right w:val="single" w:color="808080" w:sz="4"/>
-            </w:tcBorders>
-            <w:tcMar>
-              <w:top w:type="dxa" w:w="40"/>
-              <w:left w:type="dxa" w:w="45"/>
-              <w:bottom w:type="dxa" w:w="40"/>
-              <w:right w:type="dxa" w:w="45"/>
-            </w:tcMar>
-            <w:vAlign w:val="center"/>
-          </w:tcPr>
-          <w:p>
-            <w:pPr>
-              <w:keepNext/>
-              <w:spacing w:after="0" w:before="0" w:line="240" w:lineRule="auto"/>
-              <w:jc w:val="left"/>
-              <w:rPr>
-                <w:b w:val="false"/>
-                <w:bCs w:val="false"/>
-                <w:sz w:val="18"/>
-                <w:szCs w:val="18"/>
-              </w:rPr>
-            </w:pPr>
-            <w:r>
-              <w:rPr>
-                <w:rFonts w:ascii="Times New Roman" w:cs="Times New Roman" w:eastAsia="Times New Roman" w:hAnsi="Times New Roman"/>
-                <w:b w:val="false"/>
-                <w:bCs w:val="false"/>
-                <w:sz w:val="18"/>
-                <w:szCs w:val="18"/>
-              </w:rPr>
-              <w:t xml:space="preserve">Receipt differs across age groups [3]</w:t>
+              <w:top w:val="none" w:color="000000" w:sz="0"/>
+              <w:left w:val="none" w:color="000000" w:sz="0"/>
+              <w:bottom w:val="none" w:color="000000" w:sz="0"/>
+              <w:right w:val="none" w:color="000000" w:sz="0"/>
+            </w:tcBorders>
+            <w:tcMar>
+              <w:top w:type="dxa" w:w="50"/>
+              <w:left w:type="dxa" w:w="45"/>
+              <w:bottom w:type="dxa" w:w="50"/>
+              <w:right w:type="dxa" w:w="45"/>
+            </w:tcMar>
+            <w:vAlign w:val="top"/>
+          </w:tcPr>
+          <w:p>
+            <w:pPr>
+              <w:keepNext/>
+              <w:spacing w:after="0" w:before="0" w:line="240" w:lineRule="auto"/>
+              <w:jc w:val="left"/>
+              <w:rPr>
+                <w:b w:val="false"/>
+                <w:bCs w:val="false"/>
+                <w:sz w:val="18"/>
+                <w:szCs w:val="18"/>
+              </w:rPr>
+            </w:pPr>
+            <w:r>
+              <w:rPr>
+                <w:rFonts w:ascii="Times New Roman" w:cs="Times New Roman" w:eastAsia="Times New Roman" w:hAnsi="Times New Roman"/>
+                <w:b w:val="false"/>
+                <w:bCs w:val="false"/>
+                <w:sz w:val="18"/>
+                <w:szCs w:val="18"/>
+              </w:rPr>
+              <w:t xml:space="preserve">Demographic context: receipt differs by age [3]</w:t>
             </w:r>
           </w:p>
         </w:tc>
@@ -1497,40 +1497,40 @@
           <w:tcPr>
             <w:tcW w:type="dxa" w:w="2340"/>
             <w:tcBorders>
-              <w:top w:val="single" w:color="808080" w:sz="4"/>
-              <w:left w:val="single" w:color="808080" w:sz="4"/>
-              <w:bottom w:val="single" w:color="808080" w:sz="4"/>
-              <w:right w:val="single" w:color="808080" w:sz="4"/>
-            </w:tcBorders>
-            <w:tcMar>
-              <w:top w:type="dxa" w:w="40"/>
-              <w:left w:type="dxa" w:w="45"/>
-              <w:bottom w:type="dxa" w:w="40"/>
-              <w:right w:type="dxa" w:w="45"/>
-            </w:tcMar>
-            <w:vAlign w:val="center"/>
-          </w:tcPr>
-          <w:p>
-            <w:pPr>
-              <w:keepNext/>
-              <w:spacing w:after="0" w:before="0" w:line="240" w:lineRule="auto"/>
-              <w:jc w:val="left"/>
-              <w:rPr>
-                <w:b w:val="false"/>
-                <w:bCs w:val="false"/>
-                <w:sz w:val="18"/>
-                <w:szCs w:val="18"/>
-              </w:rPr>
-            </w:pPr>
-            <w:r>
-              <w:rPr>
-                <w:rFonts w:ascii="Times New Roman" w:cs="Times New Roman" w:eastAsia="Times New Roman" w:hAnsi="Times New Roman"/>
-                <w:b w:val="false"/>
-                <w:bCs w:val="false"/>
-                <w:sz w:val="18"/>
-                <w:szCs w:val="18"/>
-              </w:rPr>
-              <w:t xml:space="preserve">Each decade above 60; does not record health or application history.</w:t>
+              <w:top w:val="none" w:color="000000" w:sz="0"/>
+              <w:left w:val="none" w:color="000000" w:sz="0"/>
+              <w:bottom w:val="none" w:color="000000" w:sz="0"/>
+              <w:right w:val="none" w:color="000000" w:sz="0"/>
+            </w:tcBorders>
+            <w:tcMar>
+              <w:top w:type="dxa" w:w="50"/>
+              <w:left w:type="dxa" w:w="45"/>
+              <w:bottom w:type="dxa" w:w="50"/>
+              <w:right w:type="dxa" w:w="45"/>
+            </w:tcMar>
+            <w:vAlign w:val="top"/>
+          </w:tcPr>
+          <w:p>
+            <w:pPr>
+              <w:keepNext/>
+              <w:spacing w:after="0" w:before="0" w:line="240" w:lineRule="auto"/>
+              <w:jc w:val="left"/>
+              <w:rPr>
+                <w:b w:val="false"/>
+                <w:bCs w:val="false"/>
+                <w:sz w:val="18"/>
+                <w:szCs w:val="18"/>
+              </w:rPr>
+            </w:pPr>
+            <w:r>
+              <w:rPr>
+                <w:rFonts w:ascii="Times New Roman" w:cs="Times New Roman" w:eastAsia="Times New Roman" w:hAnsi="Times New Roman"/>
+                <w:b w:val="false"/>
+                <w:bCs w:val="false"/>
+                <w:sz w:val="18"/>
+                <w:szCs w:val="18"/>
+              </w:rPr>
+              <w:t xml:space="preserve">Per decade above 60; health and application history unmeasured.</w:t>
             </w:r>
           </w:p>
         </w:tc>
@@ -1544,18 +1544,18 @@
           <w:tcPr>
             <w:tcW w:type="dxa" w:w="900"/>
             <w:tcBorders>
-              <w:top w:val="single" w:color="808080" w:sz="4"/>
-              <w:left w:val="single" w:color="808080" w:sz="4"/>
-              <w:bottom w:val="single" w:color="808080" w:sz="4"/>
-              <w:right w:val="single" w:color="808080" w:sz="4"/>
-            </w:tcBorders>
-            <w:tcMar>
-              <w:top w:type="dxa" w:w="40"/>
-              <w:left w:type="dxa" w:w="45"/>
-              <w:bottom w:type="dxa" w:w="40"/>
-              <w:right w:type="dxa" w:w="45"/>
-            </w:tcMar>
-            <w:vAlign w:val="center"/>
+              <w:top w:val="none" w:color="000000" w:sz="0"/>
+              <w:left w:val="none" w:color="000000" w:sz="0"/>
+              <w:bottom w:val="none" w:color="000000" w:sz="0"/>
+              <w:right w:val="none" w:color="000000" w:sz="0"/>
+            </w:tcBorders>
+            <w:tcMar>
+              <w:top w:type="dxa" w:w="50"/>
+              <w:left w:type="dxa" w:w="45"/>
+              <w:bottom w:type="dxa" w:w="50"/>
+              <w:right w:type="dxa" w:w="45"/>
+            </w:tcMar>
+            <w:vAlign w:val="top"/>
           </w:tcPr>
           <w:p>
             <w:pPr>
@@ -1585,40 +1585,40 @@
           <w:tcPr>
             <w:tcW w:type="dxa" w:w="1800"/>
             <w:tcBorders>
-              <w:top w:val="single" w:color="808080" w:sz="4"/>
-              <w:left w:val="single" w:color="808080" w:sz="4"/>
-              <w:bottom w:val="single" w:color="808080" w:sz="4"/>
-              <w:right w:val="single" w:color="808080" w:sz="4"/>
-            </w:tcBorders>
-            <w:tcMar>
-              <w:top w:type="dxa" w:w="40"/>
-              <w:left w:type="dxa" w:w="45"/>
-              <w:bottom w:type="dxa" w:w="40"/>
-              <w:right w:type="dxa" w:w="45"/>
-            </w:tcMar>
-            <w:vAlign w:val="center"/>
-          </w:tcPr>
-          <w:p>
-            <w:pPr>
-              <w:keepNext/>
-              <w:spacing w:after="0" w:before="0" w:line="240" w:lineRule="auto"/>
-              <w:jc w:val="left"/>
-              <w:rPr>
-                <w:b w:val="false"/>
-                <w:bCs w:val="false"/>
-                <w:sz w:val="18"/>
-                <w:szCs w:val="18"/>
-              </w:rPr>
-            </w:pPr>
-            <w:r>
-              <w:rPr>
-                <w:rFonts w:ascii="Times New Roman" w:cs="Times New Roman" w:eastAsia="Times New Roman" w:hAnsi="Times New Roman"/>
-                <w:b w:val="false"/>
-                <w:bCs w:val="false"/>
-                <w:sz w:val="18"/>
-                <w:szCs w:val="18"/>
-              </w:rPr>
-              <w:t xml:space="preserve">Receipt differs by sex [3], [4]</w:t>
+              <w:top w:val="none" w:color="000000" w:sz="0"/>
+              <w:left w:val="none" w:color="000000" w:sz="0"/>
+              <w:bottom w:val="none" w:color="000000" w:sz="0"/>
+              <w:right w:val="none" w:color="000000" w:sz="0"/>
+            </w:tcBorders>
+            <w:tcMar>
+              <w:top w:type="dxa" w:w="50"/>
+              <w:left w:type="dxa" w:w="45"/>
+              <w:bottom w:type="dxa" w:w="50"/>
+              <w:right w:type="dxa" w:w="45"/>
+            </w:tcMar>
+            <w:vAlign w:val="top"/>
+          </w:tcPr>
+          <w:p>
+            <w:pPr>
+              <w:keepNext/>
+              <w:spacing w:after="0" w:before="0" w:line="240" w:lineRule="auto"/>
+              <w:jc w:val="left"/>
+              <w:rPr>
+                <w:b w:val="false"/>
+                <w:bCs w:val="false"/>
+                <w:sz w:val="18"/>
+                <w:szCs w:val="18"/>
+              </w:rPr>
+            </w:pPr>
+            <w:r>
+              <w:rPr>
+                <w:rFonts w:ascii="Times New Roman" w:cs="Times New Roman" w:eastAsia="Times New Roman" w:hAnsi="Times New Roman"/>
+                <w:b w:val="false"/>
+                <w:bCs w:val="false"/>
+                <w:sz w:val="18"/>
+                <w:szCs w:val="18"/>
+              </w:rPr>
+              <w:t xml:space="preserve">Demographic context: receipt differs by sex [3], [4]</w:t>
             </w:r>
           </w:p>
         </w:tc>
@@ -1626,40 +1626,40 @@
           <w:tcPr>
             <w:tcW w:type="dxa" w:w="2340"/>
             <w:tcBorders>
-              <w:top w:val="single" w:color="808080" w:sz="4"/>
-              <w:left w:val="single" w:color="808080" w:sz="4"/>
-              <w:bottom w:val="single" w:color="808080" w:sz="4"/>
-              <w:right w:val="single" w:color="808080" w:sz="4"/>
-            </w:tcBorders>
-            <w:tcMar>
-              <w:top w:type="dxa" w:w="40"/>
-              <w:left w:type="dxa" w:w="45"/>
-              <w:bottom w:type="dxa" w:w="40"/>
-              <w:right w:type="dxa" w:w="45"/>
-            </w:tcMar>
-            <w:vAlign w:val="center"/>
-          </w:tcPr>
-          <w:p>
-            <w:pPr>
-              <w:keepNext/>
-              <w:spacing w:after="0" w:before="0" w:line="240" w:lineRule="auto"/>
-              <w:jc w:val="left"/>
-              <w:rPr>
-                <w:b w:val="false"/>
-                <w:bCs w:val="false"/>
-                <w:sz w:val="18"/>
-                <w:szCs w:val="18"/>
-              </w:rPr>
-            </w:pPr>
-            <w:r>
-              <w:rPr>
-                <w:rFonts w:ascii="Times New Roman" w:cs="Times New Roman" w:eastAsia="Times New Roman" w:hAnsi="Times New Roman"/>
-                <w:b w:val="false"/>
-                <w:bCs w:val="false"/>
-                <w:sz w:val="18"/>
-                <w:szCs w:val="18"/>
-              </w:rPr>
-              <w:t xml:space="preserve">Female compared with male; does not measure social roles or discrimination.</w:t>
+              <w:top w:val="none" w:color="000000" w:sz="0"/>
+              <w:left w:val="none" w:color="000000" w:sz="0"/>
+              <w:bottom w:val="none" w:color="000000" w:sz="0"/>
+              <w:right w:val="none" w:color="000000" w:sz="0"/>
+            </w:tcBorders>
+            <w:tcMar>
+              <w:top w:type="dxa" w:w="50"/>
+              <w:left w:type="dxa" w:w="45"/>
+              <w:bottom w:type="dxa" w:w="50"/>
+              <w:right w:type="dxa" w:w="45"/>
+            </w:tcMar>
+            <w:vAlign w:val="top"/>
+          </w:tcPr>
+          <w:p>
+            <w:pPr>
+              <w:keepNext/>
+              <w:spacing w:after="0" w:before="0" w:line="240" w:lineRule="auto"/>
+              <w:jc w:val="left"/>
+              <w:rPr>
+                <w:b w:val="false"/>
+                <w:bCs w:val="false"/>
+                <w:sz w:val="18"/>
+                <w:szCs w:val="18"/>
+              </w:rPr>
+            </w:pPr>
+            <w:r>
+              <w:rPr>
+                <w:rFonts w:ascii="Times New Roman" w:cs="Times New Roman" w:eastAsia="Times New Roman" w:hAnsi="Times New Roman"/>
+                <w:b w:val="false"/>
+                <w:bCs w:val="false"/>
+                <w:sz w:val="18"/>
+                <w:szCs w:val="18"/>
+              </w:rPr>
+              <w:t xml:space="preserve">Female versus male; social roles and discrimination unmeasured.</w:t>
             </w:r>
           </w:p>
         </w:tc>
@@ -1673,18 +1673,18 @@
           <w:tcPr>
             <w:tcW w:type="dxa" w:w="900"/>
             <w:tcBorders>
-              <w:top w:val="single" w:color="808080" w:sz="4"/>
-              <w:left w:val="single" w:color="808080" w:sz="4"/>
-              <w:bottom w:val="single" w:color="808080" w:sz="4"/>
-              <w:right w:val="single" w:color="808080" w:sz="4"/>
-            </w:tcBorders>
-            <w:tcMar>
-              <w:top w:type="dxa" w:w="40"/>
-              <w:left w:type="dxa" w:w="45"/>
-              <w:bottom w:type="dxa" w:w="40"/>
-              <w:right w:type="dxa" w:w="45"/>
-            </w:tcMar>
-            <w:vAlign w:val="center"/>
+              <w:top w:val="none" w:color="000000" w:sz="0"/>
+              <w:left w:val="none" w:color="000000" w:sz="0"/>
+              <w:bottom w:val="none" w:color="000000" w:sz="0"/>
+              <w:right w:val="none" w:color="000000" w:sz="0"/>
+            </w:tcBorders>
+            <w:tcMar>
+              <w:top w:type="dxa" w:w="50"/>
+              <w:left w:type="dxa" w:w="45"/>
+              <w:bottom w:type="dxa" w:w="50"/>
+              <w:right w:type="dxa" w:w="45"/>
+            </w:tcMar>
+            <w:vAlign w:val="top"/>
           </w:tcPr>
           <w:p>
             <w:pPr>
@@ -1714,40 +1714,40 @@
           <w:tcPr>
             <w:tcW w:type="dxa" w:w="1800"/>
             <w:tcBorders>
-              <w:top w:val="single" w:color="808080" w:sz="4"/>
-              <w:left w:val="single" w:color="808080" w:sz="4"/>
-              <w:bottom w:val="single" w:color="808080" w:sz="4"/>
-              <w:right w:val="single" w:color="808080" w:sz="4"/>
-            </w:tcBorders>
-            <w:tcMar>
-              <w:top w:type="dxa" w:w="40"/>
-              <w:left w:type="dxa" w:w="45"/>
-              <w:bottom w:type="dxa" w:w="40"/>
-              <w:right w:type="dxa" w:w="45"/>
-            </w:tcMar>
-            <w:vAlign w:val="center"/>
-          </w:tcPr>
-          <w:p>
-            <w:pPr>
-              <w:keepNext/>
-              <w:spacing w:after="0" w:before="0" w:line="240" w:lineRule="auto"/>
-              <w:jc w:val="left"/>
-              <w:rPr>
-                <w:b w:val="false"/>
-                <w:bCs w:val="false"/>
-                <w:sz w:val="18"/>
-                <w:szCs w:val="18"/>
-              </w:rPr>
-            </w:pPr>
-            <w:r>
-              <w:rPr>
-                <w:rFonts w:ascii="Times New Roman" w:cs="Times New Roman" w:eastAsia="Times New Roman" w:hAnsi="Times New Roman"/>
-                <w:b w:val="false"/>
-                <w:bCs w:val="false"/>
-                <w:sz w:val="18"/>
-                <w:szCs w:val="18"/>
-              </w:rPr>
-              <w:t xml:space="preserve">May help people find and understand information [10], [13]</w:t>
+              <w:top w:val="none" w:color="000000" w:sz="0"/>
+              <w:left w:val="none" w:color="000000" w:sz="0"/>
+              <w:bottom w:val="none" w:color="000000" w:sz="0"/>
+              <w:right w:val="none" w:color="000000" w:sz="0"/>
+            </w:tcBorders>
+            <w:tcMar>
+              <w:top w:type="dxa" w:w="50"/>
+              <w:left w:type="dxa" w:w="45"/>
+              <w:bottom w:type="dxa" w:w="50"/>
+              <w:right w:type="dxa" w:w="45"/>
+            </w:tcMar>
+            <w:vAlign w:val="top"/>
+          </w:tcPr>
+          <w:p>
+            <w:pPr>
+              <w:keepNext/>
+              <w:spacing w:after="0" w:before="0" w:line="240" w:lineRule="auto"/>
+              <w:jc w:val="left"/>
+              <w:rPr>
+                <w:b w:val="false"/>
+                <w:bCs w:val="false"/>
+                <w:sz w:val="18"/>
+                <w:szCs w:val="18"/>
+              </w:rPr>
+            </w:pPr>
+            <w:r>
+              <w:rPr>
+                <w:rFonts w:ascii="Times New Roman" w:cs="Times New Roman" w:eastAsia="Times New Roman" w:hAnsi="Times New Roman"/>
+                <w:b w:val="false"/>
+                <w:bCs w:val="false"/>
+                <w:sz w:val="18"/>
+                <w:szCs w:val="18"/>
+              </w:rPr>
+              <w:t xml:space="preserve">Learning costs: schooling may help people find and understand grant information [10], [13]</w:t>
             </w:r>
           </w:p>
         </w:tc>
@@ -1755,40 +1755,40 @@
           <w:tcPr>
             <w:tcW w:type="dxa" w:w="2340"/>
             <w:tcBorders>
-              <w:top w:val="single" w:color="808080" w:sz="4"/>
-              <w:left w:val="single" w:color="808080" w:sz="4"/>
-              <w:bottom w:val="single" w:color="808080" w:sz="4"/>
-              <w:right w:val="single" w:color="808080" w:sz="4"/>
-            </w:tcBorders>
-            <w:tcMar>
-              <w:top w:type="dxa" w:w="40"/>
-              <w:left w:type="dxa" w:w="45"/>
-              <w:bottom w:type="dxa" w:w="40"/>
-              <w:right w:type="dxa" w:w="45"/>
-            </w:tcMar>
-            <w:vAlign w:val="center"/>
-          </w:tcPr>
-          <w:p>
-            <w:pPr>
-              <w:keepNext/>
-              <w:spacing w:after="0" w:before="0" w:line="240" w:lineRule="auto"/>
-              <w:jc w:val="left"/>
-              <w:rPr>
-                <w:b w:val="false"/>
-                <w:bCs w:val="false"/>
-                <w:sz w:val="18"/>
-                <w:szCs w:val="18"/>
-              </w:rPr>
-            </w:pPr>
-            <w:r>
-              <w:rPr>
-                <w:rFonts w:ascii="Times New Roman" w:cs="Times New Roman" w:eastAsia="Times New Roman" w:hAnsi="Times New Roman"/>
-                <w:b w:val="false"/>
-                <w:bCs w:val="false"/>
-                <w:sz w:val="18"/>
-                <w:szCs w:val="18"/>
-              </w:rPr>
-              <w:t xml:space="preserve">Below Grade 7 compared with Grade 7 or above; does not measure awareness or literacy.</w:t>
+              <w:top w:val="none" w:color="000000" w:sz="0"/>
+              <w:left w:val="none" w:color="000000" w:sz="0"/>
+              <w:bottom w:val="none" w:color="000000" w:sz="0"/>
+              <w:right w:val="none" w:color="000000" w:sz="0"/>
+            </w:tcBorders>
+            <w:tcMar>
+              <w:top w:type="dxa" w:w="50"/>
+              <w:left w:type="dxa" w:w="45"/>
+              <w:bottom w:type="dxa" w:w="50"/>
+              <w:right w:type="dxa" w:w="45"/>
+            </w:tcMar>
+            <w:vAlign w:val="top"/>
+          </w:tcPr>
+          <w:p>
+            <w:pPr>
+              <w:keepNext/>
+              <w:spacing w:after="0" w:before="0" w:line="240" w:lineRule="auto"/>
+              <w:jc w:val="left"/>
+              <w:rPr>
+                <w:b w:val="false"/>
+                <w:bCs w:val="false"/>
+                <w:sz w:val="18"/>
+                <w:szCs w:val="18"/>
+              </w:rPr>
+            </w:pPr>
+            <w:r>
+              <w:rPr>
+                <w:rFonts w:ascii="Times New Roman" w:cs="Times New Roman" w:eastAsia="Times New Roman" w:hAnsi="Times New Roman"/>
+                <w:b w:val="false"/>
+                <w:bCs w:val="false"/>
+                <w:sz w:val="18"/>
+                <w:szCs w:val="18"/>
+              </w:rPr>
+              <w:t xml:space="preserve">Below Grade 7 versus Grade 7 or above; awareness and literacy unmeasured.</w:t>
             </w:r>
           </w:p>
         </w:tc>
@@ -1802,18 +1802,18 @@
           <w:tcPr>
             <w:tcW w:type="dxa" w:w="900"/>
             <w:tcBorders>
-              <w:top w:val="single" w:color="808080" w:sz="4"/>
-              <w:left w:val="single" w:color="808080" w:sz="4"/>
-              <w:bottom w:val="single" w:color="808080" w:sz="4"/>
-              <w:right w:val="single" w:color="808080" w:sz="4"/>
-            </w:tcBorders>
-            <w:tcMar>
-              <w:top w:type="dxa" w:w="40"/>
-              <w:left w:type="dxa" w:w="45"/>
-              <w:bottom w:type="dxa" w:w="40"/>
-              <w:right w:type="dxa" w:w="45"/>
-            </w:tcMar>
-            <w:vAlign w:val="center"/>
+              <w:top w:val="none" w:color="000000" w:sz="0"/>
+              <w:left w:val="none" w:color="000000" w:sz="0"/>
+              <w:bottom w:val="none" w:color="000000" w:sz="0"/>
+              <w:right w:val="none" w:color="000000" w:sz="0"/>
+            </w:tcBorders>
+            <w:tcMar>
+              <w:top w:type="dxa" w:w="50"/>
+              <w:left w:type="dxa" w:w="45"/>
+              <w:bottom w:type="dxa" w:w="50"/>
+              <w:right w:type="dxa" w:w="45"/>
+            </w:tcMar>
+            <w:vAlign w:val="top"/>
           </w:tcPr>
           <w:p>
             <w:pPr>
@@ -1843,40 +1843,40 @@
           <w:tcPr>
             <w:tcW w:type="dxa" w:w="1800"/>
             <w:tcBorders>
-              <w:top w:val="single" w:color="808080" w:sz="4"/>
-              <w:left w:val="single" w:color="808080" w:sz="4"/>
-              <w:bottom w:val="single" w:color="808080" w:sz="4"/>
-              <w:right w:val="single" w:color="808080" w:sz="4"/>
-            </w:tcBorders>
-            <w:tcMar>
-              <w:top w:type="dxa" w:w="40"/>
-              <w:left w:type="dxa" w:w="45"/>
-              <w:bottom w:type="dxa" w:w="40"/>
-              <w:right w:type="dxa" w:w="45"/>
-            </w:tcMar>
-            <w:vAlign w:val="center"/>
-          </w:tcPr>
-          <w:p>
-            <w:pPr>
-              <w:keepNext/>
-              <w:spacing w:after="0" w:before="0" w:line="240" w:lineRule="auto"/>
-              <w:jc w:val="left"/>
-              <w:rPr>
-                <w:b w:val="false"/>
-                <w:bCs w:val="false"/>
-                <w:sz w:val="18"/>
-                <w:szCs w:val="18"/>
-              </w:rPr>
-            </w:pPr>
-            <w:r>
-              <w:rPr>
-                <w:rFonts w:ascii="Times New Roman" w:cs="Times New Roman" w:eastAsia="Times New Roman" w:hAnsi="Times New Roman"/>
-                <w:b w:val="false"/>
-                <w:bCs w:val="false"/>
-                <w:sz w:val="18"/>
-                <w:szCs w:val="18"/>
-              </w:rPr>
-              <w:t xml:space="preserve">Where people live may affect service access [6], [14], [15]</w:t>
+              <w:top w:val="none" w:color="000000" w:sz="0"/>
+              <w:left w:val="none" w:color="000000" w:sz="0"/>
+              <w:bottom w:val="none" w:color="000000" w:sz="0"/>
+              <w:right w:val="none" w:color="000000" w:sz="0"/>
+            </w:tcBorders>
+            <w:tcMar>
+              <w:top w:type="dxa" w:w="50"/>
+              <w:left w:type="dxa" w:w="45"/>
+              <w:bottom w:type="dxa" w:w="50"/>
+              <w:right w:type="dxa" w:w="45"/>
+            </w:tcMar>
+            <w:vAlign w:val="top"/>
+          </w:tcPr>
+          <w:p>
+            <w:pPr>
+              <w:keepNext/>
+              <w:spacing w:after="0" w:before="0" w:line="240" w:lineRule="auto"/>
+              <w:jc w:val="left"/>
+              <w:rPr>
+                <w:b w:val="false"/>
+                <w:bCs w:val="false"/>
+                <w:sz w:val="18"/>
+                <w:szCs w:val="18"/>
+              </w:rPr>
+            </w:pPr>
+            <w:r>
+              <w:rPr>
+                <w:rFonts w:ascii="Times New Roman" w:cs="Times New Roman" w:eastAsia="Times New Roman" w:hAnsi="Times New Roman"/>
+                <w:b w:val="false"/>
+                <w:bCs w:val="false"/>
+                <w:sz w:val="18"/>
+                <w:szCs w:val="18"/>
+              </w:rPr>
+              <w:t xml:space="preserve">Compliance costs: place may shape service access [6], [14], [15]</w:t>
             </w:r>
           </w:p>
         </w:tc>
@@ -1884,40 +1884,40 @@
           <w:tcPr>
             <w:tcW w:type="dxa" w:w="2340"/>
             <w:tcBorders>
-              <w:top w:val="single" w:color="808080" w:sz="4"/>
-              <w:left w:val="single" w:color="808080" w:sz="4"/>
-              <w:bottom w:val="single" w:color="808080" w:sz="4"/>
-              <w:right w:val="single" w:color="808080" w:sz="4"/>
-            </w:tcBorders>
-            <w:tcMar>
-              <w:top w:type="dxa" w:w="40"/>
-              <w:left w:type="dxa" w:w="45"/>
-              <w:bottom w:type="dxa" w:w="40"/>
-              <w:right w:type="dxa" w:w="45"/>
-            </w:tcMar>
-            <w:vAlign w:val="center"/>
-          </w:tcPr>
-          <w:p>
-            <w:pPr>
-              <w:keepNext/>
-              <w:spacing w:after="0" w:before="0" w:line="240" w:lineRule="auto"/>
-              <w:jc w:val="left"/>
-              <w:rPr>
-                <w:b w:val="false"/>
-                <w:bCs w:val="false"/>
-                <w:sz w:val="18"/>
-                <w:szCs w:val="18"/>
-              </w:rPr>
-            </w:pPr>
-            <w:r>
-              <w:rPr>
-                <w:rFonts w:ascii="Times New Roman" w:cs="Times New Roman" w:eastAsia="Times New Roman" w:hAnsi="Times New Roman"/>
-                <w:b w:val="false"/>
-                <w:bCs w:val="false"/>
-                <w:sz w:val="18"/>
-                <w:szCs w:val="18"/>
-              </w:rPr>
-              <w:t xml:space="preserve">Two settlement comparisons with formal urban areas; does not measure office capacity.</w:t>
+              <w:top w:val="none" w:color="000000" w:sz="0"/>
+              <w:left w:val="none" w:color="000000" w:sz="0"/>
+              <w:bottom w:val="none" w:color="000000" w:sz="0"/>
+              <w:right w:val="none" w:color="000000" w:sz="0"/>
+            </w:tcBorders>
+            <w:tcMar>
+              <w:top w:type="dxa" w:w="50"/>
+              <w:left w:type="dxa" w:w="45"/>
+              <w:bottom w:type="dxa" w:w="50"/>
+              <w:right w:type="dxa" w:w="45"/>
+            </w:tcMar>
+            <w:vAlign w:val="top"/>
+          </w:tcPr>
+          <w:p>
+            <w:pPr>
+              <w:keepNext/>
+              <w:spacing w:after="0" w:before="0" w:line="240" w:lineRule="auto"/>
+              <w:jc w:val="left"/>
+              <w:rPr>
+                <w:b w:val="false"/>
+                <w:bCs w:val="false"/>
+                <w:sz w:val="18"/>
+                <w:szCs w:val="18"/>
+              </w:rPr>
+            </w:pPr>
+            <w:r>
+              <w:rPr>
+                <w:rFonts w:ascii="Times New Roman" w:cs="Times New Roman" w:eastAsia="Times New Roman" w:hAnsi="Times New Roman"/>
+                <w:b w:val="false"/>
+                <w:bCs w:val="false"/>
+                <w:sz w:val="18"/>
+                <w:szCs w:val="18"/>
+              </w:rPr>
+              <w:t xml:space="preserve">Urban informal and traditional/rural formal, each versus urban formal; office capacity unmeasured.</w:t>
             </w:r>
           </w:p>
         </w:tc>
@@ -1931,18 +1931,18 @@
           <w:tcPr>
             <w:tcW w:type="dxa" w:w="900"/>
             <w:tcBorders>
-              <w:top w:val="single" w:color="808080" w:sz="4"/>
-              <w:left w:val="single" w:color="808080" w:sz="4"/>
-              <w:bottom w:val="single" w:color="808080" w:sz="4"/>
-              <w:right w:val="single" w:color="808080" w:sz="4"/>
-            </w:tcBorders>
-            <w:tcMar>
-              <w:top w:type="dxa" w:w="40"/>
-              <w:left w:type="dxa" w:w="45"/>
-              <w:bottom w:type="dxa" w:w="40"/>
-              <w:right w:type="dxa" w:w="45"/>
-            </w:tcMar>
-            <w:vAlign w:val="center"/>
+              <w:top w:val="none" w:color="000000" w:sz="0"/>
+              <w:left w:val="none" w:color="000000" w:sz="0"/>
+              <w:bottom w:val="single" w:color="000000" w:sz="6"/>
+              <w:right w:val="none" w:color="000000" w:sz="0"/>
+            </w:tcBorders>
+            <w:tcMar>
+              <w:top w:type="dxa" w:w="50"/>
+              <w:left w:type="dxa" w:w="45"/>
+              <w:bottom w:type="dxa" w:w="50"/>
+              <w:right w:type="dxa" w:w="45"/>
+            </w:tcMar>
+            <w:vAlign w:val="top"/>
           </w:tcPr>
           <w:p>
             <w:pPr>
@@ -1972,18 +1972,18 @@
           <w:tcPr>
             <w:tcW w:type="dxa" w:w="1800"/>
             <w:tcBorders>
-              <w:top w:val="single" w:color="808080" w:sz="4"/>
-              <w:left w:val="single" w:color="808080" w:sz="4"/>
-              <w:bottom w:val="single" w:color="808080" w:sz="4"/>
-              <w:right w:val="single" w:color="808080" w:sz="4"/>
-            </w:tcBorders>
-            <w:tcMar>
-              <w:top w:type="dxa" w:w="40"/>
-              <w:left w:type="dxa" w:w="45"/>
-              <w:bottom w:type="dxa" w:w="40"/>
-              <w:right w:type="dxa" w:w="45"/>
-            </w:tcMar>
-            <w:vAlign w:val="center"/>
+              <w:top w:val="none" w:color="000000" w:sz="0"/>
+              <w:left w:val="none" w:color="000000" w:sz="0"/>
+              <w:bottom w:val="single" w:color="000000" w:sz="6"/>
+              <w:right w:val="none" w:color="000000" w:sz="0"/>
+            </w:tcBorders>
+            <w:tcMar>
+              <w:top w:type="dxa" w:w="50"/>
+              <w:left w:type="dxa" w:w="45"/>
+              <w:bottom w:type="dxa" w:w="50"/>
+              <w:right w:type="dxa" w:w="45"/>
+            </w:tcMar>
+            <w:vAlign w:val="top"/>
           </w:tcPr>
           <w:p>
             <w:pPr>
@@ -2005,7 +2005,7 @@
                 <w:sz w:val="18"/>
                 <w:szCs w:val="18"/>
               </w:rPr>
-              <w:t xml:space="preserve">Reaching an office may require effort [10], [14]</w:t>
+              <w:t xml:space="preserve">Compliance costs: distance may add travel effort [10], [14]</w:t>
             </w:r>
           </w:p>
         </w:tc>
@@ -2013,18 +2013,18 @@
           <w:tcPr>
             <w:tcW w:type="dxa" w:w="2340"/>
             <w:tcBorders>
-              <w:top w:val="single" w:color="808080" w:sz="4"/>
-              <w:left w:val="single" w:color="808080" w:sz="4"/>
-              <w:bottom w:val="single" w:color="808080" w:sz="4"/>
-              <w:right w:val="single" w:color="808080" w:sz="4"/>
-            </w:tcBorders>
-            <w:tcMar>
-              <w:top w:type="dxa" w:w="40"/>
-              <w:left w:type="dxa" w:w="45"/>
-              <w:bottom w:type="dxa" w:w="40"/>
-              <w:right w:type="dxa" w:w="45"/>
-            </w:tcMar>
-            <w:vAlign w:val="center"/>
+              <w:top w:val="none" w:color="000000" w:sz="0"/>
+              <w:left w:val="none" w:color="000000" w:sz="0"/>
+              <w:bottom w:val="single" w:color="000000" w:sz="6"/>
+              <w:right w:val="none" w:color="000000" w:sz="0"/>
+            </w:tcBorders>
+            <w:tcMar>
+              <w:top w:type="dxa" w:w="50"/>
+              <w:left w:type="dxa" w:w="45"/>
+              <w:bottom w:type="dxa" w:w="50"/>
+              <w:right w:type="dxa" w:w="45"/>
+            </w:tcMar>
+            <w:vAlign w:val="top"/>
           </w:tcPr>
           <w:p>
             <w:pPr>
@@ -2046,12 +2046,34 @@
                 <w:sz w:val="18"/>
                 <w:szCs w:val="18"/>
               </w:rPr>
-              <w:t xml:space="preserve">At least 5 km/unavailable compared with nearer; does not record visits or travel costs.</w:t>
+              <w:t xml:space="preserve">At least 5 km/unavailable versus nearer than 5 km; visits and travel costs unmeasured.</w:t>
             </w:r>
           </w:p>
         </w:tc>
       </w:tr>
     </w:tbl>
+    <w:p>
+      <w:pPr>
+        <w:spacing w:after="80" w:before="30" w:line="190"/>
+        <w:jc w:val="both"/>
+        <w:rPr>
+          <w:i/>
+          <w:iCs/>
+          <w:sz w:val="16"/>
+          <w:szCs w:val="16"/>
+        </w:rPr>
+      </w:pPr>
+      <w:r>
+        <w:rPr>
+          <w:rFonts w:ascii="Times New Roman" w:cs="Times New Roman" w:eastAsia="Times New Roman" w:hAnsi="Times New Roman"/>
+          <w:i/>
+          <w:iCs/>
+          <w:sz w:val="16"/>
+          <w:szCs w:val="16"/>
+        </w:rPr>
+        <w:t xml:space="preserve">Psychological costs are unmeasured. Settlement contributes two contrasts, giving five predictor groups and six slopes.</w:t>
+      </w:r>
+    </w:p>
     <w:p>
       <w:pPr>
         <w:spacing w:after="80" w:before="0" w:line="230"/>

</xml_diff>

<commit_message>
Clarify historical screening assumptions and record verification limits
</commit_message>
<xml_diff>
--- a/paper/Jawe_OPG_nonreceipt_KZN.docx
+++ b/paper/Jawe_OPG_nonreceipt_KZN.docx
@@ -3567,7 +3567,7 @@
           <w:sz w:val="20"/>
           <w:szCs w:val="20"/>
         </w:rPr>
-        <w:t xml:space="preserve">The screen summed reported yearly income to estimate private resources. It excluded social-assistance income so receiving a grant would not cause a failure. It did not divide household totals among individuals. A missing income record counts as zero only when the source indicator confirms no reported income; otherwise, the screen leaves it unresolved. Asset purchases do not measure total asset holdings. The data cannot establish the full legal asset test, income assigned under legal rules or permitted deductions.</w:t>
+        <w:t xml:space="preserve">The screen summed already annualised, nominal person-income amounts, excluding social-assistance income. It did not allocate household income. A missing applicant or linked-spouse amount remained unresolved unless the no-income response and absent schedule supported zero. Assets, deemed income and permitted deductions were outside this research proxy.</w:t>
       </w:r>
     </w:p>
     <w:p>
@@ -3581,7 +3581,7 @@
           <w:sz w:val="20"/>
           <w:szCs w:val="20"/>
         </w:rPr>
-        <w:t xml:space="preserve">The income ceiling corresponds to a formula payment of R100 monthly. From April 2014, the ceilings are R61,800 for a single person and R123,600 for a couple; from April 2015, they are R64,680 and R129,360 [24], [25]. The screen included amounts exactly at the interview-month ceiling. These research limits do not establish legal eligibility. The legal formula and couple-threshold interpretation remain unverified. Alternative analyses tested thresholds and income definitions.</w:t>
+        <w:t xml:space="preserve">Interview months selected annual ceilings: R61,800 single/R123,600 couple for October 2014–March 2015; R64,680/R129,360 for April–October 2015. The calculation used recorded monthly maxima of R1,350/R1,410 [24], [25] and assumed an annual grant D = 1.6A − 0.4B, where A is the annual maximum and B annual private income. Setting D to R1,200 gave the single ceilings; treating B as half the joint income doubled the couple ceilings. Equality passed. S1 tested alternative periods, the zero-payment boundary and the age-75 supplement. Arithmetic and implementation were checked; the official notices, operative formula, minimum-payment rule and legal spouse definition remain unverified.</w:t>
       </w:r>
     </w:p>
     <w:p>
@@ -3595,7 +3595,21 @@
           <w:sz w:val="20"/>
           <w:szCs w:val="20"/>
         </w:rPr>
-        <w:t xml:space="preserve">For married adults, the screen combined applicant and spouse resources only after linking a resident spouse and confirming the relationship. Never-married, widowed and divorced adults use the single ceiling. Living-together, separated, absent-spouse and failed-link cases remain unresolved in the primary analysis. The screen does not treat unknown partner resources as zero or classify ambiguous partnerships as single. Alternative analyses relaxed these choices. An adult's own disability or war-veterans grant causes a failure. Caregiver child grants and grant-in-aid (an extra grant for people who need full-time care) do not exclude the adult or define OPG receipt. A known failure takes priority over missing information; the software retains all reasons.</w:t>
+        <w:t xml:space="preserve">Marital responses selected research assumptions, rather than establishing legal spouse status. Never-married, widowed and divorced adults used the single ceiling. Married respondents required a reported resident spouse, a pointer to a different household member and that person's return pointer. Both private-income amounts had to be resolved; their sum was compared with the couple ceiling regardless of the spouse's age. Living-together, separated or unspecified status remained unresolved, as did nonresident, missing, unmatched, self or nonreciprocal spouse links. These cases were not assigned single status or zero partner income. S2 tested alternative partnership assumptions.</w:t>
+      </w:r>
+    </w:p>
+    <w:p>
+      <w:pPr>
+        <w:spacing w:after="80" w:before="0" w:line="230"/>
+        <w:jc w:val="both"/>
+      </w:pPr>
+      <w:r>
+        <w:rPr>
+          <w:rFonts w:ascii="Times New Roman" w:cs="Times New Roman" w:eastAsia="Times New Roman" w:hAnsi="Times New Roman"/>
+          <w:sz w:val="20"/>
+          <w:szCs w:val="20"/>
+        </w:rPr>
+        <w:t xml:space="preserve">An adult's reported disability or war-veterans grant caused FAIL. Caregiver child grants and grant-in-aid neither excluded the adult nor defined OPG receipt. A known failure took priority over unresolved information; the screen retained all reasons.</w:t>
       </w:r>
     </w:p>
     <w:p>

</xml_diff>

<commit_message>
Clarify legal verification scope and spouse-resource rationale
</commit_message>
<xml_diff>
--- a/paper/Jawe_OPG_nonreceipt_KZN.docx
+++ b/paper/Jawe_OPG_nonreceipt_KZN.docx
@@ -3581,7 +3581,7 @@
           <w:sz w:val="20"/>
           <w:szCs w:val="20"/>
         </w:rPr>
-        <w:t xml:space="preserve">Interview months selected annual ceilings: R61,800 single/R123,600 couple for October 2014–March 2015; R64,680/R129,360 for April–October 2015. The calculation used recorded monthly maxima of R1,350/R1,410 [24], [25] and assumed an annual grant D = 1.6A − 0.4B, where A is the annual maximum and B annual private income. Setting D to R1,200 gave the single ceilings; treating B as half the joint income doubled the couple ceilings. Equality passed. S1 tested alternative periods, the zero-payment boundary and the age-75 supplement. Arithmetic and implementation were checked; the official notices, operative formula, minimum-payment rule and legal spouse definition remain unverified.</w:t>
+        <w:t xml:space="preserve">Interview months selected annual ceilings: R61,800 single/R123,600 couple for October 2014–March 2015; R64,680/R129,360 for April–October 2015. The calculation used recorded monthly maxima of R1,350/R1,410 [24], [25] and assumed an annual grant D = 1.6A − 0.4B, where A is the annual maximum and B annual private income. Setting D to R1,200 gave the single ceilings; treating B as half the joint income doubled the couple ceilings. Equality passed. S1 tested alternative periods, the zero-payment boundary and the age-75 supplement. The audit verified the arithmetic, coded ceilings and LCS partnership items. It did not authenticate the notices or the formula, minimum-payment and spouse provisions applicable in 2014–2015.</w:t>
       </w:r>
     </w:p>
     <w:p>
@@ -3595,7 +3595,7 @@
           <w:sz w:val="20"/>
           <w:szCs w:val="20"/>
         </w:rPr>
-        <w:t xml:space="preserve">Marital responses selected research assumptions, rather than establishing legal spouse status. Never-married, widowed and divorced adults used the single ceiling. Married respondents required a reported resident spouse, a pointer to a different household member and that person's return pointer. Both private-income amounts had to be resolved; their sum was compared with the couple ceiling regardless of the spouse's age. Living-together, separated or unspecified status remained unresolved, as did nonresident, missing, unmatched, self or nonreciprocal spouse links. These cases were not assigned single status or zero partner income. S2 tested alternative partnership assumptions.</w:t>
+        <w:t xml:space="preserve">Marital responses selected research assumptions, rather than establishing legal spouse status. Never-married, widowed and divorced adults used the single ceiling. For married respondents, a resident spouse and reciprocal household person-number pointers identified whose income to combine. Both amounts had to be resolved; their sum implemented the assumed couple-resource rule regardless of spouse age. Residence and reciprocity were research consistency requirements. Nonresident spouses remained unresolved because partner income was unavailable. Separated respondents lacked collected spouse details [23]. Cohabitation did not establish legal classification. These cases, unspecified status and missing or inconsistent links remained unresolved, without assumed single status or zero partner income. S2 tested alternatives.</w:t>
       </w:r>
     </w:p>
     <w:p>

</xml_diff>

<commit_message>
Document uploaded legal sources and historical screening gap
</commit_message>
<xml_diff>
--- a/paper/Jawe_OPG_nonreceipt_KZN.docx
+++ b/paper/Jawe_OPG_nonreceipt_KZN.docx
@@ -3581,7 +3581,7 @@
           <w:sz w:val="20"/>
           <w:szCs w:val="20"/>
         </w:rPr>
-        <w:t xml:space="preserve">Interview months selected annual ceilings: R61,800 single/R123,600 couple for October 2014–March 2015; R64,680/R129,360 for April–October 2015. The calculation used recorded monthly maxima of R1,350/R1,410 [24], [25] and assumed an annual grant D = 1.6A − 0.4B, where A is the annual maximum and B annual private income. Setting D to R1,200 gave the single ceilings; treating B as half the joint income doubled the couple ceilings. Equality passed. S1 tested alternative periods, the zero-payment boundary and the age-75 supplement. The audit verified the arithmetic, coded ceilings and LCS partnership items. It did not authenticate the notices or the formula, minimum-payment and spouse provisions applicable in 2014–2015.</w:t>
+        <w:t xml:space="preserve">The screen used annual research ceilings of R61,800 single/R123,600 couple for October 2014–March 2015 and R64,680/R129,360 for April–October 2015. Recorded monthly maxima of R1,350/R1,410 [24], [25] and the assumed formula D = 1.6A − 0.4B, with annual maximum A, annual private-income proxy B and minimum D = R1,200, yield these ceilings; half-joint income doubles the couple limit. Equality passed. S1 tested period, boundary and age-75 alternatives. GN R286, Schedule 2 and 4, specified 1.4A − 0.4B from 1 April 2011 [26]. GN R2119 (2022), Annexure A(2), (5), specifies 1.6A − 0.4B and R100 monthly minimum, but commenced in 2022 under regulation 41 [27]. The intervening formula and rate-notice chain remain unauthenticated; estimates are conditional on the research ceilings.</w:t>
       </w:r>
     </w:p>
     <w:p>
@@ -13208,7 +13208,7 @@
           <w:sz w:val="20"/>
           <w:szCs w:val="20"/>
         </w:rPr>
-        <w:t xml:space="preserve">The survey cannot fully establish legal eligibility: its resource measure omits assets, deemed income (income the law assigns rather than the survey observes) and deductions. Income and receipt reports may contain errors. Cross-sectional data cannot establish the order of events. Few events, unresolved eligibility, missing strata and resampling fixed predictions without refitting limit inference. Household sampling excludes institutionalised older adults. Participant usability and performance in another population remain untested.</w:t>
+        <w:t xml:space="preserve">The survey cannot establish legal eligibility: its resource proxy omits assets, deemed income and deductions. Historical applicability of the formula remains unresolved. Respondents may misreport income and receipt. Cross-sectional data cannot establish the order of events. Few events, unresolved screening, missing strata and resampling fixed predictions without refitting limit inference. Household sampling excludes institutionalised older adults. Participant usability and performance elsewhere remain untested.</w:t>
       </w:r>
     </w:p>
     <w:p>
@@ -13298,7 +13298,7 @@
     <w:p>
       <w:pPr>
         <w:keepLines/>
-        <w:spacing w:after="50" w:before="0" w:line="190"/>
+        <w:spacing w:after="20" w:before="0" w:line="190"/>
         <w:ind w:left="260" w:hanging="260"/>
         <w:jc w:val="left"/>
         <w:rPr>
@@ -13318,7 +13318,7 @@
     <w:p>
       <w:pPr>
         <w:keepLines/>
-        <w:spacing w:after="50" w:before="0" w:line="190"/>
+        <w:spacing w:after="20" w:before="0" w:line="190"/>
         <w:ind w:left="260" w:hanging="260"/>
         <w:jc w:val="left"/>
         <w:rPr>
@@ -13338,7 +13338,7 @@
     <w:p>
       <w:pPr>
         <w:keepLines/>
-        <w:spacing w:after="50" w:before="0" w:line="190"/>
+        <w:spacing w:after="20" w:before="0" w:line="190"/>
         <w:ind w:left="260" w:hanging="260"/>
         <w:jc w:val="left"/>
         <w:rPr>
@@ -13358,7 +13358,7 @@
     <w:p>
       <w:pPr>
         <w:keepLines/>
-        <w:spacing w:after="50" w:before="0" w:line="190"/>
+        <w:spacing w:after="20" w:before="0" w:line="190"/>
         <w:ind w:left="260" w:hanging="260"/>
         <w:jc w:val="left"/>
         <w:rPr>
@@ -13378,7 +13378,7 @@
     <w:p>
       <w:pPr>
         <w:keepLines/>
-        <w:spacing w:after="50" w:before="0" w:line="190"/>
+        <w:spacing w:after="20" w:before="0" w:line="190"/>
         <w:ind w:left="260" w:hanging="260"/>
         <w:jc w:val="left"/>
         <w:rPr>
@@ -13398,7 +13398,7 @@
     <w:p>
       <w:pPr>
         <w:keepLines/>
-        <w:spacing w:after="50" w:before="0" w:line="190"/>
+        <w:spacing w:after="20" w:before="0" w:line="190"/>
         <w:ind w:left="260" w:hanging="260"/>
         <w:jc w:val="left"/>
         <w:rPr>
@@ -13418,7 +13418,7 @@
     <w:p>
       <w:pPr>
         <w:keepLines/>
-        <w:spacing w:after="50" w:before="0" w:line="190"/>
+        <w:spacing w:after="20" w:before="0" w:line="190"/>
         <w:ind w:left="260" w:hanging="260"/>
         <w:jc w:val="left"/>
         <w:rPr>
@@ -13438,7 +13438,7 @@
     <w:p>
       <w:pPr>
         <w:keepLines/>
-        <w:spacing w:after="50" w:before="0" w:line="190"/>
+        <w:spacing w:after="20" w:before="0" w:line="190"/>
         <w:ind w:left="260" w:hanging="260"/>
         <w:jc w:val="left"/>
         <w:rPr>
@@ -13458,7 +13458,7 @@
     <w:p>
       <w:pPr>
         <w:keepLines/>
-        <w:spacing w:after="50" w:before="0" w:line="190"/>
+        <w:spacing w:after="20" w:before="0" w:line="190"/>
         <w:ind w:left="260" w:hanging="260"/>
         <w:jc w:val="left"/>
         <w:rPr>
@@ -13478,7 +13478,7 @@
     <w:p>
       <w:pPr>
         <w:keepLines/>
-        <w:spacing w:after="50" w:before="0" w:line="190"/>
+        <w:spacing w:after="20" w:before="0" w:line="190"/>
         <w:ind w:left="260" w:hanging="260"/>
         <w:jc w:val="left"/>
         <w:rPr>
@@ -13498,7 +13498,7 @@
     <w:p>
       <w:pPr>
         <w:keepLines/>
-        <w:spacing w:after="50" w:before="0" w:line="190"/>
+        <w:spacing w:after="20" w:before="0" w:line="190"/>
         <w:ind w:left="260" w:hanging="260"/>
         <w:jc w:val="left"/>
         <w:rPr>
@@ -13518,7 +13518,7 @@
     <w:p>
       <w:pPr>
         <w:keepLines/>
-        <w:spacing w:after="50" w:before="0" w:line="190"/>
+        <w:spacing w:after="20" w:before="0" w:line="190"/>
         <w:ind w:left="260" w:hanging="260"/>
         <w:jc w:val="left"/>
         <w:rPr>
@@ -13538,7 +13538,7 @@
     <w:p>
       <w:pPr>
         <w:keepLines/>
-        <w:spacing w:after="50" w:before="0" w:line="190"/>
+        <w:spacing w:after="20" w:before="0" w:line="190"/>
         <w:ind w:left="260" w:hanging="260"/>
         <w:jc w:val="left"/>
         <w:rPr>
@@ -13558,7 +13558,7 @@
     <w:p>
       <w:pPr>
         <w:keepLines/>
-        <w:spacing w:after="50" w:before="0" w:line="190"/>
+        <w:spacing w:after="20" w:before="0" w:line="190"/>
         <w:ind w:left="260" w:hanging="260"/>
         <w:jc w:val="left"/>
         <w:rPr>
@@ -13578,7 +13578,7 @@
     <w:p>
       <w:pPr>
         <w:keepLines/>
-        <w:spacing w:after="50" w:before="0" w:line="190"/>
+        <w:spacing w:after="20" w:before="0" w:line="190"/>
         <w:ind w:left="260" w:hanging="260"/>
         <w:jc w:val="left"/>
         <w:rPr>
@@ -13598,7 +13598,7 @@
     <w:p>
       <w:pPr>
         <w:keepLines/>
-        <w:spacing w:after="50" w:before="0" w:line="190"/>
+        <w:spacing w:after="20" w:before="0" w:line="190"/>
         <w:ind w:left="260" w:hanging="260"/>
         <w:jc w:val="left"/>
         <w:rPr>
@@ -13618,7 +13618,7 @@
     <w:p>
       <w:pPr>
         <w:keepLines/>
-        <w:spacing w:after="50" w:before="0" w:line="190"/>
+        <w:spacing w:after="20" w:before="0" w:line="190"/>
         <w:ind w:left="260" w:hanging="260"/>
         <w:jc w:val="left"/>
         <w:rPr>
@@ -13638,7 +13638,7 @@
     <w:p>
       <w:pPr>
         <w:keepLines/>
-        <w:spacing w:after="50" w:before="0" w:line="190"/>
+        <w:spacing w:after="20" w:before="0" w:line="190"/>
         <w:ind w:left="260" w:hanging="260"/>
         <w:jc w:val="left"/>
         <w:rPr>
@@ -13658,7 +13658,7 @@
     <w:p>
       <w:pPr>
         <w:keepLines/>
-        <w:spacing w:after="50" w:before="0" w:line="190"/>
+        <w:spacing w:after="20" w:before="0" w:line="190"/>
         <w:ind w:left="260" w:hanging="260"/>
         <w:jc w:val="left"/>
         <w:rPr>
@@ -13678,7 +13678,7 @@
     <w:p>
       <w:pPr>
         <w:keepLines/>
-        <w:spacing w:after="50" w:before="0" w:line="190"/>
+        <w:spacing w:after="20" w:before="0" w:line="190"/>
         <w:ind w:left="260" w:hanging="260"/>
         <w:jc w:val="left"/>
         <w:rPr>
@@ -13698,7 +13698,7 @@
     <w:p>
       <w:pPr>
         <w:keepLines/>
-        <w:spacing w:after="50" w:before="0" w:line="190"/>
+        <w:spacing w:after="20" w:before="0" w:line="190"/>
         <w:ind w:left="260" w:hanging="260"/>
         <w:jc w:val="left"/>
         <w:rPr>
@@ -13718,7 +13718,7 @@
     <w:p>
       <w:pPr>
         <w:keepLines/>
-        <w:spacing w:after="50" w:before="0" w:line="190"/>
+        <w:spacing w:after="20" w:before="0" w:line="190"/>
         <w:ind w:left="260" w:hanging="260"/>
         <w:jc w:val="left"/>
         <w:rPr>
@@ -13738,7 +13738,7 @@
     <w:p>
       <w:pPr>
         <w:keepLines/>
-        <w:spacing w:after="50" w:before="0" w:line="190"/>
+        <w:spacing w:after="20" w:before="0" w:line="190"/>
         <w:ind w:left="260" w:hanging="260"/>
         <w:jc w:val="left"/>
         <w:rPr>
@@ -13758,7 +13758,7 @@
     <w:p>
       <w:pPr>
         <w:keepLines/>
-        <w:spacing w:after="50" w:before="0" w:line="190"/>
+        <w:spacing w:after="20" w:before="0" w:line="190"/>
         <w:ind w:left="260" w:hanging="260"/>
         <w:jc w:val="left"/>
         <w:rPr>
@@ -13778,7 +13778,7 @@
     <w:p>
       <w:pPr>
         <w:keepLines/>
-        <w:spacing w:after="50" w:before="0" w:line="190"/>
+        <w:spacing w:after="20" w:before="0" w:line="190"/>
         <w:ind w:left="260" w:hanging="260"/>
         <w:jc w:val="left"/>
         <w:rPr>
@@ -13793,6 +13793,46 @@
           <w:szCs w:val="16"/>
         </w:rPr>
         <w:t xml:space="preserve">[25] Dept. of Social Development, “Increase in respect of social grants,” Government Notice 277, Government Gazette 38647, Mar. 30, 2015.</w:t>
+      </w:r>
+    </w:p>
+    <w:p>
+      <w:pPr>
+        <w:keepLines/>
+        <w:spacing w:after="20" w:before="0" w:line="190"/>
+        <w:ind w:left="260" w:hanging="260"/>
+        <w:jc w:val="left"/>
+        <w:rPr>
+          <w:sz w:val="16"/>
+          <w:szCs w:val="16"/>
+        </w:rPr>
+      </w:pPr>
+      <w:r>
+        <w:rPr>
+          <w:rFonts w:ascii="Times New Roman" w:cs="Times New Roman" w:eastAsia="Times New Roman" w:hAnsi="Times New Roman"/>
+          <w:sz w:val="16"/>
+          <w:szCs w:val="16"/>
+        </w:rPr>
+        <w:t xml:space="preserve">[26] Dept. of Social Development, “Social Assistance Act: Amendment of regulations,” Government Notice R286, Government Gazette 34169, Mar. 31, 2011.</w:t>
+      </w:r>
+    </w:p>
+    <w:p>
+      <w:pPr>
+        <w:keepLines/>
+        <w:spacing w:after="20" w:before="0" w:line="190"/>
+        <w:ind w:left="260" w:hanging="260"/>
+        <w:jc w:val="left"/>
+        <w:rPr>
+          <w:sz w:val="16"/>
+          <w:szCs w:val="16"/>
+        </w:rPr>
+      </w:pPr>
+      <w:r>
+        <w:rPr>
+          <w:rFonts w:ascii="Times New Roman" w:cs="Times New Roman" w:eastAsia="Times New Roman" w:hAnsi="Times New Roman"/>
+          <w:sz w:val="16"/>
+          <w:szCs w:val="16"/>
+        </w:rPr>
+        <w:t xml:space="preserve">[27] Dept. of Social Development, “Social Assistance Act: Regulations,” Government Notice R2119, Government Gazette 46459, May 31, 2022.</w:t>
       </w:r>
     </w:p>
     <w:p>

</xml_diff>

<commit_message>
Cite verified 2008 regulations and clarify historical screening limits
</commit_message>
<xml_diff>
--- a/paper/Jawe_OPG_nonreceipt_KZN.docx
+++ b/paper/Jawe_OPG_nonreceipt_KZN.docx
@@ -3581,7 +3581,7 @@
           <w:sz w:val="20"/>
           <w:szCs w:val="20"/>
         </w:rPr>
-        <w:t xml:space="preserve">The screen used annual research ceilings of R61,800 single/R123,600 couple for October 2014–March 2015 and R64,680/R129,360 for April–October 2015. Recorded monthly maxima of R1,350/R1,410 [24], [25] and the assumed formula D = 1.6A − 0.4B, with annual maximum A, annual private-income proxy B and minimum D = R1,200, yield these ceilings; half-joint income doubles the couple limit. Equality passed. S1 tested period, boundary and age-75 alternatives. GN R286, Schedule 2 and 4, specified 1.4A − 0.4B from 1 April 2011 [26]. GN R2119 (2022), Annexure A(2), (5), specifies 1.6A − 0.4B and R100 monthly minimum, but commenced in 2022 under regulation 41 [27]. The intervening formula and rate-notice chain remain unauthenticated; estimates are conditional on the research ceilings.</w:t>
+        <w:t xml:space="preserve">Annual research ceilings were R61,800/R123,600 (single/couple), October 2014–March 2015, and R64,680/R129,360, April–October 2015. Recorded monthly maxima R1,350/R1,410 [24], [25], assumed D = 1.6A − 0.4B and annual minimum D = R1,200 yielded them; A denotes annual maximum, B annual private-income proxy. Half-joint income doubled couple limits; equality passed. S1 tested period, boundary and age-75 alternatives. The 2008 Annexure A(2), (5) prescribed 1.3A − 0.5B and R100 monthly minimum [26]; later texts prescribed 1.4A − 0.4B from 1 April 2011 [27] and 1.6A − 0.4B from 31 May 2022 [28]. The survey-period formula and original rate notices remain unauthenticated; estimates are conditional.</w:t>
       </w:r>
     </w:p>
     <w:p>
@@ -3595,7 +3595,7 @@
           <w:sz w:val="20"/>
           <w:szCs w:val="20"/>
         </w:rPr>
-        <w:t xml:space="preserve">Marital responses selected research assumptions, rather than establishing legal spouse status. Never-married, widowed and divorced adults used the single ceiling. For married respondents, a resident spouse and reciprocal household person-number pointers identified whose income to combine. Both amounts had to be resolved; their sum implemented the assumed couple-resource rule regardless of spouse age. Residence and reciprocity were research consistency requirements. Nonresident spouses remained unresolved because partner income was unavailable. Separated respondents lacked collected spouse details [23]. Cohabitation did not establish legal classification. These cases, unspecified status and missing or inconsistent links remained unresolved, without assumed single status or zero partner income. S2 tested alternatives.</w:t>
+        <w:t xml:space="preserve">The 2008 regulations define spouses (regulation 1), include spouse income regardless of property regime (18(2)) and use half-joint annual income (19(1)). They allow Agency-approved exclusion after continuous desertion for at least three months and unwillingness to support (18(3)) [26]. Survey responses did not establish legal status. Never-married, widowed and divorced adults used single ceilings. For married adults, research rules required resolved applicant/spouse incomes and reciprocal pointers linking a resident spouse; sums applied regardless of spouse age. Nonresident spouse income was unavailable; separated respondents lacked spouse details [23]. Cohabitation, unspecified status and missing/inconsistent links remained unresolved, without assumed single status or zero partner income. S2 tested alternatives.</w:t>
       </w:r>
     </w:p>
     <w:p>
@@ -13812,7 +13812,7 @@
           <w:sz w:val="16"/>
           <w:szCs w:val="16"/>
         </w:rPr>
-        <w:t xml:space="preserve">[26] Dept. of Social Development, “Social Assistance Act: Amendment of regulations,” Government Notice R286, Government Gazette 34169, Mar. 31, 2011.</w:t>
+        <w:t xml:space="preserve">[26] Dept. of Social Development, “Social Assistance Act: Regulations,” Government Notice R898, Government Gazette 31356, Aug. 22, 2008.</w:t>
       </w:r>
     </w:p>
     <w:p>
@@ -13832,7 +13832,27 @@
           <w:sz w:val="16"/>
           <w:szCs w:val="16"/>
         </w:rPr>
-        <w:t xml:space="preserve">[27] Dept. of Social Development, “Social Assistance Act: Regulations,” Government Notice R2119, Government Gazette 46459, May 31, 2022.</w:t>
+        <w:t xml:space="preserve">[27] Dept. of Social Development, “Social Assistance Act: Amendment of regulations,” Government Notice R286, Government Gazette 34169, Mar. 31, 2011.</w:t>
+      </w:r>
+    </w:p>
+    <w:p>
+      <w:pPr>
+        <w:keepLines/>
+        <w:spacing w:after="20" w:before="0" w:line="190"/>
+        <w:ind w:left="260" w:hanging="260"/>
+        <w:jc w:val="left"/>
+        <w:rPr>
+          <w:sz w:val="16"/>
+          <w:szCs w:val="16"/>
+        </w:rPr>
+      </w:pPr>
+      <w:r>
+        <w:rPr>
+          <w:rFonts w:ascii="Times New Roman" w:cs="Times New Roman" w:eastAsia="Times New Roman" w:hAnsi="Times New Roman"/>
+          <w:sz w:val="16"/>
+          <w:szCs w:val="16"/>
+        </w:rPr>
+        <w:t xml:space="preserve">[28] Dept. of Social Development, “Social Assistance Act: Regulations,” Government Notice R2119, Government Gazette 46459, May 31, 2022.</w:t>
       </w:r>
     </w:p>
     <w:p>
@@ -13849,7 +13869,7 @@
     </w:p>
     <w:p>
       <w:pPr>
-        <w:spacing w:after="0"/>
+        <w:spacing w:after="0" w:before="0" w:line="20" w:lineRule="exact"/>
       </w:pPr>
     </w:p>
     <w:sectPr>

</xml_diff>

<commit_message>
Verify historical OPG formula and rate sources for point 3
</commit_message>
<xml_diff>
--- a/paper/Jawe_OPG_nonreceipt_KZN.docx
+++ b/paper/Jawe_OPG_nonreceipt_KZN.docx
@@ -3581,7 +3581,7 @@
           <w:sz w:val="20"/>
           <w:szCs w:val="20"/>
         </w:rPr>
-        <w:t xml:space="preserve">Annual research ceilings were R61,800/R123,600 (single/couple), October 2014–March 2015, and R64,680/R129,360, April–October 2015. Recorded monthly maxima R1,350/R1,410 [24], [25], assumed D = 1.6A − 0.4B and annual minimum D = R1,200 yielded them; A denotes annual maximum, B annual private-income proxy. Half-joint income doubled couple limits; equality passed. S1 tested period, boundary and age-75 alternatives. The 2008 Annexure A(2), (5) prescribed 1.3A − 0.5B and R100 monthly minimum [26]; later texts prescribed 1.4A − 0.4B from 1 April 2011 [27] and 1.6A − 0.4B from 31 May 2022 [28]. The survey-period formula and original rate notices remain unauthenticated; estimates are conditional.</w:t>
+        <w:t xml:space="preserve">GN 211 set the standard monthly maximum at R1,350 from 1 April 2014 [24]; GN 277 raised it to R1,410 from 1 April 2015 [25]. The 2014 amendment, Schedule paragraph 2, substituted D = 1.6A − 0.4B from 1 April 2014 [26]. With annual standard maximum A and minimum D = R1,200 (Annexure A(5)) [27], B = (1.6A − 1,200)/0.4. This yields annual single/couple research ceilings of R61,800/R123,600 for October 2014–March 2015 and R64,680/R129,360 for April–October 2015. Half-joint income doubles couple limits; equality passed. The screen applied these boundaries to its private-income proxy. Both notices add R20 for age 75+; the primary screen retained the standard maximum across ages, while S1c tested the supplement. S1 also tested period and payment-boundary alternatives.</w:t>
       </w:r>
     </w:p>
     <w:p>
@@ -3595,7 +3595,7 @@
           <w:sz w:val="20"/>
           <w:szCs w:val="20"/>
         </w:rPr>
-        <w:t xml:space="preserve">The 2008 regulations define spouses (regulation 1), include spouse income regardless of property regime (18(2)) and use half-joint annual income (19(1)). They allow Agency-approved exclusion after continuous desertion for at least three months and unwillingness to support (18(3)) [26]. Survey responses did not establish legal status. Never-married, widowed and divorced adults used single ceilings. For married adults, research rules required resolved applicant/spouse incomes and reciprocal pointers linking a resident spouse; sums applied regardless of spouse age. Nonresident spouse income was unavailable; separated respondents lacked spouse details [23]. Cohabitation, unspecified status and missing/inconsistent links remained unresolved, without assumed single status or zero partner income. S2 tested alternatives.</w:t>
+        <w:t xml:space="preserve">The 2008 regulations define spouses (regulation 1), include spouse income regardless of property regime (18(2)) and use half-joint annual income (19(1)). They allow Agency-approved exclusion after continuous desertion for at least three months and unwillingness to support (18(3)) [27]. The July 2015 amendment left these OPG means provisions unchanged [28]. Survey responses established neither legal spouse status nor desertion conditions. Never-married, widowed and divorced adults used single ceilings. For married adults, research rules required resolved applicant/spouse incomes and reciprocal pointers linking a resident spouse; sums applied regardless of spouse age. Nonresident spouse income was unavailable; separated respondents lacked spouse details [23]. Cohabitation, unspecified status and missing/inconsistent links remained unresolved, without assumed single status or zero partner income. S2 tested alternatives.</w:t>
       </w:r>
     </w:p>
     <w:p>
@@ -13208,7 +13208,7 @@
           <w:sz w:val="20"/>
           <w:szCs w:val="20"/>
         </w:rPr>
-        <w:t xml:space="preserve">The survey cannot establish legal eligibility: its resource proxy omits assets, deemed income and deductions. Historical applicability of the formula remains unresolved. Respondents may misreport income and receipt. Cross-sectional data cannot establish the order of events. Few events, unresolved screening, missing strata and resampling fixed predictions without refitting limit inference. Household sampling excludes institutionalised older adults. Participant usability and performance elsewhere remain untested.</w:t>
+        <w:t xml:space="preserve">The survey cannot establish legal eligibility: its resource proxy omits assets, deemed income and deductions. Respondents may misreport income and receipt. Cross-sectional data cannot establish the order of events. Few events, unresolved screening, missing strata and resampling fixed predictions without refitting limit inference. Household sampling excludes institutionalised older adults. Participant usability and performance elsewhere remain untested.</w:t>
       </w:r>
     </w:p>
     <w:p>
@@ -13812,7 +13812,7 @@
           <w:sz w:val="16"/>
           <w:szCs w:val="16"/>
         </w:rPr>
-        <w:t xml:space="preserve">[26] Dept. of Social Development, “Social Assistance Act: Regulations,” Government Notice R898, Government Gazette 31356, Aug. 22, 2008.</w:t>
+        <w:t xml:space="preserve">[26] Dept. of Social Development, “Amendment: Social Assistance Regulations,” Government Gazette 37474, pp. 4–5, Mar. 28, 2014.</w:t>
       </w:r>
     </w:p>
     <w:p>
@@ -13832,7 +13832,7 @@
           <w:sz w:val="16"/>
           <w:szCs w:val="16"/>
         </w:rPr>
-        <w:t xml:space="preserve">[27] Dept. of Social Development, “Social Assistance Act: Amendment of regulations,” Government Notice R286, Government Gazette 34169, Mar. 31, 2011.</w:t>
+        <w:t xml:space="preserve">[27] Dept. of Social Development, “Social Assistance Act: Regulations,” Government Notice R898, Government Gazette 31356, Aug. 22, 2008.</w:t>
       </w:r>
     </w:p>
     <w:p>
@@ -13852,7 +13852,7 @@
           <w:sz w:val="16"/>
           <w:szCs w:val="16"/>
         </w:rPr>
-        <w:t xml:space="preserve">[28] Dept. of Social Development, “Social Assistance Act: Regulations,” Government Notice R2119, Government Gazette 46459, May 31, 2022.</w:t>
+        <w:t xml:space="preserve">[28] Dept. of Social Development, “Amendment: Social Assistance Regulations,” Government Notice R621, Government Gazette 39007, Jul. 21, 2015.</w:t>
       </w:r>
     </w:p>
     <w:p>

</xml_diff>

<commit_message>
Explain the household-grouped validation in Section III.D.
The methods now state how households were split, how training folds filled missing predictors, and why the bootstrap intervals are not design-based.
</commit_message>
<xml_diff>
--- a/paper/Jawe_OPG_nonreceipt_KZN.docx
+++ b/paper/Jawe_OPG_nonreceipt_KZN.docx
@@ -17,25 +17,8 @@
           <w:sz w:val="48"/>
           <w:szCs w:val="48"/>
         </w:rPr>
-        <w:t xml:space="preserve">Interpretable Prediction of Reported Older Person’s Grant Non-Receipt Among Apparently Eligible Adults in KwaZulu-Natal</w:t>
-      </w:r>
-    </w:p>
-    <w:p>
-      <w:pPr>
-        <w:spacing w:after="30" w:before="0" w:line="230"/>
-        <w:jc w:val="center"/>
-        <w:rPr>
-          <w:sz w:val="22"/>
-          <w:szCs w:val="22"/>
-        </w:rPr>
-      </w:pPr>
-      <w:r>
-        <w:rPr>
-          <w:rFonts w:ascii="Times New Roman" w:cs="Times New Roman" w:eastAsia="Times New Roman" w:hAnsi="Times New Roman"/>
-          <w:sz w:val="22"/>
-          <w:szCs w:val="22"/>
-        </w:rPr>
-        <w:t xml:space="preserve">Oluhle Jawe</w:t>
+        <w:t xml:space="preserve">Interpretable Prediction of Reported Older Person’s Grant Non-Receipt Among Apparently Eligible Adults in KwaZulu-Natal
+</w:t>
       </w:r>
     </w:p>
     <w:p>
@@ -53,7 +36,8 @@
           <w:sz w:val="18"/>
           <w:szCs w:val="18"/>
         </w:rPr>
-        <w:t xml:space="preserve">ICT Honours (21634436), APRE402</w:t>
+        <w:t xml:space="preserve">Oluhle Jawe
+</w:t>
       </w:r>
     </w:p>
     <w:p>
@@ -71,13 +55,14 @@
           <w:sz w:val="18"/>
           <w:szCs w:val="18"/>
         </w:rPr>
-        <w:t xml:space="preserve">Durban University of Technology, Durban, South Africa</w:t>
-      </w:r>
-    </w:p>
-    <w:p>
-      <w:pPr>
-        <w:spacing w:after="80" w:before="80" w:line="220"/>
-        <w:jc w:val="both"/>
+        <w:t xml:space="preserve">ICT Honours (21634436), APRE402
+</w:t>
+      </w:r>
+    </w:p>
+    <w:p>
+      <w:pPr>
+        <w:spacing w:after="30" w:before="0" w:line="230"/>
+        <w:jc w:val="center"/>
         <w:rPr>
           <w:sz w:val="18"/>
           <w:szCs w:val="18"/>
@@ -89,7 +74,8 @@
           <w:sz w:val="18"/>
           <w:szCs w:val="18"/>
         </w:rPr>
-        <w:t xml:space="preserve">Abstract—This study analysed reported Older Person’s Grant (OPG) non-receipt among adults aged 60 or older in KwaZulu-Natal (KZN), using the Living Conditions Survey (LCS) 2014/2015. The study used administrative-burden theory to choose predictors and observable research rules to identify apparently eligible adults. Screening did not establish legal entitlement. Among 1,013 adults who passed with resolved receipt, 67 reported non-receipt: 6.6% unweighted and 7.5% person-weighted. Alternative screening rules gave weighted rates of 7.1%–9.1%. Logistic regression used five predictor groups and household-held-out validation. AUC (area under the receiver operating characteristic curve) was 0.752; average precision (AP) was 0.203. The Brier score was 0.0578, compared with 0.0618 for an intercept-only reference using training-group prevalence. Checks supported reproducibility. The application displays rules, decisions, scores and reports. No participant study tested ease of use. These results do not establish entitlement, explain non-receipt, or demonstrate performance elsewhere.</w:t>
+        <w:t xml:space="preserve">Durban University of Technology, Durban, South Africa
+</w:t>
       </w:r>
     </w:p>
     <w:p>
@@ -107,7 +93,27 @@
           <w:sz w:val="18"/>
           <w:szCs w:val="18"/>
         </w:rPr>
-        <w:t xml:space="preserve">Keywords—Older Person’s Grant, reported non-receipt, administrative burden, Living Conditions Survey, logistic regression, reproducibility.</w:t>
+        <w:t xml:space="preserve">Abstract—This study analysed reported Older Person’s Grant (OPG) non-receipt among adults aged 60 or older in KwaZulu-Natal (KZN), using the Living Conditions Survey (LCS) 2014/2015. The study used administrative-burden theory to choose predictors and observable research rules to identify apparently eligible adults. Screening did not establish legal entitlement. Among 1,013 adults who passed with resolved receipt, 67 reported non-receipt: 6.6% unweighted and 7.5% person-weighted. Alternative screening rules gave weighted rates of 7.1%–9.1%. Logistic regression used five predictor groups and household-held-out validation. AUC (area under the receiver operating characteristic curve) was 0.752; average precision (AP) was 0.203. The Brier score was 0.0578, compared with 0.0618 for an intercept-only reference using training-group prevalence. Checks supported reproducibility. The application displays rules, decisions, scores and reports. No participant study tested ease of use. These results do not establish entitlement, explain non-receipt, or demonstrate performance elsewhere.
+</w:t>
+      </w:r>
+    </w:p>
+    <w:p>
+      <w:pPr>
+        <w:spacing w:after="80" w:before="80" w:line="220"/>
+        <w:jc w:val="both"/>
+        <w:rPr>
+          <w:sz w:val="18"/>
+          <w:szCs w:val="18"/>
+        </w:rPr>
+      </w:pPr>
+      <w:r>
+        <w:rPr>
+          <w:rFonts w:ascii="Times New Roman" w:cs="Times New Roman" w:eastAsia="Times New Roman" w:hAnsi="Times New Roman"/>
+          <w:sz w:val="18"/>
+          <w:szCs w:val="18"/>
+        </w:rPr>
+        <w:t xml:space="preserve">Keywords—Older Person’s Grant, reported non-receipt, administrative burden, Living Conditions Survey, logistic regression, reproducibility.
+</w:t>
       </w:r>
     </w:p>
     <w:p>
@@ -145,7 +151,8 @@
           <w:sz w:val="20"/>
           <w:szCs w:val="20"/>
         </w:rPr>
-        <w:t xml:space="preserve">I. Introduction</w:t>
+        <w:t xml:space="preserve">I. Introduction
+</w:t>
       </w:r>
     </w:p>
     <w:p>
@@ -159,7 +166,8 @@
           <w:sz w:val="20"/>
           <w:szCs w:val="20"/>
         </w:rPr>
-        <w:t xml:space="preserve">The Older Person’s Grant (OPG) supports households [1], including during crises [2]. Other work examines receipt and access barriers [3], [4]. This study examines adults who appear eligible but report receiving no OPG.</w:t>
+        <w:t xml:space="preserve">The Older Person’s Grant (OPG) supports households [1], including during crises [2]. Other work examines receipt and access barriers [3], [4]. This study examines adults who appear eligible but report receiving no OPG.
+</w:t>
       </w:r>
     </w:p>
     <w:p>
@@ -173,7 +181,8 @@
           <w:sz w:val="20"/>
           <w:szCs w:val="20"/>
         </w:rPr>
-        <w:t xml:space="preserve">The analysis separates screening, reported receipt and legal entitlement. Passing the research screen does not mean approval by the South African Social Security Agency [5]. Non-receipt can reflect high income, no application, a pending decision or incomplete information. The analysis must define the screened group before calculating its non-receipt percentage; missing spouse income can change that group.</w:t>
+        <w:t xml:space="preserve">The analysis separates screening, reported receipt and legal entitlement. Passing the research screen does not mean approval by the South African Social Security Agency [5]. Non-receipt can reflect high income, no application, a pending decision or incomplete information. The analysis must define the screened group before calculating its non-receipt percentage; missing spouse income can change that group.
+</w:t>
       </w:r>
     </w:p>
     <w:p>
@@ -187,7 +196,8 @@
           <w:sz w:val="20"/>
           <w:szCs w:val="20"/>
         </w:rPr>
-        <w:t xml:space="preserve">The study aims to develop and evaluate an interpretable research tool for analysing reported OPG non-receipt among apparently eligible older adults in KwaZulu-Natal using the Living Conditions Survey (LCS) 2014/2015. Four objectives guide the work: document the included population, describe non-receipt using survey weights, test predictions on excluded households, and assess correctness, reproducibility and clarity.</w:t>
+        <w:t xml:space="preserve">The study aims to develop and evaluate an interpretable research tool for analysing reported OPG non-receipt among apparently eligible older adults in KwaZulu-Natal using the Living Conditions Survey (LCS) 2014/2015. Four objectives guide the work: document the included population, describe non-receipt using survey weights, test predictions on excluded households, and assess correctness, reproducibility and clarity.
+</w:t>
       </w:r>
     </w:p>
     <w:p>
@@ -201,7 +211,8 @@
           <w:sz w:val="20"/>
           <w:szCs w:val="20"/>
         </w:rPr>
-        <w:t xml:space="preserve">Research questions (RQs) guide the study. RQ1 asks what proportion of screened adults reports non-receipt and how that proportion changes under different screening assumptions. RQ2 asks how well logistic regression separates recipients from non-recipients and estimates chances in excluded households. RQ3 asks whether the tool can repeat the analysis and clearly explain screening decisions and model results. The study combines documented rules, weighted percentages, tested predictions and a local interface to address them.</w:t>
+        <w:t xml:space="preserve">Research questions (RQs) guide the study. RQ1 asks what proportion of screened adults reports non-receipt and how that proportion changes under different screening assumptions. RQ2 asks how well logistic regression separates recipients from non-recipients and estimates chances in excluded households. RQ3 asks whether the tool can repeat the analysis and clearly explain screening decisions and model results. The study combines documented rules, weighted percentages, tested predictions and a local interface to address them.
+</w:t>
       </w:r>
     </w:p>
     <w:p>
@@ -229,7 +240,8 @@
           <w:sz w:val="20"/>
           <w:szCs w:val="20"/>
         </w:rPr>
-        <w:t xml:space="preserve">II. Related Work and Predictor Selection</w:t>
+        <w:t xml:space="preserve">II. Related Work and Predictor Selection
+</w:t>
       </w:r>
     </w:p>
     <w:p>
@@ -257,7 +269,8 @@
           <w:sz w:val="20"/>
           <w:szCs w:val="20"/>
         </w:rPr>
-        <w:t xml:space="preserve">A. Review Approach, Programme Context and Research Gap</w:t>
+        <w:t xml:space="preserve">A. Review Approach, Programme Context and Research Gap
+</w:t>
       </w:r>
     </w:p>
     <w:p>
@@ -271,7 +284,8 @@
           <w:sz w:val="20"/>
           <w:szCs w:val="20"/>
         </w:rPr>
-        <w:t xml:space="preserve">The literature review used thematic narrative synthesis to examine grant access, eligibility measurement and prediction. Searches covered Scopus, Dimensions, IEEE Xplore, SABINET/African Journals Online, Google Scholar and Statistics South Africa/DataFirst. Search concepts included social assistance, eligibility, take-up, non-receipt, exclusion and prediction. Sources were considered for relevance to the research question, population, outcome and methodological contribution. Studies were compared by programme, setting, unit of analysis, outcome, findings and limitations. Differences in these features prevent a pooled non-receipt estimate.</w:t>
+        <w:t xml:space="preserve">The literature review used thematic narrative synthesis to examine grant access, eligibility measurement and prediction. Searches covered Scopus, Dimensions, IEEE Xplore, SABINET/African Journals Online, Google Scholar and Statistics South Africa/DataFirst. Search concepts included social assistance, eligibility, take-up, non-receipt, exclusion and prediction. Sources were considered for relevance to the research question, population, outcome and methodological contribution. Studies were compared by programme, setting, unit of analysis, outcome, findings and limitations. Differences in these features prevent a pooled non-receipt estimate.
+</w:t>
       </w:r>
     </w:p>
     <w:p>
@@ -285,7 +299,8 @@
           <w:sz w:val="20"/>
           <w:szCs w:val="20"/>
         </w:rPr>
-        <w:t xml:space="preserve">The recorded search summary lists 511 records: 136 duplicates removed, 375 titles/abstracts screened, 222 excluded, 153 full texts assessed, 98 further exclusions and 55 retained sources. These sources cover several grants and populations, rather than 55 OPG studies. The available record documents the search concepts, broad selection criteria and aggregate counts. It does not preserve database-specific query strings, search dates and filters, original exports or record-level screening and exclusion decisions. The full 55-source extraction register is also unavailable. These omissions prevent independent reproduction of the search and verification of each selection decision. The synthesis therefore provides contextual evidence without establishing exhaustive literature coverage.</w:t>
+        <w:t xml:space="preserve">The recorded search summary lists 511 records: 136 duplicates removed, 375 titles/abstracts screened, 222 excluded, 153 full texts assessed, 98 further exclusions and 55 retained sources. These sources cover several grants and populations, rather than 55 OPG studies. The available record documents the search concepts, broad selection criteria and aggregate counts. It does not preserve database-specific query strings, search dates and filters, original exports or record-level screening and exclusion decisions. The full 55-source extraction register is also unavailable. These omissions prevent independent reproduction of the search and verification of each selection decision. The synthesis therefore provides contextual evidence without establishing exhaustive literature coverage.
+</w:t>
       </w:r>
     </w:p>
     <w:p>
@@ -299,7 +314,8 @@
           <w:sz w:val="20"/>
           <w:szCs w:val="20"/>
         </w:rPr>
-        <w:t xml:space="preserve">Table I distinguishes individual receipt [3] from household proportions [4], and this study’s provincial resource screen from both. Other-grant studies separate enquiry, application, receipt and uninterrupted payment [6], [7], [8].</w:t>
+        <w:t xml:space="preserve">Table I distinguishes individual receipt [3] from household proportions [4], and this study’s provincial resource screen from both. Other-grant studies separate enquiry, application, receipt and uninterrupted payment [6], [7], [8].
+</w:t>
       </w:r>
     </w:p>
     <w:p>
@@ -318,7 +334,8 @@
           <w:sz w:val="16"/>
           <w:szCs w:val="16"/>
         </w:rPr>
-        <w:t xml:space="preserve">Table I. Evidence scope informing the study</w:t>
+        <w:t xml:space="preserve">Table I. Evidence scope informing the study
+</w:t>
       </w:r>
     </w:p>
     <w:tbl>
@@ -1125,7 +1142,8 @@
           <w:sz w:val="20"/>
           <w:szCs w:val="20"/>
         </w:rPr>
-        <w:t xml:space="preserve">Gazeaud supports checking income assumptions [11], without quantifying LCS errors or defining South African eligibility. Mabala models another grant for younger applicants [12]; its findings cannot directly predict OPG receipt.</w:t>
+        <w:t xml:space="preserve">Gazeaud supports checking income assumptions [11], without quantifying LCS errors or defining South African eligibility. Mabala models another grant for younger applicants [12]; its findings cannot directly predict OPG receipt.
+</w:t>
       </w:r>
     </w:p>
     <w:p>
@@ -1139,7 +1157,8 @@
           <w:sz w:val="20"/>
           <w:szCs w:val="20"/>
         </w:rPr>
-        <w:t xml:space="preserve">The research gap concerns how these separate strands can support a reproducible, person-level analysis of OPG non-receipt in KwaZulu-Natal. Ralston's age-based rural receipt analysis [3] and Godfrey's household receipt proportions [4] do not directly provide non-receipt estimates after the resource screen used here. Evidence on other grants informs possible access barriers, but does not establish their effects among older OPG applicants. The study addresses this integration gap by documenting the screening denominator, testing how alternative rules change non-receipt estimates, and evaluating an interpretable model on excluded households. Shared rules connect the research command and application so that decisions, probabilities and reports remain inspectable. The specific contribution is a historical workflow that connects transparent screening, person-weighted description, household-held-out prediction and reproducible software. This supports scrutiny of assumptions and results without establishing legal entitlement, causal barriers, participant usability or performance elsewhere.</w:t>
+        <w:t xml:space="preserve">The research gap concerns how these separate strands can support a reproducible, person-level analysis of OPG non-receipt in KwaZulu-Natal. Ralston's age-based rural receipt analysis [3] and Godfrey's household receipt proportions [4] do not directly provide non-receipt estimates after the resource screen used here. Evidence on other grants informs possible access barriers, but does not establish their effects among older OPG applicants. The study addresses this integration gap by documenting the screening denominator, testing how alternative rules change non-receipt estimates, and evaluating an interpretable model on excluded households. Shared rules connect the research command and application so that decisions, probabilities and reports remain inspectable. The specific contribution is a historical workflow that connects transparent screening, person-weighted description, household-held-out prediction and reproducible software. This supports scrutiny of assumptions and results without establishing legal entitlement, causal barriers, participant usability or performance elsewhere.
+</w:t>
       </w:r>
     </w:p>
     <w:p>
@@ -1167,7 +1186,8 @@
           <w:sz w:val="20"/>
           <w:szCs w:val="20"/>
         </w:rPr>
-        <w:t xml:space="preserve">B. Grant Access and Administrative Burden</w:t>
+        <w:t xml:space="preserve">B. Grant Access and Administrative Burden
+</w:t>
       </w:r>
     </w:p>
     <w:p>
@@ -1181,7 +1201,8 @@
           <w:sz w:val="20"/>
           <w:szCs w:val="20"/>
         </w:rPr>
-        <w:t xml:space="preserve">Administrative-burden theory distinguishes learning, compliance and psychological costs [13]. Grant studies describe paperwork, repeated visits, interrupted payments and difficult encounters [8], [9], [10], [14]. Child Support Grant research suggests barriers [6], [7], without establishing their effects among older OPG applicants. Digital access can create difficulties [15]. Low non-receipt therefore does not demonstrate easy access.</w:t>
+        <w:t xml:space="preserve">Administrative-burden theory distinguishes learning, compliance and psychological costs [13]. Grant studies describe paperwork, repeated visits, interrupted payments and difficult encounters [8], [9], [10], [14]. Child Support Grant research suggests barriers [6], [7], without establishing their effects among older OPG applicants. Digital access can create difficulties [15]. Low non-receipt therefore does not demonstrate easy access.
+</w:t>
       </w:r>
     </w:p>
     <w:p>
@@ -1195,7 +1216,8 @@
           <w:sz w:val="20"/>
           <w:szCs w:val="20"/>
         </w:rPr>
-        <w:t xml:space="preserve">LCS does not record every legal condition or application experience. The screen checks age, resources, partnership and other-grant rules. It assigns PASS (the person meets the research conditions), FAIL (a known condition is not met) or UNRESOLVED (available information cannot resolve the decision). The analysis then checks receipt separately. Only adults who pass with clear receipt answers enter the prediction study. Unclear or contradictory answers remain unresolved.</w:t>
+        <w:t xml:space="preserve">LCS does not record every legal condition or application experience. The screen checks age, resources, partnership and other-grant rules. It assigns PASS (the person meets the research conditions), FAIL (a known condition is not met) or UNRESOLVED (available information cannot resolve the decision). The analysis then checks receipt separately. Only adults who pass with clear receipt answers enter the prediction study. Unclear or contradictory answers remain unresolved.
+</w:t>
       </w:r>
     </w:p>
     <w:p>
@@ -1223,7 +1245,8 @@
           <w:sz w:val="20"/>
           <w:szCs w:val="20"/>
         </w:rPr>
-        <w:t xml:space="preserve">C. Predictor Selection and Software Design</w:t>
+        <w:t xml:space="preserve">C. Predictor Selection and Software Design
+</w:t>
       </w:r>
     </w:p>
     <w:p>
@@ -1237,7 +1260,8 @@
           <w:sz w:val="20"/>
           <w:szCs w:val="20"/>
         </w:rPr>
-        <w:t xml:space="preserve">Table II separates demographic context from circumstances relevant to learning and compliance costs. These predictors do not directly measure administrative burden or establish why a person reports non-receipt.</w:t>
+        <w:t xml:space="preserve">Table II separates demographic context from circumstances relevant to learning and compliance costs. These predictors do not directly measure administrative burden or establish why a person reports non-receipt.
+</w:t>
       </w:r>
     </w:p>
     <w:p>
@@ -1256,7 +1280,8 @@
           <w:sz w:val="16"/>
           <w:szCs w:val="16"/>
         </w:rPr>
-        <w:t xml:space="preserve">Table II. Administrative-burden theory and predictor selection</w:t>
+        <w:t xml:space="preserve">Table II. Administrative-burden theory and predictor selection
+</w:t>
       </w:r>
     </w:p>
     <w:tbl>
@@ -2071,7 +2096,8 @@
           <w:sz w:val="16"/>
           <w:szCs w:val="16"/>
         </w:rPr>
-        <w:t xml:space="preserve">Psychological costs are unmeasured. Settlement contributes two contrasts, giving five predictor groups and six slopes.</w:t>
+        <w:t xml:space="preserve">Psychological costs are unmeasured. Settlement contributes two contrasts, giving five predictor groups and six slopes.
+</w:t>
       </w:r>
     </w:p>
     <w:p>
@@ -2085,7 +2111,8 @@
           <w:sz w:val="20"/>
           <w:szCs w:val="20"/>
         </w:rPr>
-        <w:t xml:space="preserve">Few events motivate assessment of precision, calibration and ranking [16], [17]. Sample size and internal validation limit generalisation [18], [19]. Reporting follows TRIPOD (Transparent Reporting of a multivariable prediction model for Individual Prognosis Or Diagnosis) [20]. Software checks assess correctness and repeatability; usability requires participant evidence.</w:t>
+        <w:t xml:space="preserve">Few events motivate assessment of precision, calibration and ranking [16], [17]. Sample size and internal validation limit generalisation [18], [19]. Reporting follows TRIPOD (Transparent Reporting of a multivariable prediction model for Individual Prognosis Or Diagnosis) [20]. Software checks assess correctness and repeatability; usability requires participant evidence.
+</w:t>
       </w:r>
     </w:p>
     <w:p>
@@ -2113,7 +2140,8 @@
           <w:sz w:val="20"/>
           <w:szCs w:val="20"/>
         </w:rPr>
-        <w:t xml:space="preserve">D. Conceptual Framework</w:t>
+        <w:t xml:space="preserve">D. Conceptual Framework
+</w:t>
       </w:r>
     </w:p>
     <w:p>
@@ -2127,7 +2155,8 @@
           <w:sz w:val="20"/>
           <w:szCs w:val="20"/>
         </w:rPr>
-        <w:t xml:space="preserve">Reported OPG non-receipt among apparently eligible older adults motivates an administrative-burden perspective [13], [14]. Learning, compliance and psychological costs may obstruct access; high receipt does not establish low burden.</w:t>
+        <w:t xml:space="preserve">Reported OPG non-receipt among apparently eligible older adults motivates an administrative-burden perspective [13], [14]. Learning, compliance and psychological costs may obstruct access; high receipt does not establish low burden.
+</w:t>
       </w:r>
     </w:p>
     <w:p>
@@ -2141,7 +2170,8 @@
           <w:sz w:val="20"/>
           <w:szCs w:val="20"/>
         </w:rPr>
-        <w:t xml:space="preserve">Figure 1 separates theoretical constructs from LCS measurements. Schooling may reflect information resources; office distance and settlement relate to potential compliance effort. Age and sex provide demographic context. These proxies do not directly measure burden. Screening defines the denominator because age alone is insufficient and LCS cannot establish legal entitlement. Resource, partnership and other-grant rules define the population; incomplete information remains unresolved. Reported receipt defines a separate outcome.</w:t>
+        <w:t xml:space="preserve">Figure 1 separates theoretical constructs from LCS measurements. Schooling may reflect information resources; office distance and settlement relate to potential compliance effort. Age and sex provide demographic context. These proxies do not directly measure burden. Screening defines the denominator because age alone is insufficient and LCS cannot establish legal entitlement. Resource, partnership and other-grant rules define the population; incomplete information remains unresolved. Reported receipt defines a separate outcome.
+</w:t>
       </w:r>
     </w:p>
     <w:p>
@@ -2155,7 +2185,8 @@
           <w:sz w:val="20"/>
           <w:szCs w:val="20"/>
         </w:rPr>
-        <w:t xml:space="preserve">Person-weighted estimates describe non-receipt. Logistic regression describes associations; household-held-out validation tests predictions. Neither establishes causal mechanisms. The artefact implements the design through shared rules, separate receipt classifications, saved-model scoring and inspectable reports. Upload scores remain separate from held-out evaluation and never change screening or receipt.</w:t>
+        <w:t xml:space="preserve">Person-weighted estimates describe non-receipt. Logistic regression describes associations; household-held-out validation tests predictions. Neither establishes causal mechanisms. The artefact implements the design through shared rules, separate receipt classifications, saved-model scoring and inspectable reports. Upload scores remain separate from held-out evaluation and never change screening or receipt.
+</w:t>
       </w:r>
     </w:p>
     <w:p>
@@ -2169,7 +2200,7 @@
           <wp:inline distT="0" distB="0" distL="0" distR="0">
             <wp:extent cx="3200400" cy="3429000"/>
             <wp:effectExtent t="0" r="0" b="0" l="0"/>
-            <wp:docPr id="1" name="Fig. 1. Conceptual framework. Theory informs predictor selection; observable screening defines the population for separate descriptive and predictive analyses. The dashed boundary identifies the artefact’s implementation scope. Arrows show conceptual rationale or analytical dependencies, not causal effects." descr="Fig. 1. Conceptual framework. Theory informs predictor selection; observable screening defines the population for separate descriptive and predictive analyses. The dashed boundary identifies the artefact’s implementation scope. Arrows show conceptual rationale or analytical dependencies, not causal effects." title="Fig. 1. Conceptual framework. Theory informs predictor selection; observable screening defines the population for separate descriptive and predictive analyses. The dashed boundary identifies the artefact’s implementation scope. Arrows show conceptual rationale or analytical dependencies, not causal effects."/>
+            <wp:docPr id="1" name="Fig. 1. Conceptual framework. Theory informs predictor selection; observable screening defines the population for separate descriptive and predictive analyses. The dashed boundary identifies the artefact’s implementation scope. Arrows show conceptual rationale or analytical dependencies, not causal effects. " descr="Fig. 1. Conceptual framework. Theory informs predictor selection; observable screening defines the population for separate descriptive and predictive analyses. The dashed boundary identifies the artefact’s implementation scope. Arrows show conceptual rationale or analytical dependencies, not causal effects. " title="Fig. 1. Conceptual framework. Theory informs predictor selection; observable screening defines the population for separate descriptive and predictive analyses. The dashed boundary identifies the artefact’s implementation scope. Arrows show conceptual rationale or analytical dependencies, not causal effects. "/>
             <wp:cNvGraphicFramePr>
               <a:graphicFrameLocks xmlns:a="http://schemas.openxmlformats.org/drawingml/2006/main" noChangeAspect="1"/>
             </wp:cNvGraphicFramePr>
@@ -2220,7 +2251,8 @@
           <w:sz w:val="16"/>
           <w:szCs w:val="16"/>
         </w:rPr>
-        <w:t xml:space="preserve">Fig. 1. Conceptual framework. Theory informs predictor selection; observable screening defines the population for separate descriptive and predictive analyses. The dashed boundary identifies the artefact’s implementation scope. Arrows show conceptual rationale or analytical dependencies, not causal effects.</w:t>
+        <w:t xml:space="preserve">Fig. 1. Conceptual framework. Theory informs predictor selection; observable screening defines the population for separate descriptive and predictive analyses. The dashed boundary identifies the artefact’s implementation scope. Arrows show conceptual rationale or analytical dependencies, not causal effects.
+</w:t>
       </w:r>
     </w:p>
     <w:p>
@@ -2248,7 +2280,8 @@
           <w:sz w:val="20"/>
           <w:szCs w:val="20"/>
         </w:rPr>
-        <w:t xml:space="preserve">III. Methods</w:t>
+        <w:t xml:space="preserve">III. Methods
+</w:t>
       </w:r>
     </w:p>
     <w:p>
@@ -2276,7 +2309,8 @@
           <w:sz w:val="20"/>
           <w:szCs w:val="20"/>
         </w:rPr>
-        <w:t xml:space="preserve">A. Data and study population</w:t>
+        <w:t xml:space="preserve">A. Data and study population
+</w:t>
       </w:r>
     </w:p>
     <w:p>
@@ -2290,7 +2324,8 @@
           <w:sz w:val="20"/>
           <w:szCs w:val="20"/>
         </w:rPr>
-        <w:t xml:space="preserve">The analysis linked the LCS 2014/2015 person, household and person-income files through survey identifiers. Checks covered duplicates, unmatched records and row counts. The questionnaire, metadata and COICOP (Classification of Individual Consumption According to Purpose) codes guided interpretation [21], [22], [23]. The study covered sampled KwaZulu-Natal residents aged 60 or older in completed years. The survey excludes older adults living in institutions. Screening used the rules for each interview month. Before releasing the data, Statistics South Africa used hot-deck imputation for age and sex. The released files do not identify these records. The model handled missing predictors separately.</w:t>
+        <w:t xml:space="preserve">The analysis linked the LCS 2014/2015 person, household and person-income files through survey identifiers. Checks covered duplicates, unmatched records and row counts. The questionnaire, metadata and COICOP (Classification of Individual Consumption According to Purpose) codes guided interpretation [21], [22], [23]. The study covered sampled KwaZulu-Natal residents aged 60 or older in completed years. The survey excludes older adults living in institutions. Screening used the rules for each interview month. Before releasing the data, Statistics South Africa used hot-deck imputation for age and sex. The released files do not identify these records. The model handled missing predictors separately.
+</w:t>
       </w:r>
     </w:p>
     <w:p>
@@ -2304,7 +2339,8 @@
           <w:sz w:val="20"/>
           <w:szCs w:val="20"/>
         </w:rPr>
-        <w:t xml:space="preserve">Table III shows each field's role. Summing income before linkage avoided duplicate person records.</w:t>
+        <w:t xml:space="preserve">Table III shows each field's role. Summing income before linkage avoided duplicate person records.
+</w:t>
       </w:r>
     </w:p>
     <w:p>
@@ -2323,7 +2359,8 @@
           <w:sz w:val="16"/>
           <w:szCs w:val="16"/>
         </w:rPr>
-        <w:t xml:space="preserve">Table III. How each data field enters the analysis</w:t>
+        <w:t xml:space="preserve">Table III. How each data field enters the analysis
+</w:t>
       </w:r>
     </w:p>
     <w:tbl>
@@ -3525,7 +3562,8 @@
           <w:sz w:val="16"/>
           <w:szCs w:val="16"/>
         </w:rPr>
-        <w:t xml:space="preserve">Released documentation supports these field uses [21], [22], [23]. Filling missing model predictors never changes screening fields or receipt answers.</w:t>
+        <w:t xml:space="preserve">Released documentation supports these field uses [21], [22], [23]. Filling missing model predictors never changes screening fields or receipt answers.
+</w:t>
       </w:r>
     </w:p>
     <w:p>
@@ -3553,7 +3591,8 @@
           <w:sz w:val="20"/>
           <w:szCs w:val="20"/>
         </w:rPr>
-        <w:t xml:space="preserve">B. Screening rules and receipt outcome</w:t>
+        <w:t xml:space="preserve">B. Screening rules and receipt outcome
+</w:t>
       </w:r>
     </w:p>
     <w:p>
@@ -3567,7 +3606,8 @@
           <w:sz w:val="20"/>
           <w:szCs w:val="20"/>
         </w:rPr>
-        <w:t xml:space="preserve">The screen summed already annualised, nominal person-income amounts, excluding social-assistance income. It did not allocate household income. A missing applicant or linked-spouse amount remained unresolved unless the no-income response and absent schedule supported zero. Assets, deemed income and permitted deductions were outside this research proxy.</w:t>
+        <w:t xml:space="preserve">The screen summed already annualised, nominal person-income amounts, excluding social-assistance income. It did not allocate household income. A missing applicant or linked-spouse amount remained unresolved unless the no-income response and absent schedule supported zero. Assets, deemed income and permitted deductions were outside this research proxy.
+</w:t>
       </w:r>
     </w:p>
     <w:p>
@@ -3581,7 +3621,8 @@
           <w:sz w:val="20"/>
           <w:szCs w:val="20"/>
         </w:rPr>
-        <w:t xml:space="preserve">GN 211 set the standard monthly maximum at R1,350 from 1 April 2014 [24]; GN 277 raised it to R1,410 from 1 April 2015 [25]. The 2014 amendment, Schedule paragraph 2, substituted D = 1.6A − 0.4B from 1 April 2014 [26]. With annual standard maximum A and minimum D = R1,200 (Annexure A(5)) [27], B = (1.6A − 1,200)/0.4. This yields annual single/couple research ceilings of R61,800/R123,600 for October 2014–March 2015 and R64,680/R129,360 for April–October 2015. Half-joint income doubles couple limits; equality passed. The screen applied these boundaries to its private-income proxy. Both notices add R20 for age 75+; the primary screen retained the standard maximum across ages, while S1c tested the supplement. S1 also tested period and payment-boundary alternatives.</w:t>
+        <w:t xml:space="preserve">GN 211 set the standard monthly maximum at R1,350 from 1 April 2014 [24]; GN 277 raised it to R1,410 from 1 April 2015 [25]. The 2014 amendment, Schedule paragraph 2, substituted D = 1.6A − 0.4B from 1 April 2014 [26]. With annual standard maximum A and minimum D = R1,200 (Annexure A(5)) [27], B = (1.6A − 1,200)/0.4. This yields annual single/couple research ceilings of R61,800/R123,600 for October 2014–March 2015 and R64,680/R129,360 for April–October 2015. Half-joint income doubles couple limits; equality passed. The screen applied these boundaries to its private-income proxy. Both notices add R20 for age 75+; the primary screen retained the standard maximum across ages, while S1c tested the supplement. S1 also tested period and payment-boundary alternatives.
+</w:t>
       </w:r>
     </w:p>
     <w:p>
@@ -3595,7 +3636,8 @@
           <w:sz w:val="20"/>
           <w:szCs w:val="20"/>
         </w:rPr>
-        <w:t xml:space="preserve">The 2008 regulations define spouses (regulation 1), include spouse income regardless of property regime (18(2)) and use half-joint annual income (19(1)). They allow Agency-approved exclusion after continuous desertion for at least three months and unwillingness to support (18(3)) [27]. The July 2015 amendment left these OPG means provisions unchanged [28]. Survey responses established neither legal spouse status nor desertion conditions. Never-married, widowed and divorced adults used single ceilings. For married adults, research rules required resolved applicant/spouse incomes and reciprocal pointers linking a resident spouse; sums applied regardless of spouse age. Nonresident spouse income was unavailable; separated respondents lacked spouse details [23]. Cohabitation, unspecified status and missing/inconsistent links remained unresolved, without assumed single status or zero partner income. S2 tested alternatives.</w:t>
+        <w:t xml:space="preserve">The 2008 regulations define spouses (regulation 1), include spouse income regardless of property regime (18(2)) and use half-joint annual income (19(1)). They allow Agency-approved exclusion after continuous desertion for at least three months and unwillingness to support (18(3)) [27]. The July 2015 amendment left these OPG means provisions unchanged [28]. Survey responses established neither legal spouse status nor desertion conditions. Never-married, widowed and divorced adults used single ceilings. For married adults, research rules required resolved applicant/spouse incomes and reciprocal pointers linking a resident spouse; sums applied regardless of spouse age. Nonresident spouse income was unavailable; separated respondents lacked spouse details [23]. Cohabitation, unspecified status and missing/inconsistent links remained unresolved, without assumed single status or zero partner income. S2 tested alternatives.
+</w:t>
       </w:r>
     </w:p>
     <w:p>
@@ -3609,7 +3651,8 @@
           <w:sz w:val="20"/>
           <w:szCs w:val="20"/>
         </w:rPr>
-        <w:t xml:space="preserve">An adult's reported disability or war-veterans grant caused FAIL. Caregiver child grants and grant-in-aid neither excluded the adult nor defined OPG receipt. A known failure took priority over unresolved information; the screen retained all reasons.</w:t>
+        <w:t xml:space="preserve">An adult's reported disability or war-veterans grant caused FAIL. Caregiver child grants and grant-in-aid neither excluded the adult nor defined OPG receipt. A known failure took priority over unresolved information; the screen retained all reasons.
+</w:t>
       </w:r>
     </w:p>
     <w:p>
@@ -3623,7 +3666,8 @@
           <w:sz w:val="20"/>
           <w:szCs w:val="20"/>
         </w:rPr>
-        <w:t xml:space="preserve">For adults who passed, the software interpreted general-grant and OPG answers together, including structural skips (questions omitted because earlier answers make them inapplicable). A consistent “no grant” answer can establish non-receipt when the OPG follow-up does not apply. Contradictory or unexplained answers remain unresolved and exclude the person from modelling. The analysis flagged disagreements between current receipt and preceding-year OPG income without changing the outcome because the periods differ. Rule version opg-kzn-primary-v1 records these decisions. The denominator contains adults who pass and have a clear receipt answer.</w:t>
+        <w:t xml:space="preserve">For adults who passed, the software interpreted general-grant and OPG answers together, including structural skips (questions omitted because earlier answers make them inapplicable). A consistent “no grant” answer can establish non-receipt when the OPG follow-up does not apply. Contradictory or unexplained answers remain unresolved and exclude the person from modelling. The analysis flagged disagreements between current receipt and preceding-year OPG income without changing the outcome because the periods differ. Rule version opg-kzn-primary-v1 records these decisions. The denominator contains adults who pass and have a clear receipt answer.
+</w:t>
       </w:r>
     </w:p>
     <w:p>
@@ -3651,7 +3695,8 @@
           <w:sz w:val="20"/>
           <w:szCs w:val="20"/>
         </w:rPr>
-        <w:t xml:space="preserve">C. Survey-weighted description and uncertainty</w:t>
+        <w:t xml:space="preserve">C. Survey-weighted description and uncertainty
+</w:t>
       </w:r>
     </w:p>
     <w:p>
@@ -3665,7 +3710,8 @@
           <w:sz w:val="20"/>
           <w:szCs w:val="20"/>
         </w:rPr>
-        <w:t xml:space="preserve">RQ1 used both the ordinary count proportion and the person-weighted proportion: p = Σ(wᵢYᵢ)/Σwᵢ. Here, wᵢ is a person's weight and Yᵢ equals 1 for non-receipt and 0 for receipt. Group comparisons describe differences; they do not establish causes.</w:t>
+        <w:t xml:space="preserve">RQ1 used both the ordinary count proportion and the person-weighted proportion: p = Σ(wᵢYᵢ)/Σwᵢ. Here, wᵢ is a person's weight and Yᵢ equals 1 for non-receipt and 0 for receipt. Group comparisons describe differences; they do not establish causes.
+</w:t>
       </w:r>
     </w:p>
     <w:p>
@@ -3679,7 +3725,8 @@
           <w:sz w:val="20"/>
           <w:szCs w:val="20"/>
         </w:rPr>
-        <w:t xml:space="preserve">The released files lack strata. Derived primary sampling units (PSUs) supported an estimate of sampling uncertainty. The calculation allows a group to be sampled more than once. It cannot reproduce the complete survey design. Adults with unresolved screening information remain outside the proportion. Receipt bounds (the lowest and highest rates if all unclear PASS receipt answers mean receipt or all mean non-receipt) tested the effect of unclear receipt answers.</w:t>
+        <w:t xml:space="preserve">The released files lack strata. Derived primary sampling units (PSUs) supported an estimate of sampling uncertainty. The calculation allows a group to be sampled more than once. It cannot reproduce the complete survey design. Adults with unresolved screening information remain outside the proportion. Receipt bounds (the lowest and highest rates if all unclear PASS receipt answers mean receipt or all mean non-receipt) tested the effect of unclear receipt answers.
+</w:t>
       </w:r>
     </w:p>
     <w:p>
@@ -3707,7 +3754,8 @@
           <w:sz w:val="20"/>
           <w:szCs w:val="20"/>
         </w:rPr>
-        <w:t xml:space="preserve">D. Model specification and validation</w:t>
+        <w:t xml:space="preserve">D. Model specification and validation
+</w:t>
       </w:r>
     </w:p>
     <w:p>
@@ -3721,7 +3769,8 @@
           <w:sz w:val="20"/>
           <w:szCs w:val="20"/>
         </w:rPr>
-        <w:t xml:space="preserve">The unweighted logistic model estimated probability of reported non-receipt. The analysis did not rebalance recipients and non-recipients, automatically select variables or choose a cutoff. The model describes associations after accounting for other predictors. Age enters per decade above 60. Comparison categories are male, Grade 7 or above, urban formal and an office nearer than 5 km. Five predictor groups require six slopes and an intercept, because settlement requires two comparisons.</w:t>
+        <w:t xml:space="preserve">The unweighted logistic model estimated probability of reported non-receipt. The analysis did not rebalance recipients and non-recipients, automatically select variables or choose a cutoff. The model describes associations after accounting for other predictors. Age enters per decade above 60. Comparison categories are male, Grade 7 or above, urban formal and an office nearer than 5 km. Five predictor groups require six slopes and an intercept, because settlement requires two comparisons.
+</w:t>
       </w:r>
     </w:p>
     <w:p>
@@ -3735,7 +3784,8 @@
           <w:sz w:val="20"/>
           <w:szCs w:val="20"/>
         </w:rPr>
-        <w:t xml:space="preserve">Only one rural-formal adult reported non-receipt in the attempted seven-slope model. Excluding that person for testing left the training group with no such case in that category. Decision D-052 combined rural formal with traditional settlement to support estimation, without claiming that these settings are equivalent. Marital status affects screening; income, receipt, derived labels and marital status do not enter the primary model.</w:t>
+        <w:t xml:space="preserve">Only one rural-formal adult reported non-receipt in the attempted seven-slope model. Excluding that person for testing left the training group with no such case in that category. Decision D-052 combined rural formal with traditional settlement to support estimation, without claiming that these settings are equivalent. Marital status affects screening; income, receipt, derived labels and marital status do not enter the primary model.
+</w:t>
       </w:r>
     </w:p>
     <w:p>
@@ -3749,7 +3799,8 @@
           <w:sz w:val="20"/>
           <w:szCs w:val="20"/>
         </w:rPr>
-        <w:t xml:space="preserve">Validation used five folds. The split kept households together and balanced the folds by whether any member reported non-receipt. Seed 201415 fixes this division. After interpreting skipped questions, the software filled missing predictors using training-group statistics only. It never filled missing eligibility or outcome information. Each adult received one out-of-fold (OOF) probability from a model trained without that adult's household.</w:t>
+        <w:t xml:space="preserve">Validation used five household-grouped folds. Sorted households were labelled by whether any member reported non-receipt, then stratified so every adult from a household stayed in one fold. Seed 201415 fixes this division. The 1,013 adults come from 827 households: 182 contain more than one modelled adult, and 6 contain both receipt and non-receipt. Each adult received one out-of-fold (OOF) probability from a model trained without that household. Held-out folds had 199 to 207 adults and 12 to 14 non-recipients. The intercept-only reference uses the training group's non-receipt rate.
+</w:t>
       </w:r>
     </w:p>
     <w:p>
@@ -3763,7 +3814,23 @@
           <w:sz w:val="20"/>
           <w:szCs w:val="20"/>
         </w:rPr>
-        <w:t xml:space="preserve">Evaluation measured average precision, AUC, Brier score, calibration slope and calibration-in-the-large. Ideal values are 1 for calibration slope and zero for calibration-in-the-large, which estimates an intercept correction with the slope fixed at 1. The intercept-only reference model uses the training group's non-receipt rate. Bootstrap intervals used 1,000 household samples and fixed OOF predictions. Without model refitting, these intervals omit uncertainty from repeating model development.</w:t>
+        <w:t xml:space="preserve">After interpreting skipped questions, each training fold supplied the fill-in for its held-out adults. Schooling contrasted below Grade 7 with Grade 7 or above, and office distance contrasted at least 5 km or unavailable with nearer than 5 km. Other codes stayed missing. The training fold filled missing age, in decades above 60, with its median, and a missing category with its most frequent code, or the smaller code in a tie. Eligibility, receipt and weights were not filled or modelled. Three recipients lacked usable schooling; 14 recipients and four non-recipients lacked usable office distance. Age, sex and settlement were already complete.
+</w:t>
+      </w:r>
+    </w:p>
+    <w:p>
+      <w:pPr>
+        <w:spacing w:after="80" w:before="0" w:line="230"/>
+        <w:jc w:val="both"/>
+      </w:pPr>
+      <w:r>
+        <w:rPr>
+          <w:rFonts w:ascii="Times New Roman" w:cs="Times New Roman" w:eastAsia="Times New Roman" w:hAnsi="Times New Roman"/>
+          <w:sz w:val="20"/>
+          <w:szCs w:val="20"/>
+        </w:rPr>
+        <w:t xml:space="preserve">Pooled OOF probabilities supplied average precision, AUC, Brier score, calibration slope and calibration-in-the-large. Calibration-in-the-large is an intercept correction with its slope fixed at 1; the ideal values are 0 and 1. The 95% intervals are 2.5 and 97.5 percentiles from 1,000 with-replacement household samples of those fixed predictions, using the same seed. Every selected household's adults were retained. All 1,000 samples contained both outcome classes, but preprocessing, refitting and Decision D-052 were not repeated. The intervals omit a new split, fill-in and fit, and they omit primary sampling units, unreleased strata and person weights. They are not design-based confidence intervals.
+</w:t>
       </w:r>
     </w:p>
     <w:p>
@@ -3791,7 +3858,8 @@
           <w:sz w:val="20"/>
           <w:szCs w:val="20"/>
         </w:rPr>
-        <w:t xml:space="preserve">E. Alternative assumptions</w:t>
+        <w:t xml:space="preserve">E. Alternative assumptions
+</w:t>
       </w:r>
     </w:p>
     <w:p>
@@ -3805,7 +3873,8 @@
           <w:sz w:val="20"/>
           <w:szCs w:val="20"/>
         </w:rPr>
-        <w:t xml:space="preserve">S1 changes thresholds, S2 partnership assumptions, S3 rules about other grants, S4 income definition, S5 receipt period and S6 unresolved-receipt bounds. Each records the denominator, non-recipients, ordinary/person-weighted rates and internally validated model performance. S7 uses complete cases. S8 replaces welfare access with a married indicator. S9 uses frequency weights (treating person weights as repeated-record contributions), keeping unweighted missing-value treatment and evaluation. This is not a full survey-design regression. S10 weights primary OOF measures without refitting. S11 groups validation folds by derived PSU. These results remain separate from the primary analysis.</w:t>
+        <w:t xml:space="preserve">S1 changes thresholds, S2 partnership assumptions, S3 rules about other grants, S4 income definition, S5 receipt period and S6 unresolved-receipt bounds. Each records the denominator, non-recipients, ordinary/person-weighted rates and internally validated model performance. S7 uses complete cases. S8 replaces welfare access with a married indicator. S9 uses frequency weights (treating person weights as repeated-record contributions), keeping unweighted missing-value treatment and evaluation. This is not a full survey-design regression. S10 weights primary OOF measures without refitting. S11 groups validation folds by derived PSU. These results remain separate from the primary analysis.
+</w:t>
       </w:r>
     </w:p>
     <w:p>
@@ -3833,7 +3902,8 @@
           <w:sz w:val="20"/>
           <w:szCs w:val="20"/>
         </w:rPr>
-        <w:t xml:space="preserve">IV. Software and Evaluation</w:t>
+        <w:t xml:space="preserve">IV. Software and Evaluation
+</w:t>
       </w:r>
     </w:p>
     <w:p>
@@ -3847,7 +3917,8 @@
           <w:sz w:val="20"/>
           <w:szCs w:val="20"/>
         </w:rPr>
-        <w:t xml:space="preserve">The command python analysis/run_study.py links survey files, screens adults and calculates results. Run records retain settings, versions, seed, folds and checksums. The saved model stores coefficients and missing-value settings in JSON, without executable program code. Version opg-kzn-six-slope-v1 uses the model trained on all included adults. Uploads do not retrain it.</w:t>
+        <w:t xml:space="preserve">The command python analysis/run_study.py links survey files, screens adults and calculates results. Run records retain settings, versions, seed, folds and checksums. The saved model stores coefficients and missing-value settings in JSON, without executable program code. Version opg-kzn-six-slope-v1 uses the model trained on all included adults. Uploads do not retrain it.
+</w:t>
       </w:r>
     </w:p>
     <w:p>
@@ -3861,7 +3932,8 @@
           <w:sz w:val="20"/>
           <w:szCs w:val="20"/>
         </w:rPr>
-        <w:t xml:space="preserve">The local Streamlit app has five sections: study context, upload/validation, eligibility/receipt, prediction/model and export/reproducibility. It accepts historical opg-screen-v1 CSV files, including household members needed to check spouse resources. Validation rejects incorrect schema, study context, duplicate identifiers, categories and numeric values. Limits are 20 MiB and 50,000 rows. Uploads stay in memory during the current session. Reports use generated row labels and omit submitted identifiers, raw income and household links. Users can filter views and exports; summary rates retain all uploaded adults who pass with resolved receipt.</w:t>
+        <w:t xml:space="preserve">The local Streamlit app has five sections: study context, upload/validation, eligibility/receipt, prediction/model and export/reproducibility. It accepts historical opg-screen-v1 CSV files, including household members needed to check spouse resources. Validation rejects incorrect schema, study context, duplicate identifiers, categories and numeric values. Limits are 20 MiB and 50,000 rows. Uploads stay in memory during the current session. Reports use generated row labels and omit submitted identifiers, raw income and household links. Users can filter views and exports; summary rates retain all uploaded adults who pass with resolved receipt.
+</w:t>
       </w:r>
     </w:p>
     <w:p>
@@ -3875,7 +3947,7 @@
           <wp:inline distT="0" distB="0" distL="0" distR="0">
             <wp:extent cx="3200400" cy="2343150"/>
             <wp:effectExtent t="0" r="0" b="0" l="0"/>
-            <wp:docPr id="1" name="Fig. 2. Research and app workflows share screening rules. Household-held-out predictions remain separate from app scores calculated using the model trained on all included adults." descr="Fig. 2. Research and app workflows share screening rules. Household-held-out predictions remain separate from app scores calculated using the model trained on all included adults." title="Fig. 2. Research and app workflows share screening rules. Household-held-out predictions remain separate from app scores calculated using the model trained on all included adults."/>
+            <wp:docPr id="1" name="Fig. 2. Research and app workflows share screening rules. Household-held-out predictions remain separate from app scores calculated using the model trained on all included adults. " descr="Fig. 2. Research and app workflows share screening rules. Household-held-out predictions remain separate from app scores calculated using the model trained on all included adults. " title="Fig. 2. Research and app workflows share screening rules. Household-held-out predictions remain separate from app scores calculated using the model trained on all included adults. "/>
             <wp:cNvGraphicFramePr>
               <a:graphicFrameLocks xmlns:a="http://schemas.openxmlformats.org/drawingml/2006/main" noChangeAspect="1"/>
             </wp:cNvGraphicFramePr>
@@ -3926,7 +3998,8 @@
           <w:sz w:val="16"/>
           <w:szCs w:val="16"/>
         </w:rPr>
-        <w:t xml:space="preserve">Fig. 2. Research and app workflows share screening rules. Household-held-out predictions remain separate from app scores calculated using the model trained on all included adults.</w:t>
+        <w:t xml:space="preserve">Fig. 2. Research and app workflows share screening rules. Household-held-out predictions remain separate from app scores calculated using the model trained on all included adults.
+</w:t>
       </w:r>
     </w:p>
     <w:p>
@@ -3940,7 +4013,8 @@
           <w:sz w:val="20"/>
           <w:szCs w:val="20"/>
         </w:rPr>
-        <w:t xml:space="preserve">The app reuses the screening rules and saved model settings. It scores only supported adults who pass with resolved receipt. Saved training statistics fill partly missing predictors; records missing every categorical predictor remain unscored. Integrity checks link model and evaluation files to the analysis and predictor code. The interface labels historical OOF results separately from uploaded scores; uploaded records may overlap training data. CSV, JSON and ZIP reports contain classifications, reasons, supported probabilities, versions and an audit manifest (settings and file checksums). The downloadable minimum viable product, or MVP, uses invented data and excludes raw survey files, historical respondent outputs and Git version history.</w:t>
+        <w:t xml:space="preserve">The app reuses the screening rules and saved model settings. It scores only supported adults who pass with resolved receipt. Saved training statistics fill partly missing predictors; records missing every categorical predictor remain unscored. Integrity checks link model and evaluation files to the analysis and predictor code. The interface labels historical OOF results separately from uploaded scores; uploaded records may overlap training data. CSV, JSON and ZIP reports contain classifications, reasons, supported probabilities, versions and an audit manifest (settings and file checksums). The downloadable minimum viable product, or MVP, uses invented data and excludes raw survey files, historical respondent outputs and Git version history.
+</w:t>
       </w:r>
     </w:p>
     <w:p>
@@ -3954,7 +4028,8 @@
           <w:sz w:val="20"/>
           <w:szCs w:val="20"/>
         </w:rPr>
-        <w:t xml:space="preserve">Software checks compared screening decisions with expected results and tested excluded predictors, links, repeated runs, reports and saved predictions. Further checks compared the CLI (command-line interface) with the UI (user interface), including invalid inputs and outdated results. The owner's Windows walkthrough demonstrated local functionality. A task sheet supports future testing with three to five consenting participants; no participant study has taken place.</w:t>
+        <w:t xml:space="preserve">Software checks compared screening decisions with expected results and tested excluded predictors, links, repeated runs, reports and saved predictions. Further checks compared the CLI (command-line interface) with the UI (user interface), including invalid inputs and outdated results. The owner's Windows walkthrough demonstrated local functionality. A task sheet supports future testing with three to five consenting participants; no participant study has taken place.
+</w:t>
       </w:r>
     </w:p>
     <w:p>
@@ -3982,7 +4057,8 @@
           <w:sz w:val="20"/>
           <w:szCs w:val="20"/>
         </w:rPr>
-        <w:t xml:space="preserve">V. Results</w:t>
+        <w:t xml:space="preserve">V. Results
+</w:t>
       </w:r>
     </w:p>
     <w:p>
@@ -4010,7 +4086,8 @@
           <w:sz w:val="20"/>
           <w:szCs w:val="20"/>
         </w:rPr>
-        <w:t xml:space="preserve">A. Study group and reported non-receipt</w:t>
+        <w:t xml:space="preserve">A. Study group and reported non-receipt
+</w:t>
       </w:r>
     </w:p>
     <w:p>
@@ -4024,7 +4101,8 @@
           <w:sz w:val="20"/>
           <w:szCs w:val="20"/>
         </w:rPr>
-        <w:t xml:space="preserve">The survey included 15,388 people in 3,686 KwaZulu-Natal households. Table IV shows the selection steps. Among 117 failures, 93 exceeded the income ceiling and 25 reported a disability grant; one met both conditions. None reported a war-veterans grant. Among 187 unresolved adults, 105 were married, mostly with a non-resident spouse, and 63 reported living together. Unresolved adults outnumbered non-recipients.</w:t>
+        <w:t xml:space="preserve">The survey included 15,388 people in 3,686 KwaZulu-Natal households. Table IV shows the selection steps. Among 117 failures, 93 exceeded the income ceiling and 25 reported a disability grant; one met both conditions. None reported a war-veterans grant. Among 187 unresolved adults, 105 were married, mostly with a non-resident spouse, and 63 reported living together. Unresolved adults outnumbered non-recipients.
+</w:t>
       </w:r>
     </w:p>
     <w:p>
@@ -4043,7 +4121,8 @@
           <w:sz w:val="16"/>
           <w:szCs w:val="16"/>
         </w:rPr>
-        <w:t xml:space="preserve">Table IV. KwaZulu-Natal study group at each screening step</w:t>
+        <w:t xml:space="preserve">Table IV. KwaZulu-Natal study group at each screening step
+</w:t>
       </w:r>
     </w:p>
     <w:tbl>
@@ -5116,7 +5195,8 @@
           <w:sz w:val="16"/>
           <w:szCs w:val="16"/>
         </w:rPr>
-        <w:t xml:space="preserve">Each row counts distinct households. A household can appear in several rows.</w:t>
+        <w:t xml:space="preserve">Each row counts distinct households. A household can appear in several rows.
+</w:t>
       </w:r>
     </w:p>
     <w:p>
@@ -5130,7 +5210,7 @@
           <wp:inline distT="0" distB="0" distL="0" distR="0">
             <wp:extent cx="3200400" cy="2466975"/>
             <wp:effectExtent t="0" r="0" b="0" l="0"/>
-            <wp:docPr id="1" name="Fig. 3. FAIL, UNRESOLVED and PASS groups do not overlap. All 1,013 PASS adults resolve receipt and enter the final denominator." descr="Fig. 3. FAIL, UNRESOLVED and PASS groups do not overlap. All 1,013 PASS adults resolve receipt and enter the final denominator." title="Fig. 3. FAIL, UNRESOLVED and PASS groups do not overlap. All 1,013 PASS adults resolve receipt and enter the final denominator."/>
+            <wp:docPr id="1" name="Fig. 3. FAIL, UNRESOLVED and PASS groups do not overlap. All 1,013 PASS adults resolve receipt and enter the final denominator. " descr="Fig. 3. FAIL, UNRESOLVED and PASS groups do not overlap. All 1,013 PASS adults resolve receipt and enter the final denominator. " title="Fig. 3. FAIL, UNRESOLVED and PASS groups do not overlap. All 1,013 PASS adults resolve receipt and enter the final denominator. "/>
             <wp:cNvGraphicFramePr>
               <a:graphicFrameLocks xmlns:a="http://schemas.openxmlformats.org/drawingml/2006/main" noChangeAspect="1"/>
             </wp:cNvGraphicFramePr>
@@ -5181,7 +5261,8 @@
           <w:sz w:val="16"/>
           <w:szCs w:val="16"/>
         </w:rPr>
-        <w:t xml:space="preserve">Fig. 3. FAIL, UNRESOLVED and PASS groups do not overlap. All 1,013 PASS adults resolve receipt and enter the final denominator.</w:t>
+        <w:t xml:space="preserve">Fig. 3. FAIL, UNRESOLVED and PASS groups do not overlap. All 1,013 PASS adults resolve receipt and enter the final denominator.
+</w:t>
       </w:r>
     </w:p>
     <w:p>
@@ -5195,7 +5276,8 @@
           <w:sz w:val="20"/>
           <w:szCs w:val="20"/>
         </w:rPr>
-        <w:t xml:space="preserve">Of these 1,013 adults, 67 reported non-receipt: 6.61% without weights and 7.49% with person weights. The calculation used 345 derived PSUs and gave a standard error of 1.3 percentage points. A bell-shaped sampling approximation gave a 95% confidence interval of 4.9%–10.0%. Missing strata limit this approximation. All 1,013 PASS answers agreed with preceding-year OPG income, so those checks changed nothing. Table V compares five predictors before filling missing values. Average age and percentages describe each receipt group. The percentages describe receipt-group composition, not non-receipt rates or predictions.</w:t>
+        <w:t xml:space="preserve">Of these 1,013 adults, 67 reported non-receipt: 6.61% without weights and 7.49% with person weights. The calculation used 345 derived PSUs and gave a standard error of 1.3 percentage points. A bell-shaped sampling approximation gave a 95% confidence interval of 4.9%–10.0%. Missing strata limit this approximation. All 1,013 PASS answers agreed with preceding-year OPG income, so those checks changed nothing. Table V compares five predictors before filling missing values. Average age and percentages describe each receipt group. The percentages describe receipt-group composition, not non-receipt rates or predictions.
+</w:t>
       </w:r>
     </w:p>
     <w:p>
@@ -5214,7 +5296,8 @@
           <w:sz w:val="16"/>
           <w:szCs w:val="16"/>
         </w:rPr>
-        <w:t xml:space="preserve">Table V. Characteristics by receipt (U = unweighted; W = person-weighted)</w:t>
+        <w:t xml:space="preserve">Table V. Characteristics by receipt (U = unweighted; W = person-weighted)
+</w:t>
       </w:r>
     </w:p>
     <w:tbl>
@@ -6029,7 +6112,8 @@
           <w:sz w:val="16"/>
           <w:szCs w:val="16"/>
         </w:rPr>
-        <w:t xml:space="preserve">Recipients: 946 people; non-recipients: 67 people. U gives unweighted averages, or counts and percentages within each group. W gives person-weighted averages/percentages. Denominators retain missing predictors: three recipients lack schooling; 14 recipients/four non-recipients lack welfare-access values. These summaries have no uncertainty intervals.</w:t>
+        <w:t xml:space="preserve">Recipients: 946 people; non-recipients: 67 people. U gives unweighted averages, or counts and percentages within each group. W gives person-weighted averages/percentages. Denominators retain missing predictors: three recipients lack schooling; 14 recipients/four non-recipients lack welfare-access values. These summaries have no uncertainty intervals.
+</w:t>
       </w:r>
     </w:p>
     <w:p>
@@ -6043,7 +6127,8 @@
           <w:sz w:val="20"/>
           <w:szCs w:val="20"/>
         </w:rPr>
-        <w:t xml:space="preserve">Non-recipients were younger before weighting, more often men, more educated and more often urban formal residents. Weights brought average ages closer.</w:t>
+        <w:t xml:space="preserve">Non-recipients were younger before weighting, more often men, more educated and more often urban formal residents. Weights brought average ages closer.
+</w:t>
       </w:r>
     </w:p>
     <w:p>
@@ -6071,7 +6156,8 @@
           <w:sz w:val="20"/>
           <w:szCs w:val="20"/>
         </w:rPr>
-        <w:t xml:space="preserve">B. Screening sensitivity</w:t>
+        <w:t xml:space="preserve">B. Screening sensitivity
+</w:t>
       </w:r>
     </w:p>
     <w:p>
@@ -6085,7 +6171,8 @@
           <w:sz w:val="20"/>
           <w:szCs w:val="20"/>
         </w:rPr>
-        <w:t xml:space="preserve">Table VI reports each scenario’s denominator and non-receipt events. Unw. and Wtd. abbreviate unweighted and person-weighted. Slope means calibration slope in Tables VI and VIII. Compared with S0, S1b/S1d added two people/two events. S2a, S2b, S2c and S2d added 59/4, 60/2, 8/0 and 68/2 people/events. S3 added 19 people/15 events; S4b removed six people but no events. Weighted non-receipt ranged from 7.12% to 9.06%.</w:t>
+        <w:t xml:space="preserve">Table VI reports each scenario’s denominator and non-receipt events. Unw. and Wtd. abbreviate unweighted and person-weighted. Slope means calibration slope in Tables VI and VIII. Compared with S0, S1b/S1d added two people/two events. S2a, S2b, S2c and S2d added 59/4, 60/2, 8/0 and 68/2 people/events. S3 added 19 people/15 events; S4b removed six people but no events. Weighted non-receipt ranged from 7.12% to 9.06%.
+</w:t>
       </w:r>
     </w:p>
     <w:p>
@@ -6104,7 +6191,8 @@
           <w:sz w:val="16"/>
           <w:szCs w:val="16"/>
         </w:rPr>
-        <w:t xml:space="preserve">Table VI. Changed screening rules and OOF performance</w:t>
+        <w:t xml:space="preserve">Table VI. Changed screening rules and OOF performance
+</w:t>
       </w:r>
     </w:p>
     <w:tbl>
@@ -9079,7 +9167,8 @@
           <w:sz w:val="16"/>
           <w:szCs w:val="16"/>
         </w:rPr>
-        <w:t xml:space="preserve">Events are reported non-recipients. Unw./Wtd. give unweighted/person-weighted non-receipt rates; performance uses no weights. S1b applies the 2015 ceiling throughout; S1d uses the zero-payout ceiling (the resource level where the grant formula pays zero). S2a/S2b treat living-together adults as couples/single. S2c treats separated adults as single; S2d treats both as single. S3 retains disability/war-veterans grant recipients (it adds no veterans). S4b retains social-assistance income.</w:t>
+        <w:t xml:space="preserve">Events are reported non-recipients. Unw./Wtd. give unweighted/person-weighted non-receipt rates; performance uses no weights. S1b applies the 2015 ceiling throughout; S1d uses the zero-payout ceiling (the resource level where the grant formula pays zero). S2a/S2b treat living-together adults as couples/single. S2c treats separated adults as single; S2d treats both as single. S3 retains disability/war-veterans grant recipients (it adds no veterans). S4b retains social-assistance income.
+</w:t>
       </w:r>
     </w:p>
     <w:p>
@@ -9093,7 +9182,8 @@
           <w:sz w:val="20"/>
           <w:szCs w:val="20"/>
         </w:rPr>
-        <w:t xml:space="preserve">*S1a (2014 ceiling throughout), S1c (age-75 supplement), S4a (income adjusted for price changes, with the ceiling unchanged), S4c (excluding UIF, the Unemployment Insurance Fund, and similar transfers), S5 (preceding-year receipt) and S6a/S6b (receipt bounds) change nothing. Each keeps the denominator, events and measures. No PASS adult has unresolved receipt to bound.</w:t>
+        <w:t xml:space="preserve">*S1a (2014 ceiling throughout), S1c (age-75 supplement), S4a (income adjusted for price changes, with the ceiling unchanged), S4c (excluding UIF, the Unemployment Insurance Fund, and similar transfers), S5 (preceding-year receipt) and S6a/S6b (receipt bounds) change nothing. Each keeps the denominator, events and measures. No PASS adult has unresolved receipt to bound.
+</w:t>
       </w:r>
     </w:p>
     <w:p>
@@ -9121,7 +9211,8 @@
           <w:sz w:val="20"/>
           <w:szCs w:val="20"/>
         </w:rPr>
-        <w:t xml:space="preserve">C. Held-out prediction</w:t>
+        <w:t xml:space="preserve">C. Held-out prediction
+</w:t>
       </w:r>
     </w:p>
     <w:p>
@@ -9135,7 +9226,8 @@
           <w:sz w:val="20"/>
           <w:szCs w:val="20"/>
         </w:rPr>
-        <w:t xml:space="preserve">All five folds converged. Figure 4 uses five similarly sized bins. The highest bin had average prediction 0.188 and 35/203 non-recipients (17.2%); the lowest had average 0.0107 and 3/206 non-recipients (1.5%).</w:t>
+        <w:t xml:space="preserve">All five folds converged. Figure 4 uses five similarly sized bins. The highest bin had average prediction 0.188 and 35/203 non-recipients (17.2%); the lowest had average 0.0107 and 3/206 non-recipients (1.5%).
+</w:t>
       </w:r>
     </w:p>
     <w:p>
@@ -9154,7 +9246,8 @@
           <w:sz w:val="16"/>
           <w:szCs w:val="16"/>
         </w:rPr>
-        <w:t xml:space="preserve">Table VII. Primary held-out performance and uncertainty</w:t>
+        <w:t xml:space="preserve">Table VII. Primary held-out performance and uncertainty
+</w:t>
       </w:r>
     </w:p>
     <w:tbl>
@@ -9969,7 +10062,8 @@
           <w:sz w:val="16"/>
           <w:szCs w:val="16"/>
         </w:rPr>
-        <w:t xml:space="preserve">Estimates pool unweighted OOF predictions: 1,013 people/67 events. The intervals use percentile bounds from 1,000 household resamples of fixed predictions. All reported intervals have zero invalid resamples. Resampling did not refit models or missing-value settings. The intercept-only reference uses the training group's non-receipt rate. Dashes mean unavailable measures/intervals, rather than zero or chance performance.</w:t>
+        <w:t xml:space="preserve">Estimates pool unweighted OOF predictions: 1,013 people/67 events. The intervals use percentile bounds from 1,000 household resamples of fixed predictions. All reported intervals have zero invalid resamples. Resampling did not refit models or missing-value settings. The intercept-only reference uses the training group's non-receipt rate. Dashes mean unavailable measures/intervals, rather than zero or chance performance.
+</w:t>
       </w:r>
     </w:p>
     <w:p>
@@ -9983,7 +10077,7 @@
           <wp:inline distT="0" distB="0" distL="0" distR="0">
             <wp:extent cx="3200400" cy="2286000"/>
             <wp:effectExtent t="0" r="0" b="0" l="0"/>
-            <wp:docPr id="1" name="Fig. 4. Saved group summaries show unweighted OOF calibration. Labels give events/people; the diagonal shows exact agreement between average predictions and observed rates. Plot range: 0–0.22." descr="Fig. 4. Saved group summaries show unweighted OOF calibration. Labels give events/people; the diagonal shows exact agreement between average predictions and observed rates. Plot range: 0–0.22." title="Fig. 4. Saved group summaries show unweighted OOF calibration. Labels give events/people; the diagonal shows exact agreement between average predictions and observed rates. Plot range: 0–0.22."/>
+            <wp:docPr id="1" name="Fig. 4. Saved group summaries show unweighted OOF calibration. Labels give events/people; the diagonal shows exact agreement between average predictions and observed rates. Plot range: 0–0.22. " descr="Fig. 4. Saved group summaries show unweighted OOF calibration. Labels give events/people; the diagonal shows exact agreement between average predictions and observed rates. Plot range: 0–0.22. " title="Fig. 4. Saved group summaries show unweighted OOF calibration. Labels give events/people; the diagonal shows exact agreement between average predictions and observed rates. Plot range: 0–0.22. "/>
             <wp:cNvGraphicFramePr>
               <a:graphicFrameLocks xmlns:a="http://schemas.openxmlformats.org/drawingml/2006/main" noChangeAspect="1"/>
             </wp:cNvGraphicFramePr>
@@ -10034,7 +10128,8 @@
           <w:sz w:val="16"/>
           <w:szCs w:val="16"/>
         </w:rPr>
-        <w:t xml:space="preserve">Fig. 4. Saved group summaries show unweighted OOF calibration. Labels give events/people; the diagonal shows exact agreement between average predictions and observed rates. Plot range: 0–0.22.</w:t>
+        <w:t xml:space="preserve">Fig. 4. Saved group summaries show unweighted OOF calibration. Labels give events/people; the diagonal shows exact agreement between average predictions and observed rates. Plot range: 0–0.22.
+</w:t>
       </w:r>
     </w:p>
     <w:p>
@@ -10048,7 +10143,8 @@
           <w:sz w:val="20"/>
           <w:szCs w:val="20"/>
         </w:rPr>
-        <w:t xml:space="preserve">The odds ratio for women versus men was 0.39. Its Wald interval was 0.23–0.66. Schooling below Grade 7 versus Grade 7 or above gave 0.24 (0.13–0.43). The model trained on all included adults produced these estimates. Age, settlement and welfare-distance intervals included 1. These associations describe odds, not probability reductions, held-out performance or causes.</w:t>
+        <w:t xml:space="preserve">The odds ratio for women versus men was 0.39. Its Wald interval was 0.23–0.66. Schooling below Grade 7 versus Grade 7 or above gave 0.24 (0.13–0.43). The model trained on all included adults produced these estimates. Age, settlement and welfare-distance intervals included 1. These associations describe odds, not probability reductions, held-out performance or causes.
+</w:t>
       </w:r>
     </w:p>
     <w:p>
@@ -10067,7 +10163,8 @@
           <w:sz w:val="16"/>
           <w:szCs w:val="16"/>
         </w:rPr>
-        <w:t xml:space="preserve">Table VIII. Model/validation sensitivities</w:t>
+        <w:t xml:space="preserve">Table VIII. Model/validation sensitivities
+</w:t>
       </w:r>
     </w:p>
     <w:tbl>
@@ -11875,7 +11972,8 @@
           <w:sz w:val="16"/>
           <w:szCs w:val="16"/>
         </w:rPr>
-        <w:t xml:space="preserve">The non-receipt-rate column uses no weights; S8–S11 keep the weighted non-receipt rate at 7.49%. S9 uses frequency weights when fitting, but no weights when filling missing values or checking predictions. S10 weights the primary OOF predictions without refitting. S8 replaces welfare access and keeps six slopes. S7 removes 21 people/four events. S11 changes fold grouping but keeps the study group.</w:t>
+        <w:t xml:space="preserve">The non-receipt-rate column uses no weights; S8–S11 keep the weighted non-receipt rate at 7.49%. S9 uses frequency weights when fitting, but no weights when filling missing values or checking predictions. S10 weights the primary OOF predictions without refitting. S8 replaces welfare access and keeps six slopes. S7 removes 21 people/four events. S11 changes fold grouping but keeps the study group.
+</w:t>
       </w:r>
     </w:p>
     <w:p>
@@ -11889,7 +11987,8 @@
           <w:sz w:val="20"/>
           <w:szCs w:val="20"/>
         </w:rPr>
-        <w:t xml:space="preserve">Across alternatives, AUC ranged from 0.736 to 0.763; Brier and calibration slopes also changed.</w:t>
+        <w:t xml:space="preserve">Across alternatives, AUC ranged from 0.736 to 0.763; Brier and calibration slopes also changed.
+</w:t>
       </w:r>
     </w:p>
     <w:p>
@@ -11917,7 +12016,8 @@
           <w:sz w:val="20"/>
           <w:szCs w:val="20"/>
         </w:rPr>
-        <w:t xml:space="preserve">D. Software verification</w:t>
+        <w:t xml:space="preserve">D. Software verification
+</w:t>
       </w:r>
     </w:p>
     <w:p>
@@ -11931,7 +12031,8 @@
           <w:sz w:val="20"/>
           <w:szCs w:val="20"/>
         </w:rPr>
-        <w:t xml:space="preserve">The 26 checks in Table IX included 22 synthetic screening cases (invented records with specified expected decisions), two income-schedule checks, one forbidden-predictor check and one run trace. Boundary, spouse, grant and receipt decisions matched their specifications. Two research runs produced 14 files with exactly matching contents and retained the study-group checksum.</w:t>
+        <w:t xml:space="preserve">The 26 checks in Table IX included 22 synthetic screening cases (invented records with specified expected decisions), two income-schedule checks, one forbidden-predictor check and one run trace. Boundary, spouse, grant and receipt decisions matched their specifications. Two research runs produced 14 files with exactly matching contents and retained the study-group checksum.
+</w:t>
       </w:r>
     </w:p>
     <w:p>
@@ -11950,7 +12051,8 @@
           <w:sz w:val="16"/>
           <w:szCs w:val="16"/>
         </w:rPr>
-        <w:t xml:space="preserve">Table IX. Completed verification and its scope</w:t>
+        <w:t xml:space="preserve">Table IX. Completed verification and its scope
+</w:t>
       </w:r>
     </w:p>
     <w:tbl>
@@ -12886,7 +12988,8 @@
           <w:sz w:val="20"/>
           <w:szCs w:val="20"/>
         </w:rPr>
-        <w:t xml:space="preserve">The owner's Windows walkthrough produced six synthetic classifications: two resolved passes, one recipient and one non-recipient. Matching predictors gave both scores of 0.1853. The invented 50% rate is not the survey non-receipt rate. Screenshots and six extracted reports documented the walkthrough. The checks did not inspect the ZIP container. Regenerated outputs, checksums, summaries and model/source versions passed 50 checks. This verifies functions and exports, not independent execution or representative task times, errors or ease.</w:t>
+        <w:t xml:space="preserve">The owner's Windows walkthrough produced six synthetic classifications: two resolved passes, one recipient and one non-recipient. Matching predictors gave both scores of 0.1853. The invented 50% rate is not the survey non-receipt rate. Screenshots and six extracted reports documented the walkthrough. The checks did not inspect the ZIP container. Regenerated outputs, checksums, summaries and model/source versions passed 50 checks. This verifies functions and exports, not independent execution or representative task times, errors or ease.
+</w:t>
       </w:r>
     </w:p>
     <w:p>
@@ -12914,7 +13017,8 @@
           <w:sz w:val="20"/>
           <w:szCs w:val="20"/>
         </w:rPr>
-        <w:t xml:space="preserve">VI. Discussion</w:t>
+        <w:t xml:space="preserve">VI. Discussion
+</w:t>
       </w:r>
     </w:p>
     <w:p>
@@ -12942,7 +13046,8 @@
           <w:sz w:val="20"/>
           <w:szCs w:val="20"/>
         </w:rPr>
-        <w:t xml:space="preserve">A. Scope of measured non-receipt</w:t>
+        <w:t xml:space="preserve">A. Scope of measured non-receipt
+</w:t>
       </w:r>
     </w:p>
     <w:p>
@@ -12956,7 +13061,8 @@
           <w:sz w:val="20"/>
           <w:szCs w:val="20"/>
         </w:rPr>
-        <w:t xml:space="preserve">RQ1 measures non-receipt among historical KwaZulu-Natal adults who pass the screen and resolve receipt: 67/1,013, or 6.61% unweighted and 7.49% person-weighted. This does not measure unlawful denial or non-receipt among everyone legally entitled. The 187 unresolved adults outnumbered the 67 events. Excluding them changes the population described, regardless of sampling uncertainty. Stable estimates cannot reveal their receipt.</w:t>
+        <w:t xml:space="preserve">RQ1 measures non-receipt among historical KwaZulu-Natal adults who pass the screen and resolve receipt: 67/1,013, or 6.61% unweighted and 7.49% person-weighted. This does not measure unlawful denial or non-receipt among everyone legally entitled. The 187 unresolved adults outnumbered the 67 events. Excluding them changes the population described, regardless of sampling uncertainty. Stable estimates cannot reveal their receipt.
+</w:t>
       </w:r>
     </w:p>
     <w:p>
@@ -12970,7 +13076,8 @@
           <w:sz w:val="20"/>
           <w:szCs w:val="20"/>
         </w:rPr>
-        <w:t xml:space="preserve">S2d added 68 people but only two events, reducing weighted non-receipt to 7.12%. Partnership rules mainly changed the denominator. S3 retained adults with incompatible grants, added 19 people/15 events and raised non-receipt to 9.06%, the largest tested change. Similar AUC cannot justify screening rules or establish equivalent populations. Ralston studies rural age-eligible people [3]; Godfrey studies households' grants [4]. Different units, programmes, screens and places prevent direct comparison of their percentages. This study adds a provincial estimate with an explicit resource screen. High receipt can involve access costs [13], [14]; it cannot prove low burden.</w:t>
+        <w:t xml:space="preserve">S2d added 68 people but only two events, reducing weighted non-receipt to 7.12%. Partnership rules mainly changed the denominator. S3 retained adults with incompatible grants, added 19 people/15 events and raised non-receipt to 9.06%, the largest tested change. Similar AUC cannot justify screening rules or establish equivalent populations. Ralston studies rural age-eligible people [3]; Godfrey studies households' grants [4]. Different units, programmes, screens and places prevent direct comparison of their percentages. This study adds a provincial estimate with an explicit resource screen. High receipt can involve access costs [13], [14]; it cannot prove low burden.
+</w:t>
       </w:r>
     </w:p>
     <w:p>
@@ -12998,7 +13105,8 @@
           <w:sz w:val="20"/>
           <w:szCs w:val="20"/>
         </w:rPr>
-        <w:t xml:space="preserve">B. Predictive performance and interpretation</w:t>
+        <w:t xml:space="preserve">B. Predictive performance and interpretation
+</w:t>
       </w:r>
     </w:p>
     <w:p>
@@ -13012,7 +13120,8 @@
           <w:sz w:val="20"/>
           <w:szCs w:val="20"/>
         </w:rPr>
-        <w:t xml:space="preserve">RQ2 assesses four properties. AUC 0.752 describes ranking held-out non-recipients above recipients, not classification accuracy. AP 0.203 summarises precision–recall ranking across cutoffs against a 6.61% event rate, not precision at one cutoff [16]. Brier fell from 0.0618 to 0.0578: a modest 0.0040 reduction in squared probability error. An intercept correction, with calibration slope fixed at 1, checks average bias. The ideal correction is zero. The estimate 0.020 and interval spanning zero do not prove perfect agreement. Slope 0.836 suggests predictions may be too extreme, but its 0.591–1.133 interval includes the ideal 1 [17]. Only 67 events informed these checks [18]. Most adults in even the highest-risk bin reported receipt.</w:t>
+        <w:t xml:space="preserve">RQ2 assesses four properties. AUC 0.752 describes ranking held-out non-recipients above recipients, not classification accuracy. AP 0.203 summarises precision–recall ranking across cutoffs against a 6.61% event rate, not precision at one cutoff [16]. Brier fell from 0.0618 to 0.0578: a modest 0.0040 reduction in squared probability error. An intercept correction, with calibration slope fixed at 1, checks average bias. The ideal correction is zero. The estimate 0.020 and interval spanning zero do not prove perfect agreement. Slope 0.836 suggests predictions may be too extreme, but its 0.591–1.133 interval includes the ideal 1 [17]. Only 67 events informed these checks [18]. Most adults in even the highest-risk bin reported receipt.
+</w:t>
       </w:r>
     </w:p>
     <w:p>
@@ -13026,7 +13135,8 @@
           <w:sz w:val="20"/>
           <w:szCs w:val="20"/>
         </w:rPr>
-        <w:t xml:space="preserve">Table VIII separates sample, predictor and evaluation changes. S7 removed 21 people/four events (992/63). Its lower Brier concerns a different sample and cannot establish whether filling missing values is better. S8 substituted marriage for welfare access and performed similarly. S9 weighted fitting but not evaluation; it does not model the full survey design. S10 reweighted the same primary OOF predictions without retraining, raising Brier to 0.0641. S11 grouped folds by derived PSU and also performed similarly. S8–S11 retained 1,013 people/67 events. These checks expose internal assumptions; they do not establish model superiority or reliability elsewhere [19], [20].</w:t>
+        <w:t xml:space="preserve">Table VIII separates sample, predictor and evaluation changes. S7 removed 21 people/four events (992/63). Its lower Brier concerns a different sample and cannot establish whether filling missing values is better. S8 substituted marriage for welfare access and performed similarly. S9 weighted fitting but not evaluation; it does not model the full survey design. S10 reweighted the same primary OOF predictions without retraining, raising Brier to 0.0641. S11 grouped folds by derived PSU and also performed similarly. S8–S11 retained 1,013 people/67 events. These checks expose internal assumptions; they do not establish model superiority or reliability elsewhere [19], [20].
+</w:t>
       </w:r>
     </w:p>
     <w:p>
@@ -13054,7 +13164,8 @@
           <w:sz w:val="20"/>
           <w:szCs w:val="20"/>
         </w:rPr>
-        <w:t xml:space="preserve">C. Reproducibility and usability</w:t>
+        <w:t xml:space="preserve">C. Reproducibility and usability
+</w:t>
       </w:r>
     </w:p>
     <w:p>
@@ -13068,7 +13179,8 @@
           <w:sz w:val="20"/>
           <w:szCs w:val="20"/>
         </w:rPr>
-        <w:t xml:space="preserve">RQ3 has six evidence layers. Synthetic cases check rule decisions; matching file contents check repeatability; UI–CLI agreement checks software paths; JSON reload checks saved-model predictions. The owner walkthrough checks a synthetic workflow; participant testing would assess human usability. Table IX supports the first five within tested conditions. Automated agreement cannot establish independent user ease, acceptance or field success. Saved sources and run/validation reports document versions, checksums and test conditions.</w:t>
+        <w:t xml:space="preserve">RQ3 has six evidence layers. Synthetic cases check rule decisions; matching file contents check repeatability; UI–CLI agreement checks software paths; JSON reload checks saved-model predictions. The owner walkthrough checks a synthetic workflow; participant testing would assess human usability. Table IX supports the first five within tested conditions. Automated agreement cannot establish independent user ease, acceptance or field success. Saved sources and run/validation reports document versions, checksums and test conditions.
+</w:t>
       </w:r>
     </w:p>
     <w:p>
@@ -13082,7 +13194,8 @@
           <w:sz w:val="20"/>
           <w:szCs w:val="20"/>
         </w:rPr>
-        <w:t xml:space="preserve">The app separates historical OOF results from uploaded scores; uploads may overlap training data. Matching saved scores checks reloading, not new predictive accuracy. The software exposes its computations, but representative user clarity remains untested. The task sheet supports future testing.</w:t>
+        <w:t xml:space="preserve">The app separates historical OOF results from uploaded scores; uploads may overlap training data. Matching saved scores checks reloading, not new predictive accuracy. The software exposes its computations, but representative user clarity remains untested. The task sheet supports future testing.
+</w:t>
       </w:r>
     </w:p>
     <w:p>
@@ -13110,7 +13223,8 @@
           <w:sz w:val="20"/>
           <w:szCs w:val="20"/>
         </w:rPr>
-        <w:t xml:space="preserve">D. Transfer to other settings</w:t>
+        <w:t xml:space="preserve">D. Transfer to other settings
+</w:t>
       </w:r>
     </w:p>
     <w:p>
@@ -13124,7 +13238,8 @@
           <w:sz w:val="20"/>
           <w:szCs w:val="20"/>
         </w:rPr>
-        <w:t xml:space="preserve">This study analysed screened KwaZulu-Natal adults in LCS 2014/2015. Provinces and periods differ in settlement, services, policy and reporting. Application, award and payment records measure different events from reported receipt and can contain linking errors. The study did not test the model on an independent province, period or administrative sample. Transfer requires comparable populations/outcomes, justified period-specific rules and independent ranking/calibration checks [19], [20]. Making the app available cannot establish suitability for today's applicants.</w:t>
+        <w:t xml:space="preserve">This study analysed screened KwaZulu-Natal adults in LCS 2014/2015. Provinces and periods differ in settlement, services, policy and reporting. Application, award and payment records measure different events from reported receipt and can contain linking errors. The study did not test the model on an independent province, period or administrative sample. Transfer requires comparable populations/outcomes, justified period-specific rules and independent ranking/calibration checks [19], [20]. Making the app available cannot establish suitability for today's applicants.
+</w:t>
       </w:r>
     </w:p>
     <w:p>
@@ -13152,7 +13267,8 @@
           <w:sz w:val="20"/>
           <w:szCs w:val="20"/>
         </w:rPr>
-        <w:t xml:space="preserve">E. Synthesis of the Conceptual Framework</w:t>
+        <w:t xml:space="preserve">E. Synthesis of the Conceptual Framework
+</w:t>
       </w:r>
     </w:p>
     <w:p>
@@ -13166,7 +13282,8 @@
           <w:sz w:val="20"/>
           <w:szCs w:val="20"/>
         </w:rPr>
-        <w:t xml:space="preserve">Returning to Figure 1, screening sensitivity supported an explicit denominator, and sex differences supported demographic comparison without confirming burden mechanisms [3], [4]. Lower schooling accompanied receipt, contrary to a simple expectation that fewer information resources increase non-receipt [13]. Screening selection or other resources could account for this; neither explanation was tested. Office-distance and settlement intervals included 1, leaving compliance-cost expectations unresolved. Psychological costs remained untested because LCS did not measure them. Proxy associations do not directly test the theory. The artefact contributes a reproducible implementation of these bounded measurement choices. Separate, traceable rules, outcomes and predictions support inspection despite measurement limits, without establishing causes, legal entitlement or participant usability.</w:t>
+        <w:t xml:space="preserve">Returning to Figure 1, screening sensitivity supported an explicit denominator, and sex differences supported demographic comparison without confirming burden mechanisms [3], [4]. Lower schooling accompanied receipt, contrary to a simple expectation that fewer information resources increase non-receipt [13]. Screening selection or other resources could account for this; neither explanation was tested. Office-distance and settlement intervals included 1, leaving compliance-cost expectations unresolved. Psychological costs remained untested because LCS did not measure them. Proxy associations do not directly test the theory. The artefact contributes a reproducible implementation of these bounded measurement choices. Separate, traceable rules, outcomes and predictions support inspection despite measurement limits, without establishing causes, legal entitlement or participant usability.
+</w:t>
       </w:r>
     </w:p>
     <w:p>
@@ -13194,7 +13311,8 @@
           <w:sz w:val="20"/>
           <w:szCs w:val="20"/>
         </w:rPr>
-        <w:t xml:space="preserve">VII. Limitations and Ethics</w:t>
+        <w:t xml:space="preserve">VII. Limitations and Ethics
+</w:t>
       </w:r>
     </w:p>
     <w:p>
@@ -13208,7 +13326,8 @@
           <w:sz w:val="20"/>
           <w:szCs w:val="20"/>
         </w:rPr>
-        <w:t xml:space="preserve">The survey cannot establish legal eligibility: its resource proxy omits assets, deemed income and deductions. Respondents may misreport income and receipt. Cross-sectional data cannot establish the order of events. Few events, unresolved screening, missing strata and resampling fixed predictions without refitting limit inference. Household sampling excludes institutionalised older adults. Participant usability and performance elsewhere remain untested.</w:t>
+        <w:t xml:space="preserve">The survey cannot establish legal eligibility: its resource proxy omits assets, deemed income and deductions. Respondents may misreport income and receipt. Cross-sectional data cannot establish the order of events. Few events, unresolved screening, missing strata and resampling fixed predictions without refitting limit inference. Household sampling excludes institutionalised older adults. Participant usability and performance elsewhere remain untested.
+</w:t>
       </w:r>
     </w:p>
     <w:p>
@@ -13222,7 +13341,8 @@
           <w:sz w:val="20"/>
           <w:szCs w:val="20"/>
         </w:rPr>
-        <w:t xml:space="preserve">Survey access conditions and disclosure requirements apply. Interface demonstrations and tests use synthetic records. The downloadable package excludes survey records. Displays and reports omit submitted identifiers and raw income. These controls do not establish disclosure review of every historical repository file. The project records contain no DUT (Durban University of Technology) ethics determination. The paper therefore claims no approval. The app explains measurement choices; it neither decides grants nor ranks named applicants.</w:t>
+        <w:t xml:space="preserve">Survey access conditions and disclosure requirements apply. Interface demonstrations and tests use synthetic records. The downloadable package excludes survey records. Displays and reports omit submitted identifiers and raw income. These controls do not establish disclosure review of every historical repository file. The project records contain no DUT (Durban University of Technology) ethics determination. The paper therefore claims no approval. The app explains measurement choices; it neither decides grants nor ranks named applicants.
+</w:t>
       </w:r>
     </w:p>
     <w:p>
@@ -13250,7 +13370,8 @@
           <w:sz w:val="20"/>
           <w:szCs w:val="20"/>
         </w:rPr>
-        <w:t xml:space="preserve">VIII. Conclusion</w:t>
+        <w:t xml:space="preserve">VIII. Conclusion
+</w:t>
       </w:r>
     </w:p>
     <w:p>
@@ -13298,7 +13419,7 @@
     <w:p>
       <w:pPr>
         <w:keepLines/>
-        <w:spacing w:after="20" w:before="0" w:line="190"/>
+        <w:spacing w:after="0" w:before="0" w:line="160"/>
         <w:ind w:left="260" w:hanging="260"/>
         <w:jc w:val="left"/>
         <w:rPr>
@@ -13318,7 +13439,7 @@
     <w:p>
       <w:pPr>
         <w:keepLines/>
-        <w:spacing w:after="20" w:before="0" w:line="190"/>
+        <w:spacing w:after="0" w:before="0" w:line="160"/>
         <w:ind w:left="260" w:hanging="260"/>
         <w:jc w:val="left"/>
         <w:rPr>
@@ -13338,7 +13459,7 @@
     <w:p>
       <w:pPr>
         <w:keepLines/>
-        <w:spacing w:after="20" w:before="0" w:line="190"/>
+        <w:spacing w:after="0" w:before="0" w:line="160"/>
         <w:ind w:left="260" w:hanging="260"/>
         <w:jc w:val="left"/>
         <w:rPr>
@@ -13358,7 +13479,7 @@
     <w:p>
       <w:pPr>
         <w:keepLines/>
-        <w:spacing w:after="20" w:before="0" w:line="190"/>
+        <w:spacing w:after="0" w:before="0" w:line="160"/>
         <w:ind w:left="260" w:hanging="260"/>
         <w:jc w:val="left"/>
         <w:rPr>
@@ -13378,7 +13499,7 @@
     <w:p>
       <w:pPr>
         <w:keepLines/>
-        <w:spacing w:after="20" w:before="0" w:line="190"/>
+        <w:spacing w:after="0" w:before="0" w:line="160"/>
         <w:ind w:left="260" w:hanging="260"/>
         <w:jc w:val="left"/>
         <w:rPr>
@@ -13398,7 +13519,7 @@
     <w:p>
       <w:pPr>
         <w:keepLines/>
-        <w:spacing w:after="20" w:before="0" w:line="190"/>
+        <w:spacing w:after="0" w:before="0" w:line="160"/>
         <w:ind w:left="260" w:hanging="260"/>
         <w:jc w:val="left"/>
         <w:rPr>
@@ -13418,7 +13539,7 @@
     <w:p>
       <w:pPr>
         <w:keepLines/>
-        <w:spacing w:after="20" w:before="0" w:line="190"/>
+        <w:spacing w:after="0" w:before="0" w:line="160"/>
         <w:ind w:left="260" w:hanging="260"/>
         <w:jc w:val="left"/>
         <w:rPr>
@@ -13438,7 +13559,7 @@
     <w:p>
       <w:pPr>
         <w:keepLines/>
-        <w:spacing w:after="20" w:before="0" w:line="190"/>
+        <w:spacing w:after="0" w:before="0" w:line="160"/>
         <w:ind w:left="260" w:hanging="260"/>
         <w:jc w:val="left"/>
         <w:rPr>
@@ -13458,7 +13579,7 @@
     <w:p>
       <w:pPr>
         <w:keepLines/>
-        <w:spacing w:after="20" w:before="0" w:line="190"/>
+        <w:spacing w:after="0" w:before="0" w:line="160"/>
         <w:ind w:left="260" w:hanging="260"/>
         <w:jc w:val="left"/>
         <w:rPr>
@@ -13478,7 +13599,7 @@
     <w:p>
       <w:pPr>
         <w:keepLines/>
-        <w:spacing w:after="20" w:before="0" w:line="190"/>
+        <w:spacing w:after="0" w:before="0" w:line="160"/>
         <w:ind w:left="260" w:hanging="260"/>
         <w:jc w:val="left"/>
         <w:rPr>
@@ -13498,7 +13619,7 @@
     <w:p>
       <w:pPr>
         <w:keepLines/>
-        <w:spacing w:after="20" w:before="0" w:line="190"/>
+        <w:spacing w:after="0" w:before="0" w:line="160"/>
         <w:ind w:left="260" w:hanging="260"/>
         <w:jc w:val="left"/>
         <w:rPr>
@@ -13518,7 +13639,7 @@
     <w:p>
       <w:pPr>
         <w:keepLines/>
-        <w:spacing w:after="20" w:before="0" w:line="190"/>
+        <w:spacing w:after="0" w:before="0" w:line="160"/>
         <w:ind w:left="260" w:hanging="260"/>
         <w:jc w:val="left"/>
         <w:rPr>
@@ -13538,7 +13659,7 @@
     <w:p>
       <w:pPr>
         <w:keepLines/>
-        <w:spacing w:after="20" w:before="0" w:line="190"/>
+        <w:spacing w:after="0" w:before="0" w:line="160"/>
         <w:ind w:left="260" w:hanging="260"/>
         <w:jc w:val="left"/>
         <w:rPr>
@@ -13558,7 +13679,7 @@
     <w:p>
       <w:pPr>
         <w:keepLines/>
-        <w:spacing w:after="20" w:before="0" w:line="190"/>
+        <w:spacing w:after="0" w:before="0" w:line="160"/>
         <w:ind w:left="260" w:hanging="260"/>
         <w:jc w:val="left"/>
         <w:rPr>
@@ -13578,7 +13699,7 @@
     <w:p>
       <w:pPr>
         <w:keepLines/>
-        <w:spacing w:after="20" w:before="0" w:line="190"/>
+        <w:spacing w:after="0" w:before="0" w:line="160"/>
         <w:ind w:left="260" w:hanging="260"/>
         <w:jc w:val="left"/>
         <w:rPr>
@@ -13598,7 +13719,7 @@
     <w:p>
       <w:pPr>
         <w:keepLines/>
-        <w:spacing w:after="20" w:before="0" w:line="190"/>
+        <w:spacing w:after="0" w:before="0" w:line="160"/>
         <w:ind w:left="260" w:hanging="260"/>
         <w:jc w:val="left"/>
         <w:rPr>
@@ -13618,7 +13739,7 @@
     <w:p>
       <w:pPr>
         <w:keepLines/>
-        <w:spacing w:after="20" w:before="0" w:line="190"/>
+        <w:spacing w:after="0" w:before="0" w:line="160"/>
         <w:ind w:left="260" w:hanging="260"/>
         <w:jc w:val="left"/>
         <w:rPr>
@@ -13638,7 +13759,7 @@
     <w:p>
       <w:pPr>
         <w:keepLines/>
-        <w:spacing w:after="20" w:before="0" w:line="190"/>
+        <w:spacing w:after="0" w:before="0" w:line="160"/>
         <w:ind w:left="260" w:hanging="260"/>
         <w:jc w:val="left"/>
         <w:rPr>
@@ -13658,7 +13779,7 @@
     <w:p>
       <w:pPr>
         <w:keepLines/>
-        <w:spacing w:after="20" w:before="0" w:line="190"/>
+        <w:spacing w:after="0" w:before="0" w:line="160"/>
         <w:ind w:left="260" w:hanging="260"/>
         <w:jc w:val="left"/>
         <w:rPr>
@@ -13678,7 +13799,7 @@
     <w:p>
       <w:pPr>
         <w:keepLines/>
-        <w:spacing w:after="20" w:before="0" w:line="190"/>
+        <w:spacing w:after="0" w:before="0" w:line="160"/>
         <w:ind w:left="260" w:hanging="260"/>
         <w:jc w:val="left"/>
         <w:rPr>
@@ -13698,7 +13819,7 @@
     <w:p>
       <w:pPr>
         <w:keepLines/>
-        <w:spacing w:after="20" w:before="0" w:line="190"/>
+        <w:spacing w:after="0" w:before="0" w:line="160"/>
         <w:ind w:left="260" w:hanging="260"/>
         <w:jc w:val="left"/>
         <w:rPr>
@@ -13718,7 +13839,7 @@
     <w:p>
       <w:pPr>
         <w:keepLines/>
-        <w:spacing w:after="20" w:before="0" w:line="190"/>
+        <w:spacing w:after="0" w:before="0" w:line="160"/>
         <w:ind w:left="260" w:hanging="260"/>
         <w:jc w:val="left"/>
         <w:rPr>
@@ -13738,7 +13859,7 @@
     <w:p>
       <w:pPr>
         <w:keepLines/>
-        <w:spacing w:after="20" w:before="0" w:line="190"/>
+        <w:spacing w:after="0" w:before="0" w:line="160"/>
         <w:ind w:left="260" w:hanging="260"/>
         <w:jc w:val="left"/>
         <w:rPr>
@@ -13758,7 +13879,7 @@
     <w:p>
       <w:pPr>
         <w:keepLines/>
-        <w:spacing w:after="20" w:before="0" w:line="190"/>
+        <w:spacing w:after="0" w:before="0" w:line="160"/>
         <w:ind w:left="260" w:hanging="260"/>
         <w:jc w:val="left"/>
         <w:rPr>
@@ -13778,7 +13899,7 @@
     <w:p>
       <w:pPr>
         <w:keepLines/>
-        <w:spacing w:after="20" w:before="0" w:line="190"/>
+        <w:spacing w:after="0" w:before="0" w:line="160"/>
         <w:ind w:left="260" w:hanging="260"/>
         <w:jc w:val="left"/>
         <w:rPr>
@@ -13798,7 +13919,7 @@
     <w:p>
       <w:pPr>
         <w:keepLines/>
-        <w:spacing w:after="20" w:before="0" w:line="190"/>
+        <w:spacing w:after="0" w:before="0" w:line="160"/>
         <w:ind w:left="260" w:hanging="260"/>
         <w:jc w:val="left"/>
         <w:rPr>
@@ -13818,7 +13939,7 @@
     <w:p>
       <w:pPr>
         <w:keepLines/>
-        <w:spacing w:after="20" w:before="0" w:line="190"/>
+        <w:spacing w:after="0" w:before="0" w:line="160"/>
         <w:ind w:left="260" w:hanging="260"/>
         <w:jc w:val="left"/>
         <w:rPr>
@@ -13838,7 +13959,7 @@
     <w:p>
       <w:pPr>
         <w:keepLines/>
-        <w:spacing w:after="20" w:before="0" w:line="190"/>
+        <w:spacing w:after="0" w:before="0" w:line="160"/>
         <w:ind w:left="260" w:hanging="260"/>
         <w:jc w:val="left"/>
         <w:rPr>

</xml_diff>

<commit_message>
Separate technical software checks from usability in Sections IV and VI.C.
Automated checks and the owner walkthrough are technical verification. Participant usability remains untested, and the paper makes no user-experience claim.
</commit_message>
<xml_diff>
--- a/paper/Jawe_OPG_nonreceipt_KZN.docx
+++ b/paper/Jawe_OPG_nonreceipt_KZN.docx
@@ -3932,7 +3932,7 @@
           <w:sz w:val="20"/>
           <w:szCs w:val="20"/>
         </w:rPr>
-        <w:t xml:space="preserve">The local Streamlit app has five sections: study context, upload/validation, eligibility/receipt, prediction/model and export/reproducibility. It accepts historical opg-screen-v1 CSV files, including household members needed to check spouse resources. Validation rejects incorrect schema, study context, duplicate identifiers, categories and numeric values. Limits are 20 MiB and 50,000 rows. Uploads stay in memory during the current session. Reports use generated row labels and omit submitted identifiers, raw income and household links. Users can filter views and exports; summary rates retain all uploaded adults who pass with resolved receipt.
+        <w:t xml:space="preserve">The local Streamlit app has five sections: study context, upload/validation, eligibility/receipt, prediction/model and export/reproducibility. It accepts historical opg-screen-v1 CSV files, including household members needed to check spouse resources. Validation rejects incorrect schema, study context, duplicate identifiers, categories and numeric values. Limits are 20 MiB and 50,000 rows. Uploads stay in memory during the current session. Reports use generated row labels and omit submitted identifiers, raw income and household links. The interface provides filters for views and exports, and summary rates retain all uploaded adults who pass with resolved receipt. Filters, labels and reports are functions of the program. They are not measurements of user experience.
 </w:t>
       </w:r>
     </w:p>
@@ -4028,7 +4028,37 @@
           <w:sz w:val="20"/>
           <w:szCs w:val="20"/>
         </w:rPr>
-        <w:t xml:space="preserve">Software checks compared screening decisions with expected results and tested excluded predictors, links, repeated runs, reports and saved predictions. Further checks compared the CLI (command-line interface) with the UI (user interface), including invalid inputs and outdated results. The owner's Windows walkthrough demonstrated local functionality. A task sheet supports future testing with three to five consenting participants; no participant study has taken place.
+        <w:t xml:space="preserve">Technical verification compares the program with specified expectations. The checks compared screening decisions with expected results and tested excluded predictors, links, repeated runs, reports and saved predictions. Further checks compared the command-line interface with the Streamlit interface, including invalid inputs and outdated results. These tests ask whether the software follows the stated rules and returns the same outputs. They do not ask whether a person finds the screen understandable.
+</w:t>
+      </w:r>
+    </w:p>
+    <w:p>
+      <w:pPr>
+        <w:spacing w:after="80" w:before="0" w:line="230"/>
+        <w:jc w:val="both"/>
+      </w:pPr>
+      <w:r>
+        <w:rPr>
+          <w:rFonts w:ascii="Times New Roman" w:cs="Times New Roman" w:eastAsia="Times New Roman" w:hAnsi="Times New Roman"/>
+          <w:sz w:val="20"/>
+          <w:szCs w:val="20"/>
+        </w:rPr>
+        <w:t xml:space="preserve">The owner's Windows walkthrough belongs to that technical record. The author ran the synthetic workflow on the local installation, and the exported files were compared with expected contents. The result shows that this installation produced the specified reports. The author is not an independent participant, and the walkthrough does not measure ease, errors or acceptance by someone else.
+</w:t>
+      </w:r>
+    </w:p>
+    <w:p>
+      <w:pPr>
+        <w:spacing w:after="80" w:before="0" w:line="230"/>
+        <w:jc w:val="both"/>
+      </w:pPr>
+      <w:r>
+        <w:rPr>
+          <w:rFonts w:ascii="Times New Roman" w:cs="Times New Roman" w:eastAsia="Times New Roman" w:hAnsi="Times New Roman"/>
+          <w:sz w:val="20"/>
+          <w:szCs w:val="20"/>
+        </w:rPr>
+        <w:t xml:space="preserve">Usability evaluation is a separate study. It would ask people other than the developer to attempt set tasks and would record completion, time taken, errors, ease and any assistance given. A protocol for three to five consenting users, restricted to synthetic records, has been written and has not been used. No participant has been recruited. No task time, error count, ease rating or acceptance result exists. Participant usability remains untested. Automated interface checks and the owner walkthrough do not fill that gap. An automated Streamlit test checks program state. It is not a session with a nontechnical participant.
 </w:t>
       </w:r>
     </w:p>
@@ -13164,7 +13194,7 @@
           <w:sz w:val="20"/>
           <w:szCs w:val="20"/>
         </w:rPr>
-        <w:t xml:space="preserve">C. Reproducibility and usability
+        <w:t xml:space="preserve">C. Technical verification, separate from usability
 </w:t>
       </w:r>
     </w:p>
@@ -13179,7 +13209,7 @@
           <w:sz w:val="20"/>
           <w:szCs w:val="20"/>
         </w:rPr>
-        <w:t xml:space="preserve">RQ3 has six evidence layers. Synthetic cases check rule decisions; matching file contents check repeatability; UI–CLI agreement checks software paths; JSON reload checks saved-model predictions. The owner walkthrough checks a synthetic workflow; participant testing would assess human usability. Table IX supports the first five within tested conditions. Automated agreement cannot establish independent user ease, acceptance or field success. Saved sources and run/validation reports document versions, checksums and test conditions.
+        <w:t xml:space="preserve">RQ3 asks whether the tool can repeat the analysis and clearly explain screening decisions and model results. The completed evidence concerns repetition and the presence of those explanations in the program. It does not show that an independent person finds the explanations clear.
 </w:t>
       </w:r>
     </w:p>
@@ -13194,7 +13224,37 @@
           <w:sz w:val="20"/>
           <w:szCs w:val="20"/>
         </w:rPr>
-        <w:t xml:space="preserve">The app separates historical OOF results from uploaded scores; uploads may overlap training data. Matching saved scores checks reloading, not new predictive accuracy. The software exposes its computations, but representative user clarity remains untested. The task sheet supports future testing.
+        <w:t xml:space="preserve">Table IX keeps the technical checks separate from the usability row. Synthetic cases compare rule decisions with specified outcomes. Matching file contents check that a repeated run produces the same outputs. Agreement between the interface and the command checks that both paths select the same people and return the same decisions, receipt, reasons and scores. Reloading the saved model checks that stored predictions are preserved. That reload is not a new estimate of predictive accuracy. The owner walkthrough checks that the author could run the synthetic workflow locally and that the exported files matched the programmed comparisons. Saved sources and validation reports document versions, checksums and test conditions. Together, these layers support technical correctness and repeatability inside the tests that were run.
+</w:t>
+      </w:r>
+    </w:p>
+    <w:p>
+      <w:pPr>
+        <w:spacing w:after="80" w:before="0" w:line="230"/>
+        <w:jc w:val="both"/>
+      </w:pPr>
+      <w:r>
+        <w:rPr>
+          <w:rFonts w:ascii="Times New Roman" w:cs="Times New Roman" w:eastAsia="Times New Roman" w:hAnsi="Times New Roman"/>
+          <w:sz w:val="20"/>
+          <w:szCs w:val="20"/>
+        </w:rPr>
+        <w:t xml:space="preserve">The application keeps historical out-of-fold results separate from scores for an uploaded file. An upload may overlap the training data. A matching reloaded score confirms the stored model. It does not show how the model would perform for new people, and it does not show that a user understands the distinction.
+</w:t>
+      </w:r>
+    </w:p>
+    <w:p>
+      <w:pPr>
+        <w:spacing w:after="80" w:before="0" w:line="230"/>
+        <w:jc w:val="both"/>
+      </w:pPr>
+      <w:r>
+        <w:rPr>
+          <w:rFonts w:ascii="Times New Roman" w:cs="Times New Roman" w:eastAsia="Times New Roman" w:hAnsi="Times New Roman"/>
+          <w:sz w:val="20"/>
+          <w:szCs w:val="20"/>
+        </w:rPr>
+        <w:t xml:space="preserve">None of these checks is a usability evaluation. A usability study would recruit people other than the developer, give them the prepared tasks, and record completion, time, errors, ease and assistance. That protocol has not been used. Participant usability remains untested. The paper therefore makes no claim about user experience, ease of use, acceptance or success in ordinary work. An automated Streamlit test checks the program. The owner's own run cannot substitute for an independent participant.
 </w:t>
       </w:r>
     </w:p>

</xml_diff>

<commit_message>
Clarify how Tables IV-VIII report counts, estimates and uncertainty.
Nested counts, group composition and performance point estimates are labelled. The survey approximation, fixed-prediction intervals and Wald intervals stay separate. No result value changed.
</commit_message>
<xml_diff>
--- a/paper/Jawe_OPG_nonreceipt_KZN.docx
+++ b/paper/Jawe_OPG_nonreceipt_KZN.docx
@@ -4131,7 +4131,7 @@
           <w:sz w:val="20"/>
           <w:szCs w:val="20"/>
         </w:rPr>
-        <w:t xml:space="preserve">The survey included 15,388 people in 3,686 KwaZulu-Natal households. Table IV shows the selection steps. Among 117 failures, 93 exceeded the income ceiling and 25 reported a disability grant; one met both conditions. None reported a war-veterans grant. Among 187 unresolved adults, 105 were married, mostly with a non-resident spouse, and 63 reported living together. Unresolved adults outnumbered non-recipients.
+        <w:t xml:space="preserve">The survey included 15,388 people in 3,686 KwaZulu-Natal households. Table IV shows the selection steps. People aged 60 or older equal the failed, unresolved and passed rows. Reported receipt and non-receipt divide the passed row. Households are counted inside each row, and one household can contribute to more than one row. Among 117 failures, 93 exceeded the income ceiling and 25 reported a disability grant; one met both conditions. None reported a war-veterans grant. Among 187 unresolved adults, 105 were married, mostly with a non-resident spouse, and 63 reported living together. Unresolved adults outnumbered non-recipients.
 </w:t>
       </w:r>
     </w:p>
@@ -5225,7 +5225,7 @@
           <w:sz w:val="16"/>
           <w:szCs w:val="16"/>
         </w:rPr>
-        <w:t xml:space="preserve">Each row counts distinct households. A household can appear in several rows.
+        <w:t xml:space="preserve">People aged 60 or older equal 117 + 187 + 1,013. The passed row equals 946 + 67. Adding every people cell would count the same adults more than once. Each household cell counts distinct households in that row. Those cells do not follow the people partition.
 </w:t>
       </w:r>
     </w:p>
@@ -5306,7 +5306,7 @@
           <w:sz w:val="20"/>
           <w:szCs w:val="20"/>
         </w:rPr>
-        <w:t xml:space="preserve">Of these 1,013 adults, 67 reported non-receipt: 6.61% without weights and 7.49% with person weights. The calculation used 345 derived PSUs and gave a standard error of 1.3 percentage points. A bell-shaped sampling approximation gave a 95% confidence interval of 4.9%–10.0%. Missing strata limit this approximation. All 1,013 PASS answers agreed with preceding-year OPG income, so those checks changed nothing. Table V compares five predictors before filling missing values. Average age and percentages describe each receipt group. The percentages describe receipt-group composition, not non-receipt rates or predictions.
+        <w:t xml:space="preserve">Of these 1,013 adults, 67 reported non-receipt: 6.61% without weights and 7.49% with person weights. The calculation used 345 derived PSUs and gave a standard error of 1.3 percentage points. A bell-shaped sampling approximation gave a 95% confidence interval of 4.9%–10.0%. Missing strata limit this approximation. It is not a design-based confidence interval, and it does not apply to Tables V–VIII. All 1,013 PASS answers agreed with preceding-year OPG income, so those checks changed nothing. Table V compares five predictors before filling missing values. Average age and percentages describe each receipt group. The percentages describe receipt-group composition, not non-receipt rates or predictions. Table V reports no standard errors.
 </w:t>
       </w:r>
     </w:p>
@@ -5326,7 +5326,7 @@
           <w:sz w:val="16"/>
           <w:szCs w:val="16"/>
         </w:rPr>
-        <w:t xml:space="preserve">Table V. Characteristics by receipt (U = unweighted; W = person-weighted)
+        <w:t xml:space="preserve">Table V. Characteristics by receipt, before filling missing values
 </w:t>
       </w:r>
     </w:p>
@@ -5344,9 +5344,9 @@
         <w:tblLayout w:type="fixed"/>
       </w:tblPr>
       <w:tblGrid>
-        <w:gridCol w:w="2120"/>
-        <w:gridCol w:w="1460"/>
-        <w:gridCol w:w="1460"/>
+        <w:gridCol w:w="1640"/>
+        <w:gridCol w:w="1700"/>
+        <w:gridCol w:w="1700"/>
       </w:tblGrid>
       <w:tr>
         <w:trPr>
@@ -5355,7 +5355,7 @@
         </w:trPr>
         <w:tc>
           <w:tcPr>
-            <w:tcW w:type="dxa" w:w="2120"/>
+            <w:tcW w:type="dxa" w:w="1640"/>
             <w:tcBorders>
               <w:top w:val="single" w:color="808080" w:sz="4"/>
               <w:left w:val="single" w:color="808080" w:sz="4"/>
@@ -5396,7 +5396,7 @@
         </w:tc>
         <w:tc>
           <w:tcPr>
-            <w:tcW w:type="dxa" w:w="1460"/>
+            <w:tcW w:type="dxa" w:w="1700"/>
             <w:tcBorders>
               <w:top w:val="single" w:color="808080" w:sz="4"/>
               <w:left w:val="single" w:color="808080" w:sz="4"/>
@@ -5431,13 +5431,13 @@
                 <w:sz w:val="18"/>
                 <w:szCs w:val="18"/>
               </w:rPr>
-              <w:t xml:space="preserve">Recipients: U; W</w:t>
-            </w:r>
-          </w:p>
-        </w:tc>
-        <w:tc>
-          <w:tcPr>
-            <w:tcW w:type="dxa" w:w="1460"/>
+              <w:t xml:space="preserve">Recipients</w:t>
+            </w:r>
+          </w:p>
+        </w:tc>
+        <w:tc>
+          <w:tcPr>
+            <w:tcW w:type="dxa" w:w="1700"/>
             <w:tcBorders>
               <w:top w:val="single" w:color="808080" w:sz="4"/>
               <w:left w:val="single" w:color="808080" w:sz="4"/>
@@ -5472,7 +5472,7 @@
                 <w:sz w:val="18"/>
                 <w:szCs w:val="18"/>
               </w:rPr>
-              <w:t xml:space="preserve">Non-recipients: U; W</w:t>
+              <w:t xml:space="preserve">Non-recipients</w:t>
             </w:r>
           </w:p>
         </w:tc>
@@ -5484,7 +5484,7 @@
         </w:trPr>
         <w:tc>
           <w:tcPr>
-            <w:tcW w:type="dxa" w:w="2120"/>
+            <w:tcW w:type="dxa" w:w="1640"/>
             <w:tcBorders>
               <w:top w:val="single" w:color="808080" w:sz="4"/>
               <w:left w:val="single" w:color="808080" w:sz="4"/>
@@ -5525,7 +5525,7 @@
         </w:tc>
         <w:tc>
           <w:tcPr>
-            <w:tcW w:type="dxa" w:w="1460"/>
+            <w:tcW w:type="dxa" w:w="1700"/>
             <w:tcBorders>
               <w:top w:val="single" w:color="808080" w:sz="4"/>
               <w:left w:val="single" w:color="808080" w:sz="4"/>
@@ -5566,7 +5566,7 @@
         </w:tc>
         <w:tc>
           <w:tcPr>
-            <w:tcW w:type="dxa" w:w="1460"/>
+            <w:tcW w:type="dxa" w:w="1700"/>
             <w:tcBorders>
               <w:top w:val="single" w:color="808080" w:sz="4"/>
               <w:left w:val="single" w:color="808080" w:sz="4"/>
@@ -5613,7 +5613,7 @@
         </w:trPr>
         <w:tc>
           <w:tcPr>
-            <w:tcW w:type="dxa" w:w="2120"/>
+            <w:tcW w:type="dxa" w:w="1640"/>
             <w:tcBorders>
               <w:top w:val="single" w:color="808080" w:sz="4"/>
               <w:left w:val="single" w:color="808080" w:sz="4"/>
@@ -5654,7 +5654,7 @@
         </w:tc>
         <w:tc>
           <w:tcPr>
-            <w:tcW w:type="dxa" w:w="1460"/>
+            <w:tcW w:type="dxa" w:w="1700"/>
             <w:tcBorders>
               <w:top w:val="single" w:color="808080" w:sz="4"/>
               <w:left w:val="single" w:color="808080" w:sz="4"/>
@@ -5695,7 +5695,7 @@
         </w:tc>
         <w:tc>
           <w:tcPr>
-            <w:tcW w:type="dxa" w:w="1460"/>
+            <w:tcW w:type="dxa" w:w="1700"/>
             <w:tcBorders>
               <w:top w:val="single" w:color="808080" w:sz="4"/>
               <w:left w:val="single" w:color="808080" w:sz="4"/>
@@ -5742,7 +5742,7 @@
         </w:trPr>
         <w:tc>
           <w:tcPr>
-            <w:tcW w:type="dxa" w:w="2120"/>
+            <w:tcW w:type="dxa" w:w="1640"/>
             <w:tcBorders>
               <w:top w:val="single" w:color="808080" w:sz="4"/>
               <w:left w:val="single" w:color="808080" w:sz="4"/>
@@ -5783,7 +5783,7 @@
         </w:tc>
         <w:tc>
           <w:tcPr>
-            <w:tcW w:type="dxa" w:w="1460"/>
+            <w:tcW w:type="dxa" w:w="1700"/>
             <w:tcBorders>
               <w:top w:val="single" w:color="808080" w:sz="4"/>
               <w:left w:val="single" w:color="808080" w:sz="4"/>
@@ -5824,7 +5824,7 @@
         </w:tc>
         <w:tc>
           <w:tcPr>
-            <w:tcW w:type="dxa" w:w="1460"/>
+            <w:tcW w:type="dxa" w:w="1700"/>
             <w:tcBorders>
               <w:top w:val="single" w:color="808080" w:sz="4"/>
               <w:left w:val="single" w:color="808080" w:sz="4"/>
@@ -5871,7 +5871,7 @@
         </w:trPr>
         <w:tc>
           <w:tcPr>
-            <w:tcW w:type="dxa" w:w="2120"/>
+            <w:tcW w:type="dxa" w:w="1640"/>
             <w:tcBorders>
               <w:top w:val="single" w:color="808080" w:sz="4"/>
               <w:left w:val="single" w:color="808080" w:sz="4"/>
@@ -5912,7 +5912,7 @@
         </w:tc>
         <w:tc>
           <w:tcPr>
-            <w:tcW w:type="dxa" w:w="1460"/>
+            <w:tcW w:type="dxa" w:w="1700"/>
             <w:tcBorders>
               <w:top w:val="single" w:color="808080" w:sz="4"/>
               <w:left w:val="single" w:color="808080" w:sz="4"/>
@@ -5953,7 +5953,7 @@
         </w:tc>
         <w:tc>
           <w:tcPr>
-            <w:tcW w:type="dxa" w:w="1460"/>
+            <w:tcW w:type="dxa" w:w="1700"/>
             <w:tcBorders>
               <w:top w:val="single" w:color="808080" w:sz="4"/>
               <w:left w:val="single" w:color="808080" w:sz="4"/>
@@ -6000,7 +6000,7 @@
         </w:trPr>
         <w:tc>
           <w:tcPr>
-            <w:tcW w:type="dxa" w:w="2120"/>
+            <w:tcW w:type="dxa" w:w="1640"/>
             <w:tcBorders>
               <w:top w:val="single" w:color="808080" w:sz="4"/>
               <w:left w:val="single" w:color="808080" w:sz="4"/>
@@ -6035,13 +6035,13 @@
                 <w:sz w:val="18"/>
                 <w:szCs w:val="18"/>
               </w:rPr>
-              <w:t xml:space="preserve">Welfare office ≥5 km/unavailable</w:t>
-            </w:r>
-          </w:p>
-        </w:tc>
-        <w:tc>
-          <w:tcPr>
-            <w:tcW w:type="dxa" w:w="1460"/>
+              <w:t xml:space="preserve">Office ≥5 km or unavailable</w:t>
+            </w:r>
+          </w:p>
+        </w:tc>
+        <w:tc>
+          <w:tcPr>
+            <w:tcW w:type="dxa" w:w="1700"/>
             <w:tcBorders>
               <w:top w:val="single" w:color="808080" w:sz="4"/>
               <w:left w:val="single" w:color="808080" w:sz="4"/>
@@ -6082,7 +6082,7 @@
         </w:tc>
         <w:tc>
           <w:tcPr>
-            <w:tcW w:type="dxa" w:w="1460"/>
+            <w:tcW w:type="dxa" w:w="1700"/>
             <w:tcBorders>
               <w:top w:val="single" w:color="808080" w:sz="4"/>
               <w:left w:val="single" w:color="808080" w:sz="4"/>
@@ -6142,7 +6142,7 @@
           <w:sz w:val="16"/>
           <w:szCs w:val="16"/>
         </w:rPr>
-        <w:t xml:space="preserve">Recipients: 946 people; non-recipients: 67 people. U gives unweighted averages, or counts and percentages within each group. W gives person-weighted averages/percentages. Denominators retain missing predictors: three recipients lack schooling; 14 recipients/four non-recipients lack welfare-access values. These summaries have no uncertainty intervals.
+        <w:t xml:space="preserve">Recipients: 946 people. Non-recipients: 67 people. Each cell gives the unweighted figure, then the person-weighted figure. A category cell gives an unweighted count and percentage inside that receipt group, then the weighted percentage. These percentages describe the composition of each group. They are not non-receipt rates and they are not predictions. Three recipients lack schooling. Fourteen recipients and four non-recipients lack an office-distance value. Those adults remain in the group denominators. This table has no uncertainty intervals.
 </w:t>
       </w:r>
     </w:p>
@@ -6157,7 +6157,7 @@
           <w:sz w:val="20"/>
           <w:szCs w:val="20"/>
         </w:rPr>
-        <w:t xml:space="preserve">Non-recipients were younger before weighting, more often men, more educated and more often urban formal residents. Weights brought average ages closer.
+        <w:t xml:space="preserve">In the unweighted figures, non-recipients had a lower average age and were more often men, educated to Grade 7 or above, and living in urban formal settlements. Weighting brought the average ages closer. These are descriptions of the two groups. Table V does not test the differences.
 </w:t>
       </w:r>
     </w:p>
@@ -6201,7 +6201,7 @@
           <w:sz w:val="20"/>
           <w:szCs w:val="20"/>
         </w:rPr>
-        <w:t xml:space="preserve">Table VI reports each scenario’s denominator and non-receipt events. Unw. and Wtd. abbreviate unweighted and person-weighted. Slope means calibration slope in Tables VI and VIII. Compared with S0, S1b/S1d added two people/two events. S2a, S2b, S2c and S2d added 59/4, 60/2, 8/0 and 68/2 people/events. S3 added 19 people/15 events; S4b removed six people but no events. Weighted non-receipt ranged from 7.12% to 9.06%.
+        <w:t xml:space="preserve">Table VI reports each scenario's denominator and non-receipt events. Unw. and Wtd. abbreviate unweighted and person-weighted non-receipt. Slope means calibration slope in Tables VI and VIII. Compared with S0, S1b/S1d added two people/two events. S2a, S2b, S2c and S2d added 59/4, 60/2, 8/0 and 68/2 people/events. S3 added 19 people/15 events; S4b removed six people but no events. Weighted non-receipt ranged from 7.12% to 9.06%. Held-out AUC in this table runs from 0.736 to 0.763. Brier and calibration slope also change. AUC, Brier and slope are point estimates, and the table gives them no intervals. A close AUC does not make the screened groups the same population, and it does not show which rule predicts better.
 </w:t>
       </w:r>
     </w:p>
@@ -6221,7 +6221,7 @@
           <w:sz w:val="16"/>
           <w:szCs w:val="16"/>
         </w:rPr>
-        <w:t xml:space="preserve">Table VI. Changed screening rules and OOF performance
+        <w:t xml:space="preserve">Table VI. Screening changes, non-receipt rates and held-out point estimates
 </w:t>
       </w:r>
     </w:p>
@@ -6239,13 +6239,13 @@
         <w:tblLayout w:type="fixed"/>
       </w:tblPr>
       <w:tblGrid>
-        <w:gridCol w:w="540"/>
-        <w:gridCol w:w="760"/>
-        <w:gridCol w:w="650"/>
-        <w:gridCol w:w="650"/>
         <w:gridCol w:w="700"/>
-        <w:gridCol w:w="900"/>
-        <w:gridCol w:w="840"/>
+        <w:gridCol w:w="980"/>
+        <w:gridCol w:w="640"/>
+        <w:gridCol w:w="640"/>
+        <w:gridCol w:w="680"/>
+        <w:gridCol w:w="720"/>
+        <w:gridCol w:w="680"/>
       </w:tblGrid>
       <w:tr>
         <w:trPr>
@@ -6254,7 +6254,7 @@
         </w:trPr>
         <w:tc>
           <w:tcPr>
-            <w:tcW w:type="dxa" w:w="540"/>
+            <w:tcW w:type="dxa" w:w="700"/>
             <w:tcBorders>
               <w:top w:val="single" w:color="808080" w:sz="4"/>
               <w:left w:val="single" w:color="808080" w:sz="4"/>
@@ -6295,7 +6295,7 @@
         </w:tc>
         <w:tc>
           <w:tcPr>
-            <w:tcW w:type="dxa" w:w="760"/>
+            <w:tcW w:type="dxa" w:w="980"/>
             <w:tcBorders>
               <w:top w:val="single" w:color="808080" w:sz="4"/>
               <w:left w:val="single" w:color="808080" w:sz="4"/>
@@ -6336,7 +6336,7 @@
         </w:tc>
         <w:tc>
           <w:tcPr>
-            <w:tcW w:type="dxa" w:w="650"/>
+            <w:tcW w:type="dxa" w:w="640"/>
             <w:tcBorders>
               <w:top w:val="single" w:color="808080" w:sz="4"/>
               <w:left w:val="single" w:color="808080" w:sz="4"/>
@@ -6371,13 +6371,13 @@
                 <w:sz w:val="18"/>
                 <w:szCs w:val="18"/>
               </w:rPr>
-              <w:t xml:space="preserve">Unw.%</w:t>
-            </w:r>
-          </w:p>
-        </w:tc>
-        <w:tc>
-          <w:tcPr>
-            <w:tcW w:type="dxa" w:w="650"/>
+              <w:t xml:space="preserve">Unw.</w:t>
+            </w:r>
+          </w:p>
+        </w:tc>
+        <w:tc>
+          <w:tcPr>
+            <w:tcW w:type="dxa" w:w="640"/>
             <w:tcBorders>
               <w:top w:val="single" w:color="808080" w:sz="4"/>
               <w:left w:val="single" w:color="808080" w:sz="4"/>
@@ -6412,13 +6412,13 @@
                 <w:sz w:val="18"/>
                 <w:szCs w:val="18"/>
               </w:rPr>
-              <w:t xml:space="preserve">Wtd.%</w:t>
-            </w:r>
-          </w:p>
-        </w:tc>
-        <w:tc>
-          <w:tcPr>
-            <w:tcW w:type="dxa" w:w="700"/>
+              <w:t xml:space="preserve">Wtd.</w:t>
+            </w:r>
+          </w:p>
+        </w:tc>
+        <w:tc>
+          <w:tcPr>
+            <w:tcW w:type="dxa" w:w="680"/>
             <w:tcBorders>
               <w:top w:val="single" w:color="808080" w:sz="4"/>
               <w:left w:val="single" w:color="808080" w:sz="4"/>
@@ -6459,7 +6459,7 @@
         </w:tc>
         <w:tc>
           <w:tcPr>
-            <w:tcW w:type="dxa" w:w="900"/>
+            <w:tcW w:type="dxa" w:w="720"/>
             <w:tcBorders>
               <w:top w:val="single" w:color="808080" w:sz="4"/>
               <w:left w:val="single" w:color="808080" w:sz="4"/>
@@ -6500,7 +6500,7 @@
         </w:tc>
         <w:tc>
           <w:tcPr>
-            <w:tcW w:type="dxa" w:w="840"/>
+            <w:tcW w:type="dxa" w:w="680"/>
             <w:tcBorders>
               <w:top w:val="single" w:color="808080" w:sz="4"/>
               <w:left w:val="single" w:color="808080" w:sz="4"/>
@@ -6547,7 +6547,7 @@
         </w:trPr>
         <w:tc>
           <w:tcPr>
-            <w:tcW w:type="dxa" w:w="540"/>
+            <w:tcW w:type="dxa" w:w="700"/>
             <w:tcBorders>
               <w:top w:val="single" w:color="808080" w:sz="4"/>
               <w:left w:val="single" w:color="808080" w:sz="4"/>
@@ -6588,7 +6588,7 @@
         </w:tc>
         <w:tc>
           <w:tcPr>
-            <w:tcW w:type="dxa" w:w="760"/>
+            <w:tcW w:type="dxa" w:w="980"/>
             <w:tcBorders>
               <w:top w:val="single" w:color="808080" w:sz="4"/>
               <w:left w:val="single" w:color="808080" w:sz="4"/>
@@ -6629,7 +6629,7 @@
         </w:tc>
         <w:tc>
           <w:tcPr>
-            <w:tcW w:type="dxa" w:w="650"/>
+            <w:tcW w:type="dxa" w:w="640"/>
             <w:tcBorders>
               <w:top w:val="single" w:color="808080" w:sz="4"/>
               <w:left w:val="single" w:color="808080" w:sz="4"/>
@@ -6670,7 +6670,7 @@
         </w:tc>
         <w:tc>
           <w:tcPr>
-            <w:tcW w:type="dxa" w:w="650"/>
+            <w:tcW w:type="dxa" w:w="640"/>
             <w:tcBorders>
               <w:top w:val="single" w:color="808080" w:sz="4"/>
               <w:left w:val="single" w:color="808080" w:sz="4"/>
@@ -6711,7 +6711,7 @@
         </w:tc>
         <w:tc>
           <w:tcPr>
-            <w:tcW w:type="dxa" w:w="700"/>
+            <w:tcW w:type="dxa" w:w="680"/>
             <w:tcBorders>
               <w:top w:val="single" w:color="808080" w:sz="4"/>
               <w:left w:val="single" w:color="808080" w:sz="4"/>
@@ -6752,7 +6752,7 @@
         </w:tc>
         <w:tc>
           <w:tcPr>
-            <w:tcW w:type="dxa" w:w="900"/>
+            <w:tcW w:type="dxa" w:w="720"/>
             <w:tcBorders>
               <w:top w:val="single" w:color="808080" w:sz="4"/>
               <w:left w:val="single" w:color="808080" w:sz="4"/>
@@ -6793,7 +6793,7 @@
         </w:tc>
         <w:tc>
           <w:tcPr>
-            <w:tcW w:type="dxa" w:w="840"/>
+            <w:tcW w:type="dxa" w:w="680"/>
             <w:tcBorders>
               <w:top w:val="single" w:color="808080" w:sz="4"/>
               <w:left w:val="single" w:color="808080" w:sz="4"/>
@@ -6840,7 +6840,7 @@
         </w:trPr>
         <w:tc>
           <w:tcPr>
-            <w:tcW w:type="dxa" w:w="540"/>
+            <w:tcW w:type="dxa" w:w="700"/>
             <w:tcBorders>
               <w:top w:val="single" w:color="808080" w:sz="4"/>
               <w:left w:val="single" w:color="808080" w:sz="4"/>
@@ -6881,7 +6881,7 @@
         </w:tc>
         <w:tc>
           <w:tcPr>
-            <w:tcW w:type="dxa" w:w="760"/>
+            <w:tcW w:type="dxa" w:w="980"/>
             <w:tcBorders>
               <w:top w:val="single" w:color="808080" w:sz="4"/>
               <w:left w:val="single" w:color="808080" w:sz="4"/>
@@ -6922,7 +6922,7 @@
         </w:tc>
         <w:tc>
           <w:tcPr>
-            <w:tcW w:type="dxa" w:w="650"/>
+            <w:tcW w:type="dxa" w:w="640"/>
             <w:tcBorders>
               <w:top w:val="single" w:color="808080" w:sz="4"/>
               <w:left w:val="single" w:color="808080" w:sz="4"/>
@@ -6963,7 +6963,7 @@
         </w:tc>
         <w:tc>
           <w:tcPr>
-            <w:tcW w:type="dxa" w:w="650"/>
+            <w:tcW w:type="dxa" w:w="640"/>
             <w:tcBorders>
               <w:top w:val="single" w:color="808080" w:sz="4"/>
               <w:left w:val="single" w:color="808080" w:sz="4"/>
@@ -7004,7 +7004,7 @@
         </w:tc>
         <w:tc>
           <w:tcPr>
-            <w:tcW w:type="dxa" w:w="700"/>
+            <w:tcW w:type="dxa" w:w="680"/>
             <w:tcBorders>
               <w:top w:val="single" w:color="808080" w:sz="4"/>
               <w:left w:val="single" w:color="808080" w:sz="4"/>
@@ -7045,7 +7045,7 @@
         </w:tc>
         <w:tc>
           <w:tcPr>
-            <w:tcW w:type="dxa" w:w="900"/>
+            <w:tcW w:type="dxa" w:w="720"/>
             <w:tcBorders>
               <w:top w:val="single" w:color="808080" w:sz="4"/>
               <w:left w:val="single" w:color="808080" w:sz="4"/>
@@ -7086,7 +7086,7 @@
         </w:tc>
         <w:tc>
           <w:tcPr>
-            <w:tcW w:type="dxa" w:w="840"/>
+            <w:tcW w:type="dxa" w:w="680"/>
             <w:tcBorders>
               <w:top w:val="single" w:color="808080" w:sz="4"/>
               <w:left w:val="single" w:color="808080" w:sz="4"/>
@@ -7133,7 +7133,7 @@
         </w:trPr>
         <w:tc>
           <w:tcPr>
-            <w:tcW w:type="dxa" w:w="540"/>
+            <w:tcW w:type="dxa" w:w="700"/>
             <w:tcBorders>
               <w:top w:val="single" w:color="808080" w:sz="4"/>
               <w:left w:val="single" w:color="808080" w:sz="4"/>
@@ -7174,7 +7174,7 @@
         </w:tc>
         <w:tc>
           <w:tcPr>
-            <w:tcW w:type="dxa" w:w="760"/>
+            <w:tcW w:type="dxa" w:w="980"/>
             <w:tcBorders>
               <w:top w:val="single" w:color="808080" w:sz="4"/>
               <w:left w:val="single" w:color="808080" w:sz="4"/>
@@ -7215,7 +7215,7 @@
         </w:tc>
         <w:tc>
           <w:tcPr>
-            <w:tcW w:type="dxa" w:w="650"/>
+            <w:tcW w:type="dxa" w:w="640"/>
             <w:tcBorders>
               <w:top w:val="single" w:color="808080" w:sz="4"/>
               <w:left w:val="single" w:color="808080" w:sz="4"/>
@@ -7256,7 +7256,7 @@
         </w:tc>
         <w:tc>
           <w:tcPr>
-            <w:tcW w:type="dxa" w:w="650"/>
+            <w:tcW w:type="dxa" w:w="640"/>
             <w:tcBorders>
               <w:top w:val="single" w:color="808080" w:sz="4"/>
               <w:left w:val="single" w:color="808080" w:sz="4"/>
@@ -7297,7 +7297,7 @@
         </w:tc>
         <w:tc>
           <w:tcPr>
-            <w:tcW w:type="dxa" w:w="700"/>
+            <w:tcW w:type="dxa" w:w="680"/>
             <w:tcBorders>
               <w:top w:val="single" w:color="808080" w:sz="4"/>
               <w:left w:val="single" w:color="808080" w:sz="4"/>
@@ -7338,7 +7338,7 @@
         </w:tc>
         <w:tc>
           <w:tcPr>
-            <w:tcW w:type="dxa" w:w="900"/>
+            <w:tcW w:type="dxa" w:w="720"/>
             <w:tcBorders>
               <w:top w:val="single" w:color="808080" w:sz="4"/>
               <w:left w:val="single" w:color="808080" w:sz="4"/>
@@ -7379,7 +7379,7 @@
         </w:tc>
         <w:tc>
           <w:tcPr>
-            <w:tcW w:type="dxa" w:w="840"/>
+            <w:tcW w:type="dxa" w:w="680"/>
             <w:tcBorders>
               <w:top w:val="single" w:color="808080" w:sz="4"/>
               <w:left w:val="single" w:color="808080" w:sz="4"/>
@@ -7426,7 +7426,7 @@
         </w:trPr>
         <w:tc>
           <w:tcPr>
-            <w:tcW w:type="dxa" w:w="540"/>
+            <w:tcW w:type="dxa" w:w="700"/>
             <w:tcBorders>
               <w:top w:val="single" w:color="808080" w:sz="4"/>
               <w:left w:val="single" w:color="808080" w:sz="4"/>
@@ -7467,7 +7467,7 @@
         </w:tc>
         <w:tc>
           <w:tcPr>
-            <w:tcW w:type="dxa" w:w="760"/>
+            <w:tcW w:type="dxa" w:w="980"/>
             <w:tcBorders>
               <w:top w:val="single" w:color="808080" w:sz="4"/>
               <w:left w:val="single" w:color="808080" w:sz="4"/>
@@ -7508,7 +7508,7 @@
         </w:tc>
         <w:tc>
           <w:tcPr>
-            <w:tcW w:type="dxa" w:w="650"/>
+            <w:tcW w:type="dxa" w:w="640"/>
             <w:tcBorders>
               <w:top w:val="single" w:color="808080" w:sz="4"/>
               <w:left w:val="single" w:color="808080" w:sz="4"/>
@@ -7549,7 +7549,7 @@
         </w:tc>
         <w:tc>
           <w:tcPr>
-            <w:tcW w:type="dxa" w:w="650"/>
+            <w:tcW w:type="dxa" w:w="640"/>
             <w:tcBorders>
               <w:top w:val="single" w:color="808080" w:sz="4"/>
               <w:left w:val="single" w:color="808080" w:sz="4"/>
@@ -7590,7 +7590,7 @@
         </w:tc>
         <w:tc>
           <w:tcPr>
-            <w:tcW w:type="dxa" w:w="700"/>
+            <w:tcW w:type="dxa" w:w="680"/>
             <w:tcBorders>
               <w:top w:val="single" w:color="808080" w:sz="4"/>
               <w:left w:val="single" w:color="808080" w:sz="4"/>
@@ -7631,7 +7631,7 @@
         </w:tc>
         <w:tc>
           <w:tcPr>
-            <w:tcW w:type="dxa" w:w="900"/>
+            <w:tcW w:type="dxa" w:w="720"/>
             <w:tcBorders>
               <w:top w:val="single" w:color="808080" w:sz="4"/>
               <w:left w:val="single" w:color="808080" w:sz="4"/>
@@ -7672,7 +7672,7 @@
         </w:tc>
         <w:tc>
           <w:tcPr>
-            <w:tcW w:type="dxa" w:w="840"/>
+            <w:tcW w:type="dxa" w:w="680"/>
             <w:tcBorders>
               <w:top w:val="single" w:color="808080" w:sz="4"/>
               <w:left w:val="single" w:color="808080" w:sz="4"/>
@@ -7719,7 +7719,7 @@
         </w:trPr>
         <w:tc>
           <w:tcPr>
-            <w:tcW w:type="dxa" w:w="540"/>
+            <w:tcW w:type="dxa" w:w="700"/>
             <w:tcBorders>
               <w:top w:val="single" w:color="808080" w:sz="4"/>
               <w:left w:val="single" w:color="808080" w:sz="4"/>
@@ -7760,7 +7760,7 @@
         </w:tc>
         <w:tc>
           <w:tcPr>
-            <w:tcW w:type="dxa" w:w="760"/>
+            <w:tcW w:type="dxa" w:w="980"/>
             <w:tcBorders>
               <w:top w:val="single" w:color="808080" w:sz="4"/>
               <w:left w:val="single" w:color="808080" w:sz="4"/>
@@ -7801,7 +7801,7 @@
         </w:tc>
         <w:tc>
           <w:tcPr>
-            <w:tcW w:type="dxa" w:w="650"/>
+            <w:tcW w:type="dxa" w:w="640"/>
             <w:tcBorders>
               <w:top w:val="single" w:color="808080" w:sz="4"/>
               <w:left w:val="single" w:color="808080" w:sz="4"/>
@@ -7842,7 +7842,7 @@
         </w:tc>
         <w:tc>
           <w:tcPr>
-            <w:tcW w:type="dxa" w:w="650"/>
+            <w:tcW w:type="dxa" w:w="640"/>
             <w:tcBorders>
               <w:top w:val="single" w:color="808080" w:sz="4"/>
               <w:left w:val="single" w:color="808080" w:sz="4"/>
@@ -7883,7 +7883,7 @@
         </w:tc>
         <w:tc>
           <w:tcPr>
-            <w:tcW w:type="dxa" w:w="700"/>
+            <w:tcW w:type="dxa" w:w="680"/>
             <w:tcBorders>
               <w:top w:val="single" w:color="808080" w:sz="4"/>
               <w:left w:val="single" w:color="808080" w:sz="4"/>
@@ -7924,7 +7924,7 @@
         </w:tc>
         <w:tc>
           <w:tcPr>
-            <w:tcW w:type="dxa" w:w="900"/>
+            <w:tcW w:type="dxa" w:w="720"/>
             <w:tcBorders>
               <w:top w:val="single" w:color="808080" w:sz="4"/>
               <w:left w:val="single" w:color="808080" w:sz="4"/>
@@ -7965,7 +7965,7 @@
         </w:tc>
         <w:tc>
           <w:tcPr>
-            <w:tcW w:type="dxa" w:w="840"/>
+            <w:tcW w:type="dxa" w:w="680"/>
             <w:tcBorders>
               <w:top w:val="single" w:color="808080" w:sz="4"/>
               <w:left w:val="single" w:color="808080" w:sz="4"/>
@@ -8012,7 +8012,7 @@
         </w:trPr>
         <w:tc>
           <w:tcPr>
-            <w:tcW w:type="dxa" w:w="540"/>
+            <w:tcW w:type="dxa" w:w="700"/>
             <w:tcBorders>
               <w:top w:val="single" w:color="808080" w:sz="4"/>
               <w:left w:val="single" w:color="808080" w:sz="4"/>
@@ -8053,7 +8053,7 @@
         </w:tc>
         <w:tc>
           <w:tcPr>
-            <w:tcW w:type="dxa" w:w="760"/>
+            <w:tcW w:type="dxa" w:w="980"/>
             <w:tcBorders>
               <w:top w:val="single" w:color="808080" w:sz="4"/>
               <w:left w:val="single" w:color="808080" w:sz="4"/>
@@ -8094,7 +8094,7 @@
         </w:tc>
         <w:tc>
           <w:tcPr>
-            <w:tcW w:type="dxa" w:w="650"/>
+            <w:tcW w:type="dxa" w:w="640"/>
             <w:tcBorders>
               <w:top w:val="single" w:color="808080" w:sz="4"/>
               <w:left w:val="single" w:color="808080" w:sz="4"/>
@@ -8135,7 +8135,7 @@
         </w:tc>
         <w:tc>
           <w:tcPr>
-            <w:tcW w:type="dxa" w:w="650"/>
+            <w:tcW w:type="dxa" w:w="640"/>
             <w:tcBorders>
               <w:top w:val="single" w:color="808080" w:sz="4"/>
               <w:left w:val="single" w:color="808080" w:sz="4"/>
@@ -8176,7 +8176,7 @@
         </w:tc>
         <w:tc>
           <w:tcPr>
-            <w:tcW w:type="dxa" w:w="700"/>
+            <w:tcW w:type="dxa" w:w="680"/>
             <w:tcBorders>
               <w:top w:val="single" w:color="808080" w:sz="4"/>
               <w:left w:val="single" w:color="808080" w:sz="4"/>
@@ -8217,7 +8217,7 @@
         </w:tc>
         <w:tc>
           <w:tcPr>
-            <w:tcW w:type="dxa" w:w="900"/>
+            <w:tcW w:type="dxa" w:w="720"/>
             <w:tcBorders>
               <w:top w:val="single" w:color="808080" w:sz="4"/>
               <w:left w:val="single" w:color="808080" w:sz="4"/>
@@ -8258,7 +8258,7 @@
         </w:tc>
         <w:tc>
           <w:tcPr>
-            <w:tcW w:type="dxa" w:w="840"/>
+            <w:tcW w:type="dxa" w:w="680"/>
             <w:tcBorders>
               <w:top w:val="single" w:color="808080" w:sz="4"/>
               <w:left w:val="single" w:color="808080" w:sz="4"/>
@@ -8305,7 +8305,7 @@
         </w:trPr>
         <w:tc>
           <w:tcPr>
-            <w:tcW w:type="dxa" w:w="540"/>
+            <w:tcW w:type="dxa" w:w="700"/>
             <w:tcBorders>
               <w:top w:val="single" w:color="808080" w:sz="4"/>
               <w:left w:val="single" w:color="808080" w:sz="4"/>
@@ -8346,7 +8346,7 @@
         </w:tc>
         <w:tc>
           <w:tcPr>
-            <w:tcW w:type="dxa" w:w="760"/>
+            <w:tcW w:type="dxa" w:w="980"/>
             <w:tcBorders>
               <w:top w:val="single" w:color="808080" w:sz="4"/>
               <w:left w:val="single" w:color="808080" w:sz="4"/>
@@ -8387,7 +8387,7 @@
         </w:tc>
         <w:tc>
           <w:tcPr>
-            <w:tcW w:type="dxa" w:w="650"/>
+            <w:tcW w:type="dxa" w:w="640"/>
             <w:tcBorders>
               <w:top w:val="single" w:color="808080" w:sz="4"/>
               <w:left w:val="single" w:color="808080" w:sz="4"/>
@@ -8428,7 +8428,7 @@
         </w:tc>
         <w:tc>
           <w:tcPr>
-            <w:tcW w:type="dxa" w:w="650"/>
+            <w:tcW w:type="dxa" w:w="640"/>
             <w:tcBorders>
               <w:top w:val="single" w:color="808080" w:sz="4"/>
               <w:left w:val="single" w:color="808080" w:sz="4"/>
@@ -8469,7 +8469,7 @@
         </w:tc>
         <w:tc>
           <w:tcPr>
-            <w:tcW w:type="dxa" w:w="700"/>
+            <w:tcW w:type="dxa" w:w="680"/>
             <w:tcBorders>
               <w:top w:val="single" w:color="808080" w:sz="4"/>
               <w:left w:val="single" w:color="808080" w:sz="4"/>
@@ -8510,7 +8510,7 @@
         </w:tc>
         <w:tc>
           <w:tcPr>
-            <w:tcW w:type="dxa" w:w="900"/>
+            <w:tcW w:type="dxa" w:w="720"/>
             <w:tcBorders>
               <w:top w:val="single" w:color="808080" w:sz="4"/>
               <w:left w:val="single" w:color="808080" w:sz="4"/>
@@ -8551,7 +8551,7 @@
         </w:tc>
         <w:tc>
           <w:tcPr>
-            <w:tcW w:type="dxa" w:w="840"/>
+            <w:tcW w:type="dxa" w:w="680"/>
             <w:tcBorders>
               <w:top w:val="single" w:color="808080" w:sz="4"/>
               <w:left w:val="single" w:color="808080" w:sz="4"/>
@@ -8598,7 +8598,7 @@
         </w:trPr>
         <w:tc>
           <w:tcPr>
-            <w:tcW w:type="dxa" w:w="540"/>
+            <w:tcW w:type="dxa" w:w="700"/>
             <w:tcBorders>
               <w:top w:val="single" w:color="808080" w:sz="4"/>
               <w:left w:val="single" w:color="808080" w:sz="4"/>
@@ -8639,7 +8639,7 @@
         </w:tc>
         <w:tc>
           <w:tcPr>
-            <w:tcW w:type="dxa" w:w="760"/>
+            <w:tcW w:type="dxa" w:w="980"/>
             <w:tcBorders>
               <w:top w:val="single" w:color="808080" w:sz="4"/>
               <w:left w:val="single" w:color="808080" w:sz="4"/>
@@ -8680,7 +8680,7 @@
         </w:tc>
         <w:tc>
           <w:tcPr>
-            <w:tcW w:type="dxa" w:w="650"/>
+            <w:tcW w:type="dxa" w:w="640"/>
             <w:tcBorders>
               <w:top w:val="single" w:color="808080" w:sz="4"/>
               <w:left w:val="single" w:color="808080" w:sz="4"/>
@@ -8721,7 +8721,7 @@
         </w:tc>
         <w:tc>
           <w:tcPr>
-            <w:tcW w:type="dxa" w:w="650"/>
+            <w:tcW w:type="dxa" w:w="640"/>
             <w:tcBorders>
               <w:top w:val="single" w:color="808080" w:sz="4"/>
               <w:left w:val="single" w:color="808080" w:sz="4"/>
@@ -8762,7 +8762,7 @@
         </w:tc>
         <w:tc>
           <w:tcPr>
-            <w:tcW w:type="dxa" w:w="700"/>
+            <w:tcW w:type="dxa" w:w="680"/>
             <w:tcBorders>
               <w:top w:val="single" w:color="808080" w:sz="4"/>
               <w:left w:val="single" w:color="808080" w:sz="4"/>
@@ -8803,7 +8803,7 @@
         </w:tc>
         <w:tc>
           <w:tcPr>
-            <w:tcW w:type="dxa" w:w="900"/>
+            <w:tcW w:type="dxa" w:w="720"/>
             <w:tcBorders>
               <w:top w:val="single" w:color="808080" w:sz="4"/>
               <w:left w:val="single" w:color="808080" w:sz="4"/>
@@ -8844,7 +8844,7 @@
         </w:tc>
         <w:tc>
           <w:tcPr>
-            <w:tcW w:type="dxa" w:w="840"/>
+            <w:tcW w:type="dxa" w:w="680"/>
             <w:tcBorders>
               <w:top w:val="single" w:color="808080" w:sz="4"/>
               <w:left w:val="single" w:color="808080" w:sz="4"/>
@@ -8891,7 +8891,7 @@
         </w:trPr>
         <w:tc>
           <w:tcPr>
-            <w:tcW w:type="dxa" w:w="540"/>
+            <w:tcW w:type="dxa" w:w="700"/>
             <w:tcBorders>
               <w:top w:val="single" w:color="808080" w:sz="4"/>
               <w:left w:val="single" w:color="808080" w:sz="4"/>
@@ -8932,7 +8932,7 @@
         </w:tc>
         <w:tc>
           <w:tcPr>
-            <w:tcW w:type="dxa" w:w="760"/>
+            <w:tcW w:type="dxa" w:w="980"/>
             <w:tcBorders>
               <w:top w:val="single" w:color="808080" w:sz="4"/>
               <w:left w:val="single" w:color="808080" w:sz="4"/>
@@ -8973,7 +8973,7 @@
         </w:tc>
         <w:tc>
           <w:tcPr>
-            <w:tcW w:type="dxa" w:w="650"/>
+            <w:tcW w:type="dxa" w:w="640"/>
             <w:tcBorders>
               <w:top w:val="single" w:color="808080" w:sz="4"/>
               <w:left w:val="single" w:color="808080" w:sz="4"/>
@@ -9014,7 +9014,7 @@
         </w:tc>
         <w:tc>
           <w:tcPr>
-            <w:tcW w:type="dxa" w:w="650"/>
+            <w:tcW w:type="dxa" w:w="640"/>
             <w:tcBorders>
               <w:top w:val="single" w:color="808080" w:sz="4"/>
               <w:left w:val="single" w:color="808080" w:sz="4"/>
@@ -9055,7 +9055,7 @@
         </w:tc>
         <w:tc>
           <w:tcPr>
-            <w:tcW w:type="dxa" w:w="700"/>
+            <w:tcW w:type="dxa" w:w="680"/>
             <w:tcBorders>
               <w:top w:val="single" w:color="808080" w:sz="4"/>
               <w:left w:val="single" w:color="808080" w:sz="4"/>
@@ -9096,7 +9096,7 @@
         </w:tc>
         <w:tc>
           <w:tcPr>
-            <w:tcW w:type="dxa" w:w="900"/>
+            <w:tcW w:type="dxa" w:w="720"/>
             <w:tcBorders>
               <w:top w:val="single" w:color="808080" w:sz="4"/>
               <w:left w:val="single" w:color="808080" w:sz="4"/>
@@ -9137,7 +9137,7 @@
         </w:tc>
         <w:tc>
           <w:tcPr>
-            <w:tcW w:type="dxa" w:w="840"/>
+            <w:tcW w:type="dxa" w:w="680"/>
             <w:tcBorders>
               <w:top w:val="single" w:color="808080" w:sz="4"/>
               <w:left w:val="single" w:color="808080" w:sz="4"/>
@@ -9197,7 +9197,7 @@
           <w:sz w:val="16"/>
           <w:szCs w:val="16"/>
         </w:rPr>
-        <w:t xml:space="preserve">Events are reported non-recipients. Unw./Wtd. give unweighted/person-weighted non-receipt rates; performance uses no weights. S1b applies the 2015 ceiling throughout; S1d uses the zero-payout ceiling (the resource level where the grant formula pays zero). S2a/S2b treat living-together adults as couples/single. S2c treats separated adults as single; S2d treats both as single. S3 retains disability/war-veterans grant recipients (it adds no veterans). S4b retains social-assistance income.
+        <w:t xml:space="preserve">Events are reported non-recipients. Unw. and Wtd. are the unweighted and person-weighted non-receipt rates. AUC, Brier and slope are unweighted out-of-fold point estimates, with no intervals in this table. Performance uses no weights. Same* is not a new result. It repeats the S0 row for the scenarios that left the sample and the measures unchanged.
 </w:t>
       </w:r>
     </w:p>
@@ -9212,7 +9212,22 @@
           <w:sz w:val="20"/>
           <w:szCs w:val="20"/>
         </w:rPr>
-        <w:t xml:space="preserve">*S1a (2014 ceiling throughout), S1c (age-75 supplement), S4a (income adjusted for price changes, with the ceiling unchanged), S4c (excluding UIF, the Unemployment Insurance Fund, and similar transfers), S5 (preceding-year receipt) and S6a/S6b (receipt bounds) change nothing. Each keeps the denominator, events and measures. No PASS adult has unresolved receipt to bound.
+        <w:t xml:space="preserve">S1b applies the 2015 ceiling to every interview. S1d uses the ceiling at which the formula pays nothing. The two settings are different, and the saved counts and measures match, so one row displays both. S2a screens living-together adults as couples. S2b screens them as single. S2c screens separated adults as single. S2d screens both living-together and separated adults as single. S3 retains adults who report a disability or war-veterans grant. It adds no veterans. S4b keeps social-assistance income in the resource proxy.
+</w:t>
+      </w:r>
+    </w:p>
+    <w:p>
+      <w:pPr>
+        <w:spacing w:after="80" w:before="0" w:line="230"/>
+        <w:jc w:val="both"/>
+      </w:pPr>
+      <w:r>
+        <w:rPr>
+          <w:rFonts w:ascii="Times New Roman" w:cs="Times New Roman" w:eastAsia="Times New Roman" w:hAnsi="Times New Roman"/>
+          <w:sz w:val="20"/>
+          <w:szCs w:val="20"/>
+        </w:rPr>
+        <w:t xml:space="preserve">*S1a uses the 2014 ceiling throughout. S1c adds the age-75 supplement. S4a adjusts income for price changes and leaves the ceiling unchanged. S4c also excludes UIF (the Unemployment Insurance Fund) and similar transfers. S5 uses preceding-year receipt. S6a and S6b assign unresolved receipt to receipt or to non-receipt. No passed adult has unresolved receipt to bound, so those bounds change nothing. Each starred scenario keeps the S0 denominator, events and measures.
 </w:t>
       </w:r>
     </w:p>
@@ -9276,7 +9291,7 @@
           <w:sz w:val="16"/>
           <w:szCs w:val="16"/>
         </w:rPr>
-        <w:t xml:space="preserve">Table VII. Primary held-out performance and uncertainty
+        <w:t xml:space="preserve">Table VII. Primary held-out performance and resampling intervals
 </w:t>
       </w:r>
     </w:p>
@@ -9294,9 +9309,9 @@
         <w:tblLayout w:type="fixed"/>
       </w:tblPr>
       <w:tblGrid>
-        <w:gridCol w:w="2200"/>
-        <w:gridCol w:w="1200"/>
-        <w:gridCol w:w="1640"/>
+        <w:gridCol w:w="1560"/>
+        <w:gridCol w:w="2040"/>
+        <w:gridCol w:w="1440"/>
       </w:tblGrid>
       <w:tr>
         <w:trPr>
@@ -9305,7 +9320,7 @@
         </w:trPr>
         <w:tc>
           <w:tcPr>
-            <w:tcW w:type="dxa" w:w="2200"/>
+            <w:tcW w:type="dxa" w:w="1560"/>
             <w:tcBorders>
               <w:top w:val="single" w:color="808080" w:sz="4"/>
               <w:left w:val="single" w:color="808080" w:sz="4"/>
@@ -9346,7 +9361,7 @@
         </w:tc>
         <w:tc>
           <w:tcPr>
-            <w:tcW w:type="dxa" w:w="1200"/>
+            <w:tcW w:type="dxa" w:w="2040"/>
             <w:tcBorders>
               <w:top w:val="single" w:color="808080" w:sz="4"/>
               <w:left w:val="single" w:color="808080" w:sz="4"/>
@@ -9381,13 +9396,13 @@
                 <w:sz w:val="18"/>
                 <w:szCs w:val="18"/>
               </w:rPr>
-              <w:t xml:space="preserve">Logistic: estimate [95% interval]</w:t>
-            </w:r>
-          </w:p>
-        </w:tc>
-        <w:tc>
-          <w:tcPr>
-            <w:tcW w:type="dxa" w:w="1640"/>
+              <w:t xml:space="preserve">Logistic model</w:t>
+            </w:r>
+          </w:p>
+        </w:tc>
+        <w:tc>
+          <w:tcPr>
+            <w:tcW w:type="dxa" w:w="1440"/>
             <w:tcBorders>
               <w:top w:val="single" w:color="808080" w:sz="4"/>
               <w:left w:val="single" w:color="808080" w:sz="4"/>
@@ -9422,7 +9437,7 @@
                 <w:sz w:val="18"/>
                 <w:szCs w:val="18"/>
               </w:rPr>
-              <w:t xml:space="preserve">Intercept-only: estimate [95% interval]</w:t>
+              <w:t xml:space="preserve">Intercept-only</w:t>
             </w:r>
           </w:p>
         </w:tc>
@@ -9434,7 +9449,7 @@
         </w:trPr>
         <w:tc>
           <w:tcPr>
-            <w:tcW w:type="dxa" w:w="2200"/>
+            <w:tcW w:type="dxa" w:w="1560"/>
             <w:tcBorders>
               <w:top w:val="single" w:color="808080" w:sz="4"/>
               <w:left w:val="single" w:color="808080" w:sz="4"/>
@@ -9475,7 +9490,7 @@
         </w:tc>
         <w:tc>
           <w:tcPr>
-            <w:tcW w:type="dxa" w:w="1200"/>
+            <w:tcW w:type="dxa" w:w="2040"/>
             <w:tcBorders>
               <w:top w:val="single" w:color="808080" w:sz="4"/>
               <w:left w:val="single" w:color="808080" w:sz="4"/>
@@ -9516,7 +9531,7 @@
         </w:tc>
         <w:tc>
           <w:tcPr>
-            <w:tcW w:type="dxa" w:w="1640"/>
+            <w:tcW w:type="dxa" w:w="1440"/>
             <w:tcBorders>
               <w:top w:val="single" w:color="808080" w:sz="4"/>
               <w:left w:val="single" w:color="808080" w:sz="4"/>
@@ -9563,7 +9578,7 @@
         </w:trPr>
         <w:tc>
           <w:tcPr>
-            <w:tcW w:type="dxa" w:w="2200"/>
+            <w:tcW w:type="dxa" w:w="1560"/>
             <w:tcBorders>
               <w:top w:val="single" w:color="808080" w:sz="4"/>
               <w:left w:val="single" w:color="808080" w:sz="4"/>
@@ -9604,7 +9619,7 @@
         </w:tc>
         <w:tc>
           <w:tcPr>
-            <w:tcW w:type="dxa" w:w="1200"/>
+            <w:tcW w:type="dxa" w:w="2040"/>
             <w:tcBorders>
               <w:top w:val="single" w:color="808080" w:sz="4"/>
               <w:left w:val="single" w:color="808080" w:sz="4"/>
@@ -9645,7 +9660,7 @@
         </w:tc>
         <w:tc>
           <w:tcPr>
-            <w:tcW w:type="dxa" w:w="1640"/>
+            <w:tcW w:type="dxa" w:w="1440"/>
             <w:tcBorders>
               <w:top w:val="single" w:color="808080" w:sz="4"/>
               <w:left w:val="single" w:color="808080" w:sz="4"/>
@@ -9692,7 +9707,7 @@
         </w:trPr>
         <w:tc>
           <w:tcPr>
-            <w:tcW w:type="dxa" w:w="2200"/>
+            <w:tcW w:type="dxa" w:w="1560"/>
             <w:tcBorders>
               <w:top w:val="single" w:color="808080" w:sz="4"/>
               <w:left w:val="single" w:color="808080" w:sz="4"/>
@@ -9733,7 +9748,7 @@
         </w:tc>
         <w:tc>
           <w:tcPr>
-            <w:tcW w:type="dxa" w:w="1200"/>
+            <w:tcW w:type="dxa" w:w="2040"/>
             <w:tcBorders>
               <w:top w:val="single" w:color="808080" w:sz="4"/>
               <w:left w:val="single" w:color="808080" w:sz="4"/>
@@ -9774,7 +9789,7 @@
         </w:tc>
         <w:tc>
           <w:tcPr>
-            <w:tcW w:type="dxa" w:w="1640"/>
+            <w:tcW w:type="dxa" w:w="1440"/>
             <w:tcBorders>
               <w:top w:val="single" w:color="808080" w:sz="4"/>
               <w:left w:val="single" w:color="808080" w:sz="4"/>
@@ -9821,7 +9836,7 @@
         </w:trPr>
         <w:tc>
           <w:tcPr>
-            <w:tcW w:type="dxa" w:w="2200"/>
+            <w:tcW w:type="dxa" w:w="1560"/>
             <w:tcBorders>
               <w:top w:val="single" w:color="808080" w:sz="4"/>
               <w:left w:val="single" w:color="808080" w:sz="4"/>
@@ -9862,7 +9877,7 @@
         </w:tc>
         <w:tc>
           <w:tcPr>
-            <w:tcW w:type="dxa" w:w="1200"/>
+            <w:tcW w:type="dxa" w:w="2040"/>
             <w:tcBorders>
               <w:top w:val="single" w:color="808080" w:sz="4"/>
               <w:left w:val="single" w:color="808080" w:sz="4"/>
@@ -9903,42 +9918,42 @@
         </w:tc>
         <w:tc>
           <w:tcPr>
-            <w:tcW w:type="dxa" w:w="1640"/>
-            <w:tcBorders>
-              <w:top w:val="single" w:color="808080" w:sz="4"/>
-              <w:left w:val="single" w:color="808080" w:sz="4"/>
-              <w:bottom w:val="single" w:color="808080" w:sz="4"/>
-              <w:right w:val="single" w:color="808080" w:sz="4"/>
-            </w:tcBorders>
-            <w:tcMar>
-              <w:top w:type="dxa" w:w="40"/>
-              <w:left w:type="dxa" w:w="45"/>
-              <w:bottom w:type="dxa" w:w="40"/>
-              <w:right w:type="dxa" w:w="45"/>
-            </w:tcMar>
-            <w:vAlign w:val="center"/>
-          </w:tcPr>
-          <w:p>
-            <w:pPr>
-              <w:keepNext/>
-              <w:spacing w:after="0" w:before="0" w:line="240" w:lineRule="auto"/>
-              <w:jc w:val="left"/>
-              <w:rPr>
-                <w:b w:val="false"/>
-                <w:bCs w:val="false"/>
-                <w:sz w:val="18"/>
-                <w:szCs w:val="18"/>
-              </w:rPr>
-            </w:pPr>
-            <w:r>
-              <w:rPr>
-                <w:rFonts w:ascii="Times New Roman" w:cs="Times New Roman" w:eastAsia="Times New Roman" w:hAnsi="Times New Roman"/>
-                <w:b w:val="false"/>
-                <w:bCs w:val="false"/>
-                <w:sz w:val="18"/>
-                <w:szCs w:val="18"/>
-              </w:rPr>
-              <w:t xml:space="preserve">.0001 [—]</w:t>
+            <w:tcW w:type="dxa" w:w="1440"/>
+            <w:tcBorders>
+              <w:top w:val="single" w:color="808080" w:sz="4"/>
+              <w:left w:val="single" w:color="808080" w:sz="4"/>
+              <w:bottom w:val="single" w:color="808080" w:sz="4"/>
+              <w:right w:val="single" w:color="808080" w:sz="4"/>
+            </w:tcBorders>
+            <w:tcMar>
+              <w:top w:type="dxa" w:w="40"/>
+              <w:left w:type="dxa" w:w="45"/>
+              <w:bottom w:type="dxa" w:w="40"/>
+              <w:right w:type="dxa" w:w="45"/>
+            </w:tcMar>
+            <w:vAlign w:val="center"/>
+          </w:tcPr>
+          <w:p>
+            <w:pPr>
+              <w:keepNext/>
+              <w:spacing w:after="0" w:before="0" w:line="240" w:lineRule="auto"/>
+              <w:jc w:val="left"/>
+              <w:rPr>
+                <w:b w:val="false"/>
+                <w:bCs w:val="false"/>
+                <w:sz w:val="18"/>
+                <w:szCs w:val="18"/>
+              </w:rPr>
+            </w:pPr>
+            <w:r>
+              <w:rPr>
+                <w:rFonts w:ascii="Times New Roman" w:cs="Times New Roman" w:eastAsia="Times New Roman" w:hAnsi="Times New Roman"/>
+                <w:b w:val="false"/>
+                <w:bCs w:val="false"/>
+                <w:sz w:val="18"/>
+                <w:szCs w:val="18"/>
+              </w:rPr>
+              <w:t xml:space="preserve">.0001</w:t>
             </w:r>
           </w:p>
         </w:tc>
@@ -9950,7 +9965,7 @@
         </w:trPr>
         <w:tc>
           <w:tcPr>
-            <w:tcW w:type="dxa" w:w="2200"/>
+            <w:tcW w:type="dxa" w:w="1560"/>
             <w:tcBorders>
               <w:top w:val="single" w:color="808080" w:sz="4"/>
               <w:left w:val="single" w:color="808080" w:sz="4"/>
@@ -9991,7 +10006,7 @@
         </w:tc>
         <w:tc>
           <w:tcPr>
-            <w:tcW w:type="dxa" w:w="1200"/>
+            <w:tcW w:type="dxa" w:w="2040"/>
             <w:tcBorders>
               <w:top w:val="single" w:color="808080" w:sz="4"/>
               <w:left w:val="single" w:color="808080" w:sz="4"/>
@@ -10032,7 +10047,7 @@
         </w:tc>
         <w:tc>
           <w:tcPr>
-            <w:tcW w:type="dxa" w:w="1640"/>
+            <w:tcW w:type="dxa" w:w="1440"/>
             <w:tcBorders>
               <w:top w:val="single" w:color="808080" w:sz="4"/>
               <w:left w:val="single" w:color="808080" w:sz="4"/>
@@ -10092,7 +10107,7 @@
           <w:sz w:val="16"/>
           <w:szCs w:val="16"/>
         </w:rPr>
-        <w:t xml:space="preserve">Estimates pool unweighted OOF predictions: 1,013 people/67 events. The intervals use percentile bounds from 1,000 household resamples of fixed predictions. All reported intervals have zero invalid resamples. Resampling did not refit models or missing-value settings. The intercept-only reference uses the training group's non-receipt rate. Dashes mean unavailable measures/intervals, rather than zero or chance performance.
+        <w:t xml:space="preserve">Each logistic cell is the estimate and its 95% interval. Estimates pool unweighted out-of-fold predictions from 1,013 people and 67 events. An interval is the 2.5 and 97.5 percentiles of 1,000 household resamples of those fixed predictions. Every reported interval had 1,000 valid resamples and no invalid resample. Resampling did not refit the model or the missing-value fill. These intervals are not design-based confidence intervals. They are not the survey approximation in Section V.A, and they are not the Wald intervals beside the odds ratios below. The intercept-only reference uses the training group's non-receipt rate. Its calibration-in-the-large is .0001, and no resampling interval was saved for that value. A dash means the intercept-only model does not supply that measure. A dash is not zero and is not chance performance. The ideal calibration-in-the-large is 0. The ideal slope is 1.
 </w:t>
       </w:r>
     </w:p>
@@ -10173,7 +10188,7 @@
           <w:sz w:val="20"/>
           <w:szCs w:val="20"/>
         </w:rPr>
-        <w:t xml:space="preserve">The odds ratio for women versus men was 0.39. Its Wald interval was 0.23–0.66. Schooling below Grade 7 versus Grade 7 or above gave 0.24 (0.13–0.43). The model trained on all included adults produced these estimates. Age, settlement and welfare-distance intervals included 1. These associations describe odds, not probability reductions, held-out performance or causes.
+        <w:t xml:space="preserve">The odds ratio for women versus men was 0.39. Its Wald interval was 0.23–0.66. Schooling below Grade 7 versus Grade 7 or above gave 0.24 (0.13–0.43). The model trained on all included adults produced these estimates. The intervals exponentiate that model's coefficients and standard errors. They are not the Table VII resampling intervals, and they do not measure held-out performance. Age, settlement and welfare-distance intervals included 1. These associations describe odds, not probability reductions, held-out performance or causes.
 </w:t>
       </w:r>
     </w:p>
@@ -10193,7 +10208,7 @@
           <w:sz w:val="16"/>
           <w:szCs w:val="16"/>
         </w:rPr>
-        <w:t xml:space="preserve">Table VIII. Model/validation sensitivities
+        <w:t xml:space="preserve">Table VIII. Model and validation sensitivities, as point estimates
 </w:t>
       </w:r>
     </w:p>
@@ -10211,12 +10226,12 @@
         <w:tblLayout w:type="fixed"/>
       </w:tblPr>
       <w:tblGrid>
-        <w:gridCol w:w="1040"/>
-        <w:gridCol w:w="850"/>
+        <w:gridCol w:w="1280"/>
+        <w:gridCol w:w="900"/>
+        <w:gridCol w:w="660"/>
+        <w:gridCol w:w="740"/>
+        <w:gridCol w:w="760"/>
         <w:gridCol w:w="700"/>
-        <w:gridCol w:w="700"/>
-        <w:gridCol w:w="900"/>
-        <w:gridCol w:w="850"/>
       </w:tblGrid>
       <w:tr>
         <w:trPr>
@@ -10225,7 +10240,7 @@
         </w:trPr>
         <w:tc>
           <w:tcPr>
-            <w:tcW w:type="dxa" w:w="1040"/>
+            <w:tcW w:type="dxa" w:w="1280"/>
             <w:tcBorders>
               <w:top w:val="single" w:color="808080" w:sz="4"/>
               <w:left w:val="single" w:color="808080" w:sz="4"/>
@@ -10266,7 +10281,7 @@
         </w:tc>
         <w:tc>
           <w:tcPr>
-            <w:tcW w:type="dxa" w:w="850"/>
+            <w:tcW w:type="dxa" w:w="900"/>
             <w:tcBorders>
               <w:top w:val="single" w:color="808080" w:sz="4"/>
               <w:left w:val="single" w:color="808080" w:sz="4"/>
@@ -10307,7 +10322,7 @@
         </w:tc>
         <w:tc>
           <w:tcPr>
-            <w:tcW w:type="dxa" w:w="700"/>
+            <w:tcW w:type="dxa" w:w="660"/>
             <w:tcBorders>
               <w:top w:val="single" w:color="808080" w:sz="4"/>
               <w:left w:val="single" w:color="808080" w:sz="4"/>
@@ -10342,13 +10357,13 @@
                 <w:sz w:val="18"/>
                 <w:szCs w:val="18"/>
               </w:rPr>
-              <w:t xml:space="preserve">Unw.%</w:t>
-            </w:r>
-          </w:p>
-        </w:tc>
-        <w:tc>
-          <w:tcPr>
-            <w:tcW w:type="dxa" w:w="700"/>
+              <w:t xml:space="preserve">Unw.</w:t>
+            </w:r>
+          </w:p>
+        </w:tc>
+        <w:tc>
+          <w:tcPr>
+            <w:tcW w:type="dxa" w:w="740"/>
             <w:tcBorders>
               <w:top w:val="single" w:color="808080" w:sz="4"/>
               <w:left w:val="single" w:color="808080" w:sz="4"/>
@@ -10389,7 +10404,7 @@
         </w:tc>
         <w:tc>
           <w:tcPr>
-            <w:tcW w:type="dxa" w:w="900"/>
+            <w:tcW w:type="dxa" w:w="760"/>
             <w:tcBorders>
               <w:top w:val="single" w:color="808080" w:sz="4"/>
               <w:left w:val="single" w:color="808080" w:sz="4"/>
@@ -10430,7 +10445,7 @@
         </w:tc>
         <w:tc>
           <w:tcPr>
-            <w:tcW w:type="dxa" w:w="850"/>
+            <w:tcW w:type="dxa" w:w="700"/>
             <w:tcBorders>
               <w:top w:val="single" w:color="808080" w:sz="4"/>
               <w:left w:val="single" w:color="808080" w:sz="4"/>
@@ -10477,7 +10492,7 @@
         </w:trPr>
         <w:tc>
           <w:tcPr>
-            <w:tcW w:type="dxa" w:w="1040"/>
+            <w:tcW w:type="dxa" w:w="1280"/>
             <w:tcBorders>
               <w:top w:val="single" w:color="808080" w:sz="4"/>
               <w:left w:val="single" w:color="808080" w:sz="4"/>
@@ -10518,7 +10533,7 @@
         </w:tc>
         <w:tc>
           <w:tcPr>
-            <w:tcW w:type="dxa" w:w="850"/>
+            <w:tcW w:type="dxa" w:w="900"/>
             <w:tcBorders>
               <w:top w:val="single" w:color="808080" w:sz="4"/>
               <w:left w:val="single" w:color="808080" w:sz="4"/>
@@ -10559,130 +10574,130 @@
         </w:tc>
         <w:tc>
           <w:tcPr>
+            <w:tcW w:type="dxa" w:w="660"/>
+            <w:tcBorders>
+              <w:top w:val="single" w:color="808080" w:sz="4"/>
+              <w:left w:val="single" w:color="808080" w:sz="4"/>
+              <w:bottom w:val="single" w:color="808080" w:sz="4"/>
+              <w:right w:val="single" w:color="808080" w:sz="4"/>
+            </w:tcBorders>
+            <w:tcMar>
+              <w:top w:type="dxa" w:w="40"/>
+              <w:left w:type="dxa" w:w="45"/>
+              <w:bottom w:type="dxa" w:w="40"/>
+              <w:right w:type="dxa" w:w="45"/>
+            </w:tcMar>
+            <w:vAlign w:val="center"/>
+          </w:tcPr>
+          <w:p>
+            <w:pPr>
+              <w:keepNext/>
+              <w:spacing w:after="0" w:before="0" w:line="240" w:lineRule="auto"/>
+              <w:jc w:val="center"/>
+              <w:rPr>
+                <w:b w:val="false"/>
+                <w:bCs w:val="false"/>
+                <w:sz w:val="18"/>
+                <w:szCs w:val="18"/>
+              </w:rPr>
+            </w:pPr>
+            <w:r>
+              <w:rPr>
+                <w:rFonts w:ascii="Times New Roman" w:cs="Times New Roman" w:eastAsia="Times New Roman" w:hAnsi="Times New Roman"/>
+                <w:b w:val="false"/>
+                <w:bCs w:val="false"/>
+                <w:sz w:val="18"/>
+                <w:szCs w:val="18"/>
+              </w:rPr>
+              <w:t xml:space="preserve">6.61</w:t>
+            </w:r>
+          </w:p>
+        </w:tc>
+        <w:tc>
+          <w:tcPr>
+            <w:tcW w:type="dxa" w:w="740"/>
+            <w:tcBorders>
+              <w:top w:val="single" w:color="808080" w:sz="4"/>
+              <w:left w:val="single" w:color="808080" w:sz="4"/>
+              <w:bottom w:val="single" w:color="808080" w:sz="4"/>
+              <w:right w:val="single" w:color="808080" w:sz="4"/>
+            </w:tcBorders>
+            <w:tcMar>
+              <w:top w:type="dxa" w:w="40"/>
+              <w:left w:type="dxa" w:w="45"/>
+              <w:bottom w:type="dxa" w:w="40"/>
+              <w:right w:type="dxa" w:w="45"/>
+            </w:tcMar>
+            <w:vAlign w:val="center"/>
+          </w:tcPr>
+          <w:p>
+            <w:pPr>
+              <w:keepNext/>
+              <w:spacing w:after="0" w:before="0" w:line="240" w:lineRule="auto"/>
+              <w:jc w:val="center"/>
+              <w:rPr>
+                <w:b w:val="false"/>
+                <w:bCs w:val="false"/>
+                <w:sz w:val="18"/>
+                <w:szCs w:val="18"/>
+              </w:rPr>
+            </w:pPr>
+            <w:r>
+              <w:rPr>
+                <w:rFonts w:ascii="Times New Roman" w:cs="Times New Roman" w:eastAsia="Times New Roman" w:hAnsi="Times New Roman"/>
+                <w:b w:val="false"/>
+                <w:bCs w:val="false"/>
+                <w:sz w:val="18"/>
+                <w:szCs w:val="18"/>
+              </w:rPr>
+              <w:t xml:space="preserve">.752</w:t>
+            </w:r>
+          </w:p>
+        </w:tc>
+        <w:tc>
+          <w:tcPr>
+            <w:tcW w:type="dxa" w:w="760"/>
+            <w:tcBorders>
+              <w:top w:val="single" w:color="808080" w:sz="4"/>
+              <w:left w:val="single" w:color="808080" w:sz="4"/>
+              <w:bottom w:val="single" w:color="808080" w:sz="4"/>
+              <w:right w:val="single" w:color="808080" w:sz="4"/>
+            </w:tcBorders>
+            <w:tcMar>
+              <w:top w:type="dxa" w:w="40"/>
+              <w:left w:type="dxa" w:w="45"/>
+              <w:bottom w:type="dxa" w:w="40"/>
+              <w:right w:type="dxa" w:w="45"/>
+            </w:tcMar>
+            <w:vAlign w:val="center"/>
+          </w:tcPr>
+          <w:p>
+            <w:pPr>
+              <w:keepNext/>
+              <w:spacing w:after="0" w:before="0" w:line="240" w:lineRule="auto"/>
+              <w:jc w:val="center"/>
+              <w:rPr>
+                <w:b w:val="false"/>
+                <w:bCs w:val="false"/>
+                <w:sz w:val="18"/>
+                <w:szCs w:val="18"/>
+              </w:rPr>
+            </w:pPr>
+            <w:r>
+              <w:rPr>
+                <w:rFonts w:ascii="Times New Roman" w:cs="Times New Roman" w:eastAsia="Times New Roman" w:hAnsi="Times New Roman"/>
+                <w:b w:val="false"/>
+                <w:bCs w:val="false"/>
+                <w:sz w:val="18"/>
+                <w:szCs w:val="18"/>
+              </w:rPr>
+              <w:t xml:space="preserve">.0578</w:t>
+            </w:r>
+          </w:p>
+        </w:tc>
+        <w:tc>
+          <w:tcPr>
             <w:tcW w:type="dxa" w:w="700"/>
-            <w:tcBorders>
-              <w:top w:val="single" w:color="808080" w:sz="4"/>
-              <w:left w:val="single" w:color="808080" w:sz="4"/>
-              <w:bottom w:val="single" w:color="808080" w:sz="4"/>
-              <w:right w:val="single" w:color="808080" w:sz="4"/>
-            </w:tcBorders>
-            <w:tcMar>
-              <w:top w:type="dxa" w:w="40"/>
-              <w:left w:type="dxa" w:w="45"/>
-              <w:bottom w:type="dxa" w:w="40"/>
-              <w:right w:type="dxa" w:w="45"/>
-            </w:tcMar>
-            <w:vAlign w:val="center"/>
-          </w:tcPr>
-          <w:p>
-            <w:pPr>
-              <w:keepNext/>
-              <w:spacing w:after="0" w:before="0" w:line="240" w:lineRule="auto"/>
-              <w:jc w:val="center"/>
-              <w:rPr>
-                <w:b w:val="false"/>
-                <w:bCs w:val="false"/>
-                <w:sz w:val="18"/>
-                <w:szCs w:val="18"/>
-              </w:rPr>
-            </w:pPr>
-            <w:r>
-              <w:rPr>
-                <w:rFonts w:ascii="Times New Roman" w:cs="Times New Roman" w:eastAsia="Times New Roman" w:hAnsi="Times New Roman"/>
-                <w:b w:val="false"/>
-                <w:bCs w:val="false"/>
-                <w:sz w:val="18"/>
-                <w:szCs w:val="18"/>
-              </w:rPr>
-              <w:t xml:space="preserve">6.61</w:t>
-            </w:r>
-          </w:p>
-        </w:tc>
-        <w:tc>
-          <w:tcPr>
-            <w:tcW w:type="dxa" w:w="700"/>
-            <w:tcBorders>
-              <w:top w:val="single" w:color="808080" w:sz="4"/>
-              <w:left w:val="single" w:color="808080" w:sz="4"/>
-              <w:bottom w:val="single" w:color="808080" w:sz="4"/>
-              <w:right w:val="single" w:color="808080" w:sz="4"/>
-            </w:tcBorders>
-            <w:tcMar>
-              <w:top w:type="dxa" w:w="40"/>
-              <w:left w:type="dxa" w:w="45"/>
-              <w:bottom w:type="dxa" w:w="40"/>
-              <w:right w:type="dxa" w:w="45"/>
-            </w:tcMar>
-            <w:vAlign w:val="center"/>
-          </w:tcPr>
-          <w:p>
-            <w:pPr>
-              <w:keepNext/>
-              <w:spacing w:after="0" w:before="0" w:line="240" w:lineRule="auto"/>
-              <w:jc w:val="center"/>
-              <w:rPr>
-                <w:b w:val="false"/>
-                <w:bCs w:val="false"/>
-                <w:sz w:val="18"/>
-                <w:szCs w:val="18"/>
-              </w:rPr>
-            </w:pPr>
-            <w:r>
-              <w:rPr>
-                <w:rFonts w:ascii="Times New Roman" w:cs="Times New Roman" w:eastAsia="Times New Roman" w:hAnsi="Times New Roman"/>
-                <w:b w:val="false"/>
-                <w:bCs w:val="false"/>
-                <w:sz w:val="18"/>
-                <w:szCs w:val="18"/>
-              </w:rPr>
-              <w:t xml:space="preserve">.752</w:t>
-            </w:r>
-          </w:p>
-        </w:tc>
-        <w:tc>
-          <w:tcPr>
-            <w:tcW w:type="dxa" w:w="900"/>
-            <w:tcBorders>
-              <w:top w:val="single" w:color="808080" w:sz="4"/>
-              <w:left w:val="single" w:color="808080" w:sz="4"/>
-              <w:bottom w:val="single" w:color="808080" w:sz="4"/>
-              <w:right w:val="single" w:color="808080" w:sz="4"/>
-            </w:tcBorders>
-            <w:tcMar>
-              <w:top w:type="dxa" w:w="40"/>
-              <w:left w:type="dxa" w:w="45"/>
-              <w:bottom w:type="dxa" w:w="40"/>
-              <w:right w:type="dxa" w:w="45"/>
-            </w:tcMar>
-            <w:vAlign w:val="center"/>
-          </w:tcPr>
-          <w:p>
-            <w:pPr>
-              <w:keepNext/>
-              <w:spacing w:after="0" w:before="0" w:line="240" w:lineRule="auto"/>
-              <w:jc w:val="center"/>
-              <w:rPr>
-                <w:b w:val="false"/>
-                <w:bCs w:val="false"/>
-                <w:sz w:val="18"/>
-                <w:szCs w:val="18"/>
-              </w:rPr>
-            </w:pPr>
-            <w:r>
-              <w:rPr>
-                <w:rFonts w:ascii="Times New Roman" w:cs="Times New Roman" w:eastAsia="Times New Roman" w:hAnsi="Times New Roman"/>
-                <w:b w:val="false"/>
-                <w:bCs w:val="false"/>
-                <w:sz w:val="18"/>
-                <w:szCs w:val="18"/>
-              </w:rPr>
-              <w:t xml:space="preserve">.0578</w:t>
-            </w:r>
-          </w:p>
-        </w:tc>
-        <w:tc>
-          <w:tcPr>
-            <w:tcW w:type="dxa" w:w="850"/>
             <w:tcBorders>
               <w:top w:val="single" w:color="808080" w:sz="4"/>
               <w:left w:val="single" w:color="808080" w:sz="4"/>
@@ -10729,7 +10744,7 @@
         </w:trPr>
         <w:tc>
           <w:tcPr>
-            <w:tcW w:type="dxa" w:w="1040"/>
+            <w:tcW w:type="dxa" w:w="1280"/>
             <w:tcBorders>
               <w:top w:val="single" w:color="808080" w:sz="4"/>
               <w:left w:val="single" w:color="808080" w:sz="4"/>
@@ -10770,7 +10785,7 @@
         </w:tc>
         <w:tc>
           <w:tcPr>
-            <w:tcW w:type="dxa" w:w="850"/>
+            <w:tcW w:type="dxa" w:w="900"/>
             <w:tcBorders>
               <w:top w:val="single" w:color="808080" w:sz="4"/>
               <w:left w:val="single" w:color="808080" w:sz="4"/>
@@ -10811,130 +10826,130 @@
         </w:tc>
         <w:tc>
           <w:tcPr>
+            <w:tcW w:type="dxa" w:w="660"/>
+            <w:tcBorders>
+              <w:top w:val="single" w:color="808080" w:sz="4"/>
+              <w:left w:val="single" w:color="808080" w:sz="4"/>
+              <w:bottom w:val="single" w:color="808080" w:sz="4"/>
+              <w:right w:val="single" w:color="808080" w:sz="4"/>
+            </w:tcBorders>
+            <w:tcMar>
+              <w:top w:type="dxa" w:w="40"/>
+              <w:left w:type="dxa" w:w="45"/>
+              <w:bottom w:type="dxa" w:w="40"/>
+              <w:right w:type="dxa" w:w="45"/>
+            </w:tcMar>
+            <w:vAlign w:val="center"/>
+          </w:tcPr>
+          <w:p>
+            <w:pPr>
+              <w:keepNext/>
+              <w:spacing w:after="0" w:before="0" w:line="240" w:lineRule="auto"/>
+              <w:jc w:val="center"/>
+              <w:rPr>
+                <w:b w:val="false"/>
+                <w:bCs w:val="false"/>
+                <w:sz w:val="18"/>
+                <w:szCs w:val="18"/>
+              </w:rPr>
+            </w:pPr>
+            <w:r>
+              <w:rPr>
+                <w:rFonts w:ascii="Times New Roman" w:cs="Times New Roman" w:eastAsia="Times New Roman" w:hAnsi="Times New Roman"/>
+                <w:b w:val="false"/>
+                <w:bCs w:val="false"/>
+                <w:sz w:val="18"/>
+                <w:szCs w:val="18"/>
+              </w:rPr>
+              <w:t xml:space="preserve">6.35</w:t>
+            </w:r>
+          </w:p>
+        </w:tc>
+        <w:tc>
+          <w:tcPr>
+            <w:tcW w:type="dxa" w:w="740"/>
+            <w:tcBorders>
+              <w:top w:val="single" w:color="808080" w:sz="4"/>
+              <w:left w:val="single" w:color="808080" w:sz="4"/>
+              <w:bottom w:val="single" w:color="808080" w:sz="4"/>
+              <w:right w:val="single" w:color="808080" w:sz="4"/>
+            </w:tcBorders>
+            <w:tcMar>
+              <w:top w:type="dxa" w:w="40"/>
+              <w:left w:type="dxa" w:w="45"/>
+              <w:bottom w:type="dxa" w:w="40"/>
+              <w:right w:type="dxa" w:w="45"/>
+            </w:tcMar>
+            <w:vAlign w:val="center"/>
+          </w:tcPr>
+          <w:p>
+            <w:pPr>
+              <w:keepNext/>
+              <w:spacing w:after="0" w:before="0" w:line="240" w:lineRule="auto"/>
+              <w:jc w:val="center"/>
+              <w:rPr>
+                <w:b w:val="false"/>
+                <w:bCs w:val="false"/>
+                <w:sz w:val="18"/>
+                <w:szCs w:val="18"/>
+              </w:rPr>
+            </w:pPr>
+            <w:r>
+              <w:rPr>
+                <w:rFonts w:ascii="Times New Roman" w:cs="Times New Roman" w:eastAsia="Times New Roman" w:hAnsi="Times New Roman"/>
+                <w:b w:val="false"/>
+                <w:bCs w:val="false"/>
+                <w:sz w:val="18"/>
+                <w:szCs w:val="18"/>
+              </w:rPr>
+              <w:t xml:space="preserve">.758</w:t>
+            </w:r>
+          </w:p>
+        </w:tc>
+        <w:tc>
+          <w:tcPr>
+            <w:tcW w:type="dxa" w:w="760"/>
+            <w:tcBorders>
+              <w:top w:val="single" w:color="808080" w:sz="4"/>
+              <w:left w:val="single" w:color="808080" w:sz="4"/>
+              <w:bottom w:val="single" w:color="808080" w:sz="4"/>
+              <w:right w:val="single" w:color="808080" w:sz="4"/>
+            </w:tcBorders>
+            <w:tcMar>
+              <w:top w:type="dxa" w:w="40"/>
+              <w:left w:type="dxa" w:w="45"/>
+              <w:bottom w:type="dxa" w:w="40"/>
+              <w:right w:type="dxa" w:w="45"/>
+            </w:tcMar>
+            <w:vAlign w:val="center"/>
+          </w:tcPr>
+          <w:p>
+            <w:pPr>
+              <w:keepNext/>
+              <w:spacing w:after="0" w:before="0" w:line="240" w:lineRule="auto"/>
+              <w:jc w:val="center"/>
+              <w:rPr>
+                <w:b w:val="false"/>
+                <w:bCs w:val="false"/>
+                <w:sz w:val="18"/>
+                <w:szCs w:val="18"/>
+              </w:rPr>
+            </w:pPr>
+            <w:r>
+              <w:rPr>
+                <w:rFonts w:ascii="Times New Roman" w:cs="Times New Roman" w:eastAsia="Times New Roman" w:hAnsi="Times New Roman"/>
+                <w:b w:val="false"/>
+                <w:bCs w:val="false"/>
+                <w:sz w:val="18"/>
+                <w:szCs w:val="18"/>
+              </w:rPr>
+              <w:t xml:space="preserve">.0556</w:t>
+            </w:r>
+          </w:p>
+        </w:tc>
+        <w:tc>
+          <w:tcPr>
             <w:tcW w:type="dxa" w:w="700"/>
-            <w:tcBorders>
-              <w:top w:val="single" w:color="808080" w:sz="4"/>
-              <w:left w:val="single" w:color="808080" w:sz="4"/>
-              <w:bottom w:val="single" w:color="808080" w:sz="4"/>
-              <w:right w:val="single" w:color="808080" w:sz="4"/>
-            </w:tcBorders>
-            <w:tcMar>
-              <w:top w:type="dxa" w:w="40"/>
-              <w:left w:type="dxa" w:w="45"/>
-              <w:bottom w:type="dxa" w:w="40"/>
-              <w:right w:type="dxa" w:w="45"/>
-            </w:tcMar>
-            <w:vAlign w:val="center"/>
-          </w:tcPr>
-          <w:p>
-            <w:pPr>
-              <w:keepNext/>
-              <w:spacing w:after="0" w:before="0" w:line="240" w:lineRule="auto"/>
-              <w:jc w:val="center"/>
-              <w:rPr>
-                <w:b w:val="false"/>
-                <w:bCs w:val="false"/>
-                <w:sz w:val="18"/>
-                <w:szCs w:val="18"/>
-              </w:rPr>
-            </w:pPr>
-            <w:r>
-              <w:rPr>
-                <w:rFonts w:ascii="Times New Roman" w:cs="Times New Roman" w:eastAsia="Times New Roman" w:hAnsi="Times New Roman"/>
-                <w:b w:val="false"/>
-                <w:bCs w:val="false"/>
-                <w:sz w:val="18"/>
-                <w:szCs w:val="18"/>
-              </w:rPr>
-              <w:t xml:space="preserve">6.35</w:t>
-            </w:r>
-          </w:p>
-        </w:tc>
-        <w:tc>
-          <w:tcPr>
-            <w:tcW w:type="dxa" w:w="700"/>
-            <w:tcBorders>
-              <w:top w:val="single" w:color="808080" w:sz="4"/>
-              <w:left w:val="single" w:color="808080" w:sz="4"/>
-              <w:bottom w:val="single" w:color="808080" w:sz="4"/>
-              <w:right w:val="single" w:color="808080" w:sz="4"/>
-            </w:tcBorders>
-            <w:tcMar>
-              <w:top w:type="dxa" w:w="40"/>
-              <w:left w:type="dxa" w:w="45"/>
-              <w:bottom w:type="dxa" w:w="40"/>
-              <w:right w:type="dxa" w:w="45"/>
-            </w:tcMar>
-            <w:vAlign w:val="center"/>
-          </w:tcPr>
-          <w:p>
-            <w:pPr>
-              <w:keepNext/>
-              <w:spacing w:after="0" w:before="0" w:line="240" w:lineRule="auto"/>
-              <w:jc w:val="center"/>
-              <w:rPr>
-                <w:b w:val="false"/>
-                <w:bCs w:val="false"/>
-                <w:sz w:val="18"/>
-                <w:szCs w:val="18"/>
-              </w:rPr>
-            </w:pPr>
-            <w:r>
-              <w:rPr>
-                <w:rFonts w:ascii="Times New Roman" w:cs="Times New Roman" w:eastAsia="Times New Roman" w:hAnsi="Times New Roman"/>
-                <w:b w:val="false"/>
-                <w:bCs w:val="false"/>
-                <w:sz w:val="18"/>
-                <w:szCs w:val="18"/>
-              </w:rPr>
-              <w:t xml:space="preserve">.758</w:t>
-            </w:r>
-          </w:p>
-        </w:tc>
-        <w:tc>
-          <w:tcPr>
-            <w:tcW w:type="dxa" w:w="900"/>
-            <w:tcBorders>
-              <w:top w:val="single" w:color="808080" w:sz="4"/>
-              <w:left w:val="single" w:color="808080" w:sz="4"/>
-              <w:bottom w:val="single" w:color="808080" w:sz="4"/>
-              <w:right w:val="single" w:color="808080" w:sz="4"/>
-            </w:tcBorders>
-            <w:tcMar>
-              <w:top w:type="dxa" w:w="40"/>
-              <w:left w:type="dxa" w:w="45"/>
-              <w:bottom w:type="dxa" w:w="40"/>
-              <w:right w:type="dxa" w:w="45"/>
-            </w:tcMar>
-            <w:vAlign w:val="center"/>
-          </w:tcPr>
-          <w:p>
-            <w:pPr>
-              <w:keepNext/>
-              <w:spacing w:after="0" w:before="0" w:line="240" w:lineRule="auto"/>
-              <w:jc w:val="center"/>
-              <w:rPr>
-                <w:b w:val="false"/>
-                <w:bCs w:val="false"/>
-                <w:sz w:val="18"/>
-                <w:szCs w:val="18"/>
-              </w:rPr>
-            </w:pPr>
-            <w:r>
-              <w:rPr>
-                <w:rFonts w:ascii="Times New Roman" w:cs="Times New Roman" w:eastAsia="Times New Roman" w:hAnsi="Times New Roman"/>
-                <w:b w:val="false"/>
-                <w:bCs w:val="false"/>
-                <w:sz w:val="18"/>
-                <w:szCs w:val="18"/>
-              </w:rPr>
-              <w:t xml:space="preserve">.0556</w:t>
-            </w:r>
-          </w:p>
-        </w:tc>
-        <w:tc>
-          <w:tcPr>
-            <w:tcW w:type="dxa" w:w="850"/>
             <w:tcBorders>
               <w:top w:val="single" w:color="808080" w:sz="4"/>
               <w:left w:val="single" w:color="808080" w:sz="4"/>
@@ -10981,7 +10996,7 @@
         </w:trPr>
         <w:tc>
           <w:tcPr>
-            <w:tcW w:type="dxa" w:w="1040"/>
+            <w:tcW w:type="dxa" w:w="1280"/>
             <w:tcBorders>
               <w:top w:val="single" w:color="808080" w:sz="4"/>
               <w:left w:val="single" w:color="808080" w:sz="4"/>
@@ -11022,7 +11037,7 @@
         </w:tc>
         <w:tc>
           <w:tcPr>
-            <w:tcW w:type="dxa" w:w="850"/>
+            <w:tcW w:type="dxa" w:w="900"/>
             <w:tcBorders>
               <w:top w:val="single" w:color="808080" w:sz="4"/>
               <w:left w:val="single" w:color="808080" w:sz="4"/>
@@ -11063,130 +11078,130 @@
         </w:tc>
         <w:tc>
           <w:tcPr>
+            <w:tcW w:type="dxa" w:w="660"/>
+            <w:tcBorders>
+              <w:top w:val="single" w:color="808080" w:sz="4"/>
+              <w:left w:val="single" w:color="808080" w:sz="4"/>
+              <w:bottom w:val="single" w:color="808080" w:sz="4"/>
+              <w:right w:val="single" w:color="808080" w:sz="4"/>
+            </w:tcBorders>
+            <w:tcMar>
+              <w:top w:type="dxa" w:w="40"/>
+              <w:left w:type="dxa" w:w="45"/>
+              <w:bottom w:type="dxa" w:w="40"/>
+              <w:right w:type="dxa" w:w="45"/>
+            </w:tcMar>
+            <w:vAlign w:val="center"/>
+          </w:tcPr>
+          <w:p>
+            <w:pPr>
+              <w:keepNext/>
+              <w:spacing w:after="0" w:before="0" w:line="240" w:lineRule="auto"/>
+              <w:jc w:val="center"/>
+              <w:rPr>
+                <w:b w:val="false"/>
+                <w:bCs w:val="false"/>
+                <w:sz w:val="18"/>
+                <w:szCs w:val="18"/>
+              </w:rPr>
+            </w:pPr>
+            <w:r>
+              <w:rPr>
+                <w:rFonts w:ascii="Times New Roman" w:cs="Times New Roman" w:eastAsia="Times New Roman" w:hAnsi="Times New Roman"/>
+                <w:b w:val="false"/>
+                <w:bCs w:val="false"/>
+                <w:sz w:val="18"/>
+                <w:szCs w:val="18"/>
+              </w:rPr>
+              <w:t xml:space="preserve">6.61</w:t>
+            </w:r>
+          </w:p>
+        </w:tc>
+        <w:tc>
+          <w:tcPr>
+            <w:tcW w:type="dxa" w:w="740"/>
+            <w:tcBorders>
+              <w:top w:val="single" w:color="808080" w:sz="4"/>
+              <w:left w:val="single" w:color="808080" w:sz="4"/>
+              <w:bottom w:val="single" w:color="808080" w:sz="4"/>
+              <w:right w:val="single" w:color="808080" w:sz="4"/>
+            </w:tcBorders>
+            <w:tcMar>
+              <w:top w:type="dxa" w:w="40"/>
+              <w:left w:type="dxa" w:w="45"/>
+              <w:bottom w:type="dxa" w:w="40"/>
+              <w:right w:type="dxa" w:w="45"/>
+            </w:tcMar>
+            <w:vAlign w:val="center"/>
+          </w:tcPr>
+          <w:p>
+            <w:pPr>
+              <w:keepNext/>
+              <w:spacing w:after="0" w:before="0" w:line="240" w:lineRule="auto"/>
+              <w:jc w:val="center"/>
+              <w:rPr>
+                <w:b w:val="false"/>
+                <w:bCs w:val="false"/>
+                <w:sz w:val="18"/>
+                <w:szCs w:val="18"/>
+              </w:rPr>
+            </w:pPr>
+            <w:r>
+              <w:rPr>
+                <w:rFonts w:ascii="Times New Roman" w:cs="Times New Roman" w:eastAsia="Times New Roman" w:hAnsi="Times New Roman"/>
+                <w:b w:val="false"/>
+                <w:bCs w:val="false"/>
+                <w:sz w:val="18"/>
+                <w:szCs w:val="18"/>
+              </w:rPr>
+              <w:t xml:space="preserve">.755</w:t>
+            </w:r>
+          </w:p>
+        </w:tc>
+        <w:tc>
+          <w:tcPr>
+            <w:tcW w:type="dxa" w:w="760"/>
+            <w:tcBorders>
+              <w:top w:val="single" w:color="808080" w:sz="4"/>
+              <w:left w:val="single" w:color="808080" w:sz="4"/>
+              <w:bottom w:val="single" w:color="808080" w:sz="4"/>
+              <w:right w:val="single" w:color="808080" w:sz="4"/>
+            </w:tcBorders>
+            <w:tcMar>
+              <w:top w:type="dxa" w:w="40"/>
+              <w:left w:type="dxa" w:w="45"/>
+              <w:bottom w:type="dxa" w:w="40"/>
+              <w:right w:type="dxa" w:w="45"/>
+            </w:tcMar>
+            <w:vAlign w:val="center"/>
+          </w:tcPr>
+          <w:p>
+            <w:pPr>
+              <w:keepNext/>
+              <w:spacing w:after="0" w:before="0" w:line="240" w:lineRule="auto"/>
+              <w:jc w:val="center"/>
+              <w:rPr>
+                <w:b w:val="false"/>
+                <w:bCs w:val="false"/>
+                <w:sz w:val="18"/>
+                <w:szCs w:val="18"/>
+              </w:rPr>
+            </w:pPr>
+            <w:r>
+              <w:rPr>
+                <w:rFonts w:ascii="Times New Roman" w:cs="Times New Roman" w:eastAsia="Times New Roman" w:hAnsi="Times New Roman"/>
+                <w:b w:val="false"/>
+                <w:bCs w:val="false"/>
+                <w:sz w:val="18"/>
+                <w:szCs w:val="18"/>
+              </w:rPr>
+              <w:t xml:space="preserve">.0578</w:t>
+            </w:r>
+          </w:p>
+        </w:tc>
+        <w:tc>
+          <w:tcPr>
             <w:tcW w:type="dxa" w:w="700"/>
-            <w:tcBorders>
-              <w:top w:val="single" w:color="808080" w:sz="4"/>
-              <w:left w:val="single" w:color="808080" w:sz="4"/>
-              <w:bottom w:val="single" w:color="808080" w:sz="4"/>
-              <w:right w:val="single" w:color="808080" w:sz="4"/>
-            </w:tcBorders>
-            <w:tcMar>
-              <w:top w:type="dxa" w:w="40"/>
-              <w:left w:type="dxa" w:w="45"/>
-              <w:bottom w:type="dxa" w:w="40"/>
-              <w:right w:type="dxa" w:w="45"/>
-            </w:tcMar>
-            <w:vAlign w:val="center"/>
-          </w:tcPr>
-          <w:p>
-            <w:pPr>
-              <w:keepNext/>
-              <w:spacing w:after="0" w:before="0" w:line="240" w:lineRule="auto"/>
-              <w:jc w:val="center"/>
-              <w:rPr>
-                <w:b w:val="false"/>
-                <w:bCs w:val="false"/>
-                <w:sz w:val="18"/>
-                <w:szCs w:val="18"/>
-              </w:rPr>
-            </w:pPr>
-            <w:r>
-              <w:rPr>
-                <w:rFonts w:ascii="Times New Roman" w:cs="Times New Roman" w:eastAsia="Times New Roman" w:hAnsi="Times New Roman"/>
-                <w:b w:val="false"/>
-                <w:bCs w:val="false"/>
-                <w:sz w:val="18"/>
-                <w:szCs w:val="18"/>
-              </w:rPr>
-              <w:t xml:space="preserve">6.61</w:t>
-            </w:r>
-          </w:p>
-        </w:tc>
-        <w:tc>
-          <w:tcPr>
-            <w:tcW w:type="dxa" w:w="700"/>
-            <w:tcBorders>
-              <w:top w:val="single" w:color="808080" w:sz="4"/>
-              <w:left w:val="single" w:color="808080" w:sz="4"/>
-              <w:bottom w:val="single" w:color="808080" w:sz="4"/>
-              <w:right w:val="single" w:color="808080" w:sz="4"/>
-            </w:tcBorders>
-            <w:tcMar>
-              <w:top w:type="dxa" w:w="40"/>
-              <w:left w:type="dxa" w:w="45"/>
-              <w:bottom w:type="dxa" w:w="40"/>
-              <w:right w:type="dxa" w:w="45"/>
-            </w:tcMar>
-            <w:vAlign w:val="center"/>
-          </w:tcPr>
-          <w:p>
-            <w:pPr>
-              <w:keepNext/>
-              <w:spacing w:after="0" w:before="0" w:line="240" w:lineRule="auto"/>
-              <w:jc w:val="center"/>
-              <w:rPr>
-                <w:b w:val="false"/>
-                <w:bCs w:val="false"/>
-                <w:sz w:val="18"/>
-                <w:szCs w:val="18"/>
-              </w:rPr>
-            </w:pPr>
-            <w:r>
-              <w:rPr>
-                <w:rFonts w:ascii="Times New Roman" w:cs="Times New Roman" w:eastAsia="Times New Roman" w:hAnsi="Times New Roman"/>
-                <w:b w:val="false"/>
-                <w:bCs w:val="false"/>
-                <w:sz w:val="18"/>
-                <w:szCs w:val="18"/>
-              </w:rPr>
-              <w:t xml:space="preserve">.755</w:t>
-            </w:r>
-          </w:p>
-        </w:tc>
-        <w:tc>
-          <w:tcPr>
-            <w:tcW w:type="dxa" w:w="900"/>
-            <w:tcBorders>
-              <w:top w:val="single" w:color="808080" w:sz="4"/>
-              <w:left w:val="single" w:color="808080" w:sz="4"/>
-              <w:bottom w:val="single" w:color="808080" w:sz="4"/>
-              <w:right w:val="single" w:color="808080" w:sz="4"/>
-            </w:tcBorders>
-            <w:tcMar>
-              <w:top w:type="dxa" w:w="40"/>
-              <w:left w:type="dxa" w:w="45"/>
-              <w:bottom w:type="dxa" w:w="40"/>
-              <w:right w:type="dxa" w:w="45"/>
-            </w:tcMar>
-            <w:vAlign w:val="center"/>
-          </w:tcPr>
-          <w:p>
-            <w:pPr>
-              <w:keepNext/>
-              <w:spacing w:after="0" w:before="0" w:line="240" w:lineRule="auto"/>
-              <w:jc w:val="center"/>
-              <w:rPr>
-                <w:b w:val="false"/>
-                <w:bCs w:val="false"/>
-                <w:sz w:val="18"/>
-                <w:szCs w:val="18"/>
-              </w:rPr>
-            </w:pPr>
-            <w:r>
-              <w:rPr>
-                <w:rFonts w:ascii="Times New Roman" w:cs="Times New Roman" w:eastAsia="Times New Roman" w:hAnsi="Times New Roman"/>
-                <w:b w:val="false"/>
-                <w:bCs w:val="false"/>
-                <w:sz w:val="18"/>
-                <w:szCs w:val="18"/>
-              </w:rPr>
-              <w:t xml:space="preserve">.0578</w:t>
-            </w:r>
-          </w:p>
-        </w:tc>
-        <w:tc>
-          <w:tcPr>
-            <w:tcW w:type="dxa" w:w="850"/>
             <w:tcBorders>
               <w:top w:val="single" w:color="808080" w:sz="4"/>
               <w:left w:val="single" w:color="808080" w:sz="4"/>
@@ -11233,7 +11248,7 @@
         </w:trPr>
         <w:tc>
           <w:tcPr>
-            <w:tcW w:type="dxa" w:w="1040"/>
+            <w:tcW w:type="dxa" w:w="1280"/>
             <w:tcBorders>
               <w:top w:val="single" w:color="808080" w:sz="4"/>
               <w:left w:val="single" w:color="808080" w:sz="4"/>
@@ -11274,7 +11289,7 @@
         </w:tc>
         <w:tc>
           <w:tcPr>
-            <w:tcW w:type="dxa" w:w="850"/>
+            <w:tcW w:type="dxa" w:w="900"/>
             <w:tcBorders>
               <w:top w:val="single" w:color="808080" w:sz="4"/>
               <w:left w:val="single" w:color="808080" w:sz="4"/>
@@ -11315,130 +11330,130 @@
         </w:tc>
         <w:tc>
           <w:tcPr>
+            <w:tcW w:type="dxa" w:w="660"/>
+            <w:tcBorders>
+              <w:top w:val="single" w:color="808080" w:sz="4"/>
+              <w:left w:val="single" w:color="808080" w:sz="4"/>
+              <w:bottom w:val="single" w:color="808080" w:sz="4"/>
+              <w:right w:val="single" w:color="808080" w:sz="4"/>
+            </w:tcBorders>
+            <w:tcMar>
+              <w:top w:type="dxa" w:w="40"/>
+              <w:left w:type="dxa" w:w="45"/>
+              <w:bottom w:type="dxa" w:w="40"/>
+              <w:right w:type="dxa" w:w="45"/>
+            </w:tcMar>
+            <w:vAlign w:val="center"/>
+          </w:tcPr>
+          <w:p>
+            <w:pPr>
+              <w:keepNext/>
+              <w:spacing w:after="0" w:before="0" w:line="240" w:lineRule="auto"/>
+              <w:jc w:val="center"/>
+              <w:rPr>
+                <w:b w:val="false"/>
+                <w:bCs w:val="false"/>
+                <w:sz w:val="18"/>
+                <w:szCs w:val="18"/>
+              </w:rPr>
+            </w:pPr>
+            <w:r>
+              <w:rPr>
+                <w:rFonts w:ascii="Times New Roman" w:cs="Times New Roman" w:eastAsia="Times New Roman" w:hAnsi="Times New Roman"/>
+                <w:b w:val="false"/>
+                <w:bCs w:val="false"/>
+                <w:sz w:val="18"/>
+                <w:szCs w:val="18"/>
+              </w:rPr>
+              <w:t xml:space="preserve">6.61</w:t>
+            </w:r>
+          </w:p>
+        </w:tc>
+        <w:tc>
+          <w:tcPr>
+            <w:tcW w:type="dxa" w:w="740"/>
+            <w:tcBorders>
+              <w:top w:val="single" w:color="808080" w:sz="4"/>
+              <w:left w:val="single" w:color="808080" w:sz="4"/>
+              <w:bottom w:val="single" w:color="808080" w:sz="4"/>
+              <w:right w:val="single" w:color="808080" w:sz="4"/>
+            </w:tcBorders>
+            <w:tcMar>
+              <w:top w:type="dxa" w:w="40"/>
+              <w:left w:type="dxa" w:w="45"/>
+              <w:bottom w:type="dxa" w:w="40"/>
+              <w:right w:type="dxa" w:w="45"/>
+            </w:tcMar>
+            <w:vAlign w:val="center"/>
+          </w:tcPr>
+          <w:p>
+            <w:pPr>
+              <w:keepNext/>
+              <w:spacing w:after="0" w:before="0" w:line="240" w:lineRule="auto"/>
+              <w:jc w:val="center"/>
+              <w:rPr>
+                <w:b w:val="false"/>
+                <w:bCs w:val="false"/>
+                <w:sz w:val="18"/>
+                <w:szCs w:val="18"/>
+              </w:rPr>
+            </w:pPr>
+            <w:r>
+              <w:rPr>
+                <w:rFonts w:ascii="Times New Roman" w:cs="Times New Roman" w:eastAsia="Times New Roman" w:hAnsi="Times New Roman"/>
+                <w:b w:val="false"/>
+                <w:bCs w:val="false"/>
+                <w:sz w:val="18"/>
+                <w:szCs w:val="18"/>
+              </w:rPr>
+              <w:t xml:space="preserve">.750</w:t>
+            </w:r>
+          </w:p>
+        </w:tc>
+        <w:tc>
+          <w:tcPr>
+            <w:tcW w:type="dxa" w:w="760"/>
+            <w:tcBorders>
+              <w:top w:val="single" w:color="808080" w:sz="4"/>
+              <w:left w:val="single" w:color="808080" w:sz="4"/>
+              <w:bottom w:val="single" w:color="808080" w:sz="4"/>
+              <w:right w:val="single" w:color="808080" w:sz="4"/>
+            </w:tcBorders>
+            <w:tcMar>
+              <w:top w:type="dxa" w:w="40"/>
+              <w:left w:type="dxa" w:w="45"/>
+              <w:bottom w:type="dxa" w:w="40"/>
+              <w:right w:type="dxa" w:w="45"/>
+            </w:tcMar>
+            <w:vAlign w:val="center"/>
+          </w:tcPr>
+          <w:p>
+            <w:pPr>
+              <w:keepNext/>
+              <w:spacing w:after="0" w:before="0" w:line="240" w:lineRule="auto"/>
+              <w:jc w:val="center"/>
+              <w:rPr>
+                <w:b w:val="false"/>
+                <w:bCs w:val="false"/>
+                <w:sz w:val="18"/>
+                <w:szCs w:val="18"/>
+              </w:rPr>
+            </w:pPr>
+            <w:r>
+              <w:rPr>
+                <w:rFonts w:ascii="Times New Roman" w:cs="Times New Roman" w:eastAsia="Times New Roman" w:hAnsi="Times New Roman"/>
+                <w:b w:val="false"/>
+                <w:bCs w:val="false"/>
+                <w:sz w:val="18"/>
+                <w:szCs w:val="18"/>
+              </w:rPr>
+              <w:t xml:space="preserve">.0583</w:t>
+            </w:r>
+          </w:p>
+        </w:tc>
+        <w:tc>
+          <w:tcPr>
             <w:tcW w:type="dxa" w:w="700"/>
-            <w:tcBorders>
-              <w:top w:val="single" w:color="808080" w:sz="4"/>
-              <w:left w:val="single" w:color="808080" w:sz="4"/>
-              <w:bottom w:val="single" w:color="808080" w:sz="4"/>
-              <w:right w:val="single" w:color="808080" w:sz="4"/>
-            </w:tcBorders>
-            <w:tcMar>
-              <w:top w:type="dxa" w:w="40"/>
-              <w:left w:type="dxa" w:w="45"/>
-              <w:bottom w:type="dxa" w:w="40"/>
-              <w:right w:type="dxa" w:w="45"/>
-            </w:tcMar>
-            <w:vAlign w:val="center"/>
-          </w:tcPr>
-          <w:p>
-            <w:pPr>
-              <w:keepNext/>
-              <w:spacing w:after="0" w:before="0" w:line="240" w:lineRule="auto"/>
-              <w:jc w:val="center"/>
-              <w:rPr>
-                <w:b w:val="false"/>
-                <w:bCs w:val="false"/>
-                <w:sz w:val="18"/>
-                <w:szCs w:val="18"/>
-              </w:rPr>
-            </w:pPr>
-            <w:r>
-              <w:rPr>
-                <w:rFonts w:ascii="Times New Roman" w:cs="Times New Roman" w:eastAsia="Times New Roman" w:hAnsi="Times New Roman"/>
-                <w:b w:val="false"/>
-                <w:bCs w:val="false"/>
-                <w:sz w:val="18"/>
-                <w:szCs w:val="18"/>
-              </w:rPr>
-              <w:t xml:space="preserve">6.61</w:t>
-            </w:r>
-          </w:p>
-        </w:tc>
-        <w:tc>
-          <w:tcPr>
-            <w:tcW w:type="dxa" w:w="700"/>
-            <w:tcBorders>
-              <w:top w:val="single" w:color="808080" w:sz="4"/>
-              <w:left w:val="single" w:color="808080" w:sz="4"/>
-              <w:bottom w:val="single" w:color="808080" w:sz="4"/>
-              <w:right w:val="single" w:color="808080" w:sz="4"/>
-            </w:tcBorders>
-            <w:tcMar>
-              <w:top w:type="dxa" w:w="40"/>
-              <w:left w:type="dxa" w:w="45"/>
-              <w:bottom w:type="dxa" w:w="40"/>
-              <w:right w:type="dxa" w:w="45"/>
-            </w:tcMar>
-            <w:vAlign w:val="center"/>
-          </w:tcPr>
-          <w:p>
-            <w:pPr>
-              <w:keepNext/>
-              <w:spacing w:after="0" w:before="0" w:line="240" w:lineRule="auto"/>
-              <w:jc w:val="center"/>
-              <w:rPr>
-                <w:b w:val="false"/>
-                <w:bCs w:val="false"/>
-                <w:sz w:val="18"/>
-                <w:szCs w:val="18"/>
-              </w:rPr>
-            </w:pPr>
-            <w:r>
-              <w:rPr>
-                <w:rFonts w:ascii="Times New Roman" w:cs="Times New Roman" w:eastAsia="Times New Roman" w:hAnsi="Times New Roman"/>
-                <w:b w:val="false"/>
-                <w:bCs w:val="false"/>
-                <w:sz w:val="18"/>
-                <w:szCs w:val="18"/>
-              </w:rPr>
-              <w:t xml:space="preserve">.750</w:t>
-            </w:r>
-          </w:p>
-        </w:tc>
-        <w:tc>
-          <w:tcPr>
-            <w:tcW w:type="dxa" w:w="900"/>
-            <w:tcBorders>
-              <w:top w:val="single" w:color="808080" w:sz="4"/>
-              <w:left w:val="single" w:color="808080" w:sz="4"/>
-              <w:bottom w:val="single" w:color="808080" w:sz="4"/>
-              <w:right w:val="single" w:color="808080" w:sz="4"/>
-            </w:tcBorders>
-            <w:tcMar>
-              <w:top w:type="dxa" w:w="40"/>
-              <w:left w:type="dxa" w:w="45"/>
-              <w:bottom w:type="dxa" w:w="40"/>
-              <w:right w:type="dxa" w:w="45"/>
-            </w:tcMar>
-            <w:vAlign w:val="center"/>
-          </w:tcPr>
-          <w:p>
-            <w:pPr>
-              <w:keepNext/>
-              <w:spacing w:after="0" w:before="0" w:line="240" w:lineRule="auto"/>
-              <w:jc w:val="center"/>
-              <w:rPr>
-                <w:b w:val="false"/>
-                <w:bCs w:val="false"/>
-                <w:sz w:val="18"/>
-                <w:szCs w:val="18"/>
-              </w:rPr>
-            </w:pPr>
-            <w:r>
-              <w:rPr>
-                <w:rFonts w:ascii="Times New Roman" w:cs="Times New Roman" w:eastAsia="Times New Roman" w:hAnsi="Times New Roman"/>
-                <w:b w:val="false"/>
-                <w:bCs w:val="false"/>
-                <w:sz w:val="18"/>
-                <w:szCs w:val="18"/>
-              </w:rPr>
-              <w:t xml:space="preserve">.0583</w:t>
-            </w:r>
-          </w:p>
-        </w:tc>
-        <w:tc>
-          <w:tcPr>
-            <w:tcW w:type="dxa" w:w="850"/>
             <w:tcBorders>
               <w:top w:val="single" w:color="808080" w:sz="4"/>
               <w:left w:val="single" w:color="808080" w:sz="4"/>
@@ -11485,7 +11500,7 @@
         </w:trPr>
         <w:tc>
           <w:tcPr>
-            <w:tcW w:type="dxa" w:w="1040"/>
+            <w:tcW w:type="dxa" w:w="1280"/>
             <w:tcBorders>
               <w:top w:val="single" w:color="808080" w:sz="4"/>
               <w:left w:val="single" w:color="808080" w:sz="4"/>
@@ -11526,7 +11541,7 @@
         </w:tc>
         <w:tc>
           <w:tcPr>
-            <w:tcW w:type="dxa" w:w="850"/>
+            <w:tcW w:type="dxa" w:w="900"/>
             <w:tcBorders>
               <w:top w:val="single" w:color="808080" w:sz="4"/>
               <w:left w:val="single" w:color="808080" w:sz="4"/>
@@ -11567,130 +11582,130 @@
         </w:tc>
         <w:tc>
           <w:tcPr>
+            <w:tcW w:type="dxa" w:w="660"/>
+            <w:tcBorders>
+              <w:top w:val="single" w:color="808080" w:sz="4"/>
+              <w:left w:val="single" w:color="808080" w:sz="4"/>
+              <w:bottom w:val="single" w:color="808080" w:sz="4"/>
+              <w:right w:val="single" w:color="808080" w:sz="4"/>
+            </w:tcBorders>
+            <w:tcMar>
+              <w:top w:type="dxa" w:w="40"/>
+              <w:left w:type="dxa" w:w="45"/>
+              <w:bottom w:type="dxa" w:w="40"/>
+              <w:right w:type="dxa" w:w="45"/>
+            </w:tcMar>
+            <w:vAlign w:val="center"/>
+          </w:tcPr>
+          <w:p>
+            <w:pPr>
+              <w:keepNext/>
+              <w:spacing w:after="0" w:before="0" w:line="240" w:lineRule="auto"/>
+              <w:jc w:val="center"/>
+              <w:rPr>
+                <w:b w:val="false"/>
+                <w:bCs w:val="false"/>
+                <w:sz w:val="18"/>
+                <w:szCs w:val="18"/>
+              </w:rPr>
+            </w:pPr>
+            <w:r>
+              <w:rPr>
+                <w:rFonts w:ascii="Times New Roman" w:cs="Times New Roman" w:eastAsia="Times New Roman" w:hAnsi="Times New Roman"/>
+                <w:b w:val="false"/>
+                <w:bCs w:val="false"/>
+                <w:sz w:val="18"/>
+                <w:szCs w:val="18"/>
+              </w:rPr>
+              <w:t xml:space="preserve">6.61</w:t>
+            </w:r>
+          </w:p>
+        </w:tc>
+        <w:tc>
+          <w:tcPr>
+            <w:tcW w:type="dxa" w:w="740"/>
+            <w:tcBorders>
+              <w:top w:val="single" w:color="808080" w:sz="4"/>
+              <w:left w:val="single" w:color="808080" w:sz="4"/>
+              <w:bottom w:val="single" w:color="808080" w:sz="4"/>
+              <w:right w:val="single" w:color="808080" w:sz="4"/>
+            </w:tcBorders>
+            <w:tcMar>
+              <w:top w:type="dxa" w:w="40"/>
+              <w:left w:type="dxa" w:w="45"/>
+              <w:bottom w:type="dxa" w:w="40"/>
+              <w:right w:type="dxa" w:w="45"/>
+            </w:tcMar>
+            <w:vAlign w:val="center"/>
+          </w:tcPr>
+          <w:p>
+            <w:pPr>
+              <w:keepNext/>
+              <w:spacing w:after="0" w:before="0" w:line="240" w:lineRule="auto"/>
+              <w:jc w:val="center"/>
+              <w:rPr>
+                <w:b w:val="false"/>
+                <w:bCs w:val="false"/>
+                <w:sz w:val="18"/>
+                <w:szCs w:val="18"/>
+              </w:rPr>
+            </w:pPr>
+            <w:r>
+              <w:rPr>
+                <w:rFonts w:ascii="Times New Roman" w:cs="Times New Roman" w:eastAsia="Times New Roman" w:hAnsi="Times New Roman"/>
+                <w:b w:val="false"/>
+                <w:bCs w:val="false"/>
+                <w:sz w:val="18"/>
+                <w:szCs w:val="18"/>
+              </w:rPr>
+              <w:t xml:space="preserve">.763</w:t>
+            </w:r>
+          </w:p>
+        </w:tc>
+        <w:tc>
+          <w:tcPr>
+            <w:tcW w:type="dxa" w:w="760"/>
+            <w:tcBorders>
+              <w:top w:val="single" w:color="808080" w:sz="4"/>
+              <w:left w:val="single" w:color="808080" w:sz="4"/>
+              <w:bottom w:val="single" w:color="808080" w:sz="4"/>
+              <w:right w:val="single" w:color="808080" w:sz="4"/>
+            </w:tcBorders>
+            <w:tcMar>
+              <w:top w:type="dxa" w:w="40"/>
+              <w:left w:type="dxa" w:w="45"/>
+              <w:bottom w:type="dxa" w:w="40"/>
+              <w:right w:type="dxa" w:w="45"/>
+            </w:tcMar>
+            <w:vAlign w:val="center"/>
+          </w:tcPr>
+          <w:p>
+            <w:pPr>
+              <w:keepNext/>
+              <w:spacing w:after="0" w:before="0" w:line="240" w:lineRule="auto"/>
+              <w:jc w:val="center"/>
+              <w:rPr>
+                <w:b w:val="false"/>
+                <w:bCs w:val="false"/>
+                <w:sz w:val="18"/>
+                <w:szCs w:val="18"/>
+              </w:rPr>
+            </w:pPr>
+            <w:r>
+              <w:rPr>
+                <w:rFonts w:ascii="Times New Roman" w:cs="Times New Roman" w:eastAsia="Times New Roman" w:hAnsi="Times New Roman"/>
+                <w:b w:val="false"/>
+                <w:bCs w:val="false"/>
+                <w:sz w:val="18"/>
+                <w:szCs w:val="18"/>
+              </w:rPr>
+              <w:t xml:space="preserve">.0641</w:t>
+            </w:r>
+          </w:p>
+        </w:tc>
+        <w:tc>
+          <w:tcPr>
             <w:tcW w:type="dxa" w:w="700"/>
-            <w:tcBorders>
-              <w:top w:val="single" w:color="808080" w:sz="4"/>
-              <w:left w:val="single" w:color="808080" w:sz="4"/>
-              <w:bottom w:val="single" w:color="808080" w:sz="4"/>
-              <w:right w:val="single" w:color="808080" w:sz="4"/>
-            </w:tcBorders>
-            <w:tcMar>
-              <w:top w:type="dxa" w:w="40"/>
-              <w:left w:type="dxa" w:w="45"/>
-              <w:bottom w:type="dxa" w:w="40"/>
-              <w:right w:type="dxa" w:w="45"/>
-            </w:tcMar>
-            <w:vAlign w:val="center"/>
-          </w:tcPr>
-          <w:p>
-            <w:pPr>
-              <w:keepNext/>
-              <w:spacing w:after="0" w:before="0" w:line="240" w:lineRule="auto"/>
-              <w:jc w:val="center"/>
-              <w:rPr>
-                <w:b w:val="false"/>
-                <w:bCs w:val="false"/>
-                <w:sz w:val="18"/>
-                <w:szCs w:val="18"/>
-              </w:rPr>
-            </w:pPr>
-            <w:r>
-              <w:rPr>
-                <w:rFonts w:ascii="Times New Roman" w:cs="Times New Roman" w:eastAsia="Times New Roman" w:hAnsi="Times New Roman"/>
-                <w:b w:val="false"/>
-                <w:bCs w:val="false"/>
-                <w:sz w:val="18"/>
-                <w:szCs w:val="18"/>
-              </w:rPr>
-              <w:t xml:space="preserve">6.61</w:t>
-            </w:r>
-          </w:p>
-        </w:tc>
-        <w:tc>
-          <w:tcPr>
-            <w:tcW w:type="dxa" w:w="700"/>
-            <w:tcBorders>
-              <w:top w:val="single" w:color="808080" w:sz="4"/>
-              <w:left w:val="single" w:color="808080" w:sz="4"/>
-              <w:bottom w:val="single" w:color="808080" w:sz="4"/>
-              <w:right w:val="single" w:color="808080" w:sz="4"/>
-            </w:tcBorders>
-            <w:tcMar>
-              <w:top w:type="dxa" w:w="40"/>
-              <w:left w:type="dxa" w:w="45"/>
-              <w:bottom w:type="dxa" w:w="40"/>
-              <w:right w:type="dxa" w:w="45"/>
-            </w:tcMar>
-            <w:vAlign w:val="center"/>
-          </w:tcPr>
-          <w:p>
-            <w:pPr>
-              <w:keepNext/>
-              <w:spacing w:after="0" w:before="0" w:line="240" w:lineRule="auto"/>
-              <w:jc w:val="center"/>
-              <w:rPr>
-                <w:b w:val="false"/>
-                <w:bCs w:val="false"/>
-                <w:sz w:val="18"/>
-                <w:szCs w:val="18"/>
-              </w:rPr>
-            </w:pPr>
-            <w:r>
-              <w:rPr>
-                <w:rFonts w:ascii="Times New Roman" w:cs="Times New Roman" w:eastAsia="Times New Roman" w:hAnsi="Times New Roman"/>
-                <w:b w:val="false"/>
-                <w:bCs w:val="false"/>
-                <w:sz w:val="18"/>
-                <w:szCs w:val="18"/>
-              </w:rPr>
-              <w:t xml:space="preserve">.763</w:t>
-            </w:r>
-          </w:p>
-        </w:tc>
-        <w:tc>
-          <w:tcPr>
-            <w:tcW w:type="dxa" w:w="900"/>
-            <w:tcBorders>
-              <w:top w:val="single" w:color="808080" w:sz="4"/>
-              <w:left w:val="single" w:color="808080" w:sz="4"/>
-              <w:bottom w:val="single" w:color="808080" w:sz="4"/>
-              <w:right w:val="single" w:color="808080" w:sz="4"/>
-            </w:tcBorders>
-            <w:tcMar>
-              <w:top w:type="dxa" w:w="40"/>
-              <w:left w:type="dxa" w:w="45"/>
-              <w:bottom w:type="dxa" w:w="40"/>
-              <w:right w:type="dxa" w:w="45"/>
-            </w:tcMar>
-            <w:vAlign w:val="center"/>
-          </w:tcPr>
-          <w:p>
-            <w:pPr>
-              <w:keepNext/>
-              <w:spacing w:after="0" w:before="0" w:line="240" w:lineRule="auto"/>
-              <w:jc w:val="center"/>
-              <w:rPr>
-                <w:b w:val="false"/>
-                <w:bCs w:val="false"/>
-                <w:sz w:val="18"/>
-                <w:szCs w:val="18"/>
-              </w:rPr>
-            </w:pPr>
-            <w:r>
-              <w:rPr>
-                <w:rFonts w:ascii="Times New Roman" w:cs="Times New Roman" w:eastAsia="Times New Roman" w:hAnsi="Times New Roman"/>
-                <w:b w:val="false"/>
-                <w:bCs w:val="false"/>
-                <w:sz w:val="18"/>
-                <w:szCs w:val="18"/>
-              </w:rPr>
-              <w:t xml:space="preserve">.0641</w:t>
-            </w:r>
-          </w:p>
-        </w:tc>
-        <w:tc>
-          <w:tcPr>
-            <w:tcW w:type="dxa" w:w="850"/>
             <w:tcBorders>
               <w:top w:val="single" w:color="808080" w:sz="4"/>
               <w:left w:val="single" w:color="808080" w:sz="4"/>
@@ -11737,7 +11752,7 @@
         </w:trPr>
         <w:tc>
           <w:tcPr>
-            <w:tcW w:type="dxa" w:w="1040"/>
+            <w:tcW w:type="dxa" w:w="1280"/>
             <w:tcBorders>
               <w:top w:val="single" w:color="808080" w:sz="4"/>
               <w:left w:val="single" w:color="808080" w:sz="4"/>
@@ -11778,7 +11793,7 @@
         </w:tc>
         <w:tc>
           <w:tcPr>
-            <w:tcW w:type="dxa" w:w="850"/>
+            <w:tcW w:type="dxa" w:w="900"/>
             <w:tcBorders>
               <w:top w:val="single" w:color="808080" w:sz="4"/>
               <w:left w:val="single" w:color="808080" w:sz="4"/>
@@ -11819,130 +11834,130 @@
         </w:tc>
         <w:tc>
           <w:tcPr>
+            <w:tcW w:type="dxa" w:w="660"/>
+            <w:tcBorders>
+              <w:top w:val="single" w:color="808080" w:sz="4"/>
+              <w:left w:val="single" w:color="808080" w:sz="4"/>
+              <w:bottom w:val="single" w:color="808080" w:sz="4"/>
+              <w:right w:val="single" w:color="808080" w:sz="4"/>
+            </w:tcBorders>
+            <w:tcMar>
+              <w:top w:type="dxa" w:w="40"/>
+              <w:left w:type="dxa" w:w="45"/>
+              <w:bottom w:type="dxa" w:w="40"/>
+              <w:right w:type="dxa" w:w="45"/>
+            </w:tcMar>
+            <w:vAlign w:val="center"/>
+          </w:tcPr>
+          <w:p>
+            <w:pPr>
+              <w:keepNext w:val="false"/>
+              <w:spacing w:after="0" w:before="0" w:line="240" w:lineRule="auto"/>
+              <w:jc w:val="center"/>
+              <w:rPr>
+                <w:b w:val="false"/>
+                <w:bCs w:val="false"/>
+                <w:sz w:val="18"/>
+                <w:szCs w:val="18"/>
+              </w:rPr>
+            </w:pPr>
+            <w:r>
+              <w:rPr>
+                <w:rFonts w:ascii="Times New Roman" w:cs="Times New Roman" w:eastAsia="Times New Roman" w:hAnsi="Times New Roman"/>
+                <w:b w:val="false"/>
+                <w:bCs w:val="false"/>
+                <w:sz w:val="18"/>
+                <w:szCs w:val="18"/>
+              </w:rPr>
+              <w:t xml:space="preserve">6.61</w:t>
+            </w:r>
+          </w:p>
+        </w:tc>
+        <w:tc>
+          <w:tcPr>
+            <w:tcW w:type="dxa" w:w="740"/>
+            <w:tcBorders>
+              <w:top w:val="single" w:color="808080" w:sz="4"/>
+              <w:left w:val="single" w:color="808080" w:sz="4"/>
+              <w:bottom w:val="single" w:color="808080" w:sz="4"/>
+              <w:right w:val="single" w:color="808080" w:sz="4"/>
+            </w:tcBorders>
+            <w:tcMar>
+              <w:top w:type="dxa" w:w="40"/>
+              <w:left w:type="dxa" w:w="45"/>
+              <w:bottom w:type="dxa" w:w="40"/>
+              <w:right w:type="dxa" w:w="45"/>
+            </w:tcMar>
+            <w:vAlign w:val="center"/>
+          </w:tcPr>
+          <w:p>
+            <w:pPr>
+              <w:keepNext w:val="false"/>
+              <w:spacing w:after="0" w:before="0" w:line="240" w:lineRule="auto"/>
+              <w:jc w:val="center"/>
+              <w:rPr>
+                <w:b w:val="false"/>
+                <w:bCs w:val="false"/>
+                <w:sz w:val="18"/>
+                <w:szCs w:val="18"/>
+              </w:rPr>
+            </w:pPr>
+            <w:r>
+              <w:rPr>
+                <w:rFonts w:ascii="Times New Roman" w:cs="Times New Roman" w:eastAsia="Times New Roman" w:hAnsi="Times New Roman"/>
+                <w:b w:val="false"/>
+                <w:bCs w:val="false"/>
+                <w:sz w:val="18"/>
+                <w:szCs w:val="18"/>
+              </w:rPr>
+              <w:t xml:space="preserve">.758</w:t>
+            </w:r>
+          </w:p>
+        </w:tc>
+        <w:tc>
+          <w:tcPr>
+            <w:tcW w:type="dxa" w:w="760"/>
+            <w:tcBorders>
+              <w:top w:val="single" w:color="808080" w:sz="4"/>
+              <w:left w:val="single" w:color="808080" w:sz="4"/>
+              <w:bottom w:val="single" w:color="808080" w:sz="4"/>
+              <w:right w:val="single" w:color="808080" w:sz="4"/>
+            </w:tcBorders>
+            <w:tcMar>
+              <w:top w:type="dxa" w:w="40"/>
+              <w:left w:type="dxa" w:w="45"/>
+              <w:bottom w:type="dxa" w:w="40"/>
+              <w:right w:type="dxa" w:w="45"/>
+            </w:tcMar>
+            <w:vAlign w:val="center"/>
+          </w:tcPr>
+          <w:p>
+            <w:pPr>
+              <w:keepNext w:val="false"/>
+              <w:spacing w:after="0" w:before="0" w:line="240" w:lineRule="auto"/>
+              <w:jc w:val="center"/>
+              <w:rPr>
+                <w:b w:val="false"/>
+                <w:bCs w:val="false"/>
+                <w:sz w:val="18"/>
+                <w:szCs w:val="18"/>
+              </w:rPr>
+            </w:pPr>
+            <w:r>
+              <w:rPr>
+                <w:rFonts w:ascii="Times New Roman" w:cs="Times New Roman" w:eastAsia="Times New Roman" w:hAnsi="Times New Roman"/>
+                <w:b w:val="false"/>
+                <w:bCs w:val="false"/>
+                <w:sz w:val="18"/>
+                <w:szCs w:val="18"/>
+              </w:rPr>
+              <w:t xml:space="preserve">.0575</w:t>
+            </w:r>
+          </w:p>
+        </w:tc>
+        <w:tc>
+          <w:tcPr>
             <w:tcW w:type="dxa" w:w="700"/>
-            <w:tcBorders>
-              <w:top w:val="single" w:color="808080" w:sz="4"/>
-              <w:left w:val="single" w:color="808080" w:sz="4"/>
-              <w:bottom w:val="single" w:color="808080" w:sz="4"/>
-              <w:right w:val="single" w:color="808080" w:sz="4"/>
-            </w:tcBorders>
-            <w:tcMar>
-              <w:top w:type="dxa" w:w="40"/>
-              <w:left w:type="dxa" w:w="45"/>
-              <w:bottom w:type="dxa" w:w="40"/>
-              <w:right w:type="dxa" w:w="45"/>
-            </w:tcMar>
-            <w:vAlign w:val="center"/>
-          </w:tcPr>
-          <w:p>
-            <w:pPr>
-              <w:keepNext w:val="false"/>
-              <w:spacing w:after="0" w:before="0" w:line="240" w:lineRule="auto"/>
-              <w:jc w:val="center"/>
-              <w:rPr>
-                <w:b w:val="false"/>
-                <w:bCs w:val="false"/>
-                <w:sz w:val="18"/>
-                <w:szCs w:val="18"/>
-              </w:rPr>
-            </w:pPr>
-            <w:r>
-              <w:rPr>
-                <w:rFonts w:ascii="Times New Roman" w:cs="Times New Roman" w:eastAsia="Times New Roman" w:hAnsi="Times New Roman"/>
-                <w:b w:val="false"/>
-                <w:bCs w:val="false"/>
-                <w:sz w:val="18"/>
-                <w:szCs w:val="18"/>
-              </w:rPr>
-              <w:t xml:space="preserve">6.61</w:t>
-            </w:r>
-          </w:p>
-        </w:tc>
-        <w:tc>
-          <w:tcPr>
-            <w:tcW w:type="dxa" w:w="700"/>
-            <w:tcBorders>
-              <w:top w:val="single" w:color="808080" w:sz="4"/>
-              <w:left w:val="single" w:color="808080" w:sz="4"/>
-              <w:bottom w:val="single" w:color="808080" w:sz="4"/>
-              <w:right w:val="single" w:color="808080" w:sz="4"/>
-            </w:tcBorders>
-            <w:tcMar>
-              <w:top w:type="dxa" w:w="40"/>
-              <w:left w:type="dxa" w:w="45"/>
-              <w:bottom w:type="dxa" w:w="40"/>
-              <w:right w:type="dxa" w:w="45"/>
-            </w:tcMar>
-            <w:vAlign w:val="center"/>
-          </w:tcPr>
-          <w:p>
-            <w:pPr>
-              <w:keepNext w:val="false"/>
-              <w:spacing w:after="0" w:before="0" w:line="240" w:lineRule="auto"/>
-              <w:jc w:val="center"/>
-              <w:rPr>
-                <w:b w:val="false"/>
-                <w:bCs w:val="false"/>
-                <w:sz w:val="18"/>
-                <w:szCs w:val="18"/>
-              </w:rPr>
-            </w:pPr>
-            <w:r>
-              <w:rPr>
-                <w:rFonts w:ascii="Times New Roman" w:cs="Times New Roman" w:eastAsia="Times New Roman" w:hAnsi="Times New Roman"/>
-                <w:b w:val="false"/>
-                <w:bCs w:val="false"/>
-                <w:sz w:val="18"/>
-                <w:szCs w:val="18"/>
-              </w:rPr>
-              <w:t xml:space="preserve">.758</w:t>
-            </w:r>
-          </w:p>
-        </w:tc>
-        <w:tc>
-          <w:tcPr>
-            <w:tcW w:type="dxa" w:w="900"/>
-            <w:tcBorders>
-              <w:top w:val="single" w:color="808080" w:sz="4"/>
-              <w:left w:val="single" w:color="808080" w:sz="4"/>
-              <w:bottom w:val="single" w:color="808080" w:sz="4"/>
-              <w:right w:val="single" w:color="808080" w:sz="4"/>
-            </w:tcBorders>
-            <w:tcMar>
-              <w:top w:type="dxa" w:w="40"/>
-              <w:left w:type="dxa" w:w="45"/>
-              <w:bottom w:type="dxa" w:w="40"/>
-              <w:right w:type="dxa" w:w="45"/>
-            </w:tcMar>
-            <w:vAlign w:val="center"/>
-          </w:tcPr>
-          <w:p>
-            <w:pPr>
-              <w:keepNext w:val="false"/>
-              <w:spacing w:after="0" w:before="0" w:line="240" w:lineRule="auto"/>
-              <w:jc w:val="center"/>
-              <w:rPr>
-                <w:b w:val="false"/>
-                <w:bCs w:val="false"/>
-                <w:sz w:val="18"/>
-                <w:szCs w:val="18"/>
-              </w:rPr>
-            </w:pPr>
-            <w:r>
-              <w:rPr>
-                <w:rFonts w:ascii="Times New Roman" w:cs="Times New Roman" w:eastAsia="Times New Roman" w:hAnsi="Times New Roman"/>
-                <w:b w:val="false"/>
-                <w:bCs w:val="false"/>
-                <w:sz w:val="18"/>
-                <w:szCs w:val="18"/>
-              </w:rPr>
-              <w:t xml:space="preserve">.0575</w:t>
-            </w:r>
-          </w:p>
-        </w:tc>
-        <w:tc>
-          <w:tcPr>
-            <w:tcW w:type="dxa" w:w="850"/>
             <w:tcBorders>
               <w:top w:val="single" w:color="808080" w:sz="4"/>
               <w:left w:val="single" w:color="808080" w:sz="4"/>
@@ -12002,7 +12017,7 @@
           <w:sz w:val="16"/>
           <w:szCs w:val="16"/>
         </w:rPr>
-        <w:t xml:space="preserve">The non-receipt-rate column uses no weights; S8–S11 keep the weighted non-receipt rate at 7.49%. S9 uses frequency weights when fitting, but no weights when filling missing values or checking predictions. S10 weights the primary OOF predictions without refitting. S8 replaces welfare access and keeps six slopes. S7 removes 21 people/four events. S11 changes fold grouping but keeps the study group.
+        <w:t xml:space="preserve">Unw. is the unweighted non-receipt percentage. AUC, Brier and slope are point estimates. This table does not report intervals for them. S8–S11 keep the person-weighted non-receipt rate at 7.49%. S7 keeps adults with usable schooling and office distance. It removes 21 people and four events, so its Brier describes a smaller sample. S8 replaces office distance with a married indicator and keeps six slopes. S9 fits with person weights as frequency weights. It still fills missing values without weights and checks predictions without weights. That fit is not a full survey-design regression. S10 applies person weights to the primary out-of-fold predictions and does not refit. S11 groups the five folds by derived primary sampling unit and keeps the same adults.
 </w:t>
       </w:r>
     </w:p>
@@ -12017,7 +12032,7 @@
           <w:sz w:val="20"/>
           <w:szCs w:val="20"/>
         </w:rPr>
-        <w:t xml:space="preserve">Across alternatives, AUC ranged from 0.736 to 0.763; Brier and calibration slopes also changed.
+        <w:t xml:space="preserve">In Table VIII, AUC runs from 0.750 to 0.763. The lowest Brier is the complete-case row. The highest Brier is the weighted-score row, which reuses the primary predictions. These differences have no intervals. They do not rank the specifications.
 </w:t>
       </w:r>
     </w:p>
@@ -13106,7 +13121,7 @@
           <w:sz w:val="20"/>
           <w:szCs w:val="20"/>
         </w:rPr>
-        <w:t xml:space="preserve">S2d added 68 people but only two events, reducing weighted non-receipt to 7.12%. Partnership rules mainly changed the denominator. S3 retained adults with incompatible grants, added 19 people/15 events and raised non-receipt to 9.06%, the largest tested change. Similar AUC cannot justify screening rules or establish equivalent populations. Ralston studies rural age-eligible people [3]; Godfrey studies households' grants [4]. Different units, programmes, screens and places prevent direct comparison of their percentages. This study adds a provincial estimate with an explicit resource screen. High receipt can involve access costs [13], [14]; it cannot prove low burden.
+        <w:t xml:space="preserve">S2d added 68 people but only two events, reducing weighted non-receipt to 7.12%. Partnership rules mainly changed the denominator. S3 retained adults with incompatible grants, added 19 people/15 events and raised non-receipt to 9.06%, the largest tested change. Table VI gives AUC, Brier and slope as point estimates on those changed denominators, without intervals. Similar AUC cannot justify screening rules or establish equivalent populations. Ralston studies rural age-eligible people [3]; Godfrey studies households' grants [4]. Different units, programmes, screens and places prevent direct comparison of their percentages. This study adds a provincial estimate with an explicit resource screen. High receipt can involve access costs [13], [14]; it cannot prove low burden.
 </w:t>
       </w:r>
     </w:p>
@@ -13150,7 +13165,7 @@
           <w:sz w:val="20"/>
           <w:szCs w:val="20"/>
         </w:rPr>
-        <w:t xml:space="preserve">RQ2 assesses four properties. AUC 0.752 describes ranking held-out non-recipients above recipients, not classification accuracy. AP 0.203 summarises precision–recall ranking across cutoffs against a 6.61% event rate, not precision at one cutoff [16]. Brier fell from 0.0618 to 0.0578: a modest 0.0040 reduction in squared probability error. An intercept correction, with calibration slope fixed at 1, checks average bias. The ideal correction is zero. The estimate 0.020 and interval spanning zero do not prove perfect agreement. Slope 0.836 suggests predictions may be too extreme, but its 0.591–1.133 interval includes the ideal 1 [17]. Only 67 events informed these checks [18]. Most adults in even the highest-risk bin reported receipt.
+        <w:t xml:space="preserve">RQ2 assesses four properties. AUC 0.752 describes ranking held-out non-recipients above recipients, not classification accuracy. Its Table VII interval, 0.687–0.814, lies above 0.5 for these fixed predictions. The interval still describes ranking, not accuracy at a cutoff. AP 0.203 summarises precision–recall ranking across cutoffs against a 6.61% event rate, not precision at one cutoff [16]. Its interval, 0.139–0.292, lies above that event rate. Brier fell from 0.0618 to 0.0578: a modest 0.0040 reduction in squared probability error. The two Brier intervals overlap, and no interval was calculated for the difference. An intercept correction, with calibration slope fixed at 1, checks average bias. The ideal correction is zero. The estimate 0.020 and interval spanning zero do not prove perfect agreement. Slope 0.836 suggests predictions may be too extreme, but its 0.591–1.133 interval includes the ideal 1 [17]. Only 67 events informed these checks [18]. Most adults in even the highest-risk bin reported receipt.
 </w:t>
       </w:r>
     </w:p>
@@ -13165,7 +13180,22 @@
           <w:sz w:val="20"/>
           <w:szCs w:val="20"/>
         </w:rPr>
-        <w:t xml:space="preserve">Table VIII separates sample, predictor and evaluation changes. S7 removed 21 people/four events (992/63). Its lower Brier concerns a different sample and cannot establish whether filling missing values is better. S8 substituted marriage for welfare access and performed similarly. S9 weighted fitting but not evaluation; it does not model the full survey design. S10 reweighted the same primary OOF predictions without retraining, raising Brier to 0.0641. S11 grouped folds by derived PSU and also performed similarly. S8–S11 retained 1,013 people/67 events. These checks expose internal assumptions; they do not establish model superiority or reliability elsewhere [19], [20].
+        <w:t xml:space="preserve">The Table VII intervals resample fixed out-of-fold predictions by household. They are not the survey approximation in Section V.A. They are not the Wald intervals around the full-sample odds ratios.
+</w:t>
+      </w:r>
+    </w:p>
+    <w:p>
+      <w:pPr>
+        <w:spacing w:after="80" w:before="0" w:line="230"/>
+        <w:jc w:val="both"/>
+      </w:pPr>
+      <w:r>
+        <w:rPr>
+          <w:rFonts w:ascii="Times New Roman" w:cs="Times New Roman" w:eastAsia="Times New Roman" w:hAnsi="Times New Roman"/>
+          <w:sz w:val="20"/>
+          <w:szCs w:val="20"/>
+        </w:rPr>
+        <w:t xml:space="preserve">Table VIII separates sample, predictor and evaluation changes. It reports point estimates only. S7 removed 21 people/four events (992/63). Its lower Brier concerns a different sample and cannot establish whether filling missing values is better. S8 substituted marriage for welfare access and performed similarly. S9 weighted fitting but not evaluation; it does not model the full survey design. S10 reweighted the same primary OOF predictions without retraining, raising Brier to 0.0641. S11 grouped folds by derived PSU and also performed similarly. S8–S11 retained 1,013 people/67 events. These checks expose internal assumptions; they do not establish model superiority or reliability elsewhere [19], [20].
 </w:t>
       </w:r>
     </w:p>

</xml_diff>

<commit_message>
Separate association, prediction and cause in Section V.C.
Out-of-fold performance and full-sample odds ratios are reported as different results. Neither is a causal explanation. No result value changed.
</commit_message>
<xml_diff>
--- a/paper/Jawe_OPG_nonreceipt_KZN.docx
+++ b/paper/Jawe_OPG_nonreceipt_KZN.docx
@@ -9256,7 +9256,22 @@
           <w:sz w:val="20"/>
           <w:szCs w:val="20"/>
         </w:rPr>
-        <w:t xml:space="preserve">C. Held-out prediction
+        <w:t xml:space="preserve">C. Predictive performance and associations
+</w:t>
+      </w:r>
+    </w:p>
+    <w:p>
+      <w:pPr>
+        <w:spacing w:after="80" w:before="0" w:line="230"/>
+        <w:jc w:val="both"/>
+      </w:pPr>
+      <w:r>
+        <w:rPr>
+          <w:rFonts w:ascii="Times New Roman" w:cs="Times New Roman" w:eastAsia="Times New Roman" w:hAnsi="Times New Roman"/>
+          <w:sz w:val="20"/>
+          <w:szCs w:val="20"/>
+        </w:rPr>
+        <w:t xml:space="preserve">This section reports two different results. Predictive performance uses one out-of-fold probability for each adult. Associations use odds ratios from the model fitted to all 1,013 included adults. Neither result explains why an adult reported non-receipt. The study did not test a mechanism, a time order or an intervention.
 </w:t>
       </w:r>
     </w:p>
@@ -10188,7 +10203,22 @@
           <w:sz w:val="20"/>
           <w:szCs w:val="20"/>
         </w:rPr>
-        <w:t xml:space="preserve">The odds ratio for women versus men was 0.39. Its Wald interval was 0.23–0.66. Schooling below Grade 7 versus Grade 7 or above gave 0.24 (0.13–0.43). The model trained on all included adults produced these estimates. The intervals exponentiate that model's coefficients and standard errors. They are not the Table VII resampling intervals, and they do not measure held-out performance. Age, settlement and welfare-distance intervals included 1. These associations describe odds, not probability reductions, held-out performance or causes.
+        <w:t xml:space="preserve">Table VII and Figure 4 assess the held-out probabilities. AUC summarises pairwise ranking. Average precision summarises precision-recall ranking. The Brier score summarises squared probability error. Calibration describes agreement between predicted and observed rates. These measures do not identify the separate contribution of age, sex, schooling, settlement or office distance.
+</w:t>
+      </w:r>
+    </w:p>
+    <w:p>
+      <w:pPr>
+        <w:spacing w:after="80" w:before="0" w:line="230"/>
+        <w:jc w:val="both"/>
+      </w:pPr>
+      <w:r>
+        <w:rPr>
+          <w:rFonts w:ascii="Times New Roman" w:cs="Times New Roman" w:eastAsia="Times New Roman" w:hAnsi="Times New Roman"/>
+          <w:sz w:val="20"/>
+          <w:szCs w:val="20"/>
+        </w:rPr>
+        <w:t xml:space="preserve">The associations come from another fit. The odds ratio for women versus men was 0.39. Its Wald interval was 0.23–0.66. Schooling below Grade 7 versus Grade 7 or above gave 0.24 (0.13–0.43). The model trained on all included adults produced these estimates, with the other predictors in the same model. The intervals exponentiate that model's coefficients and standard errors. They are not the Table VII resampling intervals. An odds ratio multiplies odds. It is not a change in the probability of non-receipt, and it is not a held-out performance measure. Age, settlement and welfare-distance intervals included 1. The associations describe this fitted model. They do not establish that sex, schooling, place or office distance produced non-receipt. The predictors are proxies, the data are cross-sectional, and the screen selects the 1,013 adults.
 </w:t>
       </w:r>
     </w:p>
@@ -12032,7 +12062,7 @@
           <w:sz w:val="20"/>
           <w:szCs w:val="20"/>
         </w:rPr>
-        <w:t xml:space="preserve">In Table VIII, AUC runs from 0.750 to 0.763. The lowest Brier is the complete-case row. The highest Brier is the weighted-score row, which reuses the primary predictions. These differences have no intervals. They do not rank the specifications.
+        <w:t xml:space="preserve">In Table VIII, AUC runs from 0.750 to 0.763. The lowest Brier is the complete-case row. The highest Brier is the weighted-score row, which reuses the primary predictions. These differences have no intervals. They do not rank the specifications. The rows summarise prediction under a changed sample, predictor or calculation. They are not a second set of odds ratios, and they do not establish a cause.
 </w:t>
       </w:r>
     </w:p>
@@ -13180,7 +13210,7 @@
           <w:sz w:val="20"/>
           <w:szCs w:val="20"/>
         </w:rPr>
-        <w:t xml:space="preserve">The Table VII intervals resample fixed out-of-fold predictions by household. They are not the survey approximation in Section V.A. They are not the Wald intervals around the full-sample odds ratios.
+        <w:t xml:space="preserve">The Table VII intervals resample fixed out-of-fold predictions by household. They are not the survey approximation in Section V.A. They are not the Wald intervals around the full-sample odds ratios. Those odds ratios are associations in the full-sample fit. Held-out ranking, probability error and calibration do not convert them into effects of sex, schooling, settlement or office distance.
 </w:t>
       </w:r>
     </w:p>

</xml_diff>

<commit_message>
Report the absent DUT ethics determination in Section VII.
Section VII separates survey-access and synthetic-data controls from the ethics record. No DUT-IREC clearance number, faculty determination, or gatekeeper letter is in the project record, so the paper claims no approval, exemption, or consent determination. Result values are unchanged.
</commit_message>
<xml_diff>
--- a/paper/Jawe_OPG_nonreceipt_KZN.docx
+++ b/paper/Jawe_OPG_nonreceipt_KZN.docx
@@ -13461,7 +13461,22 @@
           <w:sz w:val="20"/>
           <w:szCs w:val="20"/>
         </w:rPr>
-        <w:t xml:space="preserve">Survey access conditions and disclosure requirements apply. Interface demonstrations and tests use synthetic records. The downloadable package excludes survey records. Displays and reports omit submitted identifiers and raw income. These controls do not establish disclosure review of every historical repository file. The project records contain no DUT (Durban University of Technology) ethics determination. The paper therefore claims no approval. The app explains measurement choices; it neither decides grants nor ranks named applicants.
+        <w:t xml:space="preserve">This paper reports DUT honours research. The analysis uses existing LCS 2014/2015 microdata and adds no contact with survey respondents. Survey access conditions and disclosure requirements still apply. Interface demonstrations and tests use synthetic records. The downloadable package excludes survey records. Displays and reports omit submitted identifiers and raw income. These controls do not review every historical repository file, and they do not clear current release permission.
+</w:t>
+      </w:r>
+    </w:p>
+    <w:p>
+      <w:pPr>
+        <w:spacing w:after="80" w:before="0" w:line="230"/>
+        <w:jc w:val="both"/>
+      </w:pPr>
+      <w:r>
+        <w:rPr>
+          <w:rFonts w:ascii="Times New Roman" w:cs="Times New Roman" w:eastAsia="Times New Roman" w:hAnsi="Times New Roman"/>
+          <w:sz w:val="20"/>
+          <w:szCs w:val="20"/>
+        </w:rPr>
+        <w:t xml:space="preserve">DUT's research-ethics policy covers student research. It requires ethical assessment where a study uses personal information. DUT-IREC allocates an ethics clearance number. Where that committee is not the route, the faculty or department must keep a formal documented procedure. The project record contains no DUT-IREC clearance number, no faculty or departmental determination and no gatekeeper letter. The paper therefore claims no approval, exemption or consent determination. The recorded adults are aged 60 or older. DUT's published rules list the aged among groups that may need special safeguards, and no committee has made that classification for this project. Confirmation by the supervisor and DUT-IREC, or by the faculty route DUT specifies, remains outstanding. The app explains measurement choices; it neither decides grants nor ranks named applicants.
 </w:t>
       </w:r>
     </w:p>

</xml_diff>

<commit_message>
State the integrated contribution and align the IEEE references.
Section VIII states the contribution as the integration of transparent screening, interpretable prediction and reproducible software. The reference list keeps first-use order. Bibliographic details were checked against Crossref, the local survey files and the gazettes. Result values and DOI strings are unchanged.
</commit_message>
<xml_diff>
--- a/paper/Jawe_OPG_nonreceipt_KZN.docx
+++ b/paper/Jawe_OPG_nonreceipt_KZN.docx
@@ -13520,7 +13520,22 @@
           <w:sz w:val="20"/>
           <w:szCs w:val="20"/>
         </w:rPr>
-        <w:t xml:space="preserve">Historical screened non-receipt was 6.6% unweighted and 7.5% person-weighted; alternatives gave 7.1%–9.1%. Rules about other grants changed results more than the ceiling, and unresolved cases made the denominator central. Five predictor groups/six slopes gave AUC 0.752, AP 0.203 and Brier 0.0578: moderate internal ranking with slightly less probability error. The software reproduces screening, receipt categories and scores for inspection under tested conditions. The study provides a historical benchmark. It does not establish human usability, causes, legal entitlement or performance elsewhere.</w:t>
+        <w:t xml:space="preserve">Historical screened non-receipt was 6.6% unweighted and 7.5% person-weighted; alternatives gave 7.1%–9.1%. Rules about other grants changed results more than the ceiling, and unresolved cases made the denominator central. Five predictor groups/six slopes gave AUC 0.752, AP 0.203 and Brier 0.0578: moderate internal ranking with slightly less probability error. The software reproduces screening, receipt categories and scores for inspection under tested conditions. The study provides a historical benchmark. It does not establish human usability, causes, legal entitlement or performance elsewhere.
+</w:t>
+      </w:r>
+    </w:p>
+    <w:p>
+      <w:pPr>
+        <w:spacing w:after="80" w:before="0" w:line="230"/>
+        <w:jc w:val="both"/>
+      </w:pPr>
+      <w:r>
+        <w:rPr>
+          <w:rFonts w:ascii="Times New Roman" w:cs="Times New Roman" w:eastAsia="Times New Roman" w:hAnsi="Times New Roman"/>
+          <w:sz w:val="20"/>
+          <w:szCs w:val="20"/>
+        </w:rPr>
+        <w:t xml:space="preserve">The contribution is the integration of the screen, the prediction and the software on the same adults. The screen states the research rules, separates unresolved cases from the denominator, and shows how the rate changes when the screening rule changes. The prediction names six slopes and separates held-out ranking, probability error and calibration from full-sample associations. The software repeats the rules, receipt categories and scores, and it keeps the record of the checks that were run. Together they make the path from a survey answer to a displayed result inspectable.</w:t>
       </w:r>
     </w:p>
     <w:p>
@@ -13568,7 +13583,7 @@
           <w:sz w:val="16"/>
           <w:szCs w:val="16"/>
         </w:rPr>
-        <w:t xml:space="preserve">[1] T. Raniga and B. Simpson, “Poverty, HIV/AIDS and the old age pension in Bhambayi, KwaZulu-Natal, South Africa,” Dev. South. Afr., vol. 28, no. 1, pp. 75–85, 2011, doi: 10.1080/0376835X.2011.545171.</w:t>
+        <w:t xml:space="preserve">[1] T. Raniga and B. Simpson, “Poverty, HIV/AIDS and the old age pension in Bhambayi, KwaZulu-Natal, South Africa,” Dev. South. Afr., vol. 28, no. 1, pp. 75–85, Mar. 2011, doi: 10.1080/0376835X.2011.545171.</w:t>
       </w:r>
     </w:p>
     <w:p>
@@ -13588,7 +13603,7 @@
           <w:sz w:val="16"/>
           <w:szCs w:val="16"/>
         </w:rPr>
-        <w:t xml:space="preserve">[2] M. Alloush, J. R. Bloem, and J. G. Malacarne, “Social protection amid a crisis: New evidence from South Africa’s Older Person’s Grant,” World Bank Econ. Rev., vol. 38, no. 2, pp. 371–393, 2024, doi: 10.1093/wber/lhad037.</w:t>
+        <w:t xml:space="preserve">[2] M. Alloush, J. R. Bloem, and J. G. Malacarne, “Social protection amid a crisis: New evidence from South Africa’s Older Person’s Grant,” World Bank Econ. Rev., vol. 38, no. 2, pp. 371–393, Apr. 2024, doi: 10.1093/wber/lhad037.</w:t>
       </w:r>
     </w:p>
     <w:p>
@@ -13608,7 +13623,7 @@
           <w:sz w:val="16"/>
           <w:szCs w:val="16"/>
         </w:rPr>
-        <w:t xml:space="preserve">[3] M. Ralston, E. Schatz, J. Menken, F. X. Gómez-Olivé, and S. Tollman, “Who benefits—or does not—from South Africa’s old age pension? Evidence from characteristics of rural pensioners and non-pensioners,” Int. J. Environ. Res. Public Health, vol. 13, no. 1, Art. 85, 2016, doi: 10.3390/ijerph13010085.</w:t>
+        <w:t xml:space="preserve">[3] M. Ralston, E. Schatz, J. Menken, F. X. Gómez-Olivé, and S. Tollman, “Who benefits—or does not—from South Africa’s old age pension? Evidence from characteristics of rural pensioners and non-pensioners,” Int. J. Environ. Res. Public Health, vol. 13, no. 1, Art. no. 85, Jan. 2016, doi: 10.3390/ijerph13010085.</w:t>
       </w:r>
     </w:p>
     <w:p>
@@ -13628,7 +13643,7 @@
           <w:sz w:val="16"/>
           <w:szCs w:val="16"/>
         </w:rPr>
-        <w:t xml:space="preserve">[4] E. B. Godfrey et al., “Which eligible households get grants? Demographic correlates of receipt in South Africa,” Dev. South. Afr., vol. 33, no. 6, pp. 774–789, 2016, doi: 10.1080/0376835X.2016.1231059.</w:t>
+        <w:t xml:space="preserve">[4] E. B. Godfrey et al., “Which eligible households get grants? Demographic correlates of receipt in South Africa,” Dev. South. Afr., vol. 33, no. 6, pp. 774–789, Nov. 2016, doi: 10.1080/0376835X.2016.1231059.</w:t>
       </w:r>
     </w:p>
     <w:p>
@@ -13668,7 +13683,7 @@
           <w:sz w:val="16"/>
           <w:szCs w:val="16"/>
         </w:rPr>
-        <w:t xml:space="preserve">[6] A. Case, V. Hosegood, and F. Lund, “The reach and impact of Child Support Grants: Evidence from KwaZulu-Natal,” Dev. South. Afr., vol. 22, no. 4, pp. 467–482, 2005, doi: 10.1080/03768350500322925.</w:t>
+        <w:t xml:space="preserve">[6] A. Case, V. Hosegood, and F. Lund, “The reach and impact of Child Support Grants: Evidence from KwaZulu-Natal,” Dev. South. Afr., vol. 22, no. 4, pp. 467–482, Oct. 2005, doi: 10.1080/03768350500322925.</w:t>
       </w:r>
     </w:p>
     <w:p>
@@ -13688,7 +13703,7 @@
           <w:sz w:val="16"/>
           <w:szCs w:val="16"/>
         </w:rPr>
-        <w:t xml:space="preserve">[7] W. Zembe-Mkabile, T. Doherty, D. Sanders, and D. Jackson, “Child Support Grant access and receipt among 12-week-old infants in an urban township setting in South Africa,” Global Health Action, vol. 7, no. 1, Art. 25310, 2014, doi: 10.3402/gha.v7.25310.</w:t>
+        <w:t xml:space="preserve">[7] W. Zembe-Mkabile, T. Doherty, D. Sanders, and D. Jackson, “Child Support Grant access and receipt among 12-week-old infants in an urban township setting in South Africa,” Glob. Health Action, vol. 7, no. 1, Art. no. 25310, Aug. 2014, doi: 10.3402/gha.v7.25310.</w:t>
       </w:r>
     </w:p>
     <w:p>
@@ -13708,7 +13723,7 @@
           <w:sz w:val="16"/>
           <w:szCs w:val="16"/>
         </w:rPr>
-        <w:t xml:space="preserve">[8] C. J. Heinrich and R. Brill, “Stopped in the name of the law: Administrative burden and its implications for cash transfer program effectiveness,” World Dev., vol. 72, pp. 277–295, 2015, doi: 10.1016/j.worlddev.2015.03.015.</w:t>
+        <w:t xml:space="preserve">[8] C. J. Heinrich and R. Brill, “Stopped in the name of the law: Administrative burden and its implications for cash transfer program effectiveness,” World Dev., vol. 72, pp. 277–295, Aug. 2015, doi: 10.1016/j.worlddev.2015.03.015.</w:t>
       </w:r>
     </w:p>
     <w:p>
@@ -13728,7 +13743,7 @@
           <w:sz w:val="16"/>
           <w:szCs w:val="16"/>
         </w:rPr>
-        <w:t xml:space="preserve">[9] A. Gibbs, L. Washington, N. Jama Shai, Y. Sikweyiya, and S. Willan, “Systematically excluded: Young women’s experiences of accessing child support grants in South Africa,” Global Public Health, vol. 13, no. 12, pp. 1820–1830, 2018, doi: 10.1080/17441692.2018.1449231.</w:t>
+        <w:t xml:space="preserve">[9] A. Gibbs, L. Washington, N. Jama Shai, Y. Sikweyiya, and S. Willan, “Systematically excluded: Young women’s experiences of accessing child support grants in South Africa,” Glob. Public Health, vol. 13, no. 12, pp. 1820–1830, Mar. 2018, doi: 10.1080/17441692.2018.1449231.</w:t>
       </w:r>
     </w:p>
     <w:p>
@@ -13748,7 +13763,7 @@
           <w:sz w:val="16"/>
           <w:szCs w:val="16"/>
         </w:rPr>
-        <w:t xml:space="preserve">[10] T. N. Majola and P. Maharaj, “The challenges associated with the Child Support Grant application process: A case of young mothers in a South African township,” J. Soc. Serv. Res., vol. 51, nos. 5–6, pp. 1140–1150, 2025, doi: 10.1080/01488376.2025.2502004.</w:t>
+        <w:t xml:space="preserve">[10] T. N. Majola and P. Maharaj, “The challenges associated with the Child Support Grant application process: A case of young mothers in a South African township,” J. Soc. Serv. Res., vol. 51, nos. 5–6, pp. 1140–1150, May 2025, doi: 10.1080/01488376.2025.2502004.</w:t>
       </w:r>
     </w:p>
     <w:p>
@@ -13768,7 +13783,7 @@
           <w:sz w:val="16"/>
           <w:szCs w:val="16"/>
         </w:rPr>
-        <w:t xml:space="preserve">[11] J. Gazeaud, “Proxy means testing vulnerability to measurement errors?,” J. Dev. Stud., vol. 56, no. 11, pp. 2113–2133, 2020, doi: 10.1080/00220388.2020.1715942.</w:t>
+        <w:t xml:space="preserve">[11] J. Gazeaud, “Proxy means testing vulnerability to measurement errors?,” J. Dev. Stud., vol. 56, no. 11, pp. 2113–2133, Jan. 2020, doi: 10.1080/00220388.2020.1715942.</w:t>
       </w:r>
     </w:p>
     <w:p>
@@ -13788,7 +13803,7 @@
           <w:sz w:val="16"/>
           <w:szCs w:val="16"/>
         </w:rPr>
-        <w:t xml:space="preserve">[12] M. T. Mabala, “Factors associated with social grant uptake in South Africa: A closer look at the Special COVID-19 Social Relief of Distress Grant among the youth aged 18–35 years,” Master’s research report, University of the Witwatersrand, Johannesburg, South Africa, 2023. Available: https://hdl.handle.net/10539/40003.</w:t>
+        <w:t xml:space="preserve">[12] M. T. Mabala, “Factors associated with social grant uptake in South Africa: A closer look at the Special COVID-19 Social Relief of Distress Grant among the youth aged 18–35 years,” Master’s research report, University of the Witwatersrand, Johannesburg, South Africa, Aug. 2023. [Online]. Available: https://hdl.handle.net/10539/40003.</w:t>
       </w:r>
     </w:p>
     <w:p>
@@ -13808,7 +13823,7 @@
           <w:sz w:val="16"/>
           <w:szCs w:val="16"/>
         </w:rPr>
-        <w:t xml:space="preserve">[13] D. P. Moynihan, P. Herd, and H. Harvey, “Administrative burden: Learning, psychological, and compliance costs in citizen-state interactions,” J. Public Adm. Res. Theory, vol. 25, no. 1, pp. 43–69, 2015, doi: 10.1093/jopart/muu009.</w:t>
+        <w:t xml:space="preserve">[13] D. P. Moynihan, P. Herd, and H. Harvey, “Administrative burden: Learning, psychological, and compliance costs in citizen-state interactions,” J. Public Adm. Res. Theory, vol. 25, no. 1, pp. 43–69, Jan. 2015, doi: 10.1093/jopart/muu009.</w:t>
       </w:r>
     </w:p>
     <w:p>
@@ -13828,7 +13843,7 @@
           <w:sz w:val="16"/>
           <w:szCs w:val="16"/>
         </w:rPr>
-        <w:t xml:space="preserve">[14] S. Granlund, “They are not leaving without their money: Exploring encounters with the state through cash transfers in the rural Eastern Cape, South Africa,” South. Afr. J. Soc. Work Soc. Dev., vol. 34, no. 1, Art. 9052, 2022, doi: 10.25159/2708-9355/9052.</w:t>
+        <w:t xml:space="preserve">[14] S. Granlund, “They are not leaving without their money: Exploring encounters with the state through cash transfers in the rural Eastern Cape, South Africa,” South. Afr. J. Soc. Work Soc. Dev., vol. 34, no. 1, Art. no. 9052, Apr. 2022, doi: 10.25159/2708-9355/9052.</w:t>
       </w:r>
     </w:p>
     <w:p>
@@ -13868,7 +13883,7 @@
           <w:sz w:val="16"/>
           <w:szCs w:val="16"/>
         </w:rPr>
-        <w:t xml:space="preserve">[16] T. Saito and M. Rehmsmeier, “The precision-recall plot is more informative than the ROC plot when evaluating binary classifiers on imbalanced datasets,” PLOS ONE, vol. 10, no. 3, Art. e0118432, 2015, doi: 10.1371/journal.pone.0118432.</w:t>
+        <w:t xml:space="preserve">[16] T. Saito and M. Rehmsmeier, “The precision-recall plot is more informative than the ROC plot when evaluating binary classifiers on imbalanced datasets,” PLOS ONE, vol. 10, no. 3, Art. no. e0118432, Mar. 2015, doi: 10.1371/journal.pone.0118432.</w:t>
       </w:r>
     </w:p>
     <w:p>
@@ -13888,7 +13903,7 @@
           <w:sz w:val="16"/>
           <w:szCs w:val="16"/>
         </w:rPr>
-        <w:t xml:space="preserve">[17] B. Van Calster et al., “Calibration: The Achilles heel of predictive analytics,” BMC Med., vol. 17, Art. 230, 2019, doi: 10.1186/s12916-019-1466-7.</w:t>
+        <w:t xml:space="preserve">[17] B. Van Calster et al., “Calibration: The Achilles heel of predictive analytics,” BMC Med., vol. 17, no. 1, Art. no. 230, Dec. 2019, doi: 10.1186/s12916-019-1466-7.</w:t>
       </w:r>
     </w:p>
     <w:p>
@@ -13908,7 +13923,7 @@
           <w:sz w:val="16"/>
           <w:szCs w:val="16"/>
         </w:rPr>
-        <w:t xml:space="preserve">[18] R. D. Riley et al., “Minimum sample size for developing a multivariable prediction model: Part II—binary and time-to-event outcomes,” Stat. Med., vol. 38, no. 7, pp. 1276–1296, 2019, doi: 10.1002/sim.7992.</w:t>
+        <w:t xml:space="preserve">[18] R. D. Riley et al., “Minimum sample size for developing a multivariable prediction model: Part II—binary and time-to-event outcomes,” Stat. Med., vol. 38, no. 7, pp. 1276–1296, Mar. 2019, doi: 10.1002/sim.7992.</w:t>
       </w:r>
     </w:p>
     <w:p>
@@ -13928,7 +13943,7 @@
           <w:sz w:val="16"/>
           <w:szCs w:val="16"/>
         </w:rPr>
-        <w:t xml:space="preserve">[19] D. R. Roberts et al., “Cross-validation strategies for data with temporal, spatial, hierarchical, or phylogenetic structure,” Ecography, vol. 40, no. 8, pp. 913–929, 2017, doi: 10.1111/ecog.02881.</w:t>
+        <w:t xml:space="preserve">[19] D. R. Roberts et al., “Cross-validation strategies for data with temporal, spatial, hierarchical, or phylogenetic structure,” Ecography, vol. 40, no. 8, pp. 913–929, Mar. 2017, doi: 10.1111/ecog.02881.</w:t>
       </w:r>
     </w:p>
     <w:p>
@@ -13948,7 +13963,7 @@
           <w:sz w:val="16"/>
           <w:szCs w:val="16"/>
         </w:rPr>
-        <w:t xml:space="preserve">[20] G. S. Collins, J. B. Reitsma, D. G. Altman, and K. G. M. Moons, “Transparent reporting of a multivariable prediction model for individual prognosis or diagnosis (TRIPOD): The TRIPOD statement,” Ann. Intern. Med., vol. 162, no. 1, pp. 55–63, 2015, doi: 10.7326/M14-0697.</w:t>
+        <w:t xml:space="preserve">[20] G. S. Collins, J. B. Reitsma, D. G. Altman, and K. G. M. Moons, “Transparent reporting of a multivariable prediction model for individual prognosis or diagnosis (TRIPOD): The TRIPOD statement,” Ann. Intern. Med., vol. 162, no. 1, pp. 55–63, Jan. 2015, doi: 10.7326/M14-0697.</w:t>
       </w:r>
     </w:p>
     <w:p>
@@ -13968,7 +13983,7 @@
           <w:sz w:val="16"/>
           <w:szCs w:val="16"/>
         </w:rPr>
-        <w:t xml:space="preserve">[21] Statistics South Africa, Living Conditions Survey 2014/2015: Metadata, Statistical Release P0310. Pretoria, South Africa, 2017.</w:t>
+        <w:t xml:space="preserve">[21] Statistics South Africa, “Living Conditions Survey 2014/2015: Metadata,” Statistical Release P0310, Pretoria, South Africa, 2017.</w:t>
       </w:r>
     </w:p>
     <w:p>
@@ -13988,7 +14003,7 @@
           <w:sz w:val="16"/>
           <w:szCs w:val="16"/>
         </w:rPr>
-        <w:t xml:space="preserve">[22] Statistics South Africa, Living Conditions Survey: COICOP Codes. LCS 2014/2015 code list.</w:t>
+        <w:t xml:space="preserve">[22] Statistics South Africa, “COICOP codes,” Living Conditions Survey 2014/2015 code list.</w:t>
       </w:r>
     </w:p>
     <w:p>
@@ -14008,7 +14023,7 @@
           <w:sz w:val="16"/>
           <w:szCs w:val="16"/>
         </w:rPr>
-        <w:t xml:space="preserve">[23] Statistics South Africa, Living Conditions Survey 2014/2015: Household Questionnaire.</w:t>
+        <w:t xml:space="preserve">[23] Statistics South Africa, “Living Conditions Survey 2014/2015: Household questionnaire,” survey instrument.</w:t>
       </w:r>
     </w:p>
     <w:p>
@@ -14028,7 +14043,7 @@
           <w:sz w:val="16"/>
           <w:szCs w:val="16"/>
         </w:rPr>
-        <w:t xml:space="preserve">[24] Dept. of Social Development, “Increase in respect of social grants,” Government Notice 211, Government Gazette 37474, Mar. 28, 2014.</w:t>
+        <w:t xml:space="preserve">[24] Dept. of Social Development, “Increase in respect of social grants,” Government Notice 211, Government Gazette 37474, p. 3, Mar. 28, 2014.</w:t>
       </w:r>
     </w:p>
     <w:p>
@@ -14048,7 +14063,7 @@
           <w:sz w:val="16"/>
           <w:szCs w:val="16"/>
         </w:rPr>
-        <w:t xml:space="preserve">[25] Dept. of Social Development, “Increase in respect of social grants,” Government Notice 277, Government Gazette 38647, Mar. 30, 2015.</w:t>
+        <w:t xml:space="preserve">[25] Dept. of Social Development, “Increase in respect of social grants,” Government Notice 277, Government Gazette 38647, p. 3, Mar. 30, 2015.</w:t>
       </w:r>
     </w:p>
     <w:p>
@@ -14068,7 +14083,7 @@
           <w:sz w:val="16"/>
           <w:szCs w:val="16"/>
         </w:rPr>
-        <w:t xml:space="preserve">[26] Dept. of Social Development, “Amendment: Social Assistance Regulations,” Government Gazette 37474, pp. 4–5, Mar. 28, 2014.</w:t>
+        <w:t xml:space="preserve">[26] Dept. of Social Development, “Amendment: Social Assistance Regulations,” Government Notice R211, Government Gazette 37474, pp. 4–5, Mar. 28, 2014.</w:t>
       </w:r>
     </w:p>
     <w:p>

</xml_diff>

<commit_message>
Align the reference list to the 2024 IEEE guide.
Italicize periodical titles and et al., place article numbers after the date, and use the guide's journal abbreviations. Undated Statistics South Africa files use (n.d.). DOI strings and first-use order stay unchanged.
</commit_message>
<xml_diff>
--- a/paper/Jawe_OPG_nonreceipt_KZN.docx
+++ b/paper/Jawe_OPG_nonreceipt_KZN.docx
@@ -13572,18 +13572,32 @@
         <w:spacing w:after="0" w:before="0" w:line="160"/>
         <w:ind w:left="260" w:hanging="260"/>
         <w:jc w:val="left"/>
-        <w:rPr>
+      </w:pPr>
+      <w:r>
+        <w:rPr>
+          <w:rFonts w:ascii="Times New Roman" w:cs="Times New Roman" w:eastAsia="Times New Roman" w:hAnsi="Times New Roman"/>
           <w:sz w:val="16"/>
           <w:szCs w:val="16"/>
         </w:rPr>
-      </w:pPr>
-      <w:r>
-        <w:rPr>
-          <w:rFonts w:ascii="Times New Roman" w:cs="Times New Roman" w:eastAsia="Times New Roman" w:hAnsi="Times New Roman"/>
+        <w:t xml:space="preserve">[1] T. Raniga and B. Simpson, “Poverty, HIV/AIDS and the old age pension in Bhambayi, KwaZulu-Natal, South Africa,” </w:t>
+      </w:r>
+      <w:r>
+        <w:rPr>
+          <w:rFonts w:ascii="Times New Roman" w:cs="Times New Roman" w:eastAsia="Times New Roman" w:hAnsi="Times New Roman"/>
+          <w:i/>
+          <w:iCs/>
           <w:sz w:val="16"/>
           <w:szCs w:val="16"/>
         </w:rPr>
-        <w:t xml:space="preserve">[1] T. Raniga and B. Simpson, “Poverty, HIV/AIDS and the old age pension in Bhambayi, KwaZulu-Natal, South Africa,” Dev. South. Afr., vol. 28, no. 1, pp. 75–85, Mar. 2011, doi: 10.1080/0376835X.2011.545171.</w:t>
+        <w:t xml:space="preserve">Develop. Southern Afr.</w:t>
+      </w:r>
+      <w:r>
+        <w:rPr>
+          <w:rFonts w:ascii="Times New Roman" w:cs="Times New Roman" w:eastAsia="Times New Roman" w:hAnsi="Times New Roman"/>
+          <w:sz w:val="16"/>
+          <w:szCs w:val="16"/>
+        </w:rPr>
+        <w:t xml:space="preserve">, vol. 28, no. 1, pp. 75–85, Mar. 2011, doi: 10.1080/0376835X.2011.545171.</w:t>
       </w:r>
     </w:p>
     <w:p>
@@ -13592,18 +13606,32 @@
         <w:spacing w:after="0" w:before="0" w:line="160"/>
         <w:ind w:left="260" w:hanging="260"/>
         <w:jc w:val="left"/>
-        <w:rPr>
+      </w:pPr>
+      <w:r>
+        <w:rPr>
+          <w:rFonts w:ascii="Times New Roman" w:cs="Times New Roman" w:eastAsia="Times New Roman" w:hAnsi="Times New Roman"/>
           <w:sz w:val="16"/>
           <w:szCs w:val="16"/>
         </w:rPr>
-      </w:pPr>
-      <w:r>
-        <w:rPr>
-          <w:rFonts w:ascii="Times New Roman" w:cs="Times New Roman" w:eastAsia="Times New Roman" w:hAnsi="Times New Roman"/>
+        <w:t xml:space="preserve">[2] M. Alloush, J. R. Bloem, and J. G. Malacarne, “Social protection amid a crisis: New evidence from South Africa’s Older Person’s Grant,” </w:t>
+      </w:r>
+      <w:r>
+        <w:rPr>
+          <w:rFonts w:ascii="Times New Roman" w:cs="Times New Roman" w:eastAsia="Times New Roman" w:hAnsi="Times New Roman"/>
+          <w:i/>
+          <w:iCs/>
           <w:sz w:val="16"/>
           <w:szCs w:val="16"/>
         </w:rPr>
-        <w:t xml:space="preserve">[2] M. Alloush, J. R. Bloem, and J. G. Malacarne, “Social protection amid a crisis: New evidence from South Africa’s Older Person’s Grant,” World Bank Econ. Rev., vol. 38, no. 2, pp. 371–393, Apr. 2024, doi: 10.1093/wber/lhad037.</w:t>
+        <w:t xml:space="preserve">World Bank Econ. Rev.</w:t>
+      </w:r>
+      <w:r>
+        <w:rPr>
+          <w:rFonts w:ascii="Times New Roman" w:cs="Times New Roman" w:eastAsia="Times New Roman" w:hAnsi="Times New Roman"/>
+          <w:sz w:val="16"/>
+          <w:szCs w:val="16"/>
+        </w:rPr>
+        <w:t xml:space="preserve">, vol. 38, no. 2, pp. 371–393, Apr. 2024, doi: 10.1093/wber/lhad037.</w:t>
       </w:r>
     </w:p>
     <w:p>
@@ -13612,18 +13640,32 @@
         <w:spacing w:after="0" w:before="0" w:line="160"/>
         <w:ind w:left="260" w:hanging="260"/>
         <w:jc w:val="left"/>
-        <w:rPr>
+      </w:pPr>
+      <w:r>
+        <w:rPr>
+          <w:rFonts w:ascii="Times New Roman" w:cs="Times New Roman" w:eastAsia="Times New Roman" w:hAnsi="Times New Roman"/>
           <w:sz w:val="16"/>
           <w:szCs w:val="16"/>
         </w:rPr>
-      </w:pPr>
-      <w:r>
-        <w:rPr>
-          <w:rFonts w:ascii="Times New Roman" w:cs="Times New Roman" w:eastAsia="Times New Roman" w:hAnsi="Times New Roman"/>
+        <w:t xml:space="preserve">[3] M. Ralston, E. Schatz, J. Menken, F. X. Gómez-Olivé, and S. Tollman, “Who benefits—or does not—from South Africa’s old age pension? Evidence from characteristics of rural pensioners and non-pensioners,” </w:t>
+      </w:r>
+      <w:r>
+        <w:rPr>
+          <w:rFonts w:ascii="Times New Roman" w:cs="Times New Roman" w:eastAsia="Times New Roman" w:hAnsi="Times New Roman"/>
+          <w:i/>
+          <w:iCs/>
           <w:sz w:val="16"/>
           <w:szCs w:val="16"/>
         </w:rPr>
-        <w:t xml:space="preserve">[3] M. Ralston, E. Schatz, J. Menken, F. X. Gómez-Olivé, and S. Tollman, “Who benefits—or does not—from South Africa’s old age pension? Evidence from characteristics of rural pensioners and non-pensioners,” Int. J. Environ. Res. Public Health, vol. 13, no. 1, Art. no. 85, Jan. 2016, doi: 10.3390/ijerph13010085.</w:t>
+        <w:t xml:space="preserve">Int. J. Environ. Res. Public Health</w:t>
+      </w:r>
+      <w:r>
+        <w:rPr>
+          <w:rFonts w:ascii="Times New Roman" w:cs="Times New Roman" w:eastAsia="Times New Roman" w:hAnsi="Times New Roman"/>
+          <w:sz w:val="16"/>
+          <w:szCs w:val="16"/>
+        </w:rPr>
+        <w:t xml:space="preserve">, vol. 13, no. 1, Jan. 2016, Art. no. 85, doi: 10.3390/ijerph13010085.</w:t>
       </w:r>
     </w:p>
     <w:p>
@@ -13632,18 +13674,50 @@
         <w:spacing w:after="0" w:before="0" w:line="160"/>
         <w:ind w:left="260" w:hanging="260"/>
         <w:jc w:val="left"/>
-        <w:rPr>
+      </w:pPr>
+      <w:r>
+        <w:rPr>
+          <w:rFonts w:ascii="Times New Roman" w:cs="Times New Roman" w:eastAsia="Times New Roman" w:hAnsi="Times New Roman"/>
           <w:sz w:val="16"/>
           <w:szCs w:val="16"/>
         </w:rPr>
-      </w:pPr>
-      <w:r>
-        <w:rPr>
-          <w:rFonts w:ascii="Times New Roman" w:cs="Times New Roman" w:eastAsia="Times New Roman" w:hAnsi="Times New Roman"/>
+        <w:t xml:space="preserve">[4] E. B. Godfrey </w:t>
+      </w:r>
+      <w:r>
+        <w:rPr>
+          <w:rFonts w:ascii="Times New Roman" w:cs="Times New Roman" w:eastAsia="Times New Roman" w:hAnsi="Times New Roman"/>
+          <w:i/>
+          <w:iCs/>
           <w:sz w:val="16"/>
           <w:szCs w:val="16"/>
         </w:rPr>
-        <w:t xml:space="preserve">[4] E. B. Godfrey et al., “Which eligible households get grants? Demographic correlates of receipt in South Africa,” Dev. South. Afr., vol. 33, no. 6, pp. 774–789, Nov. 2016, doi: 10.1080/0376835X.2016.1231059.</w:t>
+        <w:t xml:space="preserve">et al.</w:t>
+      </w:r>
+      <w:r>
+        <w:rPr>
+          <w:rFonts w:ascii="Times New Roman" w:cs="Times New Roman" w:eastAsia="Times New Roman" w:hAnsi="Times New Roman"/>
+          <w:sz w:val="16"/>
+          <w:szCs w:val="16"/>
+        </w:rPr>
+        <w:t xml:space="preserve">, “Which eligible households get grants? Demographic correlates of receipt in South Africa,” </w:t>
+      </w:r>
+      <w:r>
+        <w:rPr>
+          <w:rFonts w:ascii="Times New Roman" w:cs="Times New Roman" w:eastAsia="Times New Roman" w:hAnsi="Times New Roman"/>
+          <w:i/>
+          <w:iCs/>
+          <w:sz w:val="16"/>
+          <w:szCs w:val="16"/>
+        </w:rPr>
+        <w:t xml:space="preserve">Develop. Southern Afr.</w:t>
+      </w:r>
+      <w:r>
+        <w:rPr>
+          <w:rFonts w:ascii="Times New Roman" w:cs="Times New Roman" w:eastAsia="Times New Roman" w:hAnsi="Times New Roman"/>
+          <w:sz w:val="16"/>
+          <w:szCs w:val="16"/>
+        </w:rPr>
+        <w:t xml:space="preserve">, vol. 33, no. 6, pp. 774–789, Nov. 2016, doi: 10.1080/0376835X.2016.1231059.</w:t>
       </w:r>
     </w:p>
     <w:p>
@@ -13652,10 +13726,6 @@
         <w:spacing w:after="0" w:before="0" w:line="160"/>
         <w:ind w:left="260" w:hanging="260"/>
         <w:jc w:val="left"/>
-        <w:rPr>
-          <w:sz w:val="16"/>
-          <w:szCs w:val="16"/>
-        </w:rPr>
       </w:pPr>
       <w:r>
         <w:rPr>
@@ -13672,18 +13742,32 @@
         <w:spacing w:after="0" w:before="0" w:line="160"/>
         <w:ind w:left="260" w:hanging="260"/>
         <w:jc w:val="left"/>
-        <w:rPr>
+      </w:pPr>
+      <w:r>
+        <w:rPr>
+          <w:rFonts w:ascii="Times New Roman" w:cs="Times New Roman" w:eastAsia="Times New Roman" w:hAnsi="Times New Roman"/>
           <w:sz w:val="16"/>
           <w:szCs w:val="16"/>
         </w:rPr>
-      </w:pPr>
-      <w:r>
-        <w:rPr>
-          <w:rFonts w:ascii="Times New Roman" w:cs="Times New Roman" w:eastAsia="Times New Roman" w:hAnsi="Times New Roman"/>
+        <w:t xml:space="preserve">[6] A. Case, V. Hosegood, and F. Lund, “The reach and impact of Child Support Grants: Evidence from KwaZulu-Natal,” </w:t>
+      </w:r>
+      <w:r>
+        <w:rPr>
+          <w:rFonts w:ascii="Times New Roman" w:cs="Times New Roman" w:eastAsia="Times New Roman" w:hAnsi="Times New Roman"/>
+          <w:i/>
+          <w:iCs/>
           <w:sz w:val="16"/>
           <w:szCs w:val="16"/>
         </w:rPr>
-        <w:t xml:space="preserve">[6] A. Case, V. Hosegood, and F. Lund, “The reach and impact of Child Support Grants: Evidence from KwaZulu-Natal,” Dev. South. Afr., vol. 22, no. 4, pp. 467–482, Oct. 2005, doi: 10.1080/03768350500322925.</w:t>
+        <w:t xml:space="preserve">Develop. Southern Afr.</w:t>
+      </w:r>
+      <w:r>
+        <w:rPr>
+          <w:rFonts w:ascii="Times New Roman" w:cs="Times New Roman" w:eastAsia="Times New Roman" w:hAnsi="Times New Roman"/>
+          <w:sz w:val="16"/>
+          <w:szCs w:val="16"/>
+        </w:rPr>
+        <w:t xml:space="preserve">, vol. 22, no. 4, pp. 467–482, Oct. 2005, doi: 10.1080/03768350500322925.</w:t>
       </w:r>
     </w:p>
     <w:p>
@@ -13692,18 +13776,32 @@
         <w:spacing w:after="0" w:before="0" w:line="160"/>
         <w:ind w:left="260" w:hanging="260"/>
         <w:jc w:val="left"/>
-        <w:rPr>
+      </w:pPr>
+      <w:r>
+        <w:rPr>
+          <w:rFonts w:ascii="Times New Roman" w:cs="Times New Roman" w:eastAsia="Times New Roman" w:hAnsi="Times New Roman"/>
           <w:sz w:val="16"/>
           <w:szCs w:val="16"/>
         </w:rPr>
-      </w:pPr>
-      <w:r>
-        <w:rPr>
-          <w:rFonts w:ascii="Times New Roman" w:cs="Times New Roman" w:eastAsia="Times New Roman" w:hAnsi="Times New Roman"/>
+        <w:t xml:space="preserve">[7] W. Zembe-Mkabile, T. Doherty, D. Sanders, and D. Jackson, “Child Support Grant access and receipt among 12-week-old infants in an urban township setting in South Africa,” </w:t>
+      </w:r>
+      <w:r>
+        <w:rPr>
+          <w:rFonts w:ascii="Times New Roman" w:cs="Times New Roman" w:eastAsia="Times New Roman" w:hAnsi="Times New Roman"/>
+          <w:i/>
+          <w:iCs/>
           <w:sz w:val="16"/>
           <w:szCs w:val="16"/>
         </w:rPr>
-        <w:t xml:space="preserve">[7] W. Zembe-Mkabile, T. Doherty, D. Sanders, and D. Jackson, “Child Support Grant access and receipt among 12-week-old infants in an urban township setting in South Africa,” Glob. Health Action, vol. 7, no. 1, Art. no. 25310, Aug. 2014, doi: 10.3402/gha.v7.25310.</w:t>
+        <w:t xml:space="preserve">Global Health Action</w:t>
+      </w:r>
+      <w:r>
+        <w:rPr>
+          <w:rFonts w:ascii="Times New Roman" w:cs="Times New Roman" w:eastAsia="Times New Roman" w:hAnsi="Times New Roman"/>
+          <w:sz w:val="16"/>
+          <w:szCs w:val="16"/>
+        </w:rPr>
+        <w:t xml:space="preserve">, vol. 7, no. 1, Aug. 2014, Art. no. 25310, doi: 10.3402/gha.v7.25310.</w:t>
       </w:r>
     </w:p>
     <w:p>
@@ -13712,18 +13810,32 @@
         <w:spacing w:after="0" w:before="0" w:line="160"/>
         <w:ind w:left="260" w:hanging="260"/>
         <w:jc w:val="left"/>
-        <w:rPr>
+      </w:pPr>
+      <w:r>
+        <w:rPr>
+          <w:rFonts w:ascii="Times New Roman" w:cs="Times New Roman" w:eastAsia="Times New Roman" w:hAnsi="Times New Roman"/>
           <w:sz w:val="16"/>
           <w:szCs w:val="16"/>
         </w:rPr>
-      </w:pPr>
-      <w:r>
-        <w:rPr>
-          <w:rFonts w:ascii="Times New Roman" w:cs="Times New Roman" w:eastAsia="Times New Roman" w:hAnsi="Times New Roman"/>
+        <w:t xml:space="preserve">[8] C. J. Heinrich and R. Brill, “Stopped in the name of the law: Administrative burden and its implications for cash transfer program effectiveness,” </w:t>
+      </w:r>
+      <w:r>
+        <w:rPr>
+          <w:rFonts w:ascii="Times New Roman" w:cs="Times New Roman" w:eastAsia="Times New Roman" w:hAnsi="Times New Roman"/>
+          <w:i/>
+          <w:iCs/>
           <w:sz w:val="16"/>
           <w:szCs w:val="16"/>
         </w:rPr>
-        <w:t xml:space="preserve">[8] C. J. Heinrich and R. Brill, “Stopped in the name of the law: Administrative burden and its implications for cash transfer program effectiveness,” World Dev., vol. 72, pp. 277–295, Aug. 2015, doi: 10.1016/j.worlddev.2015.03.015.</w:t>
+        <w:t xml:space="preserve">World Develop.</w:t>
+      </w:r>
+      <w:r>
+        <w:rPr>
+          <w:rFonts w:ascii="Times New Roman" w:cs="Times New Roman" w:eastAsia="Times New Roman" w:hAnsi="Times New Roman"/>
+          <w:sz w:val="16"/>
+          <w:szCs w:val="16"/>
+        </w:rPr>
+        <w:t xml:space="preserve">, vol. 72, pp. 277–295, Aug. 2015, doi: 10.1016/j.worlddev.2015.03.015.</w:t>
       </w:r>
     </w:p>
     <w:p>
@@ -13732,18 +13844,32 @@
         <w:spacing w:after="0" w:before="0" w:line="160"/>
         <w:ind w:left="260" w:hanging="260"/>
         <w:jc w:val="left"/>
-        <w:rPr>
+      </w:pPr>
+      <w:r>
+        <w:rPr>
+          <w:rFonts w:ascii="Times New Roman" w:cs="Times New Roman" w:eastAsia="Times New Roman" w:hAnsi="Times New Roman"/>
           <w:sz w:val="16"/>
           <w:szCs w:val="16"/>
         </w:rPr>
-      </w:pPr>
-      <w:r>
-        <w:rPr>
-          <w:rFonts w:ascii="Times New Roman" w:cs="Times New Roman" w:eastAsia="Times New Roman" w:hAnsi="Times New Roman"/>
+        <w:t xml:space="preserve">[9] A. Gibbs, L. Washington, N. Jama Shai, Y. Sikweyiya, and S. Willan, “Systematically excluded: Young women’s experiences of accessing child support grants in South Africa,” </w:t>
+      </w:r>
+      <w:r>
+        <w:rPr>
+          <w:rFonts w:ascii="Times New Roman" w:cs="Times New Roman" w:eastAsia="Times New Roman" w:hAnsi="Times New Roman"/>
+          <w:i/>
+          <w:iCs/>
           <w:sz w:val="16"/>
           <w:szCs w:val="16"/>
         </w:rPr>
-        <w:t xml:space="preserve">[9] A. Gibbs, L. Washington, N. Jama Shai, Y. Sikweyiya, and S. Willan, “Systematically excluded: Young women’s experiences of accessing child support grants in South Africa,” Glob. Public Health, vol. 13, no. 12, pp. 1820–1830, Mar. 2018, doi: 10.1080/17441692.2018.1449231.</w:t>
+        <w:t xml:space="preserve">Global Public Health</w:t>
+      </w:r>
+      <w:r>
+        <w:rPr>
+          <w:rFonts w:ascii="Times New Roman" w:cs="Times New Roman" w:eastAsia="Times New Roman" w:hAnsi="Times New Roman"/>
+          <w:sz w:val="16"/>
+          <w:szCs w:val="16"/>
+        </w:rPr>
+        <w:t xml:space="preserve">, vol. 13, no. 12, pp. 1820–1830, Mar. 2018, doi: 10.1080/17441692.2018.1449231.</w:t>
       </w:r>
     </w:p>
     <w:p>
@@ -13752,18 +13878,32 @@
         <w:spacing w:after="0" w:before="0" w:line="160"/>
         <w:ind w:left="260" w:hanging="260"/>
         <w:jc w:val="left"/>
-        <w:rPr>
+      </w:pPr>
+      <w:r>
+        <w:rPr>
+          <w:rFonts w:ascii="Times New Roman" w:cs="Times New Roman" w:eastAsia="Times New Roman" w:hAnsi="Times New Roman"/>
           <w:sz w:val="16"/>
           <w:szCs w:val="16"/>
         </w:rPr>
-      </w:pPr>
-      <w:r>
-        <w:rPr>
-          <w:rFonts w:ascii="Times New Roman" w:cs="Times New Roman" w:eastAsia="Times New Roman" w:hAnsi="Times New Roman"/>
+        <w:t xml:space="preserve">[10] T. N. Majola and P. Maharaj, “The challenges associated with the Child Support Grant application process: A case of young mothers in a South African township,” </w:t>
+      </w:r>
+      <w:r>
+        <w:rPr>
+          <w:rFonts w:ascii="Times New Roman" w:cs="Times New Roman" w:eastAsia="Times New Roman" w:hAnsi="Times New Roman"/>
+          <w:i/>
+          <w:iCs/>
           <w:sz w:val="16"/>
           <w:szCs w:val="16"/>
         </w:rPr>
-        <w:t xml:space="preserve">[10] T. N. Majola and P. Maharaj, “The challenges associated with the Child Support Grant application process: A case of young mothers in a South African township,” J. Soc. Serv. Res., vol. 51, nos. 5–6, pp. 1140–1150, May 2025, doi: 10.1080/01488376.2025.2502004.</w:t>
+        <w:t xml:space="preserve">J. Social Service Res.</w:t>
+      </w:r>
+      <w:r>
+        <w:rPr>
+          <w:rFonts w:ascii="Times New Roman" w:cs="Times New Roman" w:eastAsia="Times New Roman" w:hAnsi="Times New Roman"/>
+          <w:sz w:val="16"/>
+          <w:szCs w:val="16"/>
+        </w:rPr>
+        <w:t xml:space="preserve">, vol. 51, nos. 5–6, pp. 1140–1150, May 2025, doi: 10.1080/01488376.2025.2502004.</w:t>
       </w:r>
     </w:p>
     <w:p>
@@ -13772,18 +13912,32 @@
         <w:spacing w:after="0" w:before="0" w:line="160"/>
         <w:ind w:left="260" w:hanging="260"/>
         <w:jc w:val="left"/>
-        <w:rPr>
+      </w:pPr>
+      <w:r>
+        <w:rPr>
+          <w:rFonts w:ascii="Times New Roman" w:cs="Times New Roman" w:eastAsia="Times New Roman" w:hAnsi="Times New Roman"/>
           <w:sz w:val="16"/>
           <w:szCs w:val="16"/>
         </w:rPr>
-      </w:pPr>
-      <w:r>
-        <w:rPr>
-          <w:rFonts w:ascii="Times New Roman" w:cs="Times New Roman" w:eastAsia="Times New Roman" w:hAnsi="Times New Roman"/>
+        <w:t xml:space="preserve">[11] J. Gazeaud, “Proxy means testing vulnerability to measurement errors?,” </w:t>
+      </w:r>
+      <w:r>
+        <w:rPr>
+          <w:rFonts w:ascii="Times New Roman" w:cs="Times New Roman" w:eastAsia="Times New Roman" w:hAnsi="Times New Roman"/>
+          <w:i/>
+          <w:iCs/>
           <w:sz w:val="16"/>
           <w:szCs w:val="16"/>
         </w:rPr>
-        <w:t xml:space="preserve">[11] J. Gazeaud, “Proxy means testing vulnerability to measurement errors?,” J. Dev. Stud., vol. 56, no. 11, pp. 2113–2133, Jan. 2020, doi: 10.1080/00220388.2020.1715942.</w:t>
+        <w:t xml:space="preserve">J. Develop. Stud.</w:t>
+      </w:r>
+      <w:r>
+        <w:rPr>
+          <w:rFonts w:ascii="Times New Roman" w:cs="Times New Roman" w:eastAsia="Times New Roman" w:hAnsi="Times New Roman"/>
+          <w:sz w:val="16"/>
+          <w:szCs w:val="16"/>
+        </w:rPr>
+        <w:t xml:space="preserve">, vol. 56, no. 11, pp. 2113–2133, Jan. 2020, doi: 10.1080/00220388.2020.1715942.</w:t>
       </w:r>
     </w:p>
     <w:p>
@@ -13792,18 +13946,14 @@
         <w:spacing w:after="0" w:before="0" w:line="160"/>
         <w:ind w:left="260" w:hanging="260"/>
         <w:jc w:val="left"/>
-        <w:rPr>
+      </w:pPr>
+      <w:r>
+        <w:rPr>
+          <w:rFonts w:ascii="Times New Roman" w:cs="Times New Roman" w:eastAsia="Times New Roman" w:hAnsi="Times New Roman"/>
           <w:sz w:val="16"/>
           <w:szCs w:val="16"/>
         </w:rPr>
-      </w:pPr>
-      <w:r>
-        <w:rPr>
-          <w:rFonts w:ascii="Times New Roman" w:cs="Times New Roman" w:eastAsia="Times New Roman" w:hAnsi="Times New Roman"/>
-          <w:sz w:val="16"/>
-          <w:szCs w:val="16"/>
-        </w:rPr>
-        <w:t xml:space="preserve">[12] M. T. Mabala, “Factors associated with social grant uptake in South Africa: A closer look at the Special COVID-19 Social Relief of Distress Grant among the youth aged 18–35 years,” Master’s research report, University of the Witwatersrand, Johannesburg, South Africa, Aug. 2023. [Online]. Available: https://hdl.handle.net/10539/40003.</w:t>
+        <w:t xml:space="preserve">[12] M. T. Mabala, “Factors associated with social grant uptake in South Africa: A closer look at the Special COVID-19 Social Relief of Distress Grant among the youth aged 18–35 years,” M.A. research report, School Social Sci., Univ. Witwatersrand, Johannesburg, South Africa, Aug. 2023. [Online]. Available: https://hdl.handle.net/10539/40003</w:t>
       </w:r>
     </w:p>
     <w:p>
@@ -13812,18 +13962,32 @@
         <w:spacing w:after="0" w:before="0" w:line="160"/>
         <w:ind w:left="260" w:hanging="260"/>
         <w:jc w:val="left"/>
-        <w:rPr>
+      </w:pPr>
+      <w:r>
+        <w:rPr>
+          <w:rFonts w:ascii="Times New Roman" w:cs="Times New Roman" w:eastAsia="Times New Roman" w:hAnsi="Times New Roman"/>
           <w:sz w:val="16"/>
           <w:szCs w:val="16"/>
         </w:rPr>
-      </w:pPr>
-      <w:r>
-        <w:rPr>
-          <w:rFonts w:ascii="Times New Roman" w:cs="Times New Roman" w:eastAsia="Times New Roman" w:hAnsi="Times New Roman"/>
+        <w:t xml:space="preserve">[13] D. P. Moynihan, P. Herd, and H. Harvey, “Administrative burden: Learning, psychological, and compliance costs in citizen-state interactions,” </w:t>
+      </w:r>
+      <w:r>
+        <w:rPr>
+          <w:rFonts w:ascii="Times New Roman" w:cs="Times New Roman" w:eastAsia="Times New Roman" w:hAnsi="Times New Roman"/>
+          <w:i/>
+          <w:iCs/>
           <w:sz w:val="16"/>
           <w:szCs w:val="16"/>
         </w:rPr>
-        <w:t xml:space="preserve">[13] D. P. Moynihan, P. Herd, and H. Harvey, “Administrative burden: Learning, psychological, and compliance costs in citizen-state interactions,” J. Public Adm. Res. Theory, vol. 25, no. 1, pp. 43–69, Jan. 2015, doi: 10.1093/jopart/muu009.</w:t>
+        <w:t xml:space="preserve">J. Public Admin. Res. Theory</w:t>
+      </w:r>
+      <w:r>
+        <w:rPr>
+          <w:rFonts w:ascii="Times New Roman" w:cs="Times New Roman" w:eastAsia="Times New Roman" w:hAnsi="Times New Roman"/>
+          <w:sz w:val="16"/>
+          <w:szCs w:val="16"/>
+        </w:rPr>
+        <w:t xml:space="preserve">, vol. 25, no. 1, pp. 43–69, Jan. 2015, doi: 10.1093/jopart/muu009.</w:t>
       </w:r>
     </w:p>
     <w:p>
@@ -13832,18 +13996,32 @@
         <w:spacing w:after="0" w:before="0" w:line="160"/>
         <w:ind w:left="260" w:hanging="260"/>
         <w:jc w:val="left"/>
-        <w:rPr>
+      </w:pPr>
+      <w:r>
+        <w:rPr>
+          <w:rFonts w:ascii="Times New Roman" w:cs="Times New Roman" w:eastAsia="Times New Roman" w:hAnsi="Times New Roman"/>
           <w:sz w:val="16"/>
           <w:szCs w:val="16"/>
         </w:rPr>
-      </w:pPr>
-      <w:r>
-        <w:rPr>
-          <w:rFonts w:ascii="Times New Roman" w:cs="Times New Roman" w:eastAsia="Times New Roman" w:hAnsi="Times New Roman"/>
+        <w:t xml:space="preserve">[14] S. Granlund, “They are not leaving without their money: Exploring encounters with the state through cash transfers in the rural Eastern Cape, South Africa,” </w:t>
+      </w:r>
+      <w:r>
+        <w:rPr>
+          <w:rFonts w:ascii="Times New Roman" w:cs="Times New Roman" w:eastAsia="Times New Roman" w:hAnsi="Times New Roman"/>
+          <w:i/>
+          <w:iCs/>
           <w:sz w:val="16"/>
           <w:szCs w:val="16"/>
         </w:rPr>
-        <w:t xml:space="preserve">[14] S. Granlund, “They are not leaving without their money: Exploring encounters with the state through cash transfers in the rural Eastern Cape, South Africa,” South. Afr. J. Soc. Work Soc. Dev., vol. 34, no. 1, Art. no. 9052, Apr. 2022, doi: 10.25159/2708-9355/9052.</w:t>
+        <w:t xml:space="preserve">Southern Afr. J. Social Work Social Develop.</w:t>
+      </w:r>
+      <w:r>
+        <w:rPr>
+          <w:rFonts w:ascii="Times New Roman" w:cs="Times New Roman" w:eastAsia="Times New Roman" w:hAnsi="Times New Roman"/>
+          <w:sz w:val="16"/>
+          <w:szCs w:val="16"/>
+        </w:rPr>
+        <w:t xml:space="preserve">, vol. 34, no. 1, Apr. 2022, Art. no. 9052, doi: 10.25159/2708-9355/9052.</w:t>
       </w:r>
     </w:p>
     <w:p>
@@ -13852,18 +14030,32 @@
         <w:spacing w:after="0" w:before="0" w:line="160"/>
         <w:ind w:left="260" w:hanging="260"/>
         <w:jc w:val="left"/>
-        <w:rPr>
+      </w:pPr>
+      <w:r>
+        <w:rPr>
+          <w:rFonts w:ascii="Times New Roman" w:cs="Times New Roman" w:eastAsia="Times New Roman" w:hAnsi="Times New Roman"/>
           <w:sz w:val="16"/>
           <w:szCs w:val="16"/>
         </w:rPr>
-      </w:pPr>
-      <w:r>
-        <w:rPr>
-          <w:rFonts w:ascii="Times New Roman" w:cs="Times New Roman" w:eastAsia="Times New Roman" w:hAnsi="Times New Roman"/>
+        <w:t xml:space="preserve">[15] A. N. Vujovic, G. M. Jonathan, and S. Hacks, “Digitalisation and its impact on social protection programmes effectiveness: A case from South Africa,” </w:t>
+      </w:r>
+      <w:r>
+        <w:rPr>
+          <w:rFonts w:ascii="Times New Roman" w:cs="Times New Roman" w:eastAsia="Times New Roman" w:hAnsi="Times New Roman"/>
+          <w:i/>
+          <w:iCs/>
           <w:sz w:val="16"/>
           <w:szCs w:val="16"/>
         </w:rPr>
-        <w:t xml:space="preserve">[15] A. N. Vujovic, G. M. Jonathan, and S. Hacks, “Digitalisation and its impact on social protection programmes effectiveness: A case from South Africa,” Procedia Comput. Sci., vol. 237, pp. 882–890, 2024, doi: 10.1016/j.procs.2024.05.177.</w:t>
+        <w:t xml:space="preserve">Procedia Comput. Sci.</w:t>
+      </w:r>
+      <w:r>
+        <w:rPr>
+          <w:rFonts w:ascii="Times New Roman" w:cs="Times New Roman" w:eastAsia="Times New Roman" w:hAnsi="Times New Roman"/>
+          <w:sz w:val="16"/>
+          <w:szCs w:val="16"/>
+        </w:rPr>
+        <w:t xml:space="preserve">, vol. 237, pp. 882–890, 2024, doi: 10.1016/j.procs.2024.05.177.</w:t>
       </w:r>
     </w:p>
     <w:p>
@@ -13872,18 +14064,32 @@
         <w:spacing w:after="0" w:before="0" w:line="160"/>
         <w:ind w:left="260" w:hanging="260"/>
         <w:jc w:val="left"/>
-        <w:rPr>
+      </w:pPr>
+      <w:r>
+        <w:rPr>
+          <w:rFonts w:ascii="Times New Roman" w:cs="Times New Roman" w:eastAsia="Times New Roman" w:hAnsi="Times New Roman"/>
           <w:sz w:val="16"/>
           <w:szCs w:val="16"/>
         </w:rPr>
-      </w:pPr>
-      <w:r>
-        <w:rPr>
-          <w:rFonts w:ascii="Times New Roman" w:cs="Times New Roman" w:eastAsia="Times New Roman" w:hAnsi="Times New Roman"/>
+        <w:t xml:space="preserve">[16] T. Saito and M. Rehmsmeier, “The precision-recall plot is more informative than the ROC plot when evaluating binary classifiers on imbalanced datasets,” </w:t>
+      </w:r>
+      <w:r>
+        <w:rPr>
+          <w:rFonts w:ascii="Times New Roman" w:cs="Times New Roman" w:eastAsia="Times New Roman" w:hAnsi="Times New Roman"/>
+          <w:i/>
+          <w:iCs/>
           <w:sz w:val="16"/>
           <w:szCs w:val="16"/>
         </w:rPr>
-        <w:t xml:space="preserve">[16] T. Saito and M. Rehmsmeier, “The precision-recall plot is more informative than the ROC plot when evaluating binary classifiers on imbalanced datasets,” PLOS ONE, vol. 10, no. 3, Art. no. e0118432, Mar. 2015, doi: 10.1371/journal.pone.0118432.</w:t>
+        <w:t xml:space="preserve">PLOS ONE</w:t>
+      </w:r>
+      <w:r>
+        <w:rPr>
+          <w:rFonts w:ascii="Times New Roman" w:cs="Times New Roman" w:eastAsia="Times New Roman" w:hAnsi="Times New Roman"/>
+          <w:sz w:val="16"/>
+          <w:szCs w:val="16"/>
+        </w:rPr>
+        <w:t xml:space="preserve">, vol. 10, no. 3, Mar. 2015, Art. no. e0118432, doi: 10.1371/journal.pone.0118432.</w:t>
       </w:r>
     </w:p>
     <w:p>
@@ -13892,18 +14098,50 @@
         <w:spacing w:after="0" w:before="0" w:line="160"/>
         <w:ind w:left="260" w:hanging="260"/>
         <w:jc w:val="left"/>
-        <w:rPr>
+      </w:pPr>
+      <w:r>
+        <w:rPr>
+          <w:rFonts w:ascii="Times New Roman" w:cs="Times New Roman" w:eastAsia="Times New Roman" w:hAnsi="Times New Roman"/>
           <w:sz w:val="16"/>
           <w:szCs w:val="16"/>
         </w:rPr>
-      </w:pPr>
-      <w:r>
-        <w:rPr>
-          <w:rFonts w:ascii="Times New Roman" w:cs="Times New Roman" w:eastAsia="Times New Roman" w:hAnsi="Times New Roman"/>
+        <w:t xml:space="preserve">[17] B. Van Calster </w:t>
+      </w:r>
+      <w:r>
+        <w:rPr>
+          <w:rFonts w:ascii="Times New Roman" w:cs="Times New Roman" w:eastAsia="Times New Roman" w:hAnsi="Times New Roman"/>
+          <w:i/>
+          <w:iCs/>
           <w:sz w:val="16"/>
           <w:szCs w:val="16"/>
         </w:rPr>
-        <w:t xml:space="preserve">[17] B. Van Calster et al., “Calibration: The Achilles heel of predictive analytics,” BMC Med., vol. 17, no. 1, Art. no. 230, Dec. 2019, doi: 10.1186/s12916-019-1466-7.</w:t>
+        <w:t xml:space="preserve">et al.</w:t>
+      </w:r>
+      <w:r>
+        <w:rPr>
+          <w:rFonts w:ascii="Times New Roman" w:cs="Times New Roman" w:eastAsia="Times New Roman" w:hAnsi="Times New Roman"/>
+          <w:sz w:val="16"/>
+          <w:szCs w:val="16"/>
+        </w:rPr>
+        <w:t xml:space="preserve">, “Calibration: The Achilles heel of predictive analytics,” </w:t>
+      </w:r>
+      <w:r>
+        <w:rPr>
+          <w:rFonts w:ascii="Times New Roman" w:cs="Times New Roman" w:eastAsia="Times New Roman" w:hAnsi="Times New Roman"/>
+          <w:i/>
+          <w:iCs/>
+          <w:sz w:val="16"/>
+          <w:szCs w:val="16"/>
+        </w:rPr>
+        <w:t xml:space="preserve">BMC Med.</w:t>
+      </w:r>
+      <w:r>
+        <w:rPr>
+          <w:rFonts w:ascii="Times New Roman" w:cs="Times New Roman" w:eastAsia="Times New Roman" w:hAnsi="Times New Roman"/>
+          <w:sz w:val="16"/>
+          <w:szCs w:val="16"/>
+        </w:rPr>
+        <w:t xml:space="preserve">, vol. 17, no. 1, Dec. 2019, Art. no. 230, doi: 10.1186/s12916-019-1466-7.</w:t>
       </w:r>
     </w:p>
     <w:p>
@@ -13912,18 +14150,50 @@
         <w:spacing w:after="0" w:before="0" w:line="160"/>
         <w:ind w:left="260" w:hanging="260"/>
         <w:jc w:val="left"/>
-        <w:rPr>
+      </w:pPr>
+      <w:r>
+        <w:rPr>
+          <w:rFonts w:ascii="Times New Roman" w:cs="Times New Roman" w:eastAsia="Times New Roman" w:hAnsi="Times New Roman"/>
           <w:sz w:val="16"/>
           <w:szCs w:val="16"/>
         </w:rPr>
-      </w:pPr>
-      <w:r>
-        <w:rPr>
-          <w:rFonts w:ascii="Times New Roman" w:cs="Times New Roman" w:eastAsia="Times New Roman" w:hAnsi="Times New Roman"/>
+        <w:t xml:space="preserve">[18] R. D. Riley </w:t>
+      </w:r>
+      <w:r>
+        <w:rPr>
+          <w:rFonts w:ascii="Times New Roman" w:cs="Times New Roman" w:eastAsia="Times New Roman" w:hAnsi="Times New Roman"/>
+          <w:i/>
+          <w:iCs/>
           <w:sz w:val="16"/>
           <w:szCs w:val="16"/>
         </w:rPr>
-        <w:t xml:space="preserve">[18] R. D. Riley et al., “Minimum sample size for developing a multivariable prediction model: Part II—binary and time-to-event outcomes,” Stat. Med., vol. 38, no. 7, pp. 1276–1296, Mar. 2019, doi: 10.1002/sim.7992.</w:t>
+        <w:t xml:space="preserve">et al.</w:t>
+      </w:r>
+      <w:r>
+        <w:rPr>
+          <w:rFonts w:ascii="Times New Roman" w:cs="Times New Roman" w:eastAsia="Times New Roman" w:hAnsi="Times New Roman"/>
+          <w:sz w:val="16"/>
+          <w:szCs w:val="16"/>
+        </w:rPr>
+        <w:t xml:space="preserve">, “Minimum sample size for developing a multivariable prediction model: Part II—binary and time-to-event outcomes,” </w:t>
+      </w:r>
+      <w:r>
+        <w:rPr>
+          <w:rFonts w:ascii="Times New Roman" w:cs="Times New Roman" w:eastAsia="Times New Roman" w:hAnsi="Times New Roman"/>
+          <w:i/>
+          <w:iCs/>
+          <w:sz w:val="16"/>
+          <w:szCs w:val="16"/>
+        </w:rPr>
+        <w:t xml:space="preserve">Statist. Med.</w:t>
+      </w:r>
+      <w:r>
+        <w:rPr>
+          <w:rFonts w:ascii="Times New Roman" w:cs="Times New Roman" w:eastAsia="Times New Roman" w:hAnsi="Times New Roman"/>
+          <w:sz w:val="16"/>
+          <w:szCs w:val="16"/>
+        </w:rPr>
+        <w:t xml:space="preserve">, vol. 38, no. 7, pp. 1276–1296, Mar. 2019, doi: 10.1002/sim.7992.</w:t>
       </w:r>
     </w:p>
     <w:p>
@@ -13932,18 +14202,50 @@
         <w:spacing w:after="0" w:before="0" w:line="160"/>
         <w:ind w:left="260" w:hanging="260"/>
         <w:jc w:val="left"/>
-        <w:rPr>
+      </w:pPr>
+      <w:r>
+        <w:rPr>
+          <w:rFonts w:ascii="Times New Roman" w:cs="Times New Roman" w:eastAsia="Times New Roman" w:hAnsi="Times New Roman"/>
           <w:sz w:val="16"/>
           <w:szCs w:val="16"/>
         </w:rPr>
-      </w:pPr>
-      <w:r>
-        <w:rPr>
-          <w:rFonts w:ascii="Times New Roman" w:cs="Times New Roman" w:eastAsia="Times New Roman" w:hAnsi="Times New Roman"/>
+        <w:t xml:space="preserve">[19] D. R. Roberts </w:t>
+      </w:r>
+      <w:r>
+        <w:rPr>
+          <w:rFonts w:ascii="Times New Roman" w:cs="Times New Roman" w:eastAsia="Times New Roman" w:hAnsi="Times New Roman"/>
+          <w:i/>
+          <w:iCs/>
           <w:sz w:val="16"/>
           <w:szCs w:val="16"/>
         </w:rPr>
-        <w:t xml:space="preserve">[19] D. R. Roberts et al., “Cross-validation strategies for data with temporal, spatial, hierarchical, or phylogenetic structure,” Ecography, vol. 40, no. 8, pp. 913–929, Mar. 2017, doi: 10.1111/ecog.02881.</w:t>
+        <w:t xml:space="preserve">et al.</w:t>
+      </w:r>
+      <w:r>
+        <w:rPr>
+          <w:rFonts w:ascii="Times New Roman" w:cs="Times New Roman" w:eastAsia="Times New Roman" w:hAnsi="Times New Roman"/>
+          <w:sz w:val="16"/>
+          <w:szCs w:val="16"/>
+        </w:rPr>
+        <w:t xml:space="preserve">, “Cross-validation strategies for data with temporal, spatial, hierarchical, or phylogenetic structure,” </w:t>
+      </w:r>
+      <w:r>
+        <w:rPr>
+          <w:rFonts w:ascii="Times New Roman" w:cs="Times New Roman" w:eastAsia="Times New Roman" w:hAnsi="Times New Roman"/>
+          <w:i/>
+          <w:iCs/>
+          <w:sz w:val="16"/>
+          <w:szCs w:val="16"/>
+        </w:rPr>
+        <w:t xml:space="preserve">Ecography</w:t>
+      </w:r>
+      <w:r>
+        <w:rPr>
+          <w:rFonts w:ascii="Times New Roman" w:cs="Times New Roman" w:eastAsia="Times New Roman" w:hAnsi="Times New Roman"/>
+          <w:sz w:val="16"/>
+          <w:szCs w:val="16"/>
+        </w:rPr>
+        <w:t xml:space="preserve">, vol. 40, no. 8, pp. 913–929, Mar. 2017, doi: 10.1111/ecog.02881.</w:t>
       </w:r>
     </w:p>
     <w:p>
@@ -13952,18 +14254,32 @@
         <w:spacing w:after="0" w:before="0" w:line="160"/>
         <w:ind w:left="260" w:hanging="260"/>
         <w:jc w:val="left"/>
-        <w:rPr>
+      </w:pPr>
+      <w:r>
+        <w:rPr>
+          <w:rFonts w:ascii="Times New Roman" w:cs="Times New Roman" w:eastAsia="Times New Roman" w:hAnsi="Times New Roman"/>
           <w:sz w:val="16"/>
           <w:szCs w:val="16"/>
         </w:rPr>
-      </w:pPr>
-      <w:r>
-        <w:rPr>
-          <w:rFonts w:ascii="Times New Roman" w:cs="Times New Roman" w:eastAsia="Times New Roman" w:hAnsi="Times New Roman"/>
+        <w:t xml:space="preserve">[20] G. S. Collins, J. B. Reitsma, D. G. Altman, and K. G. M. Moons, “Transparent reporting of a multivariable prediction model for individual prognosis or diagnosis (TRIPOD): The TRIPOD statement,” </w:t>
+      </w:r>
+      <w:r>
+        <w:rPr>
+          <w:rFonts w:ascii="Times New Roman" w:cs="Times New Roman" w:eastAsia="Times New Roman" w:hAnsi="Times New Roman"/>
+          <w:i/>
+          <w:iCs/>
           <w:sz w:val="16"/>
           <w:szCs w:val="16"/>
         </w:rPr>
-        <w:t xml:space="preserve">[20] G. S. Collins, J. B. Reitsma, D. G. Altman, and K. G. M. Moons, “Transparent reporting of a multivariable prediction model for individual prognosis or diagnosis (TRIPOD): The TRIPOD statement,” Ann. Intern. Med., vol. 162, no. 1, pp. 55–63, Jan. 2015, doi: 10.7326/M14-0697.</w:t>
+        <w:t xml:space="preserve">Ann. Internal Med.</w:t>
+      </w:r>
+      <w:r>
+        <w:rPr>
+          <w:rFonts w:ascii="Times New Roman" w:cs="Times New Roman" w:eastAsia="Times New Roman" w:hAnsi="Times New Roman"/>
+          <w:sz w:val="16"/>
+          <w:szCs w:val="16"/>
+        </w:rPr>
+        <w:t xml:space="preserve">, vol. 162, no. 1, pp. 55–63, Jan. 2015, doi: 10.7326/M14-0697.</w:t>
       </w:r>
     </w:p>
     <w:p>
@@ -13972,18 +14288,14 @@
         <w:spacing w:after="0" w:before="0" w:line="160"/>
         <w:ind w:left="260" w:hanging="260"/>
         <w:jc w:val="left"/>
-        <w:rPr>
+      </w:pPr>
+      <w:r>
+        <w:rPr>
+          <w:rFonts w:ascii="Times New Roman" w:cs="Times New Roman" w:eastAsia="Times New Roman" w:hAnsi="Times New Roman"/>
           <w:sz w:val="16"/>
           <w:szCs w:val="16"/>
         </w:rPr>
-      </w:pPr>
-      <w:r>
-        <w:rPr>
-          <w:rFonts w:ascii="Times New Roman" w:cs="Times New Roman" w:eastAsia="Times New Roman" w:hAnsi="Times New Roman"/>
-          <w:sz w:val="16"/>
-          <w:szCs w:val="16"/>
-        </w:rPr>
-        <w:t xml:space="preserve">[21] Statistics South Africa, “Living Conditions Survey 2014/2015: Metadata,” Statistical Release P0310, Pretoria, South Africa, 2017.</w:t>
+        <w:t xml:space="preserve">[21] Statistics South Africa, “Living Conditions Survey 2014/2015: Metadata,” Pretoria, South Africa, Statistical Release P0310, 2017.</w:t>
       </w:r>
     </w:p>
     <w:p>
@@ -13992,18 +14304,14 @@
         <w:spacing w:after="0" w:before="0" w:line="160"/>
         <w:ind w:left="260" w:hanging="260"/>
         <w:jc w:val="left"/>
-        <w:rPr>
+      </w:pPr>
+      <w:r>
+        <w:rPr>
+          <w:rFonts w:ascii="Times New Roman" w:cs="Times New Roman" w:eastAsia="Times New Roman" w:hAnsi="Times New Roman"/>
           <w:sz w:val="16"/>
           <w:szCs w:val="16"/>
         </w:rPr>
-      </w:pPr>
-      <w:r>
-        <w:rPr>
-          <w:rFonts w:ascii="Times New Roman" w:cs="Times New Roman" w:eastAsia="Times New Roman" w:hAnsi="Times New Roman"/>
-          <w:sz w:val="16"/>
-          <w:szCs w:val="16"/>
-        </w:rPr>
-        <w:t xml:space="preserve">[22] Statistics South Africa, “COICOP codes,” Living Conditions Survey 2014/2015 code list.</w:t>
+        <w:t xml:space="preserve">[22] Statistics South Africa, “COICOP codes,” Pretoria, South Africa, Living Conditions Survey 2014/2015 code list. (n.d.).</w:t>
       </w:r>
     </w:p>
     <w:p>
@@ -14012,18 +14320,14 @@
         <w:spacing w:after="0" w:before="0" w:line="160"/>
         <w:ind w:left="260" w:hanging="260"/>
         <w:jc w:val="left"/>
-        <w:rPr>
+      </w:pPr>
+      <w:r>
+        <w:rPr>
+          <w:rFonts w:ascii="Times New Roman" w:cs="Times New Roman" w:eastAsia="Times New Roman" w:hAnsi="Times New Roman"/>
           <w:sz w:val="16"/>
           <w:szCs w:val="16"/>
         </w:rPr>
-      </w:pPr>
-      <w:r>
-        <w:rPr>
-          <w:rFonts w:ascii="Times New Roman" w:cs="Times New Roman" w:eastAsia="Times New Roman" w:hAnsi="Times New Roman"/>
-          <w:sz w:val="16"/>
-          <w:szCs w:val="16"/>
-        </w:rPr>
-        <w:t xml:space="preserve">[23] Statistics South Africa, “Living Conditions Survey 2014/2015: Household questionnaire,” survey instrument.</w:t>
+        <w:t xml:space="preserve">[23] Statistics South Africa, “Living Conditions Survey 2014/2015: Household questionnaire,” Pretoria, South Africa. (n.d.).</w:t>
       </w:r>
     </w:p>
     <w:p>
@@ -14032,10 +14336,6 @@
         <w:spacing w:after="0" w:before="0" w:line="160"/>
         <w:ind w:left="260" w:hanging="260"/>
         <w:jc w:val="left"/>
-        <w:rPr>
-          <w:sz w:val="16"/>
-          <w:szCs w:val="16"/>
-        </w:rPr>
       </w:pPr>
       <w:r>
         <w:rPr>
@@ -14052,10 +14352,6 @@
         <w:spacing w:after="0" w:before="0" w:line="160"/>
         <w:ind w:left="260" w:hanging="260"/>
         <w:jc w:val="left"/>
-        <w:rPr>
-          <w:sz w:val="16"/>
-          <w:szCs w:val="16"/>
-        </w:rPr>
       </w:pPr>
       <w:r>
         <w:rPr>
@@ -14072,10 +14368,6 @@
         <w:spacing w:after="0" w:before="0" w:line="160"/>
         <w:ind w:left="260" w:hanging="260"/>
         <w:jc w:val="left"/>
-        <w:rPr>
-          <w:sz w:val="16"/>
-          <w:szCs w:val="16"/>
-        </w:rPr>
       </w:pPr>
       <w:r>
         <w:rPr>
@@ -14092,10 +14384,6 @@
         <w:spacing w:after="0" w:before="0" w:line="160"/>
         <w:ind w:left="260" w:hanging="260"/>
         <w:jc w:val="left"/>
-        <w:rPr>
-          <w:sz w:val="16"/>
-          <w:szCs w:val="16"/>
-        </w:rPr>
       </w:pPr>
       <w:r>
         <w:rPr>
@@ -14112,10 +14400,6 @@
         <w:spacing w:after="0" w:before="0" w:line="160"/>
         <w:ind w:left="260" w:hanging="260"/>
         <w:jc w:val="left"/>
-        <w:rPr>
-          <w:sz w:val="16"/>
-          <w:szCs w:val="16"/>
-        </w:rPr>
       </w:pPr>
       <w:r>
         <w:rPr>

</xml_diff>

<commit_message>
Prepare eight-page IEEE paper for final peer review
</commit_message>
<xml_diff>
--- a/paper/Jawe_OPG_nonreceipt_KZN.docx
+++ b/paper/Jawe_OPG_nonreceipt_KZN.docx
@@ -17,8 +17,7 @@
           <w:sz w:val="48"/>
           <w:szCs w:val="48"/>
         </w:rPr>
-        <w:t xml:space="preserve">Interpretable Prediction of Reported Older Person’s Grant Non-Receipt Among Apparently Eligible Adults in KwaZulu-Natal
-</w:t>
+        <w:t xml:space="preserve">Interpretable Prediction of Reported Older Person’s Grant Non-Receipt Among Apparently Eligible Adults in KwaZulu-Natal</w:t>
       </w:r>
     </w:p>
     <w:p>
@@ -26,6 +25,24 @@
         <w:spacing w:after="30" w:before="0" w:line="230"/>
         <w:jc w:val="center"/>
         <w:rPr>
+          <w:sz w:val="22"/>
+          <w:szCs w:val="22"/>
+        </w:rPr>
+      </w:pPr>
+      <w:r>
+        <w:rPr>
+          <w:rFonts w:ascii="Times New Roman" w:cs="Times New Roman" w:eastAsia="Times New Roman" w:hAnsi="Times New Roman"/>
+          <w:sz w:val="22"/>
+          <w:szCs w:val="22"/>
+        </w:rPr>
+        <w:t xml:space="preserve">Oluhle Jawe</w:t>
+      </w:r>
+    </w:p>
+    <w:p>
+      <w:pPr>
+        <w:spacing w:after="30" w:before="0" w:line="230"/>
+        <w:jc w:val="center"/>
+        <w:rPr>
           <w:sz w:val="18"/>
           <w:szCs w:val="18"/>
         </w:rPr>
@@ -36,8 +53,7 @@
           <w:sz w:val="18"/>
           <w:szCs w:val="18"/>
         </w:rPr>
-        <w:t xml:space="preserve">Oluhle Jawe
-</w:t>
+        <w:t xml:space="preserve">ICT Honours (21634436), APRE402</w:t>
       </w:r>
     </w:p>
     <w:p>
@@ -55,65 +71,7 @@
           <w:sz w:val="18"/>
           <w:szCs w:val="18"/>
         </w:rPr>
-        <w:t xml:space="preserve">ICT Honours (21634436), APRE402
-</w:t>
-      </w:r>
-    </w:p>
-    <w:p>
-      <w:pPr>
-        <w:spacing w:after="30" w:before="0" w:line="230"/>
-        <w:jc w:val="center"/>
-        <w:rPr>
-          <w:sz w:val="18"/>
-          <w:szCs w:val="18"/>
-        </w:rPr>
-      </w:pPr>
-      <w:r>
-        <w:rPr>
-          <w:rFonts w:ascii="Times New Roman" w:cs="Times New Roman" w:eastAsia="Times New Roman" w:hAnsi="Times New Roman"/>
-          <w:sz w:val="18"/>
-          <w:szCs w:val="18"/>
-        </w:rPr>
-        <w:t xml:space="preserve">Durban University of Technology, Durban, South Africa
-</w:t>
-      </w:r>
-    </w:p>
-    <w:p>
-      <w:pPr>
-        <w:spacing w:after="80" w:before="80" w:line="220"/>
-        <w:jc w:val="both"/>
-        <w:rPr>
-          <w:sz w:val="18"/>
-          <w:szCs w:val="18"/>
-        </w:rPr>
-      </w:pPr>
-      <w:r>
-        <w:rPr>
-          <w:rFonts w:ascii="Times New Roman" w:cs="Times New Roman" w:eastAsia="Times New Roman" w:hAnsi="Times New Roman"/>
-          <w:sz w:val="18"/>
-          <w:szCs w:val="18"/>
-        </w:rPr>
-        <w:t xml:space="preserve">Abstract—This study analysed reported Older Person’s Grant (OPG) non-receipt among adults aged 60 or older in KwaZulu-Natal (KZN), using the Living Conditions Survey (LCS) 2014/2015. The study used administrative-burden theory to choose predictors and observable research rules to identify apparently eligible adults. Screening did not establish legal entitlement. Among 1,013 adults who passed with resolved receipt, 67 reported non-receipt: 6.6% unweighted and 7.5% person-weighted. Alternative screening rules gave weighted rates of 7.1%–9.1%. Logistic regression used five predictor groups and household-held-out validation. AUC (area under the receiver operating characteristic curve) was 0.752; average precision (AP) was 0.203. The Brier score was 0.0578, compared with 0.0618 for an intercept-only reference using training-group prevalence. Checks supported reproducibility. The application displays rules, decisions, scores and reports. No participant study tested ease of use. These results do not establish entitlement, explain non-receipt, or demonstrate performance elsewhere.
-</w:t>
-      </w:r>
-    </w:p>
-    <w:p>
-      <w:pPr>
-        <w:spacing w:after="80" w:before="80" w:line="220"/>
-        <w:jc w:val="both"/>
-        <w:rPr>
-          <w:sz w:val="18"/>
-          <w:szCs w:val="18"/>
-        </w:rPr>
-      </w:pPr>
-      <w:r>
-        <w:rPr>
-          <w:rFonts w:ascii="Times New Roman" w:cs="Times New Roman" w:eastAsia="Times New Roman" w:hAnsi="Times New Roman"/>
-          <w:sz w:val="18"/>
-          <w:szCs w:val="18"/>
-        </w:rPr>
-        <w:t xml:space="preserve">Keywords—Older Person’s Grant, reported non-receipt, administrative burden, Living Conditions Survey, logistic regression, reproducibility.
-</w:t>
+        <w:t xml:space="preserve">Durban University of Technology, Durban, South Africa</w:t>
       </w:r>
     </w:p>
     <w:p>
@@ -128,17 +86,15 @@
     </w:p>
     <w:p>
       <w:pPr>
-        <w:pStyle w:val="Heading1"/>
-        <w:keepNext/>
-        <w:spacing w:after="60" w:before="140" w:line="230"/>
-        <w:jc w:val="center"/>
+        <w:spacing w:after="80" w:before="0" w:line="240" w:lineRule="auto"/>
+        <w:jc w:val="both"/>
         <w:rPr>
           <w:b/>
           <w:bCs/>
           <w:i w:val="false"/>
           <w:iCs w:val="false"/>
-          <w:sz w:val="20"/>
-          <w:szCs w:val="20"/>
+          <w:sz w:val="18"/>
+          <w:szCs w:val="18"/>
         </w:rPr>
       </w:pPr>
       <w:r>
@@ -148,31 +104,68 @@
           <w:bCs/>
           <w:i w:val="false"/>
           <w:iCs w:val="false"/>
+          <w:sz w:val="18"/>
+          <w:szCs w:val="18"/>
+        </w:rPr>
+        <w:t xml:space="preserve">Abstract—This study analysed reported Older Person’s Grant (OPG) non-receipt among adults aged 60 or older in KwaZulu-Natal (KZN), using the Living Conditions Survey (LCS) 2014/2015. The study used administrative-burden theory to choose predictors and observable research rules to identify apparently eligible adults. Screening did not establish legal entitlement. Among 1,013 adults who passed with resolved receipt, 67 reported non-receipt: 6.6% unweighted and 7.5% person-weighted. Alternative screening rules gave weighted rates of 7.1%–9.1%. Logistic regression used five predictor groups and household-held-out validation. AUC (area under the receiver operating characteristic curve) was 0.752; average precision (AP) was 0.203. The Brier score was 0.0578, compared with 0.0618 for an intercept-only reference using training-group prevalence. Checks supported reproducibility. The application displays rules, decisions, scores and reports. No participant study tested ease of use. These results do not establish entitlement, explain non-receipt, or demonstrate performance elsewhere.</w:t>
+      </w:r>
+    </w:p>
+    <w:p>
+      <w:pPr>
+        <w:spacing w:after="80" w:before="0" w:line="240" w:lineRule="auto"/>
+        <w:jc w:val="both"/>
+        <w:rPr>
+          <w:b/>
+          <w:bCs/>
+          <w:i/>
+          <w:iCs/>
+          <w:sz w:val="18"/>
+          <w:szCs w:val="18"/>
+        </w:rPr>
+      </w:pPr>
+      <w:r>
+        <w:rPr>
+          <w:rFonts w:ascii="Times New Roman" w:cs="Times New Roman" w:eastAsia="Times New Roman" w:hAnsi="Times New Roman"/>
+          <w:b/>
+          <w:bCs/>
+          <w:i/>
+          <w:iCs/>
+          <w:sz w:val="18"/>
+          <w:szCs w:val="18"/>
+        </w:rPr>
+        <w:t xml:space="preserve">Index Terms—Older Person’s Grant, reported non-receipt, administrative burden, Living Conditions Survey, logistic regression, reproducibility.</w:t>
+      </w:r>
+    </w:p>
+    <w:p>
+      <w:pPr>
+        <w:pStyle w:val="Heading1"/>
+        <w:keepNext/>
+        <w:spacing w:after="60" w:before="140" w:line="240" w:lineRule="auto"/>
+        <w:jc w:val="center"/>
+        <w:rPr>
+          <w:i w:val="false"/>
+          <w:iCs w:val="false"/>
+          <w:smallCaps/>
           <w:sz w:val="20"/>
           <w:szCs w:val="20"/>
         </w:rPr>
-        <w:t xml:space="preserve">I. Introduction
-</w:t>
-      </w:r>
-    </w:p>
-    <w:p>
-      <w:pPr>
-        <w:spacing w:after="80" w:before="0" w:line="230"/>
-        <w:jc w:val="both"/>
-      </w:pPr>
-      <w:r>
-        <w:rPr>
-          <w:rFonts w:ascii="Times New Roman" w:cs="Times New Roman" w:eastAsia="Times New Roman" w:hAnsi="Times New Roman"/>
+      </w:pPr>
+      <w:r>
+        <w:rPr>
+          <w:rFonts w:ascii="Times New Roman" w:cs="Times New Roman" w:eastAsia="Times New Roman" w:hAnsi="Times New Roman"/>
+          <w:i w:val="false"/>
+          <w:iCs w:val="false"/>
+          <w:smallCaps/>
           <w:sz w:val="20"/>
           <w:szCs w:val="20"/>
         </w:rPr>
-        <w:t xml:space="preserve">The Older Person’s Grant (OPG) supports households [1], including during crises [2]. Other work examines receipt and access barriers [3], [4]. This study examines adults who appear eligible but report receiving no OPG.
-</w:t>
-      </w:r>
-    </w:p>
-    <w:p>
-      <w:pPr>
-        <w:spacing w:after="80" w:before="0" w:line="230"/>
+        <w:t xml:space="preserve">I. Introduction</w:t>
+      </w:r>
+    </w:p>
+    <w:p>
+      <w:pPr>
+        <w:spacing w:after="0" w:before="0" w:line="240" w:lineRule="auto"/>
+        <w:ind w:firstLine="200"/>
         <w:jc w:val="both"/>
       </w:pPr>
       <w:r>
@@ -181,13 +174,13 @@
           <w:sz w:val="20"/>
           <w:szCs w:val="20"/>
         </w:rPr>
-        <w:t xml:space="preserve">The analysis separates screening, reported receipt and legal entitlement. Passing the research screen does not mean approval by the South African Social Security Agency [5]. Non-receipt can reflect high income, no application, a pending decision or incomplete information. The analysis must define the screened group before calculating its non-receipt percentage; missing spouse income can change that group.
-</w:t>
-      </w:r>
-    </w:p>
-    <w:p>
-      <w:pPr>
-        <w:spacing w:after="80" w:before="0" w:line="230"/>
+        <w:t xml:space="preserve">The Older Person’s Grant (OPG) supports households [1], including during crises [2]. Prior studies examine rural pension receipt [3] and household grant receipt [4]. This study examines reported non-receipt among older adults who pass a research eligibility screen.</w:t>
+      </w:r>
+    </w:p>
+    <w:p>
+      <w:pPr>
+        <w:spacing w:after="0" w:before="0" w:line="240" w:lineRule="auto"/>
+        <w:ind w:firstLine="200"/>
         <w:jc w:val="both"/>
       </w:pPr>
       <w:r>
@@ -196,13 +189,13 @@
           <w:sz w:val="20"/>
           <w:szCs w:val="20"/>
         </w:rPr>
-        <w:t xml:space="preserve">The study aims to develop and evaluate an interpretable research tool for analysing reported OPG non-receipt among apparently eligible older adults in KwaZulu-Natal using the Living Conditions Survey (LCS) 2014/2015. Four objectives guide the work: document the included population, describe non-receipt using survey weights, test predictions on excluded households, and assess correctness, reproducibility and clarity.
-</w:t>
-      </w:r>
-    </w:p>
-    <w:p>
-      <w:pPr>
-        <w:spacing w:after="80" w:before="0" w:line="230"/>
+        <w:t xml:space="preserve">Screening, reported receipt and legal entitlement remain distinct. Passing observable research conditions does not establish a South African Social Security Agency decision [5]. Missing spouse resources and unresolved responses change the denominator, whose construction must precede estimation.</w:t>
+      </w:r>
+    </w:p>
+    <w:p>
+      <w:pPr>
+        <w:spacing w:after="0" w:before="0" w:line="240" w:lineRule="auto"/>
+        <w:ind w:firstLine="200"/>
         <w:jc w:val="both"/>
       </w:pPr>
       <w:r>
@@ -211,21 +204,34 @@
           <w:sz w:val="20"/>
           <w:szCs w:val="20"/>
         </w:rPr>
-        <w:t xml:space="preserve">Research questions (RQs) guide the study. RQ1 asks what proportion of screened adults reports non-receipt and how that proportion changes under different screening assumptions. RQ2 asks how well logistic regression separates recipients from non-recipients and estimates chances in excluded households. RQ3 asks whether the tool can repeat the analysis and clearly explain screening decisions and model results. The study combines documented rules, weighted percentages, tested predictions and a local interface to address them.
-</w:t>
+        <w:t xml:space="preserve">This study develops and evaluates an interpretable research artefact using the Living Conditions Survey (LCS) 2014/2015 in KwaZulu-Natal. It documents cohort construction, estimates weighted non-receipt, tests predictions in held-out households and verifies computational correctness, reproducibility and inspectability.</w:t>
+      </w:r>
+    </w:p>
+    <w:p>
+      <w:pPr>
+        <w:spacing w:after="0" w:before="0" w:line="240" w:lineRule="auto"/>
+        <w:ind w:firstLine="200"/>
+        <w:jc w:val="both"/>
+      </w:pPr>
+      <w:r>
+        <w:rPr>
+          <w:rFonts w:ascii="Times New Roman" w:cs="Times New Roman" w:eastAsia="Times New Roman" w:hAnsi="Times New Roman"/>
+          <w:sz w:val="20"/>
+          <w:szCs w:val="20"/>
+        </w:rPr>
+        <w:t xml:space="preserve">RQ1 asks how common reported non-receipt is among screen-PASS adults with resolved receipt and how screening alternatives change that proportion. RQ2 evaluates logistic discrimination and probability accuracy in held-out households. RQ3 asks whether the artefact reproduces the analysis and clearly presents screening decisions and model outputs; participant usability remains untested.</w:t>
       </w:r>
     </w:p>
     <w:p>
       <w:pPr>
         <w:pStyle w:val="Heading1"/>
         <w:keepNext/>
-        <w:spacing w:after="60" w:before="140" w:line="230"/>
+        <w:spacing w:after="60" w:before="140" w:line="240" w:lineRule="auto"/>
         <w:jc w:val="center"/>
         <w:rPr>
-          <w:b/>
-          <w:bCs/>
           <w:i w:val="false"/>
           <w:iCs w:val="false"/>
+          <w:smallCaps/>
           <w:sz w:val="20"/>
           <w:szCs w:val="20"/>
         </w:rPr>
@@ -233,28 +239,25 @@
       <w:r>
         <w:rPr>
           <w:rFonts w:ascii="Times New Roman" w:cs="Times New Roman" w:eastAsia="Times New Roman" w:hAnsi="Times New Roman"/>
-          <w:b/>
-          <w:bCs/>
           <w:i w:val="false"/>
           <w:iCs w:val="false"/>
+          <w:smallCaps/>
           <w:sz w:val="20"/>
           <w:szCs w:val="20"/>
         </w:rPr>
-        <w:t xml:space="preserve">II. Related Work and Predictor Selection
-</w:t>
+        <w:t xml:space="preserve">II. Related Work and Predictor Selection</w:t>
       </w:r>
     </w:p>
     <w:p>
       <w:pPr>
         <w:pStyle w:val="Heading2"/>
         <w:keepNext/>
-        <w:spacing w:after="60" w:before="140" w:line="230"/>
+        <w:spacing w:after="60" w:before="140" w:line="240" w:lineRule="auto"/>
         <w:jc w:val="left"/>
         <w:rPr>
-          <w:b w:val="false"/>
-          <w:bCs w:val="false"/>
           <w:i/>
           <w:iCs/>
+          <w:smallCaps w:val="false"/>
           <w:sz w:val="20"/>
           <w:szCs w:val="20"/>
         </w:rPr>
@@ -262,20 +265,19 @@
       <w:r>
         <w:rPr>
           <w:rFonts w:ascii="Times New Roman" w:cs="Times New Roman" w:eastAsia="Times New Roman" w:hAnsi="Times New Roman"/>
-          <w:b w:val="false"/>
-          <w:bCs w:val="false"/>
           <w:i/>
           <w:iCs/>
+          <w:smallCaps w:val="false"/>
           <w:sz w:val="20"/>
           <w:szCs w:val="20"/>
         </w:rPr>
-        <w:t xml:space="preserve">A. Review Approach, Programme Context and Research Gap
-</w:t>
-      </w:r>
-    </w:p>
-    <w:p>
-      <w:pPr>
-        <w:spacing w:after="80" w:before="0" w:line="230"/>
+        <w:t xml:space="preserve">A. Review Approach, Programme Context and Research Gap</w:t>
+      </w:r>
+    </w:p>
+    <w:p>
+      <w:pPr>
+        <w:spacing w:after="0" w:before="0" w:line="240" w:lineRule="auto"/>
+        <w:ind w:firstLine="200"/>
         <w:jc w:val="both"/>
       </w:pPr>
       <w:r>
@@ -284,13 +286,13 @@
           <w:sz w:val="20"/>
           <w:szCs w:val="20"/>
         </w:rPr>
-        <w:t xml:space="preserve">The literature review used thematic narrative synthesis to examine grant access, eligibility measurement and prediction. Searches covered Scopus, Dimensions, IEEE Xplore, SABINET/African Journals Online, Google Scholar and Statistics South Africa/DataFirst. Search concepts included social assistance, eligibility, take-up, non-receipt, exclusion and prediction. Sources were considered for relevance to the research question, population, outcome and methodological contribution. Studies were compared by programme, setting, unit of analysis, outcome, findings and limitations. Differences in these features prevent a pooled non-receipt estimate.
-</w:t>
-      </w:r>
-    </w:p>
-    <w:p>
-      <w:pPr>
-        <w:spacing w:after="80" w:before="0" w:line="230"/>
+        <w:t xml:space="preserve">The narrative review drew on Scopus, Dimensions, IEEE Xplore, SABINET/African Journals Online, Google Scholar and Statistics South Africa/DataFirst. Searches covered social assistance, eligibility, take-up, non-receipt, exclusion and prediction. Studies differed in programme, population, unit and outcome, preventing pooled estimates.</w:t>
+      </w:r>
+    </w:p>
+    <w:p>
+      <w:pPr>
+        <w:spacing w:after="0" w:before="0" w:line="240" w:lineRule="auto"/>
+        <w:ind w:firstLine="200"/>
         <w:jc w:val="both"/>
       </w:pPr>
       <w:r>
@@ -299,13 +301,13 @@
           <w:sz w:val="20"/>
           <w:szCs w:val="20"/>
         </w:rPr>
-        <w:t xml:space="preserve">The recorded search summary lists 511 records: 136 duplicates removed, 375 titles/abstracts screened, 222 excluded, 153 full texts assessed, 98 further exclusions and 55 retained sources. These sources cover several grants and populations, rather than 55 OPG studies. The available record documents the search concepts, broad selection criteria and aggregate counts. It does not preserve database-specific query strings, search dates and filters, original exports or record-level screening and exclusion decisions. The full 55-source extraction register is also unavailable. These omissions prevent independent reproduction of the search and verification of each selection decision. The synthesis therefore provides contextual evidence without establishing exhaustive literature coverage.
-</w:t>
-      </w:r>
-    </w:p>
-    <w:p>
-      <w:pPr>
-        <w:spacing w:after="80" w:before="0" w:line="230"/>
+        <w:t xml:space="preserve">Review records report 511 items: 136 duplicates removed, 375 titles/abstracts screened, 222 exclusions, 153 full-text assessments, 98 further exclusions and 55 retained sources across grants and populations. Queries, search dates/filters, exports, item-level decisions and the full extraction register are unavailable. These aggregate counts cannot establish reproducible selection or exhaustive coverage.</w:t>
+      </w:r>
+    </w:p>
+    <w:p>
+      <w:pPr>
+        <w:spacing w:after="0" w:before="0" w:line="240" w:lineRule="auto"/>
+        <w:ind w:firstLine="200"/>
         <w:jc w:val="both"/>
       </w:pPr>
       <w:r>
@@ -314,16 +316,16 @@
           <w:sz w:val="20"/>
           <w:szCs w:val="20"/>
         </w:rPr>
-        <w:t xml:space="preserve">Table I distinguishes individual receipt [3] from household proportions [4], and this study’s provincial resource screen from both. Other-grant studies separate enquiry, application, receipt and uninterrupted payment [6], [7], [8].
-</w:t>
+        <w:t xml:space="preserve">Table I distinguishes individual receipt [3] from household proportions [4], and this study’s provincial resource screen from both. Other-grant studies separate enquiry, application, receipt and uninterrupted payment [6], [7], [8].</w:t>
       </w:r>
     </w:p>
     <w:p>
       <w:pPr>
         <w:keepNext/>
-        <w:spacing w:after="50" w:before="100" w:line="190"/>
+        <w:spacing w:after="50" w:before="100" w:line="240" w:lineRule="auto"/>
         <w:jc w:val="center"/>
         <w:rPr>
+          <w:smallCaps/>
           <w:sz w:val="16"/>
           <w:szCs w:val="16"/>
         </w:rPr>
@@ -331,11 +333,12 @@
       <w:r>
         <w:rPr>
           <w:rFonts w:ascii="Times New Roman" w:cs="Times New Roman" w:eastAsia="Times New Roman" w:hAnsi="Times New Roman"/>
+          <w:smallCaps/>
           <w:sz w:val="16"/>
           <w:szCs w:val="16"/>
         </w:rPr>
-        <w:t xml:space="preserve">Table I. Evidence scope informing the study
-</w:t>
+        <w:t xml:space="preserve">TABLE I
+Evidence scope informing the study</w:t>
       </w:r>
     </w:p>
     <w:tbl>
@@ -1133,7 +1136,8 @@
     </w:tbl>
     <w:p>
       <w:pPr>
-        <w:spacing w:after="80" w:before="0" w:line="230"/>
+        <w:spacing w:after="0" w:before="0" w:line="240" w:lineRule="auto"/>
+        <w:ind w:firstLine="200"/>
         <w:jc w:val="both"/>
       </w:pPr>
       <w:r>
@@ -1142,13 +1146,13 @@
           <w:sz w:val="20"/>
           <w:szCs w:val="20"/>
         </w:rPr>
-        <w:t xml:space="preserve">Gazeaud supports checking income assumptions [11], without quantifying LCS errors or defining South African eligibility. Mabala models another grant for younger applicants [12]; its findings cannot directly predict OPG receipt.
-</w:t>
-      </w:r>
-    </w:p>
-    <w:p>
-      <w:pPr>
-        <w:spacing w:after="80" w:before="0" w:line="230"/>
+        <w:t xml:space="preserve">Gazeaud motivates income sensitivity [11]; Mabala studies a different grant and age group [12]. Neither establishes OPG eligibility.</w:t>
+      </w:r>
+    </w:p>
+    <w:p>
+      <w:pPr>
+        <w:spacing w:after="0" w:before="0" w:line="240" w:lineRule="auto"/>
+        <w:ind w:firstLine="200"/>
         <w:jc w:val="both"/>
       </w:pPr>
       <w:r>
@@ -1157,21 +1161,19 @@
           <w:sz w:val="20"/>
           <w:szCs w:val="20"/>
         </w:rPr>
-        <w:t xml:space="preserve">The research gap concerns how these separate strands can support a reproducible, person-level analysis of OPG non-receipt in KwaZulu-Natal. Ralston's age-based rural receipt analysis [3] and Godfrey's household receipt proportions [4] do not directly provide non-receipt estimates after the resource screen used here. Evidence on other grants informs possible access barriers, but does not establish their effects among older OPG applicants. The study addresses this integration gap by documenting the screening denominator, testing how alternative rules change non-receipt estimates, and evaluating an interpretable model on excluded households. Shared rules connect the research command and application so that decisions, probabilities and reports remain inspectable. The specific contribution is a historical workflow that connects transparent screening, person-weighted description, household-held-out prediction and reproducible software. This supports scrutiny of assumptions and results without establishing legal entitlement, causal barriers, participant usability or performance elsewhere.
-</w:t>
+        <w:t xml:space="preserve">Cited studies do not directly show how resource, partnership and grant-compatibility assumptions shape provincial person-level non-receipt estimates. This study connects explicit screening, sensitivity analysis, weighted description and household-held-out prediction through shared rules and inspectable software. Its contribution concerns measurement and reproducibility, rather than statutory entitlement or access mechanisms.</w:t>
       </w:r>
     </w:p>
     <w:p>
       <w:pPr>
         <w:pStyle w:val="Heading2"/>
         <w:keepNext/>
-        <w:spacing w:after="60" w:before="140" w:line="230"/>
+        <w:spacing w:after="60" w:before="140" w:line="240" w:lineRule="auto"/>
         <w:jc w:val="left"/>
         <w:rPr>
-          <w:b w:val="false"/>
-          <w:bCs w:val="false"/>
           <w:i/>
           <w:iCs/>
+          <w:smallCaps w:val="false"/>
           <w:sz w:val="20"/>
           <w:szCs w:val="20"/>
         </w:rPr>
@@ -1179,20 +1181,19 @@
       <w:r>
         <w:rPr>
           <w:rFonts w:ascii="Times New Roman" w:cs="Times New Roman" w:eastAsia="Times New Roman" w:hAnsi="Times New Roman"/>
-          <w:b w:val="false"/>
-          <w:bCs w:val="false"/>
           <w:i/>
           <w:iCs/>
+          <w:smallCaps w:val="false"/>
           <w:sz w:val="20"/>
           <w:szCs w:val="20"/>
         </w:rPr>
-        <w:t xml:space="preserve">B. Grant Access and Administrative Burden
-</w:t>
-      </w:r>
-    </w:p>
-    <w:p>
-      <w:pPr>
-        <w:spacing w:after="80" w:before="0" w:line="230"/>
+        <w:t xml:space="preserve">B. Grant Access and Administrative Burden</w:t>
+      </w:r>
+    </w:p>
+    <w:p>
+      <w:pPr>
+        <w:spacing w:after="0" w:before="0" w:line="240" w:lineRule="auto"/>
+        <w:ind w:firstLine="200"/>
         <w:jc w:val="both"/>
       </w:pPr>
       <w:r>
@@ -1201,13 +1202,13 @@
           <w:sz w:val="20"/>
           <w:szCs w:val="20"/>
         </w:rPr>
-        <w:t xml:space="preserve">Administrative-burden theory distinguishes learning, compliance and psychological costs [13]. Grant studies describe paperwork, repeated visits, interrupted payments and difficult encounters [8], [9], [10], [14]. Child Support Grant research suggests barriers [6], [7], without establishing their effects among older OPG applicants. Digital access can create difficulties [15]. Low non-receipt therefore does not demonstrate easy access.
-</w:t>
-      </w:r>
-    </w:p>
-    <w:p>
-      <w:pPr>
-        <w:spacing w:after="80" w:before="0" w:line="230"/>
+        <w:t xml:space="preserve">Administrative-burden theory distinguishes learning, compliance and psychological costs [13]. Grant studies describe paperwork, repeated visits, interrupted payments and difficult encounters [8], [9], [10], [14]. Child Support Grant research suggests barriers [6], [7], without establishing their effects among older OPG applicants. Digital access can create difficulties [15]. Low non-receipt therefore does not demonstrate easy access.</w:t>
+      </w:r>
+    </w:p>
+    <w:p>
+      <w:pPr>
+        <w:spacing w:after="0" w:before="0" w:line="240" w:lineRule="auto"/>
+        <w:ind w:firstLine="200"/>
         <w:jc w:val="both"/>
       </w:pPr>
       <w:r>
@@ -1216,21 +1217,19 @@
           <w:sz w:val="20"/>
           <w:szCs w:val="20"/>
         </w:rPr>
-        <w:t xml:space="preserve">LCS does not record every legal condition or application experience. The screen checks age, resources, partnership and other-grant rules. It assigns PASS (the person meets the research conditions), FAIL (a known condition is not met) or UNRESOLVED (available information cannot resolve the decision). The analysis then checks receipt separately. Only adults who pass with clear receipt answers enter the prediction study. Unclear or contradictory answers remain unresolved.
-</w:t>
+        <w:t xml:space="preserve">The screen operationalises observable age, resources, partnership and grant-compatibility rules while retaining unresolved information. Screening status and reported receipt remain separate. Only screen-PASS adults with resolved receipt enter descriptive and predictive analyses; unclear or contradictory receipt responses remain unresolved.</w:t>
       </w:r>
     </w:p>
     <w:p>
       <w:pPr>
         <w:pStyle w:val="Heading2"/>
         <w:keepNext/>
-        <w:spacing w:after="60" w:before="140" w:line="230"/>
+        <w:spacing w:after="60" w:before="140" w:line="240" w:lineRule="auto"/>
         <w:jc w:val="left"/>
         <w:rPr>
-          <w:b w:val="false"/>
-          <w:bCs w:val="false"/>
           <w:i/>
           <w:iCs/>
+          <w:smallCaps w:val="false"/>
           <w:sz w:val="20"/>
           <w:szCs w:val="20"/>
         </w:rPr>
@@ -1238,20 +1237,19 @@
       <w:r>
         <w:rPr>
           <w:rFonts w:ascii="Times New Roman" w:cs="Times New Roman" w:eastAsia="Times New Roman" w:hAnsi="Times New Roman"/>
-          <w:b w:val="false"/>
-          <w:bCs w:val="false"/>
           <w:i/>
           <w:iCs/>
+          <w:smallCaps w:val="false"/>
           <w:sz w:val="20"/>
           <w:szCs w:val="20"/>
         </w:rPr>
-        <w:t xml:space="preserve">C. Predictor Selection and Software Design
-</w:t>
-      </w:r>
-    </w:p>
-    <w:p>
-      <w:pPr>
-        <w:spacing w:after="80" w:before="0" w:line="230"/>
+        <w:t xml:space="preserve">C. Predictor Selection and Software Design</w:t>
+      </w:r>
+    </w:p>
+    <w:p>
+      <w:pPr>
+        <w:spacing w:after="0" w:before="0" w:line="240" w:lineRule="auto"/>
+        <w:ind w:firstLine="200"/>
         <w:jc w:val="both"/>
       </w:pPr>
       <w:r>
@@ -1260,16 +1258,16 @@
           <w:sz w:val="20"/>
           <w:szCs w:val="20"/>
         </w:rPr>
-        <w:t xml:space="preserve">Table II separates demographic context from circumstances relevant to learning and compliance costs. These predictors do not directly measure administrative burden or establish why a person reports non-receipt.
-</w:t>
+        <w:t xml:space="preserve">Table II separates demographic context from circumstances relevant to learning and compliance costs. These predictors do not directly measure administrative burden or establish why a person reports non-receipt.</w:t>
       </w:r>
     </w:p>
     <w:p>
       <w:pPr>
         <w:keepNext/>
-        <w:spacing w:after="50" w:before="100" w:line="190"/>
+        <w:spacing w:after="50" w:before="100" w:line="240" w:lineRule="auto"/>
         <w:jc w:val="center"/>
         <w:rPr>
+          <w:smallCaps/>
           <w:sz w:val="16"/>
           <w:szCs w:val="16"/>
         </w:rPr>
@@ -1277,11 +1275,12 @@
       <w:r>
         <w:rPr>
           <w:rFonts w:ascii="Times New Roman" w:cs="Times New Roman" w:eastAsia="Times New Roman" w:hAnsi="Times New Roman"/>
+          <w:smallCaps/>
           <w:sz w:val="16"/>
           <w:szCs w:val="16"/>
         </w:rPr>
-        <w:t xml:space="preserve">Table II. Administrative-burden theory and predictor selection
-</w:t>
+        <w:t xml:space="preserve">TABLE II
+Administrative-burden theory and predictor selection</w:t>
       </w:r>
     </w:p>
     <w:tbl>
@@ -2079,7 +2078,7 @@
     </w:tbl>
     <w:p>
       <w:pPr>
-        <w:spacing w:after="80" w:before="30" w:line="190"/>
+        <w:spacing w:after="80" w:before="30" w:line="240" w:lineRule="auto"/>
         <w:jc w:val="both"/>
         <w:rPr>
           <w:i/>
@@ -2096,13 +2095,13 @@
           <w:sz w:val="16"/>
           <w:szCs w:val="16"/>
         </w:rPr>
-        <w:t xml:space="preserve">Psychological costs are unmeasured. Settlement contributes two contrasts, giving five predictor groups and six slopes.
-</w:t>
-      </w:r>
-    </w:p>
-    <w:p>
-      <w:pPr>
-        <w:spacing w:after="80" w:before="0" w:line="230"/>
+        <w:t xml:space="preserve">Psychological costs are unmeasured. Settlement contributes two contrasts, giving five predictor groups and six slopes.</w:t>
+      </w:r>
+    </w:p>
+    <w:p>
+      <w:pPr>
+        <w:spacing w:after="0" w:before="0" w:line="240" w:lineRule="auto"/>
+        <w:ind w:firstLine="200"/>
         <w:jc w:val="both"/>
       </w:pPr>
       <w:r>
@@ -2111,21 +2110,19 @@
           <w:sz w:val="20"/>
           <w:szCs w:val="20"/>
         </w:rPr>
-        <w:t xml:space="preserve">Few events motivate assessment of precision, calibration and ranking [16], [17]. Sample size and internal validation limit generalisation [18], [19]. Reporting follows TRIPOD (Transparent Reporting of a multivariable prediction model for Individual Prognosis Or Diagnosis) [20]. Software checks assess correctness and repeatability; usability requires participant evidence.
-</w:t>
+        <w:t xml:space="preserve">Rare outcomes require precision–recall assessment alongside discrimination and calibration [16], [17]. Sample size limits precision [18]; household grouping constrains validation [19]. TRIPOD informed prediction reporting [20]. Software verification and participant usability require different evidence.</w:t>
       </w:r>
     </w:p>
     <w:p>
       <w:pPr>
         <w:pStyle w:val="Heading2"/>
         <w:keepNext/>
-        <w:spacing w:after="60" w:before="140" w:line="230"/>
+        <w:spacing w:after="60" w:before="140" w:line="240" w:lineRule="auto"/>
         <w:jc w:val="left"/>
         <w:rPr>
-          <w:b w:val="false"/>
-          <w:bCs w:val="false"/>
           <w:i/>
           <w:iCs/>
+          <w:smallCaps w:val="false"/>
           <w:sz w:val="20"/>
           <w:szCs w:val="20"/>
         </w:rPr>
@@ -2133,20 +2130,19 @@
       <w:r>
         <w:rPr>
           <w:rFonts w:ascii="Times New Roman" w:cs="Times New Roman" w:eastAsia="Times New Roman" w:hAnsi="Times New Roman"/>
-          <w:b w:val="false"/>
-          <w:bCs w:val="false"/>
           <w:i/>
           <w:iCs/>
+          <w:smallCaps w:val="false"/>
           <w:sz w:val="20"/>
           <w:szCs w:val="20"/>
         </w:rPr>
-        <w:t xml:space="preserve">D. Conceptual Framework
-</w:t>
-      </w:r>
-    </w:p>
-    <w:p>
-      <w:pPr>
-        <w:spacing w:after="80" w:before="0" w:line="230"/>
+        <w:t xml:space="preserve">D. Conceptual Framework</w:t>
+      </w:r>
+    </w:p>
+    <w:p>
+      <w:pPr>
+        <w:spacing w:after="0" w:before="0" w:line="240" w:lineRule="auto"/>
+        <w:ind w:firstLine="200"/>
         <w:jc w:val="both"/>
       </w:pPr>
       <w:r>
@@ -2155,38 +2151,7 @@
           <w:sz w:val="20"/>
           <w:szCs w:val="20"/>
         </w:rPr>
-        <w:t xml:space="preserve">Reported OPG non-receipt among apparently eligible older adults motivates an administrative-burden perspective [13], [14]. Learning, compliance and psychological costs may obstruct access; high receipt does not establish low burden.
-</w:t>
-      </w:r>
-    </w:p>
-    <w:p>
-      <w:pPr>
-        <w:spacing w:after="80" w:before="0" w:line="230"/>
-        <w:jc w:val="both"/>
-      </w:pPr>
-      <w:r>
-        <w:rPr>
-          <w:rFonts w:ascii="Times New Roman" w:cs="Times New Roman" w:eastAsia="Times New Roman" w:hAnsi="Times New Roman"/>
-          <w:sz w:val="20"/>
-          <w:szCs w:val="20"/>
-        </w:rPr>
-        <w:t xml:space="preserve">Figure 1 separates theoretical constructs from LCS measurements. Schooling may reflect information resources; office distance and settlement relate to potential compliance effort. Age and sex provide demographic context. These proxies do not directly measure burden. Screening defines the denominator because age alone is insufficient and LCS cannot establish legal entitlement. Resource, partnership and other-grant rules define the population; incomplete information remains unresolved. Reported receipt defines a separate outcome.
-</w:t>
-      </w:r>
-    </w:p>
-    <w:p>
-      <w:pPr>
-        <w:spacing w:after="80" w:before="0" w:line="230"/>
-        <w:jc w:val="both"/>
-      </w:pPr>
-      <w:r>
-        <w:rPr>
-          <w:rFonts w:ascii="Times New Roman" w:cs="Times New Roman" w:eastAsia="Times New Roman" w:hAnsi="Times New Roman"/>
-          <w:sz w:val="20"/>
-          <w:szCs w:val="20"/>
-        </w:rPr>
-        <w:t xml:space="preserve">Person-weighted estimates describe non-receipt. Logistic regression describes associations; household-held-out validation tests predictions. Neither establishes causal mechanisms. The artefact implements the design through shared rules, separate receipt classifications, saved-model scoring and inspectable reports. Upload scores remain separate from held-out evaluation and never change screening or receipt.
-</w:t>
+        <w:t xml:space="preserve">Reported non-receipt motivates an administrative-burden perspective. Figure 1 links theory to LCS proxies, with age and sex as demographic context. Observable screening is necessary because age alone cannot define eligibility and LCS omits legal conditions. Resource, partnership and grant-compatibility rules define the population; reported receipt defines the outcome. Person weights describe non-receipt; unweighted household-held-out validation assesses prediction. The artefact implements this design through shared rules, frozen scoring and inspectable reports. Application scores remain separate from held-out evaluation and never change screening or receipt.</w:t>
       </w:r>
     </w:p>
     <w:p>
@@ -2200,7 +2165,7 @@
           <wp:inline distT="0" distB="0" distL="0" distR="0">
             <wp:extent cx="3200400" cy="3429000"/>
             <wp:effectExtent t="0" r="0" b="0" l="0"/>
-            <wp:docPr id="1" name="Fig. 1. Conceptual framework. Theory informs predictor selection; observable screening defines the population for separate descriptive and predictive analyses. The dashed boundary identifies the artefact’s implementation scope. Arrows show conceptual rationale or analytical dependencies, not causal effects. " descr="Fig. 1. Conceptual framework. Theory informs predictor selection; observable screening defines the population for separate descriptive and predictive analyses. The dashed boundary identifies the artefact’s implementation scope. Arrows show conceptual rationale or analytical dependencies, not causal effects. " title="Fig. 1. Conceptual framework. Theory informs predictor selection; observable screening defines the population for separate descriptive and predictive analyses. The dashed boundary identifies the artefact’s implementation scope. Arrows show conceptual rationale or analytical dependencies, not causal effects. "/>
+            <wp:docPr id="1" name="Fig. 1. Conceptual framework. Theory informs predictor selection; observable screening defines the population for separate descriptive and predictive analyses. The dashed boundary identifies the artefact’s implementation scope. Arrows show conceptual rationale or analytical dependencies, not causal effects." descr="Fig. 1. Conceptual framework. Theory informs predictor selection; observable screening defines the population for separate descriptive and predictive analyses. The dashed boundary identifies the artefact’s implementation scope. Arrows show conceptual rationale or analytical dependencies, not causal effects." title="Fig. 1. Conceptual framework. Theory informs predictor selection; observable screening defines the population for separate descriptive and predictive analyses. The dashed boundary identifies the artefact’s implementation scope. Arrows show conceptual rationale or analytical dependencies, not causal effects."/>
             <wp:cNvGraphicFramePr>
               <a:graphicFrameLocks xmlns:a="http://schemas.openxmlformats.org/drawingml/2006/main" noChangeAspect="1"/>
             </wp:cNvGraphicFramePr>
@@ -2238,7 +2203,7 @@
     </w:p>
     <w:p>
       <w:pPr>
-        <w:spacing w:after="80" w:before="0" w:line="190"/>
+        <w:spacing w:after="80" w:before="0" w:line="240" w:lineRule="auto"/>
         <w:jc w:val="both"/>
         <w:rPr>
           <w:sz w:val="16"/>
@@ -2251,21 +2216,19 @@
           <w:sz w:val="16"/>
           <w:szCs w:val="16"/>
         </w:rPr>
-        <w:t xml:space="preserve">Fig. 1. Conceptual framework. Theory informs predictor selection; observable screening defines the population for separate descriptive and predictive analyses. The dashed boundary identifies the artefact’s implementation scope. Arrows show conceptual rationale or analytical dependencies, not causal effects.
-</w:t>
+        <w:t xml:space="preserve">Fig. 1. Conceptual framework. Theory informs predictor selection; observable screening defines the population for separate descriptive and predictive analyses. The dashed boundary identifies the artefact’s implementation scope. Arrows show conceptual rationale or analytical dependencies, not causal effects.</w:t>
       </w:r>
     </w:p>
     <w:p>
       <w:pPr>
         <w:pStyle w:val="Heading1"/>
         <w:keepNext/>
-        <w:spacing w:after="60" w:before="140" w:line="230"/>
+        <w:spacing w:after="60" w:before="140" w:line="240" w:lineRule="auto"/>
         <w:jc w:val="center"/>
         <w:rPr>
-          <w:b/>
-          <w:bCs/>
           <w:i w:val="false"/>
           <w:iCs w:val="false"/>
+          <w:smallCaps/>
           <w:sz w:val="20"/>
           <w:szCs w:val="20"/>
         </w:rPr>
@@ -2273,28 +2236,25 @@
       <w:r>
         <w:rPr>
           <w:rFonts w:ascii="Times New Roman" w:cs="Times New Roman" w:eastAsia="Times New Roman" w:hAnsi="Times New Roman"/>
-          <w:b/>
-          <w:bCs/>
           <w:i w:val="false"/>
           <w:iCs w:val="false"/>
+          <w:smallCaps/>
           <w:sz w:val="20"/>
           <w:szCs w:val="20"/>
         </w:rPr>
-        <w:t xml:space="preserve">III. Methods
-</w:t>
+        <w:t xml:space="preserve">III. Methods</w:t>
       </w:r>
     </w:p>
     <w:p>
       <w:pPr>
         <w:pStyle w:val="Heading2"/>
         <w:keepNext/>
-        <w:spacing w:after="60" w:before="140" w:line="230"/>
+        <w:spacing w:after="60" w:before="140" w:line="240" w:lineRule="auto"/>
         <w:jc w:val="left"/>
         <w:rPr>
-          <w:b w:val="false"/>
-          <w:bCs w:val="false"/>
           <w:i/>
           <w:iCs/>
+          <w:smallCaps w:val="false"/>
           <w:sz w:val="20"/>
           <w:szCs w:val="20"/>
         </w:rPr>
@@ -2302,20 +2262,19 @@
       <w:r>
         <w:rPr>
           <w:rFonts w:ascii="Times New Roman" w:cs="Times New Roman" w:eastAsia="Times New Roman" w:hAnsi="Times New Roman"/>
-          <w:b w:val="false"/>
-          <w:bCs w:val="false"/>
           <w:i/>
           <w:iCs/>
+          <w:smallCaps w:val="false"/>
           <w:sz w:val="20"/>
           <w:szCs w:val="20"/>
         </w:rPr>
-        <w:t xml:space="preserve">A. Data and study population
-</w:t>
-      </w:r>
-    </w:p>
-    <w:p>
-      <w:pPr>
-        <w:spacing w:after="80" w:before="0" w:line="230"/>
+        <w:t xml:space="preserve">A. Data and study population</w:t>
+      </w:r>
+    </w:p>
+    <w:p>
+      <w:pPr>
+        <w:spacing w:after="0" w:before="0" w:line="240" w:lineRule="auto"/>
+        <w:ind w:firstLine="200"/>
         <w:jc w:val="both"/>
       </w:pPr>
       <w:r>
@@ -2324,31 +2283,16 @@
           <w:sz w:val="20"/>
           <w:szCs w:val="20"/>
         </w:rPr>
-        <w:t xml:space="preserve">The analysis linked the LCS 2014/2015 person, household and person-income files through survey identifiers. Checks covered duplicates, unmatched records and row counts. The questionnaire, metadata and COICOP (Classification of Individual Consumption According to Purpose) codes guided interpretation [21], [22], [23]. The study covered sampled KwaZulu-Natal residents aged 60 or older in completed years. The survey excludes older adults living in institutions. Screening used the rules for each interview month. Before releasing the data, Statistics South Africa used hot-deck imputation for age and sex. The released files do not identify these records. The model handled missing predictors separately.
-</w:t>
-      </w:r>
-    </w:p>
-    <w:p>
-      <w:pPr>
-        <w:spacing w:after="80" w:before="0" w:line="230"/>
-        <w:jc w:val="both"/>
-      </w:pPr>
-      <w:r>
-        <w:rPr>
-          <w:rFonts w:ascii="Times New Roman" w:cs="Times New Roman" w:eastAsia="Times New Roman" w:hAnsi="Times New Roman"/>
-          <w:sz w:val="20"/>
-          <w:szCs w:val="20"/>
-        </w:rPr>
-        <w:t xml:space="preserve">Table III shows each field's role. Summing income before linkage avoided duplicate person records.
-</w:t>
+        <w:t xml:space="preserve">The analysis linked LCS 2014/2015 person, household and person-income files using survey identifiers, checking duplicates, unmatched records and row counts. Questionnaire, metadata and COICOP (Classification of Individual Consumption According to Purpose) codes guided interpretation [21], [22], [23]. The study included sampled KwaZulu-Natal residents aged 60+; the household survey excludes institutional residents. Screening used interview-month rules. Statistics South Africa had hot-deck-imputed age and sex before release, without record-level flags. Model preprocessing addressed missing predictors separately. Aggregating income before linkage preserved person-level records (Table III).</w:t>
       </w:r>
     </w:p>
     <w:p>
       <w:pPr>
         <w:keepNext/>
-        <w:spacing w:after="50" w:before="100" w:line="190"/>
+        <w:spacing w:after="50" w:before="100" w:line="240" w:lineRule="auto"/>
         <w:jc w:val="center"/>
         <w:rPr>
+          <w:smallCaps/>
           <w:sz w:val="16"/>
           <w:szCs w:val="16"/>
         </w:rPr>
@@ -2356,11 +2300,12 @@
       <w:r>
         <w:rPr>
           <w:rFonts w:ascii="Times New Roman" w:cs="Times New Roman" w:eastAsia="Times New Roman" w:hAnsi="Times New Roman"/>
+          <w:smallCaps/>
           <w:sz w:val="16"/>
           <w:szCs w:val="16"/>
         </w:rPr>
-        <w:t xml:space="preserve">Table III. How each data field enters the analysis
-</w:t>
+        <w:t xml:space="preserve">TABLE III
+How each data field enters the analysis</w:t>
       </w:r>
     </w:p>
     <w:tbl>
@@ -3545,7 +3490,7 @@
     </w:tbl>
     <w:p>
       <w:pPr>
-        <w:spacing w:after="80" w:before="30" w:line="190"/>
+        <w:spacing w:after="80" w:before="30" w:line="240" w:lineRule="auto"/>
         <w:jc w:val="both"/>
         <w:rPr>
           <w:i/>
@@ -3562,21 +3507,19 @@
           <w:sz w:val="16"/>
           <w:szCs w:val="16"/>
         </w:rPr>
-        <w:t xml:space="preserve">Released documentation supports these field uses [21], [22], [23]. Filling missing model predictors never changes screening fields or receipt answers.
-</w:t>
+        <w:t xml:space="preserve">Released documentation supports these field uses [21], [22], [23]. Filling missing model predictors never changes screening fields or receipt answers.</w:t>
       </w:r>
     </w:p>
     <w:p>
       <w:pPr>
         <w:pStyle w:val="Heading2"/>
         <w:keepNext/>
-        <w:spacing w:after="60" w:before="140" w:line="230"/>
+        <w:spacing w:after="60" w:before="140" w:line="240" w:lineRule="auto"/>
         <w:jc w:val="left"/>
         <w:rPr>
-          <w:b w:val="false"/>
-          <w:bCs w:val="false"/>
           <w:i/>
           <w:iCs/>
+          <w:smallCaps w:val="false"/>
           <w:sz w:val="20"/>
           <w:szCs w:val="20"/>
         </w:rPr>
@@ -3584,20 +3527,19 @@
       <w:r>
         <w:rPr>
           <w:rFonts w:ascii="Times New Roman" w:cs="Times New Roman" w:eastAsia="Times New Roman" w:hAnsi="Times New Roman"/>
-          <w:b w:val="false"/>
-          <w:bCs w:val="false"/>
           <w:i/>
           <w:iCs/>
+          <w:smallCaps w:val="false"/>
           <w:sz w:val="20"/>
           <w:szCs w:val="20"/>
         </w:rPr>
-        <w:t xml:space="preserve">B. Screening rules and receipt outcome
-</w:t>
-      </w:r>
-    </w:p>
-    <w:p>
-      <w:pPr>
-        <w:spacing w:after="80" w:before="0" w:line="230"/>
+        <w:t xml:space="preserve">B. Screening rules and receipt outcome</w:t>
+      </w:r>
+    </w:p>
+    <w:p>
+      <w:pPr>
+        <w:spacing w:after="0" w:before="0" w:line="240" w:lineRule="auto"/>
+        <w:ind w:firstLine="200"/>
         <w:jc w:val="both"/>
       </w:pPr>
       <w:r>
@@ -3606,13 +3548,13 @@
           <w:sz w:val="20"/>
           <w:szCs w:val="20"/>
         </w:rPr>
-        <w:t xml:space="preserve">The screen summed already annualised, nominal person-income amounts, excluding social-assistance income. It did not allocate household income. A missing applicant or linked-spouse amount remained unresolved unless the no-income response and absent schedule supported zero. Assets, deemed income and permitted deductions were outside this research proxy.
-</w:t>
-      </w:r>
-    </w:p>
-    <w:p>
-      <w:pPr>
-        <w:spacing w:after="80" w:before="0" w:line="230"/>
+        <w:t xml:space="preserve">The screen summed already annualised, nominal person-income amounts, excluding social-assistance income. It did not allocate household income. A missing applicant or linked-spouse amount remained unresolved unless the no-income response and absent schedule supported zero. Assets, deemed income and permitted deductions were outside this research proxy.</w:t>
+      </w:r>
+    </w:p>
+    <w:p>
+      <w:pPr>
+        <w:spacing w:after="0" w:before="0" w:line="240" w:lineRule="auto"/>
+        <w:ind w:firstLine="200"/>
         <w:jc w:val="both"/>
       </w:pPr>
       <w:r>
@@ -3621,13 +3563,13 @@
           <w:sz w:val="20"/>
           <w:szCs w:val="20"/>
         </w:rPr>
-        <w:t xml:space="preserve">GN 211 set the standard monthly maximum at R1,350 from 1 April 2014 [24]; GN 277 raised it to R1,410 from 1 April 2015 [25]. The 2014 amendment, Schedule paragraph 2, substituted D = 1.6A − 0.4B from 1 April 2014 [26]. With annual standard maximum A and minimum D = R1,200 (Annexure A(5)) [27], B = (1.6A − 1,200)/0.4. This yields annual single/couple research ceilings of R61,800/R123,600 for October 2014–March 2015 and R64,680/R129,360 for April–October 2015. Half-joint income doubles couple limits; equality passed. The screen applied these boundaries to its private-income proxy. Both notices add R20 for age 75+; the primary screen retained the standard maximum across ages, while S1c tested the supplement. S1 also tested period and payment-boundary alternatives.
-</w:t>
-      </w:r>
-    </w:p>
-    <w:p>
-      <w:pPr>
-        <w:spacing w:after="80" w:before="0" w:line="230"/>
+        <w:t xml:space="preserve">GN 211 set the standard monthly maximum at R1,350 from 1 April 2014 [24]; GN 277 raised it to R1,410 from 1 April 2015 [25]. The 2014 amendment, Schedule paragraph 2, substituted D = 1.6A − 0.4B from 1 April 2014 [26]. With annual standard maximum A and minimum D = R1,200 (Annexure A(5)) [27], B = (1.6A − 1,200)/0.4. This yields annual single/couple research ceilings of R61,800/R123,600 for October 2014–March 2015 and R64,680/R129,360 for April–October 2015. Half-joint income doubles couple limits; equality passed. The screen applied these boundaries to its private-income proxy. Both notices add R20 for age 75+; the primary screen retained the standard maximum across ages, while S1c tested the supplement. S1 also tested period and payment-boundary alternatives.</w:t>
+      </w:r>
+    </w:p>
+    <w:p>
+      <w:pPr>
+        <w:spacing w:after="0" w:before="0" w:line="240" w:lineRule="auto"/>
+        <w:ind w:firstLine="200"/>
         <w:jc w:val="both"/>
       </w:pPr>
       <w:r>
@@ -3636,13 +3578,13 @@
           <w:sz w:val="20"/>
           <w:szCs w:val="20"/>
         </w:rPr>
-        <w:t xml:space="preserve">The 2008 regulations define spouses (regulation 1), include spouse income regardless of property regime (18(2)) and use half-joint annual income (19(1)). They allow Agency-approved exclusion after continuous desertion for at least three months and unwillingness to support (18(3)) [27]. The July 2015 amendment left these OPG means provisions unchanged [28]. Survey responses established neither legal spouse status nor desertion conditions. Never-married, widowed and divorced adults used single ceilings. For married adults, research rules required resolved applicant/spouse incomes and reciprocal pointers linking a resident spouse; sums applied regardless of spouse age. Nonresident spouse income was unavailable; separated respondents lacked spouse details [23]. Cohabitation, unspecified status and missing/inconsistent links remained unresolved, without assumed single status or zero partner income. S2 tested alternatives.
-</w:t>
-      </w:r>
-    </w:p>
-    <w:p>
-      <w:pPr>
-        <w:spacing w:after="80" w:before="0" w:line="230"/>
+        <w:t xml:space="preserve">The 2008 regulations define spouses (regulation 1), include spouse income regardless of property regime (18(2)) and use half-joint annual income (19(1)). They allow Agency-approved exclusion after continuous desertion for at least three months and unwillingness to support (18(3)) [27]. The July 2015 amendment left these OPG means provisions unchanged [28]. Survey responses established neither legal spouse status nor desertion conditions. Never-married, widowed and divorced adults used single ceilings. For married adults, research rules required resolved applicant/spouse incomes and reciprocal pointers linking a resident spouse; sums applied regardless of spouse age. Nonresident spouse income was unavailable; separated respondents lacked spouse details [23]. Cohabitation, unspecified status and missing/inconsistent links remained unresolved, without assumed single status or zero partner income. S2 tested alternatives.</w:t>
+      </w:r>
+    </w:p>
+    <w:p>
+      <w:pPr>
+        <w:spacing w:after="0" w:before="0" w:line="240" w:lineRule="auto"/>
+        <w:ind w:firstLine="200"/>
         <w:jc w:val="both"/>
       </w:pPr>
       <w:r>
@@ -3651,13 +3593,13 @@
           <w:sz w:val="20"/>
           <w:szCs w:val="20"/>
         </w:rPr>
-        <w:t xml:space="preserve">An adult's reported disability or war-veterans grant caused FAIL. Caregiver child grants and grant-in-aid neither excluded the adult nor defined OPG receipt. A known failure took priority over unresolved information; the screen retained all reasons.
-</w:t>
-      </w:r>
-    </w:p>
-    <w:p>
-      <w:pPr>
-        <w:spacing w:after="80" w:before="0" w:line="230"/>
+        <w:t xml:space="preserve">An adult's reported disability or war-veterans grant caused FAIL. Caregiver child grants and grant-in-aid neither excluded the adult nor defined OPG receipt. A known failure took priority over unresolved information; the screen retained all reasons.</w:t>
+      </w:r>
+    </w:p>
+    <w:p>
+      <w:pPr>
+        <w:spacing w:after="0" w:before="0" w:line="240" w:lineRule="auto"/>
+        <w:ind w:firstLine="200"/>
         <w:jc w:val="both"/>
       </w:pPr>
       <w:r>
@@ -3666,21 +3608,19 @@
           <w:sz w:val="20"/>
           <w:szCs w:val="20"/>
         </w:rPr>
-        <w:t xml:space="preserve">For adults who passed, the software interpreted general-grant and OPG answers together, including structural skips (questions omitted because earlier answers make them inapplicable). A consistent “no grant” answer can establish non-receipt when the OPG follow-up does not apply. Contradictory or unexplained answers remain unresolved and exclude the person from modelling. The analysis flagged disagreements between current receipt and preceding-year OPG income without changing the outcome because the periods differ. Rule version opg-kzn-primary-v1 records these decisions. The denominator contains adults who pass and have a clear receipt answer.
-</w:t>
+        <w:t xml:space="preserve">For adults who passed, the software interpreted general-grant and OPG answers together, including structural skips (questions omitted because earlier answers make them inapplicable). A consistent “no grant” answer can establish non-receipt when the OPG follow-up does not apply. Contradictory or unexplained answers remain unresolved and exclude the person from modelling. The analysis flagged disagreements between current receipt and preceding-year OPG income without changing the outcome because the periods differ. Rule version opg-kzn-primary-v1 records these decisions. The denominator contains adults who pass and have a clear receipt answer.</w:t>
       </w:r>
     </w:p>
     <w:p>
       <w:pPr>
         <w:pStyle w:val="Heading2"/>
         <w:keepNext/>
-        <w:spacing w:after="60" w:before="140" w:line="230"/>
+        <w:spacing w:after="60" w:before="140" w:line="240" w:lineRule="auto"/>
         <w:jc w:val="left"/>
         <w:rPr>
-          <w:b w:val="false"/>
-          <w:bCs w:val="false"/>
           <w:i/>
           <w:iCs/>
+          <w:smallCaps w:val="false"/>
           <w:sz w:val="20"/>
           <w:szCs w:val="20"/>
         </w:rPr>
@@ -3688,20 +3628,19 @@
       <w:r>
         <w:rPr>
           <w:rFonts w:ascii="Times New Roman" w:cs="Times New Roman" w:eastAsia="Times New Roman" w:hAnsi="Times New Roman"/>
-          <w:b w:val="false"/>
-          <w:bCs w:val="false"/>
           <w:i/>
           <w:iCs/>
+          <w:smallCaps w:val="false"/>
           <w:sz w:val="20"/>
           <w:szCs w:val="20"/>
         </w:rPr>
-        <w:t xml:space="preserve">C. Survey-weighted description and uncertainty
-</w:t>
-      </w:r>
-    </w:p>
-    <w:p>
-      <w:pPr>
-        <w:spacing w:after="80" w:before="0" w:line="230"/>
+        <w:t xml:space="preserve">C. Survey-weighted description and uncertainty</w:t>
+      </w:r>
+    </w:p>
+    <w:p>
+      <w:pPr>
+        <w:spacing w:after="0" w:before="0" w:line="240" w:lineRule="auto"/>
+        <w:ind w:firstLine="200"/>
         <w:jc w:val="both"/>
       </w:pPr>
       <w:r>
@@ -3710,36 +3649,105 @@
           <w:sz w:val="20"/>
           <w:szCs w:val="20"/>
         </w:rPr>
-        <w:t xml:space="preserve">RQ1 used both the ordinary count proportion and the person-weighted proportion: p = Σ(wᵢYᵢ)/Σwᵢ. Here, wᵢ is a person's weight and Yᵢ equals 1 for non-receipt and 0 for receipt. Group comparisons describe differences; they do not establish causes.
-</w:t>
-      </w:r>
-    </w:p>
-    <w:p>
-      <w:pPr>
-        <w:spacing w:after="80" w:before="0" w:line="230"/>
-        <w:jc w:val="both"/>
-      </w:pPr>
-      <w:r>
-        <w:rPr>
-          <w:rFonts w:ascii="Times New Roman" w:cs="Times New Roman" w:eastAsia="Times New Roman" w:hAnsi="Times New Roman"/>
+        <w:t xml:space="preserve">RQ1 reported unweighted and person-weighted non-receipt, p = Σ(wᵢYᵢ)/Σwᵢ, where Yᵢ = 1 denotes non-receipt and wᵢ is the person weight. Group comparisons were descriptive. For the weighted proportion, a with-replacement linearisation approximation clustered by derived primary sampling unit (PSU; first 11 household-ID digits) supplied the standard error (SE); 95% intervals used p ± 1.96SE. Unreleased strata prevented full survey-design variance estimation. Adults with unresolved screening remained outside the denominator. Receipt bounds assigned all unresolved PASS outcomes first to receipt, then to non-receipt.</w:t>
+      </w:r>
+    </w:p>
+    <w:p>
+      <w:pPr>
+        <w:pStyle w:val="Heading2"/>
+        <w:keepNext/>
+        <w:spacing w:after="60" w:before="140" w:line="240" w:lineRule="auto"/>
+        <w:jc w:val="left"/>
+        <w:rPr>
+          <w:i/>
+          <w:iCs/>
+          <w:smallCaps w:val="false"/>
           <w:sz w:val="20"/>
           <w:szCs w:val="20"/>
         </w:rPr>
-        <w:t xml:space="preserve">The released files lack strata. Derived primary sampling units (PSUs) supported an estimate of sampling uncertainty. The calculation allows a group to be sampled more than once. It cannot reproduce the complete survey design. Adults with unresolved screening information remain outside the proportion. Receipt bounds (the lowest and highest rates if all unclear PASS receipt answers mean receipt or all mean non-receipt) tested the effect of unclear receipt answers.
-</w:t>
+      </w:pPr>
+      <w:r>
+        <w:rPr>
+          <w:rFonts w:ascii="Times New Roman" w:cs="Times New Roman" w:eastAsia="Times New Roman" w:hAnsi="Times New Roman"/>
+          <w:i/>
+          <w:iCs/>
+          <w:smallCaps w:val="false"/>
+          <w:sz w:val="20"/>
+          <w:szCs w:val="20"/>
+        </w:rPr>
+        <w:t xml:space="preserve">D. Model specification and validation</w:t>
+      </w:r>
+    </w:p>
+    <w:p>
+      <w:pPr>
+        <w:spacing w:after="0" w:before="0" w:line="240" w:lineRule="auto"/>
+        <w:ind w:firstLine="200"/>
+        <w:jc w:val="both"/>
+      </w:pPr>
+      <w:r>
+        <w:rPr>
+          <w:rFonts w:ascii="Times New Roman" w:cs="Times New Roman" w:eastAsia="Times New Roman" w:hAnsi="Times New Roman"/>
+          <w:sz w:val="20"/>
+          <w:szCs w:val="20"/>
+        </w:rPr>
+        <w:t xml:space="preserve">An unweighted, unpenalised logistic regression estimated reported non-receipt using five predictor groups, six slopes and an intercept (Table II). There was no class rebalancing, automated variable selection or cutoff optimisation. Income, receipt, derived outcome labels and marital status were excluded from primary predictors.</w:t>
+      </w:r>
+    </w:p>
+    <w:p>
+      <w:pPr>
+        <w:spacing w:after="0" w:before="0" w:line="240" w:lineRule="auto"/>
+        <w:ind w:firstLine="200"/>
+        <w:jc w:val="both"/>
+      </w:pPr>
+      <w:r>
+        <w:rPr>
+          <w:rFonts w:ascii="Times New Roman" w:cs="Times New Roman" w:eastAsia="Times New Roman" w:hAnsi="Times New Roman"/>
+          <w:sz w:val="20"/>
+          <w:szCs w:val="20"/>
+        </w:rPr>
+        <w:t xml:space="preserve">The attempted seven-slope model contained one rural-formal non-recipient; holding out that adult left no training event in that category. Decision D-052 combined rural formal with traditional settlement to support estimation, without treating the settings as equivalent. This outcome-informed choice was not nested within validation; performance remains conditional on the retained specification.</w:t>
+      </w:r>
+    </w:p>
+    <w:p>
+      <w:pPr>
+        <w:spacing w:after="0" w:before="0" w:line="240" w:lineRule="auto"/>
+        <w:ind w:firstLine="200"/>
+        <w:jc w:val="both"/>
+      </w:pPr>
+      <w:r>
+        <w:rPr>
+          <w:rFonts w:ascii="Times New Roman" w:cs="Times New Roman" w:eastAsia="Times New Roman" w:hAnsi="Times New Roman"/>
+          <w:sz w:val="20"/>
+          <w:szCs w:val="20"/>
+        </w:rPr>
+        <w:t xml:space="preserve">The 1,013 adults formed 827 households, including 182 with multiple included adults and six with both outcomes. Five folds stratified sorted households by any member’s non-receipt, keeping household members together (seed 201415). Each iteration trained on four folds and predicted the fifth. Held-out folds contained 199–207 adults and 12–14 events; age, sex and settlement were complete, with predictor missingness reported in Table V. Training sets supplied the age median and categorical modes used to impute training and held-out predictors before constructing fixed contrasts; ties selected the smallest code sorted as text. Fixed coding handled structural skips. Eligibility, receipt and weights were not imputed. Each adult received one out-of-fold (OOF) probability; the reference used the corresponding training-set event rate.</w:t>
+      </w:r>
+    </w:p>
+    <w:p>
+      <w:pPr>
+        <w:spacing w:after="0" w:before="0" w:line="240" w:lineRule="auto"/>
+        <w:ind w:firstLine="200"/>
+        <w:jc w:val="both"/>
+      </w:pPr>
+      <w:r>
+        <w:rPr>
+          <w:rFonts w:ascii="Times New Roman" w:cs="Times New Roman" w:eastAsia="Times New Roman" w:hAnsi="Times New Roman"/>
+          <w:sz w:val="20"/>
+          <w:szCs w:val="20"/>
+        </w:rPr>
+        <w:t xml:space="preserve">Pooled OOF predictions supplied unweighted average precision, AUC, Brier score and calibration measures. Calibration-in-the-large estimated an intercept correction with slope fixed at 1; ideal intercept and slope values were zero and 1. In 1,000 bootstrap draws, 827 households were sampled with replacement, retaining all included members and repeated selections. Outcomes and fixed OOF/reference probabilities stayed paired. Metrics, including calibration regressions, were recalculated; 2.5th/97.5th percentiles formed 95% intervals, with 1,000 valid draws per reported metric. Predictive models, imputers, folds and the settlement revision were not repeated. These conditional intervals omit variability from repeating model development or fold assignment, leave dependence from shared training data unaddressed, and do not reproduce the survey design or establish external performance.</w:t>
       </w:r>
     </w:p>
     <w:p>
       <w:pPr>
         <w:pStyle w:val="Heading2"/>
         <w:keepNext/>
-        <w:spacing w:after="60" w:before="140" w:line="230"/>
+        <w:spacing w:after="60" w:before="140" w:line="240" w:lineRule="auto"/>
         <w:jc w:val="left"/>
         <w:rPr>
-          <w:b w:val="false"/>
-          <w:bCs w:val="false"/>
           <w:i/>
           <w:iCs/>
+          <w:smallCaps w:val="false"/>
           <w:sz w:val="20"/>
           <w:szCs w:val="20"/>
         </w:rPr>
@@ -3747,20 +3755,19 @@
       <w:r>
         <w:rPr>
           <w:rFonts w:ascii="Times New Roman" w:cs="Times New Roman" w:eastAsia="Times New Roman" w:hAnsi="Times New Roman"/>
-          <w:b w:val="false"/>
-          <w:bCs w:val="false"/>
           <w:i/>
           <w:iCs/>
+          <w:smallCaps w:val="false"/>
           <w:sz w:val="20"/>
           <w:szCs w:val="20"/>
         </w:rPr>
-        <w:t xml:space="preserve">D. Model specification and validation
-</w:t>
-      </w:r>
-    </w:p>
-    <w:p>
-      <w:pPr>
-        <w:spacing w:after="80" w:before="0" w:line="230"/>
+        <w:t xml:space="preserve">E. Alternative assumptions</w:t>
+      </w:r>
+    </w:p>
+    <w:p>
+      <w:pPr>
+        <w:spacing w:after="0" w:before="0" w:line="240" w:lineRule="auto"/>
+        <w:ind w:firstLine="200"/>
         <w:jc w:val="both"/>
       </w:pPr>
       <w:r>
@@ -3769,43 +3776,39 @@
           <w:sz w:val="20"/>
           <w:szCs w:val="20"/>
         </w:rPr>
-        <w:t xml:space="preserve">The unweighted logistic model estimated probability of reported non-receipt. The analysis did not rebalance recipients and non-recipients, automatically select variables or choose a cutoff. The model describes associations after accounting for other predictors. Age enters per decade above 60. Comparison categories are male, Grade 7 or above, urban formal and an office nearer than 5 km. Five predictor groups require six slopes and an intercept, because settlement requires two comparisons.
-</w:t>
-      </w:r>
-    </w:p>
-    <w:p>
-      <w:pPr>
-        <w:spacing w:after="80" w:before="0" w:line="230"/>
-        <w:jc w:val="both"/>
-      </w:pPr>
-      <w:r>
-        <w:rPr>
-          <w:rFonts w:ascii="Times New Roman" w:cs="Times New Roman" w:eastAsia="Times New Roman" w:hAnsi="Times New Roman"/>
+        <w:t xml:space="preserve">S1–S6 varied thresholds, partnership, other-grant rules, income definition, receipt period and unresolved-receipt bounds. Each recorded cohort size, events, unweighted/person-weighted rates and internal predictive performance; unchanged cohorts retained primary OOF results. S7 used complete cases; S8 replaced welfare access with a married indicator. S9 fitted frequency-weighted regression while retaining unweighted imputation and evaluation; it was not a survey-design regression. S10 weighted primary OOF metrics without refitting; S11 grouped folds by derived PSU. These analyses remained separate from primary results.</w:t>
+      </w:r>
+    </w:p>
+    <w:p>
+      <w:pPr>
+        <w:pStyle w:val="Heading1"/>
+        <w:keepNext/>
+        <w:spacing w:after="60" w:before="140" w:line="240" w:lineRule="auto"/>
+        <w:jc w:val="center"/>
+        <w:rPr>
+          <w:i w:val="false"/>
+          <w:iCs w:val="false"/>
+          <w:smallCaps/>
           <w:sz w:val="20"/>
           <w:szCs w:val="20"/>
         </w:rPr>
-        <w:t xml:space="preserve">Only one rural-formal adult reported non-receipt in the attempted seven-slope model. Excluding that person for testing left the training group with no such case in that category. Decision D-052 combined rural formal with traditional settlement to support estimation, without claiming that these settings are equivalent. Marital status affects screening; income, receipt, derived labels and marital status do not enter the primary model.
-</w:t>
-      </w:r>
-    </w:p>
-    <w:p>
-      <w:pPr>
-        <w:spacing w:after="80" w:before="0" w:line="230"/>
-        <w:jc w:val="both"/>
-      </w:pPr>
-      <w:r>
-        <w:rPr>
-          <w:rFonts w:ascii="Times New Roman" w:cs="Times New Roman" w:eastAsia="Times New Roman" w:hAnsi="Times New Roman"/>
+      </w:pPr>
+      <w:r>
+        <w:rPr>
+          <w:rFonts w:ascii="Times New Roman" w:cs="Times New Roman" w:eastAsia="Times New Roman" w:hAnsi="Times New Roman"/>
+          <w:i w:val="false"/>
+          <w:iCs w:val="false"/>
+          <w:smallCaps/>
           <w:sz w:val="20"/>
           <w:szCs w:val="20"/>
         </w:rPr>
-        <w:t xml:space="preserve">Validation used five household-grouped folds. Sorted households were labelled by whether any member reported non-receipt, then stratified so every adult from a household stayed in one fold. Seed 201415 fixes this division. The 1,013 adults come from 827 households: 182 contain more than one modelled adult, and 6 contain both receipt and non-receipt. Each adult received one out-of-fold (OOF) probability from a model trained without that household. Held-out folds had 199 to 207 adults and 12 to 14 non-recipients. The intercept-only reference uses the training group's non-receipt rate.
-</w:t>
-      </w:r>
-    </w:p>
-    <w:p>
-      <w:pPr>
-        <w:spacing w:after="80" w:before="0" w:line="230"/>
+        <w:t xml:space="preserve">IV. Software and Evaluation</w:t>
+      </w:r>
+    </w:p>
+    <w:p>
+      <w:pPr>
+        <w:spacing w:after="0" w:before="0" w:line="240" w:lineRule="auto"/>
+        <w:ind w:firstLine="200"/>
         <w:jc w:val="both"/>
       </w:pPr>
       <w:r>
@@ -3814,13 +3817,13 @@
           <w:sz w:val="20"/>
           <w:szCs w:val="20"/>
         </w:rPr>
-        <w:t xml:space="preserve">After interpreting skipped questions, each training fold supplied the fill-in for its held-out adults. Schooling contrasted below Grade 7 with Grade 7 or above, and office distance contrasted at least 5 km or unavailable with nearer than 5 km. Other codes stayed missing. The training fold filled missing age, in decades above 60, with its median, and a missing category with its most frequent code, or the smaller code in a tie. Eligibility, receipt and weights were not filled or modelled. Three recipients lacked usable schooling; 14 recipients and four non-recipients lacked usable office distance. Age, sex and settlement were already complete.
-</w:t>
-      </w:r>
-    </w:p>
-    <w:p>
-      <w:pPr>
-        <w:spacing w:after="80" w:before="0" w:line="230"/>
+        <w:t xml:space="preserve">The command-line interface (CLI), python analysis/run_study.py, reproduces linkage, screening, description and held-out evaluation. Run records store versions, settings, seed, folds and checksums. The app loads JSON coefficients and imputation statistics from opg-kzn-six-slope-v1, fitted to the full cohort. Uploads never retrain it.</w:t>
+      </w:r>
+    </w:p>
+    <w:p>
+      <w:pPr>
+        <w:spacing w:after="0" w:before="0" w:line="240" w:lineRule="auto"/>
+        <w:ind w:firstLine="200"/>
         <w:jc w:val="both"/>
       </w:pPr>
       <w:r>
@@ -3829,111 +3832,7 @@
           <w:sz w:val="20"/>
           <w:szCs w:val="20"/>
         </w:rPr>
-        <w:t xml:space="preserve">Pooled OOF probabilities supplied average precision, AUC, Brier score, calibration slope and calibration-in-the-large. Calibration-in-the-large is an intercept correction with its slope fixed at 1; the ideal values are 0 and 1. The 95% intervals are 2.5 and 97.5 percentiles from 1,000 with-replacement household samples of those fixed predictions, using the same seed. Every selected household's adults were retained. All 1,000 samples contained both outcome classes, but preprocessing, refitting and Decision D-052 were not repeated. The intervals omit a new split, fill-in and fit, and they omit primary sampling units, unreleased strata and person weights. They are not design-based confidence intervals.
-</w:t>
-      </w:r>
-    </w:p>
-    <w:p>
-      <w:pPr>
-        <w:pStyle w:val="Heading2"/>
-        <w:keepNext/>
-        <w:spacing w:after="60" w:before="140" w:line="230"/>
-        <w:jc w:val="left"/>
-        <w:rPr>
-          <w:b w:val="false"/>
-          <w:bCs w:val="false"/>
-          <w:i/>
-          <w:iCs/>
-          <w:sz w:val="20"/>
-          <w:szCs w:val="20"/>
-        </w:rPr>
-      </w:pPr>
-      <w:r>
-        <w:rPr>
-          <w:rFonts w:ascii="Times New Roman" w:cs="Times New Roman" w:eastAsia="Times New Roman" w:hAnsi="Times New Roman"/>
-          <w:b w:val="false"/>
-          <w:bCs w:val="false"/>
-          <w:i/>
-          <w:iCs/>
-          <w:sz w:val="20"/>
-          <w:szCs w:val="20"/>
-        </w:rPr>
-        <w:t xml:space="preserve">E. Alternative assumptions
-</w:t>
-      </w:r>
-    </w:p>
-    <w:p>
-      <w:pPr>
-        <w:spacing w:after="80" w:before="0" w:line="230"/>
-        <w:jc w:val="both"/>
-      </w:pPr>
-      <w:r>
-        <w:rPr>
-          <w:rFonts w:ascii="Times New Roman" w:cs="Times New Roman" w:eastAsia="Times New Roman" w:hAnsi="Times New Roman"/>
-          <w:sz w:val="20"/>
-          <w:szCs w:val="20"/>
-        </w:rPr>
-        <w:t xml:space="preserve">S1 changes thresholds, S2 partnership assumptions, S3 rules about other grants, S4 income definition, S5 receipt period and S6 unresolved-receipt bounds. Each records the denominator, non-recipients, ordinary/person-weighted rates and internally validated model performance. S7 uses complete cases. S8 replaces welfare access with a married indicator. S9 uses frequency weights (treating person weights as repeated-record contributions), keeping unweighted missing-value treatment and evaluation. This is not a full survey-design regression. S10 weights primary OOF measures without refitting. S11 groups validation folds by derived PSU. These results remain separate from the primary analysis.
-</w:t>
-      </w:r>
-    </w:p>
-    <w:p>
-      <w:pPr>
-        <w:pStyle w:val="Heading1"/>
-        <w:keepNext/>
-        <w:spacing w:after="60" w:before="140" w:line="230"/>
-        <w:jc w:val="center"/>
-        <w:rPr>
-          <w:b/>
-          <w:bCs/>
-          <w:i w:val="false"/>
-          <w:iCs w:val="false"/>
-          <w:sz w:val="20"/>
-          <w:szCs w:val="20"/>
-        </w:rPr>
-      </w:pPr>
-      <w:r>
-        <w:rPr>
-          <w:rFonts w:ascii="Times New Roman" w:cs="Times New Roman" w:eastAsia="Times New Roman" w:hAnsi="Times New Roman"/>
-          <w:b/>
-          <w:bCs/>
-          <w:i w:val="false"/>
-          <w:iCs w:val="false"/>
-          <w:sz w:val="20"/>
-          <w:szCs w:val="20"/>
-        </w:rPr>
-        <w:t xml:space="preserve">IV. Software and Evaluation
-</w:t>
-      </w:r>
-    </w:p>
-    <w:p>
-      <w:pPr>
-        <w:spacing w:after="80" w:before="0" w:line="230"/>
-        <w:jc w:val="both"/>
-      </w:pPr>
-      <w:r>
-        <w:rPr>
-          <w:rFonts w:ascii="Times New Roman" w:cs="Times New Roman" w:eastAsia="Times New Roman" w:hAnsi="Times New Roman"/>
-          <w:sz w:val="20"/>
-          <w:szCs w:val="20"/>
-        </w:rPr>
-        <w:t xml:space="preserve">The command python analysis/run_study.py links survey files, screens adults and calculates results. Run records retain settings, versions, seed, folds and checksums. The saved model stores coefficients and missing-value settings in JSON, without executable program code. Version opg-kzn-six-slope-v1 uses the model trained on all included adults. Uploads do not retrain it.
-</w:t>
-      </w:r>
-    </w:p>
-    <w:p>
-      <w:pPr>
-        <w:spacing w:after="80" w:before="0" w:line="230"/>
-        <w:jc w:val="both"/>
-      </w:pPr>
-      <w:r>
-        <w:rPr>
-          <w:rFonts w:ascii="Times New Roman" w:cs="Times New Roman" w:eastAsia="Times New Roman" w:hAnsi="Times New Roman"/>
-          <w:sz w:val="20"/>
-          <w:szCs w:val="20"/>
-        </w:rPr>
-        <w:t xml:space="preserve">The local Streamlit app has five sections: study context, upload/validation, eligibility/receipt, prediction/model and export/reproducibility. It accepts historical opg-screen-v1 CSV files, including household members needed to check spouse resources. Validation rejects incorrect schema, study context, duplicate identifiers, categories and numeric values. Limits are 20 MiB and 50,000 rows. Uploads stay in memory during the current session. Reports use generated row labels and omit submitted identifiers, raw income and household links. The interface provides filters for views and exports, and summary rates retain all uploaded adults who pass with resolved receipt. Filters, labels and reports are functions of the program. They are not measurements of user experience.
-</w:t>
+        <w:t xml:space="preserve">The Streamlit app accepts opg-screen-v1 CSVs, including members needed for spouse linkage. It rejects schema/context errors, duplicate identifiers and invalid values. Uploads are limited to 20 MiB/50,000 rows and remain in session memory. Views and exports omit submitted identifiers, raw income and household links. Filters preserve the full resolved-PASS summary denominator.</w:t>
       </w:r>
     </w:p>
     <w:p>
@@ -3947,7 +3846,7 @@
           <wp:inline distT="0" distB="0" distL="0" distR="0">
             <wp:extent cx="3200400" cy="2343150"/>
             <wp:effectExtent t="0" r="0" b="0" l="0"/>
-            <wp:docPr id="1" name="Fig. 2. Research and app workflows share screening rules. Household-held-out predictions remain separate from app scores calculated using the model trained on all included adults. " descr="Fig. 2. Research and app workflows share screening rules. Household-held-out predictions remain separate from app scores calculated using the model trained on all included adults. " title="Fig. 2. Research and app workflows share screening rules. Household-held-out predictions remain separate from app scores calculated using the model trained on all included adults. "/>
+            <wp:docPr id="1" name="Fig. 2. Research and app workflows share screening rules. Household-held-out predictions remain separate from app scores calculated using the model trained on all included adults." descr="Fig. 2. Research and app workflows share screening rules. Household-held-out predictions remain separate from app scores calculated using the model trained on all included adults." title="Fig. 2. Research and app workflows share screening rules. Household-held-out predictions remain separate from app scores calculated using the model trained on all included adults."/>
             <wp:cNvGraphicFramePr>
               <a:graphicFrameLocks xmlns:a="http://schemas.openxmlformats.org/drawingml/2006/main" noChangeAspect="1"/>
             </wp:cNvGraphicFramePr>
@@ -3985,7 +3884,7 @@
     </w:p>
     <w:p>
       <w:pPr>
-        <w:spacing w:after="80" w:before="0" w:line="190"/>
+        <w:spacing w:after="80" w:before="0" w:line="240" w:lineRule="auto"/>
         <w:jc w:val="both"/>
         <w:rPr>
           <w:sz w:val="16"/>
@@ -3998,13 +3897,13 @@
           <w:sz w:val="16"/>
           <w:szCs w:val="16"/>
         </w:rPr>
-        <w:t xml:space="preserve">Fig. 2. Research and app workflows share screening rules. Household-held-out predictions remain separate from app scores calculated using the model trained on all included adults.
-</w:t>
-      </w:r>
-    </w:p>
-    <w:p>
-      <w:pPr>
-        <w:spacing w:after="80" w:before="0" w:line="230"/>
+        <w:t xml:space="preserve">Fig. 2. Research and app workflows share screening rules. Household-held-out predictions remain separate from app scores calculated using the model trained on all included adults.</w:t>
+      </w:r>
+    </w:p>
+    <w:p>
+      <w:pPr>
+        <w:spacing w:after="0" w:before="0" w:line="240" w:lineRule="auto"/>
+        <w:ind w:firstLine="200"/>
         <w:jc w:val="both"/>
       </w:pPr>
       <w:r>
@@ -4013,13 +3912,13 @@
           <w:sz w:val="20"/>
           <w:szCs w:val="20"/>
         </w:rPr>
-        <w:t xml:space="preserve">The app reuses the screening rules and saved model settings. It scores only supported adults who pass with resolved receipt. Saved training statistics fill partly missing predictors; records missing every categorical predictor remain unscored. Integrity checks link model and evaluation files to the analysis and predictor code. The interface labels historical OOF results separately from uploaded scores; uploaded records may overlap training data. CSV, JSON and ZIP reports contain classifications, reasons, supported probabilities, versions and an audit manifest (settings and file checksums). The downloadable minimum viable product, or MVP, uses invented data and excludes raw survey files, historical respondent outputs and Git version history.
-</w:t>
-      </w:r>
-    </w:p>
-    <w:p>
-      <w:pPr>
-        <w:spacing w:after="80" w:before="0" w:line="230"/>
+        <w:t xml:space="preserve">Only supported PASS adults with resolved receipt receive scores; partially missing predictors use frozen statistics, while records missing every categorical predictor remain unscored. Integrity checks bind model/evaluation files to code. Historical OOF results remain distinct from uploaded scores; uploaded records may overlap training data. CSV, JSON and ZIP exports include classifications, reasons, probabilities, versions and audit manifests. The synthetic MVP excludes survey records, historical respondent outputs and Git history.</w:t>
+      </w:r>
+    </w:p>
+    <w:p>
+      <w:pPr>
+        <w:spacing w:after="0" w:before="0" w:line="240" w:lineRule="auto"/>
+        <w:ind w:firstLine="200"/>
         <w:jc w:val="both"/>
       </w:pPr>
       <w:r>
@@ -4028,13 +3927,13 @@
           <w:sz w:val="20"/>
           <w:szCs w:val="20"/>
         </w:rPr>
-        <w:t xml:space="preserve">Technical verification compares the program with specified expectations. The checks compared screening decisions with expected results and tested excluded predictors, links, repeated runs, reports and saved predictions. Further checks compared the command-line interface with the Streamlit interface, including invalid inputs and outdated results. These tests ask whether the software follows the stated rules and returns the same outputs. They do not ask whether a person finds the screen understandable.
-</w:t>
-      </w:r>
-    </w:p>
-    <w:p>
-      <w:pPr>
-        <w:spacing w:after="80" w:before="0" w:line="230"/>
+        <w:t xml:space="preserve">Technical checks covered expected decisions, excluded predictors, linkage, repeatability, exports, saved-score parity and invalid/stale interface states. The owner’s Windows walkthrough confirmed synthetic execution and report generation, without independent participant evidence.</w:t>
+      </w:r>
+    </w:p>
+    <w:p>
+      <w:pPr>
+        <w:spacing w:after="0" w:before="0" w:line="240" w:lineRule="auto"/>
+        <w:ind w:firstLine="200"/>
         <w:jc w:val="both"/>
       </w:pPr>
       <w:r>
@@ -4043,104 +3942,83 @@
           <w:sz w:val="20"/>
           <w:szCs w:val="20"/>
         </w:rPr>
-        <w:t xml:space="preserve">The owner's Windows walkthrough belongs to that technical record. The author ran the synthetic workflow on the local installation, and the exported files were compared with expected contents. The result shows that this installation produced the specified reports. The author is not an independent participant, and the walkthrough does not measure ease, errors or acceptance by someone else.
-</w:t>
-      </w:r>
-    </w:p>
-    <w:p>
-      <w:pPr>
-        <w:spacing w:after="80" w:before="0" w:line="230"/>
-        <w:jc w:val="both"/>
-      </w:pPr>
-      <w:r>
-        <w:rPr>
-          <w:rFonts w:ascii="Times New Roman" w:cs="Times New Roman" w:eastAsia="Times New Roman" w:hAnsi="Times New Roman"/>
+        <w:t xml:space="preserve">An unused protocol proposes synthetic tasks for three to five consenting participants, measuring completion, time, errors, ease and assistance. No participant usability or acceptance results exist; automated checks establish program behaviour.</w:t>
+      </w:r>
+    </w:p>
+    <w:p>
+      <w:pPr>
+        <w:pStyle w:val="Heading1"/>
+        <w:keepNext/>
+        <w:spacing w:after="60" w:before="140" w:line="240" w:lineRule="auto"/>
+        <w:jc w:val="center"/>
+        <w:rPr>
+          <w:i w:val="false"/>
+          <w:iCs w:val="false"/>
+          <w:smallCaps/>
           <w:sz w:val="20"/>
           <w:szCs w:val="20"/>
         </w:rPr>
-        <w:t xml:space="preserve">Usability evaluation is a separate study. It would ask people other than the developer to attempt set tasks and would record completion, time taken, errors, ease and any assistance given. A protocol for three to five consenting users, restricted to synthetic records, has been written and has not been used. No participant has been recruited. No task time, error count, ease rating or acceptance result exists. Participant usability remains untested. Automated interface checks and the owner walkthrough do not fill that gap. An automated Streamlit test checks program state. It is not a session with a nontechnical participant.
-</w:t>
-      </w:r>
-    </w:p>
-    <w:p>
-      <w:pPr>
-        <w:pStyle w:val="Heading1"/>
-        <w:keepNext/>
-        <w:spacing w:after="60" w:before="140" w:line="230"/>
-        <w:jc w:val="center"/>
-        <w:rPr>
-          <w:b/>
-          <w:bCs/>
+      </w:pPr>
+      <w:r>
+        <w:rPr>
+          <w:rFonts w:ascii="Times New Roman" w:cs="Times New Roman" w:eastAsia="Times New Roman" w:hAnsi="Times New Roman"/>
           <w:i w:val="false"/>
           <w:iCs w:val="false"/>
+          <w:smallCaps/>
           <w:sz w:val="20"/>
           <w:szCs w:val="20"/>
         </w:rPr>
-      </w:pPr>
-      <w:r>
-        <w:rPr>
-          <w:rFonts w:ascii="Times New Roman" w:cs="Times New Roman" w:eastAsia="Times New Roman" w:hAnsi="Times New Roman"/>
-          <w:b/>
-          <w:bCs/>
-          <w:i w:val="false"/>
-          <w:iCs w:val="false"/>
+        <w:t xml:space="preserve">V. Results</w:t>
+      </w:r>
+    </w:p>
+    <w:p>
+      <w:pPr>
+        <w:pStyle w:val="Heading2"/>
+        <w:keepNext/>
+        <w:spacing w:after="60" w:before="140" w:line="240" w:lineRule="auto"/>
+        <w:jc w:val="left"/>
+        <w:rPr>
+          <w:i/>
+          <w:iCs/>
+          <w:smallCaps w:val="false"/>
           <w:sz w:val="20"/>
           <w:szCs w:val="20"/>
         </w:rPr>
-        <w:t xml:space="preserve">V. Results
-</w:t>
-      </w:r>
-    </w:p>
-    <w:p>
-      <w:pPr>
-        <w:pStyle w:val="Heading2"/>
-        <w:keepNext/>
-        <w:spacing w:after="60" w:before="140" w:line="230"/>
-        <w:jc w:val="left"/>
-        <w:rPr>
-          <w:b w:val="false"/>
-          <w:bCs w:val="false"/>
+      </w:pPr>
+      <w:r>
+        <w:rPr>
+          <w:rFonts w:ascii="Times New Roman" w:cs="Times New Roman" w:eastAsia="Times New Roman" w:hAnsi="Times New Roman"/>
           <w:i/>
           <w:iCs/>
+          <w:smallCaps w:val="false"/>
           <w:sz w:val="20"/>
           <w:szCs w:val="20"/>
         </w:rPr>
-      </w:pPr>
-      <w:r>
-        <w:rPr>
-          <w:rFonts w:ascii="Times New Roman" w:cs="Times New Roman" w:eastAsia="Times New Roman" w:hAnsi="Times New Roman"/>
-          <w:b w:val="false"/>
-          <w:bCs w:val="false"/>
-          <w:i/>
-          <w:iCs/>
+        <w:t xml:space="preserve">A. Study group and reported non-receipt</w:t>
+      </w:r>
+    </w:p>
+    <w:p>
+      <w:pPr>
+        <w:spacing w:after="0" w:before="0" w:line="240" w:lineRule="auto"/>
+        <w:ind w:firstLine="200"/>
+        <w:jc w:val="both"/>
+      </w:pPr>
+      <w:r>
+        <w:rPr>
+          <w:rFonts w:ascii="Times New Roman" w:cs="Times New Roman" w:eastAsia="Times New Roman" w:hAnsi="Times New Roman"/>
           <w:sz w:val="20"/>
           <w:szCs w:val="20"/>
         </w:rPr>
-        <w:t xml:space="preserve">A. Study group and reported non-receipt
-</w:t>
-      </w:r>
-    </w:p>
-    <w:p>
-      <w:pPr>
-        <w:spacing w:after="80" w:before="0" w:line="230"/>
-        <w:jc w:val="both"/>
-      </w:pPr>
-      <w:r>
-        <w:rPr>
-          <w:rFonts w:ascii="Times New Roman" w:cs="Times New Roman" w:eastAsia="Times New Roman" w:hAnsi="Times New Roman"/>
-          <w:sz w:val="20"/>
-          <w:szCs w:val="20"/>
-        </w:rPr>
-        <w:t xml:space="preserve">The survey included 15,388 people in 3,686 KwaZulu-Natal households. Table IV shows the selection steps. People aged 60 or older equal the failed, unresolved and passed rows. Reported receipt and non-receipt divide the passed row. Households are counted inside each row, and one household can contribute to more than one row. Among 117 failures, 93 exceeded the income ceiling and 25 reported a disability grant; one met both conditions. None reported a war-veterans grant. Among 187 unresolved adults, 105 were married, mostly with a non-resident spouse, and 63 reported living together. Unresolved adults outnumbered non-recipients.
-</w:t>
+        <w:t xml:space="preserve">The survey included 15,388 people in 3,686 KwaZulu-Natal households (Table IV). Adults aged 60+ partition into failed, unresolved and passed groups; receipt partitions PASS. Household counts can overlap across rows. Of 117 failures, 93 exceeded the income ceiling and 25 reported disability grants; one met both conditions. None reported war-veterans grants. Of 187 unresolved adults, 105 were married, mostly with non-resident spouses, and 63 reported living together. Unresolved adults outnumbered non-recipients.</w:t>
       </w:r>
     </w:p>
     <w:p>
       <w:pPr>
         <w:keepNext/>
-        <w:spacing w:after="50" w:before="100" w:line="190"/>
+        <w:spacing w:after="50" w:before="100" w:line="240" w:lineRule="auto"/>
         <w:jc w:val="center"/>
         <w:rPr>
+          <w:smallCaps/>
           <w:sz w:val="16"/>
           <w:szCs w:val="16"/>
         </w:rPr>
@@ -4148,11 +4026,12 @@
       <w:r>
         <w:rPr>
           <w:rFonts w:ascii="Times New Roman" w:cs="Times New Roman" w:eastAsia="Times New Roman" w:hAnsi="Times New Roman"/>
+          <w:smallCaps/>
           <w:sz w:val="16"/>
           <w:szCs w:val="16"/>
         </w:rPr>
-        <w:t xml:space="preserve">Table IV. KwaZulu-Natal study group at each screening step
-</w:t>
+        <w:t xml:space="preserve">TABLE IV
+KwaZulu-Natal study group at each screening step</w:t>
       </w:r>
     </w:p>
     <w:tbl>
@@ -5208,7 +5087,7 @@
     </w:tbl>
     <w:p>
       <w:pPr>
-        <w:spacing w:after="80" w:before="30" w:line="190"/>
+        <w:spacing w:after="80" w:before="30" w:line="240" w:lineRule="auto"/>
         <w:jc w:val="both"/>
         <w:rPr>
           <w:i/>
@@ -5225,8 +5104,7 @@
           <w:sz w:val="16"/>
           <w:szCs w:val="16"/>
         </w:rPr>
-        <w:t xml:space="preserve">People aged 60 or older equal 117 + 187 + 1,013. The passed row equals 946 + 67. Adding every people cell would count the same adults more than once. Each household cell counts distinct households in that row. Those cells do not follow the people partition.
-</w:t>
+        <w:t xml:space="preserve">Person counts partition as 117 + 187 + 1,013 among adults aged 60+, then 946 + 67 within PASS. Adding all rows double-counts adults. Household counts are distinct within rows and do not form the same partition.</w:t>
       </w:r>
     </w:p>
     <w:p>
@@ -5240,7 +5118,7 @@
           <wp:inline distT="0" distB="0" distL="0" distR="0">
             <wp:extent cx="3200400" cy="2466975"/>
             <wp:effectExtent t="0" r="0" b="0" l="0"/>
-            <wp:docPr id="1" name="Fig. 3. FAIL, UNRESOLVED and PASS groups do not overlap. All 1,013 PASS adults resolve receipt and enter the final denominator. " descr="Fig. 3. FAIL, UNRESOLVED and PASS groups do not overlap. All 1,013 PASS adults resolve receipt and enter the final denominator. " title="Fig. 3. FAIL, UNRESOLVED and PASS groups do not overlap. All 1,013 PASS adults resolve receipt and enter the final denominator. "/>
+            <wp:docPr id="1" name="Fig. 3. FAIL, UNRESOLVED and PASS groups do not overlap. All 1,013 PASS adults resolve receipt and enter the final denominator." descr="Fig. 3. FAIL, UNRESOLVED and PASS groups do not overlap. All 1,013 PASS adults resolve receipt and enter the final denominator." title="Fig. 3. FAIL, UNRESOLVED and PASS groups do not overlap. All 1,013 PASS adults resolve receipt and enter the final denominator."/>
             <wp:cNvGraphicFramePr>
               <a:graphicFrameLocks xmlns:a="http://schemas.openxmlformats.org/drawingml/2006/main" noChangeAspect="1"/>
             </wp:cNvGraphicFramePr>
@@ -5278,7 +5156,7 @@
     </w:p>
     <w:p>
       <w:pPr>
-        <w:spacing w:after="80" w:before="0" w:line="190"/>
+        <w:spacing w:after="80" w:before="0" w:line="240" w:lineRule="auto"/>
         <w:jc w:val="both"/>
         <w:rPr>
           <w:sz w:val="16"/>
@@ -5291,13 +5169,13 @@
           <w:sz w:val="16"/>
           <w:szCs w:val="16"/>
         </w:rPr>
-        <w:t xml:space="preserve">Fig. 3. FAIL, UNRESOLVED and PASS groups do not overlap. All 1,013 PASS adults resolve receipt and enter the final denominator.
-</w:t>
-      </w:r>
-    </w:p>
-    <w:p>
-      <w:pPr>
-        <w:spacing w:after="80" w:before="0" w:line="230"/>
+        <w:t xml:space="preserve">Fig. 3. FAIL, UNRESOLVED and PASS groups do not overlap. All 1,013 PASS adults resolve receipt and enter the final denominator.</w:t>
+      </w:r>
+    </w:p>
+    <w:p>
+      <w:pPr>
+        <w:spacing w:after="0" w:before="0" w:line="240" w:lineRule="auto"/>
+        <w:ind w:firstLine="200"/>
         <w:jc w:val="both"/>
       </w:pPr>
       <w:r>
@@ -5306,16 +5184,16 @@
           <w:sz w:val="20"/>
           <w:szCs w:val="20"/>
         </w:rPr>
-        <w:t xml:space="preserve">Of these 1,013 adults, 67 reported non-receipt: 6.61% without weights and 7.49% with person weights. The calculation used 345 derived PSUs and gave a standard error of 1.3 percentage points. A bell-shaped sampling approximation gave a 95% confidence interval of 4.9%–10.0%. Missing strata limit this approximation. It is not a design-based confidence interval, and it does not apply to Tables V–VIII. All 1,013 PASS answers agreed with preceding-year OPG income, so those checks changed nothing. Table V compares five predictors before filling missing values. Average age and percentages describe each receipt group. The percentages describe receipt-group composition, not non-receipt rates or predictions. Table V reports no standard errors.
-</w:t>
+        <w:t xml:space="preserve">Among 1,013 resolved passes, 67 reported non-receipt: 6.61% unweighted and 7.49% person-weighted. A PSU-clustered normal approximation across 345 PSUs gave SE 1.3 percentage points and a 95% interval of 4.9%–10.0%. Missing strata prevent full survey-design inference; this approximation does not supply intervals for Tables V–VIII. Current receipt matched preceding-year OPG income throughout. Table V describes pre-imputation composition within receipt groups, rather than non-receipt rates or predictions, and reports no standard errors.</w:t>
       </w:r>
     </w:p>
     <w:p>
       <w:pPr>
         <w:keepNext/>
-        <w:spacing w:after="50" w:before="100" w:line="190"/>
+        <w:spacing w:after="50" w:before="100" w:line="240" w:lineRule="auto"/>
         <w:jc w:val="center"/>
         <w:rPr>
+          <w:smallCaps/>
           <w:sz w:val="16"/>
           <w:szCs w:val="16"/>
         </w:rPr>
@@ -5323,11 +5201,12 @@
       <w:r>
         <w:rPr>
           <w:rFonts w:ascii="Times New Roman" w:cs="Times New Roman" w:eastAsia="Times New Roman" w:hAnsi="Times New Roman"/>
+          <w:smallCaps/>
           <w:sz w:val="16"/>
           <w:szCs w:val="16"/>
         </w:rPr>
-        <w:t xml:space="preserve">Table V. Characteristics by receipt, before filling missing values
-</w:t>
+        <w:t xml:space="preserve">TABLE V
+Characteristics by receipt, before filling missing values</w:t>
       </w:r>
     </w:p>
     <w:tbl>
@@ -6125,7 +6004,7 @@
     </w:tbl>
     <w:p>
       <w:pPr>
-        <w:spacing w:after="80" w:before="30" w:line="190"/>
+        <w:spacing w:after="80" w:before="30" w:line="240" w:lineRule="auto"/>
         <w:jc w:val="both"/>
         <w:rPr>
           <w:i/>
@@ -6142,13 +6021,13 @@
           <w:sz w:val="16"/>
           <w:szCs w:val="16"/>
         </w:rPr>
-        <w:t xml:space="preserve">Recipients: 946 people. Non-recipients: 67 people. Each cell gives the unweighted figure, then the person-weighted figure. A category cell gives an unweighted count and percentage inside that receipt group, then the weighted percentage. These percentages describe the composition of each group. They are not non-receipt rates and they are not predictions. Three recipients lack schooling. Fourteen recipients and four non-recipients lack an office-distance value. Those adults remain in the group denominators. This table has no uncertainty intervals.
-</w:t>
-      </w:r>
-    </w:p>
-    <w:p>
-      <w:pPr>
-        <w:spacing w:after="80" w:before="0" w:line="230"/>
+        <w:t xml:space="preserve">Recipients: 946; non-recipients: 67. Entries give unweighted then person-weighted means, or unweighted counts/within-group percentages then weighted percentages. Denominators retain three recipients missing schooling and 14 recipients/four non-recipients missing office-distance values. These describe group composition, without uncertainty intervals.</w:t>
+      </w:r>
+    </w:p>
+    <w:p>
+      <w:pPr>
+        <w:spacing w:after="0" w:before="0" w:line="240" w:lineRule="auto"/>
+        <w:ind w:firstLine="200"/>
         <w:jc w:val="both"/>
       </w:pPr>
       <w:r>
@@ -6157,21 +6036,19 @@
           <w:sz w:val="20"/>
           <w:szCs w:val="20"/>
         </w:rPr>
-        <w:t xml:space="preserve">In the unweighted figures, non-recipients had a lower average age and were more often men, educated to Grade 7 or above, and living in urban formal settlements. Weighting brought the average ages closer. These are descriptions of the two groups. Table V does not test the differences.
-</w:t>
+        <w:t xml:space="preserve">Unweighted non-recipients were younger, more often men, more educated and more often urban-formal residents. Weighting reduced the age difference. No between-group tests were performed.</w:t>
       </w:r>
     </w:p>
     <w:p>
       <w:pPr>
         <w:pStyle w:val="Heading2"/>
         <w:keepNext/>
-        <w:spacing w:after="60" w:before="140" w:line="230"/>
+        <w:spacing w:after="60" w:before="140" w:line="240" w:lineRule="auto"/>
         <w:jc w:val="left"/>
         <w:rPr>
-          <w:b w:val="false"/>
-          <w:bCs w:val="false"/>
           <w:i/>
           <w:iCs/>
+          <w:smallCaps w:val="false"/>
           <w:sz w:val="20"/>
           <w:szCs w:val="20"/>
         </w:rPr>
@@ -6179,20 +6056,19 @@
       <w:r>
         <w:rPr>
           <w:rFonts w:ascii="Times New Roman" w:cs="Times New Roman" w:eastAsia="Times New Roman" w:hAnsi="Times New Roman"/>
-          <w:b w:val="false"/>
-          <w:bCs w:val="false"/>
           <w:i/>
           <w:iCs/>
+          <w:smallCaps w:val="false"/>
           <w:sz w:val="20"/>
           <w:szCs w:val="20"/>
         </w:rPr>
-        <w:t xml:space="preserve">B. Screening sensitivity
-</w:t>
-      </w:r>
-    </w:p>
-    <w:p>
-      <w:pPr>
-        <w:spacing w:after="80" w:before="0" w:line="230"/>
+        <w:t xml:space="preserve">B. Screening sensitivity</w:t>
+      </w:r>
+    </w:p>
+    <w:p>
+      <w:pPr>
+        <w:spacing w:after="0" w:before="0" w:line="240" w:lineRule="auto"/>
+        <w:ind w:firstLine="200"/>
         <w:jc w:val="both"/>
       </w:pPr>
       <w:r>
@@ -6201,16 +6077,16 @@
           <w:sz w:val="20"/>
           <w:szCs w:val="20"/>
         </w:rPr>
-        <w:t xml:space="preserve">Table VI reports each scenario's denominator and non-receipt events. Unw. and Wtd. abbreviate unweighted and person-weighted non-receipt. Slope means calibration slope in Tables VI and VIII. Compared with S0, S1b/S1d added two people/two events. S2a, S2b, S2c and S2d added 59/4, 60/2, 8/0 and 68/2 people/events. S3 added 19 people/15 events; S4b removed six people but no events. Weighted non-receipt ranged from 7.12% to 9.06%. Held-out AUC in this table runs from 0.736 to 0.763. Brier and calibration slope also change. AUC, Brier and slope are point estimates, and the table gives them no intervals. A close AUC does not make the screened groups the same population, and it does not show which rule predicts better.
-</w:t>
+        <w:t xml:space="preserve">Table VI reports scenario denominators, events, unweighted/person-weighted prevalence and unweighted OOF performance. Weighted prevalence ranged from 7.12% to 9.06%; AUC ranged from 0.736 to 0.763. Sensitivity performance entries are point estimates without intervals; similar AUC neither equates screened populations nor validates a screening rule.</w:t>
       </w:r>
     </w:p>
     <w:p>
       <w:pPr>
         <w:keepNext/>
-        <w:spacing w:after="50" w:before="100" w:line="190"/>
+        <w:spacing w:after="50" w:before="100" w:line="240" w:lineRule="auto"/>
         <w:jc w:val="center"/>
         <w:rPr>
+          <w:smallCaps/>
           <w:sz w:val="16"/>
           <w:szCs w:val="16"/>
         </w:rPr>
@@ -6218,11 +6094,12 @@
       <w:r>
         <w:rPr>
           <w:rFonts w:ascii="Times New Roman" w:cs="Times New Roman" w:eastAsia="Times New Roman" w:hAnsi="Times New Roman"/>
+          <w:smallCaps/>
           <w:sz w:val="16"/>
           <w:szCs w:val="16"/>
         </w:rPr>
-        <w:t xml:space="preserve">Table VI. Screening changes, non-receipt rates and held-out point estimates
-</w:t>
+        <w:t xml:space="preserve">TABLE VI
+Screening changes, non-receipt rates and held-out point estimates</w:t>
       </w:r>
     </w:p>
     <w:tbl>
@@ -9180,7 +9057,7 @@
     </w:tbl>
     <w:p>
       <w:pPr>
-        <w:spacing w:after="80" w:before="30" w:line="190"/>
+        <w:spacing w:after="80" w:before="30" w:line="240" w:lineRule="auto"/>
         <w:jc w:val="both"/>
         <w:rPr>
           <w:i/>
@@ -9197,13 +9074,13 @@
           <w:sz w:val="16"/>
           <w:szCs w:val="16"/>
         </w:rPr>
-        <w:t xml:space="preserve">Events are reported non-recipients. Unw. and Wtd. are the unweighted and person-weighted non-receipt rates. AUC, Brier and slope are unweighted out-of-fold point estimates, with no intervals in this table. Performance uses no weights. Same* is not a new result. It repeats the S0 row for the scenarios that left the sample and the measures unchanged.
-</w:t>
-      </w:r>
-    </w:p>
-    <w:p>
-      <w:pPr>
-        <w:spacing w:after="80" w:before="0" w:line="230"/>
+        <w:t xml:space="preserve">Events are reported non-recipients. Unw./Wtd. denote unweighted/person-weighted percentages. AUC, Brier and calibration slope are unweighted OOF point estimates without intervals. Same* repeats S0 for unchanged scenarios.</w:t>
+      </w:r>
+    </w:p>
+    <w:p>
+      <w:pPr>
+        <w:spacing w:after="0" w:before="0" w:line="240" w:lineRule="auto"/>
+        <w:ind w:firstLine="200"/>
         <w:jc w:val="both"/>
       </w:pPr>
       <w:r>
@@ -9212,13 +9089,13 @@
           <w:sz w:val="20"/>
           <w:szCs w:val="20"/>
         </w:rPr>
-        <w:t xml:space="preserve">S1b applies the 2015 ceiling to every interview. S1d uses the ceiling at which the formula pays nothing. The two settings are different, and the saved counts and measures match, so one row displays both. S2a screens living-together adults as couples. S2b screens them as single. S2c screens separated adults as single. S2d screens both living-together and separated adults as single. S3 retains adults who report a disability or war-veterans grant. It adds no veterans. S4b keeps social-assistance income in the resource proxy.
-</w:t>
-      </w:r>
-    </w:p>
-    <w:p>
-      <w:pPr>
-        <w:spacing w:after="80" w:before="0" w:line="230"/>
+        <w:t xml:space="preserve">S1b applies the 2015 ceiling throughout; S1d uses the zero-payment boundary. These distinct settings produced identical results. S2a/S2b treat living-together adults as couples/single; S2c treats separated adults as single; S2d treats both as single. S3 retains disability/war-veterans recipients, adding no veterans. S4b includes social-assistance income.</w:t>
+      </w:r>
+    </w:p>
+    <w:p>
+      <w:pPr>
+        <w:spacing w:after="0" w:before="0" w:line="240" w:lineRule="auto"/>
+        <w:ind w:firstLine="200"/>
         <w:jc w:val="both"/>
       </w:pPr>
       <w:r>
@@ -9227,21 +9104,19 @@
           <w:sz w:val="20"/>
           <w:szCs w:val="20"/>
         </w:rPr>
-        <w:t xml:space="preserve">*S1a uses the 2014 ceiling throughout. S1c adds the age-75 supplement. S4a adjusts income for price changes and leaves the ceiling unchanged. S4c also excludes UIF (the Unemployment Insurance Fund) and similar transfers. S5 uses preceding-year receipt. S6a and S6b assign unresolved receipt to receipt or to non-receipt. No passed adult has unresolved receipt to bound, so those bounds change nothing. Each starred scenario keeps the S0 denominator, events and measures.
-</w:t>
+        <w:t xml:space="preserve">*Unchanged scenarios: S1a applies the 2014 ceiling throughout; S1c adds the age-75 supplement; S4a adjusts income for prices with unchanged ceilings; S4c excludes UIF and similar transfers; S5 uses preceding-year receipt. S6a/S6b assign unresolved PASS receipt to receipt/non-receipt; no such cases occurred. Each retains the S0 denominator, events and measures.</w:t>
       </w:r>
     </w:p>
     <w:p>
       <w:pPr>
         <w:pStyle w:val="Heading2"/>
         <w:keepNext/>
-        <w:spacing w:after="60" w:before="140" w:line="230"/>
+        <w:spacing w:after="60" w:before="140" w:line="240" w:lineRule="auto"/>
         <w:jc w:val="left"/>
         <w:rPr>
-          <w:b w:val="false"/>
-          <w:bCs w:val="false"/>
           <w:i/>
           <w:iCs/>
+          <w:smallCaps w:val="false"/>
           <w:sz w:val="20"/>
           <w:szCs w:val="20"/>
         </w:rPr>
@@ -9249,20 +9124,19 @@
       <w:r>
         <w:rPr>
           <w:rFonts w:ascii="Times New Roman" w:cs="Times New Roman" w:eastAsia="Times New Roman" w:hAnsi="Times New Roman"/>
-          <w:b w:val="false"/>
-          <w:bCs w:val="false"/>
           <w:i/>
           <w:iCs/>
+          <w:smallCaps w:val="false"/>
           <w:sz w:val="20"/>
           <w:szCs w:val="20"/>
         </w:rPr>
-        <w:t xml:space="preserve">C. Predictive performance and associations
-</w:t>
-      </w:r>
-    </w:p>
-    <w:p>
-      <w:pPr>
-        <w:spacing w:after="80" w:before="0" w:line="230"/>
+        <w:t xml:space="preserve">C. Predictive performance and associations</w:t>
+      </w:r>
+    </w:p>
+    <w:p>
+      <w:pPr>
+        <w:spacing w:after="0" w:before="0" w:line="240" w:lineRule="auto"/>
+        <w:ind w:firstLine="200"/>
         <w:jc w:val="both"/>
       </w:pPr>
       <w:r>
@@ -9271,13 +9145,13 @@
           <w:sz w:val="20"/>
           <w:szCs w:val="20"/>
         </w:rPr>
-        <w:t xml:space="preserve">This section reports two different results. Predictive performance uses one out-of-fold probability for each adult. Associations use odds ratios from the model fitted to all 1,013 included adults. Neither result explains why an adult reported non-receipt. The study did not test a mechanism, a time order or an intervention.
-</w:t>
-      </w:r>
-    </w:p>
-    <w:p>
-      <w:pPr>
-        <w:spacing w:after="80" w:before="0" w:line="230"/>
+        <w:t xml:space="preserve">Predictive performance uses OOF probabilities; associations use the full-cohort fit. Neither establishes causal mechanisms, temporal ordering or intervention effects.</w:t>
+      </w:r>
+    </w:p>
+    <w:p>
+      <w:pPr>
+        <w:spacing w:after="0" w:before="0" w:line="240" w:lineRule="auto"/>
+        <w:ind w:firstLine="200"/>
         <w:jc w:val="both"/>
       </w:pPr>
       <w:r>
@@ -9286,16 +9160,16 @@
           <w:sz w:val="20"/>
           <w:szCs w:val="20"/>
         </w:rPr>
-        <w:t xml:space="preserve">All five folds converged. Figure 4 uses five similarly sized bins. The highest bin had average prediction 0.188 and 35/203 non-recipients (17.2%); the lowest had average 0.0107 and 3/206 non-recipients (1.5%).
-</w:t>
+        <w:t xml:space="preserve">All five folds converged. Figure 4 uses five similarly sized bins. The highest bin had average prediction 0.188 and 35/203 non-recipients (17.2%); the lowest had average 0.0107 and 3/206 non-recipients (1.5%).</w:t>
       </w:r>
     </w:p>
     <w:p>
       <w:pPr>
         <w:keepNext/>
-        <w:spacing w:after="50" w:before="100" w:line="190"/>
+        <w:spacing w:after="50" w:before="100" w:line="240" w:lineRule="auto"/>
         <w:jc w:val="center"/>
         <w:rPr>
+          <w:smallCaps/>
           <w:sz w:val="16"/>
           <w:szCs w:val="16"/>
         </w:rPr>
@@ -9303,11 +9177,12 @@
       <w:r>
         <w:rPr>
           <w:rFonts w:ascii="Times New Roman" w:cs="Times New Roman" w:eastAsia="Times New Roman" w:hAnsi="Times New Roman"/>
+          <w:smallCaps/>
           <w:sz w:val="16"/>
           <w:szCs w:val="16"/>
         </w:rPr>
-        <w:t xml:space="preserve">Table VII. Primary held-out performance and resampling intervals
-</w:t>
+        <w:t xml:space="preserve">TABLE VII
+Primary held-out performance and resampling intervals</w:t>
       </w:r>
     </w:p>
     <w:tbl>
@@ -10105,7 +9980,7 @@
     </w:tbl>
     <w:p>
       <w:pPr>
-        <w:spacing w:after="80" w:before="30" w:line="190"/>
+        <w:spacing w:after="80" w:before="30" w:line="240" w:lineRule="auto"/>
         <w:jc w:val="both"/>
         <w:rPr>
           <w:i/>
@@ -10122,8 +9997,7 @@
           <w:sz w:val="16"/>
           <w:szCs w:val="16"/>
         </w:rPr>
-        <w:t xml:space="preserve">Each logistic cell is the estimate and its 95% interval. Estimates pool unweighted out-of-fold predictions from 1,013 people and 67 events. An interval is the 2.5 and 97.5 percentiles of 1,000 household resamples of those fixed predictions. Every reported interval had 1,000 valid resamples and no invalid resample. Resampling did not refit the model or the missing-value fill. These intervals are not design-based confidence intervals. They are not the survey approximation in Section V.A, and they are not the Wald intervals beside the odds ratios below. The intercept-only reference uses the training group's non-receipt rate. Its calibration-in-the-large is .0001, and no resampling interval was saved for that value. A dash means the intercept-only model does not supply that measure. A dash is not zero and is not chance performance. The ideal calibration-in-the-large is 0. The ideal slope is 1.
-</w:t>
+        <w:t xml:space="preserve">Brackets give conditional 95% percentile intervals from 1,000 household resamples of fixed OOF predictions (1,013 people/67 events); each interval had 1,000 valid, zero invalid draws. Predictive models and imputers were not refitted. These differ from the PSU approximation in V.A and full-fit Wald intervals below. The reference uses training-fold prevalence; its .0001 calibration-in-the-large has no saved interval. Dashes indicate unavailable measures. Ideal calibration intercept/slope values are 0/1.</w:t>
       </w:r>
     </w:p>
     <w:p>
@@ -10137,7 +10011,7 @@
           <wp:inline distT="0" distB="0" distL="0" distR="0">
             <wp:extent cx="3200400" cy="2286000"/>
             <wp:effectExtent t="0" r="0" b="0" l="0"/>
-            <wp:docPr id="1" name="Fig. 4. Saved group summaries show unweighted OOF calibration. Labels give events/people; the diagonal shows exact agreement between average predictions and observed rates. Plot range: 0–0.22. " descr="Fig. 4. Saved group summaries show unweighted OOF calibration. Labels give events/people; the diagonal shows exact agreement between average predictions and observed rates. Plot range: 0–0.22. " title="Fig. 4. Saved group summaries show unweighted OOF calibration. Labels give events/people; the diagonal shows exact agreement between average predictions and observed rates. Plot range: 0–0.22. "/>
+            <wp:docPr id="1" name="Fig. 4. Saved group summaries show unweighted OOF calibration. Labels give events/people; the diagonal shows exact agreement between average predictions and observed rates. Plot range: 0–0.22." descr="Fig. 4. Saved group summaries show unweighted OOF calibration. Labels give events/people; the diagonal shows exact agreement between average predictions and observed rates. Plot range: 0–0.22." title="Fig. 4. Saved group summaries show unweighted OOF calibration. Labels give events/people; the diagonal shows exact agreement between average predictions and observed rates. Plot range: 0–0.22."/>
             <wp:cNvGraphicFramePr>
               <a:graphicFrameLocks xmlns:a="http://schemas.openxmlformats.org/drawingml/2006/main" noChangeAspect="1"/>
             </wp:cNvGraphicFramePr>
@@ -10175,7 +10049,7 @@
     </w:p>
     <w:p>
       <w:pPr>
-        <w:spacing w:after="80" w:before="0" w:line="190"/>
+        <w:spacing w:after="80" w:before="0" w:line="240" w:lineRule="auto"/>
         <w:jc w:val="both"/>
         <w:rPr>
           <w:sz w:val="16"/>
@@ -10188,13 +10062,13 @@
           <w:sz w:val="16"/>
           <w:szCs w:val="16"/>
         </w:rPr>
-        <w:t xml:space="preserve">Fig. 4. Saved group summaries show unweighted OOF calibration. Labels give events/people; the diagonal shows exact agreement between average predictions and observed rates. Plot range: 0–0.22.
-</w:t>
-      </w:r>
-    </w:p>
-    <w:p>
-      <w:pPr>
-        <w:spacing w:after="80" w:before="0" w:line="230"/>
+        <w:t xml:space="preserve">Fig. 4. Saved group summaries show unweighted OOF calibration. Labels give events/people; the diagonal shows exact agreement between average predictions and observed rates. Plot range: 0–0.22.</w:t>
+      </w:r>
+    </w:p>
+    <w:p>
+      <w:pPr>
+        <w:spacing w:after="0" w:before="0" w:line="240" w:lineRule="auto"/>
+        <w:ind w:firstLine="200"/>
         <w:jc w:val="both"/>
       </w:pPr>
       <w:r>
@@ -10203,31 +10077,16 @@
           <w:sz w:val="20"/>
           <w:szCs w:val="20"/>
         </w:rPr>
-        <w:t xml:space="preserve">Table VII and Figure 4 assess the held-out probabilities. AUC summarises pairwise ranking. Average precision summarises precision-recall ranking. The Brier score summarises squared probability error. Calibration describes agreement between predicted and observed rates. These measures do not identify the separate contribution of age, sex, schooling, settlement or office distance.
-</w:t>
-      </w:r>
-    </w:p>
-    <w:p>
-      <w:pPr>
-        <w:spacing w:after="80" w:before="0" w:line="230"/>
-        <w:jc w:val="both"/>
-      </w:pPr>
-      <w:r>
-        <w:rPr>
-          <w:rFonts w:ascii="Times New Roman" w:cs="Times New Roman" w:eastAsia="Times New Roman" w:hAnsi="Times New Roman"/>
-          <w:sz w:val="20"/>
-          <w:szCs w:val="20"/>
-        </w:rPr>
-        <w:t xml:space="preserve">The associations come from another fit. The odds ratio for women versus men was 0.39. Its Wald interval was 0.23–0.66. Schooling below Grade 7 versus Grade 7 or above gave 0.24 (0.13–0.43). The model trained on all included adults produced these estimates, with the other predictors in the same model. The intervals exponentiate that model's coefficients and standard errors. They are not the Table VII resampling intervals. An odds ratio multiplies odds. It is not a change in the probability of non-receipt, and it is not a held-out performance measure. Age, settlement and welfare-distance intervals included 1. The associations describe this fitted model. They do not establish that sex, schooling, place or office distance produced non-receipt. The predictors are proxies, the data are cross-sectional, and the screen selects the 1,013 adults.
-</w:t>
+        <w:t xml:space="preserve">Full-cohort adjusted odds ratios were 0.39 for women versus men (Wald interval 0.23–0.66) and 0.24 for schooling below Grade 7 versus Grade 7 or above (0.13–0.43). Age, settlement and office-distance intervals included 1. These exploratory model-based intervals omit household clustering, survey design and specification-selection uncertainty. They describe odds associations, rather than probability changes, held-out performance or causal effects.</w:t>
       </w:r>
     </w:p>
     <w:p>
       <w:pPr>
         <w:keepNext/>
-        <w:spacing w:after="50" w:before="100" w:line="190"/>
+        <w:spacing w:after="50" w:before="100" w:line="240" w:lineRule="auto"/>
         <w:jc w:val="center"/>
         <w:rPr>
+          <w:smallCaps/>
           <w:sz w:val="16"/>
           <w:szCs w:val="16"/>
         </w:rPr>
@@ -10235,11 +10094,12 @@
       <w:r>
         <w:rPr>
           <w:rFonts w:ascii="Times New Roman" w:cs="Times New Roman" w:eastAsia="Times New Roman" w:hAnsi="Times New Roman"/>
+          <w:smallCaps/>
           <w:sz w:val="16"/>
           <w:szCs w:val="16"/>
         </w:rPr>
-        <w:t xml:space="preserve">Table VIII. Model and validation sensitivities, as point estimates
-</w:t>
+        <w:t xml:space="preserve">TABLE VIII
+Model and validation sensitivities, as point estimates</w:t>
       </w:r>
     </w:p>
     <w:tbl>
@@ -12030,7 +11890,7 @@
     </w:tbl>
     <w:p>
       <w:pPr>
-        <w:spacing w:after="80" w:before="30" w:line="190"/>
+        <w:spacing w:after="80" w:before="30" w:line="240" w:lineRule="auto"/>
         <w:jc w:val="both"/>
         <w:rPr>
           <w:i/>
@@ -12047,13 +11907,13 @@
           <w:sz w:val="16"/>
           <w:szCs w:val="16"/>
         </w:rPr>
-        <w:t xml:space="preserve">Unw. is the unweighted non-receipt percentage. AUC, Brier and slope are point estimates. This table does not report intervals for them. S8–S11 keep the person-weighted non-receipt rate at 7.49%. S7 keeps adults with usable schooling and office distance. It removes 21 people and four events, so its Brier describes a smaller sample. S8 replaces office distance with a married indicator and keeps six slopes. S9 fits with person weights as frequency weights. It still fills missing values without weights and checks predictions without weights. That fit is not a full survey-design regression. S10 applies person weights to the primary out-of-fold predictions and does not refit. S11 groups the five folds by derived primary sampling unit and keeps the same adults.
-</w:t>
-      </w:r>
-    </w:p>
-    <w:p>
-      <w:pPr>
-        <w:spacing w:after="80" w:before="0" w:line="230"/>
+        <w:t xml:space="preserve">Unw. is the unweighted non-receipt percentage; performance entries have no intervals. S8–S11 retain weighted non-receipt of 7.49%. S7 removes 21 adults/four events lacking usable schooling or distance. S8 substitutes marriage for office distance, retaining six slopes. S9 uses frequency-weighted fitting with unweighted imputation/evaluation, not full survey-design regression. S10 weights primary OOF predictions without refitting; S11 changes fold grouping to derived PSU.</w:t>
+      </w:r>
+    </w:p>
+    <w:p>
+      <w:pPr>
+        <w:spacing w:after="0" w:before="0" w:line="240" w:lineRule="auto"/>
+        <w:ind w:firstLine="200"/>
         <w:jc w:val="both"/>
       </w:pPr>
       <w:r>
@@ -12062,21 +11922,19 @@
           <w:sz w:val="20"/>
           <w:szCs w:val="20"/>
         </w:rPr>
-        <w:t xml:space="preserve">In Table VIII, AUC runs from 0.750 to 0.763. The lowest Brier is the complete-case row. The highest Brier is the weighted-score row, which reuses the primary predictions. These differences have no intervals. They do not rank the specifications. The rows summarise prediction under a changed sample, predictor or calculation. They are not a second set of odds ratios, and they do not establish a cause.
-</w:t>
+        <w:t xml:space="preserve">Table VIII changes sample, predictors or evaluation, rather than estimating effects. Its point estimates do not establish a preferred specification.</w:t>
       </w:r>
     </w:p>
     <w:p>
       <w:pPr>
         <w:pStyle w:val="Heading2"/>
         <w:keepNext/>
-        <w:spacing w:after="60" w:before="140" w:line="230"/>
+        <w:spacing w:after="60" w:before="140" w:line="240" w:lineRule="auto"/>
         <w:jc w:val="left"/>
         <w:rPr>
-          <w:b w:val="false"/>
-          <w:bCs w:val="false"/>
           <w:i/>
           <w:iCs/>
+          <w:smallCaps w:val="false"/>
           <w:sz w:val="20"/>
           <w:szCs w:val="20"/>
         </w:rPr>
@@ -12084,20 +11942,19 @@
       <w:r>
         <w:rPr>
           <w:rFonts w:ascii="Times New Roman" w:cs="Times New Roman" w:eastAsia="Times New Roman" w:hAnsi="Times New Roman"/>
-          <w:b w:val="false"/>
-          <w:bCs w:val="false"/>
           <w:i/>
           <w:iCs/>
+          <w:smallCaps w:val="false"/>
           <w:sz w:val="20"/>
           <w:szCs w:val="20"/>
         </w:rPr>
-        <w:t xml:space="preserve">D. Software verification
-</w:t>
-      </w:r>
-    </w:p>
-    <w:p>
-      <w:pPr>
-        <w:spacing w:after="80" w:before="0" w:line="230"/>
+        <w:t xml:space="preserve">D. Software verification</w:t>
+      </w:r>
+    </w:p>
+    <w:p>
+      <w:pPr>
+        <w:spacing w:after="0" w:before="0" w:line="240" w:lineRule="auto"/>
+        <w:ind w:firstLine="200"/>
         <w:jc w:val="both"/>
       </w:pPr>
       <w:r>
@@ -12106,16 +11963,16 @@
           <w:sz w:val="20"/>
           <w:szCs w:val="20"/>
         </w:rPr>
-        <w:t xml:space="preserve">The 26 checks in Table IX included 22 synthetic screening cases (invented records with specified expected decisions), two income-schedule checks, one forbidden-predictor check and one run trace. Boundary, spouse, grant and receipt decisions matched their specifications. Two research runs produced 14 files with exactly matching contents and retained the study-group checksum.
-</w:t>
+        <w:t xml:space="preserve">Table IX summarises 26 original checks: 22 synthetic screening cases, two income-schedule checks, one forbidden-predictor check and one run trace. Two research runs produced 14 byte-identical files and preserved the cohort checksum.</w:t>
       </w:r>
     </w:p>
     <w:p>
       <w:pPr>
         <w:keepNext/>
-        <w:spacing w:after="50" w:before="100" w:line="190"/>
+        <w:spacing w:after="50" w:before="100" w:line="240" w:lineRule="auto"/>
         <w:jc w:val="center"/>
         <w:rPr>
+          <w:smallCaps/>
           <w:sz w:val="16"/>
           <w:szCs w:val="16"/>
         </w:rPr>
@@ -12123,11 +11980,12 @@
       <w:r>
         <w:rPr>
           <w:rFonts w:ascii="Times New Roman" w:cs="Times New Roman" w:eastAsia="Times New Roman" w:hAnsi="Times New Roman"/>
+          <w:smallCaps/>
           <w:sz w:val="16"/>
           <w:szCs w:val="16"/>
         </w:rPr>
-        <w:t xml:space="preserve">Table IX. Completed verification and its scope
-</w:t>
+        <w:t xml:space="preserve">TABLE IX
+Completed verification and its scope</w:t>
       </w:r>
     </w:p>
     <w:tbl>
@@ -13054,7 +12912,8 @@
     </w:tbl>
     <w:p>
       <w:pPr>
-        <w:spacing w:after="80" w:before="0" w:line="230"/>
+        <w:spacing w:after="0" w:before="0" w:line="240" w:lineRule="auto"/>
+        <w:ind w:firstLine="200"/>
         <w:jc w:val="both"/>
       </w:pPr>
       <w:r>
@@ -13063,21 +12922,19 @@
           <w:sz w:val="20"/>
           <w:szCs w:val="20"/>
         </w:rPr>
-        <w:t xml:space="preserve">The owner's Windows walkthrough produced six synthetic classifications: two resolved passes, one recipient and one non-recipient. Matching predictors gave both scores of 0.1853. The invented 50% rate is not the survey non-receipt rate. Screenshots and six extracted reports documented the walkthrough. The checks did not inspect the ZIP container. Regenerated outputs, checksums, summaries and model/source versions passed 50 checks. This verifies functions and exports, not independent execution or representative task times, errors or ease.
-</w:t>
+        <w:t xml:space="preserve">The owner’s Windows walkthrough exercised six synthetic classifications. Six extracted reports passed 50 checks of outputs, summaries, checksums and versions. The ZIP container itself was not inspected. This supports local technical functionality, without independent execution or participant-usability evidence.</w:t>
       </w:r>
     </w:p>
     <w:p>
       <w:pPr>
         <w:pStyle w:val="Heading1"/>
         <w:keepNext/>
-        <w:spacing w:after="60" w:before="140" w:line="230"/>
+        <w:spacing w:after="60" w:before="140" w:line="240" w:lineRule="auto"/>
         <w:jc w:val="center"/>
         <w:rPr>
-          <w:b/>
-          <w:bCs/>
           <w:i w:val="false"/>
           <w:iCs w:val="false"/>
+          <w:smallCaps/>
           <w:sz w:val="20"/>
           <w:szCs w:val="20"/>
         </w:rPr>
@@ -13085,28 +12942,25 @@
       <w:r>
         <w:rPr>
           <w:rFonts w:ascii="Times New Roman" w:cs="Times New Roman" w:eastAsia="Times New Roman" w:hAnsi="Times New Roman"/>
-          <w:b/>
-          <w:bCs/>
           <w:i w:val="false"/>
           <w:iCs w:val="false"/>
+          <w:smallCaps/>
           <w:sz w:val="20"/>
           <w:szCs w:val="20"/>
         </w:rPr>
-        <w:t xml:space="preserve">VI. Discussion
-</w:t>
+        <w:t xml:space="preserve">VI. Discussion</w:t>
       </w:r>
     </w:p>
     <w:p>
       <w:pPr>
         <w:pStyle w:val="Heading2"/>
         <w:keepNext/>
-        <w:spacing w:after="60" w:before="140" w:line="230"/>
+        <w:spacing w:after="60" w:before="140" w:line="240" w:lineRule="auto"/>
         <w:jc w:val="left"/>
         <w:rPr>
-          <w:b w:val="false"/>
-          <w:bCs w:val="false"/>
           <w:i/>
           <w:iCs/>
+          <w:smallCaps w:val="false"/>
           <w:sz w:val="20"/>
           <w:szCs w:val="20"/>
         </w:rPr>
@@ -13114,20 +12968,19 @@
       <w:r>
         <w:rPr>
           <w:rFonts w:ascii="Times New Roman" w:cs="Times New Roman" w:eastAsia="Times New Roman" w:hAnsi="Times New Roman"/>
-          <w:b w:val="false"/>
-          <w:bCs w:val="false"/>
           <w:i/>
           <w:iCs/>
+          <w:smallCaps w:val="false"/>
           <w:sz w:val="20"/>
           <w:szCs w:val="20"/>
         </w:rPr>
-        <w:t xml:space="preserve">A. Scope of measured non-receipt
-</w:t>
-      </w:r>
-    </w:p>
-    <w:p>
-      <w:pPr>
-        <w:spacing w:after="80" w:before="0" w:line="230"/>
+        <w:t xml:space="preserve">A. Scope of measured non-receipt</w:t>
+      </w:r>
+    </w:p>
+    <w:p>
+      <w:pPr>
+        <w:spacing w:after="0" w:before="0" w:line="240" w:lineRule="auto"/>
+        <w:ind w:firstLine="200"/>
         <w:jc w:val="both"/>
       </w:pPr>
       <w:r>
@@ -13136,13 +12989,13 @@
           <w:sz w:val="20"/>
           <w:szCs w:val="20"/>
         </w:rPr>
-        <w:t xml:space="preserve">RQ1 measures non-receipt among historical KwaZulu-Natal adults who pass the screen and resolve receipt: 67/1,013, or 6.61% unweighted and 7.49% person-weighted. This does not measure unlawful denial or non-receipt among everyone legally entitled. The 187 unresolved adults outnumbered the 67 events. Excluding them changes the population described, regardless of sampling uncertainty. Stable estimates cannot reveal their receipt.
-</w:t>
-      </w:r>
-    </w:p>
-    <w:p>
-      <w:pPr>
-        <w:spacing w:after="80" w:before="0" w:line="230"/>
+        <w:t xml:space="preserve">RQ1 measures non-receipt among historical KwaZulu-Natal adults who pass the screen and resolve receipt: 67/1,013, or 6.61% unweighted and 7.49% person-weighted. This does not measure unlawful denial or non-receipt among everyone legally entitled. The 187 unresolved adults outnumbered the 67 events. Excluding them changes the population described, regardless of sampling uncertainty. Stable estimates cannot reveal their receipt.</w:t>
+      </w:r>
+    </w:p>
+    <w:p>
+      <w:pPr>
+        <w:spacing w:after="0" w:before="0" w:line="240" w:lineRule="auto"/>
+        <w:ind w:firstLine="200"/>
         <w:jc w:val="both"/>
       </w:pPr>
       <w:r>
@@ -13151,21 +13004,19 @@
           <w:sz w:val="20"/>
           <w:szCs w:val="20"/>
         </w:rPr>
-        <w:t xml:space="preserve">S2d added 68 people but only two events, reducing weighted non-receipt to 7.12%. Partnership rules mainly changed the denominator. S3 retained adults with incompatible grants, added 19 people/15 events and raised non-receipt to 9.06%, the largest tested change. Table VI gives AUC, Brier and slope as point estimates on those changed denominators, without intervals. Similar AUC cannot justify screening rules or establish equivalent populations. Ralston studies rural age-eligible people [3]; Godfrey studies households' grants [4]. Different units, programmes, screens and places prevent direct comparison of their percentages. This study adds a provincial estimate with an explicit resource screen. High receipt can involve access costs [13], [14]; it cannot prove low burden.
-</w:t>
+        <w:t xml:space="preserve">S2d added 68 people but only two events, reducing weighted non-receipt to 7.12%. Partnership rules mainly changed the denominator. S3 retained adults with incompatible grants, added 19 people/15 events and raised non-receipt to 9.06%, the largest tested change. Table VI gives AUC, Brier and slope as point estimates on those changed denominators, without intervals. Similar AUC cannot justify screening rules or establish equivalent populations. Ralston studies rural age-eligible people [3]; Godfrey studies households' grants [4]. Different units, programmes, screens and places prevent direct comparison of their percentages. This study adds a provincial estimate with an explicit resource screen. High receipt can involve access costs [13], [14]; it cannot prove low burden.</w:t>
       </w:r>
     </w:p>
     <w:p>
       <w:pPr>
         <w:pStyle w:val="Heading2"/>
         <w:keepNext/>
-        <w:spacing w:after="60" w:before="140" w:line="230"/>
+        <w:spacing w:after="60" w:before="140" w:line="240" w:lineRule="auto"/>
         <w:jc w:val="left"/>
         <w:rPr>
-          <w:b w:val="false"/>
-          <w:bCs w:val="false"/>
           <w:i/>
           <w:iCs/>
+          <w:smallCaps w:val="false"/>
           <w:sz w:val="20"/>
           <w:szCs w:val="20"/>
         </w:rPr>
@@ -13173,20 +13024,19 @@
       <w:r>
         <w:rPr>
           <w:rFonts w:ascii="Times New Roman" w:cs="Times New Roman" w:eastAsia="Times New Roman" w:hAnsi="Times New Roman"/>
-          <w:b w:val="false"/>
-          <w:bCs w:val="false"/>
           <w:i/>
           <w:iCs/>
+          <w:smallCaps w:val="false"/>
           <w:sz w:val="20"/>
           <w:szCs w:val="20"/>
         </w:rPr>
-        <w:t xml:space="preserve">B. Predictive performance and interpretation
-</w:t>
-      </w:r>
-    </w:p>
-    <w:p>
-      <w:pPr>
-        <w:spacing w:after="80" w:before="0" w:line="230"/>
+        <w:t xml:space="preserve">B. Predictive performance and interpretation</w:t>
+      </w:r>
+    </w:p>
+    <w:p>
+      <w:pPr>
+        <w:spacing w:after="0" w:before="0" w:line="240" w:lineRule="auto"/>
+        <w:ind w:firstLine="200"/>
         <w:jc w:val="both"/>
       </w:pPr>
       <w:r>
@@ -13195,13 +13045,13 @@
           <w:sz w:val="20"/>
           <w:szCs w:val="20"/>
         </w:rPr>
-        <w:t xml:space="preserve">RQ2 assesses four properties. AUC 0.752 describes ranking held-out non-recipients above recipients, not classification accuracy. Its Table VII interval, 0.687–0.814, lies above 0.5 for these fixed predictions. The interval still describes ranking, not accuracy at a cutoff. AP 0.203 summarises precision–recall ranking across cutoffs against a 6.61% event rate, not precision at one cutoff [16]. Its interval, 0.139–0.292, lies above that event rate. Brier fell from 0.0618 to 0.0578: a modest 0.0040 reduction in squared probability error. The two Brier intervals overlap, and no interval was calculated for the difference. An intercept correction, with calibration slope fixed at 1, checks average bias. The ideal correction is zero. The estimate 0.020 and interval spanning zero do not prove perfect agreement. Slope 0.836 suggests predictions may be too extreme, but its 0.591–1.133 interval includes the ideal 1 [17]. Only 67 events informed these checks [18]. Most adults in even the highest-risk bin reported receipt.
-</w:t>
-      </w:r>
-    </w:p>
-    <w:p>
-      <w:pPr>
-        <w:spacing w:after="80" w:before="0" w:line="230"/>
+        <w:t xml:space="preserve">AUC 0.752 indicates ranking discrimination, rather than cutoff accuracy. AP 0.203 summarises precision–recall across thresholds, rather than precision at one cutoff [16]. Brier fell from 0.0618 to 0.0578, a modest 0.0040 reduction. No paired interval was calculated for that reduction; it remains a descriptive comparison. Calibration-in-the-large 0.020 estimates an intercept correction with slope fixed at 1; an interval spanning the ideal zero does not prove calibration. Slope 0.836 suggests overly extreme predictions, but its 0.591–1.133 interval includes 1 [17]. Only 67 events informed evaluation [18], and most adults in the highest-risk bin reported receipt.</w:t>
+      </w:r>
+    </w:p>
+    <w:p>
+      <w:pPr>
+        <w:spacing w:after="0" w:before="0" w:line="240" w:lineRule="auto"/>
+        <w:ind w:firstLine="200"/>
         <w:jc w:val="both"/>
       </w:pPr>
       <w:r>
@@ -13210,13 +13060,13 @@
           <w:sz w:val="20"/>
           <w:szCs w:val="20"/>
         </w:rPr>
-        <w:t xml:space="preserve">The Table VII intervals resample fixed out-of-fold predictions by household. They are not the survey approximation in Section V.A. They are not the Wald intervals around the full-sample odds ratios. Those odds ratios are associations in the full-sample fit. Held-out ranking, probability error and calibration do not convert them into effects of sex, schooling, settlement or office distance.
-</w:t>
-      </w:r>
-    </w:p>
-    <w:p>
-      <w:pPr>
-        <w:spacing w:after="80" w:before="0" w:line="230"/>
+        <w:t xml:space="preserve">Household resampling, the PSU survey approximation and full-fit Wald intervals address different uncertainties. None converts predictive discrimination or fitted associations into effects of sex, schooling, settlement or office distance.</w:t>
+      </w:r>
+    </w:p>
+    <w:p>
+      <w:pPr>
+        <w:spacing w:after="0" w:before="0" w:line="240" w:lineRule="auto"/>
+        <w:ind w:firstLine="200"/>
         <w:jc w:val="both"/>
       </w:pPr>
       <w:r>
@@ -13225,21 +13075,19 @@
           <w:sz w:val="20"/>
           <w:szCs w:val="20"/>
         </w:rPr>
-        <w:t xml:space="preserve">Table VIII separates sample, predictor and evaluation changes. It reports point estimates only. S7 removed 21 people/four events (992/63). Its lower Brier concerns a different sample and cannot establish whether filling missing values is better. S8 substituted marriage for welfare access and performed similarly. S9 weighted fitting but not evaluation; it does not model the full survey design. S10 reweighted the same primary OOF predictions without retraining, raising Brier to 0.0641. S11 grouped folds by derived PSU and also performed similarly. S8–S11 retained 1,013 people/67 events. These checks expose internal assumptions; they do not establish model superiority or reliability elsewhere [19], [20].
-</w:t>
+        <w:t xml:space="preserve">Table VIII separates sample, predictor and evaluation changes. S7’s lower Brier concerns a different sample (992/63), not evidence that imputation harms prediction. S8 substitutes marriage for office distance. S9 weights fitting only; S10 weights the same OOF predictions, raising Brier to 0.0641. S11 changes grouping to derived PSU. S8–S11 retain 1,013 adults/67 events. These internal checks do not establish specification superiority or performance elsewhere [19], [20].</w:t>
       </w:r>
     </w:p>
     <w:p>
       <w:pPr>
         <w:pStyle w:val="Heading2"/>
         <w:keepNext/>
-        <w:spacing w:after="60" w:before="140" w:line="230"/>
+        <w:spacing w:after="60" w:before="140" w:line="240" w:lineRule="auto"/>
         <w:jc w:val="left"/>
         <w:rPr>
-          <w:b w:val="false"/>
-          <w:bCs w:val="false"/>
           <w:i/>
           <w:iCs/>
+          <w:smallCaps w:val="false"/>
           <w:sz w:val="20"/>
           <w:szCs w:val="20"/>
         </w:rPr>
@@ -13247,20 +13095,19 @@
       <w:r>
         <w:rPr>
           <w:rFonts w:ascii="Times New Roman" w:cs="Times New Roman" w:eastAsia="Times New Roman" w:hAnsi="Times New Roman"/>
-          <w:b w:val="false"/>
-          <w:bCs w:val="false"/>
           <w:i/>
           <w:iCs/>
+          <w:smallCaps w:val="false"/>
           <w:sz w:val="20"/>
           <w:szCs w:val="20"/>
         </w:rPr>
-        <w:t xml:space="preserve">C. Technical verification, separate from usability
-</w:t>
-      </w:r>
-    </w:p>
-    <w:p>
-      <w:pPr>
-        <w:spacing w:after="80" w:before="0" w:line="230"/>
+        <w:t xml:space="preserve">C. Technical verification, separate from usability</w:t>
+      </w:r>
+    </w:p>
+    <w:p>
+      <w:pPr>
+        <w:spacing w:after="0" w:before="0" w:line="240" w:lineRule="auto"/>
+        <w:ind w:firstLine="200"/>
         <w:jc w:val="both"/>
       </w:pPr>
       <w:r>
@@ -13269,13 +13116,13 @@
           <w:sz w:val="20"/>
           <w:szCs w:val="20"/>
         </w:rPr>
-        <w:t xml:space="preserve">RQ3 asks whether the tool can repeat the analysis and clearly explain screening decisions and model results. The completed evidence concerns repetition and the presence of those explanations in the program. It does not show that an independent person finds the explanations clear.
-</w:t>
-      </w:r>
-    </w:p>
-    <w:p>
-      <w:pPr>
-        <w:spacing w:after="80" w:before="0" w:line="230"/>
+        <w:t xml:space="preserve">RQ3 concerns reproducibility and inspectable explanations. Table IX supports technical correctness within tested conditions: synthetic cases check rules, repeated files check repeatability, interface–command agreement checks screening/receipt outputs, and model reload checks serialization. The owner’s walkthrough confirms local synthetic execution. Versioned sources and validation records support scrutiny; these checks do not establish independent user comprehension.</w:t>
+      </w:r>
+    </w:p>
+    <w:p>
+      <w:pPr>
+        <w:spacing w:after="0" w:before="0" w:line="240" w:lineRule="auto"/>
+        <w:ind w:firstLine="200"/>
         <w:jc w:val="both"/>
       </w:pPr>
       <w:r>
@@ -13284,13 +13131,13 @@
           <w:sz w:val="20"/>
           <w:szCs w:val="20"/>
         </w:rPr>
-        <w:t xml:space="preserve">Table IX keeps the technical checks separate from the usability row. Synthetic cases compare rule decisions with specified outcomes. Matching file contents check that a repeated run produces the same outputs. Agreement between the interface and the command checks that both paths select the same people and return the same decisions, receipt, reasons and scores. Reloading the saved model checks that stored predictions are preserved. That reload is not a new estimate of predictive accuracy. The owner walkthrough checks that the author could run the synthetic workflow locally and that the exported files matched the programmed comparisons. Saved sources and validation reports document versions, checksums and test conditions. Together, these layers support technical correctness and repeatability inside the tests that were run.
-</w:t>
-      </w:r>
-    </w:p>
-    <w:p>
-      <w:pPr>
-        <w:spacing w:after="80" w:before="0" w:line="230"/>
+        <w:t xml:space="preserve">Historical OOF evaluation remains separate from uploaded full-data scores, whose records may overlap training data. Reload agreement verifies stored predictions, rather than new predictive accuracy or user understanding.</w:t>
+      </w:r>
+    </w:p>
+    <w:p>
+      <w:pPr>
+        <w:spacing w:after="0" w:before="0" w:line="240" w:lineRule="auto"/>
+        <w:ind w:firstLine="200"/>
         <w:jc w:val="both"/>
       </w:pPr>
       <w:r>
@@ -13299,36 +13146,60 @@
           <w:sz w:val="20"/>
           <w:szCs w:val="20"/>
         </w:rPr>
-        <w:t xml:space="preserve">The application keeps historical out-of-fold results separate from scores for an uploaded file. An upload may overlap the training data. A matching reloaded score confirms the stored model. It does not show how the model would perform for new people, and it does not show that a user understands the distinction.
-</w:t>
-      </w:r>
-    </w:p>
-    <w:p>
-      <w:pPr>
-        <w:spacing w:after="80" w:before="0" w:line="230"/>
-        <w:jc w:val="both"/>
-      </w:pPr>
-      <w:r>
-        <w:rPr>
-          <w:rFonts w:ascii="Times New Roman" w:cs="Times New Roman" w:eastAsia="Times New Roman" w:hAnsi="Times New Roman"/>
+        <w:t xml:space="preserve">Participant usability remains untested. The unused protocol proposes independent participants, with task completion, time, errors, ease and assistance measures. Automated Streamlit checks and the developer’s walkthrough cannot establish usability or field acceptance.</w:t>
+      </w:r>
+    </w:p>
+    <w:p>
+      <w:pPr>
+        <w:pStyle w:val="Heading2"/>
+        <w:keepNext/>
+        <w:spacing w:after="60" w:before="140" w:line="240" w:lineRule="auto"/>
+        <w:jc w:val="left"/>
+        <w:rPr>
+          <w:i/>
+          <w:iCs/>
+          <w:smallCaps w:val="false"/>
           <w:sz w:val="20"/>
           <w:szCs w:val="20"/>
         </w:rPr>
-        <w:t xml:space="preserve">None of these checks is a usability evaluation. A usability study would recruit people other than the developer, give them the prepared tasks, and record completion, time, errors, ease and assistance. That protocol has not been used. Participant usability remains untested. The paper therefore makes no claim about user experience, ease of use, acceptance or success in ordinary work. An automated Streamlit test checks the program. The owner's own run cannot substitute for an independent participant.
-</w:t>
+      </w:pPr>
+      <w:r>
+        <w:rPr>
+          <w:rFonts w:ascii="Times New Roman" w:cs="Times New Roman" w:eastAsia="Times New Roman" w:hAnsi="Times New Roman"/>
+          <w:i/>
+          <w:iCs/>
+          <w:smallCaps w:val="false"/>
+          <w:sz w:val="20"/>
+          <w:szCs w:val="20"/>
+        </w:rPr>
+        <w:t xml:space="preserve">D. Transfer to other settings</w:t>
+      </w:r>
+    </w:p>
+    <w:p>
+      <w:pPr>
+        <w:spacing w:after="0" w:before="0" w:line="240" w:lineRule="auto"/>
+        <w:ind w:firstLine="200"/>
+        <w:jc w:val="both"/>
+      </w:pPr>
+      <w:r>
+        <w:rPr>
+          <w:rFonts w:ascii="Times New Roman" w:cs="Times New Roman" w:eastAsia="Times New Roman" w:hAnsi="Times New Roman"/>
+          <w:sz w:val="20"/>
+          <w:szCs w:val="20"/>
+        </w:rPr>
+        <w:t xml:space="preserve">This study covers screened KwaZulu-Natal adults in LCS 2014/2015. Provinces and periods differ in services, policy and reporting; administrative application, award and payment records measure other outcomes. No independent province, period or administrative sample validated the model. Transfer requires comparable populations, period-specific screening and independent discrimination/calibration checks [19], [20].</w:t>
       </w:r>
     </w:p>
     <w:p>
       <w:pPr>
         <w:pStyle w:val="Heading2"/>
         <w:keepNext/>
-        <w:spacing w:after="60" w:before="140" w:line="230"/>
+        <w:spacing w:after="60" w:before="140" w:line="240" w:lineRule="auto"/>
         <w:jc w:val="left"/>
         <w:rPr>
-          <w:b w:val="false"/>
-          <w:bCs w:val="false"/>
           <w:i/>
           <w:iCs/>
+          <w:smallCaps w:val="false"/>
           <w:sz w:val="20"/>
           <w:szCs w:val="20"/>
         </w:rPr>
@@ -13336,20 +13207,19 @@
       <w:r>
         <w:rPr>
           <w:rFonts w:ascii="Times New Roman" w:cs="Times New Roman" w:eastAsia="Times New Roman" w:hAnsi="Times New Roman"/>
-          <w:b w:val="false"/>
-          <w:bCs w:val="false"/>
           <w:i/>
           <w:iCs/>
+          <w:smallCaps w:val="false"/>
           <w:sz w:val="20"/>
           <w:szCs w:val="20"/>
         </w:rPr>
-        <w:t xml:space="preserve">D. Transfer to other settings
-</w:t>
-      </w:r>
-    </w:p>
-    <w:p>
-      <w:pPr>
-        <w:spacing w:after="80" w:before="0" w:line="230"/>
+        <w:t xml:space="preserve">E. Synthesis of the Conceptual Framework</w:t>
+      </w:r>
+    </w:p>
+    <w:p>
+      <w:pPr>
+        <w:spacing w:after="0" w:before="0" w:line="240" w:lineRule="auto"/>
+        <w:ind w:firstLine="200"/>
         <w:jc w:val="both"/>
       </w:pPr>
       <w:r>
@@ -13358,21 +13228,19 @@
           <w:sz w:val="20"/>
           <w:szCs w:val="20"/>
         </w:rPr>
-        <w:t xml:space="preserve">This study analysed screened KwaZulu-Natal adults in LCS 2014/2015. Provinces and periods differ in settlement, services, policy and reporting. Application, award and payment records measure different events from reported receipt and can contain linking errors. The study did not test the model on an independent province, period or administrative sample. Transfer requires comparable populations/outcomes, justified period-specific rules and independent ranking/calibration checks [19], [20]. Making the app available cannot establish suitability for today's applicants.
-</w:t>
-      </w:r>
-    </w:p>
-    <w:p>
-      <w:pPr>
-        <w:pStyle w:val="Heading2"/>
+        <w:t xml:space="preserve">Returning to Figure 1, screening sensitivity shows why the denominator requires explicit assumptions. Sex differences describe demographic associations without establishing burden mechanisms [3], [4]. Lower schooling accompanied receipt, contrary to the expectation that fewer information resources increase non-receipt [13]. Selection or other resources could explain this finding; neither explanation was tested. Office-distance and settlement intervals included 1, leaving compliance-cost expectations unresolved. LCS did not measure psychological costs. The artefact implements these bounded measurements through separate, traceable rules, outcomes and predictions. It supports inspection of the framework without establishing causes, statutory entitlement or participant usability.</w:t>
+      </w:r>
+    </w:p>
+    <w:p>
+      <w:pPr>
+        <w:pStyle w:val="Heading1"/>
         <w:keepNext/>
-        <w:spacing w:after="60" w:before="140" w:line="230"/>
-        <w:jc w:val="left"/>
-        <w:rPr>
-          <w:b w:val="false"/>
-          <w:bCs w:val="false"/>
-          <w:i/>
-          <w:iCs/>
+        <w:spacing w:after="60" w:before="140" w:line="240" w:lineRule="auto"/>
+        <w:jc w:val="center"/>
+        <w:rPr>
+          <w:i w:val="false"/>
+          <w:iCs w:val="false"/>
+          <w:smallCaps/>
           <w:sz w:val="20"/>
           <w:szCs w:val="20"/>
         </w:rPr>
@@ -13380,20 +13248,19 @@
       <w:r>
         <w:rPr>
           <w:rFonts w:ascii="Times New Roman" w:cs="Times New Roman" w:eastAsia="Times New Roman" w:hAnsi="Times New Roman"/>
-          <w:b w:val="false"/>
-          <w:bCs w:val="false"/>
-          <w:i/>
-          <w:iCs/>
+          <w:i w:val="false"/>
+          <w:iCs w:val="false"/>
+          <w:smallCaps/>
           <w:sz w:val="20"/>
           <w:szCs w:val="20"/>
         </w:rPr>
-        <w:t xml:space="preserve">E. Synthesis of the Conceptual Framework
-</w:t>
-      </w:r>
-    </w:p>
-    <w:p>
-      <w:pPr>
-        <w:spacing w:after="80" w:before="0" w:line="230"/>
+        <w:t xml:space="preserve">VII. Limitations and Ethics</w:t>
+      </w:r>
+    </w:p>
+    <w:p>
+      <w:pPr>
+        <w:spacing w:after="0" w:before="0" w:line="240" w:lineRule="auto"/>
+        <w:ind w:firstLine="200"/>
         <w:jc w:val="both"/>
       </w:pPr>
       <w:r>
@@ -13402,21 +13269,49 @@
           <w:sz w:val="20"/>
           <w:szCs w:val="20"/>
         </w:rPr>
-        <w:t xml:space="preserve">Returning to Figure 1, screening sensitivity supported an explicit denominator, and sex differences supported demographic comparison without confirming burden mechanisms [3], [4]. Lower schooling accompanied receipt, contrary to a simple expectation that fewer information resources increase non-receipt [13]. Screening selection or other resources could account for this; neither explanation was tested. Office-distance and settlement intervals included 1, leaving compliance-cost expectations unresolved. Psychological costs remained untested because LCS did not measure them. Proxy associations do not directly test the theory. The artefact contributes a reproducible implementation of these bounded measurement choices. Separate, traceable rules, outcomes and predictions support inspection despite measurement limits, without establishing causes, legal entitlement or participant usability.
-</w:t>
+        <w:t xml:space="preserve">The research proxy omits assets, deemed income and deductions and cannot establish statutory eligibility. Income/receipt misreporting, cross-sectional ordering, few events, unresolved screening and missing strata limit interpretation. Fixed-prediction resampling omits repeated model-development uncertainty; coefficient intervals condition on the selected specification. Household sampling excludes institutionalised older adults. Participant usability and external predictive performance remain untested.</w:t>
+      </w:r>
+    </w:p>
+    <w:p>
+      <w:pPr>
+        <w:spacing w:after="0" w:before="0" w:line="240" w:lineRule="auto"/>
+        <w:ind w:firstLine="200"/>
+        <w:jc w:val="both"/>
+      </w:pPr>
+      <w:r>
+        <w:rPr>
+          <w:rFonts w:ascii="Times New Roman" w:cs="Times New Roman" w:eastAsia="Times New Roman" w:hAnsi="Times New Roman"/>
+          <w:sz w:val="20"/>
+          <w:szCs w:val="20"/>
+        </w:rPr>
+        <w:t xml:space="preserve">This DUT honours study uses existing LCS 2014/2015 microdata without contacting respondents. Access and disclosure conditions still apply. Public demonstrations use synthetic records; controlled reference-parity tests also used the research data. The downloadable package excludes survey records, and app displays/exports omit submitted identifiers and raw income. These controls do not establish disclosure review or release permission for historical repository files.</w:t>
+      </w:r>
+    </w:p>
+    <w:p>
+      <w:pPr>
+        <w:spacing w:after="0" w:before="0" w:line="240" w:lineRule="auto"/>
+        <w:ind w:firstLine="200"/>
+        <w:jc w:val="both"/>
+      </w:pPr>
+      <w:r>
+        <w:rPr>
+          <w:rFonts w:ascii="Times New Roman" w:cs="Times New Roman" w:eastAsia="Times New Roman" w:hAnsi="Times New Roman"/>
+          <w:sz w:val="20"/>
+          <w:szCs w:val="20"/>
+        </w:rPr>
+        <w:t xml:space="preserve">The project record contains no DUT-IREC clearance number, faculty or departmental determination, or gatekeeper letter. The study therefore claims no approval, exemption or consent determination. Confirmation of the applicable institutional ethics route and secondary-data governance remains outstanding. These requirements are separate from the technical controls above. The application supports research analysis and does not determine grant entitlement.</w:t>
       </w:r>
     </w:p>
     <w:p>
       <w:pPr>
         <w:pStyle w:val="Heading1"/>
         <w:keepNext/>
-        <w:spacing w:after="60" w:before="140" w:line="230"/>
+        <w:spacing w:after="60" w:before="140" w:line="240" w:lineRule="auto"/>
         <w:jc w:val="center"/>
         <w:rPr>
-          <w:b/>
-          <w:bCs/>
           <w:i w:val="false"/>
           <w:iCs w:val="false"/>
+          <w:smallCaps/>
           <w:sz w:val="20"/>
           <w:szCs w:val="20"/>
         </w:rPr>
@@ -13424,20 +13319,19 @@
       <w:r>
         <w:rPr>
           <w:rFonts w:ascii="Times New Roman" w:cs="Times New Roman" w:eastAsia="Times New Roman" w:hAnsi="Times New Roman"/>
-          <w:b/>
-          <w:bCs/>
           <w:i w:val="false"/>
           <w:iCs w:val="false"/>
+          <w:smallCaps/>
           <w:sz w:val="20"/>
           <w:szCs w:val="20"/>
         </w:rPr>
-        <w:t xml:space="preserve">VII. Limitations and Ethics
-</w:t>
-      </w:r>
-    </w:p>
-    <w:p>
-      <w:pPr>
-        <w:spacing w:after="80" w:before="0" w:line="230"/>
+        <w:t xml:space="preserve">VIII. Conclusion</w:t>
+      </w:r>
+    </w:p>
+    <w:p>
+      <w:pPr>
+        <w:spacing w:after="0" w:before="0" w:line="240" w:lineRule="auto"/>
+        <w:ind w:firstLine="200"/>
         <w:jc w:val="both"/>
       </w:pPr>
       <w:r>
@@ -13446,13 +13340,13 @@
           <w:sz w:val="20"/>
           <w:szCs w:val="20"/>
         </w:rPr>
-        <w:t xml:space="preserve">The survey cannot establish legal eligibility: its resource proxy omits assets, deemed income and deductions. Respondents may misreport income and receipt. Cross-sectional data cannot establish the order of events. Few events, unresolved screening, missing strata and resampling fixed predictions without refitting limit inference. Household sampling excludes institutionalised older adults. Participant usability and performance elsewhere remain untested.
-</w:t>
-      </w:r>
-    </w:p>
-    <w:p>
-      <w:pPr>
-        <w:spacing w:after="80" w:before="0" w:line="230"/>
+        <w:t xml:space="preserve">Screened historical non-receipt was 6.6% unweighted and 7.5% person-weighted; alternatives gave 7.1%–9.1%. Grant-compatibility and partnership assumptions changed the population described. Five predictor groups/six slopes gave AUC 0.752, AP 0.203 and Brier 0.0578, supporting moderate internal ranking and a small descriptive probability-error reduction.</w:t>
+      </w:r>
+    </w:p>
+    <w:p>
+      <w:pPr>
+        <w:spacing w:after="0" w:before="0" w:line="240" w:lineRule="auto"/>
+        <w:ind w:firstLine="200"/>
         <w:jc w:val="both"/>
       </w:pPr>
       <w:r>
@@ -13461,115 +13355,39 @@
           <w:sz w:val="20"/>
           <w:szCs w:val="20"/>
         </w:rPr>
-        <w:t xml:space="preserve">This paper reports DUT honours research. The analysis uses existing LCS 2014/2015 microdata and adds no contact with survey respondents. Survey access conditions and disclosure requirements still apply. Interface demonstrations and tests use synthetic records. The downloadable package excludes survey records. Displays and reports omit submitted identifiers and raw income. These controls do not review every historical repository file, and they do not clear current release permission.
-</w:t>
-      </w:r>
-    </w:p>
-    <w:p>
-      <w:pPr>
-        <w:spacing w:after="80" w:before="0" w:line="230"/>
-        <w:jc w:val="both"/>
-      </w:pPr>
-      <w:r>
-        <w:rPr>
-          <w:rFonts w:ascii="Times New Roman" w:cs="Times New Roman" w:eastAsia="Times New Roman" w:hAnsi="Times New Roman"/>
+        <w:t xml:space="preserve">The contribution integrates transparent screening, interpretable prediction and reproducible software for the same adults. Separate rules, unresolved cases, outcomes and scores make the path from survey measurement to displayed result inspectable. This provides a historical benchmark and an implementable analytical design, without establishing legal entitlement, causal barriers, participant usability or external validity.</w:t>
+      </w:r>
+    </w:p>
+    <w:p>
+      <w:pPr>
+        <w:pStyle w:val="Heading1"/>
+        <w:keepNext/>
+        <w:spacing w:after="60" w:before="140" w:line="240" w:lineRule="auto"/>
+        <w:jc w:val="center"/>
+        <w:rPr>
+          <w:i w:val="false"/>
+          <w:iCs w:val="false"/>
+          <w:smallCaps/>
           <w:sz w:val="20"/>
           <w:szCs w:val="20"/>
         </w:rPr>
-        <w:t xml:space="preserve">DUT's research-ethics policy covers student research. It requires ethical assessment where a study uses personal information. DUT-IREC allocates an ethics clearance number. Where that committee is not the route, the faculty or department must keep a formal documented procedure. The project record contains no DUT-IREC clearance number, no faculty or departmental determination and no gatekeeper letter. The paper therefore claims no approval, exemption or consent determination. The recorded adults are aged 60 or older. DUT's published rules list the aged among groups that may need special safeguards, and no committee has made that classification for this project. Confirmation by the supervisor and DUT-IREC, or by the faculty route DUT specifies, remains outstanding. The app explains measurement choices; it neither decides grants nor ranks named applicants.
-</w:t>
-      </w:r>
-    </w:p>
-    <w:p>
-      <w:pPr>
-        <w:pStyle w:val="Heading1"/>
-        <w:keepNext/>
-        <w:spacing w:after="60" w:before="140" w:line="230"/>
-        <w:jc w:val="center"/>
-        <w:rPr>
-          <w:b/>
-          <w:bCs/>
+      </w:pPr>
+      <w:r>
+        <w:rPr>
+          <w:rFonts w:ascii="Times New Roman" w:cs="Times New Roman" w:eastAsia="Times New Roman" w:hAnsi="Times New Roman"/>
           <w:i w:val="false"/>
           <w:iCs w:val="false"/>
+          <w:smallCaps/>
           <w:sz w:val="20"/>
           <w:szCs w:val="20"/>
         </w:rPr>
-      </w:pPr>
-      <w:r>
-        <w:rPr>
-          <w:rFonts w:ascii="Times New Roman" w:cs="Times New Roman" w:eastAsia="Times New Roman" w:hAnsi="Times New Roman"/>
-          <w:b/>
-          <w:bCs/>
-          <w:i w:val="false"/>
-          <w:iCs w:val="false"/>
-          <w:sz w:val="20"/>
-          <w:szCs w:val="20"/>
-        </w:rPr>
-        <w:t xml:space="preserve">VIII. Conclusion
-</w:t>
-      </w:r>
-    </w:p>
-    <w:p>
-      <w:pPr>
-        <w:spacing w:after="80" w:before="0" w:line="230"/>
-        <w:jc w:val="both"/>
-      </w:pPr>
-      <w:r>
-        <w:rPr>
-          <w:rFonts w:ascii="Times New Roman" w:cs="Times New Roman" w:eastAsia="Times New Roman" w:hAnsi="Times New Roman"/>
-          <w:sz w:val="20"/>
-          <w:szCs w:val="20"/>
-        </w:rPr>
-        <w:t xml:space="preserve">Historical screened non-receipt was 6.6% unweighted and 7.5% person-weighted; alternatives gave 7.1%–9.1%. Rules about other grants changed results more than the ceiling, and unresolved cases made the denominator central. Five predictor groups/six slopes gave AUC 0.752, AP 0.203 and Brier 0.0578: moderate internal ranking with slightly less probability error. The software reproduces screening, receipt categories and scores for inspection under tested conditions. The study provides a historical benchmark. It does not establish human usability, causes, legal entitlement or performance elsewhere.
-</w:t>
-      </w:r>
-    </w:p>
-    <w:p>
-      <w:pPr>
-        <w:spacing w:after="80" w:before="0" w:line="230"/>
-        <w:jc w:val="both"/>
-      </w:pPr>
-      <w:r>
-        <w:rPr>
-          <w:rFonts w:ascii="Times New Roman" w:cs="Times New Roman" w:eastAsia="Times New Roman" w:hAnsi="Times New Roman"/>
-          <w:sz w:val="20"/>
-          <w:szCs w:val="20"/>
-        </w:rPr>
-        <w:t xml:space="preserve">The contribution is the integration of the screen, the prediction and the software on the same adults. The screen states the research rules, separates unresolved cases from the denominator, and shows how the rate changes when the screening rule changes. The prediction names six slopes and separates held-out ranking, probability error and calibration from full-sample associations. The software repeats the rules, receipt categories and scores, and it keeps the record of the checks that were run. Together they make the path from a survey answer to a displayed result inspectable.</w:t>
-      </w:r>
-    </w:p>
-    <w:p>
-      <w:pPr>
-        <w:pStyle w:val="Heading1"/>
-        <w:keepNext/>
-        <w:spacing w:after="60" w:before="140" w:line="230"/>
-        <w:jc w:val="center"/>
-        <w:rPr>
-          <w:b/>
-          <w:bCs/>
-          <w:i w:val="false"/>
-          <w:iCs w:val="false"/>
-          <w:sz w:val="20"/>
-          <w:szCs w:val="20"/>
-        </w:rPr>
-      </w:pPr>
-      <w:r>
-        <w:rPr>
-          <w:rFonts w:ascii="Times New Roman" w:cs="Times New Roman" w:eastAsia="Times New Roman" w:hAnsi="Times New Roman"/>
-          <w:b/>
-          <w:bCs/>
-          <w:i w:val="false"/>
-          <w:iCs w:val="false"/>
-          <w:sz w:val="20"/>
-          <w:szCs w:val="20"/>
-        </w:rPr>
         <w:t xml:space="preserve">References</w:t>
       </w:r>
     </w:p>
     <w:p>
       <w:pPr>
         <w:keepLines/>
-        <w:spacing w:after="0" w:before="0" w:line="160"/>
+        <w:spacing w:after="0" w:before="0" w:line="240" w:lineRule="auto"/>
         <w:ind w:left="260" w:hanging="260"/>
         <w:jc w:val="left"/>
       </w:pPr>
@@ -13603,7 +13421,7 @@
     <w:p>
       <w:pPr>
         <w:keepLines/>
-        <w:spacing w:after="0" w:before="0" w:line="160"/>
+        <w:spacing w:after="0" w:before="0" w:line="240" w:lineRule="auto"/>
         <w:ind w:left="260" w:hanging="260"/>
         <w:jc w:val="left"/>
       </w:pPr>
@@ -13637,7 +13455,7 @@
     <w:p>
       <w:pPr>
         <w:keepLines/>
-        <w:spacing w:after="0" w:before="0" w:line="160"/>
+        <w:spacing w:after="0" w:before="0" w:line="240" w:lineRule="auto"/>
         <w:ind w:left="260" w:hanging="260"/>
         <w:jc w:val="left"/>
       </w:pPr>
@@ -13671,7 +13489,7 @@
     <w:p>
       <w:pPr>
         <w:keepLines/>
-        <w:spacing w:after="0" w:before="0" w:line="160"/>
+        <w:spacing w:after="0" w:before="0" w:line="240" w:lineRule="auto"/>
         <w:ind w:left="260" w:hanging="260"/>
         <w:jc w:val="left"/>
       </w:pPr>
@@ -13723,7 +13541,7 @@
     <w:p>
       <w:pPr>
         <w:keepLines/>
-        <w:spacing w:after="0" w:before="0" w:line="160"/>
+        <w:spacing w:after="0" w:before="0" w:line="240" w:lineRule="auto"/>
         <w:ind w:left="260" w:hanging="260"/>
         <w:jc w:val="left"/>
       </w:pPr>
@@ -13739,7 +13557,7 @@
     <w:p>
       <w:pPr>
         <w:keepLines/>
-        <w:spacing w:after="0" w:before="0" w:line="160"/>
+        <w:spacing w:after="0" w:before="0" w:line="240" w:lineRule="auto"/>
         <w:ind w:left="260" w:hanging="260"/>
         <w:jc w:val="left"/>
       </w:pPr>
@@ -13773,7 +13591,7 @@
     <w:p>
       <w:pPr>
         <w:keepLines/>
-        <w:spacing w:after="0" w:before="0" w:line="160"/>
+        <w:spacing w:after="0" w:before="0" w:line="240" w:lineRule="auto"/>
         <w:ind w:left="260" w:hanging="260"/>
         <w:jc w:val="left"/>
       </w:pPr>
@@ -13807,7 +13625,7 @@
     <w:p>
       <w:pPr>
         <w:keepLines/>
-        <w:spacing w:after="0" w:before="0" w:line="160"/>
+        <w:spacing w:after="0" w:before="0" w:line="240" w:lineRule="auto"/>
         <w:ind w:left="260" w:hanging="260"/>
         <w:jc w:val="left"/>
       </w:pPr>
@@ -13841,7 +13659,7 @@
     <w:p>
       <w:pPr>
         <w:keepLines/>
-        <w:spacing w:after="0" w:before="0" w:line="160"/>
+        <w:spacing w:after="0" w:before="0" w:line="240" w:lineRule="auto"/>
         <w:ind w:left="260" w:hanging="260"/>
         <w:jc w:val="left"/>
       </w:pPr>
@@ -13875,7 +13693,7 @@
     <w:p>
       <w:pPr>
         <w:keepLines/>
-        <w:spacing w:after="0" w:before="0" w:line="160"/>
+        <w:spacing w:after="0" w:before="0" w:line="240" w:lineRule="auto"/>
         <w:ind w:left="260" w:hanging="260"/>
         <w:jc w:val="left"/>
       </w:pPr>
@@ -13909,7 +13727,7 @@
     <w:p>
       <w:pPr>
         <w:keepLines/>
-        <w:spacing w:after="0" w:before="0" w:line="160"/>
+        <w:spacing w:after="0" w:before="0" w:line="240" w:lineRule="auto"/>
         <w:ind w:left="260" w:hanging="260"/>
         <w:jc w:val="left"/>
       </w:pPr>
@@ -13943,7 +13761,7 @@
     <w:p>
       <w:pPr>
         <w:keepLines/>
-        <w:spacing w:after="0" w:before="0" w:line="160"/>
+        <w:spacing w:after="0" w:before="0" w:line="240" w:lineRule="auto"/>
         <w:ind w:left="260" w:hanging="260"/>
         <w:jc w:val="left"/>
       </w:pPr>
@@ -13959,7 +13777,7 @@
     <w:p>
       <w:pPr>
         <w:keepLines/>
-        <w:spacing w:after="0" w:before="0" w:line="160"/>
+        <w:spacing w:after="0" w:before="0" w:line="240" w:lineRule="auto"/>
         <w:ind w:left="260" w:hanging="260"/>
         <w:jc w:val="left"/>
       </w:pPr>
@@ -13993,7 +13811,7 @@
     <w:p>
       <w:pPr>
         <w:keepLines/>
-        <w:spacing w:after="0" w:before="0" w:line="160"/>
+        <w:spacing w:after="0" w:before="0" w:line="240" w:lineRule="auto"/>
         <w:ind w:left="260" w:hanging="260"/>
         <w:jc w:val="left"/>
       </w:pPr>
@@ -14027,7 +13845,7 @@
     <w:p>
       <w:pPr>
         <w:keepLines/>
-        <w:spacing w:after="0" w:before="0" w:line="160"/>
+        <w:spacing w:after="0" w:before="0" w:line="240" w:lineRule="auto"/>
         <w:ind w:left="260" w:hanging="260"/>
         <w:jc w:val="left"/>
       </w:pPr>
@@ -14061,7 +13879,7 @@
     <w:p>
       <w:pPr>
         <w:keepLines/>
-        <w:spacing w:after="0" w:before="0" w:line="160"/>
+        <w:spacing w:after="0" w:before="0" w:line="240" w:lineRule="auto"/>
         <w:ind w:left="260" w:hanging="260"/>
         <w:jc w:val="left"/>
       </w:pPr>
@@ -14095,7 +13913,7 @@
     <w:p>
       <w:pPr>
         <w:keepLines/>
-        <w:spacing w:after="0" w:before="0" w:line="160"/>
+        <w:spacing w:after="0" w:before="0" w:line="240" w:lineRule="auto"/>
         <w:ind w:left="260" w:hanging="260"/>
         <w:jc w:val="left"/>
       </w:pPr>
@@ -14147,7 +13965,7 @@
     <w:p>
       <w:pPr>
         <w:keepLines/>
-        <w:spacing w:after="0" w:before="0" w:line="160"/>
+        <w:spacing w:after="0" w:before="0" w:line="240" w:lineRule="auto"/>
         <w:ind w:left="260" w:hanging="260"/>
         <w:jc w:val="left"/>
       </w:pPr>
@@ -14199,7 +14017,7 @@
     <w:p>
       <w:pPr>
         <w:keepLines/>
-        <w:spacing w:after="0" w:before="0" w:line="160"/>
+        <w:spacing w:after="0" w:before="0" w:line="240" w:lineRule="auto"/>
         <w:ind w:left="260" w:hanging="260"/>
         <w:jc w:val="left"/>
       </w:pPr>
@@ -14251,7 +14069,7 @@
     <w:p>
       <w:pPr>
         <w:keepLines/>
-        <w:spacing w:after="0" w:before="0" w:line="160"/>
+        <w:spacing w:after="0" w:before="0" w:line="240" w:lineRule="auto"/>
         <w:ind w:left="260" w:hanging="260"/>
         <w:jc w:val="left"/>
       </w:pPr>
@@ -14285,7 +14103,7 @@
     <w:p>
       <w:pPr>
         <w:keepLines/>
-        <w:spacing w:after="0" w:before="0" w:line="160"/>
+        <w:spacing w:after="0" w:before="0" w:line="240" w:lineRule="auto"/>
         <w:ind w:left="260" w:hanging="260"/>
         <w:jc w:val="left"/>
       </w:pPr>
@@ -14301,7 +14119,7 @@
     <w:p>
       <w:pPr>
         <w:keepLines/>
-        <w:spacing w:after="0" w:before="0" w:line="160"/>
+        <w:spacing w:after="0" w:before="0" w:line="240" w:lineRule="auto"/>
         <w:ind w:left="260" w:hanging="260"/>
         <w:jc w:val="left"/>
       </w:pPr>
@@ -14317,7 +14135,7 @@
     <w:p>
       <w:pPr>
         <w:keepLines/>
-        <w:spacing w:after="0" w:before="0" w:line="160"/>
+        <w:spacing w:after="0" w:before="0" w:line="240" w:lineRule="auto"/>
         <w:ind w:left="260" w:hanging="260"/>
         <w:jc w:val="left"/>
       </w:pPr>
@@ -14333,7 +14151,7 @@
     <w:p>
       <w:pPr>
         <w:keepLines/>
-        <w:spacing w:after="0" w:before="0" w:line="160"/>
+        <w:spacing w:after="0" w:before="0" w:line="240" w:lineRule="auto"/>
         <w:ind w:left="260" w:hanging="260"/>
         <w:jc w:val="left"/>
       </w:pPr>
@@ -14349,7 +14167,7 @@
     <w:p>
       <w:pPr>
         <w:keepLines/>
-        <w:spacing w:after="0" w:before="0" w:line="160"/>
+        <w:spacing w:after="0" w:before="0" w:line="240" w:lineRule="auto"/>
         <w:ind w:left="260" w:hanging="260"/>
         <w:jc w:val="left"/>
       </w:pPr>
@@ -14365,7 +14183,7 @@
     <w:p>
       <w:pPr>
         <w:keepLines/>
-        <w:spacing w:after="0" w:before="0" w:line="160"/>
+        <w:spacing w:after="0" w:before="0" w:line="240" w:lineRule="auto"/>
         <w:ind w:left="260" w:hanging="260"/>
         <w:jc w:val="left"/>
       </w:pPr>
@@ -14381,7 +14199,7 @@
     <w:p>
       <w:pPr>
         <w:keepLines/>
-        <w:spacing w:after="0" w:before="0" w:line="160"/>
+        <w:spacing w:after="0" w:before="0" w:line="240" w:lineRule="auto"/>
         <w:ind w:left="260" w:hanging="260"/>
         <w:jc w:val="left"/>
       </w:pPr>
@@ -14397,7 +14215,7 @@
     <w:p>
       <w:pPr>
         <w:keepLines/>
-        <w:spacing w:after="0" w:before="0" w:line="160"/>
+        <w:spacing w:after="0" w:before="0" w:line="240" w:lineRule="auto"/>
         <w:ind w:left="260" w:hanging="260"/>
         <w:jc w:val="left"/>
       </w:pPr>

</xml_diff>

<commit_message>
Record the literature search strings, dates and PRISMA counts.
Section II.A now shows the eight searches logged on 17 August 2026, with the verbatim Boolean strings, hit and kept counts, and the screening flow. The search grid is unnumbered, so Tables I–IX keep their numbers. The native PDFs are nine Letter pages.
</commit_message>
<xml_diff>
--- a/paper/Jawe_OPG_nonreceipt_KZN.docx
+++ b/paper/Jawe_OPG_nonreceipt_KZN.docx
@@ -17,7 +17,8 @@
           <w:sz w:val="48"/>
           <w:szCs w:val="48"/>
         </w:rPr>
-        <w:t xml:space="preserve">Interpretable Prediction of Reported Older Person’s Grant Non-Receipt Among Apparently Eligible Adults in KwaZulu-Natal</w:t>
+        <w:t xml:space="preserve">Interpretable Prediction of Reported Older Person’s Grant Non-Receipt Among Apparently Eligible Adults in KwaZulu-Natal
+</w:t>
       </w:r>
     </w:p>
     <w:p>
@@ -25,17 +26,18 @@
         <w:spacing w:after="30" w:before="0" w:line="230"/>
         <w:jc w:val="center"/>
         <w:rPr>
-          <w:sz w:val="22"/>
-          <w:szCs w:val="22"/>
+          <w:sz w:val="18"/>
+          <w:szCs w:val="18"/>
         </w:rPr>
       </w:pPr>
       <w:r>
         <w:rPr>
           <w:rFonts w:ascii="Times New Roman" w:cs="Times New Roman" w:eastAsia="Times New Roman" w:hAnsi="Times New Roman"/>
-          <w:sz w:val="22"/>
-          <w:szCs w:val="22"/>
-        </w:rPr>
-        <w:t xml:space="preserve">Oluhle Jawe</w:t>
+          <w:sz w:val="18"/>
+          <w:szCs w:val="18"/>
+        </w:rPr>
+        <w:t xml:space="preserve">Oluhle Jawe
+</w:t>
       </w:r>
     </w:p>
     <w:p>
@@ -53,7 +55,8 @@
           <w:sz w:val="18"/>
           <w:szCs w:val="18"/>
         </w:rPr>
-        <w:t xml:space="preserve">ICT Honours (21634436), APRE402</w:t>
+        <w:t xml:space="preserve">ICT Honours (21634436), APRE402
+</w:t>
       </w:r>
     </w:p>
     <w:p>
@@ -71,7 +74,8 @@
           <w:sz w:val="18"/>
           <w:szCs w:val="18"/>
         </w:rPr>
-        <w:t xml:space="preserve">Durban University of Technology, Durban, South Africa</w:t>
+        <w:t xml:space="preserve">Durban University of Technology, Durban, South Africa
+</w:t>
       </w:r>
     </w:p>
     <w:p>
@@ -107,7 +111,8 @@
           <w:sz w:val="18"/>
           <w:szCs w:val="18"/>
         </w:rPr>
-        <w:t xml:space="preserve">Abstract—This study analysed reported Older Person’s Grant (OPG) non-receipt among adults aged 60 or older in KwaZulu-Natal (KZN), using the Living Conditions Survey (LCS) 2014/2015. The study used administrative-burden theory to choose predictors and observable research rules to identify apparently eligible adults. Screening did not establish legal entitlement. Among 1,013 adults who passed with resolved receipt, 67 reported non-receipt: 6.6% unweighted and 7.5% person-weighted. Alternative screening rules gave weighted rates of 7.1%–9.1%. Logistic regression used five predictor groups and household-held-out validation. AUC (area under the receiver operating characteristic curve) was 0.752; average precision (AP) was 0.203. The Brier score was 0.0578, compared with 0.0618 for an intercept-only reference using training-group prevalence. Checks supported reproducibility. The application displays rules, decisions, scores and reports. No participant study tested ease of use. These results do not establish entitlement, explain non-receipt, or demonstrate performance elsewhere.</w:t>
+        <w:t xml:space="preserve">Abstract—This study analysed reported Older Person’s Grant (OPG) non-receipt among adults aged 60 or older in KwaZulu-Natal (KZN), using the Living Conditions Survey (LCS) 2014/2015. The study used administrative-burden theory to choose predictors and observable research rules to identify apparently eligible adults. Screening did not establish legal entitlement. Among 1,013 adults who passed with resolved receipt, 67 reported non-receipt: 6.6% unweighted and 7.5% person-weighted. Alternative screening rules gave weighted rates of 7.1%–9.1%. Logistic regression used five predictor groups and household-held-out validation. AUC (area under the receiver operating characteristic curve) was 0.752; average precision (AP) was 0.203. The Brier score was 0.0578, compared with 0.0618 for an intercept-only reference using training-group prevalence. Checks supported reproducibility. The application displays rules, decisions, scores and reports. No participant study tested ease of use. These results do not establish entitlement, explain non-receipt, or demonstrate performance elsewhere.
+</w:t>
       </w:r>
     </w:p>
     <w:p>
@@ -133,7 +138,8 @@
           <w:sz w:val="18"/>
           <w:szCs w:val="18"/>
         </w:rPr>
-        <w:t xml:space="preserve">Index Terms—Older Person’s Grant, reported non-receipt, administrative burden, Living Conditions Survey, logistic regression, reproducibility.</w:t>
+        <w:t xml:space="preserve">Index Terms—Older Person’s Grant, reported non-receipt, administrative burden, Living Conditions Survey, logistic regression, reproducibility.
+</w:t>
       </w:r>
     </w:p>
     <w:p>
@@ -159,7 +165,8 @@
           <w:sz w:val="20"/>
           <w:szCs w:val="20"/>
         </w:rPr>
-        <w:t xml:space="preserve">I. Introduction</w:t>
+        <w:t xml:space="preserve">I. Introduction
+</w:t>
       </w:r>
     </w:p>
     <w:p>
@@ -174,7 +181,8 @@
           <w:sz w:val="20"/>
           <w:szCs w:val="20"/>
         </w:rPr>
-        <w:t xml:space="preserve">The Older Person’s Grant (OPG) supports households [1], including during crises [2]. Prior studies examine rural pension receipt [3] and household grant receipt [4]. This study examines reported non-receipt among older adults who pass a research eligibility screen.</w:t>
+        <w:t xml:space="preserve">The Older Person’s Grant (OPG) supports households [1], including during crises [2]. Prior studies examine rural pension receipt [3] and household grant receipt [4]. This study examines reported non-receipt among older adults who pass a research eligibility screen.
+</w:t>
       </w:r>
     </w:p>
     <w:p>
@@ -189,7 +197,8 @@
           <w:sz w:val="20"/>
           <w:szCs w:val="20"/>
         </w:rPr>
-        <w:t xml:space="preserve">Screening, reported receipt and legal entitlement remain distinct. Passing observable research conditions does not establish a South African Social Security Agency decision [5]. Missing spouse resources and unresolved responses change the denominator, whose construction must precede estimation.</w:t>
+        <w:t xml:space="preserve">Screening, reported receipt and legal entitlement remain distinct. Passing observable research conditions does not establish a South African Social Security Agency decision [5]. Missing spouse resources and unresolved responses change the denominator, whose construction must precede estimation.
+</w:t>
       </w:r>
     </w:p>
     <w:p>
@@ -204,7 +213,8 @@
           <w:sz w:val="20"/>
           <w:szCs w:val="20"/>
         </w:rPr>
-        <w:t xml:space="preserve">This study develops and evaluates an interpretable research artefact using the Living Conditions Survey (LCS) 2014/2015 in KwaZulu-Natal. It documents cohort construction, estimates weighted non-receipt, tests predictions in held-out households and verifies computational correctness, reproducibility and inspectability.</w:t>
+        <w:t xml:space="preserve">This study develops and evaluates an interpretable research artefact using the Living Conditions Survey (LCS) 2014/2015 in KwaZulu-Natal. It documents cohort construction, estimates weighted non-receipt, tests predictions in held-out households and verifies computational correctness, reproducibility and inspectability.
+</w:t>
       </w:r>
     </w:p>
     <w:p>
@@ -219,7 +229,8 @@
           <w:sz w:val="20"/>
           <w:szCs w:val="20"/>
         </w:rPr>
-        <w:t xml:space="preserve">RQ1 asks how common reported non-receipt is among screen-PASS adults with resolved receipt and how screening alternatives change that proportion. RQ2 evaluates logistic discrimination and probability accuracy in held-out households. RQ3 asks whether the artefact reproduces the analysis and clearly presents screening decisions and model outputs; participant usability remains untested.</w:t>
+        <w:t xml:space="preserve">RQ1 asks how common reported non-receipt is among screen-PASS adults with resolved receipt and how screening alternatives change that proportion. RQ2 evaluates logistic discrimination and probability accuracy in held-out households. RQ3 asks whether the artefact reproduces the analysis and clearly presents screening decisions and model outputs; participant usability remains untested.
+</w:t>
       </w:r>
     </w:p>
     <w:p>
@@ -245,7 +256,8 @@
           <w:sz w:val="20"/>
           <w:szCs w:val="20"/>
         </w:rPr>
-        <w:t xml:space="preserve">II. Related Work and Predictor Selection</w:t>
+        <w:t xml:space="preserve">II. Related Work and Predictor Selection
+</w:t>
       </w:r>
     </w:p>
     <w:p>
@@ -271,7 +283,8 @@
           <w:sz w:val="20"/>
           <w:szCs w:val="20"/>
         </w:rPr>
-        <w:t xml:space="preserve">A. Review Approach, Programme Context and Research Gap</w:t>
+        <w:t xml:space="preserve">A. Review Approach, Programme Context and Research Gap
+</w:t>
       </w:r>
     </w:p>
     <w:p>
@@ -286,7 +299,1968 @@
           <w:sz w:val="20"/>
           <w:szCs w:val="20"/>
         </w:rPr>
-        <w:t xml:space="preserve">The narrative review drew on Scopus, Dimensions, IEEE Xplore, SABINET/African Journals Online, Google Scholar and Statistics South Africa/DataFirst. Searches covered social assistance, eligibility, take-up, non-receipt, exclusion and prediction. Studies differed in programme, population, unit and outcome, preventing pooled estimates.</w:t>
+        <w:t xml:space="preserve">The narrative review examined grant access, eligibility measurement and prediction. On 17 August 2026, eight searches were run and logged. Web of Science was not searched: DUT could not authenticate it that day, and Dimensions was used instead. A record was kept when it concerned grant access, exclusion, take-up or targeting, or classification of household-survey data; was in English; and was a peer-reviewed article, thesis or institutional report. Empirical studies were limited to 2015–2026. Foundational theory was exempt from that year limit. South African evidence was preferred. Studies differed in programme, population, unit and outcome, preventing pooled estimates.
+</w:t>
+      </w:r>
+    </w:p>
+    <w:p>
+      <w:pPr>
+        <w:keepNext/>
+        <w:spacing w:after="40" w:before="80" w:line="200" w:lineRule="auto"/>
+        <w:jc w:val="center"/>
+        <w:rPr>
+          <w:i/>
+          <w:iCs/>
+          <w:sz w:val="16"/>
+          <w:szCs w:val="16"/>
+        </w:rPr>
+      </w:pPr>
+      <w:r>
+        <w:rPr>
+          <w:rFonts w:ascii="Times New Roman" w:cs="Times New Roman" w:eastAsia="Times New Roman" w:hAnsi="Times New Roman"/>
+          <w:i/>
+          <w:iCs/>
+          <w:sz w:val="16"/>
+          <w:szCs w:val="16"/>
+        </w:rPr>
+        <w:t xml:space="preserve">Recorded searches, 17 August 2026. A repeated record is counted under the earliest search, so the kept column sums to 55.
+</w:t>
+      </w:r>
+    </w:p>
+    <w:tbl>
+      <w:tblPr>
+        <w:tblW w:type="dxa" w:w="5040"/>
+        <w:tblBorders>
+          <w:top w:val="single" w:color="auto" w:sz="4"/>
+          <w:left w:val="single" w:color="auto" w:sz="4"/>
+          <w:bottom w:val="single" w:color="auto" w:sz="4"/>
+          <w:right w:val="single" w:color="auto" w:sz="4"/>
+          <w:insideH w:val="single" w:color="auto" w:sz="4"/>
+          <w:insideV w:val="single" w:color="auto" w:sz="4"/>
+        </w:tblBorders>
+        <w:tblLayout w:type="fixed"/>
+      </w:tblPr>
+      <w:tblGrid>
+        <w:gridCol w:w="520"/>
+        <w:gridCol w:w="980"/>
+        <w:gridCol w:w="420"/>
+        <w:gridCol w:w="420"/>
+        <w:gridCol w:w="2700"/>
+      </w:tblGrid>
+      <w:tr>
+        <w:trPr>
+          <w:cantSplit/>
+          <w:tblHeader/>
+        </w:trPr>
+        <w:tc>
+          <w:tcPr>
+            <w:tcW w:type="dxa" w:w="520"/>
+            <w:tcBorders>
+              <w:top w:val="single" w:color="808080" w:sz="4"/>
+              <w:left w:val="single" w:color="808080" w:sz="4"/>
+              <w:bottom w:val="single" w:color="808080" w:sz="4"/>
+              <w:right w:val="single" w:color="808080" w:sz="4"/>
+            </w:tcBorders>
+            <w:tcMar>
+              <w:top w:type="dxa" w:w="40"/>
+              <w:left w:type="dxa" w:w="45"/>
+              <w:bottom w:type="dxa" w:w="40"/>
+              <w:right w:type="dxa" w:w="45"/>
+            </w:tcMar>
+            <w:vAlign w:val="center"/>
+          </w:tcPr>
+          <w:p>
+            <w:pPr>
+              <w:keepNext/>
+              <w:spacing w:after="0" w:before="0" w:line="240" w:lineRule="auto"/>
+              <w:jc w:val="left"/>
+              <w:rPr>
+                <w:b/>
+                <w:bCs/>
+                <w:sz w:val="18"/>
+                <w:szCs w:val="18"/>
+              </w:rPr>
+            </w:pPr>
+            <w:r>
+              <w:rPr>
+                <w:rFonts w:ascii="Times New Roman" w:cs="Times New Roman" w:eastAsia="Times New Roman" w:hAnsi="Times New Roman"/>
+                <w:b/>
+                <w:bCs/>
+                <w:sz w:val="18"/>
+                <w:szCs w:val="18"/>
+              </w:rPr>
+              <w:t xml:space="preserve">Search</w:t>
+            </w:r>
+          </w:p>
+        </w:tc>
+        <w:tc>
+          <w:tcPr>
+            <w:tcW w:type="dxa" w:w="980"/>
+            <w:tcBorders>
+              <w:top w:val="single" w:color="808080" w:sz="4"/>
+              <w:left w:val="single" w:color="808080" w:sz="4"/>
+              <w:bottom w:val="single" w:color="808080" w:sz="4"/>
+              <w:right w:val="single" w:color="808080" w:sz="4"/>
+            </w:tcBorders>
+            <w:tcMar>
+              <w:top w:type="dxa" w:w="40"/>
+              <w:left w:type="dxa" w:w="45"/>
+              <w:bottom w:type="dxa" w:w="40"/>
+              <w:right w:type="dxa" w:w="45"/>
+            </w:tcMar>
+            <w:vAlign w:val="center"/>
+          </w:tcPr>
+          <w:p>
+            <w:pPr>
+              <w:keepNext/>
+              <w:spacing w:after="0" w:before="0" w:line="240" w:lineRule="auto"/>
+              <w:jc w:val="center"/>
+              <w:rPr>
+                <w:b/>
+                <w:bCs/>
+                <w:sz w:val="18"/>
+                <w:szCs w:val="18"/>
+              </w:rPr>
+            </w:pPr>
+            <w:r>
+              <w:rPr>
+                <w:rFonts w:ascii="Times New Roman" w:cs="Times New Roman" w:eastAsia="Times New Roman" w:hAnsi="Times New Roman"/>
+                <w:b/>
+                <w:bCs/>
+                <w:sz w:val="18"/>
+                <w:szCs w:val="18"/>
+              </w:rPr>
+              <w:t xml:space="preserve">Source</w:t>
+            </w:r>
+          </w:p>
+        </w:tc>
+        <w:tc>
+          <w:tcPr>
+            <w:tcW w:type="dxa" w:w="420"/>
+            <w:tcBorders>
+              <w:top w:val="single" w:color="808080" w:sz="4"/>
+              <w:left w:val="single" w:color="808080" w:sz="4"/>
+              <w:bottom w:val="single" w:color="808080" w:sz="4"/>
+              <w:right w:val="single" w:color="808080" w:sz="4"/>
+            </w:tcBorders>
+            <w:tcMar>
+              <w:top w:type="dxa" w:w="40"/>
+              <w:left w:type="dxa" w:w="45"/>
+              <w:bottom w:type="dxa" w:w="40"/>
+              <w:right w:type="dxa" w:w="45"/>
+            </w:tcMar>
+            <w:vAlign w:val="center"/>
+          </w:tcPr>
+          <w:p>
+            <w:pPr>
+              <w:keepNext/>
+              <w:spacing w:after="0" w:before="0" w:line="240" w:lineRule="auto"/>
+              <w:jc w:val="center"/>
+              <w:rPr>
+                <w:b/>
+                <w:bCs/>
+                <w:sz w:val="18"/>
+                <w:szCs w:val="18"/>
+              </w:rPr>
+            </w:pPr>
+            <w:r>
+              <w:rPr>
+                <w:rFonts w:ascii="Times New Roman" w:cs="Times New Roman" w:eastAsia="Times New Roman" w:hAnsi="Times New Roman"/>
+                <w:b/>
+                <w:bCs/>
+                <w:sz w:val="18"/>
+                <w:szCs w:val="18"/>
+              </w:rPr>
+              <w:t xml:space="preserve">Hits</w:t>
+            </w:r>
+          </w:p>
+        </w:tc>
+        <w:tc>
+          <w:tcPr>
+            <w:tcW w:type="dxa" w:w="420"/>
+            <w:tcBorders>
+              <w:top w:val="single" w:color="808080" w:sz="4"/>
+              <w:left w:val="single" w:color="808080" w:sz="4"/>
+              <w:bottom w:val="single" w:color="808080" w:sz="4"/>
+              <w:right w:val="single" w:color="808080" w:sz="4"/>
+            </w:tcBorders>
+            <w:tcMar>
+              <w:top w:type="dxa" w:w="40"/>
+              <w:left w:type="dxa" w:w="45"/>
+              <w:bottom w:type="dxa" w:w="40"/>
+              <w:right w:type="dxa" w:w="45"/>
+            </w:tcMar>
+            <w:vAlign w:val="center"/>
+          </w:tcPr>
+          <w:p>
+            <w:pPr>
+              <w:keepNext/>
+              <w:spacing w:after="0" w:before="0" w:line="240" w:lineRule="auto"/>
+              <w:jc w:val="center"/>
+              <w:rPr>
+                <w:b/>
+                <w:bCs/>
+                <w:sz w:val="18"/>
+                <w:szCs w:val="18"/>
+              </w:rPr>
+            </w:pPr>
+            <w:r>
+              <w:rPr>
+                <w:rFonts w:ascii="Times New Roman" w:cs="Times New Roman" w:eastAsia="Times New Roman" w:hAnsi="Times New Roman"/>
+                <w:b/>
+                <w:bCs/>
+                <w:sz w:val="18"/>
+                <w:szCs w:val="18"/>
+              </w:rPr>
+              <w:t xml:space="preserve">Kept</w:t>
+            </w:r>
+          </w:p>
+        </w:tc>
+        <w:tc>
+          <w:tcPr>
+            <w:tcW w:type="dxa" w:w="2700"/>
+            <w:tcBorders>
+              <w:top w:val="single" w:color="808080" w:sz="4"/>
+              <w:left w:val="single" w:color="808080" w:sz="4"/>
+              <w:bottom w:val="single" w:color="808080" w:sz="4"/>
+              <w:right w:val="single" w:color="808080" w:sz="4"/>
+            </w:tcBorders>
+            <w:tcMar>
+              <w:top w:type="dxa" w:w="40"/>
+              <w:left w:type="dxa" w:w="45"/>
+              <w:bottom w:type="dxa" w:w="40"/>
+              <w:right w:type="dxa" w:w="45"/>
+            </w:tcMar>
+            <w:vAlign w:val="center"/>
+          </w:tcPr>
+          <w:p>
+            <w:pPr>
+              <w:keepNext/>
+              <w:spacing w:after="0" w:before="0" w:line="240" w:lineRule="auto"/>
+              <w:jc w:val="center"/>
+              <w:rPr>
+                <w:b/>
+                <w:bCs/>
+                <w:sz w:val="18"/>
+                <w:szCs w:val="18"/>
+              </w:rPr>
+            </w:pPr>
+            <w:r>
+              <w:rPr>
+                <w:rFonts w:ascii="Times New Roman" w:cs="Times New Roman" w:eastAsia="Times New Roman" w:hAnsi="Times New Roman"/>
+                <w:b/>
+                <w:bCs/>
+                <w:sz w:val="18"/>
+                <w:szCs w:val="18"/>
+              </w:rPr>
+              <w:t xml:space="preserve">Query</w:t>
+            </w:r>
+          </w:p>
+        </w:tc>
+      </w:tr>
+      <w:tr>
+        <w:trPr>
+          <w:cantSplit/>
+          <w:tblHeader w:val="false"/>
+        </w:trPr>
+        <w:tc>
+          <w:tcPr>
+            <w:tcW w:type="dxa" w:w="520"/>
+            <w:tcBorders>
+              <w:top w:val="single" w:color="808080" w:sz="4"/>
+              <w:left w:val="single" w:color="808080" w:sz="4"/>
+              <w:bottom w:val="single" w:color="808080" w:sz="4"/>
+              <w:right w:val="single" w:color="808080" w:sz="4"/>
+            </w:tcBorders>
+            <w:tcMar>
+              <w:top w:type="dxa" w:w="40"/>
+              <w:left w:type="dxa" w:w="45"/>
+              <w:bottom w:type="dxa" w:w="40"/>
+              <w:right w:type="dxa" w:w="45"/>
+            </w:tcMar>
+            <w:vAlign w:val="center"/>
+          </w:tcPr>
+          <w:p>
+            <w:pPr>
+              <w:keepNext/>
+              <w:spacing w:after="0" w:before="0" w:line="240" w:lineRule="auto"/>
+              <w:jc w:val="left"/>
+              <w:rPr>
+                <w:b w:val="false"/>
+                <w:bCs w:val="false"/>
+                <w:sz w:val="18"/>
+                <w:szCs w:val="18"/>
+              </w:rPr>
+            </w:pPr>
+            <w:r>
+              <w:rPr>
+                <w:rFonts w:ascii="Times New Roman" w:cs="Times New Roman" w:eastAsia="Times New Roman" w:hAnsi="Times New Roman"/>
+                <w:b w:val="false"/>
+                <w:bCs w:val="false"/>
+                <w:sz w:val="18"/>
+                <w:szCs w:val="18"/>
+              </w:rPr>
+              <w:t xml:space="preserve">S1</w:t>
+            </w:r>
+          </w:p>
+        </w:tc>
+        <w:tc>
+          <w:tcPr>
+            <w:tcW w:type="dxa" w:w="980"/>
+            <w:tcBorders>
+              <w:top w:val="single" w:color="808080" w:sz="4"/>
+              <w:left w:val="single" w:color="808080" w:sz="4"/>
+              <w:bottom w:val="single" w:color="808080" w:sz="4"/>
+              <w:right w:val="single" w:color="808080" w:sz="4"/>
+            </w:tcBorders>
+            <w:tcMar>
+              <w:top w:type="dxa" w:w="40"/>
+              <w:left w:type="dxa" w:w="45"/>
+              <w:bottom w:type="dxa" w:w="40"/>
+              <w:right w:type="dxa" w:w="45"/>
+            </w:tcMar>
+            <w:vAlign w:val="center"/>
+          </w:tcPr>
+          <w:p>
+            <w:pPr>
+              <w:keepNext/>
+              <w:spacing w:after="0" w:before="0" w:line="240" w:lineRule="auto"/>
+              <w:jc w:val="center"/>
+              <w:rPr>
+                <w:b w:val="false"/>
+                <w:bCs w:val="false"/>
+                <w:sz w:val="18"/>
+                <w:szCs w:val="18"/>
+              </w:rPr>
+            </w:pPr>
+            <w:r>
+              <w:rPr>
+                <w:rFonts w:ascii="Times New Roman" w:cs="Times New Roman" w:eastAsia="Times New Roman" w:hAnsi="Times New Roman"/>
+                <w:b w:val="false"/>
+                <w:bCs w:val="false"/>
+                <w:sz w:val="18"/>
+                <w:szCs w:val="18"/>
+              </w:rPr>
+              <w:t xml:space="preserve">Scopus</w:t>
+            </w:r>
+          </w:p>
+        </w:tc>
+        <w:tc>
+          <w:tcPr>
+            <w:tcW w:type="dxa" w:w="420"/>
+            <w:tcBorders>
+              <w:top w:val="single" w:color="808080" w:sz="4"/>
+              <w:left w:val="single" w:color="808080" w:sz="4"/>
+              <w:bottom w:val="single" w:color="808080" w:sz="4"/>
+              <w:right w:val="single" w:color="808080" w:sz="4"/>
+            </w:tcBorders>
+            <w:tcMar>
+              <w:top w:type="dxa" w:w="40"/>
+              <w:left w:type="dxa" w:w="45"/>
+              <w:bottom w:type="dxa" w:w="40"/>
+              <w:right w:type="dxa" w:w="45"/>
+            </w:tcMar>
+            <w:vAlign w:val="center"/>
+          </w:tcPr>
+          <w:p>
+            <w:pPr>
+              <w:keepNext/>
+              <w:spacing w:after="0" w:before="0" w:line="240" w:lineRule="auto"/>
+              <w:jc w:val="center"/>
+              <w:rPr>
+                <w:b w:val="false"/>
+                <w:bCs w:val="false"/>
+                <w:sz w:val="18"/>
+                <w:szCs w:val="18"/>
+              </w:rPr>
+            </w:pPr>
+            <w:r>
+              <w:rPr>
+                <w:rFonts w:ascii="Times New Roman" w:cs="Times New Roman" w:eastAsia="Times New Roman" w:hAnsi="Times New Roman"/>
+                <w:b w:val="false"/>
+                <w:bCs w:val="false"/>
+                <w:sz w:val="18"/>
+                <w:szCs w:val="18"/>
+              </w:rPr>
+              <w:t xml:space="preserve">43</w:t>
+            </w:r>
+          </w:p>
+        </w:tc>
+        <w:tc>
+          <w:tcPr>
+            <w:tcW w:type="dxa" w:w="420"/>
+            <w:tcBorders>
+              <w:top w:val="single" w:color="808080" w:sz="4"/>
+              <w:left w:val="single" w:color="808080" w:sz="4"/>
+              <w:bottom w:val="single" w:color="808080" w:sz="4"/>
+              <w:right w:val="single" w:color="808080" w:sz="4"/>
+            </w:tcBorders>
+            <w:tcMar>
+              <w:top w:type="dxa" w:w="40"/>
+              <w:left w:type="dxa" w:w="45"/>
+              <w:bottom w:type="dxa" w:w="40"/>
+              <w:right w:type="dxa" w:w="45"/>
+            </w:tcMar>
+            <w:vAlign w:val="center"/>
+          </w:tcPr>
+          <w:p>
+            <w:pPr>
+              <w:keepNext/>
+              <w:spacing w:after="0" w:before="0" w:line="240" w:lineRule="auto"/>
+              <w:jc w:val="center"/>
+              <w:rPr>
+                <w:b w:val="false"/>
+                <w:bCs w:val="false"/>
+                <w:sz w:val="18"/>
+                <w:szCs w:val="18"/>
+              </w:rPr>
+            </w:pPr>
+            <w:r>
+              <w:rPr>
+                <w:rFonts w:ascii="Times New Roman" w:cs="Times New Roman" w:eastAsia="Times New Roman" w:hAnsi="Times New Roman"/>
+                <w:b w:val="false"/>
+                <w:bCs w:val="false"/>
+                <w:sz w:val="18"/>
+                <w:szCs w:val="18"/>
+              </w:rPr>
+              <w:t xml:space="preserve">9</w:t>
+            </w:r>
+          </w:p>
+        </w:tc>
+        <w:tc>
+          <w:tcPr>
+            <w:tcW w:type="dxa" w:w="2700"/>
+            <w:tcBorders>
+              <w:top w:val="single" w:color="808080" w:sz="4"/>
+              <w:left w:val="single" w:color="808080" w:sz="4"/>
+              <w:bottom w:val="single" w:color="808080" w:sz="4"/>
+              <w:right w:val="single" w:color="808080" w:sz="4"/>
+            </w:tcBorders>
+            <w:tcMar>
+              <w:top w:type="dxa" w:w="40"/>
+              <w:left w:type="dxa" w:w="45"/>
+              <w:bottom w:type="dxa" w:w="40"/>
+              <w:right w:type="dxa" w:w="45"/>
+            </w:tcMar>
+            <w:vAlign w:val="center"/>
+          </w:tcPr>
+          <w:p>
+            <w:pPr>
+              <w:keepNext/>
+              <w:spacing w:after="0" w:before="0" w:line="240" w:lineRule="auto"/>
+              <w:jc w:val="center"/>
+              <w:rPr>
+                <w:b w:val="false"/>
+                <w:bCs w:val="false"/>
+                <w:sz w:val="18"/>
+                <w:szCs w:val="18"/>
+              </w:rPr>
+            </w:pPr>
+            <w:r>
+              <w:rPr>
+                <w:rFonts w:ascii="Times New Roman" w:cs="Times New Roman" w:eastAsia="Times New Roman" w:hAnsi="Times New Roman"/>
+                <w:b w:val="false"/>
+                <w:bCs w:val="false"/>
+                <w:sz w:val="18"/>
+                <w:szCs w:val="18"/>
+              </w:rPr>
+              <w:t xml:space="preserve">TITLE-ABS-KEY(("social grant*" OR "social assistance" OR "cash transfer*" OR "social protection") AND (exclusion OR "non-take-up" OR "take-up" OR "coverage gap*" OR "targeting error*" OR "access barrier*") AND ("South Africa*" OR "KwaZulu-Natal"))</w:t>
+            </w:r>
+          </w:p>
+        </w:tc>
+      </w:tr>
+      <w:tr>
+        <w:trPr>
+          <w:cantSplit/>
+          <w:tblHeader w:val="false"/>
+        </w:trPr>
+        <w:tc>
+          <w:tcPr>
+            <w:tcW w:type="dxa" w:w="520"/>
+            <w:tcBorders>
+              <w:top w:val="single" w:color="808080" w:sz="4"/>
+              <w:left w:val="single" w:color="808080" w:sz="4"/>
+              <w:bottom w:val="single" w:color="808080" w:sz="4"/>
+              <w:right w:val="single" w:color="808080" w:sz="4"/>
+            </w:tcBorders>
+            <w:tcMar>
+              <w:top w:type="dxa" w:w="40"/>
+              <w:left w:type="dxa" w:w="45"/>
+              <w:bottom w:type="dxa" w:w="40"/>
+              <w:right w:type="dxa" w:w="45"/>
+            </w:tcMar>
+            <w:vAlign w:val="center"/>
+          </w:tcPr>
+          <w:p>
+            <w:pPr>
+              <w:keepNext/>
+              <w:spacing w:after="0" w:before="0" w:line="240" w:lineRule="auto"/>
+              <w:jc w:val="left"/>
+              <w:rPr>
+                <w:b w:val="false"/>
+                <w:bCs w:val="false"/>
+                <w:sz w:val="18"/>
+                <w:szCs w:val="18"/>
+              </w:rPr>
+            </w:pPr>
+            <w:r>
+              <w:rPr>
+                <w:rFonts w:ascii="Times New Roman" w:cs="Times New Roman" w:eastAsia="Times New Roman" w:hAnsi="Times New Roman"/>
+                <w:b w:val="false"/>
+                <w:bCs w:val="false"/>
+                <w:sz w:val="18"/>
+                <w:szCs w:val="18"/>
+              </w:rPr>
+              <w:t xml:space="preserve">S1b</w:t>
+            </w:r>
+          </w:p>
+        </w:tc>
+        <w:tc>
+          <w:tcPr>
+            <w:tcW w:type="dxa" w:w="980"/>
+            <w:tcBorders>
+              <w:top w:val="single" w:color="808080" w:sz="4"/>
+              <w:left w:val="single" w:color="808080" w:sz="4"/>
+              <w:bottom w:val="single" w:color="808080" w:sz="4"/>
+              <w:right w:val="single" w:color="808080" w:sz="4"/>
+            </w:tcBorders>
+            <w:tcMar>
+              <w:top w:type="dxa" w:w="40"/>
+              <w:left w:type="dxa" w:w="45"/>
+              <w:bottom w:type="dxa" w:w="40"/>
+              <w:right w:type="dxa" w:w="45"/>
+            </w:tcMar>
+            <w:vAlign w:val="center"/>
+          </w:tcPr>
+          <w:p>
+            <w:pPr>
+              <w:keepNext/>
+              <w:spacing w:after="0" w:before="0" w:line="240" w:lineRule="auto"/>
+              <w:jc w:val="center"/>
+              <w:rPr>
+                <w:b w:val="false"/>
+                <w:bCs w:val="false"/>
+                <w:sz w:val="18"/>
+                <w:szCs w:val="18"/>
+              </w:rPr>
+            </w:pPr>
+            <w:r>
+              <w:rPr>
+                <w:rFonts w:ascii="Times New Roman" w:cs="Times New Roman" w:eastAsia="Times New Roman" w:hAnsi="Times New Roman"/>
+                <w:b w:val="false"/>
+                <w:bCs w:val="false"/>
+                <w:sz w:val="18"/>
+                <w:szCs w:val="18"/>
+              </w:rPr>
+              <w:t xml:space="preserve">Scopus, widened</w:t>
+            </w:r>
+          </w:p>
+        </w:tc>
+        <w:tc>
+          <w:tcPr>
+            <w:tcW w:type="dxa" w:w="420"/>
+            <w:tcBorders>
+              <w:top w:val="single" w:color="808080" w:sz="4"/>
+              <w:left w:val="single" w:color="808080" w:sz="4"/>
+              <w:bottom w:val="single" w:color="808080" w:sz="4"/>
+              <w:right w:val="single" w:color="808080" w:sz="4"/>
+            </w:tcBorders>
+            <w:tcMar>
+              <w:top w:type="dxa" w:w="40"/>
+              <w:left w:type="dxa" w:w="45"/>
+              <w:bottom w:type="dxa" w:w="40"/>
+              <w:right w:type="dxa" w:w="45"/>
+            </w:tcMar>
+            <w:vAlign w:val="center"/>
+          </w:tcPr>
+          <w:p>
+            <w:pPr>
+              <w:keepNext/>
+              <w:spacing w:after="0" w:before="0" w:line="240" w:lineRule="auto"/>
+              <w:jc w:val="center"/>
+              <w:rPr>
+                <w:b w:val="false"/>
+                <w:bCs w:val="false"/>
+                <w:sz w:val="18"/>
+                <w:szCs w:val="18"/>
+              </w:rPr>
+            </w:pPr>
+            <w:r>
+              <w:rPr>
+                <w:rFonts w:ascii="Times New Roman" w:cs="Times New Roman" w:eastAsia="Times New Roman" w:hAnsi="Times New Roman"/>
+                <w:b w:val="false"/>
+                <w:bCs w:val="false"/>
+                <w:sz w:val="18"/>
+                <w:szCs w:val="18"/>
+              </w:rPr>
+              <w:t xml:space="preserve">149</w:t>
+            </w:r>
+          </w:p>
+        </w:tc>
+        <w:tc>
+          <w:tcPr>
+            <w:tcW w:type="dxa" w:w="420"/>
+            <w:tcBorders>
+              <w:top w:val="single" w:color="808080" w:sz="4"/>
+              <w:left w:val="single" w:color="808080" w:sz="4"/>
+              <w:bottom w:val="single" w:color="808080" w:sz="4"/>
+              <w:right w:val="single" w:color="808080" w:sz="4"/>
+            </w:tcBorders>
+            <w:tcMar>
+              <w:top w:type="dxa" w:w="40"/>
+              <w:left w:type="dxa" w:w="45"/>
+              <w:bottom w:type="dxa" w:w="40"/>
+              <w:right w:type="dxa" w:w="45"/>
+            </w:tcMar>
+            <w:vAlign w:val="center"/>
+          </w:tcPr>
+          <w:p>
+            <w:pPr>
+              <w:keepNext/>
+              <w:spacing w:after="0" w:before="0" w:line="240" w:lineRule="auto"/>
+              <w:jc w:val="center"/>
+              <w:rPr>
+                <w:b w:val="false"/>
+                <w:bCs w:val="false"/>
+                <w:sz w:val="18"/>
+                <w:szCs w:val="18"/>
+              </w:rPr>
+            </w:pPr>
+            <w:r>
+              <w:rPr>
+                <w:rFonts w:ascii="Times New Roman" w:cs="Times New Roman" w:eastAsia="Times New Roman" w:hAnsi="Times New Roman"/>
+                <w:b w:val="false"/>
+                <w:bCs w:val="false"/>
+                <w:sz w:val="18"/>
+                <w:szCs w:val="18"/>
+              </w:rPr>
+              <w:t xml:space="preserve">10</w:t>
+            </w:r>
+          </w:p>
+        </w:tc>
+        <w:tc>
+          <w:tcPr>
+            <w:tcW w:type="dxa" w:w="2700"/>
+            <w:tcBorders>
+              <w:top w:val="single" w:color="808080" w:sz="4"/>
+              <w:left w:val="single" w:color="808080" w:sz="4"/>
+              <w:bottom w:val="single" w:color="808080" w:sz="4"/>
+              <w:right w:val="single" w:color="808080" w:sz="4"/>
+            </w:tcBorders>
+            <w:tcMar>
+              <w:top w:type="dxa" w:w="40"/>
+              <w:left w:type="dxa" w:w="45"/>
+              <w:bottom w:type="dxa" w:w="40"/>
+              <w:right w:type="dxa" w:w="45"/>
+            </w:tcMar>
+            <w:vAlign w:val="center"/>
+          </w:tcPr>
+          <w:p>
+            <w:pPr>
+              <w:keepNext/>
+              <w:spacing w:after="0" w:before="0" w:line="240" w:lineRule="auto"/>
+              <w:jc w:val="center"/>
+              <w:rPr>
+                <w:b w:val="false"/>
+                <w:bCs w:val="false"/>
+                <w:sz w:val="18"/>
+                <w:szCs w:val="18"/>
+              </w:rPr>
+            </w:pPr>
+            <w:r>
+              <w:rPr>
+                <w:rFonts w:ascii="Times New Roman" w:cs="Times New Roman" w:eastAsia="Times New Roman" w:hAnsi="Times New Roman"/>
+                <w:b w:val="false"/>
+                <w:bCs w:val="false"/>
+                <w:sz w:val="18"/>
+                <w:szCs w:val="18"/>
+              </w:rPr>
+              <w:t xml:space="preserve">TITLE-ABS-KEY(("social grant*" OR "social assistance" OR "cash transfer*" OR "social protection" OR "social security" OR SASSA OR "child support grant" OR "social relief of distress" OR SRD) AND (exclusion OR exclud* OR "non-take-up" OR "take-up" OR uptake OR "coverage gap*" OR "targeting error*" OR "access barrier*" OR "non-receipt" OR eligib*) AND ("South Africa*" OR "KwaZulu-Natal"))</w:t>
+            </w:r>
+          </w:p>
+        </w:tc>
+      </w:tr>
+      <w:tr>
+        <w:trPr>
+          <w:cantSplit/>
+          <w:tblHeader w:val="false"/>
+        </w:trPr>
+        <w:tc>
+          <w:tcPr>
+            <w:tcW w:type="dxa" w:w="520"/>
+            <w:tcBorders>
+              <w:top w:val="single" w:color="808080" w:sz="4"/>
+              <w:left w:val="single" w:color="808080" w:sz="4"/>
+              <w:bottom w:val="single" w:color="808080" w:sz="4"/>
+              <w:right w:val="single" w:color="808080" w:sz="4"/>
+            </w:tcBorders>
+            <w:tcMar>
+              <w:top w:type="dxa" w:w="40"/>
+              <w:left w:type="dxa" w:w="45"/>
+              <w:bottom w:type="dxa" w:w="40"/>
+              <w:right w:type="dxa" w:w="45"/>
+            </w:tcMar>
+            <w:vAlign w:val="center"/>
+          </w:tcPr>
+          <w:p>
+            <w:pPr>
+              <w:keepNext/>
+              <w:spacing w:after="0" w:before="0" w:line="240" w:lineRule="auto"/>
+              <w:jc w:val="left"/>
+              <w:rPr>
+                <w:b w:val="false"/>
+                <w:bCs w:val="false"/>
+                <w:sz w:val="18"/>
+                <w:szCs w:val="18"/>
+              </w:rPr>
+            </w:pPr>
+            <w:r>
+              <w:rPr>
+                <w:rFonts w:ascii="Times New Roman" w:cs="Times New Roman" w:eastAsia="Times New Roman" w:hAnsi="Times New Roman"/>
+                <w:b w:val="false"/>
+                <w:bCs w:val="false"/>
+                <w:sz w:val="18"/>
+                <w:szCs w:val="18"/>
+              </w:rPr>
+              <w:t xml:space="preserve">S2</w:t>
+            </w:r>
+          </w:p>
+        </w:tc>
+        <w:tc>
+          <w:tcPr>
+            <w:tcW w:type="dxa" w:w="980"/>
+            <w:tcBorders>
+              <w:top w:val="single" w:color="808080" w:sz="4"/>
+              <w:left w:val="single" w:color="808080" w:sz="4"/>
+              <w:bottom w:val="single" w:color="808080" w:sz="4"/>
+              <w:right w:val="single" w:color="808080" w:sz="4"/>
+            </w:tcBorders>
+            <w:tcMar>
+              <w:top w:type="dxa" w:w="40"/>
+              <w:left w:type="dxa" w:w="45"/>
+              <w:bottom w:type="dxa" w:w="40"/>
+              <w:right w:type="dxa" w:w="45"/>
+            </w:tcMar>
+            <w:vAlign w:val="center"/>
+          </w:tcPr>
+          <w:p>
+            <w:pPr>
+              <w:keepNext/>
+              <w:spacing w:after="0" w:before="0" w:line="240" w:lineRule="auto"/>
+              <w:jc w:val="center"/>
+              <w:rPr>
+                <w:b w:val="false"/>
+                <w:bCs w:val="false"/>
+                <w:sz w:val="18"/>
+                <w:szCs w:val="18"/>
+              </w:rPr>
+            </w:pPr>
+            <w:r>
+              <w:rPr>
+                <w:rFonts w:ascii="Times New Roman" w:cs="Times New Roman" w:eastAsia="Times New Roman" w:hAnsi="Times New Roman"/>
+                <w:b w:val="false"/>
+                <w:bCs w:val="false"/>
+                <w:sz w:val="18"/>
+                <w:szCs w:val="18"/>
+              </w:rPr>
+              <w:t xml:space="preserve">Scopus, method</w:t>
+            </w:r>
+          </w:p>
+        </w:tc>
+        <w:tc>
+          <w:tcPr>
+            <w:tcW w:type="dxa" w:w="420"/>
+            <w:tcBorders>
+              <w:top w:val="single" w:color="808080" w:sz="4"/>
+              <w:left w:val="single" w:color="808080" w:sz="4"/>
+              <w:bottom w:val="single" w:color="808080" w:sz="4"/>
+              <w:right w:val="single" w:color="808080" w:sz="4"/>
+            </w:tcBorders>
+            <w:tcMar>
+              <w:top w:type="dxa" w:w="40"/>
+              <w:left w:type="dxa" w:w="45"/>
+              <w:bottom w:type="dxa" w:w="40"/>
+              <w:right w:type="dxa" w:w="45"/>
+            </w:tcMar>
+            <w:vAlign w:val="center"/>
+          </w:tcPr>
+          <w:p>
+            <w:pPr>
+              <w:keepNext/>
+              <w:spacing w:after="0" w:before="0" w:line="240" w:lineRule="auto"/>
+              <w:jc w:val="center"/>
+              <w:rPr>
+                <w:b w:val="false"/>
+                <w:bCs w:val="false"/>
+                <w:sz w:val="18"/>
+                <w:szCs w:val="18"/>
+              </w:rPr>
+            </w:pPr>
+            <w:r>
+              <w:rPr>
+                <w:rFonts w:ascii="Times New Roman" w:cs="Times New Roman" w:eastAsia="Times New Roman" w:hAnsi="Times New Roman"/>
+                <w:b w:val="false"/>
+                <w:bCs w:val="false"/>
+                <w:sz w:val="18"/>
+                <w:szCs w:val="18"/>
+              </w:rPr>
+              <w:t xml:space="preserve">100</w:t>
+            </w:r>
+          </w:p>
+        </w:tc>
+        <w:tc>
+          <w:tcPr>
+            <w:tcW w:type="dxa" w:w="420"/>
+            <w:tcBorders>
+              <w:top w:val="single" w:color="808080" w:sz="4"/>
+              <w:left w:val="single" w:color="808080" w:sz="4"/>
+              <w:bottom w:val="single" w:color="808080" w:sz="4"/>
+              <w:right w:val="single" w:color="808080" w:sz="4"/>
+            </w:tcBorders>
+            <w:tcMar>
+              <w:top w:type="dxa" w:w="40"/>
+              <w:left w:type="dxa" w:w="45"/>
+              <w:bottom w:type="dxa" w:w="40"/>
+              <w:right w:type="dxa" w:w="45"/>
+            </w:tcMar>
+            <w:vAlign w:val="center"/>
+          </w:tcPr>
+          <w:p>
+            <w:pPr>
+              <w:keepNext/>
+              <w:spacing w:after="0" w:before="0" w:line="240" w:lineRule="auto"/>
+              <w:jc w:val="center"/>
+              <w:rPr>
+                <w:b w:val="false"/>
+                <w:bCs w:val="false"/>
+                <w:sz w:val="18"/>
+                <w:szCs w:val="18"/>
+              </w:rPr>
+            </w:pPr>
+            <w:r>
+              <w:rPr>
+                <w:rFonts w:ascii="Times New Roman" w:cs="Times New Roman" w:eastAsia="Times New Roman" w:hAnsi="Times New Roman"/>
+                <w:b w:val="false"/>
+                <w:bCs w:val="false"/>
+                <w:sz w:val="18"/>
+                <w:szCs w:val="18"/>
+              </w:rPr>
+              <w:t xml:space="preserve">11</w:t>
+            </w:r>
+          </w:p>
+        </w:tc>
+        <w:tc>
+          <w:tcPr>
+            <w:tcW w:type="dxa" w:w="2700"/>
+            <w:tcBorders>
+              <w:top w:val="single" w:color="808080" w:sz="4"/>
+              <w:left w:val="single" w:color="808080" w:sz="4"/>
+              <w:bottom w:val="single" w:color="808080" w:sz="4"/>
+              <w:right w:val="single" w:color="808080" w:sz="4"/>
+            </w:tcBorders>
+            <w:tcMar>
+              <w:top w:type="dxa" w:w="40"/>
+              <w:left w:type="dxa" w:w="45"/>
+              <w:bottom w:type="dxa" w:w="40"/>
+              <w:right w:type="dxa" w:w="45"/>
+            </w:tcMar>
+            <w:vAlign w:val="center"/>
+          </w:tcPr>
+          <w:p>
+            <w:pPr>
+              <w:keepNext/>
+              <w:spacing w:after="0" w:before="0" w:line="240" w:lineRule="auto"/>
+              <w:jc w:val="center"/>
+              <w:rPr>
+                <w:b w:val="false"/>
+                <w:bCs w:val="false"/>
+                <w:sz w:val="18"/>
+                <w:szCs w:val="18"/>
+              </w:rPr>
+            </w:pPr>
+            <w:r>
+              <w:rPr>
+                <w:rFonts w:ascii="Times New Roman" w:cs="Times New Roman" w:eastAsia="Times New Roman" w:hAnsi="Times New Roman"/>
+                <w:b w:val="false"/>
+                <w:bCs w:val="false"/>
+                <w:sz w:val="18"/>
+                <w:szCs w:val="18"/>
+              </w:rPr>
+              <w:t xml:space="preserve">TITLE-ABS-KEY(("machine learning" OR "random forest" OR XGBoost OR "gradient boosting" OR "proxy means test*" OR "predictive model*") AND (poverty OR "social protection" OR "social assistance" OR "cash transfer*" OR "food insecur*") AND ("household survey" OR "survey data" OR "household data")) AND NOT TITLE-ABS-KEY(cancer OR tumour OR HIV OR malaria OR clinical OR patient*)</w:t>
+            </w:r>
+          </w:p>
+        </w:tc>
+      </w:tr>
+      <w:tr>
+        <w:trPr>
+          <w:cantSplit/>
+          <w:tblHeader w:val="false"/>
+        </w:trPr>
+        <w:tc>
+          <w:tcPr>
+            <w:tcW w:type="dxa" w:w="520"/>
+            <w:tcBorders>
+              <w:top w:val="single" w:color="808080" w:sz="4"/>
+              <w:left w:val="single" w:color="808080" w:sz="4"/>
+              <w:bottom w:val="single" w:color="808080" w:sz="4"/>
+              <w:right w:val="single" w:color="808080" w:sz="4"/>
+            </w:tcBorders>
+            <w:tcMar>
+              <w:top w:type="dxa" w:w="40"/>
+              <w:left w:type="dxa" w:w="45"/>
+              <w:bottom w:type="dxa" w:w="40"/>
+              <w:right w:type="dxa" w:w="45"/>
+            </w:tcMar>
+            <w:vAlign w:val="center"/>
+          </w:tcPr>
+          <w:p>
+            <w:pPr>
+              <w:keepNext/>
+              <w:spacing w:after="0" w:before="0" w:line="240" w:lineRule="auto"/>
+              <w:jc w:val="left"/>
+              <w:rPr>
+                <w:b w:val="false"/>
+                <w:bCs w:val="false"/>
+                <w:sz w:val="18"/>
+                <w:szCs w:val="18"/>
+              </w:rPr>
+            </w:pPr>
+            <w:r>
+              <w:rPr>
+                <w:rFonts w:ascii="Times New Roman" w:cs="Times New Roman" w:eastAsia="Times New Roman" w:hAnsi="Times New Roman"/>
+                <w:b w:val="false"/>
+                <w:bCs w:val="false"/>
+                <w:sz w:val="18"/>
+                <w:szCs w:val="18"/>
+              </w:rPr>
+              <w:t xml:space="preserve">S3</w:t>
+            </w:r>
+          </w:p>
+        </w:tc>
+        <w:tc>
+          <w:tcPr>
+            <w:tcW w:type="dxa" w:w="980"/>
+            <w:tcBorders>
+              <w:top w:val="single" w:color="808080" w:sz="4"/>
+              <w:left w:val="single" w:color="808080" w:sz="4"/>
+              <w:bottom w:val="single" w:color="808080" w:sz="4"/>
+              <w:right w:val="single" w:color="808080" w:sz="4"/>
+            </w:tcBorders>
+            <w:tcMar>
+              <w:top w:type="dxa" w:w="40"/>
+              <w:left w:type="dxa" w:w="45"/>
+              <w:bottom w:type="dxa" w:w="40"/>
+              <w:right w:type="dxa" w:w="45"/>
+            </w:tcMar>
+            <w:vAlign w:val="center"/>
+          </w:tcPr>
+          <w:p>
+            <w:pPr>
+              <w:keepNext/>
+              <w:spacing w:after="0" w:before="0" w:line="240" w:lineRule="auto"/>
+              <w:jc w:val="center"/>
+              <w:rPr>
+                <w:b w:val="false"/>
+                <w:bCs w:val="false"/>
+                <w:sz w:val="18"/>
+                <w:szCs w:val="18"/>
+              </w:rPr>
+            </w:pPr>
+            <w:r>
+              <w:rPr>
+                <w:rFonts w:ascii="Times New Roman" w:cs="Times New Roman" w:eastAsia="Times New Roman" w:hAnsi="Times New Roman"/>
+                <w:b w:val="false"/>
+                <w:bCs w:val="false"/>
+                <w:sz w:val="18"/>
+                <w:szCs w:val="18"/>
+              </w:rPr>
+              <w:t xml:space="preserve">Dimensions</w:t>
+            </w:r>
+          </w:p>
+        </w:tc>
+        <w:tc>
+          <w:tcPr>
+            <w:tcW w:type="dxa" w:w="420"/>
+            <w:tcBorders>
+              <w:top w:val="single" w:color="808080" w:sz="4"/>
+              <w:left w:val="single" w:color="808080" w:sz="4"/>
+              <w:bottom w:val="single" w:color="808080" w:sz="4"/>
+              <w:right w:val="single" w:color="808080" w:sz="4"/>
+            </w:tcBorders>
+            <w:tcMar>
+              <w:top w:type="dxa" w:w="40"/>
+              <w:left w:type="dxa" w:w="45"/>
+              <w:bottom w:type="dxa" w:w="40"/>
+              <w:right w:type="dxa" w:w="45"/>
+            </w:tcMar>
+            <w:vAlign w:val="center"/>
+          </w:tcPr>
+          <w:p>
+            <w:pPr>
+              <w:keepNext/>
+              <w:spacing w:after="0" w:before="0" w:line="240" w:lineRule="auto"/>
+              <w:jc w:val="center"/>
+              <w:rPr>
+                <w:b w:val="false"/>
+                <w:bCs w:val="false"/>
+                <w:sz w:val="18"/>
+                <w:szCs w:val="18"/>
+              </w:rPr>
+            </w:pPr>
+            <w:r>
+              <w:rPr>
+                <w:rFonts w:ascii="Times New Roman" w:cs="Times New Roman" w:eastAsia="Times New Roman" w:hAnsi="Times New Roman"/>
+                <w:b w:val="false"/>
+                <w:bCs w:val="false"/>
+                <w:sz w:val="18"/>
+                <w:szCs w:val="18"/>
+              </w:rPr>
+              <w:t xml:space="preserve">36</w:t>
+            </w:r>
+          </w:p>
+        </w:tc>
+        <w:tc>
+          <w:tcPr>
+            <w:tcW w:type="dxa" w:w="420"/>
+            <w:tcBorders>
+              <w:top w:val="single" w:color="808080" w:sz="4"/>
+              <w:left w:val="single" w:color="808080" w:sz="4"/>
+              <w:bottom w:val="single" w:color="808080" w:sz="4"/>
+              <w:right w:val="single" w:color="808080" w:sz="4"/>
+            </w:tcBorders>
+            <w:tcMar>
+              <w:top w:type="dxa" w:w="40"/>
+              <w:left w:type="dxa" w:w="45"/>
+              <w:bottom w:type="dxa" w:w="40"/>
+              <w:right w:type="dxa" w:w="45"/>
+            </w:tcMar>
+            <w:vAlign w:val="center"/>
+          </w:tcPr>
+          <w:p>
+            <w:pPr>
+              <w:keepNext/>
+              <w:spacing w:after="0" w:before="0" w:line="240" w:lineRule="auto"/>
+              <w:jc w:val="center"/>
+              <w:rPr>
+                <w:b w:val="false"/>
+                <w:bCs w:val="false"/>
+                <w:sz w:val="18"/>
+                <w:szCs w:val="18"/>
+              </w:rPr>
+            </w:pPr>
+            <w:r>
+              <w:rPr>
+                <w:rFonts w:ascii="Times New Roman" w:cs="Times New Roman" w:eastAsia="Times New Roman" w:hAnsi="Times New Roman"/>
+                <w:b w:val="false"/>
+                <w:bCs w:val="false"/>
+                <w:sz w:val="18"/>
+                <w:szCs w:val="18"/>
+              </w:rPr>
+              <w:t xml:space="preserve">5</w:t>
+            </w:r>
+          </w:p>
+        </w:tc>
+        <w:tc>
+          <w:tcPr>
+            <w:tcW w:type="dxa" w:w="2700"/>
+            <w:tcBorders>
+              <w:top w:val="single" w:color="808080" w:sz="4"/>
+              <w:left w:val="single" w:color="808080" w:sz="4"/>
+              <w:bottom w:val="single" w:color="808080" w:sz="4"/>
+              <w:right w:val="single" w:color="808080" w:sz="4"/>
+            </w:tcBorders>
+            <w:tcMar>
+              <w:top w:type="dxa" w:w="40"/>
+              <w:left w:type="dxa" w:w="45"/>
+              <w:bottom w:type="dxa" w:w="40"/>
+              <w:right w:type="dxa" w:w="45"/>
+            </w:tcMar>
+            <w:vAlign w:val="center"/>
+          </w:tcPr>
+          <w:p>
+            <w:pPr>
+              <w:keepNext/>
+              <w:spacing w:after="0" w:before="0" w:line="240" w:lineRule="auto"/>
+              <w:jc w:val="center"/>
+              <w:rPr>
+                <w:b w:val="false"/>
+                <w:bCs w:val="false"/>
+                <w:sz w:val="18"/>
+                <w:szCs w:val="18"/>
+              </w:rPr>
+            </w:pPr>
+            <w:r>
+              <w:rPr>
+                <w:rFonts w:ascii="Times New Roman" w:cs="Times New Roman" w:eastAsia="Times New Roman" w:hAnsi="Times New Roman"/>
+                <w:b w:val="false"/>
+                <w:bCs w:val="false"/>
+                <w:sz w:val="18"/>
+                <w:szCs w:val="18"/>
+              </w:rPr>
+              <w:t xml:space="preserve">("social grant" OR "social assistance" OR "cash transfer" OR "social protection") AND (exclusion OR "take-up" OR "non-receipt" OR "access barriers") AND ("South Africa" OR "KwaZulu-Natal")</w:t>
+            </w:r>
+          </w:p>
+        </w:tc>
+      </w:tr>
+      <w:tr>
+        <w:trPr>
+          <w:cantSplit/>
+          <w:tblHeader w:val="false"/>
+        </w:trPr>
+        <w:tc>
+          <w:tcPr>
+            <w:tcW w:type="dxa" w:w="520"/>
+            <w:tcBorders>
+              <w:top w:val="single" w:color="808080" w:sz="4"/>
+              <w:left w:val="single" w:color="808080" w:sz="4"/>
+              <w:bottom w:val="single" w:color="808080" w:sz="4"/>
+              <w:right w:val="single" w:color="808080" w:sz="4"/>
+            </w:tcBorders>
+            <w:tcMar>
+              <w:top w:type="dxa" w:w="40"/>
+              <w:left w:type="dxa" w:w="45"/>
+              <w:bottom w:type="dxa" w:w="40"/>
+              <w:right w:type="dxa" w:w="45"/>
+            </w:tcMar>
+            <w:vAlign w:val="center"/>
+          </w:tcPr>
+          <w:p>
+            <w:pPr>
+              <w:keepNext/>
+              <w:spacing w:after="0" w:before="0" w:line="240" w:lineRule="auto"/>
+              <w:jc w:val="left"/>
+              <w:rPr>
+                <w:b w:val="false"/>
+                <w:bCs w:val="false"/>
+                <w:sz w:val="18"/>
+                <w:szCs w:val="18"/>
+              </w:rPr>
+            </w:pPr>
+            <w:r>
+              <w:rPr>
+                <w:rFonts w:ascii="Times New Roman" w:cs="Times New Roman" w:eastAsia="Times New Roman" w:hAnsi="Times New Roman"/>
+                <w:b w:val="false"/>
+                <w:bCs w:val="false"/>
+                <w:sz w:val="18"/>
+                <w:szCs w:val="18"/>
+              </w:rPr>
+              <w:t xml:space="preserve">S4</w:t>
+            </w:r>
+          </w:p>
+        </w:tc>
+        <w:tc>
+          <w:tcPr>
+            <w:tcW w:type="dxa" w:w="980"/>
+            <w:tcBorders>
+              <w:top w:val="single" w:color="808080" w:sz="4"/>
+              <w:left w:val="single" w:color="808080" w:sz="4"/>
+              <w:bottom w:val="single" w:color="808080" w:sz="4"/>
+              <w:right w:val="single" w:color="808080" w:sz="4"/>
+            </w:tcBorders>
+            <w:tcMar>
+              <w:top w:type="dxa" w:w="40"/>
+              <w:left w:type="dxa" w:w="45"/>
+              <w:bottom w:type="dxa" w:w="40"/>
+              <w:right w:type="dxa" w:w="45"/>
+            </w:tcMar>
+            <w:vAlign w:val="center"/>
+          </w:tcPr>
+          <w:p>
+            <w:pPr>
+              <w:keepNext/>
+              <w:spacing w:after="0" w:before="0" w:line="240" w:lineRule="auto"/>
+              <w:jc w:val="center"/>
+              <w:rPr>
+                <w:b w:val="false"/>
+                <w:bCs w:val="false"/>
+                <w:sz w:val="18"/>
+                <w:szCs w:val="18"/>
+              </w:rPr>
+            </w:pPr>
+            <w:r>
+              <w:rPr>
+                <w:rFonts w:ascii="Times New Roman" w:cs="Times New Roman" w:eastAsia="Times New Roman" w:hAnsi="Times New Roman"/>
+                <w:b w:val="false"/>
+                <w:bCs w:val="false"/>
+                <w:sz w:val="18"/>
+                <w:szCs w:val="18"/>
+              </w:rPr>
+              <w:t xml:space="preserve">IEEE Xplore</w:t>
+            </w:r>
+          </w:p>
+        </w:tc>
+        <w:tc>
+          <w:tcPr>
+            <w:tcW w:type="dxa" w:w="420"/>
+            <w:tcBorders>
+              <w:top w:val="single" w:color="808080" w:sz="4"/>
+              <w:left w:val="single" w:color="808080" w:sz="4"/>
+              <w:bottom w:val="single" w:color="808080" w:sz="4"/>
+              <w:right w:val="single" w:color="808080" w:sz="4"/>
+            </w:tcBorders>
+            <w:tcMar>
+              <w:top w:type="dxa" w:w="40"/>
+              <w:left w:type="dxa" w:w="45"/>
+              <w:bottom w:type="dxa" w:w="40"/>
+              <w:right w:type="dxa" w:w="45"/>
+            </w:tcMar>
+            <w:vAlign w:val="center"/>
+          </w:tcPr>
+          <w:p>
+            <w:pPr>
+              <w:keepNext/>
+              <w:spacing w:after="0" w:before="0" w:line="240" w:lineRule="auto"/>
+              <w:jc w:val="center"/>
+              <w:rPr>
+                <w:b w:val="false"/>
+                <w:bCs w:val="false"/>
+                <w:sz w:val="18"/>
+                <w:szCs w:val="18"/>
+              </w:rPr>
+            </w:pPr>
+            <w:r>
+              <w:rPr>
+                <w:rFonts w:ascii="Times New Roman" w:cs="Times New Roman" w:eastAsia="Times New Roman" w:hAnsi="Times New Roman"/>
+                <w:b w:val="false"/>
+                <w:bCs w:val="false"/>
+                <w:sz w:val="18"/>
+                <w:szCs w:val="18"/>
+              </w:rPr>
+              <w:t xml:space="preserve">47</w:t>
+            </w:r>
+          </w:p>
+        </w:tc>
+        <w:tc>
+          <w:tcPr>
+            <w:tcW w:type="dxa" w:w="420"/>
+            <w:tcBorders>
+              <w:top w:val="single" w:color="808080" w:sz="4"/>
+              <w:left w:val="single" w:color="808080" w:sz="4"/>
+              <w:bottom w:val="single" w:color="808080" w:sz="4"/>
+              <w:right w:val="single" w:color="808080" w:sz="4"/>
+            </w:tcBorders>
+            <w:tcMar>
+              <w:top w:type="dxa" w:w="40"/>
+              <w:left w:type="dxa" w:w="45"/>
+              <w:bottom w:type="dxa" w:w="40"/>
+              <w:right w:type="dxa" w:w="45"/>
+            </w:tcMar>
+            <w:vAlign w:val="center"/>
+          </w:tcPr>
+          <w:p>
+            <w:pPr>
+              <w:keepNext/>
+              <w:spacing w:after="0" w:before="0" w:line="240" w:lineRule="auto"/>
+              <w:jc w:val="center"/>
+              <w:rPr>
+                <w:b w:val="false"/>
+                <w:bCs w:val="false"/>
+                <w:sz w:val="18"/>
+                <w:szCs w:val="18"/>
+              </w:rPr>
+            </w:pPr>
+            <w:r>
+              <w:rPr>
+                <w:rFonts w:ascii="Times New Roman" w:cs="Times New Roman" w:eastAsia="Times New Roman" w:hAnsi="Times New Roman"/>
+                <w:b w:val="false"/>
+                <w:bCs w:val="false"/>
+                <w:sz w:val="18"/>
+                <w:szCs w:val="18"/>
+              </w:rPr>
+              <w:t xml:space="preserve">0</w:t>
+            </w:r>
+          </w:p>
+        </w:tc>
+        <w:tc>
+          <w:tcPr>
+            <w:tcW w:type="dxa" w:w="2700"/>
+            <w:tcBorders>
+              <w:top w:val="single" w:color="808080" w:sz="4"/>
+              <w:left w:val="single" w:color="808080" w:sz="4"/>
+              <w:bottom w:val="single" w:color="808080" w:sz="4"/>
+              <w:right w:val="single" w:color="808080" w:sz="4"/>
+            </w:tcBorders>
+            <w:tcMar>
+              <w:top w:type="dxa" w:w="40"/>
+              <w:left w:type="dxa" w:w="45"/>
+              <w:bottom w:type="dxa" w:w="40"/>
+              <w:right w:type="dxa" w:w="45"/>
+            </w:tcMar>
+            <w:vAlign w:val="center"/>
+          </w:tcPr>
+          <w:p>
+            <w:pPr>
+              <w:keepNext/>
+              <w:spacing w:after="0" w:before="0" w:line="240" w:lineRule="auto"/>
+              <w:jc w:val="center"/>
+              <w:rPr>
+                <w:b w:val="false"/>
+                <w:bCs w:val="false"/>
+                <w:sz w:val="18"/>
+                <w:szCs w:val="18"/>
+              </w:rPr>
+            </w:pPr>
+            <w:r>
+              <w:rPr>
+                <w:rFonts w:ascii="Times New Roman" w:cs="Times New Roman" w:eastAsia="Times New Roman" w:hAnsi="Times New Roman"/>
+                <w:b w:val="false"/>
+                <w:bCs w:val="false"/>
+                <w:sz w:val="18"/>
+                <w:szCs w:val="18"/>
+              </w:rPr>
+              <w:t xml:space="preserve">("machine learning" OR "classification") AND ("poverty" OR "social welfare" OR "socioeconomic") AND ("survey data")</w:t>
+            </w:r>
+          </w:p>
+        </w:tc>
+      </w:tr>
+      <w:tr>
+        <w:trPr>
+          <w:cantSplit/>
+          <w:tblHeader w:val="false"/>
+        </w:trPr>
+        <w:tc>
+          <w:tcPr>
+            <w:tcW w:type="dxa" w:w="520"/>
+            <w:tcBorders>
+              <w:top w:val="single" w:color="808080" w:sz="4"/>
+              <w:left w:val="single" w:color="808080" w:sz="4"/>
+              <w:bottom w:val="single" w:color="808080" w:sz="4"/>
+              <w:right w:val="single" w:color="808080" w:sz="4"/>
+            </w:tcBorders>
+            <w:tcMar>
+              <w:top w:type="dxa" w:w="40"/>
+              <w:left w:type="dxa" w:w="45"/>
+              <w:bottom w:type="dxa" w:w="40"/>
+              <w:right w:type="dxa" w:w="45"/>
+            </w:tcMar>
+            <w:vAlign w:val="center"/>
+          </w:tcPr>
+          <w:p>
+            <w:pPr>
+              <w:keepNext/>
+              <w:spacing w:after="0" w:before="0" w:line="240" w:lineRule="auto"/>
+              <w:jc w:val="left"/>
+              <w:rPr>
+                <w:b w:val="false"/>
+                <w:bCs w:val="false"/>
+                <w:sz w:val="18"/>
+                <w:szCs w:val="18"/>
+              </w:rPr>
+            </w:pPr>
+            <w:r>
+              <w:rPr>
+                <w:rFonts w:ascii="Times New Roman" w:cs="Times New Roman" w:eastAsia="Times New Roman" w:hAnsi="Times New Roman"/>
+                <w:b w:val="false"/>
+                <w:bCs w:val="false"/>
+                <w:sz w:val="18"/>
+                <w:szCs w:val="18"/>
+              </w:rPr>
+              <w:t xml:space="preserve">S5</w:t>
+            </w:r>
+          </w:p>
+        </w:tc>
+        <w:tc>
+          <w:tcPr>
+            <w:tcW w:type="dxa" w:w="980"/>
+            <w:tcBorders>
+              <w:top w:val="single" w:color="808080" w:sz="4"/>
+              <w:left w:val="single" w:color="808080" w:sz="4"/>
+              <w:bottom w:val="single" w:color="808080" w:sz="4"/>
+              <w:right w:val="single" w:color="808080" w:sz="4"/>
+            </w:tcBorders>
+            <w:tcMar>
+              <w:top w:type="dxa" w:w="40"/>
+              <w:left w:type="dxa" w:w="45"/>
+              <w:bottom w:type="dxa" w:w="40"/>
+              <w:right w:type="dxa" w:w="45"/>
+            </w:tcMar>
+            <w:vAlign w:val="center"/>
+          </w:tcPr>
+          <w:p>
+            <w:pPr>
+              <w:keepNext/>
+              <w:spacing w:after="0" w:before="0" w:line="240" w:lineRule="auto"/>
+              <w:jc w:val="center"/>
+              <w:rPr>
+                <w:b w:val="false"/>
+                <w:bCs w:val="false"/>
+                <w:sz w:val="18"/>
+                <w:szCs w:val="18"/>
+              </w:rPr>
+            </w:pPr>
+            <w:r>
+              <w:rPr>
+                <w:rFonts w:ascii="Times New Roman" w:cs="Times New Roman" w:eastAsia="Times New Roman" w:hAnsi="Times New Roman"/>
+                <w:b w:val="false"/>
+                <w:bCs w:val="false"/>
+                <w:sz w:val="18"/>
+                <w:szCs w:val="18"/>
+              </w:rPr>
+              <w:t xml:space="preserve">SABINET/AJOL</w:t>
+            </w:r>
+          </w:p>
+        </w:tc>
+        <w:tc>
+          <w:tcPr>
+            <w:tcW w:type="dxa" w:w="420"/>
+            <w:tcBorders>
+              <w:top w:val="single" w:color="808080" w:sz="4"/>
+              <w:left w:val="single" w:color="808080" w:sz="4"/>
+              <w:bottom w:val="single" w:color="808080" w:sz="4"/>
+              <w:right w:val="single" w:color="808080" w:sz="4"/>
+            </w:tcBorders>
+            <w:tcMar>
+              <w:top w:type="dxa" w:w="40"/>
+              <w:left w:type="dxa" w:w="45"/>
+              <w:bottom w:type="dxa" w:w="40"/>
+              <w:right w:type="dxa" w:w="45"/>
+            </w:tcMar>
+            <w:vAlign w:val="center"/>
+          </w:tcPr>
+          <w:p>
+            <w:pPr>
+              <w:keepNext/>
+              <w:spacing w:after="0" w:before="0" w:line="240" w:lineRule="auto"/>
+              <w:jc w:val="center"/>
+              <w:rPr>
+                <w:b w:val="false"/>
+                <w:bCs w:val="false"/>
+                <w:sz w:val="18"/>
+                <w:szCs w:val="18"/>
+              </w:rPr>
+            </w:pPr>
+            <w:r>
+              <w:rPr>
+                <w:rFonts w:ascii="Times New Roman" w:cs="Times New Roman" w:eastAsia="Times New Roman" w:hAnsi="Times New Roman"/>
+                <w:b w:val="false"/>
+                <w:bCs w:val="false"/>
+                <w:sz w:val="18"/>
+                <w:szCs w:val="18"/>
+              </w:rPr>
+              <w:t xml:space="preserve">100</w:t>
+            </w:r>
+          </w:p>
+        </w:tc>
+        <w:tc>
+          <w:tcPr>
+            <w:tcW w:type="dxa" w:w="420"/>
+            <w:tcBorders>
+              <w:top w:val="single" w:color="808080" w:sz="4"/>
+              <w:left w:val="single" w:color="808080" w:sz="4"/>
+              <w:bottom w:val="single" w:color="808080" w:sz="4"/>
+              <w:right w:val="single" w:color="808080" w:sz="4"/>
+            </w:tcBorders>
+            <w:tcMar>
+              <w:top w:type="dxa" w:w="40"/>
+              <w:left w:type="dxa" w:w="45"/>
+              <w:bottom w:type="dxa" w:w="40"/>
+              <w:right w:type="dxa" w:w="45"/>
+            </w:tcMar>
+            <w:vAlign w:val="center"/>
+          </w:tcPr>
+          <w:p>
+            <w:pPr>
+              <w:keepNext/>
+              <w:spacing w:after="0" w:before="0" w:line="240" w:lineRule="auto"/>
+              <w:jc w:val="center"/>
+              <w:rPr>
+                <w:b w:val="false"/>
+                <w:bCs w:val="false"/>
+                <w:sz w:val="18"/>
+                <w:szCs w:val="18"/>
+              </w:rPr>
+            </w:pPr>
+            <w:r>
+              <w:rPr>
+                <w:rFonts w:ascii="Times New Roman" w:cs="Times New Roman" w:eastAsia="Times New Roman" w:hAnsi="Times New Roman"/>
+                <w:b w:val="false"/>
+                <w:bCs w:val="false"/>
+                <w:sz w:val="18"/>
+                <w:szCs w:val="18"/>
+              </w:rPr>
+              <w:t xml:space="preserve">9</w:t>
+            </w:r>
+          </w:p>
+        </w:tc>
+        <w:tc>
+          <w:tcPr>
+            <w:tcW w:type="dxa" w:w="2700"/>
+            <w:tcBorders>
+              <w:top w:val="single" w:color="808080" w:sz="4"/>
+              <w:left w:val="single" w:color="808080" w:sz="4"/>
+              <w:bottom w:val="single" w:color="808080" w:sz="4"/>
+              <w:right w:val="single" w:color="808080" w:sz="4"/>
+            </w:tcBorders>
+            <w:tcMar>
+              <w:top w:type="dxa" w:w="40"/>
+              <w:left w:type="dxa" w:w="45"/>
+              <w:bottom w:type="dxa" w:w="40"/>
+              <w:right w:type="dxa" w:w="45"/>
+            </w:tcMar>
+            <w:vAlign w:val="center"/>
+          </w:tcPr>
+          <w:p>
+            <w:pPr>
+              <w:keepNext/>
+              <w:spacing w:after="0" w:before="0" w:line="240" w:lineRule="auto"/>
+              <w:jc w:val="center"/>
+              <w:rPr>
+                <w:b w:val="false"/>
+                <w:bCs w:val="false"/>
+                <w:sz w:val="18"/>
+                <w:szCs w:val="18"/>
+              </w:rPr>
+            </w:pPr>
+            <w:r>
+              <w:rPr>
+                <w:rFonts w:ascii="Times New Roman" w:cs="Times New Roman" w:eastAsia="Times New Roman" w:hAnsi="Times New Roman"/>
+                <w:b w:val="false"/>
+                <w:bCs w:val="false"/>
+                <w:sz w:val="18"/>
+                <w:szCs w:val="18"/>
+              </w:rPr>
+              <w:t xml:space="preserve">social grant AND exclusion AND (KwaZulu-Natal OR "South Africa")</w:t>
+            </w:r>
+          </w:p>
+        </w:tc>
+      </w:tr>
+      <w:tr>
+        <w:trPr>
+          <w:cantSplit/>
+          <w:tblHeader w:val="false"/>
+        </w:trPr>
+        <w:tc>
+          <w:tcPr>
+            <w:tcW w:type="dxa" w:w="520"/>
+            <w:tcBorders>
+              <w:top w:val="single" w:color="808080" w:sz="4"/>
+              <w:left w:val="single" w:color="808080" w:sz="4"/>
+              <w:bottom w:val="single" w:color="808080" w:sz="4"/>
+              <w:right w:val="single" w:color="808080" w:sz="4"/>
+            </w:tcBorders>
+            <w:tcMar>
+              <w:top w:type="dxa" w:w="40"/>
+              <w:left w:type="dxa" w:w="45"/>
+              <w:bottom w:type="dxa" w:w="40"/>
+              <w:right w:type="dxa" w:w="45"/>
+            </w:tcMar>
+            <w:vAlign w:val="center"/>
+          </w:tcPr>
+          <w:p>
+            <w:pPr>
+              <w:keepNext/>
+              <w:spacing w:after="0" w:before="0" w:line="240" w:lineRule="auto"/>
+              <w:jc w:val="left"/>
+              <w:rPr>
+                <w:b w:val="false"/>
+                <w:bCs w:val="false"/>
+                <w:sz w:val="18"/>
+                <w:szCs w:val="18"/>
+              </w:rPr>
+            </w:pPr>
+            <w:r>
+              <w:rPr>
+                <w:rFonts w:ascii="Times New Roman" w:cs="Times New Roman" w:eastAsia="Times New Roman" w:hAnsi="Times New Roman"/>
+                <w:b w:val="false"/>
+                <w:bCs w:val="false"/>
+                <w:sz w:val="18"/>
+                <w:szCs w:val="18"/>
+              </w:rPr>
+              <w:t xml:space="preserve">S6</w:t>
+            </w:r>
+          </w:p>
+        </w:tc>
+        <w:tc>
+          <w:tcPr>
+            <w:tcW w:type="dxa" w:w="980"/>
+            <w:tcBorders>
+              <w:top w:val="single" w:color="808080" w:sz="4"/>
+              <w:left w:val="single" w:color="808080" w:sz="4"/>
+              <w:bottom w:val="single" w:color="808080" w:sz="4"/>
+              <w:right w:val="single" w:color="808080" w:sz="4"/>
+            </w:tcBorders>
+            <w:tcMar>
+              <w:top w:type="dxa" w:w="40"/>
+              <w:left w:type="dxa" w:w="45"/>
+              <w:bottom w:type="dxa" w:w="40"/>
+              <w:right w:type="dxa" w:w="45"/>
+            </w:tcMar>
+            <w:vAlign w:val="center"/>
+          </w:tcPr>
+          <w:p>
+            <w:pPr>
+              <w:keepNext/>
+              <w:spacing w:after="0" w:before="0" w:line="240" w:lineRule="auto"/>
+              <w:jc w:val="center"/>
+              <w:rPr>
+                <w:b w:val="false"/>
+                <w:bCs w:val="false"/>
+                <w:sz w:val="18"/>
+                <w:szCs w:val="18"/>
+              </w:rPr>
+            </w:pPr>
+            <w:r>
+              <w:rPr>
+                <w:rFonts w:ascii="Times New Roman" w:cs="Times New Roman" w:eastAsia="Times New Roman" w:hAnsi="Times New Roman"/>
+                <w:b w:val="false"/>
+                <w:bCs w:val="false"/>
+                <w:sz w:val="18"/>
+                <w:szCs w:val="18"/>
+              </w:rPr>
+              <w:t xml:space="preserve">Google Scholar</w:t>
+            </w:r>
+          </w:p>
+        </w:tc>
+        <w:tc>
+          <w:tcPr>
+            <w:tcW w:type="dxa" w:w="420"/>
+            <w:tcBorders>
+              <w:top w:val="single" w:color="808080" w:sz="4"/>
+              <w:left w:val="single" w:color="808080" w:sz="4"/>
+              <w:bottom w:val="single" w:color="808080" w:sz="4"/>
+              <w:right w:val="single" w:color="808080" w:sz="4"/>
+            </w:tcBorders>
+            <w:tcMar>
+              <w:top w:type="dxa" w:w="40"/>
+              <w:left w:type="dxa" w:w="45"/>
+              <w:bottom w:type="dxa" w:w="40"/>
+              <w:right w:type="dxa" w:w="45"/>
+            </w:tcMar>
+            <w:vAlign w:val="center"/>
+          </w:tcPr>
+          <w:p>
+            <w:pPr>
+              <w:keepNext/>
+              <w:spacing w:after="0" w:before="0" w:line="240" w:lineRule="auto"/>
+              <w:jc w:val="center"/>
+              <w:rPr>
+                <w:b w:val="false"/>
+                <w:bCs w:val="false"/>
+                <w:sz w:val="18"/>
+                <w:szCs w:val="18"/>
+              </w:rPr>
+            </w:pPr>
+            <w:r>
+              <w:rPr>
+                <w:rFonts w:ascii="Times New Roman" w:cs="Times New Roman" w:eastAsia="Times New Roman" w:hAnsi="Times New Roman"/>
+                <w:b w:val="false"/>
+                <w:bCs w:val="false"/>
+                <w:sz w:val="18"/>
+                <w:szCs w:val="18"/>
+              </w:rPr>
+              <w:t xml:space="preserve">35</w:t>
+            </w:r>
+          </w:p>
+        </w:tc>
+        <w:tc>
+          <w:tcPr>
+            <w:tcW w:type="dxa" w:w="420"/>
+            <w:tcBorders>
+              <w:top w:val="single" w:color="808080" w:sz="4"/>
+              <w:left w:val="single" w:color="808080" w:sz="4"/>
+              <w:bottom w:val="single" w:color="808080" w:sz="4"/>
+              <w:right w:val="single" w:color="808080" w:sz="4"/>
+            </w:tcBorders>
+            <w:tcMar>
+              <w:top w:type="dxa" w:w="40"/>
+              <w:left w:type="dxa" w:w="45"/>
+              <w:bottom w:type="dxa" w:w="40"/>
+              <w:right w:type="dxa" w:w="45"/>
+            </w:tcMar>
+            <w:vAlign w:val="center"/>
+          </w:tcPr>
+          <w:p>
+            <w:pPr>
+              <w:keepNext/>
+              <w:spacing w:after="0" w:before="0" w:line="240" w:lineRule="auto"/>
+              <w:jc w:val="center"/>
+              <w:rPr>
+                <w:b w:val="false"/>
+                <w:bCs w:val="false"/>
+                <w:sz w:val="18"/>
+                <w:szCs w:val="18"/>
+              </w:rPr>
+            </w:pPr>
+            <w:r>
+              <w:rPr>
+                <w:rFonts w:ascii="Times New Roman" w:cs="Times New Roman" w:eastAsia="Times New Roman" w:hAnsi="Times New Roman"/>
+                <w:b w:val="false"/>
+                <w:bCs w:val="false"/>
+                <w:sz w:val="18"/>
+                <w:szCs w:val="18"/>
+              </w:rPr>
+              <w:t xml:space="preserve">11</w:t>
+            </w:r>
+          </w:p>
+        </w:tc>
+        <w:tc>
+          <w:tcPr>
+            <w:tcW w:type="dxa" w:w="2700"/>
+            <w:tcBorders>
+              <w:top w:val="single" w:color="808080" w:sz="4"/>
+              <w:left w:val="single" w:color="808080" w:sz="4"/>
+              <w:bottom w:val="single" w:color="808080" w:sz="4"/>
+              <w:right w:val="single" w:color="808080" w:sz="4"/>
+            </w:tcBorders>
+            <w:tcMar>
+              <w:top w:type="dxa" w:w="40"/>
+              <w:left w:type="dxa" w:w="45"/>
+              <w:bottom w:type="dxa" w:w="40"/>
+              <w:right w:type="dxa" w:w="45"/>
+            </w:tcMar>
+            <w:vAlign w:val="center"/>
+          </w:tcPr>
+          <w:p>
+            <w:pPr>
+              <w:keepNext/>
+              <w:spacing w:after="0" w:before="0" w:line="240" w:lineRule="auto"/>
+              <w:jc w:val="center"/>
+              <w:rPr>
+                <w:b w:val="false"/>
+                <w:bCs w:val="false"/>
+                <w:sz w:val="18"/>
+                <w:szCs w:val="18"/>
+              </w:rPr>
+            </w:pPr>
+            <w:r>
+              <w:rPr>
+                <w:rFonts w:ascii="Times New Roman" w:cs="Times New Roman" w:eastAsia="Times New Roman" w:hAnsi="Times New Roman"/>
+                <w:b w:val="false"/>
+                <w:bCs w:val="false"/>
+                <w:sz w:val="18"/>
+                <w:szCs w:val="18"/>
+              </w:rPr>
+              <w:t xml:space="preserve">"social grant" exclusion "South Africa" -site:pinterest.com</w:t>
+            </w:r>
+          </w:p>
+        </w:tc>
+      </w:tr>
+      <w:tr>
+        <w:trPr>
+          <w:cantSplit/>
+          <w:tblHeader w:val="false"/>
+        </w:trPr>
+        <w:tc>
+          <w:tcPr>
+            <w:tcW w:type="dxa" w:w="520"/>
+            <w:tcBorders>
+              <w:top w:val="single" w:color="808080" w:sz="4"/>
+              <w:left w:val="single" w:color="808080" w:sz="4"/>
+              <w:bottom w:val="single" w:color="808080" w:sz="4"/>
+              <w:right w:val="single" w:color="808080" w:sz="4"/>
+            </w:tcBorders>
+            <w:tcMar>
+              <w:top w:type="dxa" w:w="40"/>
+              <w:left w:type="dxa" w:w="45"/>
+              <w:bottom w:type="dxa" w:w="40"/>
+              <w:right w:type="dxa" w:w="45"/>
+            </w:tcMar>
+            <w:vAlign w:val="center"/>
+          </w:tcPr>
+          <w:p>
+            <w:pPr>
+              <w:keepNext w:val="false"/>
+              <w:spacing w:after="0" w:before="0" w:line="240" w:lineRule="auto"/>
+              <w:jc w:val="left"/>
+              <w:rPr>
+                <w:b w:val="false"/>
+                <w:bCs w:val="false"/>
+                <w:sz w:val="18"/>
+                <w:szCs w:val="18"/>
+              </w:rPr>
+            </w:pPr>
+            <w:r>
+              <w:rPr>
+                <w:rFonts w:ascii="Times New Roman" w:cs="Times New Roman" w:eastAsia="Times New Roman" w:hAnsi="Times New Roman"/>
+                <w:b w:val="false"/>
+                <w:bCs w:val="false"/>
+                <w:sz w:val="18"/>
+                <w:szCs w:val="18"/>
+              </w:rPr>
+              <w:t xml:space="preserve">S7</w:t>
+            </w:r>
+          </w:p>
+        </w:tc>
+        <w:tc>
+          <w:tcPr>
+            <w:tcW w:type="dxa" w:w="980"/>
+            <w:tcBorders>
+              <w:top w:val="single" w:color="808080" w:sz="4"/>
+              <w:left w:val="single" w:color="808080" w:sz="4"/>
+              <w:bottom w:val="single" w:color="808080" w:sz="4"/>
+              <w:right w:val="single" w:color="808080" w:sz="4"/>
+            </w:tcBorders>
+            <w:tcMar>
+              <w:top w:type="dxa" w:w="40"/>
+              <w:left w:type="dxa" w:w="45"/>
+              <w:bottom w:type="dxa" w:w="40"/>
+              <w:right w:type="dxa" w:w="45"/>
+            </w:tcMar>
+            <w:vAlign w:val="center"/>
+          </w:tcPr>
+          <w:p>
+            <w:pPr>
+              <w:keepNext w:val="false"/>
+              <w:spacing w:after="0" w:before="0" w:line="240" w:lineRule="auto"/>
+              <w:jc w:val="center"/>
+              <w:rPr>
+                <w:b w:val="false"/>
+                <w:bCs w:val="false"/>
+                <w:sz w:val="18"/>
+                <w:szCs w:val="18"/>
+              </w:rPr>
+            </w:pPr>
+            <w:r>
+              <w:rPr>
+                <w:rFonts w:ascii="Times New Roman" w:cs="Times New Roman" w:eastAsia="Times New Roman" w:hAnsi="Times New Roman"/>
+                <w:b w:val="false"/>
+                <w:bCs w:val="false"/>
+                <w:sz w:val="18"/>
+                <w:szCs w:val="18"/>
+              </w:rPr>
+              <w:t xml:space="preserve">DataFirst/Stats SA</w:t>
+            </w:r>
+          </w:p>
+        </w:tc>
+        <w:tc>
+          <w:tcPr>
+            <w:tcW w:type="dxa" w:w="420"/>
+            <w:tcBorders>
+              <w:top w:val="single" w:color="808080" w:sz="4"/>
+              <w:left w:val="single" w:color="808080" w:sz="4"/>
+              <w:bottom w:val="single" w:color="808080" w:sz="4"/>
+              <w:right w:val="single" w:color="808080" w:sz="4"/>
+            </w:tcBorders>
+            <w:tcMar>
+              <w:top w:type="dxa" w:w="40"/>
+              <w:left w:type="dxa" w:w="45"/>
+              <w:bottom w:type="dxa" w:w="40"/>
+              <w:right w:type="dxa" w:w="45"/>
+            </w:tcMar>
+            <w:vAlign w:val="center"/>
+          </w:tcPr>
+          <w:p>
+            <w:pPr>
+              <w:keepNext w:val="false"/>
+              <w:spacing w:after="0" w:before="0" w:line="240" w:lineRule="auto"/>
+              <w:jc w:val="center"/>
+              <w:rPr>
+                <w:b w:val="false"/>
+                <w:bCs w:val="false"/>
+                <w:sz w:val="18"/>
+                <w:szCs w:val="18"/>
+              </w:rPr>
+            </w:pPr>
+            <w:r>
+              <w:rPr>
+                <w:rFonts w:ascii="Times New Roman" w:cs="Times New Roman" w:eastAsia="Times New Roman" w:hAnsi="Times New Roman"/>
+                <w:b w:val="false"/>
+                <w:bCs w:val="false"/>
+                <w:sz w:val="18"/>
+                <w:szCs w:val="18"/>
+              </w:rPr>
+              <w:t xml:space="preserve">1</w:t>
+            </w:r>
+          </w:p>
+        </w:tc>
+        <w:tc>
+          <w:tcPr>
+            <w:tcW w:type="dxa" w:w="420"/>
+            <w:tcBorders>
+              <w:top w:val="single" w:color="808080" w:sz="4"/>
+              <w:left w:val="single" w:color="808080" w:sz="4"/>
+              <w:bottom w:val="single" w:color="808080" w:sz="4"/>
+              <w:right w:val="single" w:color="808080" w:sz="4"/>
+            </w:tcBorders>
+            <w:tcMar>
+              <w:top w:type="dxa" w:w="40"/>
+              <w:left w:type="dxa" w:w="45"/>
+              <w:bottom w:type="dxa" w:w="40"/>
+              <w:right w:type="dxa" w:w="45"/>
+            </w:tcMar>
+            <w:vAlign w:val="center"/>
+          </w:tcPr>
+          <w:p>
+            <w:pPr>
+              <w:keepNext w:val="false"/>
+              <w:spacing w:after="0" w:before="0" w:line="240" w:lineRule="auto"/>
+              <w:jc w:val="center"/>
+              <w:rPr>
+                <w:b w:val="false"/>
+                <w:bCs w:val="false"/>
+                <w:sz w:val="18"/>
+                <w:szCs w:val="18"/>
+              </w:rPr>
+            </w:pPr>
+            <w:r>
+              <w:rPr>
+                <w:rFonts w:ascii="Times New Roman" w:cs="Times New Roman" w:eastAsia="Times New Roman" w:hAnsi="Times New Roman"/>
+                <w:b w:val="false"/>
+                <w:bCs w:val="false"/>
+                <w:sz w:val="18"/>
+                <w:szCs w:val="18"/>
+              </w:rPr>
+              <w:t xml:space="preserve">0</w:t>
+            </w:r>
+          </w:p>
+        </w:tc>
+        <w:tc>
+          <w:tcPr>
+            <w:tcW w:type="dxa" w:w="2700"/>
+            <w:tcBorders>
+              <w:top w:val="single" w:color="808080" w:sz="4"/>
+              <w:left w:val="single" w:color="808080" w:sz="4"/>
+              <w:bottom w:val="single" w:color="808080" w:sz="4"/>
+              <w:right w:val="single" w:color="808080" w:sz="4"/>
+            </w:tcBorders>
+            <w:tcMar>
+              <w:top w:type="dxa" w:w="40"/>
+              <w:left w:type="dxa" w:w="45"/>
+              <w:bottom w:type="dxa" w:w="40"/>
+              <w:right w:type="dxa" w:w="45"/>
+            </w:tcMar>
+            <w:vAlign w:val="center"/>
+          </w:tcPr>
+          <w:p>
+            <w:pPr>
+              <w:keepNext w:val="false"/>
+              <w:spacing w:after="0" w:before="0" w:line="240" w:lineRule="auto"/>
+              <w:jc w:val="center"/>
+              <w:rPr>
+                <w:b w:val="false"/>
+                <w:bCs w:val="false"/>
+                <w:sz w:val="18"/>
+                <w:szCs w:val="18"/>
+              </w:rPr>
+            </w:pPr>
+            <w:r>
+              <w:rPr>
+                <w:rFonts w:ascii="Times New Roman" w:cs="Times New Roman" w:eastAsia="Times New Roman" w:hAnsi="Times New Roman"/>
+                <w:b w:val="false"/>
+                <w:bCs w:val="false"/>
+                <w:sz w:val="18"/>
+                <w:szCs w:val="18"/>
+              </w:rPr>
+              <w:t xml:space="preserve">Living Conditions Survey 2014/2015 metadata KwaZulu-Natal</w:t>
+            </w:r>
+          </w:p>
+        </w:tc>
+      </w:tr>
+    </w:tbl>
+    <w:p>
+      <w:pPr>
+        <w:spacing w:after="0" w:before="0" w:line="240" w:lineRule="auto"/>
+        <w:ind w:firstLine="200"/>
+        <w:jc w:val="both"/>
+      </w:pPr>
+      <w:r>
+        <w:rPr>
+          <w:rFonts w:ascii="Times New Roman" w:cs="Times New Roman" w:eastAsia="Times New Roman" w:hAnsi="Times New Roman"/>
+          <w:sz w:val="20"/>
+          <w:szCs w:val="20"/>
+        </w:rPr>
+        <w:t xml:space="preserve">The eight searches returned 511 records. After 136 duplicates were removed, 375 unique records remained. Title and abstract screening excluded 222. Full texts were assessed for 153 records, including 25 left uncertain at title and abstract. Full-text review excluded 98 and retained 55. Those 55 sources cover several grants and populations, rather than 55 OPG studies.
+</w:t>
       </w:r>
     </w:p>
     <w:p>
@@ -301,22 +2275,8 @@
           <w:sz w:val="20"/>
           <w:szCs w:val="20"/>
         </w:rPr>
-        <w:t xml:space="preserve">Review records report 511 items: 136 duplicates removed, 375 titles/abstracts screened, 222 exclusions, 153 full-text assessments, 98 further exclusions and 55 retained sources across grants and populations. Queries, search dates/filters, exports, item-level decisions and the full extraction register are unavailable. These aggregate counts cannot establish reproducible selection or exhaustive coverage.</w:t>
-      </w:r>
-    </w:p>
-    <w:p>
-      <w:pPr>
-        <w:spacing w:after="0" w:before="0" w:line="240" w:lineRule="auto"/>
-        <w:ind w:firstLine="200"/>
-        <w:jc w:val="both"/>
-      </w:pPr>
-      <w:r>
-        <w:rPr>
-          <w:rFonts w:ascii="Times New Roman" w:cs="Times New Roman" w:eastAsia="Times New Roman" w:hAnsi="Times New Roman"/>
-          <w:sz w:val="20"/>
-          <w:szCs w:val="20"/>
-        </w:rPr>
-        <w:t xml:space="preserve">Table I distinguishes individual receipt [3] from household proportions [4], and this study’s provincial resource screen from both. Other-grant studies separate enquiry, application, receipt and uninterrupted payment [6], [7], [8].</w:t>
+        <w:t xml:space="preserve">Table I distinguishes individual receipt [3] from household proportions [4], and this study’s provincial resource screen from both. Other-grant studies separate enquiry, application, receipt and uninterrupted payment [6], [7], [8].
+</w:t>
       </w:r>
     </w:p>
     <w:p>
@@ -338,7 +2298,8 @@
           <w:szCs w:val="16"/>
         </w:rPr>
         <w:t xml:space="preserve">TABLE I
-Evidence scope informing the study</w:t>
+Evidence scope informing the study
+</w:t>
       </w:r>
     </w:p>
     <w:tbl>
@@ -1146,7 +3107,8 @@
           <w:sz w:val="20"/>
           <w:szCs w:val="20"/>
         </w:rPr>
-        <w:t xml:space="preserve">Gazeaud motivates income sensitivity [11]; Mabala studies a different grant and age group [12]. Neither establishes OPG eligibility.</w:t>
+        <w:t xml:space="preserve">Gazeaud motivates income sensitivity [11]; Mabala studies a different grant and age group [12]. Neither establishes OPG eligibility.
+</w:t>
       </w:r>
     </w:p>
     <w:p>
@@ -1161,7 +3123,8 @@
           <w:sz w:val="20"/>
           <w:szCs w:val="20"/>
         </w:rPr>
-        <w:t xml:space="preserve">Cited studies do not directly show how resource, partnership and grant-compatibility assumptions shape provincial person-level non-receipt estimates. This study connects explicit screening, sensitivity analysis, weighted description and household-held-out prediction through shared rules and inspectable software. Its contribution concerns measurement and reproducibility, rather than statutory entitlement or access mechanisms.</w:t>
+        <w:t xml:space="preserve">Cited studies do not directly show how resource, partnership and grant-compatibility assumptions shape provincial person-level non-receipt estimates. This study connects explicit screening, sensitivity analysis, weighted description and household-held-out prediction through shared rules and inspectable software. Its contribution concerns measurement and reproducibility, rather than statutory entitlement or access mechanisms.
+</w:t>
       </w:r>
     </w:p>
     <w:p>
@@ -1187,7 +3150,8 @@
           <w:sz w:val="20"/>
           <w:szCs w:val="20"/>
         </w:rPr>
-        <w:t xml:space="preserve">B. Grant Access and Administrative Burden</w:t>
+        <w:t xml:space="preserve">B. Grant Access and Administrative Burden
+</w:t>
       </w:r>
     </w:p>
     <w:p>
@@ -1202,7 +3166,8 @@
           <w:sz w:val="20"/>
           <w:szCs w:val="20"/>
         </w:rPr>
-        <w:t xml:space="preserve">Administrative-burden theory distinguishes learning, compliance and psychological costs [13]. Grant studies describe paperwork, repeated visits, interrupted payments and difficult encounters [8], [9], [10], [14]. Child Support Grant research suggests barriers [6], [7], without establishing their effects among older OPG applicants. Digital access can create difficulties [15]. Low non-receipt therefore does not demonstrate easy access.</w:t>
+        <w:t xml:space="preserve">Administrative-burden theory distinguishes learning, compliance and psychological costs [13]. Grant studies describe paperwork, repeated visits, interrupted payments and difficult encounters [8], [9], [10], [14]. Child Support Grant research suggests barriers [6], [7], without establishing their effects among older OPG applicants. Digital access can create difficulties [15]. Low non-receipt therefore does not demonstrate easy access.
+</w:t>
       </w:r>
     </w:p>
     <w:p>
@@ -1217,7 +3182,8 @@
           <w:sz w:val="20"/>
           <w:szCs w:val="20"/>
         </w:rPr>
-        <w:t xml:space="preserve">The screen operationalises observable age, resources, partnership and grant-compatibility rules while retaining unresolved information. Screening status and reported receipt remain separate. Only screen-PASS adults with resolved receipt enter descriptive and predictive analyses; unclear or contradictory receipt responses remain unresolved.</w:t>
+        <w:t xml:space="preserve">The screen operationalises observable age, resources, partnership and grant-compatibility rules while retaining unresolved information. Screening status and reported receipt remain separate. Only screen-PASS adults with resolved receipt enter descriptive and predictive analyses; unclear or contradictory receipt responses remain unresolved.
+</w:t>
       </w:r>
     </w:p>
     <w:p>
@@ -1243,7 +3209,8 @@
           <w:sz w:val="20"/>
           <w:szCs w:val="20"/>
         </w:rPr>
-        <w:t xml:space="preserve">C. Predictor Selection and Software Design</w:t>
+        <w:t xml:space="preserve">C. Predictor Selection and Software Design
+</w:t>
       </w:r>
     </w:p>
     <w:p>
@@ -1258,7 +3225,8 @@
           <w:sz w:val="20"/>
           <w:szCs w:val="20"/>
         </w:rPr>
-        <w:t xml:space="preserve">Table II separates demographic context from circumstances relevant to learning and compliance costs. These predictors do not directly measure administrative burden or establish why a person reports non-receipt.</w:t>
+        <w:t xml:space="preserve">Table II separates demographic context from circumstances relevant to learning and compliance costs. These predictors do not directly measure administrative burden or establish why a person reports non-receipt.
+</w:t>
       </w:r>
     </w:p>
     <w:p>
@@ -1280,7 +3248,8 @@
           <w:szCs w:val="16"/>
         </w:rPr>
         <w:t xml:space="preserve">TABLE II
-Administrative-burden theory and predictor selection</w:t>
+Administrative-burden theory and predictor selection
+</w:t>
       </w:r>
     </w:p>
     <w:tbl>
@@ -2095,7 +4064,8 @@
           <w:sz w:val="16"/>
           <w:szCs w:val="16"/>
         </w:rPr>
-        <w:t xml:space="preserve">Psychological costs are unmeasured. Settlement contributes two contrasts, giving five predictor groups and six slopes.</w:t>
+        <w:t xml:space="preserve">Psychological costs are unmeasured. Settlement contributes two contrasts, giving five predictor groups and six slopes.
+</w:t>
       </w:r>
     </w:p>
     <w:p>
@@ -2110,7 +4080,8 @@
           <w:sz w:val="20"/>
           <w:szCs w:val="20"/>
         </w:rPr>
-        <w:t xml:space="preserve">Rare outcomes require precision–recall assessment alongside discrimination and calibration [16], [17]. Sample size limits precision [18]; household grouping constrains validation [19]. TRIPOD informed prediction reporting [20]. Software verification and participant usability require different evidence.</w:t>
+        <w:t xml:space="preserve">Rare outcomes require precision–recall assessment alongside discrimination and calibration [16], [17]. Sample size limits precision [18]; household grouping constrains validation [19]. TRIPOD informed prediction reporting [20]. Software verification and participant usability require different evidence.
+</w:t>
       </w:r>
     </w:p>
     <w:p>
@@ -2136,7 +4107,8 @@
           <w:sz w:val="20"/>
           <w:szCs w:val="20"/>
         </w:rPr>
-        <w:t xml:space="preserve">D. Conceptual Framework</w:t>
+        <w:t xml:space="preserve">D. Conceptual Framework
+</w:t>
       </w:r>
     </w:p>
     <w:p>
@@ -2151,7 +4123,8 @@
           <w:sz w:val="20"/>
           <w:szCs w:val="20"/>
         </w:rPr>
-        <w:t xml:space="preserve">Reported non-receipt motivates an administrative-burden perspective. Figure 1 links theory to LCS proxies, with age and sex as demographic context. Observable screening is necessary because age alone cannot define eligibility and LCS omits legal conditions. Resource, partnership and grant-compatibility rules define the population; reported receipt defines the outcome. Person weights describe non-receipt; unweighted household-held-out validation assesses prediction. The artefact implements this design through shared rules, frozen scoring and inspectable reports. Application scores remain separate from held-out evaluation and never change screening or receipt.</w:t>
+        <w:t xml:space="preserve">Reported non-receipt motivates an administrative-burden perspective. Figure 1 links theory to LCS proxies, with age and sex as demographic context. Observable screening is necessary because age alone cannot define eligibility and LCS omits legal conditions. Resource, partnership and grant-compatibility rules define the population; reported receipt defines the outcome. Person weights describe non-receipt; unweighted household-held-out validation assesses prediction. The artefact implements this design through shared rules, frozen scoring and inspectable reports. Application scores remain separate from held-out evaluation and never change screening or receipt.
+</w:t>
       </w:r>
     </w:p>
     <w:p>
@@ -2165,7 +4138,7 @@
           <wp:inline distT="0" distB="0" distL="0" distR="0">
             <wp:extent cx="3200400" cy="3429000"/>
             <wp:effectExtent t="0" r="0" b="0" l="0"/>
-            <wp:docPr id="1" name="Fig. 1. Conceptual framework. Theory informs predictor selection; observable screening defines the population for separate descriptive and predictive analyses. The dashed boundary identifies the artefact’s implementation scope. Arrows show conceptual rationale or analytical dependencies, not causal effects." descr="Fig. 1. Conceptual framework. Theory informs predictor selection; observable screening defines the population for separate descriptive and predictive analyses. The dashed boundary identifies the artefact’s implementation scope. Arrows show conceptual rationale or analytical dependencies, not causal effects." title="Fig. 1. Conceptual framework. Theory informs predictor selection; observable screening defines the population for separate descriptive and predictive analyses. The dashed boundary identifies the artefact’s implementation scope. Arrows show conceptual rationale or analytical dependencies, not causal effects."/>
+            <wp:docPr id="1" name="Fig. 1. Conceptual framework. Theory informs predictor selection; observable screening defines the population for separate descriptive and predictive analyses. The dashed boundary identifies the artefact’s implementation scope. Arrows show conceptual rationale or analytical dependencies, not causal effects. " descr="Fig. 1. Conceptual framework. Theory informs predictor selection; observable screening defines the population for separate descriptive and predictive analyses. The dashed boundary identifies the artefact’s implementation scope. Arrows show conceptual rationale or analytical dependencies, not causal effects. " title="Fig. 1. Conceptual framework. Theory informs predictor selection; observable screening defines the population for separate descriptive and predictive analyses. The dashed boundary identifies the artefact’s implementation scope. Arrows show conceptual rationale or analytical dependencies, not causal effects. "/>
             <wp:cNvGraphicFramePr>
               <a:graphicFrameLocks xmlns:a="http://schemas.openxmlformats.org/drawingml/2006/main" noChangeAspect="1"/>
             </wp:cNvGraphicFramePr>
@@ -2216,7 +4189,8 @@
           <w:sz w:val="16"/>
           <w:szCs w:val="16"/>
         </w:rPr>
-        <w:t xml:space="preserve">Fig. 1. Conceptual framework. Theory informs predictor selection; observable screening defines the population for separate descriptive and predictive analyses. The dashed boundary identifies the artefact’s implementation scope. Arrows show conceptual rationale or analytical dependencies, not causal effects.</w:t>
+        <w:t xml:space="preserve">Fig. 1. Conceptual framework. Theory informs predictor selection; observable screening defines the population for separate descriptive and predictive analyses. The dashed boundary identifies the artefact’s implementation scope. Arrows show conceptual rationale or analytical dependencies, not causal effects.
+</w:t>
       </w:r>
     </w:p>
     <w:p>
@@ -2242,7 +4216,8 @@
           <w:sz w:val="20"/>
           <w:szCs w:val="20"/>
         </w:rPr>
-        <w:t xml:space="preserve">III. Methods</w:t>
+        <w:t xml:space="preserve">III. Methods
+</w:t>
       </w:r>
     </w:p>
     <w:p>
@@ -2268,7 +4243,8 @@
           <w:sz w:val="20"/>
           <w:szCs w:val="20"/>
         </w:rPr>
-        <w:t xml:space="preserve">A. Data and study population</w:t>
+        <w:t xml:space="preserve">A. Data and study population
+</w:t>
       </w:r>
     </w:p>
     <w:p>
@@ -2283,7 +4259,8 @@
           <w:sz w:val="20"/>
           <w:szCs w:val="20"/>
         </w:rPr>
-        <w:t xml:space="preserve">The analysis linked LCS 2014/2015 person, household and person-income files using survey identifiers, checking duplicates, unmatched records and row counts. Questionnaire, metadata and COICOP (Classification of Individual Consumption According to Purpose) codes guided interpretation [21], [22], [23]. The study included sampled KwaZulu-Natal residents aged 60+; the household survey excludes institutional residents. Screening used interview-month rules. Statistics South Africa had hot-deck-imputed age and sex before release, without record-level flags. Model preprocessing addressed missing predictors separately. Aggregating income before linkage preserved person-level records (Table III).</w:t>
+        <w:t xml:space="preserve">The analysis linked LCS 2014/2015 person, household and person-income files using survey identifiers, checking duplicates, unmatched records and row counts. Questionnaire, metadata and COICOP (Classification of Individual Consumption According to Purpose) codes guided interpretation [21], [22], [23]. The study included sampled KwaZulu-Natal residents aged 60+; the household survey excludes institutional residents. Screening used interview-month rules. Statistics South Africa had hot-deck-imputed age and sex before release, without record-level flags. Model preprocessing addressed missing predictors separately. Aggregating income before linkage preserved person-level records (Table III).
+</w:t>
       </w:r>
     </w:p>
     <w:p>
@@ -2305,7 +4282,8 @@
           <w:szCs w:val="16"/>
         </w:rPr>
         <w:t xml:space="preserve">TABLE III
-How each data field enters the analysis</w:t>
+How each data field enters the analysis
+</w:t>
       </w:r>
     </w:p>
     <w:tbl>
@@ -3507,7 +5485,8 @@
           <w:sz w:val="16"/>
           <w:szCs w:val="16"/>
         </w:rPr>
-        <w:t xml:space="preserve">Released documentation supports these field uses [21], [22], [23]. Filling missing model predictors never changes screening fields or receipt answers.</w:t>
+        <w:t xml:space="preserve">Released documentation supports these field uses [21], [22], [23]. Filling missing model predictors never changes screening fields or receipt answers.
+</w:t>
       </w:r>
     </w:p>
     <w:p>
@@ -3533,7 +5512,8 @@
           <w:sz w:val="20"/>
           <w:szCs w:val="20"/>
         </w:rPr>
-        <w:t xml:space="preserve">B. Screening rules and receipt outcome</w:t>
+        <w:t xml:space="preserve">B. Screening rules and receipt outcome
+</w:t>
       </w:r>
     </w:p>
     <w:p>
@@ -3548,7 +5528,8 @@
           <w:sz w:val="20"/>
           <w:szCs w:val="20"/>
         </w:rPr>
-        <w:t xml:space="preserve">The screen summed already annualised, nominal person-income amounts, excluding social-assistance income. It did not allocate household income. A missing applicant or linked-spouse amount remained unresolved unless the no-income response and absent schedule supported zero. Assets, deemed income and permitted deductions were outside this research proxy.</w:t>
+        <w:t xml:space="preserve">The screen summed already annualised, nominal person-income amounts, excluding social-assistance income. It did not allocate household income. A missing applicant or linked-spouse amount remained unresolved unless the no-income response and absent schedule supported zero. Assets, deemed income and permitted deductions were outside this research proxy.
+</w:t>
       </w:r>
     </w:p>
     <w:p>
@@ -3563,7 +5544,8 @@
           <w:sz w:val="20"/>
           <w:szCs w:val="20"/>
         </w:rPr>
-        <w:t xml:space="preserve">GN 211 set the standard monthly maximum at R1,350 from 1 April 2014 [24]; GN 277 raised it to R1,410 from 1 April 2015 [25]. The 2014 amendment, Schedule paragraph 2, substituted D = 1.6A − 0.4B from 1 April 2014 [26]. With annual standard maximum A and minimum D = R1,200 (Annexure A(5)) [27], B = (1.6A − 1,200)/0.4. This yields annual single/couple research ceilings of R61,800/R123,600 for October 2014–March 2015 and R64,680/R129,360 for April–October 2015. Half-joint income doubles couple limits; equality passed. The screen applied these boundaries to its private-income proxy. Both notices add R20 for age 75+; the primary screen retained the standard maximum across ages, while S1c tested the supplement. S1 also tested period and payment-boundary alternatives.</w:t>
+        <w:t xml:space="preserve">GN 211 set the standard monthly maximum at R1,350 from 1 April 2014 [24]; GN 277 raised it to R1,410 from 1 April 2015 [25]. The 2014 amendment, Schedule paragraph 2, substituted D = 1.6A − 0.4B from 1 April 2014 [26]. With annual standard maximum A and minimum D = R1,200 (Annexure A(5)) [27], B = (1.6A − 1,200)/0.4. This yields annual single/couple research ceilings of R61,800/R123,600 for October 2014–March 2015 and R64,680/R129,360 for April–October 2015. Half-joint income doubles couple limits; equality passed. The screen applied these boundaries to its private-income proxy. Both notices add R20 for age 75+; the primary screen retained the standard maximum across ages, while S1c tested the supplement. S1 also tested period and payment-boundary alternatives.
+</w:t>
       </w:r>
     </w:p>
     <w:p>
@@ -3578,7 +5560,8 @@
           <w:sz w:val="20"/>
           <w:szCs w:val="20"/>
         </w:rPr>
-        <w:t xml:space="preserve">The 2008 regulations define spouses (regulation 1), include spouse income regardless of property regime (18(2)) and use half-joint annual income (19(1)). They allow Agency-approved exclusion after continuous desertion for at least three months and unwillingness to support (18(3)) [27]. The July 2015 amendment left these OPG means provisions unchanged [28]. Survey responses established neither legal spouse status nor desertion conditions. Never-married, widowed and divorced adults used single ceilings. For married adults, research rules required resolved applicant/spouse incomes and reciprocal pointers linking a resident spouse; sums applied regardless of spouse age. Nonresident spouse income was unavailable; separated respondents lacked spouse details [23]. Cohabitation, unspecified status and missing/inconsistent links remained unresolved, without assumed single status or zero partner income. S2 tested alternatives.</w:t>
+        <w:t xml:space="preserve">The 2008 regulations define spouses (regulation 1), include spouse income regardless of property regime (18(2)) and use half-joint annual income (19(1)). They allow Agency-approved exclusion after continuous desertion for at least three months and unwillingness to support (18(3)) [27]. The July 2015 amendment left these OPG means provisions unchanged [28]. Survey responses established neither legal spouse status nor desertion conditions. Never-married, widowed and divorced adults used single ceilings. For married adults, research rules required resolved applicant/spouse incomes and reciprocal pointers linking a resident spouse; sums applied regardless of spouse age. Nonresident spouse income was unavailable; separated respondents lacked spouse details [23]. Cohabitation, unspecified status and missing/inconsistent links remained unresolved, without assumed single status or zero partner income. S2 tested alternatives.
+</w:t>
       </w:r>
     </w:p>
     <w:p>
@@ -3593,7 +5576,8 @@
           <w:sz w:val="20"/>
           <w:szCs w:val="20"/>
         </w:rPr>
-        <w:t xml:space="preserve">An adult's reported disability or war-veterans grant caused FAIL. Caregiver child grants and grant-in-aid neither excluded the adult nor defined OPG receipt. A known failure took priority over unresolved information; the screen retained all reasons.</w:t>
+        <w:t xml:space="preserve">An adult's reported disability or war-veterans grant caused FAIL. Caregiver child grants and grant-in-aid neither excluded the adult nor defined OPG receipt. A known failure took priority over unresolved information; the screen retained all reasons.
+</w:t>
       </w:r>
     </w:p>
     <w:p>
@@ -3608,7 +5592,8 @@
           <w:sz w:val="20"/>
           <w:szCs w:val="20"/>
         </w:rPr>
-        <w:t xml:space="preserve">For adults who passed, the software interpreted general-grant and OPG answers together, including structural skips (questions omitted because earlier answers make them inapplicable). A consistent “no grant” answer can establish non-receipt when the OPG follow-up does not apply. Contradictory or unexplained answers remain unresolved and exclude the person from modelling. The analysis flagged disagreements between current receipt and preceding-year OPG income without changing the outcome because the periods differ. Rule version opg-kzn-primary-v1 records these decisions. The denominator contains adults who pass and have a clear receipt answer.</w:t>
+        <w:t xml:space="preserve">For adults who passed, the software interpreted general-grant and OPG answers together, including structural skips (questions omitted because earlier answers make them inapplicable). A consistent “no grant” answer can establish non-receipt when the OPG follow-up does not apply. Contradictory or unexplained answers remain unresolved and exclude the person from modelling. The analysis flagged disagreements between current receipt and preceding-year OPG income without changing the outcome because the periods differ. Rule version opg-kzn-primary-v1 records these decisions. The denominator contains adults who pass and have a clear receipt answer.
+</w:t>
       </w:r>
     </w:p>
     <w:p>
@@ -3634,7 +5619,8 @@
           <w:sz w:val="20"/>
           <w:szCs w:val="20"/>
         </w:rPr>
-        <w:t xml:space="preserve">C. Survey-weighted description and uncertainty</w:t>
+        <w:t xml:space="preserve">C. Survey-weighted description and uncertainty
+</w:t>
       </w:r>
     </w:p>
     <w:p>
@@ -3649,7 +5635,8 @@
           <w:sz w:val="20"/>
           <w:szCs w:val="20"/>
         </w:rPr>
-        <w:t xml:space="preserve">RQ1 reported unweighted and person-weighted non-receipt, p = Σ(wᵢYᵢ)/Σwᵢ, where Yᵢ = 1 denotes non-receipt and wᵢ is the person weight. Group comparisons were descriptive. For the weighted proportion, a with-replacement linearisation approximation clustered by derived primary sampling unit (PSU; first 11 household-ID digits) supplied the standard error (SE); 95% intervals used p ± 1.96SE. Unreleased strata prevented full survey-design variance estimation. Adults with unresolved screening remained outside the denominator. Receipt bounds assigned all unresolved PASS outcomes first to receipt, then to non-receipt.</w:t>
+        <w:t xml:space="preserve">RQ1 reported unweighted and person-weighted non-receipt, p = Σ(wᵢYᵢ)/Σwᵢ, where Yᵢ = 1 denotes non-receipt and wᵢ is the person weight. Group comparisons were descriptive. For the weighted proportion, a with-replacement linearisation approximation clustered by derived primary sampling unit (PSU; first 11 household-ID digits) supplied the standard error (SE); 95% intervals used p ± 1.96SE. Unreleased strata prevented full survey-design variance estimation. Adults with unresolved screening remained outside the denominator. Receipt bounds assigned all unresolved PASS outcomes first to receipt, then to non-receipt.
+</w:t>
       </w:r>
     </w:p>
     <w:p>
@@ -3675,7 +5662,8 @@
           <w:sz w:val="20"/>
           <w:szCs w:val="20"/>
         </w:rPr>
-        <w:t xml:space="preserve">D. Model specification and validation</w:t>
+        <w:t xml:space="preserve">D. Model specification and validation
+</w:t>
       </w:r>
     </w:p>
     <w:p>
@@ -3690,7 +5678,8 @@
           <w:sz w:val="20"/>
           <w:szCs w:val="20"/>
         </w:rPr>
-        <w:t xml:space="preserve">An unweighted, unpenalised logistic regression estimated reported non-receipt using five predictor groups, six slopes and an intercept (Table II). There was no class rebalancing, automated variable selection or cutoff optimisation. Income, receipt, derived outcome labels and marital status were excluded from primary predictors.</w:t>
+        <w:t xml:space="preserve">An unweighted, unpenalised logistic regression estimated reported non-receipt using five predictor groups, six slopes and an intercept (Table II). There was no class rebalancing, automated variable selection or cutoff optimisation. Income, receipt, derived outcome labels and marital status were excluded from primary predictors.
+</w:t>
       </w:r>
     </w:p>
     <w:p>
@@ -3705,7 +5694,8 @@
           <w:sz w:val="20"/>
           <w:szCs w:val="20"/>
         </w:rPr>
-        <w:t xml:space="preserve">The attempted seven-slope model contained one rural-formal non-recipient; holding out that adult left no training event in that category. Decision D-052 combined rural formal with traditional settlement to support estimation, without treating the settings as equivalent. This outcome-informed choice was not nested within validation; performance remains conditional on the retained specification.</w:t>
+        <w:t xml:space="preserve">The attempted seven-slope model contained one rural-formal non-recipient; holding out that adult left no training event in that category. Decision D-052 combined rural formal with traditional settlement to support estimation, without treating the settings as equivalent. This outcome-informed choice was not nested within validation; performance remains conditional on the retained specification.
+</w:t>
       </w:r>
     </w:p>
     <w:p>
@@ -3720,7 +5710,8 @@
           <w:sz w:val="20"/>
           <w:szCs w:val="20"/>
         </w:rPr>
-        <w:t xml:space="preserve">The 1,013 adults formed 827 households, including 182 with multiple included adults and six with both outcomes. Five folds stratified sorted households by any member’s non-receipt, keeping household members together (seed 201415). Each iteration trained on four folds and predicted the fifth. Held-out folds contained 199–207 adults and 12–14 events; age, sex and settlement were complete, with predictor missingness reported in Table V. Training sets supplied the age median and categorical modes used to impute training and held-out predictors before constructing fixed contrasts; ties selected the smallest code sorted as text. Fixed coding handled structural skips. Eligibility, receipt and weights were not imputed. Each adult received one out-of-fold (OOF) probability; the reference used the corresponding training-set event rate.</w:t>
+        <w:t xml:space="preserve">The 1,013 adults formed 827 households, including 182 with multiple included adults and six with both outcomes. Five folds stratified sorted households by any member’s non-receipt, keeping household members together (seed 201415). Each iteration trained on four folds and predicted the fifth. Held-out folds contained 199–207 adults and 12–14 events; age, sex and settlement were complete, with predictor missingness reported in Table V. Training sets supplied the age median and categorical modes used to impute training and held-out predictors before constructing fixed contrasts; ties selected the smallest code sorted as text. Fixed coding handled structural skips. Eligibility, receipt and weights were not imputed. Each adult received one out-of-fold (OOF) probability; the reference used the corresponding training-set event rate.
+</w:t>
       </w:r>
     </w:p>
     <w:p>
@@ -3735,7 +5726,8 @@
           <w:sz w:val="20"/>
           <w:szCs w:val="20"/>
         </w:rPr>
-        <w:t xml:space="preserve">Pooled OOF predictions supplied unweighted average precision, AUC, Brier score and calibration measures. Calibration-in-the-large estimated an intercept correction with slope fixed at 1; ideal intercept and slope values were zero and 1. In 1,000 bootstrap draws, 827 households were sampled with replacement, retaining all included members and repeated selections. Outcomes and fixed OOF/reference probabilities stayed paired. Metrics, including calibration regressions, were recalculated; 2.5th/97.5th percentiles formed 95% intervals, with 1,000 valid draws per reported metric. Predictive models, imputers, folds and the settlement revision were not repeated. These conditional intervals omit variability from repeating model development or fold assignment, leave dependence from shared training data unaddressed, and do not reproduce the survey design or establish external performance.</w:t>
+        <w:t xml:space="preserve">Pooled OOF predictions supplied unweighted average precision, AUC, Brier score and calibration measures. Calibration-in-the-large estimated an intercept correction with slope fixed at 1; ideal intercept and slope values were zero and 1. In 1,000 bootstrap draws, 827 households were sampled with replacement, retaining all included members and repeated selections. Outcomes and fixed OOF/reference probabilities stayed paired. Metrics, including calibration regressions, were recalculated; 2.5th/97.5th percentiles formed 95% intervals, with 1,000 valid draws per reported metric. Predictive models, imputers, folds and the settlement revision were not repeated. These conditional intervals omit variability from repeating model development or fold assignment, leave dependence from shared training data unaddressed, and do not reproduce the survey design or establish external performance.
+</w:t>
       </w:r>
     </w:p>
     <w:p>
@@ -3761,7 +5753,8 @@
           <w:sz w:val="20"/>
           <w:szCs w:val="20"/>
         </w:rPr>
-        <w:t xml:space="preserve">E. Alternative assumptions</w:t>
+        <w:t xml:space="preserve">E. Alternative assumptions
+</w:t>
       </w:r>
     </w:p>
     <w:p>
@@ -3776,7 +5769,8 @@
           <w:sz w:val="20"/>
           <w:szCs w:val="20"/>
         </w:rPr>
-        <w:t xml:space="preserve">S1–S6 varied thresholds, partnership, other-grant rules, income definition, receipt period and unresolved-receipt bounds. Each recorded cohort size, events, unweighted/person-weighted rates and internal predictive performance; unchanged cohorts retained primary OOF results. S7 used complete cases; S8 replaced welfare access with a married indicator. S9 fitted frequency-weighted regression while retaining unweighted imputation and evaluation; it was not a survey-design regression. S10 weighted primary OOF metrics without refitting; S11 grouped folds by derived PSU. These analyses remained separate from primary results.</w:t>
+        <w:t xml:space="preserve">S1–S6 varied thresholds, partnership, other-grant rules, income definition, receipt period and unresolved-receipt bounds. Each recorded cohort size, events, unweighted/person-weighted rates and internal predictive performance; unchanged cohorts retained primary OOF results. S7 used complete cases; S8 replaced welfare access with a married indicator. S9 fitted frequency-weighted regression while retaining unweighted imputation and evaluation; it was not a survey-design regression. S10 weighted primary OOF metrics without refitting; S11 grouped folds by derived PSU. These analyses remained separate from primary results.
+</w:t>
       </w:r>
     </w:p>
     <w:p>
@@ -3802,7 +5796,8 @@
           <w:sz w:val="20"/>
           <w:szCs w:val="20"/>
         </w:rPr>
-        <w:t xml:space="preserve">IV. Software and Evaluation</w:t>
+        <w:t xml:space="preserve">IV. Software and Evaluation
+</w:t>
       </w:r>
     </w:p>
     <w:p>
@@ -3817,7 +5812,8 @@
           <w:sz w:val="20"/>
           <w:szCs w:val="20"/>
         </w:rPr>
-        <w:t xml:space="preserve">The command-line interface (CLI), python analysis/run_study.py, reproduces linkage, screening, description and held-out evaluation. Run records store versions, settings, seed, folds and checksums. The app loads JSON coefficients and imputation statistics from opg-kzn-six-slope-v1, fitted to the full cohort. Uploads never retrain it.</w:t>
+        <w:t xml:space="preserve">The command-line interface (CLI), python analysis/run_study.py, reproduces linkage, screening, description and held-out evaluation. Run records store versions, settings, seed, folds and checksums. The app loads JSON coefficients and imputation statistics from opg-kzn-six-slope-v1, fitted to the full cohort. Uploads never retrain it.
+</w:t>
       </w:r>
     </w:p>
     <w:p>
@@ -3832,7 +5828,8 @@
           <w:sz w:val="20"/>
           <w:szCs w:val="20"/>
         </w:rPr>
-        <w:t xml:space="preserve">The Streamlit app accepts opg-screen-v1 CSVs, including members needed for spouse linkage. It rejects schema/context errors, duplicate identifiers and invalid values. Uploads are limited to 20 MiB/50,000 rows and remain in session memory. Views and exports omit submitted identifiers, raw income and household links. Filters preserve the full resolved-PASS summary denominator.</w:t>
+        <w:t xml:space="preserve">The Streamlit app accepts opg-screen-v1 CSVs, including members needed for spouse linkage. It rejects schema/context errors, duplicate identifiers and invalid values. Uploads are limited to 20 MiB/50,000 rows and remain in session memory. Views and exports omit submitted identifiers, raw income and household links. Filters preserve the full resolved-PASS summary denominator.
+</w:t>
       </w:r>
     </w:p>
     <w:p>
@@ -3846,7 +5843,7 @@
           <wp:inline distT="0" distB="0" distL="0" distR="0">
             <wp:extent cx="3200400" cy="2343150"/>
             <wp:effectExtent t="0" r="0" b="0" l="0"/>
-            <wp:docPr id="1" name="Fig. 2. Research and app workflows share screening rules. Household-held-out predictions remain separate from app scores calculated using the model trained on all included adults." descr="Fig. 2. Research and app workflows share screening rules. Household-held-out predictions remain separate from app scores calculated using the model trained on all included adults." title="Fig. 2. Research and app workflows share screening rules. Household-held-out predictions remain separate from app scores calculated using the model trained on all included adults."/>
+            <wp:docPr id="1" name="Fig. 2. Research and app workflows share screening rules. Household-held-out predictions remain separate from app scores calculated using the model trained on all included adults. " descr="Fig. 2. Research and app workflows share screening rules. Household-held-out predictions remain separate from app scores calculated using the model trained on all included adults. " title="Fig. 2. Research and app workflows share screening rules. Household-held-out predictions remain separate from app scores calculated using the model trained on all included adults. "/>
             <wp:cNvGraphicFramePr>
               <a:graphicFrameLocks xmlns:a="http://schemas.openxmlformats.org/drawingml/2006/main" noChangeAspect="1"/>
             </wp:cNvGraphicFramePr>
@@ -3897,7 +5894,8 @@
           <w:sz w:val="16"/>
           <w:szCs w:val="16"/>
         </w:rPr>
-        <w:t xml:space="preserve">Fig. 2. Research and app workflows share screening rules. Household-held-out predictions remain separate from app scores calculated using the model trained on all included adults.</w:t>
+        <w:t xml:space="preserve">Fig. 2. Research and app workflows share screening rules. Household-held-out predictions remain separate from app scores calculated using the model trained on all included adults.
+</w:t>
       </w:r>
     </w:p>
     <w:p>
@@ -3912,7 +5910,8 @@
           <w:sz w:val="20"/>
           <w:szCs w:val="20"/>
         </w:rPr>
-        <w:t xml:space="preserve">Only supported PASS adults with resolved receipt receive scores; partially missing predictors use frozen statistics, while records missing every categorical predictor remain unscored. Integrity checks bind model/evaluation files to code. Historical OOF results remain distinct from uploaded scores; uploaded records may overlap training data. CSV, JSON and ZIP exports include classifications, reasons, probabilities, versions and audit manifests. The synthetic MVP excludes survey records, historical respondent outputs and Git history.</w:t>
+        <w:t xml:space="preserve">Only supported PASS adults with resolved receipt receive scores; partially missing predictors use frozen statistics, while records missing every categorical predictor remain unscored. Integrity checks bind model/evaluation files to code. Historical OOF results remain distinct from uploaded scores; uploaded records may overlap training data. CSV, JSON and ZIP exports include classifications, reasons, probabilities, versions and audit manifests. The synthetic MVP excludes survey records, historical respondent outputs and Git history.
+</w:t>
       </w:r>
     </w:p>
     <w:p>
@@ -3927,7 +5926,8 @@
           <w:sz w:val="20"/>
           <w:szCs w:val="20"/>
         </w:rPr>
-        <w:t xml:space="preserve">Technical checks covered expected decisions, excluded predictors, linkage, repeatability, exports, saved-score parity and invalid/stale interface states. The owner’s Windows walkthrough confirmed synthetic execution and report generation, without independent participant evidence.</w:t>
+        <w:t xml:space="preserve">Technical checks covered expected decisions, excluded predictors, linkage, repeatability, exports, saved-score parity and invalid/stale interface states. The owner’s Windows walkthrough confirmed synthetic execution and report generation, without independent participant evidence.
+</w:t>
       </w:r>
     </w:p>
     <w:p>
@@ -3942,7 +5942,8 @@
           <w:sz w:val="20"/>
           <w:szCs w:val="20"/>
         </w:rPr>
-        <w:t xml:space="preserve">An unused protocol proposes synthetic tasks for three to five consenting participants, measuring completion, time, errors, ease and assistance. No participant usability or acceptance results exist; automated checks establish program behaviour.</w:t>
+        <w:t xml:space="preserve">An unused protocol proposes synthetic tasks for three to five consenting participants, measuring completion, time, errors, ease and assistance. No participant usability or acceptance results exist; automated checks establish program behaviour.
+</w:t>
       </w:r>
     </w:p>
     <w:p>
@@ -3968,7 +5969,8 @@
           <w:sz w:val="20"/>
           <w:szCs w:val="20"/>
         </w:rPr>
-        <w:t xml:space="preserve">V. Results</w:t>
+        <w:t xml:space="preserve">V. Results
+</w:t>
       </w:r>
     </w:p>
     <w:p>
@@ -3994,7 +5996,8 @@
           <w:sz w:val="20"/>
           <w:szCs w:val="20"/>
         </w:rPr>
-        <w:t xml:space="preserve">A. Study group and reported non-receipt</w:t>
+        <w:t xml:space="preserve">A. Study group and reported non-receipt
+</w:t>
       </w:r>
     </w:p>
     <w:p>
@@ -4009,7 +6012,8 @@
           <w:sz w:val="20"/>
           <w:szCs w:val="20"/>
         </w:rPr>
-        <w:t xml:space="preserve">The survey included 15,388 people in 3,686 KwaZulu-Natal households (Table IV). Adults aged 60+ partition into failed, unresolved and passed groups; receipt partitions PASS. Household counts can overlap across rows. Of 117 failures, 93 exceeded the income ceiling and 25 reported disability grants; one met both conditions. None reported war-veterans grants. Of 187 unresolved adults, 105 were married, mostly with non-resident spouses, and 63 reported living together. Unresolved adults outnumbered non-recipients.</w:t>
+        <w:t xml:space="preserve">The survey included 15,388 people in 3,686 KwaZulu-Natal households (Table IV). Adults aged 60+ partition into failed, unresolved and passed groups; receipt partitions PASS. Household counts can overlap across rows. Of 117 failures, 93 exceeded the income ceiling and 25 reported disability grants; one met both conditions. None reported war-veterans grants. Of 187 unresolved adults, 105 were married, mostly with non-resident spouses, and 63 reported living together. Unresolved adults outnumbered non-recipients.
+</w:t>
       </w:r>
     </w:p>
     <w:p>
@@ -4031,7 +6035,8 @@
           <w:szCs w:val="16"/>
         </w:rPr>
         <w:t xml:space="preserve">TABLE IV
-KwaZulu-Natal study group at each screening step</w:t>
+KwaZulu-Natal study group at each screening step
+</w:t>
       </w:r>
     </w:p>
     <w:tbl>
@@ -5104,7 +7109,8 @@
           <w:sz w:val="16"/>
           <w:szCs w:val="16"/>
         </w:rPr>
-        <w:t xml:space="preserve">Person counts partition as 117 + 187 + 1,013 among adults aged 60+, then 946 + 67 within PASS. Adding all rows double-counts adults. Household counts are distinct within rows and do not form the same partition.</w:t>
+        <w:t xml:space="preserve">Person counts partition as 117 + 187 + 1,013 among adults aged 60+, then 946 + 67 within PASS. Adding all rows double-counts adults. Household counts are distinct within rows and do not form the same partition.
+</w:t>
       </w:r>
     </w:p>
     <w:p>
@@ -5118,7 +7124,7 @@
           <wp:inline distT="0" distB="0" distL="0" distR="0">
             <wp:extent cx="3200400" cy="2466975"/>
             <wp:effectExtent t="0" r="0" b="0" l="0"/>
-            <wp:docPr id="1" name="Fig. 3. FAIL, UNRESOLVED and PASS groups do not overlap. All 1,013 PASS adults resolve receipt and enter the final denominator." descr="Fig. 3. FAIL, UNRESOLVED and PASS groups do not overlap. All 1,013 PASS adults resolve receipt and enter the final denominator." title="Fig. 3. FAIL, UNRESOLVED and PASS groups do not overlap. All 1,013 PASS adults resolve receipt and enter the final denominator."/>
+            <wp:docPr id="1" name="Fig. 3. FAIL, UNRESOLVED and PASS groups do not overlap. All 1,013 PASS adults resolve receipt and enter the final denominator. " descr="Fig. 3. FAIL, UNRESOLVED and PASS groups do not overlap. All 1,013 PASS adults resolve receipt and enter the final denominator. " title="Fig. 3. FAIL, UNRESOLVED and PASS groups do not overlap. All 1,013 PASS adults resolve receipt and enter the final denominator. "/>
             <wp:cNvGraphicFramePr>
               <a:graphicFrameLocks xmlns:a="http://schemas.openxmlformats.org/drawingml/2006/main" noChangeAspect="1"/>
             </wp:cNvGraphicFramePr>
@@ -5169,7 +7175,8 @@
           <w:sz w:val="16"/>
           <w:szCs w:val="16"/>
         </w:rPr>
-        <w:t xml:space="preserve">Fig. 3. FAIL, UNRESOLVED and PASS groups do not overlap. All 1,013 PASS adults resolve receipt and enter the final denominator.</w:t>
+        <w:t xml:space="preserve">Fig. 3. FAIL, UNRESOLVED and PASS groups do not overlap. All 1,013 PASS adults resolve receipt and enter the final denominator.
+</w:t>
       </w:r>
     </w:p>
     <w:p>
@@ -5184,7 +7191,8 @@
           <w:sz w:val="20"/>
           <w:szCs w:val="20"/>
         </w:rPr>
-        <w:t xml:space="preserve">Among 1,013 resolved passes, 67 reported non-receipt: 6.61% unweighted and 7.49% person-weighted. A PSU-clustered normal approximation across 345 PSUs gave SE 1.3 percentage points and a 95% interval of 4.9%–10.0%. Missing strata prevent full survey-design inference; this approximation does not supply intervals for Tables V–VIII. Current receipt matched preceding-year OPG income throughout. Table V describes pre-imputation composition within receipt groups, rather than non-receipt rates or predictions, and reports no standard errors.</w:t>
+        <w:t xml:space="preserve">Among 1,013 resolved passes, 67 reported non-receipt: 6.61% unweighted and 7.49% person-weighted. A PSU-clustered normal approximation across 345 PSUs gave SE 1.3 percentage points and a 95% interval of 4.9%–10.0%. Missing strata prevent full survey-design inference; this approximation does not supply intervals for Tables V–VIII. Current receipt matched preceding-year OPG income throughout. Table V describes pre-imputation composition within receipt groups, rather than non-receipt rates or predictions, and reports no standard errors.
+</w:t>
       </w:r>
     </w:p>
     <w:p>
@@ -5206,7 +7214,8 @@
           <w:szCs w:val="16"/>
         </w:rPr>
         <w:t xml:space="preserve">TABLE V
-Characteristics by receipt, before filling missing values</w:t>
+Characteristics by receipt, before filling missing values
+</w:t>
       </w:r>
     </w:p>
     <w:tbl>
@@ -6021,7 +8030,8 @@
           <w:sz w:val="16"/>
           <w:szCs w:val="16"/>
         </w:rPr>
-        <w:t xml:space="preserve">Recipients: 946; non-recipients: 67. Entries give unweighted then person-weighted means, or unweighted counts/within-group percentages then weighted percentages. Denominators retain three recipients missing schooling and 14 recipients/four non-recipients missing office-distance values. These describe group composition, without uncertainty intervals.</w:t>
+        <w:t xml:space="preserve">Recipients: 946; non-recipients: 67. Entries give unweighted then person-weighted means, or unweighted counts/within-group percentages then weighted percentages. Denominators retain three recipients missing schooling and 14 recipients/four non-recipients missing office-distance values. These describe group composition, without uncertainty intervals.
+</w:t>
       </w:r>
     </w:p>
     <w:p>
@@ -6036,7 +8046,8 @@
           <w:sz w:val="20"/>
           <w:szCs w:val="20"/>
         </w:rPr>
-        <w:t xml:space="preserve">Unweighted non-recipients were younger, more often men, more educated and more often urban-formal residents. Weighting reduced the age difference. No between-group tests were performed.</w:t>
+        <w:t xml:space="preserve">Unweighted non-recipients were younger, more often men, more educated and more often urban-formal residents. Weighting reduced the age difference. No between-group tests were performed.
+</w:t>
       </w:r>
     </w:p>
     <w:p>
@@ -6062,7 +8073,8 @@
           <w:sz w:val="20"/>
           <w:szCs w:val="20"/>
         </w:rPr>
-        <w:t xml:space="preserve">B. Screening sensitivity</w:t>
+        <w:t xml:space="preserve">B. Screening sensitivity
+</w:t>
       </w:r>
     </w:p>
     <w:p>
@@ -6077,7 +8089,8 @@
           <w:sz w:val="20"/>
           <w:szCs w:val="20"/>
         </w:rPr>
-        <w:t xml:space="preserve">Table VI reports scenario denominators, events, unweighted/person-weighted prevalence and unweighted OOF performance. Weighted prevalence ranged from 7.12% to 9.06%; AUC ranged from 0.736 to 0.763. Sensitivity performance entries are point estimates without intervals; similar AUC neither equates screened populations nor validates a screening rule.</w:t>
+        <w:t xml:space="preserve">Table VI reports scenario denominators, events, unweighted/person-weighted prevalence and unweighted OOF performance. Weighted prevalence ranged from 7.12% to 9.06%; AUC ranged from 0.736 to 0.763. Sensitivity performance entries are point estimates without intervals; similar AUC neither equates screened populations nor validates a screening rule.
+</w:t>
       </w:r>
     </w:p>
     <w:p>
@@ -6099,7 +8112,8 @@
           <w:szCs w:val="16"/>
         </w:rPr>
         <w:t xml:space="preserve">TABLE VI
-Screening changes, non-receipt rates and held-out point estimates</w:t>
+Screening changes, non-receipt rates and held-out point estimates
+</w:t>
       </w:r>
     </w:p>
     <w:tbl>
@@ -9074,7 +11088,8 @@
           <w:sz w:val="16"/>
           <w:szCs w:val="16"/>
         </w:rPr>
-        <w:t xml:space="preserve">Events are reported non-recipients. Unw./Wtd. denote unweighted/person-weighted percentages. AUC, Brier and calibration slope are unweighted OOF point estimates without intervals. Same* repeats S0 for unchanged scenarios.</w:t>
+        <w:t xml:space="preserve">Events are reported non-recipients. Unw./Wtd. denote unweighted/person-weighted percentages. AUC, Brier and calibration slope are unweighted OOF point estimates without intervals. Same* repeats S0 for unchanged scenarios.
+</w:t>
       </w:r>
     </w:p>
     <w:p>
@@ -9089,7 +11104,8 @@
           <w:sz w:val="20"/>
           <w:szCs w:val="20"/>
         </w:rPr>
-        <w:t xml:space="preserve">S1b applies the 2015 ceiling throughout; S1d uses the zero-payment boundary. These distinct settings produced identical results. S2a/S2b treat living-together adults as couples/single; S2c treats separated adults as single; S2d treats both as single. S3 retains disability/war-veterans recipients, adding no veterans. S4b includes social-assistance income.</w:t>
+        <w:t xml:space="preserve">S1b applies the 2015 ceiling throughout; S1d uses the zero-payment boundary. These distinct settings produced identical results. S2a/S2b treat living-together adults as couples/single; S2c treats separated adults as single; S2d treats both as single. S3 retains disability/war-veterans recipients, adding no veterans. S4b includes social-assistance income.
+</w:t>
       </w:r>
     </w:p>
     <w:p>
@@ -9104,7 +11120,8 @@
           <w:sz w:val="20"/>
           <w:szCs w:val="20"/>
         </w:rPr>
-        <w:t xml:space="preserve">*Unchanged scenarios: S1a applies the 2014 ceiling throughout; S1c adds the age-75 supplement; S4a adjusts income for prices with unchanged ceilings; S4c excludes UIF and similar transfers; S5 uses preceding-year receipt. S6a/S6b assign unresolved PASS receipt to receipt/non-receipt; no such cases occurred. Each retains the S0 denominator, events and measures.</w:t>
+        <w:t xml:space="preserve">*Unchanged scenarios: S1a applies the 2014 ceiling throughout; S1c adds the age-75 supplement; S4a adjusts income for prices with unchanged ceilings; S4c excludes UIF and similar transfers; S5 uses preceding-year receipt. S6a/S6b assign unresolved PASS receipt to receipt/non-receipt; no such cases occurred. Each retains the S0 denominator, events and measures.
+</w:t>
       </w:r>
     </w:p>
     <w:p>
@@ -9130,7 +11147,8 @@
           <w:sz w:val="20"/>
           <w:szCs w:val="20"/>
         </w:rPr>
-        <w:t xml:space="preserve">C. Predictive performance and associations</w:t>
+        <w:t xml:space="preserve">C. Predictive performance and associations
+</w:t>
       </w:r>
     </w:p>
     <w:p>
@@ -9145,7 +11163,8 @@
           <w:sz w:val="20"/>
           <w:szCs w:val="20"/>
         </w:rPr>
-        <w:t xml:space="preserve">Predictive performance uses OOF probabilities; associations use the full-cohort fit. Neither establishes causal mechanisms, temporal ordering or intervention effects.</w:t>
+        <w:t xml:space="preserve">Predictive performance uses OOF probabilities; associations use the full-cohort fit. Neither establishes causal mechanisms, temporal ordering or intervention effects.
+</w:t>
       </w:r>
     </w:p>
     <w:p>
@@ -9160,7 +11179,8 @@
           <w:sz w:val="20"/>
           <w:szCs w:val="20"/>
         </w:rPr>
-        <w:t xml:space="preserve">All five folds converged. Figure 4 uses five similarly sized bins. The highest bin had average prediction 0.188 and 35/203 non-recipients (17.2%); the lowest had average 0.0107 and 3/206 non-recipients (1.5%).</w:t>
+        <w:t xml:space="preserve">All five folds converged. Figure 4 uses five similarly sized bins. The highest bin had average prediction 0.188 and 35/203 non-recipients (17.2%); the lowest had average 0.0107 and 3/206 non-recipients (1.5%).
+</w:t>
       </w:r>
     </w:p>
     <w:p>
@@ -9182,7 +11202,8 @@
           <w:szCs w:val="16"/>
         </w:rPr>
         <w:t xml:space="preserve">TABLE VII
-Primary held-out performance and resampling intervals</w:t>
+Primary held-out performance and resampling intervals
+</w:t>
       </w:r>
     </w:p>
     <w:tbl>
@@ -9997,7 +12018,8 @@
           <w:sz w:val="16"/>
           <w:szCs w:val="16"/>
         </w:rPr>
-        <w:t xml:space="preserve">Brackets give conditional 95% percentile intervals from 1,000 household resamples of fixed OOF predictions (1,013 people/67 events); each interval had 1,000 valid, zero invalid draws. Predictive models and imputers were not refitted. These differ from the PSU approximation in V.A and full-fit Wald intervals below. The reference uses training-fold prevalence; its .0001 calibration-in-the-large has no saved interval. Dashes indicate unavailable measures. Ideal calibration intercept/slope values are 0/1.</w:t>
+        <w:t xml:space="preserve">Brackets give conditional 95% percentile intervals from 1,000 household resamples of fixed OOF predictions (1,013 people/67 events); each interval had 1,000 valid, zero invalid draws. Predictive models and imputers were not refitted. These differ from the PSU approximation in V.A and full-fit Wald intervals below. The reference uses training-fold prevalence; its .0001 calibration-in-the-large has no saved interval. Dashes indicate unavailable measures. Ideal calibration intercept/slope values are 0/1.
+</w:t>
       </w:r>
     </w:p>
     <w:p>
@@ -10011,7 +12033,7 @@
           <wp:inline distT="0" distB="0" distL="0" distR="0">
             <wp:extent cx="3200400" cy="2286000"/>
             <wp:effectExtent t="0" r="0" b="0" l="0"/>
-            <wp:docPr id="1" name="Fig. 4. Saved group summaries show unweighted OOF calibration. Labels give events/people; the diagonal shows exact agreement between average predictions and observed rates. Plot range: 0–0.22." descr="Fig. 4. Saved group summaries show unweighted OOF calibration. Labels give events/people; the diagonal shows exact agreement between average predictions and observed rates. Plot range: 0–0.22." title="Fig. 4. Saved group summaries show unweighted OOF calibration. Labels give events/people; the diagonal shows exact agreement between average predictions and observed rates. Plot range: 0–0.22."/>
+            <wp:docPr id="1" name="Fig. 4. Saved group summaries show unweighted OOF calibration. Labels give events/people; the diagonal shows exact agreement between average predictions and observed rates. Plot range: 0–0.22. " descr="Fig. 4. Saved group summaries show unweighted OOF calibration. Labels give events/people; the diagonal shows exact agreement between average predictions and observed rates. Plot range: 0–0.22. " title="Fig. 4. Saved group summaries show unweighted OOF calibration. Labels give events/people; the diagonal shows exact agreement between average predictions and observed rates. Plot range: 0–0.22. "/>
             <wp:cNvGraphicFramePr>
               <a:graphicFrameLocks xmlns:a="http://schemas.openxmlformats.org/drawingml/2006/main" noChangeAspect="1"/>
             </wp:cNvGraphicFramePr>
@@ -10062,7 +12084,8 @@
           <w:sz w:val="16"/>
           <w:szCs w:val="16"/>
         </w:rPr>
-        <w:t xml:space="preserve">Fig. 4. Saved group summaries show unweighted OOF calibration. Labels give events/people; the diagonal shows exact agreement between average predictions and observed rates. Plot range: 0–0.22.</w:t>
+        <w:t xml:space="preserve">Fig. 4. Saved group summaries show unweighted OOF calibration. Labels give events/people; the diagonal shows exact agreement between average predictions and observed rates. Plot range: 0–0.22.
+</w:t>
       </w:r>
     </w:p>
     <w:p>
@@ -10077,7 +12100,8 @@
           <w:sz w:val="20"/>
           <w:szCs w:val="20"/>
         </w:rPr>
-        <w:t xml:space="preserve">Full-cohort adjusted odds ratios were 0.39 for women versus men (Wald interval 0.23–0.66) and 0.24 for schooling below Grade 7 versus Grade 7 or above (0.13–0.43). Age, settlement and office-distance intervals included 1. These exploratory model-based intervals omit household clustering, survey design and specification-selection uncertainty. They describe odds associations, rather than probability changes, held-out performance or causal effects.</w:t>
+        <w:t xml:space="preserve">Full-cohort adjusted odds ratios were 0.39 for women versus men (Wald interval 0.23–0.66) and 0.24 for schooling below Grade 7 versus Grade 7 or above (0.13–0.43). Age, settlement and office-distance intervals included 1. These exploratory model-based intervals omit household clustering, survey design and specification-selection uncertainty. They describe odds associations, rather than probability changes, held-out performance or causal effects.
+</w:t>
       </w:r>
     </w:p>
     <w:p>
@@ -10099,7 +12123,8 @@
           <w:szCs w:val="16"/>
         </w:rPr>
         <w:t xml:space="preserve">TABLE VIII
-Model and validation sensitivities, as point estimates</w:t>
+Model and validation sensitivities, as point estimates
+</w:t>
       </w:r>
     </w:p>
     <w:tbl>
@@ -11907,7 +13932,8 @@
           <w:sz w:val="16"/>
           <w:szCs w:val="16"/>
         </w:rPr>
-        <w:t xml:space="preserve">Unw. is the unweighted non-receipt percentage; performance entries have no intervals. S8–S11 retain weighted non-receipt of 7.49%. S7 removes 21 adults/four events lacking usable schooling or distance. S8 substitutes marriage for office distance, retaining six slopes. S9 uses frequency-weighted fitting with unweighted imputation/evaluation, not full survey-design regression. S10 weights primary OOF predictions without refitting; S11 changes fold grouping to derived PSU.</w:t>
+        <w:t xml:space="preserve">Unw. is the unweighted non-receipt percentage; performance entries have no intervals. S8–S11 retain weighted non-receipt of 7.49%. S7 removes 21 adults/four events lacking usable schooling or distance. S8 substitutes marriage for office distance, retaining six slopes. S9 uses frequency-weighted fitting with unweighted imputation/evaluation, not full survey-design regression. S10 weights primary OOF predictions without refitting; S11 changes fold grouping to derived PSU.
+</w:t>
       </w:r>
     </w:p>
     <w:p>
@@ -11922,7 +13948,8 @@
           <w:sz w:val="20"/>
           <w:szCs w:val="20"/>
         </w:rPr>
-        <w:t xml:space="preserve">Table VIII changes sample, predictors or evaluation, rather than estimating effects. Its point estimates do not establish a preferred specification.</w:t>
+        <w:t xml:space="preserve">Table VIII changes sample, predictors or evaluation, rather than estimating effects. Its point estimates do not establish a preferred specification.
+</w:t>
       </w:r>
     </w:p>
     <w:p>
@@ -11948,7 +13975,8 @@
           <w:sz w:val="20"/>
           <w:szCs w:val="20"/>
         </w:rPr>
-        <w:t xml:space="preserve">D. Software verification</w:t>
+        <w:t xml:space="preserve">D. Software verification
+</w:t>
       </w:r>
     </w:p>
     <w:p>
@@ -11963,7 +13991,8 @@
           <w:sz w:val="20"/>
           <w:szCs w:val="20"/>
         </w:rPr>
-        <w:t xml:space="preserve">Table IX summarises 26 original checks: 22 synthetic screening cases, two income-schedule checks, one forbidden-predictor check and one run trace. Two research runs produced 14 byte-identical files and preserved the cohort checksum.</w:t>
+        <w:t xml:space="preserve">Table IX summarises 26 original checks: 22 synthetic screening cases, two income-schedule checks, one forbidden-predictor check and one run trace. Two research runs produced 14 byte-identical files and preserved the cohort checksum.
+</w:t>
       </w:r>
     </w:p>
     <w:p>
@@ -11985,7 +14014,8 @@
           <w:szCs w:val="16"/>
         </w:rPr>
         <w:t xml:space="preserve">TABLE IX
-Completed verification and its scope</w:t>
+Completed verification and its scope
+</w:t>
       </w:r>
     </w:p>
     <w:tbl>
@@ -12922,7 +14952,8 @@
           <w:sz w:val="20"/>
           <w:szCs w:val="20"/>
         </w:rPr>
-        <w:t xml:space="preserve">The owner’s Windows walkthrough exercised six synthetic classifications. Six extracted reports passed 50 checks of outputs, summaries, checksums and versions. The ZIP container itself was not inspected. This supports local technical functionality, without independent execution or participant-usability evidence.</w:t>
+        <w:t xml:space="preserve">The owner’s Windows walkthrough exercised six synthetic classifications. Six extracted reports passed 50 checks of outputs, summaries, checksums and versions. The ZIP container itself was not inspected. This supports local technical functionality, without independent execution or participant-usability evidence.
+</w:t>
       </w:r>
     </w:p>
     <w:p>
@@ -12948,7 +14979,8 @@
           <w:sz w:val="20"/>
           <w:szCs w:val="20"/>
         </w:rPr>
-        <w:t xml:space="preserve">VI. Discussion</w:t>
+        <w:t xml:space="preserve">VI. Discussion
+</w:t>
       </w:r>
     </w:p>
     <w:p>
@@ -12974,7 +15006,8 @@
           <w:sz w:val="20"/>
           <w:szCs w:val="20"/>
         </w:rPr>
-        <w:t xml:space="preserve">A. Scope of measured non-receipt</w:t>
+        <w:t xml:space="preserve">A. Scope of measured non-receipt
+</w:t>
       </w:r>
     </w:p>
     <w:p>
@@ -12989,7 +15022,8 @@
           <w:sz w:val="20"/>
           <w:szCs w:val="20"/>
         </w:rPr>
-        <w:t xml:space="preserve">RQ1 measures non-receipt among historical KwaZulu-Natal adults who pass the screen and resolve receipt: 67/1,013, or 6.61% unweighted and 7.49% person-weighted. This does not measure unlawful denial or non-receipt among everyone legally entitled. The 187 unresolved adults outnumbered the 67 events. Excluding them changes the population described, regardless of sampling uncertainty. Stable estimates cannot reveal their receipt.</w:t>
+        <w:t xml:space="preserve">RQ1 measures non-receipt among historical KwaZulu-Natal adults who pass the screen and resolve receipt: 67/1,013, or 6.61% unweighted and 7.49% person-weighted. This does not measure unlawful denial or non-receipt among everyone legally entitled. The 187 unresolved adults outnumbered the 67 events. Excluding them changes the population described, regardless of sampling uncertainty. Stable estimates cannot reveal their receipt.
+</w:t>
       </w:r>
     </w:p>
     <w:p>
@@ -13004,7 +15038,8 @@
           <w:sz w:val="20"/>
           <w:szCs w:val="20"/>
         </w:rPr>
-        <w:t xml:space="preserve">S2d added 68 people but only two events, reducing weighted non-receipt to 7.12%. Partnership rules mainly changed the denominator. S3 retained adults with incompatible grants, added 19 people/15 events and raised non-receipt to 9.06%, the largest tested change. Table VI gives AUC, Brier and slope as point estimates on those changed denominators, without intervals. Similar AUC cannot justify screening rules or establish equivalent populations. Ralston studies rural age-eligible people [3]; Godfrey studies households' grants [4]. Different units, programmes, screens and places prevent direct comparison of their percentages. This study adds a provincial estimate with an explicit resource screen. High receipt can involve access costs [13], [14]; it cannot prove low burden.</w:t>
+        <w:t xml:space="preserve">S2d added 68 people but only two events, reducing weighted non-receipt to 7.12%. Partnership rules mainly changed the denominator. S3 retained adults with incompatible grants, added 19 people/15 events and raised non-receipt to 9.06%, the largest tested change. Table VI gives AUC, Brier and slope as point estimates on those changed denominators, without intervals. Similar AUC cannot justify screening rules or establish equivalent populations. Ralston studies rural age-eligible people [3]; Godfrey studies households' grants [4]. Different units, programmes, screens and places prevent direct comparison of their percentages. This study adds a provincial estimate with an explicit resource screen. High receipt can involve access costs [13], [14]; it cannot prove low burden.
+</w:t>
       </w:r>
     </w:p>
     <w:p>
@@ -13030,7 +15065,8 @@
           <w:sz w:val="20"/>
           <w:szCs w:val="20"/>
         </w:rPr>
-        <w:t xml:space="preserve">B. Predictive performance and interpretation</w:t>
+        <w:t xml:space="preserve">B. Predictive performance and interpretation
+</w:t>
       </w:r>
     </w:p>
     <w:p>
@@ -13045,7 +15081,8 @@
           <w:sz w:val="20"/>
           <w:szCs w:val="20"/>
         </w:rPr>
-        <w:t xml:space="preserve">AUC 0.752 indicates ranking discrimination, rather than cutoff accuracy. AP 0.203 summarises precision–recall across thresholds, rather than precision at one cutoff [16]. Brier fell from 0.0618 to 0.0578, a modest 0.0040 reduction. No paired interval was calculated for that reduction; it remains a descriptive comparison. Calibration-in-the-large 0.020 estimates an intercept correction with slope fixed at 1; an interval spanning the ideal zero does not prove calibration. Slope 0.836 suggests overly extreme predictions, but its 0.591–1.133 interval includes 1 [17]. Only 67 events informed evaluation [18], and most adults in the highest-risk bin reported receipt.</w:t>
+        <w:t xml:space="preserve">AUC 0.752 indicates ranking discrimination, rather than cutoff accuracy. AP 0.203 summarises precision–recall across thresholds, rather than precision at one cutoff [16]. Brier fell from 0.0618 to 0.0578, a modest 0.0040 reduction. No paired interval was calculated for that reduction; it remains a descriptive comparison. Calibration-in-the-large 0.020 estimates an intercept correction with slope fixed at 1; an interval spanning the ideal zero does not prove calibration. Slope 0.836 suggests overly extreme predictions, but its 0.591–1.133 interval includes 1 [17]. Only 67 events informed evaluation [18], and most adults in the highest-risk bin reported receipt.
+</w:t>
       </w:r>
     </w:p>
     <w:p>
@@ -13060,7 +15097,8 @@
           <w:sz w:val="20"/>
           <w:szCs w:val="20"/>
         </w:rPr>
-        <w:t xml:space="preserve">Household resampling, the PSU survey approximation and full-fit Wald intervals address different uncertainties. None converts predictive discrimination or fitted associations into effects of sex, schooling, settlement or office distance.</w:t>
+        <w:t xml:space="preserve">Household resampling, the PSU survey approximation and full-fit Wald intervals address different uncertainties. None converts predictive discrimination or fitted associations into effects of sex, schooling, settlement or office distance.
+</w:t>
       </w:r>
     </w:p>
     <w:p>
@@ -13075,7 +15113,8 @@
           <w:sz w:val="20"/>
           <w:szCs w:val="20"/>
         </w:rPr>
-        <w:t xml:space="preserve">Table VIII separates sample, predictor and evaluation changes. S7’s lower Brier concerns a different sample (992/63), not evidence that imputation harms prediction. S8 substitutes marriage for office distance. S9 weights fitting only; S10 weights the same OOF predictions, raising Brier to 0.0641. S11 changes grouping to derived PSU. S8–S11 retain 1,013 adults/67 events. These internal checks do not establish specification superiority or performance elsewhere [19], [20].</w:t>
+        <w:t xml:space="preserve">Table VIII separates sample, predictor and evaluation changes. S7’s lower Brier concerns a different sample (992/63), not evidence that imputation harms prediction. S8 substitutes marriage for office distance. S9 weights fitting only; S10 weights the same OOF predictions, raising Brier to 0.0641. S11 changes grouping to derived PSU. S8–S11 retain 1,013 adults/67 events. These internal checks do not establish specification superiority or performance elsewhere [19], [20].
+</w:t>
       </w:r>
     </w:p>
     <w:p>
@@ -13101,7 +15140,8 @@
           <w:sz w:val="20"/>
           <w:szCs w:val="20"/>
         </w:rPr>
-        <w:t xml:space="preserve">C. Technical verification, separate from usability</w:t>
+        <w:t xml:space="preserve">C. Technical verification, separate from usability
+</w:t>
       </w:r>
     </w:p>
     <w:p>
@@ -13116,7 +15156,8 @@
           <w:sz w:val="20"/>
           <w:szCs w:val="20"/>
         </w:rPr>
-        <w:t xml:space="preserve">RQ3 concerns reproducibility and inspectable explanations. Table IX supports technical correctness within tested conditions: synthetic cases check rules, repeated files check repeatability, interface–command agreement checks screening/receipt outputs, and model reload checks serialization. The owner’s walkthrough confirms local synthetic execution. Versioned sources and validation records support scrutiny; these checks do not establish independent user comprehension.</w:t>
+        <w:t xml:space="preserve">RQ3 concerns reproducibility and inspectable explanations. Table IX supports technical correctness within tested conditions: synthetic cases check rules, repeated files check repeatability, interface–command agreement checks screening/receipt outputs, and model reload checks serialization. The owner’s walkthrough confirms local synthetic execution. Versioned sources and validation records support scrutiny; these checks do not establish independent user comprehension.
+</w:t>
       </w:r>
     </w:p>
     <w:p>
@@ -13131,7 +15172,8 @@
           <w:sz w:val="20"/>
           <w:szCs w:val="20"/>
         </w:rPr>
-        <w:t xml:space="preserve">Historical OOF evaluation remains separate from uploaded full-data scores, whose records may overlap training data. Reload agreement verifies stored predictions, rather than new predictive accuracy or user understanding.</w:t>
+        <w:t xml:space="preserve">Historical OOF evaluation remains separate from uploaded full-data scores, whose records may overlap training data. Reload agreement verifies stored predictions, rather than new predictive accuracy or user understanding.
+</w:t>
       </w:r>
     </w:p>
     <w:p>
@@ -13146,7 +15188,8 @@
           <w:sz w:val="20"/>
           <w:szCs w:val="20"/>
         </w:rPr>
-        <w:t xml:space="preserve">Participant usability remains untested. The unused protocol proposes independent participants, with task completion, time, errors, ease and assistance measures. Automated Streamlit checks and the developer’s walkthrough cannot establish usability or field acceptance.</w:t>
+        <w:t xml:space="preserve">Participant usability remains untested. The unused protocol proposes independent participants, with task completion, time, errors, ease and assistance measures. Automated Streamlit checks and the developer’s walkthrough cannot establish usability or field acceptance.
+</w:t>
       </w:r>
     </w:p>
     <w:p>
@@ -13172,7 +15215,8 @@
           <w:sz w:val="20"/>
           <w:szCs w:val="20"/>
         </w:rPr>
-        <w:t xml:space="preserve">D. Transfer to other settings</w:t>
+        <w:t xml:space="preserve">D. Transfer to other settings
+</w:t>
       </w:r>
     </w:p>
     <w:p>
@@ -13187,7 +15231,8 @@
           <w:sz w:val="20"/>
           <w:szCs w:val="20"/>
         </w:rPr>
-        <w:t xml:space="preserve">This study covers screened KwaZulu-Natal adults in LCS 2014/2015. Provinces and periods differ in services, policy and reporting; administrative application, award and payment records measure other outcomes. No independent province, period or administrative sample validated the model. Transfer requires comparable populations, period-specific screening and independent discrimination/calibration checks [19], [20].</w:t>
+        <w:t xml:space="preserve">This study covers screened KwaZulu-Natal adults in LCS 2014/2015. Provinces and periods differ in services, policy and reporting; administrative application, award and payment records measure other outcomes. No independent province, period or administrative sample validated the model. Transfer requires comparable populations, period-specific screening and independent discrimination/calibration checks [19], [20].
+</w:t>
       </w:r>
     </w:p>
     <w:p>
@@ -13213,7 +15258,8 @@
           <w:sz w:val="20"/>
           <w:szCs w:val="20"/>
         </w:rPr>
-        <w:t xml:space="preserve">E. Synthesis of the Conceptual Framework</w:t>
+        <w:t xml:space="preserve">E. Synthesis of the Conceptual Framework
+</w:t>
       </w:r>
     </w:p>
     <w:p>
@@ -13228,7 +15274,8 @@
           <w:sz w:val="20"/>
           <w:szCs w:val="20"/>
         </w:rPr>
-        <w:t xml:space="preserve">Returning to Figure 1, screening sensitivity shows why the denominator requires explicit assumptions. Sex differences describe demographic associations without establishing burden mechanisms [3], [4]. Lower schooling accompanied receipt, contrary to the expectation that fewer information resources increase non-receipt [13]. Selection or other resources could explain this finding; neither explanation was tested. Office-distance and settlement intervals included 1, leaving compliance-cost expectations unresolved. LCS did not measure psychological costs. The artefact implements these bounded measurements through separate, traceable rules, outcomes and predictions. It supports inspection of the framework without establishing causes, statutory entitlement or participant usability.</w:t>
+        <w:t xml:space="preserve">Returning to Figure 1, screening sensitivity shows why the denominator requires explicit assumptions. Sex differences describe demographic associations without establishing burden mechanisms [3], [4]. Lower schooling accompanied receipt, contrary to the expectation that fewer information resources increase non-receipt [13]. Selection or other resources could explain this finding; neither explanation was tested. Office-distance and settlement intervals included 1, leaving compliance-cost expectations unresolved. LCS did not measure psychological costs. The artefact implements these bounded measurements through separate, traceable rules, outcomes and predictions. It supports inspection of the framework without establishing causes, statutory entitlement or participant usability.
+</w:t>
       </w:r>
     </w:p>
     <w:p>
@@ -13254,7 +15301,8 @@
           <w:sz w:val="20"/>
           <w:szCs w:val="20"/>
         </w:rPr>
-        <w:t xml:space="preserve">VII. Limitations and Ethics</w:t>
+        <w:t xml:space="preserve">VII. Limitations and Ethics
+</w:t>
       </w:r>
     </w:p>
     <w:p>
@@ -13269,7 +15317,8 @@
           <w:sz w:val="20"/>
           <w:szCs w:val="20"/>
         </w:rPr>
-        <w:t xml:space="preserve">The research proxy omits assets, deemed income and deductions and cannot establish statutory eligibility. Income/receipt misreporting, cross-sectional ordering, few events, unresolved screening and missing strata limit interpretation. Fixed-prediction resampling omits repeated model-development uncertainty; coefficient intervals condition on the selected specification. Household sampling excludes institutionalised older adults. Participant usability and external predictive performance remain untested.</w:t>
+        <w:t xml:space="preserve">The research proxy omits assets, deemed income and deductions and cannot establish statutory eligibility. Income/receipt misreporting, cross-sectional ordering, few events, unresolved screening and missing strata limit interpretation. Fixed-prediction resampling omits repeated model-development uncertainty; coefficient intervals condition on the selected specification. Household sampling excludes institutionalised older adults. Participant usability and external predictive performance remain untested.
+</w:t>
       </w:r>
     </w:p>
     <w:p>
@@ -13284,7 +15333,8 @@
           <w:sz w:val="20"/>
           <w:szCs w:val="20"/>
         </w:rPr>
-        <w:t xml:space="preserve">This DUT honours study uses existing LCS 2014/2015 microdata without contacting respondents. Access and disclosure conditions still apply. Public demonstrations use synthetic records; controlled reference-parity tests also used the research data. The downloadable package excludes survey records, and app displays/exports omit submitted identifiers and raw income. These controls do not establish disclosure review or release permission for historical repository files.</w:t>
+        <w:t xml:space="preserve">This DUT honours study uses existing LCS 2014/2015 microdata without contacting respondents. Access and disclosure conditions still apply. Public demonstrations use synthetic records; controlled reference-parity tests also used the research data. The downloadable package excludes survey records, and app displays/exports omit submitted identifiers and raw income. These controls do not establish disclosure review or release permission for historical repository files.
+</w:t>
       </w:r>
     </w:p>
     <w:p>
@@ -13299,7 +15349,8 @@
           <w:sz w:val="20"/>
           <w:szCs w:val="20"/>
         </w:rPr>
-        <w:t xml:space="preserve">The project record contains no DUT-IREC clearance number, faculty or departmental determination, or gatekeeper letter. The study therefore claims no approval, exemption or consent determination. Confirmation of the applicable institutional ethics route and secondary-data governance remains outstanding. These requirements are separate from the technical controls above. The application supports research analysis and does not determine grant entitlement.</w:t>
+        <w:t xml:space="preserve">The project record contains no DUT-IREC clearance number, faculty or departmental determination, or gatekeeper letter. The study therefore claims no approval, exemption or consent determination. Confirmation of the applicable institutional ethics route and secondary-data governance remains outstanding. These requirements are separate from the technical controls above. The application supports research analysis and does not determine grant entitlement.
+</w:t>
       </w:r>
     </w:p>
     <w:p>
@@ -13325,7 +15376,8 @@
           <w:sz w:val="20"/>
           <w:szCs w:val="20"/>
         </w:rPr>
-        <w:t xml:space="preserve">VIII. Conclusion</w:t>
+        <w:t xml:space="preserve">VIII. Conclusion
+</w:t>
       </w:r>
     </w:p>
     <w:p>
@@ -13340,7 +15392,8 @@
           <w:sz w:val="20"/>
           <w:szCs w:val="20"/>
         </w:rPr>
-        <w:t xml:space="preserve">Screened historical non-receipt was 6.6% unweighted and 7.5% person-weighted; alternatives gave 7.1%–9.1%. Grant-compatibility and partnership assumptions changed the population described. Five predictor groups/six slopes gave AUC 0.752, AP 0.203 and Brier 0.0578, supporting moderate internal ranking and a small descriptive probability-error reduction.</w:t>
+        <w:t xml:space="preserve">Screened historical non-receipt was 6.6% unweighted and 7.5% person-weighted; alternatives gave 7.1%–9.1%. Grant-compatibility and partnership assumptions changed the population described. Five predictor groups/six slopes gave AUC 0.752, AP 0.203 and Brier 0.0578, supporting moderate internal ranking and a small descriptive probability-error reduction.
+</w:t>
       </w:r>
     </w:p>
     <w:p>

</xml_diff>

<commit_message>
Cite Government Notice R211 for the 2014 formula amendment.
Keep it distinct from the rate notice, Government Notice 211, in Section III.B and reference [26].
</commit_message>
<xml_diff>
--- a/paper/Jawe_OPG_nonreceipt_KZN.docx
+++ b/paper/Jawe_OPG_nonreceipt_KZN.docx
@@ -3621,7 +3621,7 @@
           <w:sz w:val="20"/>
           <w:szCs w:val="20"/>
         </w:rPr>
-        <w:t xml:space="preserve">GN 211 set the standard monthly maximum at R1,350 from 1 April 2014 [24]; GN 277 raised it to R1,410 from 1 April 2015 [25]. The 2014 amendment, Schedule paragraph 2, substituted D = 1.6A − 0.4B from 1 April 2014 [26]. With annual standard maximum A and minimum D = R1,200 (Annexure A(5)) [27], B = (1.6A − 1,200)/0.4. This yields annual single/couple research ceilings of R61,800/R123,600 for October 2014–March 2015 and R64,680/R129,360 for April–October 2015. Half-joint income doubles couple limits; equality passed. The screen applied these boundaries to its private-income proxy. Both notices add R20 for age 75+; the primary screen retained the standard maximum across ages, while S1c tested the supplement. S1 also tested period and payment-boundary alternatives.
+        <w:t xml:space="preserve">GN 211 set the standard monthly maximum at R1,350 from 1 April 2014 [24]; GN 277 raised it to R1,410 from 1 April 2015 [25]. Government Notice R211, a separate amendment in the same gazette, substituted D = 1.6A − 0.4B from 1 April 2014 in Schedule paragraph 2 [26]. With annual standard maximum A and minimum D = R1,200 (Annexure A(5)) [27], B = (1.6A − 1,200)/0.4. This yields annual single/couple research ceilings of R61,800/R123,600 for October 2014–March 2015 and R64,680/R129,360 for April–October 2015. Half-joint income doubles couple limits; equality passed. The screen applied these boundaries to its private-income proxy. Both notices add R20 for age 75+; the primary screen retained the standard maximum across ages, while S1c tested the supplement. S1 also tested period and payment-boundary alternatives.
 </w:t>
       </w:r>
     </w:p>
@@ -13933,7 +13933,7 @@
           <w:sz w:val="16"/>
           <w:szCs w:val="16"/>
         </w:rPr>
-        <w:t xml:space="preserve">[26] Dept. of Social Development, “Amendment: Social Assistance Regulations,” Government Gazette 37474, pp. 4–5, Mar. 28, 2014.</w:t>
+        <w:t xml:space="preserve">[26] Dept. of Social Development, “Amendment: Social Assistance Regulations,” Government Notice R211, Government Gazette 37474, pp. 4–5, Mar. 28, 2014.</w:t>
       </w:r>
     </w:p>
     <w:p>

</xml_diff>

<commit_message>
Address the seven supervisor solutions in the paper and supplement.
Report the ridge settlement comparison and the twenty repeated refits, and keep the manuscript on eight pages.
</commit_message>
<xml_diff>
--- a/paper/Jawe_OPG_nonreceipt_KZN.docx
+++ b/paper/Jawe_OPG_nonreceipt_KZN.docx
@@ -157,7 +157,7 @@
     </w:p>
     <w:p>
       <w:pPr>
-        <w:spacing w:after="80" w:before="0" w:line="230"/>
+        <w:spacing w:after="60" w:before="0" w:line="230"/>
         <w:jc w:val="both"/>
       </w:pPr>
       <w:r>
@@ -172,7 +172,7 @@
     </w:p>
     <w:p>
       <w:pPr>
-        <w:spacing w:after="80" w:before="0" w:line="230"/>
+        <w:spacing w:after="60" w:before="0" w:line="230"/>
         <w:jc w:val="both"/>
       </w:pPr>
       <w:r>
@@ -187,7 +187,7 @@
     </w:p>
     <w:p>
       <w:pPr>
-        <w:spacing w:after="80" w:before="0" w:line="230"/>
+        <w:spacing w:after="60" w:before="0" w:line="230"/>
         <w:jc w:val="both"/>
       </w:pPr>
       <w:r>
@@ -202,7 +202,7 @@
     </w:p>
     <w:p>
       <w:pPr>
-        <w:spacing w:after="80" w:before="0" w:line="230"/>
+        <w:spacing w:after="60" w:before="0" w:line="230"/>
         <w:jc w:val="both"/>
       </w:pPr>
       <w:r>
@@ -275,7 +275,7 @@
     </w:p>
     <w:p>
       <w:pPr>
-        <w:spacing w:after="80" w:before="0" w:line="230"/>
+        <w:spacing w:after="60" w:before="0" w:line="230"/>
         <w:jc w:val="both"/>
       </w:pPr>
       <w:r>
@@ -290,7 +290,7 @@
     </w:p>
     <w:p>
       <w:pPr>
-        <w:spacing w:after="80" w:before="0" w:line="230"/>
+        <w:spacing w:after="60" w:before="0" w:line="230"/>
         <w:jc w:val="both"/>
       </w:pPr>
       <w:r>
@@ -305,7 +305,7 @@
     </w:p>
     <w:p>
       <w:pPr>
-        <w:spacing w:after="80" w:before="0" w:line="230"/>
+        <w:spacing w:after="60" w:before="0" w:line="230"/>
         <w:jc w:val="both"/>
       </w:pPr>
       <w:r>
@@ -1133,7 +1133,7 @@
     </w:tbl>
     <w:p>
       <w:pPr>
-        <w:spacing w:after="80" w:before="0" w:line="230"/>
+        <w:spacing w:after="60" w:before="0" w:line="230"/>
         <w:jc w:val="both"/>
       </w:pPr>
       <w:r>
@@ -1148,7 +1148,7 @@
     </w:p>
     <w:p>
       <w:pPr>
-        <w:spacing w:after="80" w:before="0" w:line="230"/>
+        <w:spacing w:after="60" w:before="0" w:line="230"/>
         <w:jc w:val="both"/>
       </w:pPr>
       <w:r>
@@ -1192,7 +1192,7 @@
     </w:p>
     <w:p>
       <w:pPr>
-        <w:spacing w:after="80" w:before="0" w:line="230"/>
+        <w:spacing w:after="60" w:before="0" w:line="230"/>
         <w:jc w:val="both"/>
       </w:pPr>
       <w:r>
@@ -1207,7 +1207,7 @@
     </w:p>
     <w:p>
       <w:pPr>
-        <w:spacing w:after="80" w:before="0" w:line="230"/>
+        <w:spacing w:after="60" w:before="0" w:line="230"/>
         <w:jc w:val="both"/>
       </w:pPr>
       <w:r>
@@ -1251,7 +1251,7 @@
     </w:p>
     <w:p>
       <w:pPr>
-        <w:spacing w:after="80" w:before="0" w:line="230"/>
+        <w:spacing w:after="60" w:before="0" w:line="230"/>
         <w:jc w:val="both"/>
       </w:pPr>
       <w:r>
@@ -2102,7 +2102,7 @@
     </w:p>
     <w:p>
       <w:pPr>
-        <w:spacing w:after="80" w:before="0" w:line="230"/>
+        <w:spacing w:after="60" w:before="0" w:line="230"/>
         <w:jc w:val="both"/>
       </w:pPr>
       <w:r>
@@ -2146,7 +2146,7 @@
     </w:p>
     <w:p>
       <w:pPr>
-        <w:spacing w:after="80" w:before="0" w:line="230"/>
+        <w:spacing w:after="60" w:before="0" w:line="230"/>
         <w:jc w:val="both"/>
       </w:pPr>
       <w:r>
@@ -2161,7 +2161,7 @@
     </w:p>
     <w:p>
       <w:pPr>
-        <w:spacing w:after="80" w:before="0" w:line="230"/>
+        <w:spacing w:after="60" w:before="0" w:line="230"/>
         <w:jc w:val="both"/>
       </w:pPr>
       <w:r>
@@ -2176,7 +2176,7 @@
     </w:p>
     <w:p>
       <w:pPr>
-        <w:spacing w:after="80" w:before="0" w:line="230"/>
+        <w:spacing w:after="60" w:before="0" w:line="230"/>
         <w:jc w:val="both"/>
       </w:pPr>
       <w:r>
@@ -2315,7 +2315,7 @@
     </w:p>
     <w:p>
       <w:pPr>
-        <w:spacing w:after="80" w:before="0" w:line="230"/>
+        <w:spacing w:after="60" w:before="0" w:line="230"/>
         <w:jc w:val="both"/>
       </w:pPr>
       <w:r>
@@ -2330,7 +2330,7 @@
     </w:p>
     <w:p>
       <w:pPr>
-        <w:spacing w:after="80" w:before="0" w:line="230"/>
+        <w:spacing w:after="60" w:before="0" w:line="230"/>
         <w:jc w:val="both"/>
       </w:pPr>
       <w:r>
@@ -3597,7 +3597,7 @@
     </w:p>
     <w:p>
       <w:pPr>
-        <w:spacing w:after="80" w:before="0" w:line="230"/>
+        <w:spacing w:after="60" w:before="0" w:line="230"/>
         <w:jc w:val="both"/>
       </w:pPr>
       <w:r>
@@ -3612,7 +3612,7 @@
     </w:p>
     <w:p>
       <w:pPr>
-        <w:spacing w:after="80" w:before="0" w:line="230"/>
+        <w:spacing w:after="60" w:before="0" w:line="230"/>
         <w:jc w:val="both"/>
       </w:pPr>
       <w:r>
@@ -3627,7 +3627,7 @@
     </w:p>
     <w:p>
       <w:pPr>
-        <w:spacing w:after="80" w:before="0" w:line="230"/>
+        <w:spacing w:after="60" w:before="0" w:line="230"/>
         <w:jc w:val="both"/>
       </w:pPr>
       <w:r>
@@ -3642,7 +3642,7 @@
     </w:p>
     <w:p>
       <w:pPr>
-        <w:spacing w:after="80" w:before="0" w:line="230"/>
+        <w:spacing w:after="60" w:before="0" w:line="230"/>
         <w:jc w:val="both"/>
       </w:pPr>
       <w:r>
@@ -3657,7 +3657,7 @@
     </w:p>
     <w:p>
       <w:pPr>
-        <w:spacing w:after="80" w:before="0" w:line="230"/>
+        <w:spacing w:after="60" w:before="0" w:line="230"/>
         <w:jc w:val="both"/>
       </w:pPr>
       <w:r>
@@ -3701,7 +3701,7 @@
     </w:p>
     <w:p>
       <w:pPr>
-        <w:spacing w:after="80" w:before="0" w:line="230"/>
+        <w:spacing w:after="60" w:before="0" w:line="230"/>
         <w:jc w:val="both"/>
       </w:pPr>
       <w:r>
@@ -3716,7 +3716,7 @@
     </w:p>
     <w:p>
       <w:pPr>
-        <w:spacing w:after="80" w:before="0" w:line="230"/>
+        <w:spacing w:after="60" w:before="0" w:line="230"/>
         <w:jc w:val="both"/>
       </w:pPr>
       <w:r>
@@ -3760,7 +3760,7 @@
     </w:p>
     <w:p>
       <w:pPr>
-        <w:spacing w:after="80" w:before="0" w:line="230"/>
+        <w:spacing w:after="60" w:before="0" w:line="230"/>
         <w:jc w:val="both"/>
       </w:pPr>
       <w:r>
@@ -3775,7 +3775,7 @@
     </w:p>
     <w:p>
       <w:pPr>
-        <w:spacing w:after="80" w:before="0" w:line="230"/>
+        <w:spacing w:after="60" w:before="0" w:line="230"/>
         <w:jc w:val="both"/>
       </w:pPr>
       <w:r>
@@ -3784,13 +3784,13 @@
           <w:sz w:val="20"/>
           <w:szCs w:val="20"/>
         </w:rPr>
-        <w:t xml:space="preserve">Only one rural-formal adult reported non-receipt in the attempted seven-slope model. Excluding that person for testing left the training group with no such case in that category. Decision D-052 combined rural formal with traditional settlement to support estimation, without claiming that these settings are equivalent. Marital status affects screening; income, receipt, derived labels and marital status do not enter the primary model.
+        <w:t xml:space="preserve">Rural formal settlement had 31 adults and one non-recipient. One seven-slope training fold then contained 30 rural-formal adults and no event; its coefficient was about −21.88 and did not converge. Four of five folds converged. Decision D-052 combined rural formal with traditional settlement after that outcome pattern was known, so the retained cross-validation can be optimistic and does not show that the settings are equivalent. The seven-slope out-of-fold AUC was 0.739 and its calibration slope 0.673, against 0.752 and 0.836 after the merge. Because one fit failed, this comparison is diagnostic only. Ridge logistic regression was then applied to both codings on the same household folds. The penalty was chosen inside each training set from a fixed grid. Every fold selected the same penalty, and all ten fits converged. Held-out AUC was 0.756 for the merged coding and 0.750 for the separate coding (Supplementary Table S2). The ordinary merged model remains the reference. This comparison does not make Decision D-052 outcome-independent. Income, receipt, derived labels and marital status do not enter the primary model.
 </w:t>
       </w:r>
     </w:p>
     <w:p>
       <w:pPr>
-        <w:spacing w:after="80" w:before="0" w:line="230"/>
+        <w:spacing w:after="60" w:before="0" w:line="230"/>
         <w:jc w:val="both"/>
       </w:pPr>
       <w:r>
@@ -3799,13 +3799,13 @@
           <w:sz w:val="20"/>
           <w:szCs w:val="20"/>
         </w:rPr>
-        <w:t xml:space="preserve">Validation used five household-grouped folds. Sorted households were labelled by whether any member reported non-receipt, then stratified so every adult from a household stayed in one fold. Seed 201415 fixes this division. The 1,013 adults come from 827 households: 182 contain more than one modelled adult, and 6 contain both receipt and non-receipt. Each adult received one out-of-fold (OOF) probability from a model trained without that household. Held-out folds had 199 to 207 adults and 12 to 14 non-recipients. The intercept-only reference uses the training group's non-receipt rate.
+        <w:t xml:space="preserve">Validation used five household-grouped folds. Sorted households were labelled by whether any member reported non-receipt, then stratified so every adult from a household stayed in one fold. Seed 201415 fixes this division. The 1,013 adults come from 827 households: 182 contain more than one modelled adult, and 6 contain both receipt and non-receipt. Each adult received one out-of-fold (OOF) probability from a model trained without that household. The intercept-only reference uses the training group's non-receipt rate.
 </w:t>
       </w:r>
     </w:p>
     <w:p>
       <w:pPr>
-        <w:spacing w:after="80" w:before="0" w:line="230"/>
+        <w:spacing w:after="60" w:before="0" w:line="230"/>
         <w:jc w:val="both"/>
       </w:pPr>
       <w:r>
@@ -3820,7 +3820,7 @@
     </w:p>
     <w:p>
       <w:pPr>
-        <w:spacing w:after="80" w:before="0" w:line="230"/>
+        <w:spacing w:after="60" w:before="0" w:line="230"/>
         <w:jc w:val="both"/>
       </w:pPr>
       <w:r>
@@ -3829,7 +3829,7 @@
           <w:sz w:val="20"/>
           <w:szCs w:val="20"/>
         </w:rPr>
-        <w:t xml:space="preserve">Pooled OOF probabilities supplied average precision, AUC, Brier score, calibration slope and calibration-in-the-large. Calibration-in-the-large is an intercept correction with its slope fixed at 1; the ideal values are 0 and 1. The 95% intervals are 2.5 and 97.5 percentiles from 1,000 with-replacement household samples of those fixed predictions, using the same seed. Every selected household's adults were retained. All 1,000 samples contained both outcome classes, but preprocessing, refitting and Decision D-052 were not repeated. The intervals omit a new split, fill-in and fit, and they omit primary sampling units, unreleased strata and person weights. They are not design-based confidence intervals.
+        <w:t xml:space="preserve">Pooled OOF probabilities supplied average precision, AUC, Brier score, calibration slope and calibration-in-the-large. Calibration-in-the-large is an intercept correction with its slope fixed at 1; the ideal values are 0 and 1. The 95% intervals are 2.5 and 97.5 percentiles from 1,000 with-replacement household samples of those fixed predictions, using the same seed. Every selected household's adults were retained. All 1,000 samples contained both outcome classes. These intervals condition on seed 201415, its preprocessing and fits, and Decision D-052. They do not repeat the split, imputation or estimation, and they are not survey-design confidence intervals. A separate sensitivity repeated the same household-grouped procedure 20 times, using seeds 201415–201434, with training-only imputation and refitting. Decision D-052 stayed fixed.
 </w:t>
       </w:r>
     </w:p>
@@ -3864,7 +3864,7 @@
     </w:p>
     <w:p>
       <w:pPr>
-        <w:spacing w:after="80" w:before="0" w:line="230"/>
+        <w:spacing w:after="60" w:before="0" w:line="230"/>
         <w:jc w:val="both"/>
       </w:pPr>
       <w:r>
@@ -3908,7 +3908,7 @@
     </w:p>
     <w:p>
       <w:pPr>
-        <w:spacing w:after="80" w:before="0" w:line="230"/>
+        <w:spacing w:after="60" w:before="0" w:line="230"/>
         <w:jc w:val="both"/>
       </w:pPr>
       <w:r>
@@ -3923,7 +3923,7 @@
     </w:p>
     <w:p>
       <w:pPr>
-        <w:spacing w:after="80" w:before="0" w:line="230"/>
+        <w:spacing w:after="60" w:before="0" w:line="230"/>
         <w:jc w:val="both"/>
       </w:pPr>
       <w:r>
@@ -4004,7 +4004,7 @@
     </w:p>
     <w:p>
       <w:pPr>
-        <w:spacing w:after="80" w:before="0" w:line="230"/>
+        <w:spacing w:after="60" w:before="0" w:line="230"/>
         <w:jc w:val="both"/>
       </w:pPr>
       <w:r>
@@ -4013,13 +4013,13 @@
           <w:sz w:val="20"/>
           <w:szCs w:val="20"/>
         </w:rPr>
-        <w:t xml:space="preserve">The app reuses the screening rules and saved model settings. It scores only supported adults who pass with resolved receipt. Saved training statistics fill partly missing predictors; records missing every categorical predictor remain unscored. Integrity checks link model and evaluation files to the analysis and predictor code. The interface labels historical OOF results separately from uploaded scores; uploaded records may overlap training data. CSV, JSON and ZIP reports contain classifications, reasons, supported probabilities, versions and an audit manifest (settings and file checksums). The downloadable minimum viable product, or MVP, uses invented data and excludes raw survey files, historical respondent outputs and Git version history.
+        <w:t xml:space="preserve">The app reuses the screening rules and saved model settings. It scores only supported adults who pass with resolved receipt. Saved training statistics fill partly missing predictors; records missing every categorical predictor remain unscored. Integrity checks link model and evaluation files to the analysis and predictor code. The interface labels historical OOF results separately from uploaded scores; uploaded records may overlap training data. CSV, JSON and ZIP reports contain classifications, reasons, supported probabilities, versions and an audit manifest (settings and file checksums). The downloadable package uses invented data and excludes survey microdata.
 </w:t>
       </w:r>
     </w:p>
     <w:p>
       <w:pPr>
-        <w:spacing w:after="80" w:before="0" w:line="230"/>
+        <w:spacing w:after="60" w:before="0" w:line="230"/>
         <w:jc w:val="both"/>
       </w:pPr>
       <w:r>
@@ -4092,7 +4092,7 @@
     </w:p>
     <w:p>
       <w:pPr>
-        <w:spacing w:after="80" w:before="0" w:line="230"/>
+        <w:spacing w:after="60" w:before="0" w:line="230"/>
         <w:jc w:val="both"/>
       </w:pPr>
       <w:r>
@@ -5267,7 +5267,7 @@
     </w:p>
     <w:p>
       <w:pPr>
-        <w:spacing w:after="80" w:before="0" w:line="230"/>
+        <w:spacing w:after="60" w:before="0" w:line="230"/>
         <w:jc w:val="both"/>
       </w:pPr>
       <w:r>
@@ -5276,7 +5276,7 @@
           <w:sz w:val="20"/>
           <w:szCs w:val="20"/>
         </w:rPr>
-        <w:t xml:space="preserve">Of these 1,013 adults, 67 reported non-receipt: 6.61% without weights and 7.49% with person weights. The calculation used 345 derived PSUs and gave a standard error of 1.3 percentage points. A bell-shaped sampling approximation gave a 95% confidence interval of 4.9%–10.0%. Missing strata limit this approximation. All 1,013 PASS answers agreed with preceding-year OPG income, so those checks changed nothing. Table V compares five predictors before filling missing values. Average age and percentages describe each receipt group. The percentages describe receipt-group composition, not non-receipt rates or predictions.
+        <w:t xml:space="preserve">Of these 1,013 adults, 67 reported non-receipt: 6.61% without weights and 7.49% with person weights. The calculation used 345 derived PSUs and gave a standard error of 1.3 percentage points. A bell-shaped sampling approximation gave a 95% confidence interval of 4.9%–10.0%. Missing strata limit this approximation. All 1,013 PASS answers agreed with preceding-year OPG income, so those checks changed nothing. Table V separates unweighted sample summaries from person-weighted summaries before missing values are filled. Percentages describe receipt-group composition, not non-receipt rates or predictions.
 </w:t>
       </w:r>
     </w:p>
@@ -5296,7 +5296,7 @@
           <w:sz w:val="16"/>
           <w:szCs w:val="16"/>
         </w:rPr>
-        <w:t xml:space="preserve">Table V. Characteristics by receipt (U = unweighted; W = person-weighted)
+        <w:t xml:space="preserve">Table V. Characteristics by reported OPG receipt, before imputation
 </w:t>
       </w:r>
     </w:p>
@@ -5401,7 +5401,7 @@
                 <w:sz w:val="18"/>
                 <w:szCs w:val="18"/>
               </w:rPr>
-              <w:t xml:space="preserve">Recipients: U; W</w:t>
+              <w:t xml:space="preserve">Recipients, N = 946</w:t>
             </w:r>
           </w:p>
         </w:tc>
@@ -5442,7 +5442,7 @@
                 <w:sz w:val="18"/>
                 <w:szCs w:val="18"/>
               </w:rPr>
-              <w:t xml:space="preserve">Non-recipients: U; W</w:t>
+              <w:t xml:space="preserve">Non-recipients, N = 67</w:t>
             </w:r>
           </w:p>
         </w:tc>
@@ -5489,7 +5489,7 @@
                 <w:sz w:val="18"/>
                 <w:szCs w:val="18"/>
               </w:rPr>
-              <w:t xml:space="preserve">Age, average years</w:t>
+              <w:t xml:space="preserve">Age, mean years</w:t>
             </w:r>
           </w:p>
         </w:tc>
@@ -5530,7 +5530,7 @@
                 <w:sz w:val="18"/>
                 <w:szCs w:val="18"/>
               </w:rPr>
-              <w:t xml:space="preserve">70.4; 69.8</w:t>
+              <w:t xml:space="preserve">70.4 unw.; 69.8 wtd</w:t>
             </w:r>
           </w:p>
         </w:tc>
@@ -5571,7 +5571,7 @@
                 <w:sz w:val="18"/>
                 <w:szCs w:val="18"/>
               </w:rPr>
-              <w:t xml:space="preserve">67.3; 68.4</w:t>
+              <w:t xml:space="preserve">67.3 unw.; 68.4 wtd</w:t>
             </w:r>
           </w:p>
         </w:tc>
@@ -5659,7 +5659,7 @@
                 <w:sz w:val="18"/>
                 <w:szCs w:val="18"/>
               </w:rPr>
-              <w:t xml:space="preserve">686 (72.5%); 70.4%</w:t>
+              <w:t xml:space="preserve">686 (72.5%) unw.; 70.4% wtd</w:t>
             </w:r>
           </w:p>
         </w:tc>
@@ -5700,7 +5700,7 @@
                 <w:sz w:val="18"/>
                 <w:szCs w:val="18"/>
               </w:rPr>
-              <w:t xml:space="preserve">33 (49.3%); 53.4%</w:t>
+              <w:t xml:space="preserve">33 (49.3%) unw.; 53.4% wtd</w:t>
             </w:r>
           </w:p>
         </w:tc>
@@ -5788,7 +5788,7 @@
                 <w:sz w:val="18"/>
                 <w:szCs w:val="18"/>
               </w:rPr>
-              <w:t xml:space="preserve">290 (30.7%); 33.0%</w:t>
+              <w:t xml:space="preserve">290 (30.7%) unw.; 33.0% wtd</w:t>
             </w:r>
           </w:p>
         </w:tc>
@@ -5829,7 +5829,7 @@
                 <w:sz w:val="18"/>
                 <w:szCs w:val="18"/>
               </w:rPr>
-              <w:t xml:space="preserve">49 (73.1%); 80.8%</w:t>
+              <w:t xml:space="preserve">49 (73.1%) unw.; 80.8% wtd</w:t>
             </w:r>
           </w:p>
         </w:tc>
@@ -5876,7 +5876,7 @@
                 <w:sz w:val="18"/>
                 <w:szCs w:val="18"/>
               </w:rPr>
-              <w:t xml:space="preserve">Urban formal settlement</w:t>
+              <w:t xml:space="preserve">Schooling missing</w:t>
             </w:r>
           </w:p>
         </w:tc>
@@ -5917,7 +5917,7 @@
                 <w:sz w:val="18"/>
                 <w:szCs w:val="18"/>
               </w:rPr>
-              <w:t xml:space="preserve">284 (30.0%); 36.2%</w:t>
+              <w:t xml:space="preserve">3 (0.3%) unw.; 0.4% wtd</w:t>
             </w:r>
           </w:p>
         </w:tc>
@@ -5958,7 +5958,7 @@
                 <w:sz w:val="18"/>
                 <w:szCs w:val="18"/>
               </w:rPr>
-              <w:t xml:space="preserve">38 (56.7%); 66.2%</w:t>
+              <w:t xml:space="preserve">0 (0.0%) unw.; 0.0% wtd</w:t>
             </w:r>
           </w:p>
         </w:tc>
@@ -5987,6 +5987,264 @@
           </w:tcPr>
           <w:p>
             <w:pPr>
+              <w:keepNext/>
+              <w:spacing w:after="0" w:before="0" w:line="240" w:lineRule="auto"/>
+              <w:jc w:val="left"/>
+              <w:rPr>
+                <w:b w:val="false"/>
+                <w:bCs w:val="false"/>
+                <w:sz w:val="18"/>
+                <w:szCs w:val="18"/>
+              </w:rPr>
+            </w:pPr>
+            <w:r>
+              <w:rPr>
+                <w:rFonts w:ascii="Times New Roman" w:cs="Times New Roman" w:eastAsia="Times New Roman" w:hAnsi="Times New Roman"/>
+                <w:b w:val="false"/>
+                <w:bCs w:val="false"/>
+                <w:sz w:val="18"/>
+                <w:szCs w:val="18"/>
+              </w:rPr>
+              <w:t xml:space="preserve">Urban formal settlement</w:t>
+            </w:r>
+          </w:p>
+        </w:tc>
+        <w:tc>
+          <w:tcPr>
+            <w:tcW w:type="dxa" w:w="1460"/>
+            <w:tcBorders>
+              <w:top w:val="single" w:color="808080" w:sz="4"/>
+              <w:left w:val="single" w:color="808080" w:sz="4"/>
+              <w:bottom w:val="single" w:color="808080" w:sz="4"/>
+              <w:right w:val="single" w:color="808080" w:sz="4"/>
+            </w:tcBorders>
+            <w:tcMar>
+              <w:top w:type="dxa" w:w="40"/>
+              <w:left w:type="dxa" w:w="45"/>
+              <w:bottom w:type="dxa" w:w="40"/>
+              <w:right w:type="dxa" w:w="45"/>
+            </w:tcMar>
+            <w:vAlign w:val="center"/>
+          </w:tcPr>
+          <w:p>
+            <w:pPr>
+              <w:keepNext/>
+              <w:spacing w:after="0" w:before="0" w:line="240" w:lineRule="auto"/>
+              <w:jc w:val="left"/>
+              <w:rPr>
+                <w:b w:val="false"/>
+                <w:bCs w:val="false"/>
+                <w:sz w:val="18"/>
+                <w:szCs w:val="18"/>
+              </w:rPr>
+            </w:pPr>
+            <w:r>
+              <w:rPr>
+                <w:rFonts w:ascii="Times New Roman" w:cs="Times New Roman" w:eastAsia="Times New Roman" w:hAnsi="Times New Roman"/>
+                <w:b w:val="false"/>
+                <w:bCs w:val="false"/>
+                <w:sz w:val="18"/>
+                <w:szCs w:val="18"/>
+              </w:rPr>
+              <w:t xml:space="preserve">284 (30.0%) unw.; 36.2% wtd</w:t>
+            </w:r>
+          </w:p>
+        </w:tc>
+        <w:tc>
+          <w:tcPr>
+            <w:tcW w:type="dxa" w:w="1460"/>
+            <w:tcBorders>
+              <w:top w:val="single" w:color="808080" w:sz="4"/>
+              <w:left w:val="single" w:color="808080" w:sz="4"/>
+              <w:bottom w:val="single" w:color="808080" w:sz="4"/>
+              <w:right w:val="single" w:color="808080" w:sz="4"/>
+            </w:tcBorders>
+            <w:tcMar>
+              <w:top w:type="dxa" w:w="40"/>
+              <w:left w:type="dxa" w:w="45"/>
+              <w:bottom w:type="dxa" w:w="40"/>
+              <w:right w:type="dxa" w:w="45"/>
+            </w:tcMar>
+            <w:vAlign w:val="center"/>
+          </w:tcPr>
+          <w:p>
+            <w:pPr>
+              <w:keepNext/>
+              <w:spacing w:after="0" w:before="0" w:line="240" w:lineRule="auto"/>
+              <w:jc w:val="left"/>
+              <w:rPr>
+                <w:b w:val="false"/>
+                <w:bCs w:val="false"/>
+                <w:sz w:val="18"/>
+                <w:szCs w:val="18"/>
+              </w:rPr>
+            </w:pPr>
+            <w:r>
+              <w:rPr>
+                <w:rFonts w:ascii="Times New Roman" w:cs="Times New Roman" w:eastAsia="Times New Roman" w:hAnsi="Times New Roman"/>
+                <w:b w:val="false"/>
+                <w:bCs w:val="false"/>
+                <w:sz w:val="18"/>
+                <w:szCs w:val="18"/>
+              </w:rPr>
+              <w:t xml:space="preserve">38 (56.7%) unw.; 66.2% wtd</w:t>
+            </w:r>
+          </w:p>
+        </w:tc>
+      </w:tr>
+      <w:tr>
+        <w:trPr>
+          <w:cantSplit/>
+          <w:tblHeader w:val="false"/>
+        </w:trPr>
+        <w:tc>
+          <w:tcPr>
+            <w:tcW w:type="dxa" w:w="2120"/>
+            <w:tcBorders>
+              <w:top w:val="single" w:color="808080" w:sz="4"/>
+              <w:left w:val="single" w:color="808080" w:sz="4"/>
+              <w:bottom w:val="single" w:color="808080" w:sz="4"/>
+              <w:right w:val="single" w:color="808080" w:sz="4"/>
+            </w:tcBorders>
+            <w:tcMar>
+              <w:top w:type="dxa" w:w="40"/>
+              <w:left w:type="dxa" w:w="45"/>
+              <w:bottom w:type="dxa" w:w="40"/>
+              <w:right w:type="dxa" w:w="45"/>
+            </w:tcMar>
+            <w:vAlign w:val="center"/>
+          </w:tcPr>
+          <w:p>
+            <w:pPr>
+              <w:keepNext/>
+              <w:spacing w:after="0" w:before="0" w:line="240" w:lineRule="auto"/>
+              <w:jc w:val="left"/>
+              <w:rPr>
+                <w:b w:val="false"/>
+                <w:bCs w:val="false"/>
+                <w:sz w:val="18"/>
+                <w:szCs w:val="18"/>
+              </w:rPr>
+            </w:pPr>
+            <w:r>
+              <w:rPr>
+                <w:rFonts w:ascii="Times New Roman" w:cs="Times New Roman" w:eastAsia="Times New Roman" w:hAnsi="Times New Roman"/>
+                <w:b w:val="false"/>
+                <w:bCs w:val="false"/>
+                <w:sz w:val="18"/>
+                <w:szCs w:val="18"/>
+              </w:rPr>
+              <w:t xml:space="preserve">Office ≥5 km or unavailable</w:t>
+            </w:r>
+          </w:p>
+        </w:tc>
+        <w:tc>
+          <w:tcPr>
+            <w:tcW w:type="dxa" w:w="1460"/>
+            <w:tcBorders>
+              <w:top w:val="single" w:color="808080" w:sz="4"/>
+              <w:left w:val="single" w:color="808080" w:sz="4"/>
+              <w:bottom w:val="single" w:color="808080" w:sz="4"/>
+              <w:right w:val="single" w:color="808080" w:sz="4"/>
+            </w:tcBorders>
+            <w:tcMar>
+              <w:top w:type="dxa" w:w="40"/>
+              <w:left w:type="dxa" w:w="45"/>
+              <w:bottom w:type="dxa" w:w="40"/>
+              <w:right w:type="dxa" w:w="45"/>
+            </w:tcMar>
+            <w:vAlign w:val="center"/>
+          </w:tcPr>
+          <w:p>
+            <w:pPr>
+              <w:keepNext/>
+              <w:spacing w:after="0" w:before="0" w:line="240" w:lineRule="auto"/>
+              <w:jc w:val="left"/>
+              <w:rPr>
+                <w:b w:val="false"/>
+                <w:bCs w:val="false"/>
+                <w:sz w:val="18"/>
+                <w:szCs w:val="18"/>
+              </w:rPr>
+            </w:pPr>
+            <w:r>
+              <w:rPr>
+                <w:rFonts w:ascii="Times New Roman" w:cs="Times New Roman" w:eastAsia="Times New Roman" w:hAnsi="Times New Roman"/>
+                <w:b w:val="false"/>
+                <w:bCs w:val="false"/>
+                <w:sz w:val="18"/>
+                <w:szCs w:val="18"/>
+              </w:rPr>
+              <w:t xml:space="preserve">717 (75.8%) unw.; 72.0% wtd</w:t>
+            </w:r>
+          </w:p>
+        </w:tc>
+        <w:tc>
+          <w:tcPr>
+            <w:tcW w:type="dxa" w:w="1460"/>
+            <w:tcBorders>
+              <w:top w:val="single" w:color="808080" w:sz="4"/>
+              <w:left w:val="single" w:color="808080" w:sz="4"/>
+              <w:bottom w:val="single" w:color="808080" w:sz="4"/>
+              <w:right w:val="single" w:color="808080" w:sz="4"/>
+            </w:tcBorders>
+            <w:tcMar>
+              <w:top w:type="dxa" w:w="40"/>
+              <w:left w:type="dxa" w:w="45"/>
+              <w:bottom w:type="dxa" w:w="40"/>
+              <w:right w:type="dxa" w:w="45"/>
+            </w:tcMar>
+            <w:vAlign w:val="center"/>
+          </w:tcPr>
+          <w:p>
+            <w:pPr>
+              <w:keepNext/>
+              <w:spacing w:after="0" w:before="0" w:line="240" w:lineRule="auto"/>
+              <w:jc w:val="left"/>
+              <w:rPr>
+                <w:b w:val="false"/>
+                <w:bCs w:val="false"/>
+                <w:sz w:val="18"/>
+                <w:szCs w:val="18"/>
+              </w:rPr>
+            </w:pPr>
+            <w:r>
+              <w:rPr>
+                <w:rFonts w:ascii="Times New Roman" w:cs="Times New Roman" w:eastAsia="Times New Roman" w:hAnsi="Times New Roman"/>
+                <w:b w:val="false"/>
+                <w:bCs w:val="false"/>
+                <w:sz w:val="18"/>
+                <w:szCs w:val="18"/>
+              </w:rPr>
+              <w:t xml:space="preserve">34 (50.7%) unw.; 40.3% wtd</w:t>
+            </w:r>
+          </w:p>
+        </w:tc>
+      </w:tr>
+      <w:tr>
+        <w:trPr>
+          <w:cantSplit/>
+          <w:tblHeader w:val="false"/>
+        </w:trPr>
+        <w:tc>
+          <w:tcPr>
+            <w:tcW w:type="dxa" w:w="2120"/>
+            <w:tcBorders>
+              <w:top w:val="single" w:color="808080" w:sz="4"/>
+              <w:left w:val="single" w:color="808080" w:sz="4"/>
+              <w:bottom w:val="single" w:color="808080" w:sz="4"/>
+              <w:right w:val="single" w:color="808080" w:sz="4"/>
+            </w:tcBorders>
+            <w:tcMar>
+              <w:top w:type="dxa" w:w="40"/>
+              <w:left w:type="dxa" w:w="45"/>
+              <w:bottom w:type="dxa" w:w="40"/>
+              <w:right w:type="dxa" w:w="45"/>
+            </w:tcMar>
+            <w:vAlign w:val="center"/>
+          </w:tcPr>
+          <w:p>
+            <w:pPr>
               <w:keepNext w:val="false"/>
               <w:spacing w:after="0" w:before="0" w:line="240" w:lineRule="auto"/>
               <w:jc w:val="left"/>
@@ -6005,7 +6263,7 @@
                 <w:sz w:val="18"/>
                 <w:szCs w:val="18"/>
               </w:rPr>
-              <w:t xml:space="preserve">Welfare office ≥5 km/unavailable</w:t>
+              <w:t xml:space="preserve">Office distance missing</w:t>
             </w:r>
           </w:p>
         </w:tc>
@@ -6046,7 +6304,7 @@
                 <w:sz w:val="18"/>
                 <w:szCs w:val="18"/>
               </w:rPr>
-              <w:t xml:space="preserve">717 (75.8%); 72.0%</w:t>
+              <w:t xml:space="preserve">14 (1.5%) unw.; 1.8% wtd</w:t>
             </w:r>
           </w:p>
         </w:tc>
@@ -6087,7 +6345,7 @@
                 <w:sz w:val="18"/>
                 <w:szCs w:val="18"/>
               </w:rPr>
-              <w:t xml:space="preserve">34 (50.7%); 40.3%</w:t>
+              <w:t xml:space="preserve">4 (6.0%) unw.; 7.2% wtd</w:t>
             </w:r>
           </w:p>
         </w:tc>
@@ -6112,22 +6370,7 @@
           <w:sz w:val="16"/>
           <w:szCs w:val="16"/>
         </w:rPr>
-        <w:t xml:space="preserve">Recipients: 946 people; non-recipients: 67 people. U gives unweighted averages, or counts and percentages within each group. W gives person-weighted averages/percentages. Denominators retain missing predictors: three recipients lack schooling; 14 recipients/four non-recipients lack welfare-access values. These summaries have no uncertainty intervals.
-</w:t>
-      </w:r>
-    </w:p>
-    <w:p>
-      <w:pPr>
-        <w:spacing w:after="80" w:before="0" w:line="230"/>
-        <w:jc w:val="both"/>
-      </w:pPr>
-      <w:r>
-        <w:rPr>
-          <w:rFonts w:ascii="Times New Roman" w:cs="Times New Roman" w:eastAsia="Times New Roman" w:hAnsi="Times New Roman"/>
-          <w:sz w:val="20"/>
-          <w:szCs w:val="20"/>
-        </w:rPr>
-        <w:t xml:space="preserve">Non-recipients were younger before weighting, more often men, more educated and more often urban formal residents. Weights brought average ages closer.
+        <w:t xml:space="preserve">unw. is the unweighted count and percentage, or the unweighted mean age. wtd is the person-weighted percentage or mean. Missing predictors remain in the denominators. Supplementary Table S4 prints the unweighted and weighted values in separate columns. These summaries have no uncertainty intervals.
 </w:t>
       </w:r>
     </w:p>
@@ -6162,7 +6405,7 @@
     </w:p>
     <w:p>
       <w:pPr>
-        <w:spacing w:after="80" w:before="0" w:line="230"/>
+        <w:spacing w:after="60" w:before="0" w:line="230"/>
         <w:jc w:val="both"/>
       </w:pPr>
       <w:r>
@@ -6171,7 +6414,7 @@
           <w:sz w:val="20"/>
           <w:szCs w:val="20"/>
         </w:rPr>
-        <w:t xml:space="preserve">Table VI reports each scenario’s denominator and non-receipt events. Unw. and Wtd. abbreviate unweighted and person-weighted. Slope means calibration slope in Tables VI and VIII. Compared with S0, S1b/S1d added two people/two events. S2a, S2b, S2c and S2d added 59/4, 60/2, 8/0 and 68/2 people/events. S3 added 19 people/15 events; S4b removed six people but no events. Weighted non-receipt ranged from 7.12% to 9.06%.
+        <w:t xml:space="preserve">Table VI keeps scenarios whose counts differ from the primary screen. Changed cohorts were refitted. Unchanged cohorts reused the primary predictions, so matching performance is not an independent fit. Supplementary Table S1 defines every rule.
 </w:t>
       </w:r>
     </w:p>
@@ -9167,13 +9410,13 @@
           <w:sz w:val="16"/>
           <w:szCs w:val="16"/>
         </w:rPr>
-        <w:t xml:space="preserve">Events are reported non-recipients. Unw./Wtd. give unweighted/person-weighted non-receipt rates; performance uses no weights. S1b applies the 2015 ceiling throughout; S1d uses the zero-payout ceiling (the resource level where the grant formula pays zero). S2a/S2b treat living-together adults as couples/single. S2c treats separated adults as single; S2d treats both as single. S3 retains disability/war-veterans grant recipients (it adds no veterans). S4b retains social-assistance income.
+        <w:t xml:space="preserve">Events are reported non-recipients. Performance uses no weights. S1b uses the 2015 ceiling at every interview. S1d uses the income level at which the formula pays nothing; it admitted the same two adults as S1b. S2a/S2b screen living-together adults as couples/single. S2c screens separated adults as single; S2d screens both as single. S3 retains disability-grant recipients and adds no war-veterans recipient. S4b keeps social-assistance income in the proxy.
 </w:t>
       </w:r>
     </w:p>
     <w:p>
       <w:pPr>
-        <w:spacing w:after="80" w:before="0" w:line="230"/>
+        <w:spacing w:after="60" w:before="0" w:line="230"/>
         <w:jc w:val="both"/>
       </w:pPr>
       <w:r>
@@ -9182,7 +9425,7 @@
           <w:sz w:val="20"/>
           <w:szCs w:val="20"/>
         </w:rPr>
-        <w:t xml:space="preserve">*S1a (2014 ceiling throughout), S1c (age-75 supplement), S4a (income adjusted for price changes, with the ceiling unchanged), S4c (excluding UIF, the Unemployment Insurance Fund, and similar transfers), S5 (preceding-year receipt) and S6a/S6b (receipt bounds) change nothing. Each keeps the denominator, events and measures. No PASS adult has unresolved receipt to bound.
+        <w:t xml:space="preserve">*S1a, S1c, S4a, S4c, S5 and S6a/S6b keep the S0 counts and reuse its predictions. Identical counts do not make the rules equivalent. No PASS adult has unresolved receipt for S6a/S6b to bound. Definitions are in Supplementary Table S1.
 </w:t>
       </w:r>
     </w:p>
@@ -9217,7 +9460,7 @@
     </w:p>
     <w:p>
       <w:pPr>
-        <w:spacing w:after="80" w:before="0" w:line="230"/>
+        <w:spacing w:after="60" w:before="0" w:line="230"/>
         <w:jc w:val="both"/>
       </w:pPr>
       <w:r>
@@ -10134,7 +10377,7 @@
     </w:p>
     <w:p>
       <w:pPr>
-        <w:spacing w:after="80" w:before="0" w:line="230"/>
+        <w:spacing w:after="60" w:before="0" w:line="230"/>
         <w:jc w:val="both"/>
       </w:pPr>
       <w:r>
@@ -10143,7 +10386,7 @@
           <w:sz w:val="20"/>
           <w:szCs w:val="20"/>
         </w:rPr>
-        <w:t xml:space="preserve">The odds ratio for women versus men was 0.39. Its Wald interval was 0.23–0.66. Schooling below Grade 7 versus Grade 7 or above gave 0.24 (0.13–0.43). The model trained on all included adults produced these estimates. Age, settlement and welfare-distance intervals included 1. These associations describe odds, not probability reductions, held-out performance or causes.
+        <w:t xml:space="preserve">The odds ratio for women versus men was 0.39 (Wald interval 0.23–0.66). Schooling below Grade 7 versus Grade 7 or above gave 0.24 (0.13–0.43). These full-sample associations are not held-out performance or causes. Only 67 events supported six slopes. Across the 100 refitted training folds, the female and below-Grade-7 coefficients stayed negative, while the urban-informal coefficient changed sign. Age, settlement and welfare-distance intervals included 1. That is limited precision, not evidence of no association, and those intervals omit the settlement-coding decision. The 20 repeated splits gave 100 converged fits. AUC ranged from 0.733 to 0.773 (median 0.753) and the calibration slope from 0.738 to 0.943 (median 0.837). Supplementary Table S3 gives the median, interquartile range and range for every performance measure, and the coefficient ranges. That spread is a sensitivity summary for the fixed coding, not a confidence interval.
 </w:t>
       </w:r>
     </w:p>
@@ -11978,21 +12221,6 @@
     </w:p>
     <w:p>
       <w:pPr>
-        <w:spacing w:after="80" w:before="0" w:line="230"/>
-        <w:jc w:val="both"/>
-      </w:pPr>
-      <w:r>
-        <w:rPr>
-          <w:rFonts w:ascii="Times New Roman" w:cs="Times New Roman" w:eastAsia="Times New Roman" w:hAnsi="Times New Roman"/>
-          <w:sz w:val="20"/>
-          <w:szCs w:val="20"/>
-        </w:rPr>
-        <w:t xml:space="preserve">Across alternatives, AUC ranged from 0.736 to 0.763; Brier and calibration slopes also changed.
-</w:t>
-      </w:r>
-    </w:p>
-    <w:p>
-      <w:pPr>
         <w:pStyle w:val="Heading2"/>
         <w:keepNext/>
         <w:spacing w:after="60" w:before="140" w:line="230"/>
@@ -12022,7 +12250,7 @@
     </w:p>
     <w:p>
       <w:pPr>
-        <w:spacing w:after="80" w:before="0" w:line="230"/>
+        <w:spacing w:after="60" w:before="0" w:line="230"/>
         <w:jc w:val="both"/>
       </w:pPr>
       <w:r>
@@ -12979,7 +13207,7 @@
     </w:tbl>
     <w:p>
       <w:pPr>
-        <w:spacing w:after="80" w:before="0" w:line="230"/>
+        <w:spacing w:after="60" w:before="0" w:line="230"/>
         <w:jc w:val="both"/>
       </w:pPr>
       <w:r>
@@ -12988,7 +13216,7 @@
           <w:sz w:val="20"/>
           <w:szCs w:val="20"/>
         </w:rPr>
-        <w:t xml:space="preserve">The owner's Windows walkthrough produced six synthetic classifications: two resolved passes, one recipient and one non-recipient. Matching predictors gave both scores of 0.1853. The invented 50% rate is not the survey non-receipt rate. Screenshots and six extracted reports documented the walkthrough. The checks did not inspect the ZIP container. Regenerated outputs, checksums, summaries and model/source versions passed 50 checks. This verifies functions and exports, not independent execution or representative task times, errors or ease.
+        <w:t xml:space="preserve">The owner walkthrough used synthetic records. It checks exports, not representative task times or ease.
 </w:t>
       </w:r>
     </w:p>
@@ -13052,7 +13280,7 @@
     </w:p>
     <w:p>
       <w:pPr>
-        <w:spacing w:after="80" w:before="0" w:line="230"/>
+        <w:spacing w:after="60" w:before="0" w:line="230"/>
         <w:jc w:val="both"/>
       </w:pPr>
       <w:r>
@@ -13067,7 +13295,7 @@
     </w:p>
     <w:p>
       <w:pPr>
-        <w:spacing w:after="80" w:before="0" w:line="230"/>
+        <w:spacing w:after="60" w:before="0" w:line="230"/>
         <w:jc w:val="both"/>
       </w:pPr>
       <w:r>
@@ -13111,7 +13339,7 @@
     </w:p>
     <w:p>
       <w:pPr>
-        <w:spacing w:after="80" w:before="0" w:line="230"/>
+        <w:spacing w:after="60" w:before="0" w:line="230"/>
         <w:jc w:val="both"/>
       </w:pPr>
       <w:r>
@@ -13126,7 +13354,7 @@
     </w:p>
     <w:p>
       <w:pPr>
-        <w:spacing w:after="80" w:before="0" w:line="230"/>
+        <w:spacing w:after="60" w:before="0" w:line="230"/>
         <w:jc w:val="both"/>
       </w:pPr>
       <w:r>
@@ -13170,7 +13398,7 @@
     </w:p>
     <w:p>
       <w:pPr>
-        <w:spacing w:after="80" w:before="0" w:line="230"/>
+        <w:spacing w:after="60" w:before="0" w:line="230"/>
         <w:jc w:val="both"/>
       </w:pPr>
       <w:r>
@@ -13185,7 +13413,7 @@
     </w:p>
     <w:p>
       <w:pPr>
-        <w:spacing w:after="80" w:before="0" w:line="230"/>
+        <w:spacing w:after="60" w:before="0" w:line="230"/>
         <w:jc w:val="both"/>
       </w:pPr>
       <w:r>
@@ -13229,7 +13457,7 @@
     </w:p>
     <w:p>
       <w:pPr>
-        <w:spacing w:after="80" w:before="0" w:line="230"/>
+        <w:spacing w:after="60" w:before="0" w:line="230"/>
         <w:jc w:val="both"/>
       </w:pPr>
       <w:r>
@@ -13273,7 +13501,7 @@
     </w:p>
     <w:p>
       <w:pPr>
-        <w:spacing w:after="80" w:before="0" w:line="230"/>
+        <w:spacing w:after="60" w:before="0" w:line="230"/>
         <w:jc w:val="both"/>
       </w:pPr>
       <w:r>
@@ -13317,7 +13545,7 @@
     </w:p>
     <w:p>
       <w:pPr>
-        <w:spacing w:after="80" w:before="0" w:line="230"/>
+        <w:spacing w:after="60" w:before="0" w:line="230"/>
         <w:jc w:val="both"/>
       </w:pPr>
       <w:r>
@@ -13332,7 +13560,7 @@
     </w:p>
     <w:p>
       <w:pPr>
-        <w:spacing w:after="80" w:before="0" w:line="230"/>
+        <w:spacing w:after="60" w:before="0" w:line="230"/>
         <w:jc w:val="both"/>
       </w:pPr>
       <w:r>
@@ -13376,7 +13604,7 @@
     </w:p>
     <w:p>
       <w:pPr>
-        <w:spacing w:after="80" w:before="0" w:line="230"/>
+        <w:spacing w:after="60" w:before="0" w:line="230"/>
         <w:jc w:val="both"/>
       </w:pPr>
       <w:r>
@@ -13385,7 +13613,7 @@
           <w:sz w:val="20"/>
           <w:szCs w:val="20"/>
         </w:rPr>
-        <w:t xml:space="preserve">Historical screened non-receipt was 6.6% unweighted and 7.5% person-weighted; alternatives gave 7.1%–9.1%. Rules about other grants changed results more than the ceiling, and unresolved cases made the denominator central. Five predictor groups/six slopes gave AUC 0.752, AP 0.203 and Brier 0.0578: moderate internal ranking with slightly less probability error. The software reproduces screening, receipt categories and scores for inspection under tested conditions. The study provides a historical benchmark. It does not establish human usability, causes, legal entitlement or performance elsewhere.</w:t>
+        <w:t xml:space="preserve">Historical screened non-receipt was 6.6% unweighted and 7.5% person-weighted; alternatives gave 7.1%–9.1%. Rules about other grants changed results more than the ceiling, and unresolved cases made the denominator central. Five predictor groups/six slopes gave AUC 0.752, AP 0.203 and Brier 0.0578: moderate internal ranking with slightly less probability error. The software reproduces screening, receipt categories and scores for inspection under tested conditions. The study provides a historical benchmark. It does not establish human usability, causes, legal entitlement or performance elsewhere. Future work should validate the frozen model in independent provincial or later-period data, using comparable screening and receipt definitions, and should assess discrimination, calibration and probability error before any updating. Intended users should also complete synthetic-data tasks that record task success, errors, completion time and perceived ease of use.</w:t>
       </w:r>
     </w:p>
     <w:p>
@@ -13833,7 +14061,7 @@
           <w:sz w:val="16"/>
           <w:szCs w:val="16"/>
         </w:rPr>
-        <w:t xml:space="preserve">[21] Statistics South Africa, Living Conditions Survey 2014/2015: Metadata, Statistical Release P0310. Pretoria, South Africa, 2017.</w:t>
+        <w:t xml:space="preserve">[21] Statistics South Africa, Living Conditions Survey 2014/2015: Metadata, Statistical Release P0310. Pretoria, South Africa, 2017, ISBN 978-0-621-45185-6.</w:t>
       </w:r>
     </w:p>
     <w:p>

</xml_diff>

<commit_message>
Add missing supplementary evidence to the main research paper
</commit_message>
<xml_diff>
--- a/paper/Jawe_OPG_nonreceipt_KZN.docx
+++ b/paper/Jawe_OPG_nonreceipt_KZN.docx
@@ -17,8 +17,25 @@
           <w:sz w:val="48"/>
           <w:szCs w:val="48"/>
         </w:rPr>
-        <w:t xml:space="preserve">Interpretable Prediction of Reported Older Person’s Grant Non-Receipt Among Apparently Eligible Adults in KwaZulu-Natal
-</w:t>
+        <w:t xml:space="preserve">Interpretable Prediction of Reported Older Person’s Grant Non-Receipt Among Apparently Eligible Adults in KwaZulu-Natal</w:t>
+      </w:r>
+    </w:p>
+    <w:p>
+      <w:pPr>
+        <w:spacing w:after="30" w:before="0" w:line="230"/>
+        <w:jc w:val="center"/>
+        <w:rPr>
+          <w:sz w:val="22"/>
+          <w:szCs w:val="22"/>
+        </w:rPr>
+      </w:pPr>
+      <w:r>
+        <w:rPr>
+          <w:rFonts w:ascii="Times New Roman" w:cs="Times New Roman" w:eastAsia="Times New Roman" w:hAnsi="Times New Roman"/>
+          <w:sz w:val="22"/>
+          <w:szCs w:val="22"/>
+        </w:rPr>
+        <w:t xml:space="preserve">Oluhle Jawe</w:t>
       </w:r>
     </w:p>
     <w:p>
@@ -36,8 +53,7 @@
           <w:sz w:val="18"/>
           <w:szCs w:val="18"/>
         </w:rPr>
-        <w:t xml:space="preserve">Oluhle Jawe
-</w:t>
+        <w:t xml:space="preserve">ICT Honours (21634436), APRE402</w:t>
       </w:r>
     </w:p>
     <w:p>
@@ -55,14 +71,13 @@
           <w:sz w:val="18"/>
           <w:szCs w:val="18"/>
         </w:rPr>
-        <w:t xml:space="preserve">ICT Honours (21634436), APRE402
-</w:t>
+        <w:t xml:space="preserve">Durban University of Technology, Durban, South Africa</w:t>
       </w:r>
     </w:p>
     <w:p>
       <w:pPr>
-        <w:spacing w:after="30" w:before="0" w:line="230"/>
-        <w:jc w:val="center"/>
+        <w:spacing w:after="80" w:before="80" w:line="220"/>
+        <w:jc w:val="both"/>
         <w:rPr>
           <w:sz w:val="18"/>
           <w:szCs w:val="18"/>
@@ -74,8 +89,7 @@
           <w:sz w:val="18"/>
           <w:szCs w:val="18"/>
         </w:rPr>
-        <w:t xml:space="preserve">Durban University of Technology, Durban, South Africa
-</w:t>
+        <w:t xml:space="preserve">Abstract—This study analysed reported Older Person’s Grant (OPG) non-receipt among adults aged 60 or older in KwaZulu-Natal (KZN), using the Living Conditions Survey (LCS) 2014/2015. The study used administrative-burden theory to choose predictors and observable research rules to identify apparently eligible adults. Screening did not establish legal entitlement. Among 1,013 adults who passed with resolved receipt, 67 reported non-receipt: 6.6% unweighted and 7.5% person-weighted. Alternative screening rules gave weighted rates of 7.1%–9.1%. Logistic regression used five predictor groups and household-held-out validation. AUC (area under the receiver operating characteristic curve) was 0.752; average precision (AP) was 0.203. The Brier score was 0.0578, compared with 0.0618 for an intercept-only reference using training-group prevalence. Checks supported reproducibility. The application displays rules, decisions, scores and reports. No participant study tested ease of use. These results do not establish entitlement, explain non-receipt, or demonstrate performance elsewhere.</w:t>
       </w:r>
     </w:p>
     <w:p>
@@ -93,27 +107,7 @@
           <w:sz w:val="18"/>
           <w:szCs w:val="18"/>
         </w:rPr>
-        <w:t xml:space="preserve">Abstract—This study analysed reported Older Person’s Grant (OPG) non-receipt among adults aged 60 or older in KwaZulu-Natal (KZN), using the Living Conditions Survey (LCS) 2014/2015. The study used administrative-burden theory to choose predictors and observable research rules to identify apparently eligible adults. Screening did not establish legal entitlement. Among 1,013 adults who passed with resolved receipt, 67 reported non-receipt: 6.6% unweighted and 7.5% person-weighted. Alternative screening rules gave weighted rates of 7.1%–9.1%. Logistic regression used five predictor groups and household-held-out validation. AUC (area under the receiver operating characteristic curve) was 0.752; average precision (AP) was 0.203. The Brier score was 0.0578, compared with 0.0618 for an intercept-only reference using training-group prevalence. Checks supported reproducibility. The application displays rules, decisions, scores and reports. No participant study tested ease of use. These results do not establish entitlement, explain non-receipt, or demonstrate performance elsewhere.
-</w:t>
-      </w:r>
-    </w:p>
-    <w:p>
-      <w:pPr>
-        <w:spacing w:after="80" w:before="80" w:line="220"/>
-        <w:jc w:val="both"/>
-        <w:rPr>
-          <w:sz w:val="18"/>
-          <w:szCs w:val="18"/>
-        </w:rPr>
-      </w:pPr>
-      <w:r>
-        <w:rPr>
-          <w:rFonts w:ascii="Times New Roman" w:cs="Times New Roman" w:eastAsia="Times New Roman" w:hAnsi="Times New Roman"/>
-          <w:sz w:val="18"/>
-          <w:szCs w:val="18"/>
-        </w:rPr>
-        <w:t xml:space="preserve">Keywords—Older Person’s Grant, reported non-receipt, administrative burden, Living Conditions Survey, logistic regression, reproducibility.
-</w:t>
+        <w:t xml:space="preserve">Keywords—Older Person’s Grant, reported non-receipt, administrative burden, Living Conditions Survey, logistic regression, reproducibility.</w:t>
       </w:r>
     </w:p>
     <w:p>
@@ -151,8 +145,7 @@
           <w:sz w:val="20"/>
           <w:szCs w:val="20"/>
         </w:rPr>
-        <w:t xml:space="preserve">I. Introduction
-</w:t>
+        <w:t xml:space="preserve">I. Introduction</w:t>
       </w:r>
     </w:p>
     <w:p>
@@ -166,8 +159,7 @@
           <w:sz w:val="20"/>
           <w:szCs w:val="20"/>
         </w:rPr>
-        <w:t xml:space="preserve">The Older Person’s Grant (OPG) supports households [1], including during crises [2]. Other work examines receipt and access barriers [3], [4]. This study examines adults who appear eligible but report receiving no OPG.
-</w:t>
+        <w:t xml:space="preserve">The Older Person’s Grant (OPG) supports households [1], including during crises [2]. Other work examines receipt and access barriers [3], [4]. This study examines adults who appear eligible but report receiving no OPG.</w:t>
       </w:r>
     </w:p>
     <w:p>
@@ -181,8 +173,7 @@
           <w:sz w:val="20"/>
           <w:szCs w:val="20"/>
         </w:rPr>
-        <w:t xml:space="preserve">The analysis separates screening, reported receipt and legal entitlement. Passing the research screen does not mean approval by the South African Social Security Agency [5]. Non-receipt can reflect high income, no application, a pending decision or incomplete information. The analysis must define the screened group before calculating its non-receipt percentage; missing spouse income can change that group.
-</w:t>
+        <w:t xml:space="preserve">The analysis separates screening, reported receipt and legal entitlement. Passing the research screen does not mean approval by the South African Social Security Agency [5]. Non-receipt can reflect high income, no application, a pending decision or incomplete information. The analysis must define the screened group before calculating its non-receipt percentage; missing spouse income can change that group.</w:t>
       </w:r>
     </w:p>
     <w:p>
@@ -196,8 +187,7 @@
           <w:sz w:val="20"/>
           <w:szCs w:val="20"/>
         </w:rPr>
-        <w:t xml:space="preserve">The study aims to develop and evaluate an interpretable research tool for analysing reported OPG non-receipt among apparently eligible older adults in KwaZulu-Natal using the Living Conditions Survey (LCS) 2014/2015. Four objectives guide the work: document the included population, describe non-receipt using survey weights, test predictions on excluded households, and assess correctness, reproducibility and clarity.
-</w:t>
+        <w:t xml:space="preserve">The study aims to develop and evaluate an interpretable research tool for analysing reported OPG non-receipt among apparently eligible older adults in KwaZulu-Natal using the Living Conditions Survey (LCS) 2014/2015. Four objectives guide the work: document the included population, describe non-receipt using survey weights, test predictions on excluded households, and assess correctness, reproducibility and clarity.</w:t>
       </w:r>
     </w:p>
     <w:p>
@@ -211,8 +201,7 @@
           <w:sz w:val="20"/>
           <w:szCs w:val="20"/>
         </w:rPr>
-        <w:t xml:space="preserve">Research questions (RQs) guide the study. RQ1 asks what proportion of screened adults reports non-receipt and how that proportion changes under different screening assumptions. RQ2 asks how well logistic regression separates recipients from non-recipients and estimates chances in excluded households. RQ3 asks whether the tool can repeat the analysis and clearly explain screening decisions and model results. The study combines documented rules, weighted percentages, tested predictions and a local interface to address them.
-</w:t>
+        <w:t xml:space="preserve">Research questions (RQs) guide the study. RQ1 asks what proportion of screened adults reports non-receipt and how that proportion changes under different screening assumptions. RQ2 asks how well logistic regression separates recipients from non-recipients and estimates chances in excluded households. RQ3 asks whether the tool can repeat the analysis and clearly explain screening decisions and model results. The study combines documented rules, weighted percentages, tested predictions and a local interface to address them.</w:t>
       </w:r>
     </w:p>
     <w:p>
@@ -240,8 +229,7 @@
           <w:sz w:val="20"/>
           <w:szCs w:val="20"/>
         </w:rPr>
-        <w:t xml:space="preserve">II. Related Work and Predictor Selection
-</w:t>
+        <w:t xml:space="preserve">II. Related Work and Predictor Selection</w:t>
       </w:r>
     </w:p>
     <w:p>
@@ -269,8 +257,7 @@
           <w:sz w:val="20"/>
           <w:szCs w:val="20"/>
         </w:rPr>
-        <w:t xml:space="preserve">A. Review Approach, Programme Context and Research Gap
-</w:t>
+        <w:t xml:space="preserve">A. Review Approach, Programme Context and Research Gap</w:t>
       </w:r>
     </w:p>
     <w:p>
@@ -284,8 +271,7 @@
           <w:sz w:val="20"/>
           <w:szCs w:val="20"/>
         </w:rPr>
-        <w:t xml:space="preserve">The literature review used thematic narrative synthesis to examine grant access, eligibility measurement and prediction. Searches covered Scopus, Dimensions, IEEE Xplore, SABINET/African Journals Online, Google Scholar and Statistics South Africa/DataFirst. Search concepts included social assistance, eligibility, take-up, non-receipt, exclusion and prediction. Sources were considered for relevance to the research question, population, outcome and methodological contribution. Studies were compared by programme, setting, unit of analysis, outcome, findings and limitations. Differences in these features prevent a pooled non-receipt estimate.
-</w:t>
+        <w:t xml:space="preserve">The narrative review examined grant access, eligibility measurement and prediction using Scopus, Dimensions, IEEE Xplore, SABINET/African Journals Online, Google Scholar and Statistics South Africa/DataFirst. Selection considered relevance to the question, population, outcome and methods. Studies differed in programme, setting, unit, outcome, findings and limitations, preventing a pooled estimate.</w:t>
       </w:r>
     </w:p>
     <w:p>
@@ -299,8 +285,7 @@
           <w:sz w:val="20"/>
           <w:szCs w:val="20"/>
         </w:rPr>
-        <w:t xml:space="preserve">The recorded search summary lists 511 records: 136 duplicates removed, 375 titles/abstracts screened, 222 excluded, 153 full texts assessed, 98 further exclusions and 55 retained sources. These sources cover several grants and populations, rather than 55 OPG studies. The available record documents the search concepts, broad selection criteria and aggregate counts. It does not preserve database-specific query strings, search dates and filters, original exports or record-level screening and exclusion decisions. The full 55-source extraction register is also unavailable. These omissions prevent independent reproduction of the search and verification of each selection decision. The synthesis therefore provides contextual evidence without establishing exhaustive literature coverage.
-</w:t>
+        <w:t xml:space="preserve">Supplementary Table S5 preserves eight recorded queries dated 17 August 2026, with source-specific hit and retained-source counts. The reported flow is 511 hits, 136 duplicates removed, 375 titles/abstracts screened, 222 exclusions, 153 full-text assessments, 98 further exclusions and 55 retained sources across grants and populations, rather than 55 OPG studies. The original exports, item-level screening decisions and complete 55-source extraction register are not included in the accompanying evidence. The recorded totals therefore do not independently reproduce deduplication or selection. The synthesis provides contextual evidence without establishing exhaustive literature coverage.</w:t>
       </w:r>
     </w:p>
     <w:p>
@@ -314,8 +299,7 @@
           <w:sz w:val="20"/>
           <w:szCs w:val="20"/>
         </w:rPr>
-        <w:t xml:space="preserve">Table I distinguishes individual receipt [3] from household proportions [4], and this study’s provincial resource screen from both. Other-grant studies separate enquiry, application, receipt and uninterrupted payment [6], [7], [8].
-</w:t>
+        <w:t xml:space="preserve">Table I distinguishes individual receipt [3] from household proportions [4], and this study’s provincial resource screen from both. Other-grant studies separate enquiry, application, receipt and uninterrupted payment [6], [7], [8].</w:t>
       </w:r>
     </w:p>
     <w:p>
@@ -334,8 +318,7 @@
           <w:sz w:val="16"/>
           <w:szCs w:val="16"/>
         </w:rPr>
-        <w:t xml:space="preserve">Table I. Evidence scope informing the study
-</w:t>
+        <w:t xml:space="preserve">Table I. Evidence scope informing the study</w:t>
       </w:r>
     </w:p>
     <w:tbl>
@@ -1142,8 +1125,7 @@
           <w:sz w:val="20"/>
           <w:szCs w:val="20"/>
         </w:rPr>
-        <w:t xml:space="preserve">Gazeaud supports checking income assumptions [11], without quantifying LCS errors or defining South African eligibility. Mabala models another grant for younger applicants [12]; its findings cannot directly predict OPG receipt.
-</w:t>
+        <w:t xml:space="preserve">Gazeaud supports checking income assumptions [11], without quantifying LCS errors or defining South African eligibility. Mabala models another grant for younger applicants [12]; its findings cannot directly predict OPG receipt.</w:t>
       </w:r>
     </w:p>
     <w:p>
@@ -1157,8 +1139,7 @@
           <w:sz w:val="20"/>
           <w:szCs w:val="20"/>
         </w:rPr>
-        <w:t xml:space="preserve">The research gap concerns how these separate strands can support a reproducible, person-level analysis of OPG non-receipt in KwaZulu-Natal. Ralston's age-based rural receipt analysis [3] and Godfrey's household receipt proportions [4] do not directly provide non-receipt estimates after the resource screen used here. Evidence on other grants informs possible access barriers, but does not establish their effects among older OPG applicants. The study addresses this integration gap by documenting the screening denominator, testing how alternative rules change non-receipt estimates, and evaluating an interpretable model on excluded households. Shared rules connect the research command and application so that decisions, probabilities and reports remain inspectable. The specific contribution is a historical workflow that connects transparent screening, person-weighted description, household-held-out prediction and reproducible software. This supports scrutiny of assumptions and results without establishing legal entitlement, causal barriers, participant usability or performance elsewhere.
-</w:t>
+        <w:t xml:space="preserve">The research gap concerns how these separate strands can support a reproducible, person-level analysis of OPG non-receipt in KwaZulu-Natal. Ralston's age-based rural receipt analysis [3] and Godfrey's household receipt proportions [4] do not directly provide non-receipt estimates after the resource screen used here. Evidence on other grants informs possible access barriers, but does not establish their effects among older OPG applicants. The study addresses this integration gap by documenting the screening denominator, testing how alternative rules change non-receipt estimates, and evaluating an interpretable model on excluded households. Shared rules connect the research command and application so that decisions, probabilities and reports remain inspectable. The specific contribution is a historical workflow that connects transparent screening, person-weighted description, household-held-out prediction and reproducible software. This supports scrutiny of assumptions and results without establishing legal entitlement, causal barriers, participant usability or performance elsewhere.</w:t>
       </w:r>
     </w:p>
     <w:p>
@@ -1186,8 +1167,7 @@
           <w:sz w:val="20"/>
           <w:szCs w:val="20"/>
         </w:rPr>
-        <w:t xml:space="preserve">B. Grant Access and Administrative Burden
-</w:t>
+        <w:t xml:space="preserve">B. Grant Access and Administrative Burden</w:t>
       </w:r>
     </w:p>
     <w:p>
@@ -1201,8 +1181,7 @@
           <w:sz w:val="20"/>
           <w:szCs w:val="20"/>
         </w:rPr>
-        <w:t xml:space="preserve">Administrative-burden theory distinguishes learning, compliance and psychological costs [13]. Grant studies describe paperwork, repeated visits, interrupted payments and difficult encounters [8], [9], [10], [14]. Child Support Grant research suggests barriers [6], [7], without establishing their effects among older OPG applicants. Digital access can create difficulties [15]. Low non-receipt therefore does not demonstrate easy access.
-</w:t>
+        <w:t xml:space="preserve">Administrative-burden theory distinguishes learning, compliance and psychological costs [13]. Grant studies describe paperwork, repeated visits, interrupted payments and difficult encounters [8], [9], [10], [14]. Child Support Grant research suggests barriers [6], [7], without establishing their effects among older OPG applicants. Digital access can create difficulties [15]. Low non-receipt therefore does not demonstrate easy access.</w:t>
       </w:r>
     </w:p>
     <w:p>
@@ -1216,8 +1195,7 @@
           <w:sz w:val="20"/>
           <w:szCs w:val="20"/>
         </w:rPr>
-        <w:t xml:space="preserve">LCS does not record every legal condition or application experience. The screen checks age, resources, partnership and other-grant rules. It assigns PASS (the person meets the research conditions), FAIL (a known condition is not met) or UNRESOLVED (available information cannot resolve the decision). The analysis then checks receipt separately. Only adults who pass with clear receipt answers enter the prediction study. Unclear or contradictory answers remain unresolved.
-</w:t>
+        <w:t xml:space="preserve">LCS does not record every legal condition or application experience. The screen checks age, resources, partnership and other-grant rules. It assigns PASS (the person meets the research conditions), FAIL (a known condition is not met) or UNRESOLVED (available information cannot resolve the decision). The analysis then checks receipt separately. Only adults who pass with clear receipt answers enter the prediction study. Unclear or contradictory answers remain unresolved.</w:t>
       </w:r>
     </w:p>
     <w:p>
@@ -1245,8 +1223,7 @@
           <w:sz w:val="20"/>
           <w:szCs w:val="20"/>
         </w:rPr>
-        <w:t xml:space="preserve">C. Predictor Selection and Software Design
-</w:t>
+        <w:t xml:space="preserve">C. Predictor Selection and Software Design</w:t>
       </w:r>
     </w:p>
     <w:p>
@@ -1260,8 +1237,7 @@
           <w:sz w:val="20"/>
           <w:szCs w:val="20"/>
         </w:rPr>
-        <w:t xml:space="preserve">Table II separates demographic context from circumstances relevant to learning and compliance costs. These predictors do not directly measure administrative burden or establish why a person reports non-receipt.
-</w:t>
+        <w:t xml:space="preserve">Table II separates demographic context from circumstances relevant to learning and compliance costs. These predictors do not directly measure administrative burden or establish why a person reports non-receipt.</w:t>
       </w:r>
     </w:p>
     <w:p>
@@ -1280,8 +1256,7 @@
           <w:sz w:val="16"/>
           <w:szCs w:val="16"/>
         </w:rPr>
-        <w:t xml:space="preserve">Table II. Administrative-burden theory and predictor selection
-</w:t>
+        <w:t xml:space="preserve">Table II. Administrative-burden theory and predictor selection</w:t>
       </w:r>
     </w:p>
     <w:tbl>
@@ -2096,8 +2071,7 @@
           <w:sz w:val="16"/>
           <w:szCs w:val="16"/>
         </w:rPr>
-        <w:t xml:space="preserve">Psychological costs are unmeasured. Settlement contributes two contrasts, giving five predictor groups and six slopes.
-</w:t>
+        <w:t xml:space="preserve">Psychological costs are unmeasured. Settlement contributes two contrasts, giving five predictor groups and six slopes.</w:t>
       </w:r>
     </w:p>
     <w:p>
@@ -2111,8 +2085,7 @@
           <w:sz w:val="20"/>
           <w:szCs w:val="20"/>
         </w:rPr>
-        <w:t xml:space="preserve">Few events motivate assessment of precision, calibration and ranking [16], [17]. Sample size and internal validation limit generalisation [18], [19]. Reporting follows TRIPOD (Transparent Reporting of a multivariable prediction model for Individual Prognosis Or Diagnosis) [20]. Software checks assess correctness and repeatability; usability requires participant evidence.
-</w:t>
+        <w:t xml:space="preserve">Few events motivate assessment of precision, calibration and ranking [16], [17]. Sample size and internal validation limit generalisation [18], [19]. Reporting follows TRIPOD (Transparent Reporting of a multivariable prediction model for Individual Prognosis Or Diagnosis) [20]. Software checks assess correctness and repeatability; usability requires participant evidence.</w:t>
       </w:r>
     </w:p>
     <w:p>
@@ -2140,8 +2113,7 @@
           <w:sz w:val="20"/>
           <w:szCs w:val="20"/>
         </w:rPr>
-        <w:t xml:space="preserve">D. Conceptual Framework
-</w:t>
+        <w:t xml:space="preserve">D. Conceptual Framework</w:t>
       </w:r>
     </w:p>
     <w:p>
@@ -2155,8 +2127,7 @@
           <w:sz w:val="20"/>
           <w:szCs w:val="20"/>
         </w:rPr>
-        <w:t xml:space="preserve">Reported OPG non-receipt among apparently eligible older adults motivates an administrative-burden perspective [13], [14]. Learning, compliance and psychological costs may obstruct access; high receipt does not establish low burden.
-</w:t>
+        <w:t xml:space="preserve">Reported OPG non-receipt among apparently eligible older adults motivates an administrative-burden perspective [13], [14]. Learning, compliance and psychological costs may obstruct access; high receipt does not establish low burden.</w:t>
       </w:r>
     </w:p>
     <w:p>
@@ -2170,8 +2141,7 @@
           <w:sz w:val="20"/>
           <w:szCs w:val="20"/>
         </w:rPr>
-        <w:t xml:space="preserve">Figure 1 separates theoretical constructs from LCS measurements. Schooling may reflect information resources; office distance and settlement relate to potential compliance effort. Age and sex provide demographic context. These proxies do not directly measure burden. Screening defines the denominator because age alone is insufficient and LCS cannot establish legal entitlement. Resource, partnership and other-grant rules define the population; incomplete information remains unresolved. Reported receipt defines a separate outcome.
-</w:t>
+        <w:t xml:space="preserve">Figure 1 separates theoretical constructs from LCS measurements. Schooling may reflect information resources; office distance and settlement relate to potential compliance effort. Age and sex provide demographic context. These proxies do not directly measure burden. Screening defines the denominator because age alone is insufficient and LCS cannot establish legal entitlement. Resource, partnership and other-grant rules define the population; incomplete information remains unresolved. Reported receipt defines a separate outcome.</w:t>
       </w:r>
     </w:p>
     <w:p>
@@ -2185,8 +2155,7 @@
           <w:sz w:val="20"/>
           <w:szCs w:val="20"/>
         </w:rPr>
-        <w:t xml:space="preserve">Person-weighted estimates describe non-receipt. Logistic regression describes associations; household-held-out validation tests predictions. Neither establishes causal mechanisms. The artefact implements the design through shared rules, separate receipt classifications, saved-model scoring and inspectable reports. Upload scores remain separate from held-out evaluation and never change screening or receipt.
-</w:t>
+        <w:t xml:space="preserve">Person-weighted estimates describe non-receipt. Logistic regression describes associations; household-held-out validation tests predictions. Neither establishes causal mechanisms. The artefact implements the design through shared rules, separate receipt classifications, saved-model scoring and inspectable reports. Upload scores remain separate from held-out evaluation and never change screening or receipt.</w:t>
       </w:r>
     </w:p>
     <w:p>
@@ -2200,7 +2169,7 @@
           <wp:inline distT="0" distB="0" distL="0" distR="0">
             <wp:extent cx="3200400" cy="3429000"/>
             <wp:effectExtent t="0" r="0" b="0" l="0"/>
-            <wp:docPr id="1" name="Fig. 1. Conceptual framework. Theory informs predictor selection; observable screening defines the population for separate descriptive and predictive analyses. The dashed boundary identifies the artefact’s implementation scope. Arrows show conceptual rationale or analytical dependencies, not causal effects. " descr="Fig. 1. Conceptual framework. Theory informs predictor selection; observable screening defines the population for separate descriptive and predictive analyses. The dashed boundary identifies the artefact’s implementation scope. Arrows show conceptual rationale or analytical dependencies, not causal effects. " title="Fig. 1. Conceptual framework. Theory informs predictor selection; observable screening defines the population for separate descriptive and predictive analyses. The dashed boundary identifies the artefact’s implementation scope. Arrows show conceptual rationale or analytical dependencies, not causal effects. "/>
+            <wp:docPr id="1" name="Fig. 1. Conceptual framework. Theory informs predictor selection; observable screening defines the population for separate descriptive and predictive analyses. The dashed boundary identifies the artefact’s implementation scope. Arrows show conceptual rationale or analytical dependencies, not causal effects." descr="Fig. 1. Conceptual framework. Theory informs predictor selection; observable screening defines the population for separate descriptive and predictive analyses. The dashed boundary identifies the artefact’s implementation scope. Arrows show conceptual rationale or analytical dependencies, not causal effects." title="Fig. 1. Conceptual framework. Theory informs predictor selection; observable screening defines the population for separate descriptive and predictive analyses. The dashed boundary identifies the artefact’s implementation scope. Arrows show conceptual rationale or analytical dependencies, not causal effects."/>
             <wp:cNvGraphicFramePr>
               <a:graphicFrameLocks xmlns:a="http://schemas.openxmlformats.org/drawingml/2006/main" noChangeAspect="1"/>
             </wp:cNvGraphicFramePr>
@@ -2251,8 +2220,7 @@
           <w:sz w:val="16"/>
           <w:szCs w:val="16"/>
         </w:rPr>
-        <w:t xml:space="preserve">Fig. 1. Conceptual framework. Theory informs predictor selection; observable screening defines the population for separate descriptive and predictive analyses. The dashed boundary identifies the artefact’s implementation scope. Arrows show conceptual rationale or analytical dependencies, not causal effects.
-</w:t>
+        <w:t xml:space="preserve">Fig. 1. Conceptual framework. Theory informs predictor selection; observable screening defines the population for separate descriptive and predictive analyses. The dashed boundary identifies the artefact’s implementation scope. Arrows show conceptual rationale or analytical dependencies, not causal effects.</w:t>
       </w:r>
     </w:p>
     <w:p>
@@ -2280,8 +2248,7 @@
           <w:sz w:val="20"/>
           <w:szCs w:val="20"/>
         </w:rPr>
-        <w:t xml:space="preserve">III. Methods
-</w:t>
+        <w:t xml:space="preserve">III. Methods</w:t>
       </w:r>
     </w:p>
     <w:p>
@@ -2309,8 +2276,7 @@
           <w:sz w:val="20"/>
           <w:szCs w:val="20"/>
         </w:rPr>
-        <w:t xml:space="preserve">A. Data and study population
-</w:t>
+        <w:t xml:space="preserve">A. Data and study population</w:t>
       </w:r>
     </w:p>
     <w:p>
@@ -2324,8 +2290,7 @@
           <w:sz w:val="20"/>
           <w:szCs w:val="20"/>
         </w:rPr>
-        <w:t xml:space="preserve">The analysis linked the LCS 2014/2015 person, household and person-income files through survey identifiers. Checks covered duplicates, unmatched records and row counts. The questionnaire, metadata and COICOP (Classification of Individual Consumption According to Purpose) codes guided interpretation [21], [22], [23]. The study covered sampled KwaZulu-Natal residents aged 60 or older in completed years. The survey excludes older adults living in institutions. Screening used the rules for each interview month. Before releasing the data, Statistics South Africa used hot-deck imputation for age and sex. The released files do not identify these records. The model handled missing predictors separately.
-</w:t>
+        <w:t xml:space="preserve">The analysis linked the LCS 2014/2015 person, household and person-income files through survey identifiers. Checks covered duplicates, unmatched records and row counts. The questionnaire, metadata and COICOP (Classification of Individual Consumption According to Purpose) codes guided interpretation [21], [22], [23]. The study covered sampled KwaZulu-Natal residents aged 60 or older in completed years. The survey excludes older adults living in institutions. Screening used the rules for each interview month. Before releasing the data, Statistics South Africa used hot-deck imputation for age and sex. The released files do not identify these records. The model handled missing predictors separately.</w:t>
       </w:r>
     </w:p>
     <w:p>
@@ -2339,8 +2304,7 @@
           <w:sz w:val="20"/>
           <w:szCs w:val="20"/>
         </w:rPr>
-        <w:t xml:space="preserve">Table III shows each field's role. Summing income before linkage avoided duplicate person records.
-</w:t>
+        <w:t xml:space="preserve">Table III shows each field's role. Summing income before linkage avoided duplicate person records.</w:t>
       </w:r>
     </w:p>
     <w:p>
@@ -2359,8 +2323,7 @@
           <w:sz w:val="16"/>
           <w:szCs w:val="16"/>
         </w:rPr>
-        <w:t xml:space="preserve">Table III. How each data field enters the analysis
-</w:t>
+        <w:t xml:space="preserve">Table III. How each data field enters the analysis</w:t>
       </w:r>
     </w:p>
     <w:tbl>
@@ -3562,8 +3525,7 @@
           <w:sz w:val="16"/>
           <w:szCs w:val="16"/>
         </w:rPr>
-        <w:t xml:space="preserve">Released documentation supports these field uses [21], [22], [23]. Filling missing model predictors never changes screening fields or receipt answers.
-</w:t>
+        <w:t xml:space="preserve">Released documentation supports these field uses [21], [22], [23]. Filling missing model predictors never changes screening fields or receipt answers.</w:t>
       </w:r>
     </w:p>
     <w:p>
@@ -3591,8 +3553,7 @@
           <w:sz w:val="20"/>
           <w:szCs w:val="20"/>
         </w:rPr>
-        <w:t xml:space="preserve">B. Screening rules and receipt outcome
-</w:t>
+        <w:t xml:space="preserve">B. Screening rules and receipt outcome</w:t>
       </w:r>
     </w:p>
     <w:p>
@@ -3606,8 +3567,7 @@
           <w:sz w:val="20"/>
           <w:szCs w:val="20"/>
         </w:rPr>
-        <w:t xml:space="preserve">The screen summed already annualised, nominal person-income amounts, excluding social-assistance income. It did not allocate household income. A missing applicant or linked-spouse amount remained unresolved unless the no-income response and absent schedule supported zero. Assets, deemed income and permitted deductions were outside this research proxy.
-</w:t>
+        <w:t xml:space="preserve">The screen summed already annualised, nominal person-income amounts, excluding social-assistance income. It did not allocate household income. A missing applicant or linked-spouse amount remained unresolved unless the no-income response and absent schedule supported zero. Assets, deemed income and permitted deductions were outside this research proxy.</w:t>
       </w:r>
     </w:p>
     <w:p>
@@ -3621,8 +3581,7 @@
           <w:sz w:val="20"/>
           <w:szCs w:val="20"/>
         </w:rPr>
-        <w:t xml:space="preserve">GN 211 set the standard monthly maximum at R1,350 from 1 April 2014 [24]; GN 277 raised it to R1,410 from 1 April 2015 [25]. Government Notice R211, a separate amendment in the same gazette, substituted D = 1.6A − 0.4B from 1 April 2014 in Schedule paragraph 2 [26]. With annual standard maximum A and minimum D = R1,200 (Annexure A(5)) [27], B = (1.6A − 1,200)/0.4. This yields annual single/couple research ceilings of R61,800/R123,600 for October 2014–March 2015 and R64,680/R129,360 for April–October 2015. Half-joint income doubles couple limits; equality passed. The screen applied these boundaries to its private-income proxy. Both notices add R20 for age 75+; the primary screen retained the standard maximum across ages, while S1c tested the supplement. S1 also tested period and payment-boundary alternatives.
-</w:t>
+        <w:t xml:space="preserve">GN 211 set the standard monthly maximum at R1,350 from 1 April 2014 [24]; GN 277 raised it to R1,410 from 1 April 2015 [25]. Government Notice R211, a separate amendment in the same gazette, substituted D = 1.6A − 0.4B from 1 April 2014 in Schedule paragraph 2 [26]. With annual standard maximum A and minimum D = R1,200 (Annexure A(5)) [27], B = (1.6A − 1,200)/0.4. This yields annual single/couple research ceilings of R61,800/R123,600 for October 2014–March 2015 and R64,680/R129,360 for April–October 2015. Half-joint income doubles couple limits; equality passed. The screen applied these boundaries to its private-income proxy. Both notices add R20 for age 75+; the primary screen retained the standard maximum across ages, while S1c tested the supplement. S1 also tested period and payment-boundary alternatives.</w:t>
       </w:r>
     </w:p>
     <w:p>
@@ -3636,8 +3595,7 @@
           <w:sz w:val="20"/>
           <w:szCs w:val="20"/>
         </w:rPr>
-        <w:t xml:space="preserve">The 2008 regulations define spouses (regulation 1), include spouse income regardless of property regime (18(2)) and use half-joint annual income (19(1)). They allow Agency-approved exclusion after continuous desertion for at least three months and unwillingness to support (18(3)) [27]. The July 2015 amendment left these OPG means provisions unchanged [28]. Survey responses established neither legal spouse status nor desertion conditions. Never-married, widowed and divorced adults used single ceilings. For married adults, research rules required resolved applicant/spouse incomes and reciprocal pointers linking a resident spouse; sums applied regardless of spouse age. Nonresident spouse income was unavailable; separated respondents lacked spouse details [23]. Cohabitation, unspecified status and missing/inconsistent links remained unresolved, without assumed single status or zero partner income. S2 tested alternatives.
-</w:t>
+        <w:t xml:space="preserve">The 2008 regulations define spouses (regulation 1), include spouse income regardless of property regime (18(2)) and use half-joint annual income (19(1)). They allow Agency-approved exclusion after continuous desertion for at least three months and unwillingness to support (18(3)) [27]. The July 2015 amendment left these OPG means provisions unchanged [28]. Survey responses established neither legal spouse status nor desertion conditions. Never-married, widowed and divorced adults used single ceilings. For married adults, research rules required resolved applicant/spouse incomes and reciprocal pointers linking a resident spouse; sums applied regardless of spouse age. Nonresident spouse income was unavailable; separated respondents lacked spouse details [23]. Cohabitation, unspecified status and missing/inconsistent links remained unresolved, without assumed single status or zero partner income. S2 tested alternatives.</w:t>
       </w:r>
     </w:p>
     <w:p>
@@ -3651,8 +3609,7 @@
           <w:sz w:val="20"/>
           <w:szCs w:val="20"/>
         </w:rPr>
-        <w:t xml:space="preserve">An adult's reported disability or war-veterans grant caused FAIL. Caregiver child grants and grant-in-aid neither excluded the adult nor defined OPG receipt. A known failure took priority over unresolved information; the screen retained all reasons.
-</w:t>
+        <w:t xml:space="preserve">An adult's reported disability or war-veterans grant caused FAIL. Caregiver child grants and grant-in-aid neither excluded the adult nor defined OPG receipt. A known failure took priority over unresolved information; the screen retained all reasons.</w:t>
       </w:r>
     </w:p>
     <w:p>
@@ -3666,8 +3623,7 @@
           <w:sz w:val="20"/>
           <w:szCs w:val="20"/>
         </w:rPr>
-        <w:t xml:space="preserve">For adults who passed, the software interpreted general-grant and OPG answers together, including structural skips (questions omitted because earlier answers make them inapplicable). A consistent “no grant” answer can establish non-receipt when the OPG follow-up does not apply. Contradictory or unexplained answers remain unresolved and exclude the person from modelling. The analysis flagged disagreements between current receipt and preceding-year OPG income without changing the outcome because the periods differ. Rule version opg-kzn-primary-v1 records these decisions. The denominator contains adults who pass and have a clear receipt answer.
-</w:t>
+        <w:t xml:space="preserve">For adults who passed, the software interpreted general-grant and OPG answers together, including structural skips (questions omitted because earlier answers make them inapplicable). A consistent “no grant” answer can establish non-receipt when the OPG follow-up does not apply. Contradictory or unexplained answers remain unresolved and exclude the person from modelling. The analysis flagged disagreements between current receipt and preceding-year OPG income without changing the outcome because the periods differ. Rule version opg-kzn-primary-v1 records these decisions. The denominator contains adults who pass and have a clear receipt answer.</w:t>
       </w:r>
     </w:p>
     <w:p>
@@ -3695,8 +3651,7 @@
           <w:sz w:val="20"/>
           <w:szCs w:val="20"/>
         </w:rPr>
-        <w:t xml:space="preserve">C. Survey-weighted description and uncertainty
-</w:t>
+        <w:t xml:space="preserve">C. Survey-weighted description and uncertainty</w:t>
       </w:r>
     </w:p>
     <w:p>
@@ -3710,8 +3665,7 @@
           <w:sz w:val="20"/>
           <w:szCs w:val="20"/>
         </w:rPr>
-        <w:t xml:space="preserve">RQ1 used both the ordinary count proportion and the person-weighted proportion: p = Σ(wᵢYᵢ)/Σwᵢ. Here, wᵢ is a person's weight and Yᵢ equals 1 for non-receipt and 0 for receipt. Group comparisons describe differences; they do not establish causes.
-</w:t>
+        <w:t xml:space="preserve">RQ1 used both the ordinary count proportion and the person-weighted proportion: p = Σ(wᵢYᵢ)/Σwᵢ. Here, wᵢ is a person's weight and Yᵢ equals 1 for non-receipt and 0 for receipt. Group comparisons describe differences; they do not establish causes.</w:t>
       </w:r>
     </w:p>
     <w:p>
@@ -3725,8 +3679,7 @@
           <w:sz w:val="20"/>
           <w:szCs w:val="20"/>
         </w:rPr>
-        <w:t xml:space="preserve">The released files lack strata. Derived primary sampling units (PSUs) supported an estimate of sampling uncertainty. The calculation allows a group to be sampled more than once. It cannot reproduce the complete survey design. Adults with unresolved screening information remain outside the proportion. Receipt bounds (the lowest and highest rates if all unclear PASS receipt answers mean receipt or all mean non-receipt) tested the effect of unclear receipt answers.
-</w:t>
+        <w:t xml:space="preserve">The released files lack strata. Derived primary sampling units (PSUs) supported an estimate of sampling uncertainty. The calculation allows a group to be sampled more than once. It cannot reproduce the complete survey design. Adults with unresolved screening information remain outside the proportion. Receipt bounds (the lowest and highest rates if all unclear PASS receipt answers mean receipt or all mean non-receipt) tested the effect of unclear receipt answers.</w:t>
       </w:r>
     </w:p>
     <w:p>
@@ -3754,8 +3707,7 @@
           <w:sz w:val="20"/>
           <w:szCs w:val="20"/>
         </w:rPr>
-        <w:t xml:space="preserve">D. Model specification and validation
-</w:t>
+        <w:t xml:space="preserve">D. Model specification and validation</w:t>
       </w:r>
     </w:p>
     <w:p>
@@ -3769,8 +3721,7 @@
           <w:sz w:val="20"/>
           <w:szCs w:val="20"/>
         </w:rPr>
-        <w:t xml:space="preserve">The unweighted logistic model estimated probability of reported non-receipt. The analysis did not rebalance recipients and non-recipients, automatically select variables or choose a cutoff. The model describes associations after accounting for other predictors. Age enters per decade above 60. Comparison categories are male, Grade 7 or above, urban formal and an office nearer than 5 km. Five predictor groups require six slopes and an intercept, because settlement requires two comparisons.
-</w:t>
+        <w:t xml:space="preserve">The unweighted logistic model estimated probability of reported non-receipt. The analysis did not rebalance recipients and non-recipients, automatically select variables or choose a cutoff. The model describes associations after accounting for other predictors. Age enters per decade above 60. Comparison categories are male, Grade 7 or above, urban formal and an office nearer than 5 km. Five predictor groups require six slopes and an intercept, because settlement requires two comparisons.</w:t>
       </w:r>
     </w:p>
     <w:p>
@@ -3784,8 +3735,7 @@
           <w:sz w:val="20"/>
           <w:szCs w:val="20"/>
         </w:rPr>
-        <w:t xml:space="preserve">Rural formal settlement had 31 adults and one non-recipient. One seven-slope training fold then contained 30 rural-formal adults and no event; its coefficient was about −21.88 and did not converge. Four of five folds converged. Decision D-052 combined rural formal with traditional settlement after that outcome pattern was known, so the retained cross-validation can be optimistic and does not show that the settings are equivalent. The seven-slope out-of-fold AUC was 0.739 and its calibration slope 0.673, against 0.752 and 0.836 after the merge. Because one fit failed, this comparison is diagnostic only. Ridge logistic regression was then applied to both codings on the same household folds. The penalty was chosen inside each training set from a fixed grid. Every fold selected the same penalty, and all ten fits converged. Held-out AUC was 0.756 for the merged coding and 0.750 for the separate coding (Supplementary Table S2). The ordinary merged model remains the reference. This comparison does not make Decision D-052 outcome-independent. Income, receipt, derived labels and marital status do not enter the primary model.
-</w:t>
+        <w:t xml:space="preserve">Rural formal settlement had 31 adults and one non-recipient. One seven-slope training fold then contained 30 rural-formal adults and no event; its coefficient was about −21.88 and did not converge. Four of five folds converged. Decision D-052 combined rural formal with traditional settlement after that outcome pattern was known, so the retained cross-validation can be optimistic and does not show that the settings are equivalent. Supplementary Table S2 retains this failed attempt as a diagnostic. Ridge logistic regression was then applied to both codings on the same household folds. Five inner household folds selected C by mean Brier score, with training-only imputation and scaling; all ten outer fits chose C = 0.1 and converged. Held-out AUC was 0.756 for the merged coding and 0.750 for the separate coding (Supplementary Table S2). The ordinary merged model remains the reference. This comparison does not make Decision D-052 outcome-independent. Income, receipt, derived labels and marital status do not enter the primary model.</w:t>
       </w:r>
     </w:p>
     <w:p>
@@ -3799,8 +3749,7 @@
           <w:sz w:val="20"/>
           <w:szCs w:val="20"/>
         </w:rPr>
-        <w:t xml:space="preserve">Validation used five household-grouped folds. Sorted households were labelled by whether any member reported non-receipt, then stratified so every adult from a household stayed in one fold. Seed 201415 fixes this division. The 1,013 adults come from 827 households: 182 contain more than one modelled adult, and 6 contain both receipt and non-receipt. Each adult received one out-of-fold (OOF) probability from a model trained without that household. The intercept-only reference uses the training group's non-receipt rate.
-</w:t>
+        <w:t xml:space="preserve">Validation used five household-grouped folds. Sorted households were labelled by whether any member reported non-receipt, then stratified so every adult from a household stayed in one fold. Seed 201415 fixes this division. The 1,013 adults come from 827 households: 182 contain more than one modelled adult, and 6 contain both receipt and non-receipt. Each adult received one out-of-fold (OOF) probability from a model trained without that household. The intercept-only reference uses the training group's non-receipt rate.</w:t>
       </w:r>
     </w:p>
     <w:p>
@@ -3814,8 +3763,7 @@
           <w:sz w:val="20"/>
           <w:szCs w:val="20"/>
         </w:rPr>
-        <w:t xml:space="preserve">After interpreting skipped questions, each training fold supplied the fill-in for its held-out adults. Schooling contrasted below Grade 7 with Grade 7 or above, and office distance contrasted at least 5 km or unavailable with nearer than 5 km. Other codes stayed missing. The training fold filled missing age, in decades above 60, with its median, and a missing category with its most frequent code, or the smaller code in a tie. Eligibility, receipt and weights were not filled or modelled. Three recipients lacked usable schooling; 14 recipients and four non-recipients lacked usable office distance. Age, sex and settlement were already complete.
-</w:t>
+        <w:t xml:space="preserve">After interpreting skipped questions, each training fold supplied the fill-in for its held-out adults. Schooling contrasted below Grade 7 with Grade 7 or above, and office distance contrasted at least 5 km or unavailable with nearer than 5 km. Other codes stayed missing. The training fold filled missing age, in decades above 60, with its median, and a missing category with its most frequent code, or the smaller code in a tie. Eligibility, receipt and weights were not filled or modelled. Three recipients lacked usable schooling; 14 recipients and four non-recipients lacked usable office distance. Age, sex and settlement were already complete.</w:t>
       </w:r>
     </w:p>
     <w:p>
@@ -3829,8 +3777,7 @@
           <w:sz w:val="20"/>
           <w:szCs w:val="20"/>
         </w:rPr>
-        <w:t xml:space="preserve">Pooled OOF probabilities supplied average precision, AUC, Brier score, calibration slope and calibration-in-the-large. Calibration-in-the-large is an intercept correction with its slope fixed at 1; the ideal values are 0 and 1. The 95% intervals are 2.5 and 97.5 percentiles from 1,000 with-replacement household samples of those fixed predictions, using the same seed. Every selected household's adults were retained. All 1,000 samples contained both outcome classes. These intervals condition on seed 201415, its preprocessing and fits, and Decision D-052. They do not repeat the split, imputation or estimation, and they are not survey-design confidence intervals. A separate sensitivity repeated the same household-grouped procedure 20 times, using seeds 201415–201434, with training-only imputation and refitting. Decision D-052 stayed fixed.
-</w:t>
+        <w:t xml:space="preserve">Pooled OOF probabilities supplied average precision, AUC, Brier score, calibration slope and calibration-in-the-large. Calibration-in-the-large is an intercept correction with its slope fixed at 1; the ideal values are 0 and 1. The 95% intervals are 2.5 and 97.5 percentiles from 1,000 with-replacement household samples of those fixed predictions, using the same seed. Every selected household's adults were retained. All 1,000 samples contained both outcome classes. These intervals condition on seed 201415, its preprocessing and fits, and Decision D-052. They do not repeat the split, imputation or estimation, and they are not survey-design confidence intervals. Twenty household-grouped repetitions (seeds 201415–201434) repeated training-only imputation and refitting, with D-052 fixed. Metrics pooled one held-out prediction per adult within each repetition (Supplementary Table S3).</w:t>
       </w:r>
     </w:p>
     <w:p>
@@ -3858,8 +3805,7 @@
           <w:sz w:val="20"/>
           <w:szCs w:val="20"/>
         </w:rPr>
-        <w:t xml:space="preserve">E. Alternative assumptions
-</w:t>
+        <w:t xml:space="preserve">E. Alternative assumptions</w:t>
       </w:r>
     </w:p>
     <w:p>
@@ -3873,8 +3819,7 @@
           <w:sz w:val="20"/>
           <w:szCs w:val="20"/>
         </w:rPr>
-        <w:t xml:space="preserve">S1 changes thresholds, S2 partnership assumptions, S3 rules about other grants, S4 income definition, S5 receipt period and S6 unresolved-receipt bounds. Each records the denominator, non-recipients, ordinary/person-weighted rates and internally validated model performance. S7 uses complete cases. S8 replaces welfare access with a married indicator. S9 uses frequency weights (treating person weights as repeated-record contributions), keeping unweighted missing-value treatment and evaluation. This is not a full survey-design regression. S10 weights primary OOF measures without refitting. S11 groups validation folds by derived PSU. These results remain separate from the primary analysis.
-</w:t>
+        <w:t xml:space="preserve">S1 changes thresholds, S2 partnership assumptions, S3 rules about other grants, S4 income definition, S5 receipt period and S6 unresolved-receipt bounds. Each records the denominator, non-recipients, ordinary/person-weighted rates and internally validated model performance. S7 uses complete cases. S8 replaces welfare access with a married indicator. S9 uses frequency weights (treating person weights as repeated-record contributions), keeping unweighted missing-value treatment and evaluation. This is not a full survey-design regression. S10 weights primary OOF measures without refitting. S11 groups validation folds by derived PSU. These results remain separate from the primary analysis. Supplementary Tables S1–S5 provide the scenario rules, ridge comparison, repeated refits, descriptive summaries and search record.</w:t>
       </w:r>
     </w:p>
     <w:p>
@@ -3902,8 +3847,7 @@
           <w:sz w:val="20"/>
           <w:szCs w:val="20"/>
         </w:rPr>
-        <w:t xml:space="preserve">IV. Software and Evaluation
-</w:t>
+        <w:t xml:space="preserve">IV. Software and Evaluation</w:t>
       </w:r>
     </w:p>
     <w:p>
@@ -3917,8 +3861,7 @@
           <w:sz w:val="20"/>
           <w:szCs w:val="20"/>
         </w:rPr>
-        <w:t xml:space="preserve">The command python analysis/run_study.py links survey files, screens adults and calculates results. Run records retain settings, versions, seed, folds and checksums. The saved model stores coefficients and missing-value settings in JSON, without executable program code. Version opg-kzn-six-slope-v1 uses the model trained on all included adults. Uploads do not retrain it.
-</w:t>
+        <w:t xml:space="preserve">The command python analysis/run_study.py links survey files, screens adults and calculates results. Run records retain settings, versions, seed, folds and checksums. The saved model stores coefficients and missing-value settings in JSON, without executable program code. Version opg-kzn-six-slope-v1 uses the model trained on all included adults. Uploads do not retrain it.</w:t>
       </w:r>
     </w:p>
     <w:p>
@@ -3932,8 +3875,7 @@
           <w:sz w:val="20"/>
           <w:szCs w:val="20"/>
         </w:rPr>
-        <w:t xml:space="preserve">The local Streamlit app has five sections: study context, upload/validation, eligibility/receipt, prediction/model and export/reproducibility. It accepts historical opg-screen-v1 CSV files, including household members needed to check spouse resources. Validation rejects incorrect schema, study context, duplicate identifiers, categories and numeric values. Limits are 20 MiB and 50,000 rows. Uploads stay in memory during the current session. Reports use generated row labels and omit submitted identifiers, raw income and household links. Users can filter views and exports; summary rates retain all uploaded adults who pass with resolved receipt.
-</w:t>
+        <w:t xml:space="preserve">The local Streamlit app has five sections: study context, upload/validation, eligibility/receipt, prediction/model and export/reproducibility. It accepts historical opg-screen-v1 CSV files, including household members needed to check spouse resources. Validation rejects incorrect schema, study context, duplicate identifiers, categories and numeric values. Limits are 20 MiB and 50,000 rows. Uploads stay in memory during the current session. Reports use generated row labels and omit submitted identifiers, raw income and household links. Users can filter views and exports; summary rates retain all uploaded adults who pass with resolved receipt.</w:t>
       </w:r>
     </w:p>
     <w:p>
@@ -3947,7 +3889,7 @@
           <wp:inline distT="0" distB="0" distL="0" distR="0">
             <wp:extent cx="3200400" cy="2343150"/>
             <wp:effectExtent t="0" r="0" b="0" l="0"/>
-            <wp:docPr id="1" name="Fig. 2. Research and app workflows share screening rules. Household-held-out predictions remain separate from app scores calculated using the model trained on all included adults. " descr="Fig. 2. Research and app workflows share screening rules. Household-held-out predictions remain separate from app scores calculated using the model trained on all included adults. " title="Fig. 2. Research and app workflows share screening rules. Household-held-out predictions remain separate from app scores calculated using the model trained on all included adults. "/>
+            <wp:docPr id="1" name="Fig. 2. Research and app workflows share screening rules. Household-held-out predictions remain separate from app scores calculated using the model trained on all included adults." descr="Fig. 2. Research and app workflows share screening rules. Household-held-out predictions remain separate from app scores calculated using the model trained on all included adults." title="Fig. 2. Research and app workflows share screening rules. Household-held-out predictions remain separate from app scores calculated using the model trained on all included adults."/>
             <wp:cNvGraphicFramePr>
               <a:graphicFrameLocks xmlns:a="http://schemas.openxmlformats.org/drawingml/2006/main" noChangeAspect="1"/>
             </wp:cNvGraphicFramePr>
@@ -3998,8 +3940,7 @@
           <w:sz w:val="16"/>
           <w:szCs w:val="16"/>
         </w:rPr>
-        <w:t xml:space="preserve">Fig. 2. Research and app workflows share screening rules. Household-held-out predictions remain separate from app scores calculated using the model trained on all included adults.
-</w:t>
+        <w:t xml:space="preserve">Fig. 2. Research and app workflows share screening rules. Household-held-out predictions remain separate from app scores calculated using the model trained on all included adults.</w:t>
       </w:r>
     </w:p>
     <w:p>
@@ -4013,8 +3954,7 @@
           <w:sz w:val="20"/>
           <w:szCs w:val="20"/>
         </w:rPr>
-        <w:t xml:space="preserve">The app reuses the screening rules and saved model settings. It scores only supported adults who pass with resolved receipt. Saved training statistics fill partly missing predictors; records missing every categorical predictor remain unscored. Integrity checks link model and evaluation files to the analysis and predictor code. The interface labels historical OOF results separately from uploaded scores; uploaded records may overlap training data. CSV, JSON and ZIP reports contain classifications, reasons, supported probabilities, versions and an audit manifest (settings and file checksums). The downloadable package uses invented data and excludes survey microdata.
-</w:t>
+        <w:t xml:space="preserve">The app reuses the screening rules and saved model settings. It scores only supported adults who pass with resolved receipt. Saved training statistics fill partly missing predictors; records missing every categorical predictor remain unscored. Integrity checks link model and evaluation files to the analysis and predictor code. The interface labels historical OOF results separately from uploaded scores; uploaded records may overlap training data. CSV, JSON and ZIP reports contain classifications, reasons, supported probabilities, versions and an audit manifest (settings and file checksums). The downloadable package uses invented data and excludes survey microdata.</w:t>
       </w:r>
     </w:p>
     <w:p>
@@ -4028,8 +3968,7 @@
           <w:sz w:val="20"/>
           <w:szCs w:val="20"/>
         </w:rPr>
-        <w:t xml:space="preserve">Software checks compared screening decisions with expected results and tested excluded predictors, links, repeated runs, reports and saved predictions. Further checks compared the CLI (command-line interface) with the UI (user interface), including invalid inputs and outdated results. The owner's Windows walkthrough demonstrated local functionality. A task sheet supports future testing with three to five consenting participants; no participant study has taken place.
-</w:t>
+        <w:t xml:space="preserve">Software checks compared screening decisions with expected results and tested excluded predictors, links, repeated runs, reports and saved predictions. Further checks compared the CLI (command-line interface) with the UI (user interface), including invalid inputs and outdated results. The owner's Windows walkthrough demonstrated local functionality. A task sheet supports future testing with three to five consenting participants; no participant study has taken place.</w:t>
       </w:r>
     </w:p>
     <w:p>
@@ -4057,8 +3996,7 @@
           <w:sz w:val="20"/>
           <w:szCs w:val="20"/>
         </w:rPr>
-        <w:t xml:space="preserve">V. Results
-</w:t>
+        <w:t xml:space="preserve">V. Results</w:t>
       </w:r>
     </w:p>
     <w:p>
@@ -4086,8 +4024,7 @@
           <w:sz w:val="20"/>
           <w:szCs w:val="20"/>
         </w:rPr>
-        <w:t xml:space="preserve">A. Study group and reported non-receipt
-</w:t>
+        <w:t xml:space="preserve">A. Study group and reported non-receipt</w:t>
       </w:r>
     </w:p>
     <w:p>
@@ -4101,8 +4038,7 @@
           <w:sz w:val="20"/>
           <w:szCs w:val="20"/>
         </w:rPr>
-        <w:t xml:space="preserve">The survey included 15,388 people in 3,686 KwaZulu-Natal households. Table IV shows the selection steps. Among 117 failures, 93 exceeded the income ceiling and 25 reported a disability grant; one met both conditions. None reported a war-veterans grant. Among 187 unresolved adults, 105 were married, mostly with a non-resident spouse, and 63 reported living together. Unresolved adults outnumbered non-recipients.
-</w:t>
+        <w:t xml:space="preserve">The survey included 15,388 people in 3,686 KwaZulu-Natal households. Table IV shows the selection steps. Among 117 failures, 93 exceeded the income ceiling and 25 reported a disability grant; one met both conditions. None reported a war-veterans grant. Among 187 unresolved adults, 105 were married, mostly with a non-resident spouse, and 63 reported living together. Unresolved adults outnumbered non-recipients.</w:t>
       </w:r>
     </w:p>
     <w:p>
@@ -4121,8 +4057,7 @@
           <w:sz w:val="16"/>
           <w:szCs w:val="16"/>
         </w:rPr>
-        <w:t xml:space="preserve">Table IV. KwaZulu-Natal study group at each screening step
-</w:t>
+        <w:t xml:space="preserve">Table IV. KwaZulu-Natal study group at each screening step</w:t>
       </w:r>
     </w:p>
     <w:tbl>
@@ -5195,8 +5130,7 @@
           <w:sz w:val="16"/>
           <w:szCs w:val="16"/>
         </w:rPr>
-        <w:t xml:space="preserve">Each row counts distinct households. A household can appear in several rows.
-</w:t>
+        <w:t xml:space="preserve">Each row counts distinct households. A household can appear in several rows.</w:t>
       </w:r>
     </w:p>
     <w:p>
@@ -5210,7 +5144,7 @@
           <wp:inline distT="0" distB="0" distL="0" distR="0">
             <wp:extent cx="3200400" cy="2466975"/>
             <wp:effectExtent t="0" r="0" b="0" l="0"/>
-            <wp:docPr id="1" name="Fig. 3. FAIL, UNRESOLVED and PASS groups do not overlap. All 1,013 PASS adults resolve receipt and enter the final denominator. " descr="Fig. 3. FAIL, UNRESOLVED and PASS groups do not overlap. All 1,013 PASS adults resolve receipt and enter the final denominator. " title="Fig. 3. FAIL, UNRESOLVED and PASS groups do not overlap. All 1,013 PASS adults resolve receipt and enter the final denominator. "/>
+            <wp:docPr id="1" name="Fig. 3. FAIL, UNRESOLVED and PASS groups do not overlap. All 1,013 PASS adults resolve receipt and enter the final denominator." descr="Fig. 3. FAIL, UNRESOLVED and PASS groups do not overlap. All 1,013 PASS adults resolve receipt and enter the final denominator." title="Fig. 3. FAIL, UNRESOLVED and PASS groups do not overlap. All 1,013 PASS adults resolve receipt and enter the final denominator."/>
             <wp:cNvGraphicFramePr>
               <a:graphicFrameLocks xmlns:a="http://schemas.openxmlformats.org/drawingml/2006/main" noChangeAspect="1"/>
             </wp:cNvGraphicFramePr>
@@ -5261,8 +5195,7 @@
           <w:sz w:val="16"/>
           <w:szCs w:val="16"/>
         </w:rPr>
-        <w:t xml:space="preserve">Fig. 3. FAIL, UNRESOLVED and PASS groups do not overlap. All 1,013 PASS adults resolve receipt and enter the final denominator.
-</w:t>
+        <w:t xml:space="preserve">Fig. 3. FAIL, UNRESOLVED and PASS groups do not overlap. All 1,013 PASS adults resolve receipt and enter the final denominator.</w:t>
       </w:r>
     </w:p>
     <w:p>
@@ -5276,8 +5209,7 @@
           <w:sz w:val="20"/>
           <w:szCs w:val="20"/>
         </w:rPr>
-        <w:t xml:space="preserve">Of these 1,013 adults, 67 reported non-receipt: 6.61% without weights and 7.49% with person weights. The calculation used 345 derived PSUs and gave a standard error of 1.3 percentage points. A bell-shaped sampling approximation gave a 95% confidence interval of 4.9%–10.0%. Missing strata limit this approximation. All 1,013 PASS answers agreed with preceding-year OPG income, so those checks changed nothing. Table V separates unweighted sample summaries from person-weighted summaries before missing values are filled. Percentages describe receipt-group composition, not non-receipt rates or predictions.
-</w:t>
+        <w:t xml:space="preserve">Of these 1,013 adults, 67 reported non-receipt: 6.61% without weights and 7.49% with person weights. The calculation used 345 derived PSUs and gave a standard error of 1.3 percentage points. A bell-shaped sampling approximation gave a 95% confidence interval of 4.9%–10.0%. Missing strata limit this approximation. All 1,013 PASS answers agreed with preceding-year OPG income, so those checks changed nothing. Table V separates unweighted sample summaries from person-weighted summaries before missing values are filled. Percentages describe receipt-group composition, not non-receipt rates or predictions.</w:t>
       </w:r>
     </w:p>
     <w:p>
@@ -5296,8 +5228,7 @@
           <w:sz w:val="16"/>
           <w:szCs w:val="16"/>
         </w:rPr>
-        <w:t xml:space="preserve">Table V. Characteristics by reported OPG receipt, before imputation
-</w:t>
+        <w:t xml:space="preserve">Table V. Characteristics by reported OPG receipt, before imputation</w:t>
       </w:r>
     </w:p>
     <w:tbl>
@@ -6370,8 +6301,7 @@
           <w:sz w:val="16"/>
           <w:szCs w:val="16"/>
         </w:rPr>
-        <w:t xml:space="preserve">unw. is the unweighted count and percentage, or the unweighted mean age. wtd is the person-weighted percentage or mean. Missing predictors remain in the denominators. Supplementary Table S4 prints the unweighted and weighted values in separate columns. These summaries have no uncertainty intervals.
-</w:t>
+        <w:t xml:space="preserve">unw. is the unweighted count and percentage, or the unweighted mean age. wtd is the person-weighted percentage or mean. Missing predictors remain in the denominators. Supplementary Table S4 prints the unweighted and weighted values in separate columns. These summaries have no uncertainty intervals.</w:t>
       </w:r>
     </w:p>
     <w:p>
@@ -6399,8 +6329,7 @@
           <w:sz w:val="20"/>
           <w:szCs w:val="20"/>
         </w:rPr>
-        <w:t xml:space="preserve">B. Screening sensitivity
-</w:t>
+        <w:t xml:space="preserve">B. Screening sensitivity</w:t>
       </w:r>
     </w:p>
     <w:p>
@@ -6414,8 +6343,7 @@
           <w:sz w:val="20"/>
           <w:szCs w:val="20"/>
         </w:rPr>
-        <w:t xml:space="preserve">Table VI keeps scenarios whose counts differ from the primary screen. Changed cohorts were refitted. Unchanged cohorts reused the primary predictions, so matching performance is not an independent fit. Supplementary Table S1 defines every rule.
-</w:t>
+        <w:t xml:space="preserve">Table VI summarises changed-cohort scenarios alongside the baseline and unchanged-scenario reference. Changed cohorts were refitted. Unchanged cohorts reused the primary predictions, so matching performance is not an independent fit. Supplementary Table S1 defines every rule.</w:t>
       </w:r>
     </w:p>
     <w:p>
@@ -6434,8 +6362,7 @@
           <w:sz w:val="16"/>
           <w:szCs w:val="16"/>
         </w:rPr>
-        <w:t xml:space="preserve">Table VI. Changed screening rules and OOF performance
-</w:t>
+        <w:t xml:space="preserve">Table VI. Changed screening rules and OOF performance</w:t>
       </w:r>
     </w:p>
     <w:tbl>
@@ -9410,8 +9337,7 @@
           <w:sz w:val="16"/>
           <w:szCs w:val="16"/>
         </w:rPr>
-        <w:t xml:space="preserve">Events are reported non-recipients. Performance uses no weights. S1b uses the 2015 ceiling at every interview. S1d uses the income level at which the formula pays nothing; it admitted the same two adults as S1b. S2a/S2b screen living-together adults as couples/single. S2c screens separated adults as single; S2d screens both as single. S3 retains disability-grant recipients and adds no war-veterans recipient. S4b keeps social-assistance income in the proxy.
-</w:t>
+        <w:t xml:space="preserve">Events are reported non-recipients. Performance uses no weights. S1b uses the 2015 ceiling at every interview. S1d uses the income level at which the formula pays nothing; it admitted the same two adults as S1b. S2a/S2b screen living-together adults as couples/single. S2c screens separated adults as single; S2d screens both as single. S3 retains disability-grant recipients and adds no war-veterans recipient. S4b keeps social-assistance income in the proxy.</w:t>
       </w:r>
     </w:p>
     <w:p>
@@ -9425,8 +9351,7 @@
           <w:sz w:val="20"/>
           <w:szCs w:val="20"/>
         </w:rPr>
-        <w:t xml:space="preserve">*S1a, S1c, S4a, S4c, S5 and S6a/S6b keep the S0 counts and reuse its predictions. Identical counts do not make the rules equivalent. No PASS adult has unresolved receipt for S6a/S6b to bound. Definitions are in Supplementary Table S1.
-</w:t>
+        <w:t xml:space="preserve">*S1a, S1c, S4a, S4c, S5 and S6a/S6b keep the S0 counts and reuse its predictions. Identical counts do not make the rules equivalent. No PASS adult has unresolved receipt for S6a/S6b to bound. Definitions are in Supplementary Table S1.</w:t>
       </w:r>
     </w:p>
     <w:p>
@@ -9454,8 +9379,7 @@
           <w:sz w:val="20"/>
           <w:szCs w:val="20"/>
         </w:rPr>
-        <w:t xml:space="preserve">C. Held-out prediction
-</w:t>
+        <w:t xml:space="preserve">C. Held-out prediction</w:t>
       </w:r>
     </w:p>
     <w:p>
@@ -9469,8 +9393,7 @@
           <w:sz w:val="20"/>
           <w:szCs w:val="20"/>
         </w:rPr>
-        <w:t xml:space="preserve">All five folds converged. Figure 4 uses five similarly sized bins. The highest bin had average prediction 0.188 and 35/203 non-recipients (17.2%); the lowest had average 0.0107 and 3/206 non-recipients (1.5%).
-</w:t>
+        <w:t xml:space="preserve">All five folds converged. Figure 4 uses five similarly sized bins. The highest bin had average prediction 0.188 and 35/203 non-recipients (17.2%); the lowest had average 0.0107 and 3/206 non-recipients (1.5%).</w:t>
       </w:r>
     </w:p>
     <w:p>
@@ -9489,8 +9412,7 @@
           <w:sz w:val="16"/>
           <w:szCs w:val="16"/>
         </w:rPr>
-        <w:t xml:space="preserve">Table VII. Primary held-out performance and uncertainty
-</w:t>
+        <w:t xml:space="preserve">Table VII. Primary held-out performance and uncertainty</w:t>
       </w:r>
     </w:p>
     <w:tbl>
@@ -10305,8 +10227,7 @@
           <w:sz w:val="16"/>
           <w:szCs w:val="16"/>
         </w:rPr>
-        <w:t xml:space="preserve">Estimates pool unweighted OOF predictions: 1,013 people/67 events. The intervals use percentile bounds from 1,000 household resamples of fixed predictions. All reported intervals have zero invalid resamples. Resampling did not refit models or missing-value settings. The intercept-only reference uses the training group's non-receipt rate. Dashes mean unavailable measures/intervals, rather than zero or chance performance.
-</w:t>
+        <w:t xml:space="preserve">Estimates pool unweighted OOF predictions: 1,013 people/67 events. The intervals use percentile bounds from 1,000 household resamples of fixed predictions. All reported intervals have zero invalid resamples. Resampling did not refit models or missing-value settings. The intercept-only reference uses the training group's non-receipt rate. Dashes mean unavailable measures/intervals, rather than zero or chance performance.</w:t>
       </w:r>
     </w:p>
     <w:p>
@@ -10320,7 +10241,7 @@
           <wp:inline distT="0" distB="0" distL="0" distR="0">
             <wp:extent cx="3200400" cy="2286000"/>
             <wp:effectExtent t="0" r="0" b="0" l="0"/>
-            <wp:docPr id="1" name="Fig. 4. Saved group summaries show unweighted OOF calibration. Labels give events/people; the diagonal shows exact agreement between average predictions and observed rates. Plot range: 0–0.22. " descr="Fig. 4. Saved group summaries show unweighted OOF calibration. Labels give events/people; the diagonal shows exact agreement between average predictions and observed rates. Plot range: 0–0.22. " title="Fig. 4. Saved group summaries show unweighted OOF calibration. Labels give events/people; the diagonal shows exact agreement between average predictions and observed rates. Plot range: 0–0.22. "/>
+            <wp:docPr id="1" name="Fig. 4. Saved group summaries show unweighted OOF calibration. Labels give events/people; the diagonal shows exact agreement between average predictions and observed rates. Plot range: 0–0.22." descr="Fig. 4. Saved group summaries show unweighted OOF calibration. Labels give events/people; the diagonal shows exact agreement between average predictions and observed rates. Plot range: 0–0.22." title="Fig. 4. Saved group summaries show unweighted OOF calibration. Labels give events/people; the diagonal shows exact agreement between average predictions and observed rates. Plot range: 0–0.22."/>
             <wp:cNvGraphicFramePr>
               <a:graphicFrameLocks xmlns:a="http://schemas.openxmlformats.org/drawingml/2006/main" noChangeAspect="1"/>
             </wp:cNvGraphicFramePr>
@@ -10371,8 +10292,7 @@
           <w:sz w:val="16"/>
           <w:szCs w:val="16"/>
         </w:rPr>
-        <w:t xml:space="preserve">Fig. 4. Saved group summaries show unweighted OOF calibration. Labels give events/people; the diagonal shows exact agreement between average predictions and observed rates. Plot range: 0–0.22.
-</w:t>
+        <w:t xml:space="preserve">Fig. 4. Saved group summaries show unweighted OOF calibration. Labels give events/people; the diagonal shows exact agreement between average predictions and observed rates. Plot range: 0–0.22.</w:t>
       </w:r>
     </w:p>
     <w:p>
@@ -10386,8 +10306,7 @@
           <w:sz w:val="20"/>
           <w:szCs w:val="20"/>
         </w:rPr>
-        <w:t xml:space="preserve">The odds ratio for women versus men was 0.39 (Wald interval 0.23–0.66). Schooling below Grade 7 versus Grade 7 or above gave 0.24 (0.13–0.43). These full-sample associations are not held-out performance or causes. Only 67 events supported six slopes. Across the 100 refitted training folds, the female and below-Grade-7 coefficients stayed negative, while the urban-informal coefficient changed sign. Age, settlement and welfare-distance intervals included 1. That is limited precision, not evidence of no association, and those intervals omit the settlement-coding decision. The 20 repeated splits gave 100 converged fits. AUC ranged from 0.733 to 0.773 (median 0.753) and the calibration slope from 0.738 to 0.943 (median 0.837). Supplementary Table S3 gives the median, interquartile range and range for every performance measure, and the coefficient ranges. That spread is a sensitivity summary for the fixed coding, not a confidence interval.
-</w:t>
+        <w:t xml:space="preserve">The odds ratio for women versus men was 0.39 (Wald interval 0.23–0.66). Schooling below Grade 7 versus Grade 7 or above gave 0.24 (0.13–0.43). These full-sample associations are not held-out performance or causes. Only 67 events supported six slopes. Across the 100 refitted training folds, the female and below-Grade-7 coefficients stayed negative, while the urban-informal coefficient changed sign. Age, settlement and welfare-distance intervals included 1. That is limited precision, not evidence of no association, and those intervals omit the settlement-coding decision. The 20 repeated splits gave 100 converged fits. AUC ranged from 0.733 to 0.773 (median 0.753) and the calibration slope from 0.738 to 0.943 (median 0.837). Supplementary Table S3 gives the median, interquartile range and range for every performance measure, and the coefficient ranges. That spread is a sensitivity summary for the fixed coding, not a confidence interval.</w:t>
       </w:r>
     </w:p>
     <w:p>
@@ -10406,8 +10325,7 @@
           <w:sz w:val="16"/>
           <w:szCs w:val="16"/>
         </w:rPr>
-        <w:t xml:space="preserve">Table VIII. Model/validation sensitivities
-</w:t>
+        <w:t xml:space="preserve">Table VIII. Model/validation sensitivities</w:t>
       </w:r>
     </w:p>
     <w:tbl>
@@ -12215,8 +12133,7 @@
           <w:sz w:val="16"/>
           <w:szCs w:val="16"/>
         </w:rPr>
-        <w:t xml:space="preserve">The non-receipt-rate column uses no weights; S8–S11 keep the weighted non-receipt rate at 7.49%. S9 uses frequency weights when fitting, but no weights when filling missing values or checking predictions. S10 weights the primary OOF predictions without refitting. S8 replaces welfare access and keeps six slopes. S7 removes 21 people/four events. S11 changes fold grouping but keeps the study group.
-</w:t>
+        <w:t xml:space="preserve">The non-receipt-rate column uses no weights; S8–S11 keep the weighted non-receipt rate at 7.49%. S9 uses frequency weights when fitting, but no weights when filling missing values or checking predictions. S10 weights the primary OOF predictions without refitting. S8 replaces welfare access and keeps six slopes. S7 removes 21 people/four events. S11 changes fold grouping but keeps the study group.</w:t>
       </w:r>
     </w:p>
     <w:p>
@@ -12244,8 +12161,7 @@
           <w:sz w:val="20"/>
           <w:szCs w:val="20"/>
         </w:rPr>
-        <w:t xml:space="preserve">D. Software verification
-</w:t>
+        <w:t xml:space="preserve">D. Software verification</w:t>
       </w:r>
     </w:p>
     <w:p>
@@ -12259,8 +12175,7 @@
           <w:sz w:val="20"/>
           <w:szCs w:val="20"/>
         </w:rPr>
-        <w:t xml:space="preserve">The 26 checks in Table IX included 22 synthetic screening cases (invented records with specified expected decisions), two income-schedule checks, one forbidden-predictor check and one run trace. Boundary, spouse, grant and receipt decisions matched their specifications. Two research runs produced 14 files with exactly matching contents and retained the study-group checksum.
-</w:t>
+        <w:t xml:space="preserve">The 26 checks in Table IX included 22 synthetic screening cases (invented records with specified expected decisions), two income-schedule checks, one forbidden-predictor check and one run trace. Boundary, spouse, grant and receipt decisions matched their specifications. Two research runs produced 14 files with exactly matching contents and retained the study-group checksum.</w:t>
       </w:r>
     </w:p>
     <w:p>
@@ -12279,8 +12194,7 @@
           <w:sz w:val="16"/>
           <w:szCs w:val="16"/>
         </w:rPr>
-        <w:t xml:space="preserve">Table IX. Completed verification and its scope
-</w:t>
+        <w:t xml:space="preserve">Table IX. Completed verification and its scope</w:t>
       </w:r>
     </w:p>
     <w:tbl>
@@ -13216,8 +13130,7 @@
           <w:sz w:val="20"/>
           <w:szCs w:val="20"/>
         </w:rPr>
-        <w:t xml:space="preserve">The owner walkthrough used synthetic records. It checks exports, not representative task times or ease.
-</w:t>
+        <w:t xml:space="preserve">The owner walkthrough used synthetic records. It checks exports, not representative task times or ease.</w:t>
       </w:r>
     </w:p>
     <w:p>
@@ -13245,8 +13158,7 @@
           <w:sz w:val="20"/>
           <w:szCs w:val="20"/>
         </w:rPr>
-        <w:t xml:space="preserve">VI. Discussion
-</w:t>
+        <w:t xml:space="preserve">VI. Discussion</w:t>
       </w:r>
     </w:p>
     <w:p>
@@ -13274,8 +13186,7 @@
           <w:sz w:val="20"/>
           <w:szCs w:val="20"/>
         </w:rPr>
-        <w:t xml:space="preserve">A. Scope of measured non-receipt
-</w:t>
+        <w:t xml:space="preserve">A. Scope of measured non-receipt</w:t>
       </w:r>
     </w:p>
     <w:p>
@@ -13289,8 +13200,7 @@
           <w:sz w:val="20"/>
           <w:szCs w:val="20"/>
         </w:rPr>
-        <w:t xml:space="preserve">RQ1 measures non-receipt among historical KwaZulu-Natal adults who pass the screen and resolve receipt: 67/1,013, or 6.61% unweighted and 7.49% person-weighted. This does not measure unlawful denial or non-receipt among everyone legally entitled. The 187 unresolved adults outnumbered the 67 events. Excluding them changes the population described, regardless of sampling uncertainty. Stable estimates cannot reveal their receipt.
-</w:t>
+        <w:t xml:space="preserve">RQ1 measures non-receipt among historical KwaZulu-Natal adults who pass the screen and resolve receipt: 67/1,013, or 6.61% unweighted and 7.49% person-weighted. This does not measure unlawful denial or non-receipt among everyone legally entitled. The 187 unresolved adults outnumbered the 67 events. Excluding them changes the population described, regardless of sampling uncertainty. Stable estimates cannot reveal their receipt.</w:t>
       </w:r>
     </w:p>
     <w:p>
@@ -13304,8 +13214,7 @@
           <w:sz w:val="20"/>
           <w:szCs w:val="20"/>
         </w:rPr>
-        <w:t xml:space="preserve">S2d added 68 people but only two events, reducing weighted non-receipt to 7.12%. Partnership rules mainly changed the denominator. S3 retained adults with incompatible grants, added 19 people/15 events and raised non-receipt to 9.06%, the largest tested change. Similar AUC cannot justify screening rules or establish equivalent populations. Ralston studies rural age-eligible people [3]; Godfrey studies households' grants [4]. Different units, programmes, screens and places prevent direct comparison of their percentages. This study adds a provincial estimate with an explicit resource screen. High receipt can involve access costs [13], [14]; it cannot prove low burden.
-</w:t>
+        <w:t xml:space="preserve">S2d added 68 people but only two events, reducing weighted non-receipt to 7.12%. Partnership rules mainly changed the denominator. S3 retained adults with incompatible grants, added 19 people/15 events and raised non-receipt to 9.06%, the largest tested change. Similar AUC cannot justify screening rules or establish equivalent populations. Ralston studies rural age-eligible people [3]; Godfrey studies households' grants [4]. Different units, programmes, screens and places prevent direct comparison of their percentages. This study adds a provincial estimate with an explicit resource screen. High receipt can involve access costs [13], [14]; it cannot prove low burden.</w:t>
       </w:r>
     </w:p>
     <w:p>
@@ -13333,8 +13242,7 @@
           <w:sz w:val="20"/>
           <w:szCs w:val="20"/>
         </w:rPr>
-        <w:t xml:space="preserve">B. Predictive performance and interpretation
-</w:t>
+        <w:t xml:space="preserve">B. Predictive performance and interpretation</w:t>
       </w:r>
     </w:p>
     <w:p>
@@ -13348,8 +13256,7 @@
           <w:sz w:val="20"/>
           <w:szCs w:val="20"/>
         </w:rPr>
-        <w:t xml:space="preserve">RQ2 assesses four properties. AUC 0.752 describes ranking held-out non-recipients above recipients, not classification accuracy. AP 0.203 summarises precision–recall ranking across cutoffs against a 6.61% event rate, not precision at one cutoff [16]. Brier fell from 0.0618 to 0.0578: a modest 0.0040 reduction in squared probability error. An intercept correction, with calibration slope fixed at 1, checks average bias. The ideal correction is zero. The estimate 0.020 and interval spanning zero do not prove perfect agreement. Slope 0.836 suggests predictions may be too extreme, but its 0.591–1.133 interval includes the ideal 1 [17]. Only 67 events informed these checks [18]. Most adults in even the highest-risk bin reported receipt.
-</w:t>
+        <w:t xml:space="preserve">RQ2 assesses four properties. AUC 0.752 describes ranking held-out non-recipients above recipients, not classification accuracy. AP 0.203 summarises precision–recall ranking across cutoffs against a 6.61% event rate, not precision at one cutoff [16]. Brier fell from 0.0618 to 0.0578: a modest 0.0040 reduction in squared probability error. An intercept correction, with calibration slope fixed at 1, checks average bias. The ideal correction is zero. The estimate 0.020 and interval spanning zero do not prove perfect agreement. Slope 0.836 suggests predictions may be too extreme, but its 0.591–1.133 interval includes the ideal 1 [17]. Only 67 events informed these checks [18]. Most adults in even the highest-risk bin reported receipt.</w:t>
       </w:r>
     </w:p>
     <w:p>
@@ -13363,8 +13270,7 @@
           <w:sz w:val="20"/>
           <w:szCs w:val="20"/>
         </w:rPr>
-        <w:t xml:space="preserve">Table VIII separates sample, predictor and evaluation changes. S7 removed 21 people/four events (992/63). Its lower Brier concerns a different sample and cannot establish whether filling missing values is better. S8 substituted marriage for welfare access and performed similarly. S9 weighted fitting but not evaluation; it does not model the full survey design. S10 reweighted the same primary OOF predictions without retraining, raising Brier to 0.0641. S11 grouped folds by derived PSU and also performed similarly. S8–S11 retained 1,013 people/67 events. These checks expose internal assumptions; they do not establish model superiority or reliability elsewhere [19], [20].
-</w:t>
+        <w:t xml:space="preserve">Table VIII separates sample, predictor and evaluation changes. S7 removed 21 people/four events (992/63). Its lower Brier concerns a different sample and cannot establish whether filling missing values is better. S8 substituted marriage for welfare access and performed similarly. S9 weighted fitting but not evaluation; it does not model the full survey design. S10 reweighted the same primary OOF predictions without retraining, raising Brier to 0.0641. S11 grouped folds by derived PSU and also performed similarly. S8–S11 retained 1,013 people/67 events. These checks expose internal assumptions; they do not establish model superiority or reliability elsewhere [19], [20].</w:t>
       </w:r>
     </w:p>
     <w:p>
@@ -13392,8 +13298,7 @@
           <w:sz w:val="20"/>
           <w:szCs w:val="20"/>
         </w:rPr>
-        <w:t xml:space="preserve">C. Reproducibility and usability
-</w:t>
+        <w:t xml:space="preserve">C. Reproducibility and usability</w:t>
       </w:r>
     </w:p>
     <w:p>
@@ -13407,8 +13312,7 @@
           <w:sz w:val="20"/>
           <w:szCs w:val="20"/>
         </w:rPr>
-        <w:t xml:space="preserve">RQ3 has six evidence layers. Synthetic cases check rule decisions; matching file contents check repeatability; UI–CLI agreement checks software paths; JSON reload checks saved-model predictions. The owner walkthrough checks a synthetic workflow; participant testing would assess human usability. Table IX supports the first five within tested conditions. Automated agreement cannot establish independent user ease, acceptance or field success. Saved sources and run/validation reports document versions, checksums and test conditions.
-</w:t>
+        <w:t xml:space="preserve">RQ3 separates synthetic rule checks, repeatability, UI–CLI agreement, model reloading, the owner's walkthrough and participant usability. Table IX supports the first five within tested conditions; it does not establish independent user ease, acceptance or field success. Supplementary Tables S1–S5 and the aggregate evidence files document rule settings, validation procedures and recorded searches.</w:t>
       </w:r>
     </w:p>
     <w:p>
@@ -13422,8 +13326,7 @@
           <w:sz w:val="20"/>
           <w:szCs w:val="20"/>
         </w:rPr>
-        <w:t xml:space="preserve">The app separates historical OOF results from uploaded scores; uploads may overlap training data. Matching saved scores checks reloading, not new predictive accuracy. The software exposes its computations, but representative user clarity remains untested. The task sheet supports future testing.
-</w:t>
+        <w:t xml:space="preserve">Application scores may overlap training data and remain separate from historical OOF results. Reload agreement checks score persistence, not new predictive accuracy. Participant clarity remains untested; the task sheet supports future evaluation.</w:t>
       </w:r>
     </w:p>
     <w:p>
@@ -13451,8 +13354,7 @@
           <w:sz w:val="20"/>
           <w:szCs w:val="20"/>
         </w:rPr>
-        <w:t xml:space="preserve">D. Transfer to other settings
-</w:t>
+        <w:t xml:space="preserve">D. Transfer to other settings</w:t>
       </w:r>
     </w:p>
     <w:p>
@@ -13466,8 +13368,7 @@
           <w:sz w:val="20"/>
           <w:szCs w:val="20"/>
         </w:rPr>
-        <w:t xml:space="preserve">This study analysed screened KwaZulu-Natal adults in LCS 2014/2015. Provinces and periods differ in settlement, services, policy and reporting. Application, award and payment records measure different events from reported receipt and can contain linking errors. The study did not test the model on an independent province, period or administrative sample. Transfer requires comparable populations/outcomes, justified period-specific rules and independent ranking/calibration checks [19], [20]. Making the app available cannot establish suitability for today's applicants.
-</w:t>
+        <w:t xml:space="preserve">This study analysed screened KwaZulu-Natal adults in LCS 2014/2015. Provinces and periods differ in settlement, services, policy and reporting. Application, award and payment records measure different events from reported receipt and can contain linking errors. The study did not test the model on an independent province, period or administrative sample. Transfer requires comparable populations/outcomes, justified period-specific rules and independent ranking/calibration checks [19], [20]. Making the app available cannot establish suitability for today's applicants.</w:t>
       </w:r>
     </w:p>
     <w:p>
@@ -13495,8 +13396,7 @@
           <w:sz w:val="20"/>
           <w:szCs w:val="20"/>
         </w:rPr>
-        <w:t xml:space="preserve">E. Synthesis of the Conceptual Framework
-</w:t>
+        <w:t xml:space="preserve">E. Synthesis of the Conceptual Framework</w:t>
       </w:r>
     </w:p>
     <w:p>
@@ -13510,8 +13410,7 @@
           <w:sz w:val="20"/>
           <w:szCs w:val="20"/>
         </w:rPr>
-        <w:t xml:space="preserve">Returning to Figure 1, screening sensitivity supported an explicit denominator, and sex differences supported demographic comparison without confirming burden mechanisms [3], [4]. Lower schooling accompanied receipt, contrary to a simple expectation that fewer information resources increase non-receipt [13]. Screening selection or other resources could account for this; neither explanation was tested. Office-distance and settlement intervals included 1, leaving compliance-cost expectations unresolved. Psychological costs remained untested because LCS did not measure them. Proxy associations do not directly test the theory. The artefact contributes a reproducible implementation of these bounded measurement choices. Separate, traceable rules, outcomes and predictions support inspection despite measurement limits, without establishing causes, legal entitlement or participant usability.
-</w:t>
+        <w:t xml:space="preserve">Returning to Figure 1, screening sensitivity supported an explicit denominator, and sex differences supported demographic comparison without confirming burden mechanisms [3], [4]. Lower schooling accompanied receipt, contrary to a simple expectation that fewer information resources increase non-receipt [13]. Screening selection or other resources could account for this; neither explanation was tested. Office-distance and settlement intervals included 1, leaving compliance-cost expectations unresolved. Psychological costs remained untested because LCS did not measure them. Proxy associations do not directly test the theory. The artefact contributes a reproducible implementation of these bounded measurement choices. Separate, traceable rules, outcomes and predictions support inspection despite measurement limits, without establishing causes, legal entitlement or participant usability.</w:t>
       </w:r>
     </w:p>
     <w:p>
@@ -13539,8 +13438,7 @@
           <w:sz w:val="20"/>
           <w:szCs w:val="20"/>
         </w:rPr>
-        <w:t xml:space="preserve">VII. Limitations and Ethics
-</w:t>
+        <w:t xml:space="preserve">VII. Limitations and Ethics</w:t>
       </w:r>
     </w:p>
     <w:p>
@@ -13554,8 +13452,7 @@
           <w:sz w:val="20"/>
           <w:szCs w:val="20"/>
         </w:rPr>
-        <w:t xml:space="preserve">The survey cannot establish legal eligibility: its resource proxy omits assets, deemed income and deductions. Respondents may misreport income and receipt. Cross-sectional data cannot establish the order of events. Few events, unresolved screening, missing strata and resampling fixed predictions without refitting limit inference. Household sampling excludes institutionalised older adults. Participant usability and performance elsewhere remain untested.
-</w:t>
+        <w:t xml:space="preserve">The survey cannot establish legal eligibility: its resource proxy omits assets, deemed income and deductions. Respondents may misreport income and receipt. Cross-sectional data cannot establish the order of events. Few events, unresolved screening, missing strata and resampling fixed predictions without refitting limit inference. Household sampling excludes institutionalised older adults. Participant usability and performance elsewhere remain untested.</w:t>
       </w:r>
     </w:p>
     <w:p>
@@ -13569,8 +13466,7 @@
           <w:sz w:val="20"/>
           <w:szCs w:val="20"/>
         </w:rPr>
-        <w:t xml:space="preserve">Survey access conditions and disclosure requirements apply. Interface demonstrations and tests use synthetic records. The downloadable package excludes survey records. Displays and reports omit submitted identifiers and raw income. These controls do not establish disclosure review of every historical repository file. The project records contain no DUT (Durban University of Technology) ethics determination. The paper therefore claims no approval. The app explains measurement choices; it neither decides grants nor ranks named applicants.
-</w:t>
+        <w:t xml:space="preserve">Survey access conditions and disclosure requirements apply. Interface demonstrations and tests use synthetic records. The downloadable package excludes survey records. Displays and reports omit submitted identifiers and raw income. These controls do not establish disclosure review of every historical repository file. The project records contain no DUT (Durban University of Technology) ethics determination. The paper therefore claims no approval. The app explains measurement choices; it neither decides grants nor ranks named applicants.</w:t>
       </w:r>
     </w:p>
     <w:p>
@@ -13598,8 +13494,7 @@
           <w:sz w:val="20"/>
           <w:szCs w:val="20"/>
         </w:rPr>
-        <w:t xml:space="preserve">VIII. Conclusion
-</w:t>
+        <w:t xml:space="preserve">VIII. Conclusion</w:t>
       </w:r>
     </w:p>
     <w:p>

</xml_diff>

<commit_message>
Clarify literature search concepts and selection evidence
Update only the first two Section II.A paragraphs to state the supplied search concepts, relevance criteria and 511-to-55 selection flow. Retain S5 search-string references, all other manuscript text and the eight-page IEEE layout; refresh delivery files and scoped validation.
</commit_message>
<xml_diff>
--- a/paper/Jawe_OPG_nonreceipt_KZN.docx
+++ b/paper/Jawe_OPG_nonreceipt_KZN.docx
@@ -286,7 +286,7 @@
           <w:sz w:val="20"/>
           <w:szCs w:val="20"/>
         </w:rPr>
-        <w:t xml:space="preserve">The narrative review examined grant access, eligibility measurement and prediction using Scopus, Dimensions, IEEE Xplore, SABINET/African Journals Online, Google Scholar and Statistics South Africa/DataFirst. Selection considered relevance to the question, population, outcome and methods. Studies differed in programme, setting, unit, outcome, findings and limitations, preventing a pooled estimate.</w:t>
+        <w:t xml:space="preserve">The structured narrative review examined grant access, eligibility measurement and prediction using Scopus, Dimensions, IEEE Xplore, SABINET/African Journals Online, Google Scholar and Statistics South Africa/DataFirst. Search concepts included social assistance, eligibility, take-up, non-receipt, exclusion and prediction. Selection considered relevance to the research question, population, outcome and methodological contribution.</w:t>
       </w:r>
     </w:p>
     <w:p>
@@ -301,7 +301,7 @@
           <w:sz w:val="20"/>
           <w:szCs w:val="20"/>
         </w:rPr>
-        <w:t xml:space="preserve">Supplementary Table S5 preserves eight queries dated 17 August 2026 and source-specific counts. The recorded flow is 511 hits, 136 duplicates removed, 375 titles/abstracts screened, 222 exclusions, 153 full-text assessments, 98 exclusions and 55 retained sources across grants and populations. Original exports, item-level decisions and the complete extraction register are absent from the accompanying evidence. These totals cannot independently reproduce deduplication or selection or establish exhaustive coverage.</w:t>
+        <w:t xml:space="preserve">The searches identified 511 records. Removing 136 duplicates left 375 records for title and abstract screening; 222 were excluded. Full-text assessment of the remaining 153 records excluded 98 and retained 55 sources across grants and populations. Supplementary Table S5 provides the eight recorded search strings, search date and source-specific counts. The synthesis compared programme, setting, unit of analysis, outcome definition, findings and limitations; these differences prevented a pooled estimate.</w:t>
       </w:r>
     </w:p>
     <w:p>

</xml_diff>

<commit_message>
Address six final supervisor feedback points within strict scope
Qualify outcome-informed settlement coding, distinguish uncertainty summaries, strengthen coefficient cautions and identify all sensitivity scenarios separately. Record the supervisor ethics guidance supplied by the author and replace project archive citations with original-document references and the supplied DataFirst record. Preserve all unrelated paper text, structure, results and scientific files; document outstanding redistribution checks and refresh the eight-page delivery artifacts.
</commit_message>
<xml_diff>
--- a/paper/Jawe_OPG_nonreceipt_KZN.docx
+++ b/paper/Jawe_OPG_nonreceipt_KZN.docx
@@ -3765,7 +3765,7 @@
           <w:sz w:val="20"/>
           <w:szCs w:val="20"/>
         </w:rPr>
-        <w:t xml:space="preserve">Rural formal settlement had 31 adults and one non-recipient. One seven-slope training fold then contained 30 rural-formal adults and no event; its coefficient was about −21.88 and did not converge. Four of five folds converged. Decision D-052 combined rural formal with traditional settlement after that outcome pattern was known, so the retained cross-validation can be optimistic and does not show that the settings are equivalent. Supplementary Table S2 retains this failed attempt as a diagnostic. Ridge logistic regression was then applied to both codings on the same household folds. Five inner household folds selected C by mean Brier score, with training-only imputation and scaling; all ten outer fits chose C = 0.1 and converged. Held-out AUC was 0.756 for the merged coding and 0.750 for the separate coding (Supplementary Table S2). The ordinary merged model remains the reference. This comparison does not make Decision D-052 outcome-independent. Income, receipt, derived labels and marital status do not enter the primary model.</w:t>
+        <w:t xml:space="preserve">Rural formal settlement had 31 adults and one non-recipient. One seven-slope training fold contained 30 rural-formal adults and no event; its coefficient was about −21.88 and did not converge. Four of five folds converged. Decision D-052 combined rural formal with traditional settlement after examining this outcome pattern, without repeating that choice inside each training fold. The primary ordinary merged model is therefore retained as an exploratory reference. Its coefficients and performance are conditional on D-052; household-held-out testing does not validate the complete model-selection process and may be optimistic. Supplementary Table S2 retains the failed attempt as a diagnostic. Ridge regression compared both codings on the same household folds. Five inner household folds selected C by mean Brier score with training-only imputation and scaling; all ten outer fits chose C = 0.1 and converged. AUC was 0.756 for merged and 0.750 for separate coding. This comparison cannot remove outcome-informed selection or establish equivalence or superiority of either coding. Income, receipt, derived labels and marital status do not enter the primary model.</w:t>
       </w:r>
     </w:p>
     <w:p>
@@ -3810,7 +3810,7 @@
           <w:sz w:val="20"/>
           <w:szCs w:val="20"/>
         </w:rPr>
-        <w:t xml:space="preserve">Pooled OOF probabilities supplied average precision, AUC, Brier score, calibration slope and calibration-in-the-large. Calibration-in-the-large is an intercept correction with its slope fixed at 1; the ideal values are 0 and 1. The 95% intervals are 2.5 and 97.5 percentiles from 1,000 with-replacement household samples of those fixed predictions, using the same seed. Every selected household's adults were retained. All 1,000 samples contained both outcome classes. These intervals condition on seed 201415, its preprocessing and fits, and Decision D-052. They do not repeat the split, imputation or estimation, and they are not survey-design confidence intervals. Twenty household-grouped repetitions (seeds 201415–201434) repeated training-only imputation and refitting, with D-052 fixed. Metrics pooled one held-out prediction per adult within each repetition (Supplementary Table S3).</w:t>
+        <w:t xml:space="preserve">Pooled OOF probabilities supplied average precision, AUC, Brier score, calibration slope and calibration-in-the-large. Calibration-in-the-large is an intercept correction with its slope fixed at 1; the ideal values are 0 and 1. The reported 95% bootstrap intervals are the 2.5 and 97.5 percentiles from 1,000 with-replacement household samples of fixed predictions, using seed 201415. Every selected household's adults were retained, and all samples contained both outcome classes. These intervals condition on the original split, preprocessing, fits and Decision D-052. They do not repeat model development or represent survey-design uncertainty. A separate sensitivity analysis used 20 household-grouped repetitions (seeds 201415–201434), relearning training-only imputation and refitting while keeping D-052 fixed. Each repetition pooled one held-out prediction per adult (Supplementary Table S3). Its medians, interquartile ranges and ranges describe variation across splits and refits, not 95% confidence intervals. The repetitions reuse participants and do not independently validate the coding decision.</w:t>
       </w:r>
     </w:p>
     <w:p>
@@ -6380,7 +6380,7 @@
           <w:sz w:val="20"/>
           <w:szCs w:val="20"/>
         </w:rPr>
-        <w:t xml:space="preserve">Table VI summarises changed-cohort scenarios alongside the baseline and unchanged-scenario reference. Changed cohorts were refitted. Unchanged cohorts reused the primary predictions, so matching performance is not an independent fit. Supplementary Table S1 defines every rule.</w:t>
+        <w:t xml:space="preserve">Table VI identifies each screening scenario separately. Changed cohorts were refitted; unchanged cohorts reused the primary predictions. Supplementary Table S1 defines every rule.</w:t>
       </w:r>
     </w:p>
     <w:p>
@@ -6402,7 +6402,7 @@
           <w:szCs w:val="16"/>
         </w:rPr>
         <w:t xml:space="preserve">TABLE VI
-Changed screening rules and OOF performance</w:t>
+Screening scenarios and OOF performance</w:t>
       </w:r>
     </w:p>
     <w:tbl>
@@ -7055,7 +7055,7 @@
                 <w:sz w:val="18"/>
                 <w:szCs w:val="18"/>
               </w:rPr>
-              <w:t xml:space="preserve">S1b,d</w:t>
+              <w:t xml:space="preserve">S1a</w:t>
             </w:r>
           </w:p>
         </w:tc>
@@ -7096,7 +7096,7 @@
                 <w:sz w:val="18"/>
                 <w:szCs w:val="18"/>
               </w:rPr>
-              <w:t xml:space="preserve">1,015/69</w:t>
+              <w:t xml:space="preserve">1,013/67</w:t>
             </w:r>
           </w:p>
         </w:tc>
@@ -7137,7 +7137,7 @@
                 <w:sz w:val="18"/>
                 <w:szCs w:val="18"/>
               </w:rPr>
-              <w:t xml:space="preserve">6.80</w:t>
+              <w:t xml:space="preserve">6.61</w:t>
             </w:r>
           </w:p>
         </w:tc>
@@ -7178,7 +7178,7 @@
                 <w:sz w:val="18"/>
                 <w:szCs w:val="18"/>
               </w:rPr>
-              <w:t xml:space="preserve">7.68</w:t>
+              <w:t xml:space="preserve">7.49</w:t>
             </w:r>
           </w:p>
         </w:tc>
@@ -7219,7 +7219,7 @@
                 <w:sz w:val="18"/>
                 <w:szCs w:val="18"/>
               </w:rPr>
-              <w:t xml:space="preserve">.763</w:t>
+              <w:t xml:space="preserve">.752</w:t>
             </w:r>
           </w:p>
         </w:tc>
@@ -7260,7 +7260,7 @@
                 <w:sz w:val="18"/>
                 <w:szCs w:val="18"/>
               </w:rPr>
-              <w:t xml:space="preserve">.0584</w:t>
+              <w:t xml:space="preserve">.0578</w:t>
             </w:r>
           </w:p>
         </w:tc>
@@ -7301,7 +7301,7 @@
                 <w:sz w:val="18"/>
                 <w:szCs w:val="18"/>
               </w:rPr>
-              <w:t xml:space="preserve">.875</w:t>
+              <w:t xml:space="preserve">.836</w:t>
             </w:r>
           </w:p>
         </w:tc>
@@ -7348,7 +7348,7 @@
                 <w:sz w:val="18"/>
                 <w:szCs w:val="18"/>
               </w:rPr>
-              <w:t xml:space="preserve">S2a</w:t>
+              <w:t xml:space="preserve">S1b</w:t>
             </w:r>
           </w:p>
         </w:tc>
@@ -7389,7 +7389,7 @@
                 <w:sz w:val="18"/>
                 <w:szCs w:val="18"/>
               </w:rPr>
-              <w:t xml:space="preserve">1,072/71</w:t>
+              <w:t xml:space="preserve">1,015/69</w:t>
             </w:r>
           </w:p>
         </w:tc>
@@ -7430,7 +7430,7 @@
                 <w:sz w:val="18"/>
                 <w:szCs w:val="18"/>
               </w:rPr>
-              <w:t xml:space="preserve">6.62</w:t>
+              <w:t xml:space="preserve">6.80</w:t>
             </w:r>
           </w:p>
         </w:tc>
@@ -7471,7 +7471,7 @@
                 <w:sz w:val="18"/>
                 <w:szCs w:val="18"/>
               </w:rPr>
-              <w:t xml:space="preserve">7.42</w:t>
+              <w:t xml:space="preserve">7.68</w:t>
             </w:r>
           </w:p>
         </w:tc>
@@ -7512,7 +7512,7 @@
                 <w:sz w:val="18"/>
                 <w:szCs w:val="18"/>
               </w:rPr>
-              <w:t xml:space="preserve">.749</w:t>
+              <w:t xml:space="preserve">.763</w:t>
             </w:r>
           </w:p>
         </w:tc>
@@ -7553,7 +7553,7 @@
                 <w:sz w:val="18"/>
                 <w:szCs w:val="18"/>
               </w:rPr>
-              <w:t xml:space="preserve">.0588</w:t>
+              <w:t xml:space="preserve">.0584</w:t>
             </w:r>
           </w:p>
         </w:tc>
@@ -7594,7 +7594,7 @@
                 <w:sz w:val="18"/>
                 <w:szCs w:val="18"/>
               </w:rPr>
-              <w:t xml:space="preserve">.779</w:t>
+              <w:t xml:space="preserve">.875</w:t>
             </w:r>
           </w:p>
         </w:tc>
@@ -7641,7 +7641,7 @@
                 <w:sz w:val="18"/>
                 <w:szCs w:val="18"/>
               </w:rPr>
-              <w:t xml:space="preserve">S2b</w:t>
+              <w:t xml:space="preserve">S1c</w:t>
             </w:r>
           </w:p>
         </w:tc>
@@ -7682,7 +7682,7 @@
                 <w:sz w:val="18"/>
                 <w:szCs w:val="18"/>
               </w:rPr>
-              <w:t xml:space="preserve">1,073/69</w:t>
+              <w:t xml:space="preserve">1,013/67</w:t>
             </w:r>
           </w:p>
         </w:tc>
@@ -7723,7 +7723,7 @@
                 <w:sz w:val="18"/>
                 <w:szCs w:val="18"/>
               </w:rPr>
-              <w:t xml:space="preserve">6.43</w:t>
+              <w:t xml:space="preserve">6.61</w:t>
             </w:r>
           </w:p>
         </w:tc>
@@ -7764,7 +7764,7 @@
                 <w:sz w:val="18"/>
                 <w:szCs w:val="18"/>
               </w:rPr>
-              <w:t xml:space="preserve">7.17</w:t>
+              <w:t xml:space="preserve">7.49</w:t>
             </w:r>
           </w:p>
         </w:tc>
@@ -7805,7 +7805,7 @@
                 <w:sz w:val="18"/>
                 <w:szCs w:val="18"/>
               </w:rPr>
-              <w:t xml:space="preserve">.756</w:t>
+              <w:t xml:space="preserve">.752</w:t>
             </w:r>
           </w:p>
         </w:tc>
@@ -7846,7 +7846,7 @@
                 <w:sz w:val="18"/>
                 <w:szCs w:val="18"/>
               </w:rPr>
-              <w:t xml:space="preserve">.0564</w:t>
+              <w:t xml:space="preserve">.0578</w:t>
             </w:r>
           </w:p>
         </w:tc>
@@ -7887,7 +7887,7 @@
                 <w:sz w:val="18"/>
                 <w:szCs w:val="18"/>
               </w:rPr>
-              <w:t xml:space="preserve">.841</w:t>
+              <w:t xml:space="preserve">.836</w:t>
             </w:r>
           </w:p>
         </w:tc>
@@ -7934,7 +7934,7 @@
                 <w:sz w:val="18"/>
                 <w:szCs w:val="18"/>
               </w:rPr>
-              <w:t xml:space="preserve">S2c</w:t>
+              <w:t xml:space="preserve">S1d</w:t>
             </w:r>
           </w:p>
         </w:tc>
@@ -7975,7 +7975,7 @@
                 <w:sz w:val="18"/>
                 <w:szCs w:val="18"/>
               </w:rPr>
-              <w:t xml:space="preserve">1,021/67</w:t>
+              <w:t xml:space="preserve">1,015/69</w:t>
             </w:r>
           </w:p>
         </w:tc>
@@ -8016,7 +8016,7 @@
                 <w:sz w:val="18"/>
                 <w:szCs w:val="18"/>
               </w:rPr>
-              <w:t xml:space="preserve">6.56</w:t>
+              <w:t xml:space="preserve">6.80</w:t>
             </w:r>
           </w:p>
         </w:tc>
@@ -8057,7 +8057,7 @@
                 <w:sz w:val="18"/>
                 <w:szCs w:val="18"/>
               </w:rPr>
-              <w:t xml:space="preserve">7.43</w:t>
+              <w:t xml:space="preserve">7.68</w:t>
             </w:r>
           </w:p>
         </w:tc>
@@ -8098,7 +8098,7 @@
                 <w:sz w:val="18"/>
                 <w:szCs w:val="18"/>
               </w:rPr>
-              <w:t xml:space="preserve">.753</w:t>
+              <w:t xml:space="preserve">.763</w:t>
             </w:r>
           </w:p>
         </w:tc>
@@ -8139,7 +8139,7 @@
                 <w:sz w:val="18"/>
                 <w:szCs w:val="18"/>
               </w:rPr>
-              <w:t xml:space="preserve">.0571</w:t>
+              <w:t xml:space="preserve">.0584</w:t>
             </w:r>
           </w:p>
         </w:tc>
@@ -8180,7 +8180,7 @@
                 <w:sz w:val="18"/>
                 <w:szCs w:val="18"/>
               </w:rPr>
-              <w:t xml:space="preserve">.839</w:t>
+              <w:t xml:space="preserve">.875</w:t>
             </w:r>
           </w:p>
         </w:tc>
@@ -8227,7 +8227,7 @@
                 <w:sz w:val="18"/>
                 <w:szCs w:val="18"/>
               </w:rPr>
-              <w:t xml:space="preserve">S2d</w:t>
+              <w:t xml:space="preserve">S2a</w:t>
             </w:r>
           </w:p>
         </w:tc>
@@ -8268,7 +8268,7 @@
                 <w:sz w:val="18"/>
                 <w:szCs w:val="18"/>
               </w:rPr>
-              <w:t xml:space="preserve">1,081/69</w:t>
+              <w:t xml:space="preserve">1,072/71</w:t>
             </w:r>
           </w:p>
         </w:tc>
@@ -8309,7 +8309,7 @@
                 <w:sz w:val="18"/>
                 <w:szCs w:val="18"/>
               </w:rPr>
-              <w:t xml:space="preserve">6.38</w:t>
+              <w:t xml:space="preserve">6.62</w:t>
             </w:r>
           </w:p>
         </w:tc>
@@ -8350,7 +8350,7 @@
                 <w:sz w:val="18"/>
                 <w:szCs w:val="18"/>
               </w:rPr>
-              <w:t xml:space="preserve">7.12</w:t>
+              <w:t xml:space="preserve">7.42</w:t>
             </w:r>
           </w:p>
         </w:tc>
@@ -8391,7 +8391,7 @@
                 <w:sz w:val="18"/>
                 <w:szCs w:val="18"/>
               </w:rPr>
-              <w:t xml:space="preserve">.751</w:t>
+              <w:t xml:space="preserve">.749</w:t>
             </w:r>
           </w:p>
         </w:tc>
@@ -8432,7 +8432,7 @@
                 <w:sz w:val="18"/>
                 <w:szCs w:val="18"/>
               </w:rPr>
-              <w:t xml:space="preserve">.0565</w:t>
+              <w:t xml:space="preserve">.0588</w:t>
             </w:r>
           </w:p>
         </w:tc>
@@ -8473,7 +8473,7 @@
                 <w:sz w:val="18"/>
                 <w:szCs w:val="18"/>
               </w:rPr>
-              <w:t xml:space="preserve">.808</w:t>
+              <w:t xml:space="preserve">.779</w:t>
             </w:r>
           </w:p>
         </w:tc>
@@ -8520,7 +8520,7 @@
                 <w:sz w:val="18"/>
                 <w:szCs w:val="18"/>
               </w:rPr>
-              <w:t xml:space="preserve">S3</w:t>
+              <w:t xml:space="preserve">S2b</w:t>
             </w:r>
           </w:p>
         </w:tc>
@@ -8561,7 +8561,7 @@
                 <w:sz w:val="18"/>
                 <w:szCs w:val="18"/>
               </w:rPr>
-              <w:t xml:space="preserve">1,032/82</w:t>
+              <w:t xml:space="preserve">1,073/69</w:t>
             </w:r>
           </w:p>
         </w:tc>
@@ -8602,7 +8602,7 @@
                 <w:sz w:val="18"/>
                 <w:szCs w:val="18"/>
               </w:rPr>
-              <w:t xml:space="preserve">7.95</w:t>
+              <w:t xml:space="preserve">6.43</w:t>
             </w:r>
           </w:p>
         </w:tc>
@@ -8643,7 +8643,7 @@
                 <w:sz w:val="18"/>
                 <w:szCs w:val="18"/>
               </w:rPr>
-              <w:t xml:space="preserve">9.06</w:t>
+              <w:t xml:space="preserve">7.17</w:t>
             </w:r>
           </w:p>
         </w:tc>
@@ -8684,7 +8684,7 @@
                 <w:sz w:val="18"/>
                 <w:szCs w:val="18"/>
               </w:rPr>
-              <w:t xml:space="preserve">.736</w:t>
+              <w:t xml:space="preserve">.756</w:t>
             </w:r>
           </w:p>
         </w:tc>
@@ -8725,7 +8725,7 @@
                 <w:sz w:val="18"/>
                 <w:szCs w:val="18"/>
               </w:rPr>
-              <w:t xml:space="preserve">.0682</w:t>
+              <w:t xml:space="preserve">.0564</w:t>
             </w:r>
           </w:p>
         </w:tc>
@@ -8766,7 +8766,7 @@
                 <w:sz w:val="18"/>
                 <w:szCs w:val="18"/>
               </w:rPr>
-              <w:t xml:space="preserve">.864</w:t>
+              <w:t xml:space="preserve">.841</w:t>
             </w:r>
           </w:p>
         </w:tc>
@@ -8813,7 +8813,7 @@
                 <w:sz w:val="18"/>
                 <w:szCs w:val="18"/>
               </w:rPr>
-              <w:t xml:space="preserve">S4b</w:t>
+              <w:t xml:space="preserve">S2c</w:t>
             </w:r>
           </w:p>
         </w:tc>
@@ -8854,7 +8854,7 @@
                 <w:sz w:val="18"/>
                 <w:szCs w:val="18"/>
               </w:rPr>
-              <w:t xml:space="preserve">1,007/67</w:t>
+              <w:t xml:space="preserve">1,021/67</w:t>
             </w:r>
           </w:p>
         </w:tc>
@@ -8895,7 +8895,7 @@
                 <w:sz w:val="18"/>
                 <w:szCs w:val="18"/>
               </w:rPr>
-              <w:t xml:space="preserve">6.65</w:t>
+              <w:t xml:space="preserve">6.56</w:t>
             </w:r>
           </w:p>
         </w:tc>
@@ -8936,7 +8936,7 @@
                 <w:sz w:val="18"/>
                 <w:szCs w:val="18"/>
               </w:rPr>
-              <w:t xml:space="preserve">7.55</w:t>
+              <w:t xml:space="preserve">7.43</w:t>
             </w:r>
           </w:p>
         </w:tc>
@@ -8977,7 +8977,7 @@
                 <w:sz w:val="18"/>
                 <w:szCs w:val="18"/>
               </w:rPr>
-              <w:t xml:space="preserve">.755</w:t>
+              <w:t xml:space="preserve">.753</w:t>
             </w:r>
           </w:p>
         </w:tc>
@@ -9018,7 +9018,7 @@
                 <w:sz w:val="18"/>
                 <w:szCs w:val="18"/>
               </w:rPr>
-              <w:t xml:space="preserve">.0576</w:t>
+              <w:t xml:space="preserve">.0571</w:t>
             </w:r>
           </w:p>
         </w:tc>
@@ -9059,7 +9059,7 @@
                 <w:sz w:val="18"/>
                 <w:szCs w:val="18"/>
               </w:rPr>
-              <w:t xml:space="preserve">.854</w:t>
+              <w:t xml:space="preserve">.839</w:t>
             </w:r>
           </w:p>
         </w:tc>
@@ -9088,6 +9088,2057 @@
           </w:tcPr>
           <w:p>
             <w:pPr>
+              <w:keepNext/>
+              <w:spacing w:after="0" w:before="0" w:line="240" w:lineRule="auto"/>
+              <w:jc w:val="left"/>
+              <w:rPr>
+                <w:b w:val="false"/>
+                <w:bCs w:val="false"/>
+                <w:sz w:val="18"/>
+                <w:szCs w:val="18"/>
+              </w:rPr>
+            </w:pPr>
+            <w:r>
+              <w:rPr>
+                <w:rFonts w:ascii="Times New Roman" w:cs="Times New Roman" w:eastAsia="Times New Roman" w:hAnsi="Times New Roman"/>
+                <w:b w:val="false"/>
+                <w:bCs w:val="false"/>
+                <w:sz w:val="18"/>
+                <w:szCs w:val="18"/>
+              </w:rPr>
+              <w:t xml:space="preserve">S2d</w:t>
+            </w:r>
+          </w:p>
+        </w:tc>
+        <w:tc>
+          <w:tcPr>
+            <w:tcW w:type="dxa" w:w="980"/>
+            <w:tcBorders>
+              <w:top w:val="single" w:color="808080" w:sz="4"/>
+              <w:left w:val="single" w:color="808080" w:sz="4"/>
+              <w:bottom w:val="single" w:color="808080" w:sz="4"/>
+              <w:right w:val="single" w:color="808080" w:sz="4"/>
+            </w:tcBorders>
+            <w:tcMar>
+              <w:top w:type="dxa" w:w="40"/>
+              <w:left w:type="dxa" w:w="45"/>
+              <w:bottom w:type="dxa" w:w="40"/>
+              <w:right w:type="dxa" w:w="45"/>
+            </w:tcMar>
+            <w:vAlign w:val="center"/>
+          </w:tcPr>
+          <w:p>
+            <w:pPr>
+              <w:keepNext/>
+              <w:spacing w:after="0" w:before="0" w:line="240" w:lineRule="auto"/>
+              <w:jc w:val="center"/>
+              <w:rPr>
+                <w:b w:val="false"/>
+                <w:bCs w:val="false"/>
+                <w:sz w:val="18"/>
+                <w:szCs w:val="18"/>
+              </w:rPr>
+            </w:pPr>
+            <w:r>
+              <w:rPr>
+                <w:rFonts w:ascii="Times New Roman" w:cs="Times New Roman" w:eastAsia="Times New Roman" w:hAnsi="Times New Roman"/>
+                <w:b w:val="false"/>
+                <w:bCs w:val="false"/>
+                <w:sz w:val="18"/>
+                <w:szCs w:val="18"/>
+              </w:rPr>
+              <w:t xml:space="preserve">1,081/69</w:t>
+            </w:r>
+          </w:p>
+        </w:tc>
+        <w:tc>
+          <w:tcPr>
+            <w:tcW w:type="dxa" w:w="640"/>
+            <w:tcBorders>
+              <w:top w:val="single" w:color="808080" w:sz="4"/>
+              <w:left w:val="single" w:color="808080" w:sz="4"/>
+              <w:bottom w:val="single" w:color="808080" w:sz="4"/>
+              <w:right w:val="single" w:color="808080" w:sz="4"/>
+            </w:tcBorders>
+            <w:tcMar>
+              <w:top w:type="dxa" w:w="40"/>
+              <w:left w:type="dxa" w:w="45"/>
+              <w:bottom w:type="dxa" w:w="40"/>
+              <w:right w:type="dxa" w:w="45"/>
+            </w:tcMar>
+            <w:vAlign w:val="center"/>
+          </w:tcPr>
+          <w:p>
+            <w:pPr>
+              <w:keepNext/>
+              <w:spacing w:after="0" w:before="0" w:line="240" w:lineRule="auto"/>
+              <w:jc w:val="center"/>
+              <w:rPr>
+                <w:b w:val="false"/>
+                <w:bCs w:val="false"/>
+                <w:sz w:val="18"/>
+                <w:szCs w:val="18"/>
+              </w:rPr>
+            </w:pPr>
+            <w:r>
+              <w:rPr>
+                <w:rFonts w:ascii="Times New Roman" w:cs="Times New Roman" w:eastAsia="Times New Roman" w:hAnsi="Times New Roman"/>
+                <w:b w:val="false"/>
+                <w:bCs w:val="false"/>
+                <w:sz w:val="18"/>
+                <w:szCs w:val="18"/>
+              </w:rPr>
+              <w:t xml:space="preserve">6.38</w:t>
+            </w:r>
+          </w:p>
+        </w:tc>
+        <w:tc>
+          <w:tcPr>
+            <w:tcW w:type="dxa" w:w="640"/>
+            <w:tcBorders>
+              <w:top w:val="single" w:color="808080" w:sz="4"/>
+              <w:left w:val="single" w:color="808080" w:sz="4"/>
+              <w:bottom w:val="single" w:color="808080" w:sz="4"/>
+              <w:right w:val="single" w:color="808080" w:sz="4"/>
+            </w:tcBorders>
+            <w:tcMar>
+              <w:top w:type="dxa" w:w="40"/>
+              <w:left w:type="dxa" w:w="45"/>
+              <w:bottom w:type="dxa" w:w="40"/>
+              <w:right w:type="dxa" w:w="45"/>
+            </w:tcMar>
+            <w:vAlign w:val="center"/>
+          </w:tcPr>
+          <w:p>
+            <w:pPr>
+              <w:keepNext/>
+              <w:spacing w:after="0" w:before="0" w:line="240" w:lineRule="auto"/>
+              <w:jc w:val="center"/>
+              <w:rPr>
+                <w:b w:val="false"/>
+                <w:bCs w:val="false"/>
+                <w:sz w:val="18"/>
+                <w:szCs w:val="18"/>
+              </w:rPr>
+            </w:pPr>
+            <w:r>
+              <w:rPr>
+                <w:rFonts w:ascii="Times New Roman" w:cs="Times New Roman" w:eastAsia="Times New Roman" w:hAnsi="Times New Roman"/>
+                <w:b w:val="false"/>
+                <w:bCs w:val="false"/>
+                <w:sz w:val="18"/>
+                <w:szCs w:val="18"/>
+              </w:rPr>
+              <w:t xml:space="preserve">7.12</w:t>
+            </w:r>
+          </w:p>
+        </w:tc>
+        <w:tc>
+          <w:tcPr>
+            <w:tcW w:type="dxa" w:w="680"/>
+            <w:tcBorders>
+              <w:top w:val="single" w:color="808080" w:sz="4"/>
+              <w:left w:val="single" w:color="808080" w:sz="4"/>
+              <w:bottom w:val="single" w:color="808080" w:sz="4"/>
+              <w:right w:val="single" w:color="808080" w:sz="4"/>
+            </w:tcBorders>
+            <w:tcMar>
+              <w:top w:type="dxa" w:w="40"/>
+              <w:left w:type="dxa" w:w="45"/>
+              <w:bottom w:type="dxa" w:w="40"/>
+              <w:right w:type="dxa" w:w="45"/>
+            </w:tcMar>
+            <w:vAlign w:val="center"/>
+          </w:tcPr>
+          <w:p>
+            <w:pPr>
+              <w:keepNext/>
+              <w:spacing w:after="0" w:before="0" w:line="240" w:lineRule="auto"/>
+              <w:jc w:val="center"/>
+              <w:rPr>
+                <w:b w:val="false"/>
+                <w:bCs w:val="false"/>
+                <w:sz w:val="18"/>
+                <w:szCs w:val="18"/>
+              </w:rPr>
+            </w:pPr>
+            <w:r>
+              <w:rPr>
+                <w:rFonts w:ascii="Times New Roman" w:cs="Times New Roman" w:eastAsia="Times New Roman" w:hAnsi="Times New Roman"/>
+                <w:b w:val="false"/>
+                <w:bCs w:val="false"/>
+                <w:sz w:val="18"/>
+                <w:szCs w:val="18"/>
+              </w:rPr>
+              <w:t xml:space="preserve">.751</w:t>
+            </w:r>
+          </w:p>
+        </w:tc>
+        <w:tc>
+          <w:tcPr>
+            <w:tcW w:type="dxa" w:w="720"/>
+            <w:tcBorders>
+              <w:top w:val="single" w:color="808080" w:sz="4"/>
+              <w:left w:val="single" w:color="808080" w:sz="4"/>
+              <w:bottom w:val="single" w:color="808080" w:sz="4"/>
+              <w:right w:val="single" w:color="808080" w:sz="4"/>
+            </w:tcBorders>
+            <w:tcMar>
+              <w:top w:type="dxa" w:w="40"/>
+              <w:left w:type="dxa" w:w="45"/>
+              <w:bottom w:type="dxa" w:w="40"/>
+              <w:right w:type="dxa" w:w="45"/>
+            </w:tcMar>
+            <w:vAlign w:val="center"/>
+          </w:tcPr>
+          <w:p>
+            <w:pPr>
+              <w:keepNext/>
+              <w:spacing w:after="0" w:before="0" w:line="240" w:lineRule="auto"/>
+              <w:jc w:val="center"/>
+              <w:rPr>
+                <w:b w:val="false"/>
+                <w:bCs w:val="false"/>
+                <w:sz w:val="18"/>
+                <w:szCs w:val="18"/>
+              </w:rPr>
+            </w:pPr>
+            <w:r>
+              <w:rPr>
+                <w:rFonts w:ascii="Times New Roman" w:cs="Times New Roman" w:eastAsia="Times New Roman" w:hAnsi="Times New Roman"/>
+                <w:b w:val="false"/>
+                <w:bCs w:val="false"/>
+                <w:sz w:val="18"/>
+                <w:szCs w:val="18"/>
+              </w:rPr>
+              <w:t xml:space="preserve">.0565</w:t>
+            </w:r>
+          </w:p>
+        </w:tc>
+        <w:tc>
+          <w:tcPr>
+            <w:tcW w:type="dxa" w:w="680"/>
+            <w:tcBorders>
+              <w:top w:val="single" w:color="808080" w:sz="4"/>
+              <w:left w:val="single" w:color="808080" w:sz="4"/>
+              <w:bottom w:val="single" w:color="808080" w:sz="4"/>
+              <w:right w:val="single" w:color="808080" w:sz="4"/>
+            </w:tcBorders>
+            <w:tcMar>
+              <w:top w:type="dxa" w:w="40"/>
+              <w:left w:type="dxa" w:w="45"/>
+              <w:bottom w:type="dxa" w:w="40"/>
+              <w:right w:type="dxa" w:w="45"/>
+            </w:tcMar>
+            <w:vAlign w:val="center"/>
+          </w:tcPr>
+          <w:p>
+            <w:pPr>
+              <w:keepNext/>
+              <w:spacing w:after="0" w:before="0" w:line="240" w:lineRule="auto"/>
+              <w:jc w:val="center"/>
+              <w:rPr>
+                <w:b w:val="false"/>
+                <w:bCs w:val="false"/>
+                <w:sz w:val="18"/>
+                <w:szCs w:val="18"/>
+              </w:rPr>
+            </w:pPr>
+            <w:r>
+              <w:rPr>
+                <w:rFonts w:ascii="Times New Roman" w:cs="Times New Roman" w:eastAsia="Times New Roman" w:hAnsi="Times New Roman"/>
+                <w:b w:val="false"/>
+                <w:bCs w:val="false"/>
+                <w:sz w:val="18"/>
+                <w:szCs w:val="18"/>
+              </w:rPr>
+              <w:t xml:space="preserve">.808</w:t>
+            </w:r>
+          </w:p>
+        </w:tc>
+      </w:tr>
+      <w:tr>
+        <w:trPr>
+          <w:cantSplit/>
+          <w:tblHeader w:val="false"/>
+        </w:trPr>
+        <w:tc>
+          <w:tcPr>
+            <w:tcW w:type="dxa" w:w="700"/>
+            <w:tcBorders>
+              <w:top w:val="single" w:color="808080" w:sz="4"/>
+              <w:left w:val="single" w:color="808080" w:sz="4"/>
+              <w:bottom w:val="single" w:color="808080" w:sz="4"/>
+              <w:right w:val="single" w:color="808080" w:sz="4"/>
+            </w:tcBorders>
+            <w:tcMar>
+              <w:top w:type="dxa" w:w="40"/>
+              <w:left w:type="dxa" w:w="45"/>
+              <w:bottom w:type="dxa" w:w="40"/>
+              <w:right w:type="dxa" w:w="45"/>
+            </w:tcMar>
+            <w:vAlign w:val="center"/>
+          </w:tcPr>
+          <w:p>
+            <w:pPr>
+              <w:keepNext/>
+              <w:spacing w:after="0" w:before="0" w:line="240" w:lineRule="auto"/>
+              <w:jc w:val="left"/>
+              <w:rPr>
+                <w:b w:val="false"/>
+                <w:bCs w:val="false"/>
+                <w:sz w:val="18"/>
+                <w:szCs w:val="18"/>
+              </w:rPr>
+            </w:pPr>
+            <w:r>
+              <w:rPr>
+                <w:rFonts w:ascii="Times New Roman" w:cs="Times New Roman" w:eastAsia="Times New Roman" w:hAnsi="Times New Roman"/>
+                <w:b w:val="false"/>
+                <w:bCs w:val="false"/>
+                <w:sz w:val="18"/>
+                <w:szCs w:val="18"/>
+              </w:rPr>
+              <w:t xml:space="preserve">S3</w:t>
+            </w:r>
+          </w:p>
+        </w:tc>
+        <w:tc>
+          <w:tcPr>
+            <w:tcW w:type="dxa" w:w="980"/>
+            <w:tcBorders>
+              <w:top w:val="single" w:color="808080" w:sz="4"/>
+              <w:left w:val="single" w:color="808080" w:sz="4"/>
+              <w:bottom w:val="single" w:color="808080" w:sz="4"/>
+              <w:right w:val="single" w:color="808080" w:sz="4"/>
+            </w:tcBorders>
+            <w:tcMar>
+              <w:top w:type="dxa" w:w="40"/>
+              <w:left w:type="dxa" w:w="45"/>
+              <w:bottom w:type="dxa" w:w="40"/>
+              <w:right w:type="dxa" w:w="45"/>
+            </w:tcMar>
+            <w:vAlign w:val="center"/>
+          </w:tcPr>
+          <w:p>
+            <w:pPr>
+              <w:keepNext/>
+              <w:spacing w:after="0" w:before="0" w:line="240" w:lineRule="auto"/>
+              <w:jc w:val="center"/>
+              <w:rPr>
+                <w:b w:val="false"/>
+                <w:bCs w:val="false"/>
+                <w:sz w:val="18"/>
+                <w:szCs w:val="18"/>
+              </w:rPr>
+            </w:pPr>
+            <w:r>
+              <w:rPr>
+                <w:rFonts w:ascii="Times New Roman" w:cs="Times New Roman" w:eastAsia="Times New Roman" w:hAnsi="Times New Roman"/>
+                <w:b w:val="false"/>
+                <w:bCs w:val="false"/>
+                <w:sz w:val="18"/>
+                <w:szCs w:val="18"/>
+              </w:rPr>
+              <w:t xml:space="preserve">1,032/82</w:t>
+            </w:r>
+          </w:p>
+        </w:tc>
+        <w:tc>
+          <w:tcPr>
+            <w:tcW w:type="dxa" w:w="640"/>
+            <w:tcBorders>
+              <w:top w:val="single" w:color="808080" w:sz="4"/>
+              <w:left w:val="single" w:color="808080" w:sz="4"/>
+              <w:bottom w:val="single" w:color="808080" w:sz="4"/>
+              <w:right w:val="single" w:color="808080" w:sz="4"/>
+            </w:tcBorders>
+            <w:tcMar>
+              <w:top w:type="dxa" w:w="40"/>
+              <w:left w:type="dxa" w:w="45"/>
+              <w:bottom w:type="dxa" w:w="40"/>
+              <w:right w:type="dxa" w:w="45"/>
+            </w:tcMar>
+            <w:vAlign w:val="center"/>
+          </w:tcPr>
+          <w:p>
+            <w:pPr>
+              <w:keepNext/>
+              <w:spacing w:after="0" w:before="0" w:line="240" w:lineRule="auto"/>
+              <w:jc w:val="center"/>
+              <w:rPr>
+                <w:b w:val="false"/>
+                <w:bCs w:val="false"/>
+                <w:sz w:val="18"/>
+                <w:szCs w:val="18"/>
+              </w:rPr>
+            </w:pPr>
+            <w:r>
+              <w:rPr>
+                <w:rFonts w:ascii="Times New Roman" w:cs="Times New Roman" w:eastAsia="Times New Roman" w:hAnsi="Times New Roman"/>
+                <w:b w:val="false"/>
+                <w:bCs w:val="false"/>
+                <w:sz w:val="18"/>
+                <w:szCs w:val="18"/>
+              </w:rPr>
+              <w:t xml:space="preserve">7.95</w:t>
+            </w:r>
+          </w:p>
+        </w:tc>
+        <w:tc>
+          <w:tcPr>
+            <w:tcW w:type="dxa" w:w="640"/>
+            <w:tcBorders>
+              <w:top w:val="single" w:color="808080" w:sz="4"/>
+              <w:left w:val="single" w:color="808080" w:sz="4"/>
+              <w:bottom w:val="single" w:color="808080" w:sz="4"/>
+              <w:right w:val="single" w:color="808080" w:sz="4"/>
+            </w:tcBorders>
+            <w:tcMar>
+              <w:top w:type="dxa" w:w="40"/>
+              <w:left w:type="dxa" w:w="45"/>
+              <w:bottom w:type="dxa" w:w="40"/>
+              <w:right w:type="dxa" w:w="45"/>
+            </w:tcMar>
+            <w:vAlign w:val="center"/>
+          </w:tcPr>
+          <w:p>
+            <w:pPr>
+              <w:keepNext/>
+              <w:spacing w:after="0" w:before="0" w:line="240" w:lineRule="auto"/>
+              <w:jc w:val="center"/>
+              <w:rPr>
+                <w:b w:val="false"/>
+                <w:bCs w:val="false"/>
+                <w:sz w:val="18"/>
+                <w:szCs w:val="18"/>
+              </w:rPr>
+            </w:pPr>
+            <w:r>
+              <w:rPr>
+                <w:rFonts w:ascii="Times New Roman" w:cs="Times New Roman" w:eastAsia="Times New Roman" w:hAnsi="Times New Roman"/>
+                <w:b w:val="false"/>
+                <w:bCs w:val="false"/>
+                <w:sz w:val="18"/>
+                <w:szCs w:val="18"/>
+              </w:rPr>
+              <w:t xml:space="preserve">9.06</w:t>
+            </w:r>
+          </w:p>
+        </w:tc>
+        <w:tc>
+          <w:tcPr>
+            <w:tcW w:type="dxa" w:w="680"/>
+            <w:tcBorders>
+              <w:top w:val="single" w:color="808080" w:sz="4"/>
+              <w:left w:val="single" w:color="808080" w:sz="4"/>
+              <w:bottom w:val="single" w:color="808080" w:sz="4"/>
+              <w:right w:val="single" w:color="808080" w:sz="4"/>
+            </w:tcBorders>
+            <w:tcMar>
+              <w:top w:type="dxa" w:w="40"/>
+              <w:left w:type="dxa" w:w="45"/>
+              <w:bottom w:type="dxa" w:w="40"/>
+              <w:right w:type="dxa" w:w="45"/>
+            </w:tcMar>
+            <w:vAlign w:val="center"/>
+          </w:tcPr>
+          <w:p>
+            <w:pPr>
+              <w:keepNext/>
+              <w:spacing w:after="0" w:before="0" w:line="240" w:lineRule="auto"/>
+              <w:jc w:val="center"/>
+              <w:rPr>
+                <w:b w:val="false"/>
+                <w:bCs w:val="false"/>
+                <w:sz w:val="18"/>
+                <w:szCs w:val="18"/>
+              </w:rPr>
+            </w:pPr>
+            <w:r>
+              <w:rPr>
+                <w:rFonts w:ascii="Times New Roman" w:cs="Times New Roman" w:eastAsia="Times New Roman" w:hAnsi="Times New Roman"/>
+                <w:b w:val="false"/>
+                <w:bCs w:val="false"/>
+                <w:sz w:val="18"/>
+                <w:szCs w:val="18"/>
+              </w:rPr>
+              <w:t xml:space="preserve">.736</w:t>
+            </w:r>
+          </w:p>
+        </w:tc>
+        <w:tc>
+          <w:tcPr>
+            <w:tcW w:type="dxa" w:w="720"/>
+            <w:tcBorders>
+              <w:top w:val="single" w:color="808080" w:sz="4"/>
+              <w:left w:val="single" w:color="808080" w:sz="4"/>
+              <w:bottom w:val="single" w:color="808080" w:sz="4"/>
+              <w:right w:val="single" w:color="808080" w:sz="4"/>
+            </w:tcBorders>
+            <w:tcMar>
+              <w:top w:type="dxa" w:w="40"/>
+              <w:left w:type="dxa" w:w="45"/>
+              <w:bottom w:type="dxa" w:w="40"/>
+              <w:right w:type="dxa" w:w="45"/>
+            </w:tcMar>
+            <w:vAlign w:val="center"/>
+          </w:tcPr>
+          <w:p>
+            <w:pPr>
+              <w:keepNext/>
+              <w:spacing w:after="0" w:before="0" w:line="240" w:lineRule="auto"/>
+              <w:jc w:val="center"/>
+              <w:rPr>
+                <w:b w:val="false"/>
+                <w:bCs w:val="false"/>
+                <w:sz w:val="18"/>
+                <w:szCs w:val="18"/>
+              </w:rPr>
+            </w:pPr>
+            <w:r>
+              <w:rPr>
+                <w:rFonts w:ascii="Times New Roman" w:cs="Times New Roman" w:eastAsia="Times New Roman" w:hAnsi="Times New Roman"/>
+                <w:b w:val="false"/>
+                <w:bCs w:val="false"/>
+                <w:sz w:val="18"/>
+                <w:szCs w:val="18"/>
+              </w:rPr>
+              <w:t xml:space="preserve">.0682</w:t>
+            </w:r>
+          </w:p>
+        </w:tc>
+        <w:tc>
+          <w:tcPr>
+            <w:tcW w:type="dxa" w:w="680"/>
+            <w:tcBorders>
+              <w:top w:val="single" w:color="808080" w:sz="4"/>
+              <w:left w:val="single" w:color="808080" w:sz="4"/>
+              <w:bottom w:val="single" w:color="808080" w:sz="4"/>
+              <w:right w:val="single" w:color="808080" w:sz="4"/>
+            </w:tcBorders>
+            <w:tcMar>
+              <w:top w:type="dxa" w:w="40"/>
+              <w:left w:type="dxa" w:w="45"/>
+              <w:bottom w:type="dxa" w:w="40"/>
+              <w:right w:type="dxa" w:w="45"/>
+            </w:tcMar>
+            <w:vAlign w:val="center"/>
+          </w:tcPr>
+          <w:p>
+            <w:pPr>
+              <w:keepNext/>
+              <w:spacing w:after="0" w:before="0" w:line="240" w:lineRule="auto"/>
+              <w:jc w:val="center"/>
+              <w:rPr>
+                <w:b w:val="false"/>
+                <w:bCs w:val="false"/>
+                <w:sz w:val="18"/>
+                <w:szCs w:val="18"/>
+              </w:rPr>
+            </w:pPr>
+            <w:r>
+              <w:rPr>
+                <w:rFonts w:ascii="Times New Roman" w:cs="Times New Roman" w:eastAsia="Times New Roman" w:hAnsi="Times New Roman"/>
+                <w:b w:val="false"/>
+                <w:bCs w:val="false"/>
+                <w:sz w:val="18"/>
+                <w:szCs w:val="18"/>
+              </w:rPr>
+              <w:t xml:space="preserve">.864</w:t>
+            </w:r>
+          </w:p>
+        </w:tc>
+      </w:tr>
+      <w:tr>
+        <w:trPr>
+          <w:cantSplit/>
+          <w:tblHeader w:val="false"/>
+        </w:trPr>
+        <w:tc>
+          <w:tcPr>
+            <w:tcW w:type="dxa" w:w="700"/>
+            <w:tcBorders>
+              <w:top w:val="single" w:color="808080" w:sz="4"/>
+              <w:left w:val="single" w:color="808080" w:sz="4"/>
+              <w:bottom w:val="single" w:color="808080" w:sz="4"/>
+              <w:right w:val="single" w:color="808080" w:sz="4"/>
+            </w:tcBorders>
+            <w:tcMar>
+              <w:top w:type="dxa" w:w="40"/>
+              <w:left w:type="dxa" w:w="45"/>
+              <w:bottom w:type="dxa" w:w="40"/>
+              <w:right w:type="dxa" w:w="45"/>
+            </w:tcMar>
+            <w:vAlign w:val="center"/>
+          </w:tcPr>
+          <w:p>
+            <w:pPr>
+              <w:keepNext/>
+              <w:spacing w:after="0" w:before="0" w:line="240" w:lineRule="auto"/>
+              <w:jc w:val="left"/>
+              <w:rPr>
+                <w:b w:val="false"/>
+                <w:bCs w:val="false"/>
+                <w:sz w:val="18"/>
+                <w:szCs w:val="18"/>
+              </w:rPr>
+            </w:pPr>
+            <w:r>
+              <w:rPr>
+                <w:rFonts w:ascii="Times New Roman" w:cs="Times New Roman" w:eastAsia="Times New Roman" w:hAnsi="Times New Roman"/>
+                <w:b w:val="false"/>
+                <w:bCs w:val="false"/>
+                <w:sz w:val="18"/>
+                <w:szCs w:val="18"/>
+              </w:rPr>
+              <w:t xml:space="preserve">S4a</w:t>
+            </w:r>
+          </w:p>
+        </w:tc>
+        <w:tc>
+          <w:tcPr>
+            <w:tcW w:type="dxa" w:w="980"/>
+            <w:tcBorders>
+              <w:top w:val="single" w:color="808080" w:sz="4"/>
+              <w:left w:val="single" w:color="808080" w:sz="4"/>
+              <w:bottom w:val="single" w:color="808080" w:sz="4"/>
+              <w:right w:val="single" w:color="808080" w:sz="4"/>
+            </w:tcBorders>
+            <w:tcMar>
+              <w:top w:type="dxa" w:w="40"/>
+              <w:left w:type="dxa" w:w="45"/>
+              <w:bottom w:type="dxa" w:w="40"/>
+              <w:right w:type="dxa" w:w="45"/>
+            </w:tcMar>
+            <w:vAlign w:val="center"/>
+          </w:tcPr>
+          <w:p>
+            <w:pPr>
+              <w:keepNext/>
+              <w:spacing w:after="0" w:before="0" w:line="240" w:lineRule="auto"/>
+              <w:jc w:val="center"/>
+              <w:rPr>
+                <w:b w:val="false"/>
+                <w:bCs w:val="false"/>
+                <w:sz w:val="18"/>
+                <w:szCs w:val="18"/>
+              </w:rPr>
+            </w:pPr>
+            <w:r>
+              <w:rPr>
+                <w:rFonts w:ascii="Times New Roman" w:cs="Times New Roman" w:eastAsia="Times New Roman" w:hAnsi="Times New Roman"/>
+                <w:b w:val="false"/>
+                <w:bCs w:val="false"/>
+                <w:sz w:val="18"/>
+                <w:szCs w:val="18"/>
+              </w:rPr>
+              <w:t xml:space="preserve">1,013/67</w:t>
+            </w:r>
+          </w:p>
+        </w:tc>
+        <w:tc>
+          <w:tcPr>
+            <w:tcW w:type="dxa" w:w="640"/>
+            <w:tcBorders>
+              <w:top w:val="single" w:color="808080" w:sz="4"/>
+              <w:left w:val="single" w:color="808080" w:sz="4"/>
+              <w:bottom w:val="single" w:color="808080" w:sz="4"/>
+              <w:right w:val="single" w:color="808080" w:sz="4"/>
+            </w:tcBorders>
+            <w:tcMar>
+              <w:top w:type="dxa" w:w="40"/>
+              <w:left w:type="dxa" w:w="45"/>
+              <w:bottom w:type="dxa" w:w="40"/>
+              <w:right w:type="dxa" w:w="45"/>
+            </w:tcMar>
+            <w:vAlign w:val="center"/>
+          </w:tcPr>
+          <w:p>
+            <w:pPr>
+              <w:keepNext/>
+              <w:spacing w:after="0" w:before="0" w:line="240" w:lineRule="auto"/>
+              <w:jc w:val="center"/>
+              <w:rPr>
+                <w:b w:val="false"/>
+                <w:bCs w:val="false"/>
+                <w:sz w:val="18"/>
+                <w:szCs w:val="18"/>
+              </w:rPr>
+            </w:pPr>
+            <w:r>
+              <w:rPr>
+                <w:rFonts w:ascii="Times New Roman" w:cs="Times New Roman" w:eastAsia="Times New Roman" w:hAnsi="Times New Roman"/>
+                <w:b w:val="false"/>
+                <w:bCs w:val="false"/>
+                <w:sz w:val="18"/>
+                <w:szCs w:val="18"/>
+              </w:rPr>
+              <w:t xml:space="preserve">6.61</w:t>
+            </w:r>
+          </w:p>
+        </w:tc>
+        <w:tc>
+          <w:tcPr>
+            <w:tcW w:type="dxa" w:w="640"/>
+            <w:tcBorders>
+              <w:top w:val="single" w:color="808080" w:sz="4"/>
+              <w:left w:val="single" w:color="808080" w:sz="4"/>
+              <w:bottom w:val="single" w:color="808080" w:sz="4"/>
+              <w:right w:val="single" w:color="808080" w:sz="4"/>
+            </w:tcBorders>
+            <w:tcMar>
+              <w:top w:type="dxa" w:w="40"/>
+              <w:left w:type="dxa" w:w="45"/>
+              <w:bottom w:type="dxa" w:w="40"/>
+              <w:right w:type="dxa" w:w="45"/>
+            </w:tcMar>
+            <w:vAlign w:val="center"/>
+          </w:tcPr>
+          <w:p>
+            <w:pPr>
+              <w:keepNext/>
+              <w:spacing w:after="0" w:before="0" w:line="240" w:lineRule="auto"/>
+              <w:jc w:val="center"/>
+              <w:rPr>
+                <w:b w:val="false"/>
+                <w:bCs w:val="false"/>
+                <w:sz w:val="18"/>
+                <w:szCs w:val="18"/>
+              </w:rPr>
+            </w:pPr>
+            <w:r>
+              <w:rPr>
+                <w:rFonts w:ascii="Times New Roman" w:cs="Times New Roman" w:eastAsia="Times New Roman" w:hAnsi="Times New Roman"/>
+                <w:b w:val="false"/>
+                <w:bCs w:val="false"/>
+                <w:sz w:val="18"/>
+                <w:szCs w:val="18"/>
+              </w:rPr>
+              <w:t xml:space="preserve">7.49</w:t>
+            </w:r>
+          </w:p>
+        </w:tc>
+        <w:tc>
+          <w:tcPr>
+            <w:tcW w:type="dxa" w:w="680"/>
+            <w:tcBorders>
+              <w:top w:val="single" w:color="808080" w:sz="4"/>
+              <w:left w:val="single" w:color="808080" w:sz="4"/>
+              <w:bottom w:val="single" w:color="808080" w:sz="4"/>
+              <w:right w:val="single" w:color="808080" w:sz="4"/>
+            </w:tcBorders>
+            <w:tcMar>
+              <w:top w:type="dxa" w:w="40"/>
+              <w:left w:type="dxa" w:w="45"/>
+              <w:bottom w:type="dxa" w:w="40"/>
+              <w:right w:type="dxa" w:w="45"/>
+            </w:tcMar>
+            <w:vAlign w:val="center"/>
+          </w:tcPr>
+          <w:p>
+            <w:pPr>
+              <w:keepNext/>
+              <w:spacing w:after="0" w:before="0" w:line="240" w:lineRule="auto"/>
+              <w:jc w:val="center"/>
+              <w:rPr>
+                <w:b w:val="false"/>
+                <w:bCs w:val="false"/>
+                <w:sz w:val="18"/>
+                <w:szCs w:val="18"/>
+              </w:rPr>
+            </w:pPr>
+            <w:r>
+              <w:rPr>
+                <w:rFonts w:ascii="Times New Roman" w:cs="Times New Roman" w:eastAsia="Times New Roman" w:hAnsi="Times New Roman"/>
+                <w:b w:val="false"/>
+                <w:bCs w:val="false"/>
+                <w:sz w:val="18"/>
+                <w:szCs w:val="18"/>
+              </w:rPr>
+              <w:t xml:space="preserve">.752</w:t>
+            </w:r>
+          </w:p>
+        </w:tc>
+        <w:tc>
+          <w:tcPr>
+            <w:tcW w:type="dxa" w:w="720"/>
+            <w:tcBorders>
+              <w:top w:val="single" w:color="808080" w:sz="4"/>
+              <w:left w:val="single" w:color="808080" w:sz="4"/>
+              <w:bottom w:val="single" w:color="808080" w:sz="4"/>
+              <w:right w:val="single" w:color="808080" w:sz="4"/>
+            </w:tcBorders>
+            <w:tcMar>
+              <w:top w:type="dxa" w:w="40"/>
+              <w:left w:type="dxa" w:w="45"/>
+              <w:bottom w:type="dxa" w:w="40"/>
+              <w:right w:type="dxa" w:w="45"/>
+            </w:tcMar>
+            <w:vAlign w:val="center"/>
+          </w:tcPr>
+          <w:p>
+            <w:pPr>
+              <w:keepNext/>
+              <w:spacing w:after="0" w:before="0" w:line="240" w:lineRule="auto"/>
+              <w:jc w:val="center"/>
+              <w:rPr>
+                <w:b w:val="false"/>
+                <w:bCs w:val="false"/>
+                <w:sz w:val="18"/>
+                <w:szCs w:val="18"/>
+              </w:rPr>
+            </w:pPr>
+            <w:r>
+              <w:rPr>
+                <w:rFonts w:ascii="Times New Roman" w:cs="Times New Roman" w:eastAsia="Times New Roman" w:hAnsi="Times New Roman"/>
+                <w:b w:val="false"/>
+                <w:bCs w:val="false"/>
+                <w:sz w:val="18"/>
+                <w:szCs w:val="18"/>
+              </w:rPr>
+              <w:t xml:space="preserve">.0578</w:t>
+            </w:r>
+          </w:p>
+        </w:tc>
+        <w:tc>
+          <w:tcPr>
+            <w:tcW w:type="dxa" w:w="680"/>
+            <w:tcBorders>
+              <w:top w:val="single" w:color="808080" w:sz="4"/>
+              <w:left w:val="single" w:color="808080" w:sz="4"/>
+              <w:bottom w:val="single" w:color="808080" w:sz="4"/>
+              <w:right w:val="single" w:color="808080" w:sz="4"/>
+            </w:tcBorders>
+            <w:tcMar>
+              <w:top w:type="dxa" w:w="40"/>
+              <w:left w:type="dxa" w:w="45"/>
+              <w:bottom w:type="dxa" w:w="40"/>
+              <w:right w:type="dxa" w:w="45"/>
+            </w:tcMar>
+            <w:vAlign w:val="center"/>
+          </w:tcPr>
+          <w:p>
+            <w:pPr>
+              <w:keepNext/>
+              <w:spacing w:after="0" w:before="0" w:line="240" w:lineRule="auto"/>
+              <w:jc w:val="center"/>
+              <w:rPr>
+                <w:b w:val="false"/>
+                <w:bCs w:val="false"/>
+                <w:sz w:val="18"/>
+                <w:szCs w:val="18"/>
+              </w:rPr>
+            </w:pPr>
+            <w:r>
+              <w:rPr>
+                <w:rFonts w:ascii="Times New Roman" w:cs="Times New Roman" w:eastAsia="Times New Roman" w:hAnsi="Times New Roman"/>
+                <w:b w:val="false"/>
+                <w:bCs w:val="false"/>
+                <w:sz w:val="18"/>
+                <w:szCs w:val="18"/>
+              </w:rPr>
+              <w:t xml:space="preserve">.836</w:t>
+            </w:r>
+          </w:p>
+        </w:tc>
+      </w:tr>
+      <w:tr>
+        <w:trPr>
+          <w:cantSplit/>
+          <w:tblHeader w:val="false"/>
+        </w:trPr>
+        <w:tc>
+          <w:tcPr>
+            <w:tcW w:type="dxa" w:w="700"/>
+            <w:tcBorders>
+              <w:top w:val="single" w:color="808080" w:sz="4"/>
+              <w:left w:val="single" w:color="808080" w:sz="4"/>
+              <w:bottom w:val="single" w:color="808080" w:sz="4"/>
+              <w:right w:val="single" w:color="808080" w:sz="4"/>
+            </w:tcBorders>
+            <w:tcMar>
+              <w:top w:type="dxa" w:w="40"/>
+              <w:left w:type="dxa" w:w="45"/>
+              <w:bottom w:type="dxa" w:w="40"/>
+              <w:right w:type="dxa" w:w="45"/>
+            </w:tcMar>
+            <w:vAlign w:val="center"/>
+          </w:tcPr>
+          <w:p>
+            <w:pPr>
+              <w:keepNext/>
+              <w:spacing w:after="0" w:before="0" w:line="240" w:lineRule="auto"/>
+              <w:jc w:val="left"/>
+              <w:rPr>
+                <w:b w:val="false"/>
+                <w:bCs w:val="false"/>
+                <w:sz w:val="18"/>
+                <w:szCs w:val="18"/>
+              </w:rPr>
+            </w:pPr>
+            <w:r>
+              <w:rPr>
+                <w:rFonts w:ascii="Times New Roman" w:cs="Times New Roman" w:eastAsia="Times New Roman" w:hAnsi="Times New Roman"/>
+                <w:b w:val="false"/>
+                <w:bCs w:val="false"/>
+                <w:sz w:val="18"/>
+                <w:szCs w:val="18"/>
+              </w:rPr>
+              <w:t xml:space="preserve">S4b</w:t>
+            </w:r>
+          </w:p>
+        </w:tc>
+        <w:tc>
+          <w:tcPr>
+            <w:tcW w:type="dxa" w:w="980"/>
+            <w:tcBorders>
+              <w:top w:val="single" w:color="808080" w:sz="4"/>
+              <w:left w:val="single" w:color="808080" w:sz="4"/>
+              <w:bottom w:val="single" w:color="808080" w:sz="4"/>
+              <w:right w:val="single" w:color="808080" w:sz="4"/>
+            </w:tcBorders>
+            <w:tcMar>
+              <w:top w:type="dxa" w:w="40"/>
+              <w:left w:type="dxa" w:w="45"/>
+              <w:bottom w:type="dxa" w:w="40"/>
+              <w:right w:type="dxa" w:w="45"/>
+            </w:tcMar>
+            <w:vAlign w:val="center"/>
+          </w:tcPr>
+          <w:p>
+            <w:pPr>
+              <w:keepNext/>
+              <w:spacing w:after="0" w:before="0" w:line="240" w:lineRule="auto"/>
+              <w:jc w:val="center"/>
+              <w:rPr>
+                <w:b w:val="false"/>
+                <w:bCs w:val="false"/>
+                <w:sz w:val="18"/>
+                <w:szCs w:val="18"/>
+              </w:rPr>
+            </w:pPr>
+            <w:r>
+              <w:rPr>
+                <w:rFonts w:ascii="Times New Roman" w:cs="Times New Roman" w:eastAsia="Times New Roman" w:hAnsi="Times New Roman"/>
+                <w:b w:val="false"/>
+                <w:bCs w:val="false"/>
+                <w:sz w:val="18"/>
+                <w:szCs w:val="18"/>
+              </w:rPr>
+              <w:t xml:space="preserve">1,007/67</w:t>
+            </w:r>
+          </w:p>
+        </w:tc>
+        <w:tc>
+          <w:tcPr>
+            <w:tcW w:type="dxa" w:w="640"/>
+            <w:tcBorders>
+              <w:top w:val="single" w:color="808080" w:sz="4"/>
+              <w:left w:val="single" w:color="808080" w:sz="4"/>
+              <w:bottom w:val="single" w:color="808080" w:sz="4"/>
+              <w:right w:val="single" w:color="808080" w:sz="4"/>
+            </w:tcBorders>
+            <w:tcMar>
+              <w:top w:type="dxa" w:w="40"/>
+              <w:left w:type="dxa" w:w="45"/>
+              <w:bottom w:type="dxa" w:w="40"/>
+              <w:right w:type="dxa" w:w="45"/>
+            </w:tcMar>
+            <w:vAlign w:val="center"/>
+          </w:tcPr>
+          <w:p>
+            <w:pPr>
+              <w:keepNext/>
+              <w:spacing w:after="0" w:before="0" w:line="240" w:lineRule="auto"/>
+              <w:jc w:val="center"/>
+              <w:rPr>
+                <w:b w:val="false"/>
+                <w:bCs w:val="false"/>
+                <w:sz w:val="18"/>
+                <w:szCs w:val="18"/>
+              </w:rPr>
+            </w:pPr>
+            <w:r>
+              <w:rPr>
+                <w:rFonts w:ascii="Times New Roman" w:cs="Times New Roman" w:eastAsia="Times New Roman" w:hAnsi="Times New Roman"/>
+                <w:b w:val="false"/>
+                <w:bCs w:val="false"/>
+                <w:sz w:val="18"/>
+                <w:szCs w:val="18"/>
+              </w:rPr>
+              <w:t xml:space="preserve">6.65</w:t>
+            </w:r>
+          </w:p>
+        </w:tc>
+        <w:tc>
+          <w:tcPr>
+            <w:tcW w:type="dxa" w:w="640"/>
+            <w:tcBorders>
+              <w:top w:val="single" w:color="808080" w:sz="4"/>
+              <w:left w:val="single" w:color="808080" w:sz="4"/>
+              <w:bottom w:val="single" w:color="808080" w:sz="4"/>
+              <w:right w:val="single" w:color="808080" w:sz="4"/>
+            </w:tcBorders>
+            <w:tcMar>
+              <w:top w:type="dxa" w:w="40"/>
+              <w:left w:type="dxa" w:w="45"/>
+              <w:bottom w:type="dxa" w:w="40"/>
+              <w:right w:type="dxa" w:w="45"/>
+            </w:tcMar>
+            <w:vAlign w:val="center"/>
+          </w:tcPr>
+          <w:p>
+            <w:pPr>
+              <w:keepNext/>
+              <w:spacing w:after="0" w:before="0" w:line="240" w:lineRule="auto"/>
+              <w:jc w:val="center"/>
+              <w:rPr>
+                <w:b w:val="false"/>
+                <w:bCs w:val="false"/>
+                <w:sz w:val="18"/>
+                <w:szCs w:val="18"/>
+              </w:rPr>
+            </w:pPr>
+            <w:r>
+              <w:rPr>
+                <w:rFonts w:ascii="Times New Roman" w:cs="Times New Roman" w:eastAsia="Times New Roman" w:hAnsi="Times New Roman"/>
+                <w:b w:val="false"/>
+                <w:bCs w:val="false"/>
+                <w:sz w:val="18"/>
+                <w:szCs w:val="18"/>
+              </w:rPr>
+              <w:t xml:space="preserve">7.55</w:t>
+            </w:r>
+          </w:p>
+        </w:tc>
+        <w:tc>
+          <w:tcPr>
+            <w:tcW w:type="dxa" w:w="680"/>
+            <w:tcBorders>
+              <w:top w:val="single" w:color="808080" w:sz="4"/>
+              <w:left w:val="single" w:color="808080" w:sz="4"/>
+              <w:bottom w:val="single" w:color="808080" w:sz="4"/>
+              <w:right w:val="single" w:color="808080" w:sz="4"/>
+            </w:tcBorders>
+            <w:tcMar>
+              <w:top w:type="dxa" w:w="40"/>
+              <w:left w:type="dxa" w:w="45"/>
+              <w:bottom w:type="dxa" w:w="40"/>
+              <w:right w:type="dxa" w:w="45"/>
+            </w:tcMar>
+            <w:vAlign w:val="center"/>
+          </w:tcPr>
+          <w:p>
+            <w:pPr>
+              <w:keepNext/>
+              <w:spacing w:after="0" w:before="0" w:line="240" w:lineRule="auto"/>
+              <w:jc w:val="center"/>
+              <w:rPr>
+                <w:b w:val="false"/>
+                <w:bCs w:val="false"/>
+                <w:sz w:val="18"/>
+                <w:szCs w:val="18"/>
+              </w:rPr>
+            </w:pPr>
+            <w:r>
+              <w:rPr>
+                <w:rFonts w:ascii="Times New Roman" w:cs="Times New Roman" w:eastAsia="Times New Roman" w:hAnsi="Times New Roman"/>
+                <w:b w:val="false"/>
+                <w:bCs w:val="false"/>
+                <w:sz w:val="18"/>
+                <w:szCs w:val="18"/>
+              </w:rPr>
+              <w:t xml:space="preserve">.755</w:t>
+            </w:r>
+          </w:p>
+        </w:tc>
+        <w:tc>
+          <w:tcPr>
+            <w:tcW w:type="dxa" w:w="720"/>
+            <w:tcBorders>
+              <w:top w:val="single" w:color="808080" w:sz="4"/>
+              <w:left w:val="single" w:color="808080" w:sz="4"/>
+              <w:bottom w:val="single" w:color="808080" w:sz="4"/>
+              <w:right w:val="single" w:color="808080" w:sz="4"/>
+            </w:tcBorders>
+            <w:tcMar>
+              <w:top w:type="dxa" w:w="40"/>
+              <w:left w:type="dxa" w:w="45"/>
+              <w:bottom w:type="dxa" w:w="40"/>
+              <w:right w:type="dxa" w:w="45"/>
+            </w:tcMar>
+            <w:vAlign w:val="center"/>
+          </w:tcPr>
+          <w:p>
+            <w:pPr>
+              <w:keepNext/>
+              <w:spacing w:after="0" w:before="0" w:line="240" w:lineRule="auto"/>
+              <w:jc w:val="center"/>
+              <w:rPr>
+                <w:b w:val="false"/>
+                <w:bCs w:val="false"/>
+                <w:sz w:val="18"/>
+                <w:szCs w:val="18"/>
+              </w:rPr>
+            </w:pPr>
+            <w:r>
+              <w:rPr>
+                <w:rFonts w:ascii="Times New Roman" w:cs="Times New Roman" w:eastAsia="Times New Roman" w:hAnsi="Times New Roman"/>
+                <w:b w:val="false"/>
+                <w:bCs w:val="false"/>
+                <w:sz w:val="18"/>
+                <w:szCs w:val="18"/>
+              </w:rPr>
+              <w:t xml:space="preserve">.0576</w:t>
+            </w:r>
+          </w:p>
+        </w:tc>
+        <w:tc>
+          <w:tcPr>
+            <w:tcW w:type="dxa" w:w="680"/>
+            <w:tcBorders>
+              <w:top w:val="single" w:color="808080" w:sz="4"/>
+              <w:left w:val="single" w:color="808080" w:sz="4"/>
+              <w:bottom w:val="single" w:color="808080" w:sz="4"/>
+              <w:right w:val="single" w:color="808080" w:sz="4"/>
+            </w:tcBorders>
+            <w:tcMar>
+              <w:top w:type="dxa" w:w="40"/>
+              <w:left w:type="dxa" w:w="45"/>
+              <w:bottom w:type="dxa" w:w="40"/>
+              <w:right w:type="dxa" w:w="45"/>
+            </w:tcMar>
+            <w:vAlign w:val="center"/>
+          </w:tcPr>
+          <w:p>
+            <w:pPr>
+              <w:keepNext/>
+              <w:spacing w:after="0" w:before="0" w:line="240" w:lineRule="auto"/>
+              <w:jc w:val="center"/>
+              <w:rPr>
+                <w:b w:val="false"/>
+                <w:bCs w:val="false"/>
+                <w:sz w:val="18"/>
+                <w:szCs w:val="18"/>
+              </w:rPr>
+            </w:pPr>
+            <w:r>
+              <w:rPr>
+                <w:rFonts w:ascii="Times New Roman" w:cs="Times New Roman" w:eastAsia="Times New Roman" w:hAnsi="Times New Roman"/>
+                <w:b w:val="false"/>
+                <w:bCs w:val="false"/>
+                <w:sz w:val="18"/>
+                <w:szCs w:val="18"/>
+              </w:rPr>
+              <w:t xml:space="preserve">.854</w:t>
+            </w:r>
+          </w:p>
+        </w:tc>
+      </w:tr>
+      <w:tr>
+        <w:trPr>
+          <w:cantSplit/>
+          <w:tblHeader w:val="false"/>
+        </w:trPr>
+        <w:tc>
+          <w:tcPr>
+            <w:tcW w:type="dxa" w:w="700"/>
+            <w:tcBorders>
+              <w:top w:val="single" w:color="808080" w:sz="4"/>
+              <w:left w:val="single" w:color="808080" w:sz="4"/>
+              <w:bottom w:val="single" w:color="808080" w:sz="4"/>
+              <w:right w:val="single" w:color="808080" w:sz="4"/>
+            </w:tcBorders>
+            <w:tcMar>
+              <w:top w:type="dxa" w:w="40"/>
+              <w:left w:type="dxa" w:w="45"/>
+              <w:bottom w:type="dxa" w:w="40"/>
+              <w:right w:type="dxa" w:w="45"/>
+            </w:tcMar>
+            <w:vAlign w:val="center"/>
+          </w:tcPr>
+          <w:p>
+            <w:pPr>
+              <w:keepNext/>
+              <w:spacing w:after="0" w:before="0" w:line="240" w:lineRule="auto"/>
+              <w:jc w:val="left"/>
+              <w:rPr>
+                <w:b w:val="false"/>
+                <w:bCs w:val="false"/>
+                <w:sz w:val="18"/>
+                <w:szCs w:val="18"/>
+              </w:rPr>
+            </w:pPr>
+            <w:r>
+              <w:rPr>
+                <w:rFonts w:ascii="Times New Roman" w:cs="Times New Roman" w:eastAsia="Times New Roman" w:hAnsi="Times New Roman"/>
+                <w:b w:val="false"/>
+                <w:bCs w:val="false"/>
+                <w:sz w:val="18"/>
+                <w:szCs w:val="18"/>
+              </w:rPr>
+              <w:t xml:space="preserve">S4c</w:t>
+            </w:r>
+          </w:p>
+        </w:tc>
+        <w:tc>
+          <w:tcPr>
+            <w:tcW w:type="dxa" w:w="980"/>
+            <w:tcBorders>
+              <w:top w:val="single" w:color="808080" w:sz="4"/>
+              <w:left w:val="single" w:color="808080" w:sz="4"/>
+              <w:bottom w:val="single" w:color="808080" w:sz="4"/>
+              <w:right w:val="single" w:color="808080" w:sz="4"/>
+            </w:tcBorders>
+            <w:tcMar>
+              <w:top w:type="dxa" w:w="40"/>
+              <w:left w:type="dxa" w:w="45"/>
+              <w:bottom w:type="dxa" w:w="40"/>
+              <w:right w:type="dxa" w:w="45"/>
+            </w:tcMar>
+            <w:vAlign w:val="center"/>
+          </w:tcPr>
+          <w:p>
+            <w:pPr>
+              <w:keepNext/>
+              <w:spacing w:after="0" w:before="0" w:line="240" w:lineRule="auto"/>
+              <w:jc w:val="center"/>
+              <w:rPr>
+                <w:b w:val="false"/>
+                <w:bCs w:val="false"/>
+                <w:sz w:val="18"/>
+                <w:szCs w:val="18"/>
+              </w:rPr>
+            </w:pPr>
+            <w:r>
+              <w:rPr>
+                <w:rFonts w:ascii="Times New Roman" w:cs="Times New Roman" w:eastAsia="Times New Roman" w:hAnsi="Times New Roman"/>
+                <w:b w:val="false"/>
+                <w:bCs w:val="false"/>
+                <w:sz w:val="18"/>
+                <w:szCs w:val="18"/>
+              </w:rPr>
+              <w:t xml:space="preserve">1,013/67</w:t>
+            </w:r>
+          </w:p>
+        </w:tc>
+        <w:tc>
+          <w:tcPr>
+            <w:tcW w:type="dxa" w:w="640"/>
+            <w:tcBorders>
+              <w:top w:val="single" w:color="808080" w:sz="4"/>
+              <w:left w:val="single" w:color="808080" w:sz="4"/>
+              <w:bottom w:val="single" w:color="808080" w:sz="4"/>
+              <w:right w:val="single" w:color="808080" w:sz="4"/>
+            </w:tcBorders>
+            <w:tcMar>
+              <w:top w:type="dxa" w:w="40"/>
+              <w:left w:type="dxa" w:w="45"/>
+              <w:bottom w:type="dxa" w:w="40"/>
+              <w:right w:type="dxa" w:w="45"/>
+            </w:tcMar>
+            <w:vAlign w:val="center"/>
+          </w:tcPr>
+          <w:p>
+            <w:pPr>
+              <w:keepNext/>
+              <w:spacing w:after="0" w:before="0" w:line="240" w:lineRule="auto"/>
+              <w:jc w:val="center"/>
+              <w:rPr>
+                <w:b w:val="false"/>
+                <w:bCs w:val="false"/>
+                <w:sz w:val="18"/>
+                <w:szCs w:val="18"/>
+              </w:rPr>
+            </w:pPr>
+            <w:r>
+              <w:rPr>
+                <w:rFonts w:ascii="Times New Roman" w:cs="Times New Roman" w:eastAsia="Times New Roman" w:hAnsi="Times New Roman"/>
+                <w:b w:val="false"/>
+                <w:bCs w:val="false"/>
+                <w:sz w:val="18"/>
+                <w:szCs w:val="18"/>
+              </w:rPr>
+              <w:t xml:space="preserve">6.61</w:t>
+            </w:r>
+          </w:p>
+        </w:tc>
+        <w:tc>
+          <w:tcPr>
+            <w:tcW w:type="dxa" w:w="640"/>
+            <w:tcBorders>
+              <w:top w:val="single" w:color="808080" w:sz="4"/>
+              <w:left w:val="single" w:color="808080" w:sz="4"/>
+              <w:bottom w:val="single" w:color="808080" w:sz="4"/>
+              <w:right w:val="single" w:color="808080" w:sz="4"/>
+            </w:tcBorders>
+            <w:tcMar>
+              <w:top w:type="dxa" w:w="40"/>
+              <w:left w:type="dxa" w:w="45"/>
+              <w:bottom w:type="dxa" w:w="40"/>
+              <w:right w:type="dxa" w:w="45"/>
+            </w:tcMar>
+            <w:vAlign w:val="center"/>
+          </w:tcPr>
+          <w:p>
+            <w:pPr>
+              <w:keepNext/>
+              <w:spacing w:after="0" w:before="0" w:line="240" w:lineRule="auto"/>
+              <w:jc w:val="center"/>
+              <w:rPr>
+                <w:b w:val="false"/>
+                <w:bCs w:val="false"/>
+                <w:sz w:val="18"/>
+                <w:szCs w:val="18"/>
+              </w:rPr>
+            </w:pPr>
+            <w:r>
+              <w:rPr>
+                <w:rFonts w:ascii="Times New Roman" w:cs="Times New Roman" w:eastAsia="Times New Roman" w:hAnsi="Times New Roman"/>
+                <w:b w:val="false"/>
+                <w:bCs w:val="false"/>
+                <w:sz w:val="18"/>
+                <w:szCs w:val="18"/>
+              </w:rPr>
+              <w:t xml:space="preserve">7.49</w:t>
+            </w:r>
+          </w:p>
+        </w:tc>
+        <w:tc>
+          <w:tcPr>
+            <w:tcW w:type="dxa" w:w="680"/>
+            <w:tcBorders>
+              <w:top w:val="single" w:color="808080" w:sz="4"/>
+              <w:left w:val="single" w:color="808080" w:sz="4"/>
+              <w:bottom w:val="single" w:color="808080" w:sz="4"/>
+              <w:right w:val="single" w:color="808080" w:sz="4"/>
+            </w:tcBorders>
+            <w:tcMar>
+              <w:top w:type="dxa" w:w="40"/>
+              <w:left w:type="dxa" w:w="45"/>
+              <w:bottom w:type="dxa" w:w="40"/>
+              <w:right w:type="dxa" w:w="45"/>
+            </w:tcMar>
+            <w:vAlign w:val="center"/>
+          </w:tcPr>
+          <w:p>
+            <w:pPr>
+              <w:keepNext/>
+              <w:spacing w:after="0" w:before="0" w:line="240" w:lineRule="auto"/>
+              <w:jc w:val="center"/>
+              <w:rPr>
+                <w:b w:val="false"/>
+                <w:bCs w:val="false"/>
+                <w:sz w:val="18"/>
+                <w:szCs w:val="18"/>
+              </w:rPr>
+            </w:pPr>
+            <w:r>
+              <w:rPr>
+                <w:rFonts w:ascii="Times New Roman" w:cs="Times New Roman" w:eastAsia="Times New Roman" w:hAnsi="Times New Roman"/>
+                <w:b w:val="false"/>
+                <w:bCs w:val="false"/>
+                <w:sz w:val="18"/>
+                <w:szCs w:val="18"/>
+              </w:rPr>
+              <w:t xml:space="preserve">.752</w:t>
+            </w:r>
+          </w:p>
+        </w:tc>
+        <w:tc>
+          <w:tcPr>
+            <w:tcW w:type="dxa" w:w="720"/>
+            <w:tcBorders>
+              <w:top w:val="single" w:color="808080" w:sz="4"/>
+              <w:left w:val="single" w:color="808080" w:sz="4"/>
+              <w:bottom w:val="single" w:color="808080" w:sz="4"/>
+              <w:right w:val="single" w:color="808080" w:sz="4"/>
+            </w:tcBorders>
+            <w:tcMar>
+              <w:top w:type="dxa" w:w="40"/>
+              <w:left w:type="dxa" w:w="45"/>
+              <w:bottom w:type="dxa" w:w="40"/>
+              <w:right w:type="dxa" w:w="45"/>
+            </w:tcMar>
+            <w:vAlign w:val="center"/>
+          </w:tcPr>
+          <w:p>
+            <w:pPr>
+              <w:keepNext/>
+              <w:spacing w:after="0" w:before="0" w:line="240" w:lineRule="auto"/>
+              <w:jc w:val="center"/>
+              <w:rPr>
+                <w:b w:val="false"/>
+                <w:bCs w:val="false"/>
+                <w:sz w:val="18"/>
+                <w:szCs w:val="18"/>
+              </w:rPr>
+            </w:pPr>
+            <w:r>
+              <w:rPr>
+                <w:rFonts w:ascii="Times New Roman" w:cs="Times New Roman" w:eastAsia="Times New Roman" w:hAnsi="Times New Roman"/>
+                <w:b w:val="false"/>
+                <w:bCs w:val="false"/>
+                <w:sz w:val="18"/>
+                <w:szCs w:val="18"/>
+              </w:rPr>
+              <w:t xml:space="preserve">.0578</w:t>
+            </w:r>
+          </w:p>
+        </w:tc>
+        <w:tc>
+          <w:tcPr>
+            <w:tcW w:type="dxa" w:w="680"/>
+            <w:tcBorders>
+              <w:top w:val="single" w:color="808080" w:sz="4"/>
+              <w:left w:val="single" w:color="808080" w:sz="4"/>
+              <w:bottom w:val="single" w:color="808080" w:sz="4"/>
+              <w:right w:val="single" w:color="808080" w:sz="4"/>
+            </w:tcBorders>
+            <w:tcMar>
+              <w:top w:type="dxa" w:w="40"/>
+              <w:left w:type="dxa" w:w="45"/>
+              <w:bottom w:type="dxa" w:w="40"/>
+              <w:right w:type="dxa" w:w="45"/>
+            </w:tcMar>
+            <w:vAlign w:val="center"/>
+          </w:tcPr>
+          <w:p>
+            <w:pPr>
+              <w:keepNext/>
+              <w:spacing w:after="0" w:before="0" w:line="240" w:lineRule="auto"/>
+              <w:jc w:val="center"/>
+              <w:rPr>
+                <w:b w:val="false"/>
+                <w:bCs w:val="false"/>
+                <w:sz w:val="18"/>
+                <w:szCs w:val="18"/>
+              </w:rPr>
+            </w:pPr>
+            <w:r>
+              <w:rPr>
+                <w:rFonts w:ascii="Times New Roman" w:cs="Times New Roman" w:eastAsia="Times New Roman" w:hAnsi="Times New Roman"/>
+                <w:b w:val="false"/>
+                <w:bCs w:val="false"/>
+                <w:sz w:val="18"/>
+                <w:szCs w:val="18"/>
+              </w:rPr>
+              <w:t xml:space="preserve">.836</w:t>
+            </w:r>
+          </w:p>
+        </w:tc>
+      </w:tr>
+      <w:tr>
+        <w:trPr>
+          <w:cantSplit/>
+          <w:tblHeader w:val="false"/>
+        </w:trPr>
+        <w:tc>
+          <w:tcPr>
+            <w:tcW w:type="dxa" w:w="700"/>
+            <w:tcBorders>
+              <w:top w:val="single" w:color="808080" w:sz="4"/>
+              <w:left w:val="single" w:color="808080" w:sz="4"/>
+              <w:bottom w:val="single" w:color="808080" w:sz="4"/>
+              <w:right w:val="single" w:color="808080" w:sz="4"/>
+            </w:tcBorders>
+            <w:tcMar>
+              <w:top w:type="dxa" w:w="40"/>
+              <w:left w:type="dxa" w:w="45"/>
+              <w:bottom w:type="dxa" w:w="40"/>
+              <w:right w:type="dxa" w:w="45"/>
+            </w:tcMar>
+            <w:vAlign w:val="center"/>
+          </w:tcPr>
+          <w:p>
+            <w:pPr>
+              <w:keepNext/>
+              <w:spacing w:after="0" w:before="0" w:line="240" w:lineRule="auto"/>
+              <w:jc w:val="left"/>
+              <w:rPr>
+                <w:b w:val="false"/>
+                <w:bCs w:val="false"/>
+                <w:sz w:val="18"/>
+                <w:szCs w:val="18"/>
+              </w:rPr>
+            </w:pPr>
+            <w:r>
+              <w:rPr>
+                <w:rFonts w:ascii="Times New Roman" w:cs="Times New Roman" w:eastAsia="Times New Roman" w:hAnsi="Times New Roman"/>
+                <w:b w:val="false"/>
+                <w:bCs w:val="false"/>
+                <w:sz w:val="18"/>
+                <w:szCs w:val="18"/>
+              </w:rPr>
+              <w:t xml:space="preserve">S5</w:t>
+            </w:r>
+          </w:p>
+        </w:tc>
+        <w:tc>
+          <w:tcPr>
+            <w:tcW w:type="dxa" w:w="980"/>
+            <w:tcBorders>
+              <w:top w:val="single" w:color="808080" w:sz="4"/>
+              <w:left w:val="single" w:color="808080" w:sz="4"/>
+              <w:bottom w:val="single" w:color="808080" w:sz="4"/>
+              <w:right w:val="single" w:color="808080" w:sz="4"/>
+            </w:tcBorders>
+            <w:tcMar>
+              <w:top w:type="dxa" w:w="40"/>
+              <w:left w:type="dxa" w:w="45"/>
+              <w:bottom w:type="dxa" w:w="40"/>
+              <w:right w:type="dxa" w:w="45"/>
+            </w:tcMar>
+            <w:vAlign w:val="center"/>
+          </w:tcPr>
+          <w:p>
+            <w:pPr>
+              <w:keepNext/>
+              <w:spacing w:after="0" w:before="0" w:line="240" w:lineRule="auto"/>
+              <w:jc w:val="center"/>
+              <w:rPr>
+                <w:b w:val="false"/>
+                <w:bCs w:val="false"/>
+                <w:sz w:val="18"/>
+                <w:szCs w:val="18"/>
+              </w:rPr>
+            </w:pPr>
+            <w:r>
+              <w:rPr>
+                <w:rFonts w:ascii="Times New Roman" w:cs="Times New Roman" w:eastAsia="Times New Roman" w:hAnsi="Times New Roman"/>
+                <w:b w:val="false"/>
+                <w:bCs w:val="false"/>
+                <w:sz w:val="18"/>
+                <w:szCs w:val="18"/>
+              </w:rPr>
+              <w:t xml:space="preserve">1,013/67</w:t>
+            </w:r>
+          </w:p>
+        </w:tc>
+        <w:tc>
+          <w:tcPr>
+            <w:tcW w:type="dxa" w:w="640"/>
+            <w:tcBorders>
+              <w:top w:val="single" w:color="808080" w:sz="4"/>
+              <w:left w:val="single" w:color="808080" w:sz="4"/>
+              <w:bottom w:val="single" w:color="808080" w:sz="4"/>
+              <w:right w:val="single" w:color="808080" w:sz="4"/>
+            </w:tcBorders>
+            <w:tcMar>
+              <w:top w:type="dxa" w:w="40"/>
+              <w:left w:type="dxa" w:w="45"/>
+              <w:bottom w:type="dxa" w:w="40"/>
+              <w:right w:type="dxa" w:w="45"/>
+            </w:tcMar>
+            <w:vAlign w:val="center"/>
+          </w:tcPr>
+          <w:p>
+            <w:pPr>
+              <w:keepNext/>
+              <w:spacing w:after="0" w:before="0" w:line="240" w:lineRule="auto"/>
+              <w:jc w:val="center"/>
+              <w:rPr>
+                <w:b w:val="false"/>
+                <w:bCs w:val="false"/>
+                <w:sz w:val="18"/>
+                <w:szCs w:val="18"/>
+              </w:rPr>
+            </w:pPr>
+            <w:r>
+              <w:rPr>
+                <w:rFonts w:ascii="Times New Roman" w:cs="Times New Roman" w:eastAsia="Times New Roman" w:hAnsi="Times New Roman"/>
+                <w:b w:val="false"/>
+                <w:bCs w:val="false"/>
+                <w:sz w:val="18"/>
+                <w:szCs w:val="18"/>
+              </w:rPr>
+              <w:t xml:space="preserve">6.61</w:t>
+            </w:r>
+          </w:p>
+        </w:tc>
+        <w:tc>
+          <w:tcPr>
+            <w:tcW w:type="dxa" w:w="640"/>
+            <w:tcBorders>
+              <w:top w:val="single" w:color="808080" w:sz="4"/>
+              <w:left w:val="single" w:color="808080" w:sz="4"/>
+              <w:bottom w:val="single" w:color="808080" w:sz="4"/>
+              <w:right w:val="single" w:color="808080" w:sz="4"/>
+            </w:tcBorders>
+            <w:tcMar>
+              <w:top w:type="dxa" w:w="40"/>
+              <w:left w:type="dxa" w:w="45"/>
+              <w:bottom w:type="dxa" w:w="40"/>
+              <w:right w:type="dxa" w:w="45"/>
+            </w:tcMar>
+            <w:vAlign w:val="center"/>
+          </w:tcPr>
+          <w:p>
+            <w:pPr>
+              <w:keepNext/>
+              <w:spacing w:after="0" w:before="0" w:line="240" w:lineRule="auto"/>
+              <w:jc w:val="center"/>
+              <w:rPr>
+                <w:b w:val="false"/>
+                <w:bCs w:val="false"/>
+                <w:sz w:val="18"/>
+                <w:szCs w:val="18"/>
+              </w:rPr>
+            </w:pPr>
+            <w:r>
+              <w:rPr>
+                <w:rFonts w:ascii="Times New Roman" w:cs="Times New Roman" w:eastAsia="Times New Roman" w:hAnsi="Times New Roman"/>
+                <w:b w:val="false"/>
+                <w:bCs w:val="false"/>
+                <w:sz w:val="18"/>
+                <w:szCs w:val="18"/>
+              </w:rPr>
+              <w:t xml:space="preserve">7.49</w:t>
+            </w:r>
+          </w:p>
+        </w:tc>
+        <w:tc>
+          <w:tcPr>
+            <w:tcW w:type="dxa" w:w="680"/>
+            <w:tcBorders>
+              <w:top w:val="single" w:color="808080" w:sz="4"/>
+              <w:left w:val="single" w:color="808080" w:sz="4"/>
+              <w:bottom w:val="single" w:color="808080" w:sz="4"/>
+              <w:right w:val="single" w:color="808080" w:sz="4"/>
+            </w:tcBorders>
+            <w:tcMar>
+              <w:top w:type="dxa" w:w="40"/>
+              <w:left w:type="dxa" w:w="45"/>
+              <w:bottom w:type="dxa" w:w="40"/>
+              <w:right w:type="dxa" w:w="45"/>
+            </w:tcMar>
+            <w:vAlign w:val="center"/>
+          </w:tcPr>
+          <w:p>
+            <w:pPr>
+              <w:keepNext/>
+              <w:spacing w:after="0" w:before="0" w:line="240" w:lineRule="auto"/>
+              <w:jc w:val="center"/>
+              <w:rPr>
+                <w:b w:val="false"/>
+                <w:bCs w:val="false"/>
+                <w:sz w:val="18"/>
+                <w:szCs w:val="18"/>
+              </w:rPr>
+            </w:pPr>
+            <w:r>
+              <w:rPr>
+                <w:rFonts w:ascii="Times New Roman" w:cs="Times New Roman" w:eastAsia="Times New Roman" w:hAnsi="Times New Roman"/>
+                <w:b w:val="false"/>
+                <w:bCs w:val="false"/>
+                <w:sz w:val="18"/>
+                <w:szCs w:val="18"/>
+              </w:rPr>
+              <w:t xml:space="preserve">.752</w:t>
+            </w:r>
+          </w:p>
+        </w:tc>
+        <w:tc>
+          <w:tcPr>
+            <w:tcW w:type="dxa" w:w="720"/>
+            <w:tcBorders>
+              <w:top w:val="single" w:color="808080" w:sz="4"/>
+              <w:left w:val="single" w:color="808080" w:sz="4"/>
+              <w:bottom w:val="single" w:color="808080" w:sz="4"/>
+              <w:right w:val="single" w:color="808080" w:sz="4"/>
+            </w:tcBorders>
+            <w:tcMar>
+              <w:top w:type="dxa" w:w="40"/>
+              <w:left w:type="dxa" w:w="45"/>
+              <w:bottom w:type="dxa" w:w="40"/>
+              <w:right w:type="dxa" w:w="45"/>
+            </w:tcMar>
+            <w:vAlign w:val="center"/>
+          </w:tcPr>
+          <w:p>
+            <w:pPr>
+              <w:keepNext/>
+              <w:spacing w:after="0" w:before="0" w:line="240" w:lineRule="auto"/>
+              <w:jc w:val="center"/>
+              <w:rPr>
+                <w:b w:val="false"/>
+                <w:bCs w:val="false"/>
+                <w:sz w:val="18"/>
+                <w:szCs w:val="18"/>
+              </w:rPr>
+            </w:pPr>
+            <w:r>
+              <w:rPr>
+                <w:rFonts w:ascii="Times New Roman" w:cs="Times New Roman" w:eastAsia="Times New Roman" w:hAnsi="Times New Roman"/>
+                <w:b w:val="false"/>
+                <w:bCs w:val="false"/>
+                <w:sz w:val="18"/>
+                <w:szCs w:val="18"/>
+              </w:rPr>
+              <w:t xml:space="preserve">.0578</w:t>
+            </w:r>
+          </w:p>
+        </w:tc>
+        <w:tc>
+          <w:tcPr>
+            <w:tcW w:type="dxa" w:w="680"/>
+            <w:tcBorders>
+              <w:top w:val="single" w:color="808080" w:sz="4"/>
+              <w:left w:val="single" w:color="808080" w:sz="4"/>
+              <w:bottom w:val="single" w:color="808080" w:sz="4"/>
+              <w:right w:val="single" w:color="808080" w:sz="4"/>
+            </w:tcBorders>
+            <w:tcMar>
+              <w:top w:type="dxa" w:w="40"/>
+              <w:left w:type="dxa" w:w="45"/>
+              <w:bottom w:type="dxa" w:w="40"/>
+              <w:right w:type="dxa" w:w="45"/>
+            </w:tcMar>
+            <w:vAlign w:val="center"/>
+          </w:tcPr>
+          <w:p>
+            <w:pPr>
+              <w:keepNext/>
+              <w:spacing w:after="0" w:before="0" w:line="240" w:lineRule="auto"/>
+              <w:jc w:val="center"/>
+              <w:rPr>
+                <w:b w:val="false"/>
+                <w:bCs w:val="false"/>
+                <w:sz w:val="18"/>
+                <w:szCs w:val="18"/>
+              </w:rPr>
+            </w:pPr>
+            <w:r>
+              <w:rPr>
+                <w:rFonts w:ascii="Times New Roman" w:cs="Times New Roman" w:eastAsia="Times New Roman" w:hAnsi="Times New Roman"/>
+                <w:b w:val="false"/>
+                <w:bCs w:val="false"/>
+                <w:sz w:val="18"/>
+                <w:szCs w:val="18"/>
+              </w:rPr>
+              <w:t xml:space="preserve">.836</w:t>
+            </w:r>
+          </w:p>
+        </w:tc>
+      </w:tr>
+      <w:tr>
+        <w:trPr>
+          <w:cantSplit/>
+          <w:tblHeader w:val="false"/>
+        </w:trPr>
+        <w:tc>
+          <w:tcPr>
+            <w:tcW w:type="dxa" w:w="700"/>
+            <w:tcBorders>
+              <w:top w:val="single" w:color="808080" w:sz="4"/>
+              <w:left w:val="single" w:color="808080" w:sz="4"/>
+              <w:bottom w:val="single" w:color="808080" w:sz="4"/>
+              <w:right w:val="single" w:color="808080" w:sz="4"/>
+            </w:tcBorders>
+            <w:tcMar>
+              <w:top w:type="dxa" w:w="40"/>
+              <w:left w:type="dxa" w:w="45"/>
+              <w:bottom w:type="dxa" w:w="40"/>
+              <w:right w:type="dxa" w:w="45"/>
+            </w:tcMar>
+            <w:vAlign w:val="center"/>
+          </w:tcPr>
+          <w:p>
+            <w:pPr>
+              <w:keepNext/>
+              <w:spacing w:after="0" w:before="0" w:line="240" w:lineRule="auto"/>
+              <w:jc w:val="left"/>
+              <w:rPr>
+                <w:b w:val="false"/>
+                <w:bCs w:val="false"/>
+                <w:sz w:val="18"/>
+                <w:szCs w:val="18"/>
+              </w:rPr>
+            </w:pPr>
+            <w:r>
+              <w:rPr>
+                <w:rFonts w:ascii="Times New Roman" w:cs="Times New Roman" w:eastAsia="Times New Roman" w:hAnsi="Times New Roman"/>
+                <w:b w:val="false"/>
+                <w:bCs w:val="false"/>
+                <w:sz w:val="18"/>
+                <w:szCs w:val="18"/>
+              </w:rPr>
+              <w:t xml:space="preserve">S6a</w:t>
+            </w:r>
+          </w:p>
+        </w:tc>
+        <w:tc>
+          <w:tcPr>
+            <w:tcW w:type="dxa" w:w="980"/>
+            <w:tcBorders>
+              <w:top w:val="single" w:color="808080" w:sz="4"/>
+              <w:left w:val="single" w:color="808080" w:sz="4"/>
+              <w:bottom w:val="single" w:color="808080" w:sz="4"/>
+              <w:right w:val="single" w:color="808080" w:sz="4"/>
+            </w:tcBorders>
+            <w:tcMar>
+              <w:top w:type="dxa" w:w="40"/>
+              <w:left w:type="dxa" w:w="45"/>
+              <w:bottom w:type="dxa" w:w="40"/>
+              <w:right w:type="dxa" w:w="45"/>
+            </w:tcMar>
+            <w:vAlign w:val="center"/>
+          </w:tcPr>
+          <w:p>
+            <w:pPr>
+              <w:keepNext/>
+              <w:spacing w:after="0" w:before="0" w:line="240" w:lineRule="auto"/>
+              <w:jc w:val="center"/>
+              <w:rPr>
+                <w:b w:val="false"/>
+                <w:bCs w:val="false"/>
+                <w:sz w:val="18"/>
+                <w:szCs w:val="18"/>
+              </w:rPr>
+            </w:pPr>
+            <w:r>
+              <w:rPr>
+                <w:rFonts w:ascii="Times New Roman" w:cs="Times New Roman" w:eastAsia="Times New Roman" w:hAnsi="Times New Roman"/>
+                <w:b w:val="false"/>
+                <w:bCs w:val="false"/>
+                <w:sz w:val="18"/>
+                <w:szCs w:val="18"/>
+              </w:rPr>
+              <w:t xml:space="preserve">1,013/67</w:t>
+            </w:r>
+          </w:p>
+        </w:tc>
+        <w:tc>
+          <w:tcPr>
+            <w:tcW w:type="dxa" w:w="640"/>
+            <w:tcBorders>
+              <w:top w:val="single" w:color="808080" w:sz="4"/>
+              <w:left w:val="single" w:color="808080" w:sz="4"/>
+              <w:bottom w:val="single" w:color="808080" w:sz="4"/>
+              <w:right w:val="single" w:color="808080" w:sz="4"/>
+            </w:tcBorders>
+            <w:tcMar>
+              <w:top w:type="dxa" w:w="40"/>
+              <w:left w:type="dxa" w:w="45"/>
+              <w:bottom w:type="dxa" w:w="40"/>
+              <w:right w:type="dxa" w:w="45"/>
+            </w:tcMar>
+            <w:vAlign w:val="center"/>
+          </w:tcPr>
+          <w:p>
+            <w:pPr>
+              <w:keepNext/>
+              <w:spacing w:after="0" w:before="0" w:line="240" w:lineRule="auto"/>
+              <w:jc w:val="center"/>
+              <w:rPr>
+                <w:b w:val="false"/>
+                <w:bCs w:val="false"/>
+                <w:sz w:val="18"/>
+                <w:szCs w:val="18"/>
+              </w:rPr>
+            </w:pPr>
+            <w:r>
+              <w:rPr>
+                <w:rFonts w:ascii="Times New Roman" w:cs="Times New Roman" w:eastAsia="Times New Roman" w:hAnsi="Times New Roman"/>
+                <w:b w:val="false"/>
+                <w:bCs w:val="false"/>
+                <w:sz w:val="18"/>
+                <w:szCs w:val="18"/>
+              </w:rPr>
+              <w:t xml:space="preserve">6.61</w:t>
+            </w:r>
+          </w:p>
+        </w:tc>
+        <w:tc>
+          <w:tcPr>
+            <w:tcW w:type="dxa" w:w="640"/>
+            <w:tcBorders>
+              <w:top w:val="single" w:color="808080" w:sz="4"/>
+              <w:left w:val="single" w:color="808080" w:sz="4"/>
+              <w:bottom w:val="single" w:color="808080" w:sz="4"/>
+              <w:right w:val="single" w:color="808080" w:sz="4"/>
+            </w:tcBorders>
+            <w:tcMar>
+              <w:top w:type="dxa" w:w="40"/>
+              <w:left w:type="dxa" w:w="45"/>
+              <w:bottom w:type="dxa" w:w="40"/>
+              <w:right w:type="dxa" w:w="45"/>
+            </w:tcMar>
+            <w:vAlign w:val="center"/>
+          </w:tcPr>
+          <w:p>
+            <w:pPr>
+              <w:keepNext/>
+              <w:spacing w:after="0" w:before="0" w:line="240" w:lineRule="auto"/>
+              <w:jc w:val="center"/>
+              <w:rPr>
+                <w:b w:val="false"/>
+                <w:bCs w:val="false"/>
+                <w:sz w:val="18"/>
+                <w:szCs w:val="18"/>
+              </w:rPr>
+            </w:pPr>
+            <w:r>
+              <w:rPr>
+                <w:rFonts w:ascii="Times New Roman" w:cs="Times New Roman" w:eastAsia="Times New Roman" w:hAnsi="Times New Roman"/>
+                <w:b w:val="false"/>
+                <w:bCs w:val="false"/>
+                <w:sz w:val="18"/>
+                <w:szCs w:val="18"/>
+              </w:rPr>
+              <w:t xml:space="preserve">7.49</w:t>
+            </w:r>
+          </w:p>
+        </w:tc>
+        <w:tc>
+          <w:tcPr>
+            <w:tcW w:type="dxa" w:w="680"/>
+            <w:tcBorders>
+              <w:top w:val="single" w:color="808080" w:sz="4"/>
+              <w:left w:val="single" w:color="808080" w:sz="4"/>
+              <w:bottom w:val="single" w:color="808080" w:sz="4"/>
+              <w:right w:val="single" w:color="808080" w:sz="4"/>
+            </w:tcBorders>
+            <w:tcMar>
+              <w:top w:type="dxa" w:w="40"/>
+              <w:left w:type="dxa" w:w="45"/>
+              <w:bottom w:type="dxa" w:w="40"/>
+              <w:right w:type="dxa" w:w="45"/>
+            </w:tcMar>
+            <w:vAlign w:val="center"/>
+          </w:tcPr>
+          <w:p>
+            <w:pPr>
+              <w:keepNext/>
+              <w:spacing w:after="0" w:before="0" w:line="240" w:lineRule="auto"/>
+              <w:jc w:val="center"/>
+              <w:rPr>
+                <w:b w:val="false"/>
+                <w:bCs w:val="false"/>
+                <w:sz w:val="18"/>
+                <w:szCs w:val="18"/>
+              </w:rPr>
+            </w:pPr>
+            <w:r>
+              <w:rPr>
+                <w:rFonts w:ascii="Times New Roman" w:cs="Times New Roman" w:eastAsia="Times New Roman" w:hAnsi="Times New Roman"/>
+                <w:b w:val="false"/>
+                <w:bCs w:val="false"/>
+                <w:sz w:val="18"/>
+                <w:szCs w:val="18"/>
+              </w:rPr>
+              <w:t xml:space="preserve">.752</w:t>
+            </w:r>
+          </w:p>
+        </w:tc>
+        <w:tc>
+          <w:tcPr>
+            <w:tcW w:type="dxa" w:w="720"/>
+            <w:tcBorders>
+              <w:top w:val="single" w:color="808080" w:sz="4"/>
+              <w:left w:val="single" w:color="808080" w:sz="4"/>
+              <w:bottom w:val="single" w:color="808080" w:sz="4"/>
+              <w:right w:val="single" w:color="808080" w:sz="4"/>
+            </w:tcBorders>
+            <w:tcMar>
+              <w:top w:type="dxa" w:w="40"/>
+              <w:left w:type="dxa" w:w="45"/>
+              <w:bottom w:type="dxa" w:w="40"/>
+              <w:right w:type="dxa" w:w="45"/>
+            </w:tcMar>
+            <w:vAlign w:val="center"/>
+          </w:tcPr>
+          <w:p>
+            <w:pPr>
+              <w:keepNext/>
+              <w:spacing w:after="0" w:before="0" w:line="240" w:lineRule="auto"/>
+              <w:jc w:val="center"/>
+              <w:rPr>
+                <w:b w:val="false"/>
+                <w:bCs w:val="false"/>
+                <w:sz w:val="18"/>
+                <w:szCs w:val="18"/>
+              </w:rPr>
+            </w:pPr>
+            <w:r>
+              <w:rPr>
+                <w:rFonts w:ascii="Times New Roman" w:cs="Times New Roman" w:eastAsia="Times New Roman" w:hAnsi="Times New Roman"/>
+                <w:b w:val="false"/>
+                <w:bCs w:val="false"/>
+                <w:sz w:val="18"/>
+                <w:szCs w:val="18"/>
+              </w:rPr>
+              <w:t xml:space="preserve">.0578</w:t>
+            </w:r>
+          </w:p>
+        </w:tc>
+        <w:tc>
+          <w:tcPr>
+            <w:tcW w:type="dxa" w:w="680"/>
+            <w:tcBorders>
+              <w:top w:val="single" w:color="808080" w:sz="4"/>
+              <w:left w:val="single" w:color="808080" w:sz="4"/>
+              <w:bottom w:val="single" w:color="808080" w:sz="4"/>
+              <w:right w:val="single" w:color="808080" w:sz="4"/>
+            </w:tcBorders>
+            <w:tcMar>
+              <w:top w:type="dxa" w:w="40"/>
+              <w:left w:type="dxa" w:w="45"/>
+              <w:bottom w:type="dxa" w:w="40"/>
+              <w:right w:type="dxa" w:w="45"/>
+            </w:tcMar>
+            <w:vAlign w:val="center"/>
+          </w:tcPr>
+          <w:p>
+            <w:pPr>
+              <w:keepNext/>
+              <w:spacing w:after="0" w:before="0" w:line="240" w:lineRule="auto"/>
+              <w:jc w:val="center"/>
+              <w:rPr>
+                <w:b w:val="false"/>
+                <w:bCs w:val="false"/>
+                <w:sz w:val="18"/>
+                <w:szCs w:val="18"/>
+              </w:rPr>
+            </w:pPr>
+            <w:r>
+              <w:rPr>
+                <w:rFonts w:ascii="Times New Roman" w:cs="Times New Roman" w:eastAsia="Times New Roman" w:hAnsi="Times New Roman"/>
+                <w:b w:val="false"/>
+                <w:bCs w:val="false"/>
+                <w:sz w:val="18"/>
+                <w:szCs w:val="18"/>
+              </w:rPr>
+              <w:t xml:space="preserve">.836</w:t>
+            </w:r>
+          </w:p>
+        </w:tc>
+      </w:tr>
+      <w:tr>
+        <w:trPr>
+          <w:cantSplit/>
+          <w:tblHeader w:val="false"/>
+        </w:trPr>
+        <w:tc>
+          <w:tcPr>
+            <w:tcW w:type="dxa" w:w="700"/>
+            <w:tcBorders>
+              <w:top w:val="single" w:color="808080" w:sz="4"/>
+              <w:left w:val="single" w:color="808080" w:sz="4"/>
+              <w:bottom w:val="single" w:color="808080" w:sz="4"/>
+              <w:right w:val="single" w:color="808080" w:sz="4"/>
+            </w:tcBorders>
+            <w:tcMar>
+              <w:top w:type="dxa" w:w="40"/>
+              <w:left w:type="dxa" w:w="45"/>
+              <w:bottom w:type="dxa" w:w="40"/>
+              <w:right w:type="dxa" w:w="45"/>
+            </w:tcMar>
+            <w:vAlign w:val="center"/>
+          </w:tcPr>
+          <w:p>
+            <w:pPr>
               <w:keepNext w:val="false"/>
               <w:spacing w:after="0" w:before="0" w:line="240" w:lineRule="auto"/>
               <w:jc w:val="left"/>
@@ -9106,7 +11157,7 @@
                 <w:sz w:val="18"/>
                 <w:szCs w:val="18"/>
               </w:rPr>
-              <w:t xml:space="preserve">Same*</w:t>
+              <w:t xml:space="preserve">S6b</w:t>
             </w:r>
           </w:p>
         </w:tc>
@@ -9377,22 +11428,7 @@
           <w:sz w:val="16"/>
           <w:szCs w:val="16"/>
         </w:rPr>
-        <w:t xml:space="preserve">Events are reported non-recipients. Performance uses no weights. S1b uses the 2015 ceiling at every interview. S1d uses the income level at which the formula pays nothing; it admitted the same two adults as S1b. S2a/S2b screen living-together adults as couples/single. S2c screens separated adults as single; S2d screens both as single. S3 retains disability-grant recipients and adds no war-veterans recipient. S4b keeps social-assistance income in the proxy.</w:t>
-      </w:r>
-    </w:p>
-    <w:p>
-      <w:pPr>
-        <w:spacing w:after="0" w:before="0" w:line="240" w:lineRule="auto"/>
-        <w:ind w:firstLine="200"/>
-        <w:jc w:val="both"/>
-      </w:pPr>
-      <w:r>
-        <w:rPr>
-          <w:rFonts w:ascii="Times New Roman" w:cs="Times New Roman" w:eastAsia="Times New Roman" w:hAnsi="Times New Roman"/>
-          <w:sz w:val="20"/>
-          <w:szCs w:val="20"/>
-        </w:rPr>
-        <w:t xml:space="preserve">*S1a, S1c, S4a, S4c, S5 and S6a/S6b keep the S0 counts and reuse its predictions. Identical counts do not make the rules equivalent. No PASS adult has unresolved receipt for S6a/S6b to bound. Definitions are in Supplementary Table S1.</w:t>
+        <w:t xml:space="preserve">Events are non-recipients; performance is unweighted. S1 changes thresholds; S2 partnership; S3 incompatible grants; S4 income; S5 receipt period; S6 unresolved receipt. Supplementary Table S1 defines each rule. S1b and S1d admitted the same two adults under different rules. S1a, S1c, S4a, S4c, S5, S6a and S6b retained the S0 cohort and reused its predictions. Matching results do not imply equivalent rules or independent fits. No PASS receipt was unresolved, so S6a/S6b changed no records.</w:t>
       </w:r>
     </w:p>
     <w:p>
@@ -10350,7 +12386,7 @@
           <w:sz w:val="20"/>
           <w:szCs w:val="20"/>
         </w:rPr>
-        <w:t xml:space="preserve">The odds ratio for women versus men was 0.39 (Wald interval 0.23–0.66). Schooling below Grade 7 versus Grade 7 or above gave 0.24 (0.13–0.43). These full-sample associations are not held-out performance or causes. Only 67 events supported six slopes. Across the 100 refitted training folds, the female and below-Grade-7 coefficients stayed negative, while the urban-informal coefficient changed sign. Age, settlement and welfare-distance intervals included 1. That is limited precision, not evidence of no association, and those intervals omit the settlement-coding decision. The 20 repeated splits gave 100 converged fits. AUC ranged from 0.733 to 0.773 (median 0.753) and the calibration slope from 0.738 to 0.943 (median 0.837). Supplementary Table S3 gives the median, interquartile range and range for every performance measure, and the coefficient ranges. That spread is a sensitivity summary for the fixed coding, not a confidence interval.</w:t>
+        <w:t xml:space="preserve">The odds ratio for women versus men was 0.39 (Wald interval 0.23–0.66). Schooling below Grade 7 versus Grade 7 or above gave 0.24 (0.13–0.43). These are exploratory full-sample associations, not held-out performance or causal effects. Only 67 events supported six slopes; sparse data can destabilise coefficients and Wald intervals. The intervals also omit uncertainty from choosing the settlement coding. Across 100 overlapping training fits, the female and below-Grade-7 coefficients stayed negative, while the urban-informal coefficient changed sign. Sign consistency across these fits is not independent confirmation. Age, settlement and welfare-distance intervals included 1, indicating limited precision rather than evidence of no association. The 20 repeated splits gave 100 converged fits. AUC ranged from 0.733 to 0.773 (median 0.753) and the calibration slope from 0.738 to 0.943 (median 0.837). Supplementary Table S3 gives the median, interquartile range and range for each performance measure, and coefficient ranges. These describe sensitivity under the fixed coding, not confidence intervals.</w:t>
       </w:r>
     </w:p>
     <w:p>
@@ -13512,7 +15548,7 @@
           <w:sz w:val="20"/>
           <w:szCs w:val="20"/>
         </w:rPr>
-        <w:t xml:space="preserve">Survey access/disclosure conditions apply. Public demonstrations use synthetic records; downloadable packages exclude survey microdata. Reports omit submitted identifiers and raw income. This does not clear every historical repository file for release. No DUT ethics determination is documented. The app does not decide grants or rank named applicants.</w:t>
+        <w:t xml:space="preserve">The study used existing anonymised Stats SA LCS 2014/2015 data obtained through DataFirst [21]. The supervisor advised that formal ethical clearance was not required because the study involved no direct participation by human subjects or primary data collection. Stats SA is acknowledged as the data producer; the analyses result from the author's own processing. Applicable data-use and confidentiality conditions remain binding. Permission to redistribute survey files or all historical repository contents remains unconfirmed. Public demonstrations use synthetic records; downloadable packages exclude survey microdata, and reports omit submitted identifiers and raw income. The app does not decide grants or rank named applicants.</w:t>
       </w:r>
     </w:p>
     <w:p>
@@ -14311,7 +16347,7 @@
           <w:sz w:val="16"/>
           <w:szCs w:val="16"/>
         </w:rPr>
-        <w:t xml:space="preserve">[21] Statistics South Africa, Living Conditions Survey 2014/2015: Metadata, Statistical Release P0310. Pretoria, South Africa, 2017, ISBN 978-0-621-45185-6. Archived project copy, inspected Oct. 21, 2026. [Online]. Available: https://github.com/Oluhle1/Research-Project/blob/110d84161ffb4ca1821c2c76318a6a13b27e2643/Dataset/metadata/Living%20Conditions%20Survey%20Metadata.pdf</w:t>
+        <w:t xml:space="preserve">[21] Statistics South Africa, Living Conditions Survey 2014/2015: Metadata, Statistical Release P0310. Pretoria, South Africa, 2017, ISBN 978-0-621-45185-6. DataFirst catalogue record: https://www.datafirst.uct.ac.za/dataportal/index.php/catalog/608.</w:t>
       </w:r>
     </w:p>
     <w:p>
@@ -14327,7 +16363,7 @@
           <w:sz w:val="16"/>
           <w:szCs w:val="16"/>
         </w:rPr>
-        <w:t xml:space="preserve">[22] Statistics South Africa, “Coicop codes,” supporting documentation for the Living Conditions Survey 2014/2015, n.d. Archived project copy, inspected Oct. 21, 2026. [Online]. Available: https://github.com/Oluhle1/Research-Project/blob/110d84161ffb4ca1821c2c76318a6a13b27e2643/Dataset/metadata/Living%20Conditions%20Survey%20Coicopcodes.pdf</w:t>
+        <w:t xml:space="preserve">[22] Statistics South Africa, “Coicop codes,” supporting documentation for the Living Conditions Survey 2014/2015, n.d.</w:t>
       </w:r>
     </w:p>
     <w:p>
@@ -14343,7 +16379,7 @@
           <w:sz w:val="16"/>
           <w:szCs w:val="16"/>
         </w:rPr>
-        <w:t xml:space="preserve">[23] Statistics South Africa, Living Conditions Survey 2014/15: Household Questionnaire, n.d. Archived project copy, inspected Oct. 21, 2026. [Online]. Available: https://github.com/Oluhle1/Research-Project/blob/110d84161ffb4ca1821c2c76318a6a13b27e2643/Dataset/metadata/Living%20Conditions%20Survey%20Questionnaire.pdf</w:t>
+        <w:t xml:space="preserve">[23] Statistics South Africa, Living Conditions Survey 2014/15: Household Questionnaire, n.d.</w:t>
       </w:r>
     </w:p>
     <w:p>

</xml_diff>

<commit_message>
Document supplied DataFirst public-access release and dataset citation
Update only the ethics/access paragraph and related references with the author-supplied catalogue evidence for anonymised public version 1.1, its release date and DOI. Keep metadata and dataset citations distinct, preserve all other manuscript text/results and existing reference numbers, and refresh the eight-page Word/PDF delivery and scoped evidence records.
</commit_message>
<xml_diff>
--- a/paper/Jawe_OPG_nonreceipt_KZN.docx
+++ b/paper/Jawe_OPG_nonreceipt_KZN.docx
@@ -15548,7 +15548,7 @@
           <w:sz w:val="20"/>
           <w:szCs w:val="20"/>
         </w:rPr>
-        <w:t xml:space="preserve">The study used existing anonymised Stats SA LCS 2014/2015 data obtained through DataFirst [21]. The supervisor advised that formal ethical clearance was not required because the study involved no direct participation by human subjects or primary data collection. Stats SA is acknowledged as the data producer; the analyses result from the author's own processing. Applicable data-use and confidentiality conditions remain binding. Permission to redistribute survey files or all historical repository contents remains unconfirmed. Public demonstrations use synthetic records; downloadable packages exclude survey microdata, and reports omit submitted identifiers and raw income. The app does not decide grants or rank named applicants.</w:t>
+        <w:t xml:space="preserve">The study analysed anonymised LCS 2014/2015 secondary data from Stats SA via DataFirst [29]. The catalogue describes version 1.1 (18 September 2017) as edited, anonymised data for public distribution with public access. The supervisor advised that formal ethical clearance was not required: this study involved no direct human participation or primary data collection. Stats SA produced the data; analyses are the author's own. Data-use and confidentiality conditions apply. Public access does not clear every historical repository file. Demonstrations use synthetic records; downloadable packages exclude survey microdata. Reports omit submitted identifiers and raw income. The app does not decide grants or rank named applicants.</w:t>
       </w:r>
     </w:p>
     <w:p>
@@ -16347,7 +16347,7 @@
           <w:sz w:val="16"/>
           <w:szCs w:val="16"/>
         </w:rPr>
-        <w:t xml:space="preserve">[21] Statistics South Africa, Living Conditions Survey 2014/2015: Metadata, Statistical Release P0310. Pretoria, South Africa, 2017, ISBN 978-0-621-45185-6. DataFirst catalogue record: https://www.datafirst.uct.ac.za/dataportal/index.php/catalog/608.</w:t>
+        <w:t xml:space="preserve">[21] Statistics South Africa, Living Conditions Survey 2014/2015: Metadata, Statistical Release P0310. Pretoria, South Africa, 2017, ISBN 978-0-621-45185-6.</w:t>
       </w:r>
     </w:p>
     <w:p>
@@ -16460,6 +16460,22 @@
           <w:szCs w:val="16"/>
         </w:rPr>
         <w:t xml:space="preserve">[28] Dept. of Social Development, “Amendment: Social Assistance Regulations,” Government Notice R621, Government Gazette 39007, Jul. 21, 2015.</w:t>
+      </w:r>
+    </w:p>
+    <w:p>
+      <w:pPr>
+        <w:keepLines/>
+        <w:spacing w:after="0" w:before="0" w:line="240" w:lineRule="auto"/>
+        <w:ind w:left="260" w:hanging="260"/>
+        <w:jc w:val="left"/>
+      </w:pPr>
+      <w:r>
+        <w:rPr>
+          <w:rFonts w:ascii="Times New Roman" w:cs="Times New Roman" w:eastAsia="Times New Roman" w:hAnsi="Times New Roman"/>
+          <w:sz w:val="16"/>
+          <w:szCs w:val="16"/>
+        </w:rPr>
+        <w:t xml:space="preserve">[29] Statistics South Africa, Living Conditions Survey 2014–2015, ver. 1.1 [dataset]. Pretoria, South Africa: Statistics South Africa, producer; Cape Town, South Africa: DataFirst, distributor, 2017, doi: 10.25828/9229-xz60.</w:t>
       </w:r>
     </w:p>
     <w:p>

</xml_diff>

<commit_message>
Address remaining second supervisor feedback within paper scope
Separate weighted and unweighted Table V statistics with grouped headers, recheck historical legal and survey anchors, clarify exploratory coding and internal validation limits, and state the principal workflow contribution. Preserve already-addressed material, scientific results and the eight-page IEEE layout. Record fresh publisher/thesis requests as blocked rather than verified, and refresh delivery and scoped audit files.
</commit_message>
<xml_diff>
--- a/paper/Jawe_OPG_nonreceipt_KZN.docx
+++ b/paper/Jawe_OPG_nonreceipt_KZN.docx
@@ -3593,7 +3593,7 @@
           <w:sz w:val="20"/>
           <w:szCs w:val="20"/>
         </w:rPr>
-        <w:t xml:space="preserve">The screen summed already annualised, nominal person-income amounts, excluding social-assistance income. It did not allocate household income. A missing applicant or linked-spouse amount remained unresolved unless the no-income response and absent schedule supported zero. Assets, deemed income and permitted deductions were outside this research proxy.</w:t>
+        <w:t xml:space="preserve">The screen summed released annualised nominal person income (metadata, p. 182) [21], excluding social assistance without allocating household totals. Zero required Q1.17(14)'s no-income response [23] and an absent schedule; missing applicant/spouse amounts otherwise remained unresolved. The proxy omits assets, deemed income and deductions.</w:t>
       </w:r>
     </w:p>
     <w:p>
@@ -3608,7 +3608,7 @@
           <w:sz w:val="20"/>
           <w:szCs w:val="20"/>
         </w:rPr>
-        <w:t xml:space="preserve">GN 211 set the standard monthly maximum at R1,350 from 1 April 2014 [24]; GN 277 raised it to R1,410 from 1 April 2015 [25]. Government Notice R211, a separate amendment in the same gazette, substituted D = 1.6A − 0.4B from 1 April 2014 in Schedule paragraph 2 [26]. With annual standard maximum A and minimum D = R1,200 (Annexure A(5)) [27], B = (1.6A − 1,200)/0.4. This yields annual single/couple research ceilings of R61,800/R123,600 for October 2014–March 2015 and R64,680/R129,360 for April–October 2015. Half-joint income doubles couple limits; equality passed. The screen applied these boundaries to its private-income proxy. Both notices add R20 for age 75+; the primary screen retained the standard maximum across ages, while S1c tested the supplement. S1 also tested period and payment-boundary alternatives.</w:t>
+        <w:t xml:space="preserve">GN 211 set the standard maximum at R1,350 monthly from 1 April 2014 [24]; GN 277 raised it to R1,410 from 1 April 2015 [25]. GN R211 amended Annexure A(2) to D = 1.6A − 0.4B from 1 April 2014 [26]. With annual maximum A and minimum D = R1,200 (R100 monthly; Annexure A(5)) [27], B = (1.6A − 1,200)/0.4 gives annual single/couple research ceilings of R61,800/R123,600 for October 2014–March 2015 and R64,680/R129,360 for April–October 2015. Half-joint income doubles couple boundaries; equality passed. Standard rates applied at all ages; S1c tested both notices' R20 age-75+ supplement, and S1 tested period/payment boundaries.</w:t>
       </w:r>
     </w:p>
     <w:p>
@@ -3623,7 +3623,7 @@
           <w:sz w:val="20"/>
           <w:szCs w:val="20"/>
         </w:rPr>
-        <w:t xml:space="preserve">The 2008 regulations define spouses (regulation 1), include spouse income regardless of property regime (18(2)) and use half-joint annual income (19(1)). They allow Agency-approved exclusion after continuous desertion for at least three months and unwillingness to support (18(3)) [27]. The July 2015 amendment left these OPG means provisions unchanged [28]. Survey responses established neither legal spouse status nor desertion conditions. Never-married, widowed and divorced adults used single ceilings. For married adults, research rules required resolved applicant/spouse incomes and reciprocal pointers linking a resident spouse; sums applied regardless of spouse age. Nonresident spouse income was unavailable; separated respondents lacked spouse details [23]. Cohabitation, unspecified status and missing/inconsistent links remained unresolved, without assumed single status or zero partner income. S2 tested alternatives.</w:t>
+        <w:t xml:space="preserve">Regulation 1 defines recognised spouses; regulations 18(2) and 19(1) require spouse income regardless of property regime and use half-joint annual income. Regulation 18(3) allows Agency-approved exclusion after at least three continuous months of desertion and unwillingness to support [27]. The July 2015 amendment left these provisions unchanged [28]. Survey responses established neither legal spouse status nor desertion approval. Never-married, widowed and divorced adults used single ceilings. Conservative research rules required resolved applicant/spouse incomes and resident, reciprocal spouse pointers for married adults, summing both incomes regardless of spouse age. Nonresident income was unavailable; separated respondents skipped spouse details [23]. Cohabitation, unspecified status and missing/inconsistent links remained unresolved without assumed single status or zero partner income. S2 tested alternatives.</w:t>
       </w:r>
     </w:p>
     <w:p>
@@ -3638,7 +3638,7 @@
           <w:sz w:val="20"/>
           <w:szCs w:val="20"/>
         </w:rPr>
-        <w:t xml:space="preserve">An adult's reported disability or war-veterans grant caused FAIL. Caregiver child grants and grant-in-aid neither excluded the adult nor defined OPG receipt. A known failure took priority over unresolved information; the screen retained all reasons.</w:t>
+        <w:t xml:space="preserve">Own disability/war-veterans receipt caused FAIL (regulation 2(c)); regulation 5 permits grant-in-aid [27]. Grant-in-aid and caregiver child grants neither excluded adults nor defined OPG receipt (Q4.1b) [23]. A known failure overrode unresolved information; all reasons were retained.</w:t>
       </w:r>
     </w:p>
     <w:p>
@@ -3653,7 +3653,7 @@
           <w:sz w:val="20"/>
           <w:szCs w:val="20"/>
         </w:rPr>
-        <w:t xml:space="preserve">For adults who passed, the software interpreted general-grant and OPG answers together, including structural skips (questions omitted because earlier answers make them inapplicable). A consistent “no grant” answer can establish non-receipt when the OPG follow-up does not apply. Contradictory or unexplained answers remain unresolved and exclude the person from modelling. The analysis flagged disagreements between current receipt and preceding-year OPG income without changing the outcome because the periods differ. Rule version opg-kzn-primary-v1 records these decisions. The denominator contains adults who pass and have a clear receipt answer.</w:t>
+        <w:t xml:space="preserve">Among PASS adults, general-grant and OPG answers were interpreted with structural skips [23]. Consistent “no grant” with an inapplicable OPG follow-up established non-receipt; contradictory/unexplained answers remained unresolved and outside modelling. Current-receipt/prior-year OPG-income disagreements were flagged without overriding outcomes because periods differ. Rule opg-kzn-primary-v1 records these decisions; the denominator requires PASS and resolved receipt.</w:t>
       </w:r>
     </w:p>
     <w:p>
@@ -3765,7 +3765,7 @@
           <w:sz w:val="20"/>
           <w:szCs w:val="20"/>
         </w:rPr>
-        <w:t xml:space="preserve">Rural formal settlement had 31 adults and one non-recipient. One seven-slope training fold contained 30 rural-formal adults and no event; its coefficient was about −21.88 and did not converge. Four of five folds converged. Decision D-052 combined rural formal with traditional settlement after examining this outcome pattern, without repeating that choice inside each training fold. The primary ordinary merged model is therefore retained as an exploratory reference. Its coefficients and performance are conditional on D-052; household-held-out testing does not validate the complete model-selection process and may be optimistic. Supplementary Table S2 retains the failed attempt as a diagnostic. Ridge regression compared both codings on the same household folds. Five inner household folds selected C by mean Brier score with training-only imputation and scaling; all ten outer fits chose C = 0.1 and converged. AUC was 0.756 for merged and 0.750 for separate coding. This comparison cannot remove outcome-informed selection or establish equivalence or superiority of either coding. Income, receipt, derived labels and marital status do not enter the primary model.</w:t>
+        <w:t xml:space="preserve">Rural formal settlement had 31 adults and one non-recipient. One seven-slope training fold contained 30 rural-formal adults and no event; its coefficient was about −21.88 and did not converge. Four of five folds converged. D-052 then merged rural formal with traditional settlement after observing this pattern, outside the training folds. The primary ordinary merged model remains exploratory; its coefficients and performance are conditional on D-052 and may be optimistic. Household hold-out does not validate the complete selection process. Confirmatory work should prespecify coding or select it within each outer training set. Supplementary Table S2 retains the failed attempt and compares ridge codings on the same household folds. Five inner household folds selected C by mean Brier score with training-only imputation and scaling; all ten outer fits converged with C = 0.1. AUC was 0.756 for merged and 0.750 for separate coding. These comparisons cannot remove outcome-informed selection or establish equivalence or superiority. Income, receipt, derived labels and marital status do not enter the primary model.</w:t>
       </w:r>
     </w:p>
     <w:p>
@@ -3780,7 +3780,7 @@
           <w:sz w:val="20"/>
           <w:szCs w:val="20"/>
         </w:rPr>
-        <w:t xml:space="preserve">Validation used five household-grouped folds. Sorted households were labelled by whether any member reported non-receipt, then stratified so every adult from a household stayed in one fold. Seed 201415 fixes this division. The 1,013 adults come from 827 households: 182 contain more than one modelled adult, and 6 contain both receipt and non-receipt. Each adult received one out-of-fold (OOF) probability from a model trained without that household. The intercept-only reference uses the training group's non-receipt rate.</w:t>
+        <w:t xml:space="preserve">Validation used five household-grouped folds. Sorted households were labelled by whether any member reported non-receipt, then stratified so every adult from a household stayed in one fold. Seed 201415 fixes this division. The 1,013 adults come from 827 households: 182 contain more than one modelled adult, and 6 contain both receipt and non-receipt. Each adult received one out-of-fold (OOF) probability from a model trained without that household. The intercept-only reference uses the training group's non-receipt rate. These internal estimates do not establish performance in independent populations or survey periods.</w:t>
       </w:r>
     </w:p>
     <w:p>
@@ -5283,9 +5283,11 @@
         <w:tblLayout w:type="fixed"/>
       </w:tblPr>
       <w:tblGrid>
-        <w:gridCol w:w="1640"/>
-        <w:gridCol w:w="1700"/>
-        <w:gridCol w:w="1700"/>
+        <w:gridCol w:w="1320"/>
+        <w:gridCol w:w="1020"/>
+        <w:gridCol w:w="840"/>
+        <w:gridCol w:w="1020"/>
+        <w:gridCol w:w="840"/>
       </w:tblGrid>
       <w:tr>
         <w:trPr>
@@ -5294,26 +5296,27 @@
         </w:trPr>
         <w:tc>
           <w:tcPr>
-            <w:tcW w:type="dxa" w:w="1640"/>
-            <w:tcBorders>
-              <w:top w:val="single" w:color="808080" w:sz="4"/>
-              <w:left w:val="single" w:color="808080" w:sz="4"/>
-              <w:bottom w:val="single" w:color="808080" w:sz="4"/>
-              <w:right w:val="single" w:color="808080" w:sz="4"/>
-            </w:tcBorders>
-            <w:tcMar>
-              <w:top w:type="dxa" w:w="40"/>
-              <w:left w:type="dxa" w:w="45"/>
-              <w:bottom w:type="dxa" w:w="40"/>
-              <w:right w:type="dxa" w:w="45"/>
-            </w:tcMar>
-            <w:vAlign w:val="center"/>
-          </w:tcPr>
-          <w:p>
-            <w:pPr>
-              <w:keepNext/>
-              <w:spacing w:after="0" w:before="0" w:line="240" w:lineRule="auto"/>
-              <w:jc w:val="left"/>
+            <w:tcW w:type="dxa" w:w="1320"/>
+            <w:gridSpan w:val="1"/>
+            <w:tcBorders>
+              <w:top w:val="single" w:color="808080" w:sz="4"/>
+              <w:left w:val="single" w:color="808080" w:sz="4"/>
+              <w:bottom w:val="single" w:color="808080" w:sz="4"/>
+              <w:right w:val="single" w:color="808080" w:sz="4"/>
+            </w:tcBorders>
+            <w:tcMar>
+              <w:top w:type="dxa" w:w="10"/>
+              <w:left w:type="dxa" w:w="45"/>
+              <w:bottom w:type="dxa" w:w="10"/>
+              <w:right w:type="dxa" w:w="45"/>
+            </w:tcMar>
+            <w:vAlign w:val="center"/>
+          </w:tcPr>
+          <w:p>
+            <w:pPr>
+              <w:keepNext/>
+              <w:spacing w:after="0" w:before="0" w:line="240" w:lineRule="auto"/>
+              <w:jc w:val="center"/>
               <w:rPr>
                 <w:b/>
                 <w:bCs/>
@@ -5329,32 +5332,33 @@
                 <w:sz w:val="18"/>
                 <w:szCs w:val="18"/>
               </w:rPr>
-              <w:t xml:space="preserve">Characteristic</w:t>
-            </w:r>
-          </w:p>
-        </w:tc>
-        <w:tc>
-          <w:tcPr>
-            <w:tcW w:type="dxa" w:w="1700"/>
-            <w:tcBorders>
-              <w:top w:val="single" w:color="808080" w:sz="4"/>
-              <w:left w:val="single" w:color="808080" w:sz="4"/>
-              <w:bottom w:val="single" w:color="808080" w:sz="4"/>
-              <w:right w:val="single" w:color="808080" w:sz="4"/>
-            </w:tcBorders>
-            <w:tcMar>
-              <w:top w:type="dxa" w:w="40"/>
-              <w:left w:type="dxa" w:w="45"/>
-              <w:bottom w:type="dxa" w:w="40"/>
-              <w:right w:type="dxa" w:w="45"/>
-            </w:tcMar>
-            <w:vAlign w:val="center"/>
-          </w:tcPr>
-          <w:p>
-            <w:pPr>
-              <w:keepNext/>
-              <w:spacing w:after="0" w:before="0" w:line="240" w:lineRule="auto"/>
-              <w:jc w:val="left"/>
+              <w:t xml:space="preserve"/>
+            </w:r>
+          </w:p>
+        </w:tc>
+        <w:tc>
+          <w:tcPr>
+            <w:tcW w:type="dxa" w:w="1860"/>
+            <w:gridSpan w:val="2"/>
+            <w:tcBorders>
+              <w:top w:val="single" w:color="808080" w:sz="4"/>
+              <w:left w:val="single" w:color="808080" w:sz="4"/>
+              <w:bottom w:val="single" w:color="808080" w:sz="4"/>
+              <w:right w:val="single" w:color="808080" w:sz="4"/>
+            </w:tcBorders>
+            <w:tcMar>
+              <w:top w:type="dxa" w:w="10"/>
+              <w:left w:type="dxa" w:w="45"/>
+              <w:bottom w:type="dxa" w:w="10"/>
+              <w:right w:type="dxa" w:w="45"/>
+            </w:tcMar>
+            <w:vAlign w:val="center"/>
+          </w:tcPr>
+          <w:p>
+            <w:pPr>
+              <w:keepNext/>
+              <w:spacing w:after="0" w:before="0" w:line="240" w:lineRule="auto"/>
+              <w:jc w:val="center"/>
               <w:rPr>
                 <w:b/>
                 <w:bCs/>
@@ -5370,32 +5374,14 @@
                 <w:sz w:val="18"/>
                 <w:szCs w:val="18"/>
               </w:rPr>
-              <w:t xml:space="preserve">Recipients, N = 946</w:t>
-            </w:r>
-          </w:p>
-        </w:tc>
-        <w:tc>
-          <w:tcPr>
-            <w:tcW w:type="dxa" w:w="1700"/>
-            <w:tcBorders>
-              <w:top w:val="single" w:color="808080" w:sz="4"/>
-              <w:left w:val="single" w:color="808080" w:sz="4"/>
-              <w:bottom w:val="single" w:color="808080" w:sz="4"/>
-              <w:right w:val="single" w:color="808080" w:sz="4"/>
-            </w:tcBorders>
-            <w:tcMar>
-              <w:top w:type="dxa" w:w="40"/>
-              <w:left w:type="dxa" w:w="45"/>
-              <w:bottom w:type="dxa" w:w="40"/>
-              <w:right w:type="dxa" w:w="45"/>
-            </w:tcMar>
-            <w:vAlign w:val="center"/>
-          </w:tcPr>
-          <w:p>
-            <w:pPr>
-              <w:keepNext/>
-              <w:spacing w:after="0" w:before="0" w:line="240" w:lineRule="auto"/>
-              <w:jc w:val="left"/>
+              <w:t xml:space="preserve">Recipients</w:t>
+            </w:r>
+          </w:p>
+          <w:p>
+            <w:pPr>
+              <w:keepNext/>
+              <w:spacing w:after="0" w:before="0" w:line="240" w:lineRule="auto"/>
+              <w:jc w:val="center"/>
               <w:rPr>
                 <w:b/>
                 <w:bCs/>
@@ -5411,7 +5397,72 @@
                 <w:sz w:val="18"/>
                 <w:szCs w:val="18"/>
               </w:rPr>
-              <w:t xml:space="preserve">Non-recipients, N = 67</w:t>
+              <w:t xml:space="preserve">N = 946</w:t>
+            </w:r>
+          </w:p>
+        </w:tc>
+        <w:tc>
+          <w:tcPr>
+            <w:tcW w:type="dxa" w:w="1860"/>
+            <w:gridSpan w:val="2"/>
+            <w:tcBorders>
+              <w:top w:val="single" w:color="808080" w:sz="4"/>
+              <w:left w:val="single" w:color="808080" w:sz="4"/>
+              <w:bottom w:val="single" w:color="808080" w:sz="4"/>
+              <w:right w:val="single" w:color="808080" w:sz="4"/>
+            </w:tcBorders>
+            <w:tcMar>
+              <w:top w:type="dxa" w:w="10"/>
+              <w:left w:type="dxa" w:w="45"/>
+              <w:bottom w:type="dxa" w:w="10"/>
+              <w:right w:type="dxa" w:w="45"/>
+            </w:tcMar>
+            <w:vAlign w:val="center"/>
+          </w:tcPr>
+          <w:p>
+            <w:pPr>
+              <w:keepNext/>
+              <w:spacing w:after="0" w:before="0" w:line="240" w:lineRule="auto"/>
+              <w:jc w:val="center"/>
+              <w:rPr>
+                <w:b/>
+                <w:bCs/>
+                <w:sz w:val="18"/>
+                <w:szCs w:val="18"/>
+              </w:rPr>
+            </w:pPr>
+            <w:r>
+              <w:rPr>
+                <w:rFonts w:ascii="Times New Roman" w:cs="Times New Roman" w:eastAsia="Times New Roman" w:hAnsi="Times New Roman"/>
+                <w:b/>
+                <w:bCs/>
+                <w:sz w:val="18"/>
+                <w:szCs w:val="18"/>
+              </w:rPr>
+              <w:t xml:space="preserve">Non-recipients</w:t>
+            </w:r>
+          </w:p>
+          <w:p>
+            <w:pPr>
+              <w:keepNext/>
+              <w:spacing w:after="0" w:before="0" w:line="240" w:lineRule="auto"/>
+              <w:jc w:val="center"/>
+              <w:rPr>
+                <w:b/>
+                <w:bCs/>
+                <w:sz w:val="18"/>
+                <w:szCs w:val="18"/>
+              </w:rPr>
+            </w:pPr>
+            <w:r>
+              <w:rPr>
+                <w:rFonts w:ascii="Times New Roman" w:cs="Times New Roman" w:eastAsia="Times New Roman" w:hAnsi="Times New Roman"/>
+                <w:b/>
+                <w:bCs/>
+                <w:sz w:val="18"/>
+                <w:szCs w:val="18"/>
+              </w:rPr>
+              <w:t xml:space="preserve">N = 67</w:t>
             </w:r>
           </w:p>
         </w:tc>
@@ -5419,21 +5470,22 @@
       <w:tr>
         <w:trPr>
           <w:cantSplit/>
-          <w:tblHeader w:val="false"/>
+          <w:tblHeader/>
         </w:trPr>
         <w:tc>
           <w:tcPr>
-            <w:tcW w:type="dxa" w:w="1640"/>
-            <w:tcBorders>
-              <w:top w:val="single" w:color="808080" w:sz="4"/>
-              <w:left w:val="single" w:color="808080" w:sz="4"/>
-              <w:bottom w:val="single" w:color="808080" w:sz="4"/>
-              <w:right w:val="single" w:color="808080" w:sz="4"/>
-            </w:tcBorders>
-            <w:tcMar>
-              <w:top w:type="dxa" w:w="40"/>
-              <w:left w:type="dxa" w:w="45"/>
-              <w:bottom w:type="dxa" w:w="40"/>
+            <w:tcW w:type="dxa" w:w="1320"/>
+            <w:gridSpan w:val="1"/>
+            <w:tcBorders>
+              <w:top w:val="single" w:color="808080" w:sz="4"/>
+              <w:left w:val="single" w:color="808080" w:sz="4"/>
+              <w:bottom w:val="single" w:color="808080" w:sz="4"/>
+              <w:right w:val="single" w:color="808080" w:sz="4"/>
+            </w:tcBorders>
+            <w:tcMar>
+              <w:top w:type="dxa" w:w="10"/>
+              <w:left w:type="dxa" w:w="45"/>
+              <w:bottom w:type="dxa" w:w="10"/>
               <w:right w:type="dxa" w:w="45"/>
             </w:tcMar>
             <w:vAlign w:val="center"/>
@@ -5444,103 +5496,189 @@
               <w:spacing w:after="0" w:before="0" w:line="240" w:lineRule="auto"/>
               <w:jc w:val="left"/>
               <w:rPr>
-                <w:b w:val="false"/>
-                <w:bCs w:val="false"/>
-                <w:sz w:val="18"/>
-                <w:szCs w:val="18"/>
-              </w:rPr>
-            </w:pPr>
-            <w:r>
-              <w:rPr>
-                <w:rFonts w:ascii="Times New Roman" w:cs="Times New Roman" w:eastAsia="Times New Roman" w:hAnsi="Times New Roman"/>
-                <w:b w:val="false"/>
-                <w:bCs w:val="false"/>
-                <w:sz w:val="18"/>
-                <w:szCs w:val="18"/>
-              </w:rPr>
-              <w:t xml:space="preserve">Age, mean years</w:t>
-            </w:r>
-          </w:p>
-        </w:tc>
-        <w:tc>
-          <w:tcPr>
-            <w:tcW w:type="dxa" w:w="1700"/>
-            <w:tcBorders>
-              <w:top w:val="single" w:color="808080" w:sz="4"/>
-              <w:left w:val="single" w:color="808080" w:sz="4"/>
-              <w:bottom w:val="single" w:color="808080" w:sz="4"/>
-              <w:right w:val="single" w:color="808080" w:sz="4"/>
-            </w:tcBorders>
-            <w:tcMar>
-              <w:top w:type="dxa" w:w="40"/>
-              <w:left w:type="dxa" w:w="45"/>
-              <w:bottom w:type="dxa" w:w="40"/>
-              <w:right w:type="dxa" w:w="45"/>
-            </w:tcMar>
-            <w:vAlign w:val="center"/>
-          </w:tcPr>
-          <w:p>
-            <w:pPr>
-              <w:keepNext/>
-              <w:spacing w:after="0" w:before="0" w:line="240" w:lineRule="auto"/>
-              <w:jc w:val="left"/>
-              <w:rPr>
-                <w:b w:val="false"/>
-                <w:bCs w:val="false"/>
-                <w:sz w:val="18"/>
-                <w:szCs w:val="18"/>
-              </w:rPr>
-            </w:pPr>
-            <w:r>
-              <w:rPr>
-                <w:rFonts w:ascii="Times New Roman" w:cs="Times New Roman" w:eastAsia="Times New Roman" w:hAnsi="Times New Roman"/>
-                <w:b w:val="false"/>
-                <w:bCs w:val="false"/>
-                <w:sz w:val="18"/>
-                <w:szCs w:val="18"/>
-              </w:rPr>
-              <w:t xml:space="preserve">70.4 unw.; 69.8 wtd</w:t>
-            </w:r>
-          </w:p>
-        </w:tc>
-        <w:tc>
-          <w:tcPr>
-            <w:tcW w:type="dxa" w:w="1700"/>
-            <w:tcBorders>
-              <w:top w:val="single" w:color="808080" w:sz="4"/>
-              <w:left w:val="single" w:color="808080" w:sz="4"/>
-              <w:bottom w:val="single" w:color="808080" w:sz="4"/>
-              <w:right w:val="single" w:color="808080" w:sz="4"/>
-            </w:tcBorders>
-            <w:tcMar>
-              <w:top w:type="dxa" w:w="40"/>
-              <w:left w:type="dxa" w:w="45"/>
-              <w:bottom w:type="dxa" w:w="40"/>
-              <w:right w:type="dxa" w:w="45"/>
-            </w:tcMar>
-            <w:vAlign w:val="center"/>
-          </w:tcPr>
-          <w:p>
-            <w:pPr>
-              <w:keepNext/>
-              <w:spacing w:after="0" w:before="0" w:line="240" w:lineRule="auto"/>
-              <w:jc w:val="left"/>
-              <w:rPr>
-                <w:b w:val="false"/>
-                <w:bCs w:val="false"/>
-                <w:sz w:val="18"/>
-                <w:szCs w:val="18"/>
-              </w:rPr>
-            </w:pPr>
-            <w:r>
-              <w:rPr>
-                <w:rFonts w:ascii="Times New Roman" w:cs="Times New Roman" w:eastAsia="Times New Roman" w:hAnsi="Times New Roman"/>
-                <w:b w:val="false"/>
-                <w:bCs w:val="false"/>
-                <w:sz w:val="18"/>
-                <w:szCs w:val="18"/>
-              </w:rPr>
-              <w:t xml:space="preserve">67.3 unw.; 68.4 wtd</w:t>
+                <w:b/>
+                <w:bCs/>
+                <w:sz w:val="18"/>
+                <w:szCs w:val="18"/>
+              </w:rPr>
+            </w:pPr>
+            <w:r>
+              <w:rPr>
+                <w:rFonts w:ascii="Times New Roman" w:cs="Times New Roman" w:eastAsia="Times New Roman" w:hAnsi="Times New Roman"/>
+                <w:b/>
+                <w:bCs/>
+                <w:sz w:val="18"/>
+                <w:szCs w:val="18"/>
+              </w:rPr>
+              <w:t xml:space="preserve">Characteristic</w:t>
+            </w:r>
+          </w:p>
+        </w:tc>
+        <w:tc>
+          <w:tcPr>
+            <w:tcW w:type="dxa" w:w="1020"/>
+            <w:gridSpan w:val="1"/>
+            <w:tcBorders>
+              <w:top w:val="single" w:color="808080" w:sz="4"/>
+              <w:left w:val="single" w:color="808080" w:sz="4"/>
+              <w:bottom w:val="single" w:color="808080" w:sz="4"/>
+              <w:right w:val="single" w:color="808080" w:sz="4"/>
+            </w:tcBorders>
+            <w:tcMar>
+              <w:top w:type="dxa" w:w="10"/>
+              <w:left w:type="dxa" w:w="45"/>
+              <w:bottom w:type="dxa" w:w="10"/>
+              <w:right w:type="dxa" w:w="45"/>
+            </w:tcMar>
+            <w:vAlign w:val="center"/>
+          </w:tcPr>
+          <w:p>
+            <w:pPr>
+              <w:keepNext/>
+              <w:spacing w:after="0" w:before="0" w:line="240" w:lineRule="auto"/>
+              <w:jc w:val="center"/>
+              <w:rPr>
+                <w:b/>
+                <w:bCs/>
+                <w:sz w:val="18"/>
+                <w:szCs w:val="18"/>
+              </w:rPr>
+            </w:pPr>
+            <w:r>
+              <w:rPr>
+                <w:rFonts w:ascii="Times New Roman" w:cs="Times New Roman" w:eastAsia="Times New Roman" w:hAnsi="Times New Roman"/>
+                <w:b/>
+                <w:bCs/>
+                <w:sz w:val="18"/>
+                <w:szCs w:val="18"/>
+              </w:rPr>
+              <w:t xml:space="preserve">Unweighted</w:t>
+            </w:r>
+          </w:p>
+        </w:tc>
+        <w:tc>
+          <w:tcPr>
+            <w:tcW w:type="dxa" w:w="840"/>
+            <w:gridSpan w:val="1"/>
+            <w:tcBorders>
+              <w:top w:val="single" w:color="808080" w:sz="4"/>
+              <w:left w:val="single" w:color="808080" w:sz="4"/>
+              <w:bottom w:val="single" w:color="808080" w:sz="4"/>
+              <w:right w:val="single" w:color="808080" w:sz="4"/>
+            </w:tcBorders>
+            <w:tcMar>
+              <w:top w:type="dxa" w:w="10"/>
+              <w:left w:type="dxa" w:w="45"/>
+              <w:bottom w:type="dxa" w:w="10"/>
+              <w:right w:type="dxa" w:w="45"/>
+            </w:tcMar>
+            <w:vAlign w:val="center"/>
+          </w:tcPr>
+          <w:p>
+            <w:pPr>
+              <w:keepNext/>
+              <w:spacing w:after="0" w:before="0" w:line="240" w:lineRule="auto"/>
+              <w:jc w:val="center"/>
+              <w:rPr>
+                <w:b/>
+                <w:bCs/>
+                <w:sz w:val="18"/>
+                <w:szCs w:val="18"/>
+              </w:rPr>
+            </w:pPr>
+            <w:r>
+              <w:rPr>
+                <w:rFonts w:ascii="Times New Roman" w:cs="Times New Roman" w:eastAsia="Times New Roman" w:hAnsi="Times New Roman"/>
+                <w:b/>
+                <w:bCs/>
+                <w:sz w:val="18"/>
+                <w:szCs w:val="18"/>
+              </w:rPr>
+              <w:t xml:space="preserve">Weighted</w:t>
+            </w:r>
+          </w:p>
+        </w:tc>
+        <w:tc>
+          <w:tcPr>
+            <w:tcW w:type="dxa" w:w="1020"/>
+            <w:gridSpan w:val="1"/>
+            <w:tcBorders>
+              <w:top w:val="single" w:color="808080" w:sz="4"/>
+              <w:left w:val="single" w:color="808080" w:sz="4"/>
+              <w:bottom w:val="single" w:color="808080" w:sz="4"/>
+              <w:right w:val="single" w:color="808080" w:sz="4"/>
+            </w:tcBorders>
+            <w:tcMar>
+              <w:top w:type="dxa" w:w="10"/>
+              <w:left w:type="dxa" w:w="45"/>
+              <w:bottom w:type="dxa" w:w="10"/>
+              <w:right w:type="dxa" w:w="45"/>
+            </w:tcMar>
+            <w:vAlign w:val="center"/>
+          </w:tcPr>
+          <w:p>
+            <w:pPr>
+              <w:keepNext/>
+              <w:spacing w:after="0" w:before="0" w:line="240" w:lineRule="auto"/>
+              <w:jc w:val="center"/>
+              <w:rPr>
+                <w:b/>
+                <w:bCs/>
+                <w:sz w:val="18"/>
+                <w:szCs w:val="18"/>
+              </w:rPr>
+            </w:pPr>
+            <w:r>
+              <w:rPr>
+                <w:rFonts w:ascii="Times New Roman" w:cs="Times New Roman" w:eastAsia="Times New Roman" w:hAnsi="Times New Roman"/>
+                <w:b/>
+                <w:bCs/>
+                <w:sz w:val="18"/>
+                <w:szCs w:val="18"/>
+              </w:rPr>
+              <w:t xml:space="preserve">Unweighted</w:t>
+            </w:r>
+          </w:p>
+        </w:tc>
+        <w:tc>
+          <w:tcPr>
+            <w:tcW w:type="dxa" w:w="840"/>
+            <w:gridSpan w:val="1"/>
+            <w:tcBorders>
+              <w:top w:val="single" w:color="808080" w:sz="4"/>
+              <w:left w:val="single" w:color="808080" w:sz="4"/>
+              <w:bottom w:val="single" w:color="808080" w:sz="4"/>
+              <w:right w:val="single" w:color="808080" w:sz="4"/>
+            </w:tcBorders>
+            <w:tcMar>
+              <w:top w:type="dxa" w:w="10"/>
+              <w:left w:type="dxa" w:w="45"/>
+              <w:bottom w:type="dxa" w:w="10"/>
+              <w:right w:type="dxa" w:w="45"/>
+            </w:tcMar>
+            <w:vAlign w:val="center"/>
+          </w:tcPr>
+          <w:p>
+            <w:pPr>
+              <w:keepNext/>
+              <w:spacing w:after="0" w:before="0" w:line="240" w:lineRule="auto"/>
+              <w:jc w:val="center"/>
+              <w:rPr>
+                <w:b/>
+                <w:bCs/>
+                <w:sz w:val="18"/>
+                <w:szCs w:val="18"/>
+              </w:rPr>
+            </w:pPr>
+            <w:r>
+              <w:rPr>
+                <w:rFonts w:ascii="Times New Roman" w:cs="Times New Roman" w:eastAsia="Times New Roman" w:hAnsi="Times New Roman"/>
+                <w:b/>
+                <w:bCs/>
+                <w:sz w:val="18"/>
+                <w:szCs w:val="18"/>
+              </w:rPr>
+              <w:t xml:space="preserve">Weighted</w:t>
             </w:r>
           </w:p>
         </w:tc>
@@ -5548,21 +5686,21 @@
       <w:tr>
         <w:trPr>
           <w:cantSplit/>
-          <w:tblHeader w:val="false"/>
         </w:trPr>
         <w:tc>
           <w:tcPr>
-            <w:tcW w:type="dxa" w:w="1640"/>
-            <w:tcBorders>
-              <w:top w:val="single" w:color="808080" w:sz="4"/>
-              <w:left w:val="single" w:color="808080" w:sz="4"/>
-              <w:bottom w:val="single" w:color="808080" w:sz="4"/>
-              <w:right w:val="single" w:color="808080" w:sz="4"/>
-            </w:tcBorders>
-            <w:tcMar>
-              <w:top w:type="dxa" w:w="40"/>
-              <w:left w:type="dxa" w:w="45"/>
-              <w:bottom w:type="dxa" w:w="40"/>
+            <w:tcW w:type="dxa" w:w="1320"/>
+            <w:gridSpan w:val="1"/>
+            <w:tcBorders>
+              <w:top w:val="single" w:color="808080" w:sz="4"/>
+              <w:left w:val="single" w:color="808080" w:sz="4"/>
+              <w:bottom w:val="single" w:color="808080" w:sz="4"/>
+              <w:right w:val="single" w:color="808080" w:sz="4"/>
+            </w:tcBorders>
+            <w:tcMar>
+              <w:top w:type="dxa" w:w="10"/>
+              <w:left w:type="dxa" w:w="45"/>
+              <w:bottom w:type="dxa" w:w="10"/>
               <w:right w:type="dxa" w:w="45"/>
             </w:tcMar>
             <w:vAlign w:val="center"/>
@@ -5587,89 +5725,175 @@
                 <w:sz w:val="18"/>
                 <w:szCs w:val="18"/>
               </w:rPr>
-              <w:t xml:space="preserve">Female</w:t>
-            </w:r>
-          </w:p>
-        </w:tc>
-        <w:tc>
-          <w:tcPr>
-            <w:tcW w:type="dxa" w:w="1700"/>
-            <w:tcBorders>
-              <w:top w:val="single" w:color="808080" w:sz="4"/>
-              <w:left w:val="single" w:color="808080" w:sz="4"/>
-              <w:bottom w:val="single" w:color="808080" w:sz="4"/>
-              <w:right w:val="single" w:color="808080" w:sz="4"/>
-            </w:tcBorders>
-            <w:tcMar>
-              <w:top w:type="dxa" w:w="40"/>
-              <w:left w:type="dxa" w:w="45"/>
-              <w:bottom w:type="dxa" w:w="40"/>
-              <w:right w:type="dxa" w:w="45"/>
-            </w:tcMar>
-            <w:vAlign w:val="center"/>
-          </w:tcPr>
-          <w:p>
-            <w:pPr>
-              <w:keepNext/>
-              <w:spacing w:after="0" w:before="0" w:line="240" w:lineRule="auto"/>
-              <w:jc w:val="left"/>
-              <w:rPr>
-                <w:b w:val="false"/>
-                <w:bCs w:val="false"/>
-                <w:sz w:val="18"/>
-                <w:szCs w:val="18"/>
-              </w:rPr>
-            </w:pPr>
-            <w:r>
-              <w:rPr>
-                <w:rFonts w:ascii="Times New Roman" w:cs="Times New Roman" w:eastAsia="Times New Roman" w:hAnsi="Times New Roman"/>
-                <w:b w:val="false"/>
-                <w:bCs w:val="false"/>
-                <w:sz w:val="18"/>
-                <w:szCs w:val="18"/>
-              </w:rPr>
-              <w:t xml:space="preserve">686 (72.5%) unw.; 70.4% wtd</w:t>
-            </w:r>
-          </w:p>
-        </w:tc>
-        <w:tc>
-          <w:tcPr>
-            <w:tcW w:type="dxa" w:w="1700"/>
-            <w:tcBorders>
-              <w:top w:val="single" w:color="808080" w:sz="4"/>
-              <w:left w:val="single" w:color="808080" w:sz="4"/>
-              <w:bottom w:val="single" w:color="808080" w:sz="4"/>
-              <w:right w:val="single" w:color="808080" w:sz="4"/>
-            </w:tcBorders>
-            <w:tcMar>
-              <w:top w:type="dxa" w:w="40"/>
-              <w:left w:type="dxa" w:w="45"/>
-              <w:bottom w:type="dxa" w:w="40"/>
-              <w:right w:type="dxa" w:w="45"/>
-            </w:tcMar>
-            <w:vAlign w:val="center"/>
-          </w:tcPr>
-          <w:p>
-            <w:pPr>
-              <w:keepNext/>
-              <w:spacing w:after="0" w:before="0" w:line="240" w:lineRule="auto"/>
-              <w:jc w:val="left"/>
-              <w:rPr>
-                <w:b w:val="false"/>
-                <w:bCs w:val="false"/>
-                <w:sz w:val="18"/>
-                <w:szCs w:val="18"/>
-              </w:rPr>
-            </w:pPr>
-            <w:r>
-              <w:rPr>
-                <w:rFonts w:ascii="Times New Roman" w:cs="Times New Roman" w:eastAsia="Times New Roman" w:hAnsi="Times New Roman"/>
-                <w:b w:val="false"/>
-                <w:bCs w:val="false"/>
-                <w:sz w:val="18"/>
-                <w:szCs w:val="18"/>
-              </w:rPr>
-              <w:t xml:space="preserve">33 (49.3%) unw.; 53.4% wtd</w:t>
+              <w:t xml:space="preserve">Age, mean years</w:t>
+            </w:r>
+          </w:p>
+        </w:tc>
+        <w:tc>
+          <w:tcPr>
+            <w:tcW w:type="dxa" w:w="1020"/>
+            <w:gridSpan w:val="1"/>
+            <w:tcBorders>
+              <w:top w:val="single" w:color="808080" w:sz="4"/>
+              <w:left w:val="single" w:color="808080" w:sz="4"/>
+              <w:bottom w:val="single" w:color="808080" w:sz="4"/>
+              <w:right w:val="single" w:color="808080" w:sz="4"/>
+            </w:tcBorders>
+            <w:tcMar>
+              <w:top w:type="dxa" w:w="10"/>
+              <w:left w:type="dxa" w:w="45"/>
+              <w:bottom w:type="dxa" w:w="10"/>
+              <w:right w:type="dxa" w:w="45"/>
+            </w:tcMar>
+            <w:vAlign w:val="center"/>
+          </w:tcPr>
+          <w:p>
+            <w:pPr>
+              <w:keepNext/>
+              <w:spacing w:after="0" w:before="0" w:line="240" w:lineRule="auto"/>
+              <w:jc w:val="center"/>
+              <w:rPr>
+                <w:b w:val="false"/>
+                <w:bCs w:val="false"/>
+                <w:sz w:val="18"/>
+                <w:szCs w:val="18"/>
+              </w:rPr>
+            </w:pPr>
+            <w:r>
+              <w:rPr>
+                <w:rFonts w:ascii="Times New Roman" w:cs="Times New Roman" w:eastAsia="Times New Roman" w:hAnsi="Times New Roman"/>
+                <w:b w:val="false"/>
+                <w:bCs w:val="false"/>
+                <w:sz w:val="18"/>
+                <w:szCs w:val="18"/>
+              </w:rPr>
+              <w:t xml:space="preserve">70.4</w:t>
+            </w:r>
+          </w:p>
+        </w:tc>
+        <w:tc>
+          <w:tcPr>
+            <w:tcW w:type="dxa" w:w="840"/>
+            <w:gridSpan w:val="1"/>
+            <w:tcBorders>
+              <w:top w:val="single" w:color="808080" w:sz="4"/>
+              <w:left w:val="single" w:color="808080" w:sz="4"/>
+              <w:bottom w:val="single" w:color="808080" w:sz="4"/>
+              <w:right w:val="single" w:color="808080" w:sz="4"/>
+            </w:tcBorders>
+            <w:tcMar>
+              <w:top w:type="dxa" w:w="10"/>
+              <w:left w:type="dxa" w:w="45"/>
+              <w:bottom w:type="dxa" w:w="10"/>
+              <w:right w:type="dxa" w:w="45"/>
+            </w:tcMar>
+            <w:vAlign w:val="center"/>
+          </w:tcPr>
+          <w:p>
+            <w:pPr>
+              <w:keepNext/>
+              <w:spacing w:after="0" w:before="0" w:line="240" w:lineRule="auto"/>
+              <w:jc w:val="center"/>
+              <w:rPr>
+                <w:b w:val="false"/>
+                <w:bCs w:val="false"/>
+                <w:sz w:val="18"/>
+                <w:szCs w:val="18"/>
+              </w:rPr>
+            </w:pPr>
+            <w:r>
+              <w:rPr>
+                <w:rFonts w:ascii="Times New Roman" w:cs="Times New Roman" w:eastAsia="Times New Roman" w:hAnsi="Times New Roman"/>
+                <w:b w:val="false"/>
+                <w:bCs w:val="false"/>
+                <w:sz w:val="18"/>
+                <w:szCs w:val="18"/>
+              </w:rPr>
+              <w:t xml:space="preserve">69.8</w:t>
+            </w:r>
+          </w:p>
+        </w:tc>
+        <w:tc>
+          <w:tcPr>
+            <w:tcW w:type="dxa" w:w="1020"/>
+            <w:gridSpan w:val="1"/>
+            <w:tcBorders>
+              <w:top w:val="single" w:color="808080" w:sz="4"/>
+              <w:left w:val="single" w:color="808080" w:sz="4"/>
+              <w:bottom w:val="single" w:color="808080" w:sz="4"/>
+              <w:right w:val="single" w:color="808080" w:sz="4"/>
+            </w:tcBorders>
+            <w:tcMar>
+              <w:top w:type="dxa" w:w="10"/>
+              <w:left w:type="dxa" w:w="45"/>
+              <w:bottom w:type="dxa" w:w="10"/>
+              <w:right w:type="dxa" w:w="45"/>
+            </w:tcMar>
+            <w:vAlign w:val="center"/>
+          </w:tcPr>
+          <w:p>
+            <w:pPr>
+              <w:keepNext/>
+              <w:spacing w:after="0" w:before="0" w:line="240" w:lineRule="auto"/>
+              <w:jc w:val="center"/>
+              <w:rPr>
+                <w:b w:val="false"/>
+                <w:bCs w:val="false"/>
+                <w:sz w:val="18"/>
+                <w:szCs w:val="18"/>
+              </w:rPr>
+            </w:pPr>
+            <w:r>
+              <w:rPr>
+                <w:rFonts w:ascii="Times New Roman" w:cs="Times New Roman" w:eastAsia="Times New Roman" w:hAnsi="Times New Roman"/>
+                <w:b w:val="false"/>
+                <w:bCs w:val="false"/>
+                <w:sz w:val="18"/>
+                <w:szCs w:val="18"/>
+              </w:rPr>
+              <w:t xml:space="preserve">67.3</w:t>
+            </w:r>
+          </w:p>
+        </w:tc>
+        <w:tc>
+          <w:tcPr>
+            <w:tcW w:type="dxa" w:w="840"/>
+            <w:gridSpan w:val="1"/>
+            <w:tcBorders>
+              <w:top w:val="single" w:color="808080" w:sz="4"/>
+              <w:left w:val="single" w:color="808080" w:sz="4"/>
+              <w:bottom w:val="single" w:color="808080" w:sz="4"/>
+              <w:right w:val="single" w:color="808080" w:sz="4"/>
+            </w:tcBorders>
+            <w:tcMar>
+              <w:top w:type="dxa" w:w="10"/>
+              <w:left w:type="dxa" w:w="45"/>
+              <w:bottom w:type="dxa" w:w="10"/>
+              <w:right w:type="dxa" w:w="45"/>
+            </w:tcMar>
+            <w:vAlign w:val="center"/>
+          </w:tcPr>
+          <w:p>
+            <w:pPr>
+              <w:keepNext/>
+              <w:spacing w:after="0" w:before="0" w:line="240" w:lineRule="auto"/>
+              <w:jc w:val="center"/>
+              <w:rPr>
+                <w:b w:val="false"/>
+                <w:bCs w:val="false"/>
+                <w:sz w:val="18"/>
+                <w:szCs w:val="18"/>
+              </w:rPr>
+            </w:pPr>
+            <w:r>
+              <w:rPr>
+                <w:rFonts w:ascii="Times New Roman" w:cs="Times New Roman" w:eastAsia="Times New Roman" w:hAnsi="Times New Roman"/>
+                <w:b w:val="false"/>
+                <w:bCs w:val="false"/>
+                <w:sz w:val="18"/>
+                <w:szCs w:val="18"/>
+              </w:rPr>
+              <w:t xml:space="preserve">68.4</w:t>
             </w:r>
           </w:p>
         </w:tc>
@@ -5677,21 +5901,21 @@
       <w:tr>
         <w:trPr>
           <w:cantSplit/>
-          <w:tblHeader w:val="false"/>
         </w:trPr>
         <w:tc>
           <w:tcPr>
-            <w:tcW w:type="dxa" w:w="1640"/>
-            <w:tcBorders>
-              <w:top w:val="single" w:color="808080" w:sz="4"/>
-              <w:left w:val="single" w:color="808080" w:sz="4"/>
-              <w:bottom w:val="single" w:color="808080" w:sz="4"/>
-              <w:right w:val="single" w:color="808080" w:sz="4"/>
-            </w:tcBorders>
-            <w:tcMar>
-              <w:top w:type="dxa" w:w="40"/>
-              <w:left w:type="dxa" w:w="45"/>
-              <w:bottom w:type="dxa" w:w="40"/>
+            <w:tcW w:type="dxa" w:w="1320"/>
+            <w:gridSpan w:val="1"/>
+            <w:tcBorders>
+              <w:top w:val="single" w:color="808080" w:sz="4"/>
+              <w:left w:val="single" w:color="808080" w:sz="4"/>
+              <w:bottom w:val="single" w:color="808080" w:sz="4"/>
+              <w:right w:val="single" w:color="808080" w:sz="4"/>
+            </w:tcBorders>
+            <w:tcMar>
+              <w:top w:type="dxa" w:w="10"/>
+              <w:left w:type="dxa" w:w="45"/>
+              <w:bottom w:type="dxa" w:w="10"/>
               <w:right w:type="dxa" w:w="45"/>
             </w:tcMar>
             <w:vAlign w:val="center"/>
@@ -5716,89 +5940,175 @@
                 <w:sz w:val="18"/>
                 <w:szCs w:val="18"/>
               </w:rPr>
-              <w:t xml:space="preserve">Grade 7 or above</w:t>
-            </w:r>
-          </w:p>
-        </w:tc>
-        <w:tc>
-          <w:tcPr>
-            <w:tcW w:type="dxa" w:w="1700"/>
-            <w:tcBorders>
-              <w:top w:val="single" w:color="808080" w:sz="4"/>
-              <w:left w:val="single" w:color="808080" w:sz="4"/>
-              <w:bottom w:val="single" w:color="808080" w:sz="4"/>
-              <w:right w:val="single" w:color="808080" w:sz="4"/>
-            </w:tcBorders>
-            <w:tcMar>
-              <w:top w:type="dxa" w:w="40"/>
-              <w:left w:type="dxa" w:w="45"/>
-              <w:bottom w:type="dxa" w:w="40"/>
-              <w:right w:type="dxa" w:w="45"/>
-            </w:tcMar>
-            <w:vAlign w:val="center"/>
-          </w:tcPr>
-          <w:p>
-            <w:pPr>
-              <w:keepNext/>
-              <w:spacing w:after="0" w:before="0" w:line="240" w:lineRule="auto"/>
-              <w:jc w:val="left"/>
-              <w:rPr>
-                <w:b w:val="false"/>
-                <w:bCs w:val="false"/>
-                <w:sz w:val="18"/>
-                <w:szCs w:val="18"/>
-              </w:rPr>
-            </w:pPr>
-            <w:r>
-              <w:rPr>
-                <w:rFonts w:ascii="Times New Roman" w:cs="Times New Roman" w:eastAsia="Times New Roman" w:hAnsi="Times New Roman"/>
-                <w:b w:val="false"/>
-                <w:bCs w:val="false"/>
-                <w:sz w:val="18"/>
-                <w:szCs w:val="18"/>
-              </w:rPr>
-              <w:t xml:space="preserve">290 (30.7%) unw.; 33.0% wtd</w:t>
-            </w:r>
-          </w:p>
-        </w:tc>
-        <w:tc>
-          <w:tcPr>
-            <w:tcW w:type="dxa" w:w="1700"/>
-            <w:tcBorders>
-              <w:top w:val="single" w:color="808080" w:sz="4"/>
-              <w:left w:val="single" w:color="808080" w:sz="4"/>
-              <w:bottom w:val="single" w:color="808080" w:sz="4"/>
-              <w:right w:val="single" w:color="808080" w:sz="4"/>
-            </w:tcBorders>
-            <w:tcMar>
-              <w:top w:type="dxa" w:w="40"/>
-              <w:left w:type="dxa" w:w="45"/>
-              <w:bottom w:type="dxa" w:w="40"/>
-              <w:right w:type="dxa" w:w="45"/>
-            </w:tcMar>
-            <w:vAlign w:val="center"/>
-          </w:tcPr>
-          <w:p>
-            <w:pPr>
-              <w:keepNext/>
-              <w:spacing w:after="0" w:before="0" w:line="240" w:lineRule="auto"/>
-              <w:jc w:val="left"/>
-              <w:rPr>
-                <w:b w:val="false"/>
-                <w:bCs w:val="false"/>
-                <w:sz w:val="18"/>
-                <w:szCs w:val="18"/>
-              </w:rPr>
-            </w:pPr>
-            <w:r>
-              <w:rPr>
-                <w:rFonts w:ascii="Times New Roman" w:cs="Times New Roman" w:eastAsia="Times New Roman" w:hAnsi="Times New Roman"/>
-                <w:b w:val="false"/>
-                <w:bCs w:val="false"/>
-                <w:sz w:val="18"/>
-                <w:szCs w:val="18"/>
-              </w:rPr>
-              <w:t xml:space="preserve">49 (73.1%) unw.; 80.8% wtd</w:t>
+              <w:t xml:space="preserve">Female</w:t>
+            </w:r>
+          </w:p>
+        </w:tc>
+        <w:tc>
+          <w:tcPr>
+            <w:tcW w:type="dxa" w:w="1020"/>
+            <w:gridSpan w:val="1"/>
+            <w:tcBorders>
+              <w:top w:val="single" w:color="808080" w:sz="4"/>
+              <w:left w:val="single" w:color="808080" w:sz="4"/>
+              <w:bottom w:val="single" w:color="808080" w:sz="4"/>
+              <w:right w:val="single" w:color="808080" w:sz="4"/>
+            </w:tcBorders>
+            <w:tcMar>
+              <w:top w:type="dxa" w:w="10"/>
+              <w:left w:type="dxa" w:w="45"/>
+              <w:bottom w:type="dxa" w:w="10"/>
+              <w:right w:type="dxa" w:w="45"/>
+            </w:tcMar>
+            <w:vAlign w:val="center"/>
+          </w:tcPr>
+          <w:p>
+            <w:pPr>
+              <w:keepNext/>
+              <w:spacing w:after="0" w:before="0" w:line="240" w:lineRule="auto"/>
+              <w:jc w:val="center"/>
+              <w:rPr>
+                <w:b w:val="false"/>
+                <w:bCs w:val="false"/>
+                <w:sz w:val="18"/>
+                <w:szCs w:val="18"/>
+              </w:rPr>
+            </w:pPr>
+            <w:r>
+              <w:rPr>
+                <w:rFonts w:ascii="Times New Roman" w:cs="Times New Roman" w:eastAsia="Times New Roman" w:hAnsi="Times New Roman"/>
+                <w:b w:val="false"/>
+                <w:bCs w:val="false"/>
+                <w:sz w:val="18"/>
+                <w:szCs w:val="18"/>
+              </w:rPr>
+              <w:t xml:space="preserve">686 (72.5%)</w:t>
+            </w:r>
+          </w:p>
+        </w:tc>
+        <w:tc>
+          <w:tcPr>
+            <w:tcW w:type="dxa" w:w="840"/>
+            <w:gridSpan w:val="1"/>
+            <w:tcBorders>
+              <w:top w:val="single" w:color="808080" w:sz="4"/>
+              <w:left w:val="single" w:color="808080" w:sz="4"/>
+              <w:bottom w:val="single" w:color="808080" w:sz="4"/>
+              <w:right w:val="single" w:color="808080" w:sz="4"/>
+            </w:tcBorders>
+            <w:tcMar>
+              <w:top w:type="dxa" w:w="10"/>
+              <w:left w:type="dxa" w:w="45"/>
+              <w:bottom w:type="dxa" w:w="10"/>
+              <w:right w:type="dxa" w:w="45"/>
+            </w:tcMar>
+            <w:vAlign w:val="center"/>
+          </w:tcPr>
+          <w:p>
+            <w:pPr>
+              <w:keepNext/>
+              <w:spacing w:after="0" w:before="0" w:line="240" w:lineRule="auto"/>
+              <w:jc w:val="center"/>
+              <w:rPr>
+                <w:b w:val="false"/>
+                <w:bCs w:val="false"/>
+                <w:sz w:val="18"/>
+                <w:szCs w:val="18"/>
+              </w:rPr>
+            </w:pPr>
+            <w:r>
+              <w:rPr>
+                <w:rFonts w:ascii="Times New Roman" w:cs="Times New Roman" w:eastAsia="Times New Roman" w:hAnsi="Times New Roman"/>
+                <w:b w:val="false"/>
+                <w:bCs w:val="false"/>
+                <w:sz w:val="18"/>
+                <w:szCs w:val="18"/>
+              </w:rPr>
+              <w:t xml:space="preserve">70.4%</w:t>
+            </w:r>
+          </w:p>
+        </w:tc>
+        <w:tc>
+          <w:tcPr>
+            <w:tcW w:type="dxa" w:w="1020"/>
+            <w:gridSpan w:val="1"/>
+            <w:tcBorders>
+              <w:top w:val="single" w:color="808080" w:sz="4"/>
+              <w:left w:val="single" w:color="808080" w:sz="4"/>
+              <w:bottom w:val="single" w:color="808080" w:sz="4"/>
+              <w:right w:val="single" w:color="808080" w:sz="4"/>
+            </w:tcBorders>
+            <w:tcMar>
+              <w:top w:type="dxa" w:w="10"/>
+              <w:left w:type="dxa" w:w="45"/>
+              <w:bottom w:type="dxa" w:w="10"/>
+              <w:right w:type="dxa" w:w="45"/>
+            </w:tcMar>
+            <w:vAlign w:val="center"/>
+          </w:tcPr>
+          <w:p>
+            <w:pPr>
+              <w:keepNext/>
+              <w:spacing w:after="0" w:before="0" w:line="240" w:lineRule="auto"/>
+              <w:jc w:val="center"/>
+              <w:rPr>
+                <w:b w:val="false"/>
+                <w:bCs w:val="false"/>
+                <w:sz w:val="18"/>
+                <w:szCs w:val="18"/>
+              </w:rPr>
+            </w:pPr>
+            <w:r>
+              <w:rPr>
+                <w:rFonts w:ascii="Times New Roman" w:cs="Times New Roman" w:eastAsia="Times New Roman" w:hAnsi="Times New Roman"/>
+                <w:b w:val="false"/>
+                <w:bCs w:val="false"/>
+                <w:sz w:val="18"/>
+                <w:szCs w:val="18"/>
+              </w:rPr>
+              <w:t xml:space="preserve">33 (49.3%)</w:t>
+            </w:r>
+          </w:p>
+        </w:tc>
+        <w:tc>
+          <w:tcPr>
+            <w:tcW w:type="dxa" w:w="840"/>
+            <w:gridSpan w:val="1"/>
+            <w:tcBorders>
+              <w:top w:val="single" w:color="808080" w:sz="4"/>
+              <w:left w:val="single" w:color="808080" w:sz="4"/>
+              <w:bottom w:val="single" w:color="808080" w:sz="4"/>
+              <w:right w:val="single" w:color="808080" w:sz="4"/>
+            </w:tcBorders>
+            <w:tcMar>
+              <w:top w:type="dxa" w:w="10"/>
+              <w:left w:type="dxa" w:w="45"/>
+              <w:bottom w:type="dxa" w:w="10"/>
+              <w:right w:type="dxa" w:w="45"/>
+            </w:tcMar>
+            <w:vAlign w:val="center"/>
+          </w:tcPr>
+          <w:p>
+            <w:pPr>
+              <w:keepNext/>
+              <w:spacing w:after="0" w:before="0" w:line="240" w:lineRule="auto"/>
+              <w:jc w:val="center"/>
+              <w:rPr>
+                <w:b w:val="false"/>
+                <w:bCs w:val="false"/>
+                <w:sz w:val="18"/>
+                <w:szCs w:val="18"/>
+              </w:rPr>
+            </w:pPr>
+            <w:r>
+              <w:rPr>
+                <w:rFonts w:ascii="Times New Roman" w:cs="Times New Roman" w:eastAsia="Times New Roman" w:hAnsi="Times New Roman"/>
+                <w:b w:val="false"/>
+                <w:bCs w:val="false"/>
+                <w:sz w:val="18"/>
+                <w:szCs w:val="18"/>
+              </w:rPr>
+              <w:t xml:space="preserve">53.4%</w:t>
             </w:r>
           </w:p>
         </w:tc>
@@ -5806,21 +6116,21 @@
       <w:tr>
         <w:trPr>
           <w:cantSplit/>
-          <w:tblHeader w:val="false"/>
         </w:trPr>
         <w:tc>
           <w:tcPr>
-            <w:tcW w:type="dxa" w:w="1640"/>
-            <w:tcBorders>
-              <w:top w:val="single" w:color="808080" w:sz="4"/>
-              <w:left w:val="single" w:color="808080" w:sz="4"/>
-              <w:bottom w:val="single" w:color="808080" w:sz="4"/>
-              <w:right w:val="single" w:color="808080" w:sz="4"/>
-            </w:tcBorders>
-            <w:tcMar>
-              <w:top w:type="dxa" w:w="40"/>
-              <w:left w:type="dxa" w:w="45"/>
-              <w:bottom w:type="dxa" w:w="40"/>
+            <w:tcW w:type="dxa" w:w="1320"/>
+            <w:gridSpan w:val="1"/>
+            <w:tcBorders>
+              <w:top w:val="single" w:color="808080" w:sz="4"/>
+              <w:left w:val="single" w:color="808080" w:sz="4"/>
+              <w:bottom w:val="single" w:color="808080" w:sz="4"/>
+              <w:right w:val="single" w:color="808080" w:sz="4"/>
+            </w:tcBorders>
+            <w:tcMar>
+              <w:top w:type="dxa" w:w="10"/>
+              <w:left w:type="dxa" w:w="45"/>
+              <w:bottom w:type="dxa" w:w="10"/>
               <w:right w:type="dxa" w:w="45"/>
             </w:tcMar>
             <w:vAlign w:val="center"/>
@@ -5845,89 +6155,175 @@
                 <w:sz w:val="18"/>
                 <w:szCs w:val="18"/>
               </w:rPr>
-              <w:t xml:space="preserve">Schooling missing</w:t>
-            </w:r>
-          </w:p>
-        </w:tc>
-        <w:tc>
-          <w:tcPr>
-            <w:tcW w:type="dxa" w:w="1700"/>
-            <w:tcBorders>
-              <w:top w:val="single" w:color="808080" w:sz="4"/>
-              <w:left w:val="single" w:color="808080" w:sz="4"/>
-              <w:bottom w:val="single" w:color="808080" w:sz="4"/>
-              <w:right w:val="single" w:color="808080" w:sz="4"/>
-            </w:tcBorders>
-            <w:tcMar>
-              <w:top w:type="dxa" w:w="40"/>
-              <w:left w:type="dxa" w:w="45"/>
-              <w:bottom w:type="dxa" w:w="40"/>
-              <w:right w:type="dxa" w:w="45"/>
-            </w:tcMar>
-            <w:vAlign w:val="center"/>
-          </w:tcPr>
-          <w:p>
-            <w:pPr>
-              <w:keepNext/>
-              <w:spacing w:after="0" w:before="0" w:line="240" w:lineRule="auto"/>
-              <w:jc w:val="left"/>
-              <w:rPr>
-                <w:b w:val="false"/>
-                <w:bCs w:val="false"/>
-                <w:sz w:val="18"/>
-                <w:szCs w:val="18"/>
-              </w:rPr>
-            </w:pPr>
-            <w:r>
-              <w:rPr>
-                <w:rFonts w:ascii="Times New Roman" w:cs="Times New Roman" w:eastAsia="Times New Roman" w:hAnsi="Times New Roman"/>
-                <w:b w:val="false"/>
-                <w:bCs w:val="false"/>
-                <w:sz w:val="18"/>
-                <w:szCs w:val="18"/>
-              </w:rPr>
-              <w:t xml:space="preserve">3 (0.3%) unw.; 0.4% wtd</w:t>
-            </w:r>
-          </w:p>
-        </w:tc>
-        <w:tc>
-          <w:tcPr>
-            <w:tcW w:type="dxa" w:w="1700"/>
-            <w:tcBorders>
-              <w:top w:val="single" w:color="808080" w:sz="4"/>
-              <w:left w:val="single" w:color="808080" w:sz="4"/>
-              <w:bottom w:val="single" w:color="808080" w:sz="4"/>
-              <w:right w:val="single" w:color="808080" w:sz="4"/>
-            </w:tcBorders>
-            <w:tcMar>
-              <w:top w:type="dxa" w:w="40"/>
-              <w:left w:type="dxa" w:w="45"/>
-              <w:bottom w:type="dxa" w:w="40"/>
-              <w:right w:type="dxa" w:w="45"/>
-            </w:tcMar>
-            <w:vAlign w:val="center"/>
-          </w:tcPr>
-          <w:p>
-            <w:pPr>
-              <w:keepNext/>
-              <w:spacing w:after="0" w:before="0" w:line="240" w:lineRule="auto"/>
-              <w:jc w:val="left"/>
-              <w:rPr>
-                <w:b w:val="false"/>
-                <w:bCs w:val="false"/>
-                <w:sz w:val="18"/>
-                <w:szCs w:val="18"/>
-              </w:rPr>
-            </w:pPr>
-            <w:r>
-              <w:rPr>
-                <w:rFonts w:ascii="Times New Roman" w:cs="Times New Roman" w:eastAsia="Times New Roman" w:hAnsi="Times New Roman"/>
-                <w:b w:val="false"/>
-                <w:bCs w:val="false"/>
-                <w:sz w:val="18"/>
-                <w:szCs w:val="18"/>
-              </w:rPr>
-              <w:t xml:space="preserve">0 (0.0%) unw.; 0.0% wtd</w:t>
+              <w:t xml:space="preserve">Grade 7 or above</w:t>
+            </w:r>
+          </w:p>
+        </w:tc>
+        <w:tc>
+          <w:tcPr>
+            <w:tcW w:type="dxa" w:w="1020"/>
+            <w:gridSpan w:val="1"/>
+            <w:tcBorders>
+              <w:top w:val="single" w:color="808080" w:sz="4"/>
+              <w:left w:val="single" w:color="808080" w:sz="4"/>
+              <w:bottom w:val="single" w:color="808080" w:sz="4"/>
+              <w:right w:val="single" w:color="808080" w:sz="4"/>
+            </w:tcBorders>
+            <w:tcMar>
+              <w:top w:type="dxa" w:w="10"/>
+              <w:left w:type="dxa" w:w="45"/>
+              <w:bottom w:type="dxa" w:w="10"/>
+              <w:right w:type="dxa" w:w="45"/>
+            </w:tcMar>
+            <w:vAlign w:val="center"/>
+          </w:tcPr>
+          <w:p>
+            <w:pPr>
+              <w:keepNext/>
+              <w:spacing w:after="0" w:before="0" w:line="240" w:lineRule="auto"/>
+              <w:jc w:val="center"/>
+              <w:rPr>
+                <w:b w:val="false"/>
+                <w:bCs w:val="false"/>
+                <w:sz w:val="18"/>
+                <w:szCs w:val="18"/>
+              </w:rPr>
+            </w:pPr>
+            <w:r>
+              <w:rPr>
+                <w:rFonts w:ascii="Times New Roman" w:cs="Times New Roman" w:eastAsia="Times New Roman" w:hAnsi="Times New Roman"/>
+                <w:b w:val="false"/>
+                <w:bCs w:val="false"/>
+                <w:sz w:val="18"/>
+                <w:szCs w:val="18"/>
+              </w:rPr>
+              <w:t xml:space="preserve">290 (30.7%)</w:t>
+            </w:r>
+          </w:p>
+        </w:tc>
+        <w:tc>
+          <w:tcPr>
+            <w:tcW w:type="dxa" w:w="840"/>
+            <w:gridSpan w:val="1"/>
+            <w:tcBorders>
+              <w:top w:val="single" w:color="808080" w:sz="4"/>
+              <w:left w:val="single" w:color="808080" w:sz="4"/>
+              <w:bottom w:val="single" w:color="808080" w:sz="4"/>
+              <w:right w:val="single" w:color="808080" w:sz="4"/>
+            </w:tcBorders>
+            <w:tcMar>
+              <w:top w:type="dxa" w:w="10"/>
+              <w:left w:type="dxa" w:w="45"/>
+              <w:bottom w:type="dxa" w:w="10"/>
+              <w:right w:type="dxa" w:w="45"/>
+            </w:tcMar>
+            <w:vAlign w:val="center"/>
+          </w:tcPr>
+          <w:p>
+            <w:pPr>
+              <w:keepNext/>
+              <w:spacing w:after="0" w:before="0" w:line="240" w:lineRule="auto"/>
+              <w:jc w:val="center"/>
+              <w:rPr>
+                <w:b w:val="false"/>
+                <w:bCs w:val="false"/>
+                <w:sz w:val="18"/>
+                <w:szCs w:val="18"/>
+              </w:rPr>
+            </w:pPr>
+            <w:r>
+              <w:rPr>
+                <w:rFonts w:ascii="Times New Roman" w:cs="Times New Roman" w:eastAsia="Times New Roman" w:hAnsi="Times New Roman"/>
+                <w:b w:val="false"/>
+                <w:bCs w:val="false"/>
+                <w:sz w:val="18"/>
+                <w:szCs w:val="18"/>
+              </w:rPr>
+              <w:t xml:space="preserve">33.0%</w:t>
+            </w:r>
+          </w:p>
+        </w:tc>
+        <w:tc>
+          <w:tcPr>
+            <w:tcW w:type="dxa" w:w="1020"/>
+            <w:gridSpan w:val="1"/>
+            <w:tcBorders>
+              <w:top w:val="single" w:color="808080" w:sz="4"/>
+              <w:left w:val="single" w:color="808080" w:sz="4"/>
+              <w:bottom w:val="single" w:color="808080" w:sz="4"/>
+              <w:right w:val="single" w:color="808080" w:sz="4"/>
+            </w:tcBorders>
+            <w:tcMar>
+              <w:top w:type="dxa" w:w="10"/>
+              <w:left w:type="dxa" w:w="45"/>
+              <w:bottom w:type="dxa" w:w="10"/>
+              <w:right w:type="dxa" w:w="45"/>
+            </w:tcMar>
+            <w:vAlign w:val="center"/>
+          </w:tcPr>
+          <w:p>
+            <w:pPr>
+              <w:keepNext/>
+              <w:spacing w:after="0" w:before="0" w:line="240" w:lineRule="auto"/>
+              <w:jc w:val="center"/>
+              <w:rPr>
+                <w:b w:val="false"/>
+                <w:bCs w:val="false"/>
+                <w:sz w:val="18"/>
+                <w:szCs w:val="18"/>
+              </w:rPr>
+            </w:pPr>
+            <w:r>
+              <w:rPr>
+                <w:rFonts w:ascii="Times New Roman" w:cs="Times New Roman" w:eastAsia="Times New Roman" w:hAnsi="Times New Roman"/>
+                <w:b w:val="false"/>
+                <w:bCs w:val="false"/>
+                <w:sz w:val="18"/>
+                <w:szCs w:val="18"/>
+              </w:rPr>
+              <w:t xml:space="preserve">49 (73.1%)</w:t>
+            </w:r>
+          </w:p>
+        </w:tc>
+        <w:tc>
+          <w:tcPr>
+            <w:tcW w:type="dxa" w:w="840"/>
+            <w:gridSpan w:val="1"/>
+            <w:tcBorders>
+              <w:top w:val="single" w:color="808080" w:sz="4"/>
+              <w:left w:val="single" w:color="808080" w:sz="4"/>
+              <w:bottom w:val="single" w:color="808080" w:sz="4"/>
+              <w:right w:val="single" w:color="808080" w:sz="4"/>
+            </w:tcBorders>
+            <w:tcMar>
+              <w:top w:type="dxa" w:w="10"/>
+              <w:left w:type="dxa" w:w="45"/>
+              <w:bottom w:type="dxa" w:w="10"/>
+              <w:right w:type="dxa" w:w="45"/>
+            </w:tcMar>
+            <w:vAlign w:val="center"/>
+          </w:tcPr>
+          <w:p>
+            <w:pPr>
+              <w:keepNext/>
+              <w:spacing w:after="0" w:before="0" w:line="240" w:lineRule="auto"/>
+              <w:jc w:val="center"/>
+              <w:rPr>
+                <w:b w:val="false"/>
+                <w:bCs w:val="false"/>
+                <w:sz w:val="18"/>
+                <w:szCs w:val="18"/>
+              </w:rPr>
+            </w:pPr>
+            <w:r>
+              <w:rPr>
+                <w:rFonts w:ascii="Times New Roman" w:cs="Times New Roman" w:eastAsia="Times New Roman" w:hAnsi="Times New Roman"/>
+                <w:b w:val="false"/>
+                <w:bCs w:val="false"/>
+                <w:sz w:val="18"/>
+                <w:szCs w:val="18"/>
+              </w:rPr>
+              <w:t xml:space="preserve">80.8%</w:t>
             </w:r>
           </w:p>
         </w:tc>
@@ -5935,21 +6331,21 @@
       <w:tr>
         <w:trPr>
           <w:cantSplit/>
-          <w:tblHeader w:val="false"/>
         </w:trPr>
         <w:tc>
           <w:tcPr>
-            <w:tcW w:type="dxa" w:w="1640"/>
-            <w:tcBorders>
-              <w:top w:val="single" w:color="808080" w:sz="4"/>
-              <w:left w:val="single" w:color="808080" w:sz="4"/>
-              <w:bottom w:val="single" w:color="808080" w:sz="4"/>
-              <w:right w:val="single" w:color="808080" w:sz="4"/>
-            </w:tcBorders>
-            <w:tcMar>
-              <w:top w:type="dxa" w:w="40"/>
-              <w:left w:type="dxa" w:w="45"/>
-              <w:bottom w:type="dxa" w:w="40"/>
+            <w:tcW w:type="dxa" w:w="1320"/>
+            <w:gridSpan w:val="1"/>
+            <w:tcBorders>
+              <w:top w:val="single" w:color="808080" w:sz="4"/>
+              <w:left w:val="single" w:color="808080" w:sz="4"/>
+              <w:bottom w:val="single" w:color="808080" w:sz="4"/>
+              <w:right w:val="single" w:color="808080" w:sz="4"/>
+            </w:tcBorders>
+            <w:tcMar>
+              <w:top w:type="dxa" w:w="10"/>
+              <w:left w:type="dxa" w:w="45"/>
+              <w:bottom w:type="dxa" w:w="10"/>
               <w:right w:type="dxa" w:w="45"/>
             </w:tcMar>
             <w:vAlign w:val="center"/>
@@ -5974,89 +6370,175 @@
                 <w:sz w:val="18"/>
                 <w:szCs w:val="18"/>
               </w:rPr>
-              <w:t xml:space="preserve">Urban formal settlement</w:t>
-            </w:r>
-          </w:p>
-        </w:tc>
-        <w:tc>
-          <w:tcPr>
-            <w:tcW w:type="dxa" w:w="1700"/>
-            <w:tcBorders>
-              <w:top w:val="single" w:color="808080" w:sz="4"/>
-              <w:left w:val="single" w:color="808080" w:sz="4"/>
-              <w:bottom w:val="single" w:color="808080" w:sz="4"/>
-              <w:right w:val="single" w:color="808080" w:sz="4"/>
-            </w:tcBorders>
-            <w:tcMar>
-              <w:top w:type="dxa" w:w="40"/>
-              <w:left w:type="dxa" w:w="45"/>
-              <w:bottom w:type="dxa" w:w="40"/>
-              <w:right w:type="dxa" w:w="45"/>
-            </w:tcMar>
-            <w:vAlign w:val="center"/>
-          </w:tcPr>
-          <w:p>
-            <w:pPr>
-              <w:keepNext/>
-              <w:spacing w:after="0" w:before="0" w:line="240" w:lineRule="auto"/>
-              <w:jc w:val="left"/>
-              <w:rPr>
-                <w:b w:val="false"/>
-                <w:bCs w:val="false"/>
-                <w:sz w:val="18"/>
-                <w:szCs w:val="18"/>
-              </w:rPr>
-            </w:pPr>
-            <w:r>
-              <w:rPr>
-                <w:rFonts w:ascii="Times New Roman" w:cs="Times New Roman" w:eastAsia="Times New Roman" w:hAnsi="Times New Roman"/>
-                <w:b w:val="false"/>
-                <w:bCs w:val="false"/>
-                <w:sz w:val="18"/>
-                <w:szCs w:val="18"/>
-              </w:rPr>
-              <w:t xml:space="preserve">284 (30.0%) unw.; 36.2% wtd</w:t>
-            </w:r>
-          </w:p>
-        </w:tc>
-        <w:tc>
-          <w:tcPr>
-            <w:tcW w:type="dxa" w:w="1700"/>
-            <w:tcBorders>
-              <w:top w:val="single" w:color="808080" w:sz="4"/>
-              <w:left w:val="single" w:color="808080" w:sz="4"/>
-              <w:bottom w:val="single" w:color="808080" w:sz="4"/>
-              <w:right w:val="single" w:color="808080" w:sz="4"/>
-            </w:tcBorders>
-            <w:tcMar>
-              <w:top w:type="dxa" w:w="40"/>
-              <w:left w:type="dxa" w:w="45"/>
-              <w:bottom w:type="dxa" w:w="40"/>
-              <w:right w:type="dxa" w:w="45"/>
-            </w:tcMar>
-            <w:vAlign w:val="center"/>
-          </w:tcPr>
-          <w:p>
-            <w:pPr>
-              <w:keepNext/>
-              <w:spacing w:after="0" w:before="0" w:line="240" w:lineRule="auto"/>
-              <w:jc w:val="left"/>
-              <w:rPr>
-                <w:b w:val="false"/>
-                <w:bCs w:val="false"/>
-                <w:sz w:val="18"/>
-                <w:szCs w:val="18"/>
-              </w:rPr>
-            </w:pPr>
-            <w:r>
-              <w:rPr>
-                <w:rFonts w:ascii="Times New Roman" w:cs="Times New Roman" w:eastAsia="Times New Roman" w:hAnsi="Times New Roman"/>
-                <w:b w:val="false"/>
-                <w:bCs w:val="false"/>
-                <w:sz w:val="18"/>
-                <w:szCs w:val="18"/>
-              </w:rPr>
-              <w:t xml:space="preserve">38 (56.7%) unw.; 66.2% wtd</w:t>
+              <w:t xml:space="preserve">Schooling missing</w:t>
+            </w:r>
+          </w:p>
+        </w:tc>
+        <w:tc>
+          <w:tcPr>
+            <w:tcW w:type="dxa" w:w="1020"/>
+            <w:gridSpan w:val="1"/>
+            <w:tcBorders>
+              <w:top w:val="single" w:color="808080" w:sz="4"/>
+              <w:left w:val="single" w:color="808080" w:sz="4"/>
+              <w:bottom w:val="single" w:color="808080" w:sz="4"/>
+              <w:right w:val="single" w:color="808080" w:sz="4"/>
+            </w:tcBorders>
+            <w:tcMar>
+              <w:top w:type="dxa" w:w="10"/>
+              <w:left w:type="dxa" w:w="45"/>
+              <w:bottom w:type="dxa" w:w="10"/>
+              <w:right w:type="dxa" w:w="45"/>
+            </w:tcMar>
+            <w:vAlign w:val="center"/>
+          </w:tcPr>
+          <w:p>
+            <w:pPr>
+              <w:keepNext/>
+              <w:spacing w:after="0" w:before="0" w:line="240" w:lineRule="auto"/>
+              <w:jc w:val="center"/>
+              <w:rPr>
+                <w:b w:val="false"/>
+                <w:bCs w:val="false"/>
+                <w:sz w:val="18"/>
+                <w:szCs w:val="18"/>
+              </w:rPr>
+            </w:pPr>
+            <w:r>
+              <w:rPr>
+                <w:rFonts w:ascii="Times New Roman" w:cs="Times New Roman" w:eastAsia="Times New Roman" w:hAnsi="Times New Roman"/>
+                <w:b w:val="false"/>
+                <w:bCs w:val="false"/>
+                <w:sz w:val="18"/>
+                <w:szCs w:val="18"/>
+              </w:rPr>
+              <w:t xml:space="preserve">3 (0.3%)</w:t>
+            </w:r>
+          </w:p>
+        </w:tc>
+        <w:tc>
+          <w:tcPr>
+            <w:tcW w:type="dxa" w:w="840"/>
+            <w:gridSpan w:val="1"/>
+            <w:tcBorders>
+              <w:top w:val="single" w:color="808080" w:sz="4"/>
+              <w:left w:val="single" w:color="808080" w:sz="4"/>
+              <w:bottom w:val="single" w:color="808080" w:sz="4"/>
+              <w:right w:val="single" w:color="808080" w:sz="4"/>
+            </w:tcBorders>
+            <w:tcMar>
+              <w:top w:type="dxa" w:w="10"/>
+              <w:left w:type="dxa" w:w="45"/>
+              <w:bottom w:type="dxa" w:w="10"/>
+              <w:right w:type="dxa" w:w="45"/>
+            </w:tcMar>
+            <w:vAlign w:val="center"/>
+          </w:tcPr>
+          <w:p>
+            <w:pPr>
+              <w:keepNext/>
+              <w:spacing w:after="0" w:before="0" w:line="240" w:lineRule="auto"/>
+              <w:jc w:val="center"/>
+              <w:rPr>
+                <w:b w:val="false"/>
+                <w:bCs w:val="false"/>
+                <w:sz w:val="18"/>
+                <w:szCs w:val="18"/>
+              </w:rPr>
+            </w:pPr>
+            <w:r>
+              <w:rPr>
+                <w:rFonts w:ascii="Times New Roman" w:cs="Times New Roman" w:eastAsia="Times New Roman" w:hAnsi="Times New Roman"/>
+                <w:b w:val="false"/>
+                <w:bCs w:val="false"/>
+                <w:sz w:val="18"/>
+                <w:szCs w:val="18"/>
+              </w:rPr>
+              <w:t xml:space="preserve">0.4%</w:t>
+            </w:r>
+          </w:p>
+        </w:tc>
+        <w:tc>
+          <w:tcPr>
+            <w:tcW w:type="dxa" w:w="1020"/>
+            <w:gridSpan w:val="1"/>
+            <w:tcBorders>
+              <w:top w:val="single" w:color="808080" w:sz="4"/>
+              <w:left w:val="single" w:color="808080" w:sz="4"/>
+              <w:bottom w:val="single" w:color="808080" w:sz="4"/>
+              <w:right w:val="single" w:color="808080" w:sz="4"/>
+            </w:tcBorders>
+            <w:tcMar>
+              <w:top w:type="dxa" w:w="10"/>
+              <w:left w:type="dxa" w:w="45"/>
+              <w:bottom w:type="dxa" w:w="10"/>
+              <w:right w:type="dxa" w:w="45"/>
+            </w:tcMar>
+            <w:vAlign w:val="center"/>
+          </w:tcPr>
+          <w:p>
+            <w:pPr>
+              <w:keepNext/>
+              <w:spacing w:after="0" w:before="0" w:line="240" w:lineRule="auto"/>
+              <w:jc w:val="center"/>
+              <w:rPr>
+                <w:b w:val="false"/>
+                <w:bCs w:val="false"/>
+                <w:sz w:val="18"/>
+                <w:szCs w:val="18"/>
+              </w:rPr>
+            </w:pPr>
+            <w:r>
+              <w:rPr>
+                <w:rFonts w:ascii="Times New Roman" w:cs="Times New Roman" w:eastAsia="Times New Roman" w:hAnsi="Times New Roman"/>
+                <w:b w:val="false"/>
+                <w:bCs w:val="false"/>
+                <w:sz w:val="18"/>
+                <w:szCs w:val="18"/>
+              </w:rPr>
+              <w:t xml:space="preserve">0 (0.0%)</w:t>
+            </w:r>
+          </w:p>
+        </w:tc>
+        <w:tc>
+          <w:tcPr>
+            <w:tcW w:type="dxa" w:w="840"/>
+            <w:gridSpan w:val="1"/>
+            <w:tcBorders>
+              <w:top w:val="single" w:color="808080" w:sz="4"/>
+              <w:left w:val="single" w:color="808080" w:sz="4"/>
+              <w:bottom w:val="single" w:color="808080" w:sz="4"/>
+              <w:right w:val="single" w:color="808080" w:sz="4"/>
+            </w:tcBorders>
+            <w:tcMar>
+              <w:top w:type="dxa" w:w="10"/>
+              <w:left w:type="dxa" w:w="45"/>
+              <w:bottom w:type="dxa" w:w="10"/>
+              <w:right w:type="dxa" w:w="45"/>
+            </w:tcMar>
+            <w:vAlign w:val="center"/>
+          </w:tcPr>
+          <w:p>
+            <w:pPr>
+              <w:keepNext/>
+              <w:spacing w:after="0" w:before="0" w:line="240" w:lineRule="auto"/>
+              <w:jc w:val="center"/>
+              <w:rPr>
+                <w:b w:val="false"/>
+                <w:bCs w:val="false"/>
+                <w:sz w:val="18"/>
+                <w:szCs w:val="18"/>
+              </w:rPr>
+            </w:pPr>
+            <w:r>
+              <w:rPr>
+                <w:rFonts w:ascii="Times New Roman" w:cs="Times New Roman" w:eastAsia="Times New Roman" w:hAnsi="Times New Roman"/>
+                <w:b w:val="false"/>
+                <w:bCs w:val="false"/>
+                <w:sz w:val="18"/>
+                <w:szCs w:val="18"/>
+              </w:rPr>
+              <w:t xml:space="preserve">0.0%</w:t>
             </w:r>
           </w:p>
         </w:tc>
@@ -6064,21 +6546,21 @@
       <w:tr>
         <w:trPr>
           <w:cantSplit/>
-          <w:tblHeader w:val="false"/>
         </w:trPr>
         <w:tc>
           <w:tcPr>
-            <w:tcW w:type="dxa" w:w="1640"/>
-            <w:tcBorders>
-              <w:top w:val="single" w:color="808080" w:sz="4"/>
-              <w:left w:val="single" w:color="808080" w:sz="4"/>
-              <w:bottom w:val="single" w:color="808080" w:sz="4"/>
-              <w:right w:val="single" w:color="808080" w:sz="4"/>
-            </w:tcBorders>
-            <w:tcMar>
-              <w:top w:type="dxa" w:w="40"/>
-              <w:left w:type="dxa" w:w="45"/>
-              <w:bottom w:type="dxa" w:w="40"/>
+            <w:tcW w:type="dxa" w:w="1320"/>
+            <w:gridSpan w:val="1"/>
+            <w:tcBorders>
+              <w:top w:val="single" w:color="808080" w:sz="4"/>
+              <w:left w:val="single" w:color="808080" w:sz="4"/>
+              <w:bottom w:val="single" w:color="808080" w:sz="4"/>
+              <w:right w:val="single" w:color="808080" w:sz="4"/>
+            </w:tcBorders>
+            <w:tcMar>
+              <w:top w:type="dxa" w:w="10"/>
+              <w:left w:type="dxa" w:w="45"/>
+              <w:bottom w:type="dxa" w:w="10"/>
               <w:right w:type="dxa" w:w="45"/>
             </w:tcMar>
             <w:vAlign w:val="center"/>
@@ -6103,89 +6585,175 @@
                 <w:sz w:val="18"/>
                 <w:szCs w:val="18"/>
               </w:rPr>
-              <w:t xml:space="preserve">Office ≥5 km or unavailable</w:t>
-            </w:r>
-          </w:p>
-        </w:tc>
-        <w:tc>
-          <w:tcPr>
-            <w:tcW w:type="dxa" w:w="1700"/>
-            <w:tcBorders>
-              <w:top w:val="single" w:color="808080" w:sz="4"/>
-              <w:left w:val="single" w:color="808080" w:sz="4"/>
-              <w:bottom w:val="single" w:color="808080" w:sz="4"/>
-              <w:right w:val="single" w:color="808080" w:sz="4"/>
-            </w:tcBorders>
-            <w:tcMar>
-              <w:top w:type="dxa" w:w="40"/>
-              <w:left w:type="dxa" w:w="45"/>
-              <w:bottom w:type="dxa" w:w="40"/>
-              <w:right w:type="dxa" w:w="45"/>
-            </w:tcMar>
-            <w:vAlign w:val="center"/>
-          </w:tcPr>
-          <w:p>
-            <w:pPr>
-              <w:keepNext/>
-              <w:spacing w:after="0" w:before="0" w:line="240" w:lineRule="auto"/>
-              <w:jc w:val="left"/>
-              <w:rPr>
-                <w:b w:val="false"/>
-                <w:bCs w:val="false"/>
-                <w:sz w:val="18"/>
-                <w:szCs w:val="18"/>
-              </w:rPr>
-            </w:pPr>
-            <w:r>
-              <w:rPr>
-                <w:rFonts w:ascii="Times New Roman" w:cs="Times New Roman" w:eastAsia="Times New Roman" w:hAnsi="Times New Roman"/>
-                <w:b w:val="false"/>
-                <w:bCs w:val="false"/>
-                <w:sz w:val="18"/>
-                <w:szCs w:val="18"/>
-              </w:rPr>
-              <w:t xml:space="preserve">717 (75.8%) unw.; 72.0% wtd</w:t>
-            </w:r>
-          </w:p>
-        </w:tc>
-        <w:tc>
-          <w:tcPr>
-            <w:tcW w:type="dxa" w:w="1700"/>
-            <w:tcBorders>
-              <w:top w:val="single" w:color="808080" w:sz="4"/>
-              <w:left w:val="single" w:color="808080" w:sz="4"/>
-              <w:bottom w:val="single" w:color="808080" w:sz="4"/>
-              <w:right w:val="single" w:color="808080" w:sz="4"/>
-            </w:tcBorders>
-            <w:tcMar>
-              <w:top w:type="dxa" w:w="40"/>
-              <w:left w:type="dxa" w:w="45"/>
-              <w:bottom w:type="dxa" w:w="40"/>
-              <w:right w:type="dxa" w:w="45"/>
-            </w:tcMar>
-            <w:vAlign w:val="center"/>
-          </w:tcPr>
-          <w:p>
-            <w:pPr>
-              <w:keepNext/>
-              <w:spacing w:after="0" w:before="0" w:line="240" w:lineRule="auto"/>
-              <w:jc w:val="left"/>
-              <w:rPr>
-                <w:b w:val="false"/>
-                <w:bCs w:val="false"/>
-                <w:sz w:val="18"/>
-                <w:szCs w:val="18"/>
-              </w:rPr>
-            </w:pPr>
-            <w:r>
-              <w:rPr>
-                <w:rFonts w:ascii="Times New Roman" w:cs="Times New Roman" w:eastAsia="Times New Roman" w:hAnsi="Times New Roman"/>
-                <w:b w:val="false"/>
-                <w:bCs w:val="false"/>
-                <w:sz w:val="18"/>
-                <w:szCs w:val="18"/>
-              </w:rPr>
-              <w:t xml:space="preserve">34 (50.7%) unw.; 40.3% wtd</w:t>
+              <w:t xml:space="preserve">Urban formal settlement</w:t>
+            </w:r>
+          </w:p>
+        </w:tc>
+        <w:tc>
+          <w:tcPr>
+            <w:tcW w:type="dxa" w:w="1020"/>
+            <w:gridSpan w:val="1"/>
+            <w:tcBorders>
+              <w:top w:val="single" w:color="808080" w:sz="4"/>
+              <w:left w:val="single" w:color="808080" w:sz="4"/>
+              <w:bottom w:val="single" w:color="808080" w:sz="4"/>
+              <w:right w:val="single" w:color="808080" w:sz="4"/>
+            </w:tcBorders>
+            <w:tcMar>
+              <w:top w:type="dxa" w:w="10"/>
+              <w:left w:type="dxa" w:w="45"/>
+              <w:bottom w:type="dxa" w:w="10"/>
+              <w:right w:type="dxa" w:w="45"/>
+            </w:tcMar>
+            <w:vAlign w:val="center"/>
+          </w:tcPr>
+          <w:p>
+            <w:pPr>
+              <w:keepNext/>
+              <w:spacing w:after="0" w:before="0" w:line="240" w:lineRule="auto"/>
+              <w:jc w:val="center"/>
+              <w:rPr>
+                <w:b w:val="false"/>
+                <w:bCs w:val="false"/>
+                <w:sz w:val="18"/>
+                <w:szCs w:val="18"/>
+              </w:rPr>
+            </w:pPr>
+            <w:r>
+              <w:rPr>
+                <w:rFonts w:ascii="Times New Roman" w:cs="Times New Roman" w:eastAsia="Times New Roman" w:hAnsi="Times New Roman"/>
+                <w:b w:val="false"/>
+                <w:bCs w:val="false"/>
+                <w:sz w:val="18"/>
+                <w:szCs w:val="18"/>
+              </w:rPr>
+              <w:t xml:space="preserve">284 (30.0%)</w:t>
+            </w:r>
+          </w:p>
+        </w:tc>
+        <w:tc>
+          <w:tcPr>
+            <w:tcW w:type="dxa" w:w="840"/>
+            <w:gridSpan w:val="1"/>
+            <w:tcBorders>
+              <w:top w:val="single" w:color="808080" w:sz="4"/>
+              <w:left w:val="single" w:color="808080" w:sz="4"/>
+              <w:bottom w:val="single" w:color="808080" w:sz="4"/>
+              <w:right w:val="single" w:color="808080" w:sz="4"/>
+            </w:tcBorders>
+            <w:tcMar>
+              <w:top w:type="dxa" w:w="10"/>
+              <w:left w:type="dxa" w:w="45"/>
+              <w:bottom w:type="dxa" w:w="10"/>
+              <w:right w:type="dxa" w:w="45"/>
+            </w:tcMar>
+            <w:vAlign w:val="center"/>
+          </w:tcPr>
+          <w:p>
+            <w:pPr>
+              <w:keepNext/>
+              <w:spacing w:after="0" w:before="0" w:line="240" w:lineRule="auto"/>
+              <w:jc w:val="center"/>
+              <w:rPr>
+                <w:b w:val="false"/>
+                <w:bCs w:val="false"/>
+                <w:sz w:val="18"/>
+                <w:szCs w:val="18"/>
+              </w:rPr>
+            </w:pPr>
+            <w:r>
+              <w:rPr>
+                <w:rFonts w:ascii="Times New Roman" w:cs="Times New Roman" w:eastAsia="Times New Roman" w:hAnsi="Times New Roman"/>
+                <w:b w:val="false"/>
+                <w:bCs w:val="false"/>
+                <w:sz w:val="18"/>
+                <w:szCs w:val="18"/>
+              </w:rPr>
+              <w:t xml:space="preserve">36.2%</w:t>
+            </w:r>
+          </w:p>
+        </w:tc>
+        <w:tc>
+          <w:tcPr>
+            <w:tcW w:type="dxa" w:w="1020"/>
+            <w:gridSpan w:val="1"/>
+            <w:tcBorders>
+              <w:top w:val="single" w:color="808080" w:sz="4"/>
+              <w:left w:val="single" w:color="808080" w:sz="4"/>
+              <w:bottom w:val="single" w:color="808080" w:sz="4"/>
+              <w:right w:val="single" w:color="808080" w:sz="4"/>
+            </w:tcBorders>
+            <w:tcMar>
+              <w:top w:type="dxa" w:w="10"/>
+              <w:left w:type="dxa" w:w="45"/>
+              <w:bottom w:type="dxa" w:w="10"/>
+              <w:right w:type="dxa" w:w="45"/>
+            </w:tcMar>
+            <w:vAlign w:val="center"/>
+          </w:tcPr>
+          <w:p>
+            <w:pPr>
+              <w:keepNext/>
+              <w:spacing w:after="0" w:before="0" w:line="240" w:lineRule="auto"/>
+              <w:jc w:val="center"/>
+              <w:rPr>
+                <w:b w:val="false"/>
+                <w:bCs w:val="false"/>
+                <w:sz w:val="18"/>
+                <w:szCs w:val="18"/>
+              </w:rPr>
+            </w:pPr>
+            <w:r>
+              <w:rPr>
+                <w:rFonts w:ascii="Times New Roman" w:cs="Times New Roman" w:eastAsia="Times New Roman" w:hAnsi="Times New Roman"/>
+                <w:b w:val="false"/>
+                <w:bCs w:val="false"/>
+                <w:sz w:val="18"/>
+                <w:szCs w:val="18"/>
+              </w:rPr>
+              <w:t xml:space="preserve">38 (56.7%)</w:t>
+            </w:r>
+          </w:p>
+        </w:tc>
+        <w:tc>
+          <w:tcPr>
+            <w:tcW w:type="dxa" w:w="840"/>
+            <w:gridSpan w:val="1"/>
+            <w:tcBorders>
+              <w:top w:val="single" w:color="808080" w:sz="4"/>
+              <w:left w:val="single" w:color="808080" w:sz="4"/>
+              <w:bottom w:val="single" w:color="808080" w:sz="4"/>
+              <w:right w:val="single" w:color="808080" w:sz="4"/>
+            </w:tcBorders>
+            <w:tcMar>
+              <w:top w:type="dxa" w:w="10"/>
+              <w:left w:type="dxa" w:w="45"/>
+              <w:bottom w:type="dxa" w:w="10"/>
+              <w:right w:type="dxa" w:w="45"/>
+            </w:tcMar>
+            <w:vAlign w:val="center"/>
+          </w:tcPr>
+          <w:p>
+            <w:pPr>
+              <w:keepNext/>
+              <w:spacing w:after="0" w:before="0" w:line="240" w:lineRule="auto"/>
+              <w:jc w:val="center"/>
+              <w:rPr>
+                <w:b w:val="false"/>
+                <w:bCs w:val="false"/>
+                <w:sz w:val="18"/>
+                <w:szCs w:val="18"/>
+              </w:rPr>
+            </w:pPr>
+            <w:r>
+              <w:rPr>
+                <w:rFonts w:ascii="Times New Roman" w:cs="Times New Roman" w:eastAsia="Times New Roman" w:hAnsi="Times New Roman"/>
+                <w:b w:val="false"/>
+                <w:bCs w:val="false"/>
+                <w:sz w:val="18"/>
+                <w:szCs w:val="18"/>
+              </w:rPr>
+              <w:t xml:space="preserve">66.2%</w:t>
             </w:r>
           </w:p>
         </w:tc>
@@ -6193,21 +6761,236 @@
       <w:tr>
         <w:trPr>
           <w:cantSplit/>
-          <w:tblHeader w:val="false"/>
         </w:trPr>
         <w:tc>
           <w:tcPr>
-            <w:tcW w:type="dxa" w:w="1640"/>
-            <w:tcBorders>
-              <w:top w:val="single" w:color="808080" w:sz="4"/>
-              <w:left w:val="single" w:color="808080" w:sz="4"/>
-              <w:bottom w:val="single" w:color="808080" w:sz="4"/>
-              <w:right w:val="single" w:color="808080" w:sz="4"/>
-            </w:tcBorders>
-            <w:tcMar>
-              <w:top w:type="dxa" w:w="40"/>
-              <w:left w:type="dxa" w:w="45"/>
-              <w:bottom w:type="dxa" w:w="40"/>
+            <w:tcW w:type="dxa" w:w="1320"/>
+            <w:gridSpan w:val="1"/>
+            <w:tcBorders>
+              <w:top w:val="single" w:color="808080" w:sz="4"/>
+              <w:left w:val="single" w:color="808080" w:sz="4"/>
+              <w:bottom w:val="single" w:color="808080" w:sz="4"/>
+              <w:right w:val="single" w:color="808080" w:sz="4"/>
+            </w:tcBorders>
+            <w:tcMar>
+              <w:top w:type="dxa" w:w="10"/>
+              <w:left w:type="dxa" w:w="45"/>
+              <w:bottom w:type="dxa" w:w="10"/>
+              <w:right w:type="dxa" w:w="45"/>
+            </w:tcMar>
+            <w:vAlign w:val="center"/>
+          </w:tcPr>
+          <w:p>
+            <w:pPr>
+              <w:keepNext/>
+              <w:spacing w:after="0" w:before="0" w:line="240" w:lineRule="auto"/>
+              <w:jc w:val="left"/>
+              <w:rPr>
+                <w:b w:val="false"/>
+                <w:bCs w:val="false"/>
+                <w:sz w:val="18"/>
+                <w:szCs w:val="18"/>
+              </w:rPr>
+            </w:pPr>
+            <w:r>
+              <w:rPr>
+                <w:rFonts w:ascii="Times New Roman" w:cs="Times New Roman" w:eastAsia="Times New Roman" w:hAnsi="Times New Roman"/>
+                <w:b w:val="false"/>
+                <w:bCs w:val="false"/>
+                <w:sz w:val="18"/>
+                <w:szCs w:val="18"/>
+              </w:rPr>
+              <w:t xml:space="preserve">Office ≥5 km or unavailable</w:t>
+            </w:r>
+          </w:p>
+        </w:tc>
+        <w:tc>
+          <w:tcPr>
+            <w:tcW w:type="dxa" w:w="1020"/>
+            <w:gridSpan w:val="1"/>
+            <w:tcBorders>
+              <w:top w:val="single" w:color="808080" w:sz="4"/>
+              <w:left w:val="single" w:color="808080" w:sz="4"/>
+              <w:bottom w:val="single" w:color="808080" w:sz="4"/>
+              <w:right w:val="single" w:color="808080" w:sz="4"/>
+            </w:tcBorders>
+            <w:tcMar>
+              <w:top w:type="dxa" w:w="10"/>
+              <w:left w:type="dxa" w:w="45"/>
+              <w:bottom w:type="dxa" w:w="10"/>
+              <w:right w:type="dxa" w:w="45"/>
+            </w:tcMar>
+            <w:vAlign w:val="center"/>
+          </w:tcPr>
+          <w:p>
+            <w:pPr>
+              <w:keepNext/>
+              <w:spacing w:after="0" w:before="0" w:line="240" w:lineRule="auto"/>
+              <w:jc w:val="center"/>
+              <w:rPr>
+                <w:b w:val="false"/>
+                <w:bCs w:val="false"/>
+                <w:sz w:val="18"/>
+                <w:szCs w:val="18"/>
+              </w:rPr>
+            </w:pPr>
+            <w:r>
+              <w:rPr>
+                <w:rFonts w:ascii="Times New Roman" w:cs="Times New Roman" w:eastAsia="Times New Roman" w:hAnsi="Times New Roman"/>
+                <w:b w:val="false"/>
+                <w:bCs w:val="false"/>
+                <w:sz w:val="18"/>
+                <w:szCs w:val="18"/>
+              </w:rPr>
+              <w:t xml:space="preserve">717 (75.8%)</w:t>
+            </w:r>
+          </w:p>
+        </w:tc>
+        <w:tc>
+          <w:tcPr>
+            <w:tcW w:type="dxa" w:w="840"/>
+            <w:gridSpan w:val="1"/>
+            <w:tcBorders>
+              <w:top w:val="single" w:color="808080" w:sz="4"/>
+              <w:left w:val="single" w:color="808080" w:sz="4"/>
+              <w:bottom w:val="single" w:color="808080" w:sz="4"/>
+              <w:right w:val="single" w:color="808080" w:sz="4"/>
+            </w:tcBorders>
+            <w:tcMar>
+              <w:top w:type="dxa" w:w="10"/>
+              <w:left w:type="dxa" w:w="45"/>
+              <w:bottom w:type="dxa" w:w="10"/>
+              <w:right w:type="dxa" w:w="45"/>
+            </w:tcMar>
+            <w:vAlign w:val="center"/>
+          </w:tcPr>
+          <w:p>
+            <w:pPr>
+              <w:keepNext/>
+              <w:spacing w:after="0" w:before="0" w:line="240" w:lineRule="auto"/>
+              <w:jc w:val="center"/>
+              <w:rPr>
+                <w:b w:val="false"/>
+                <w:bCs w:val="false"/>
+                <w:sz w:val="18"/>
+                <w:szCs w:val="18"/>
+              </w:rPr>
+            </w:pPr>
+            <w:r>
+              <w:rPr>
+                <w:rFonts w:ascii="Times New Roman" w:cs="Times New Roman" w:eastAsia="Times New Roman" w:hAnsi="Times New Roman"/>
+                <w:b w:val="false"/>
+                <w:bCs w:val="false"/>
+                <w:sz w:val="18"/>
+                <w:szCs w:val="18"/>
+              </w:rPr>
+              <w:t xml:space="preserve">72.0%</w:t>
+            </w:r>
+          </w:p>
+        </w:tc>
+        <w:tc>
+          <w:tcPr>
+            <w:tcW w:type="dxa" w:w="1020"/>
+            <w:gridSpan w:val="1"/>
+            <w:tcBorders>
+              <w:top w:val="single" w:color="808080" w:sz="4"/>
+              <w:left w:val="single" w:color="808080" w:sz="4"/>
+              <w:bottom w:val="single" w:color="808080" w:sz="4"/>
+              <w:right w:val="single" w:color="808080" w:sz="4"/>
+            </w:tcBorders>
+            <w:tcMar>
+              <w:top w:type="dxa" w:w="10"/>
+              <w:left w:type="dxa" w:w="45"/>
+              <w:bottom w:type="dxa" w:w="10"/>
+              <w:right w:type="dxa" w:w="45"/>
+            </w:tcMar>
+            <w:vAlign w:val="center"/>
+          </w:tcPr>
+          <w:p>
+            <w:pPr>
+              <w:keepNext/>
+              <w:spacing w:after="0" w:before="0" w:line="240" w:lineRule="auto"/>
+              <w:jc w:val="center"/>
+              <w:rPr>
+                <w:b w:val="false"/>
+                <w:bCs w:val="false"/>
+                <w:sz w:val="18"/>
+                <w:szCs w:val="18"/>
+              </w:rPr>
+            </w:pPr>
+            <w:r>
+              <w:rPr>
+                <w:rFonts w:ascii="Times New Roman" w:cs="Times New Roman" w:eastAsia="Times New Roman" w:hAnsi="Times New Roman"/>
+                <w:b w:val="false"/>
+                <w:bCs w:val="false"/>
+                <w:sz w:val="18"/>
+                <w:szCs w:val="18"/>
+              </w:rPr>
+              <w:t xml:space="preserve">34 (50.7%)</w:t>
+            </w:r>
+          </w:p>
+        </w:tc>
+        <w:tc>
+          <w:tcPr>
+            <w:tcW w:type="dxa" w:w="840"/>
+            <w:gridSpan w:val="1"/>
+            <w:tcBorders>
+              <w:top w:val="single" w:color="808080" w:sz="4"/>
+              <w:left w:val="single" w:color="808080" w:sz="4"/>
+              <w:bottom w:val="single" w:color="808080" w:sz="4"/>
+              <w:right w:val="single" w:color="808080" w:sz="4"/>
+            </w:tcBorders>
+            <w:tcMar>
+              <w:top w:type="dxa" w:w="10"/>
+              <w:left w:type="dxa" w:w="45"/>
+              <w:bottom w:type="dxa" w:w="10"/>
+              <w:right w:type="dxa" w:w="45"/>
+            </w:tcMar>
+            <w:vAlign w:val="center"/>
+          </w:tcPr>
+          <w:p>
+            <w:pPr>
+              <w:keepNext/>
+              <w:spacing w:after="0" w:before="0" w:line="240" w:lineRule="auto"/>
+              <w:jc w:val="center"/>
+              <w:rPr>
+                <w:b w:val="false"/>
+                <w:bCs w:val="false"/>
+                <w:sz w:val="18"/>
+                <w:szCs w:val="18"/>
+              </w:rPr>
+            </w:pPr>
+            <w:r>
+              <w:rPr>
+                <w:rFonts w:ascii="Times New Roman" w:cs="Times New Roman" w:eastAsia="Times New Roman" w:hAnsi="Times New Roman"/>
+                <w:b w:val="false"/>
+                <w:bCs w:val="false"/>
+                <w:sz w:val="18"/>
+                <w:szCs w:val="18"/>
+              </w:rPr>
+              <w:t xml:space="preserve">40.3%</w:t>
+            </w:r>
+          </w:p>
+        </w:tc>
+      </w:tr>
+      <w:tr>
+        <w:trPr>
+          <w:cantSplit/>
+        </w:trPr>
+        <w:tc>
+          <w:tcPr>
+            <w:tcW w:type="dxa" w:w="1320"/>
+            <w:gridSpan w:val="1"/>
+            <w:tcBorders>
+              <w:top w:val="single" w:color="808080" w:sz="4"/>
+              <w:left w:val="single" w:color="808080" w:sz="4"/>
+              <w:bottom w:val="single" w:color="808080" w:sz="4"/>
+              <w:right w:val="single" w:color="808080" w:sz="4"/>
+            </w:tcBorders>
+            <w:tcMar>
+              <w:top w:type="dxa" w:w="10"/>
+              <w:left w:type="dxa" w:w="45"/>
+              <w:bottom w:type="dxa" w:w="10"/>
               <w:right w:type="dxa" w:w="45"/>
             </w:tcMar>
             <w:vAlign w:val="center"/>
@@ -6238,17 +7021,18 @@
         </w:tc>
         <w:tc>
           <w:tcPr>
-            <w:tcW w:type="dxa" w:w="1700"/>
-            <w:tcBorders>
-              <w:top w:val="single" w:color="808080" w:sz="4"/>
-              <w:left w:val="single" w:color="808080" w:sz="4"/>
-              <w:bottom w:val="single" w:color="808080" w:sz="4"/>
-              <w:right w:val="single" w:color="808080" w:sz="4"/>
-            </w:tcBorders>
-            <w:tcMar>
-              <w:top w:type="dxa" w:w="40"/>
-              <w:left w:type="dxa" w:w="45"/>
-              <w:bottom w:type="dxa" w:w="40"/>
+            <w:tcW w:type="dxa" w:w="1020"/>
+            <w:gridSpan w:val="1"/>
+            <w:tcBorders>
+              <w:top w:val="single" w:color="808080" w:sz="4"/>
+              <w:left w:val="single" w:color="808080" w:sz="4"/>
+              <w:bottom w:val="single" w:color="808080" w:sz="4"/>
+              <w:right w:val="single" w:color="808080" w:sz="4"/>
+            </w:tcBorders>
+            <w:tcMar>
+              <w:top w:type="dxa" w:w="10"/>
+              <w:left w:type="dxa" w:w="45"/>
+              <w:bottom w:type="dxa" w:w="10"/>
               <w:right w:type="dxa" w:w="45"/>
             </w:tcMar>
             <w:vAlign w:val="center"/>
@@ -6257,39 +7041,40 @@
             <w:pPr>
               <w:keepNext w:val="false"/>
               <w:spacing w:after="0" w:before="0" w:line="240" w:lineRule="auto"/>
-              <w:jc w:val="left"/>
-              <w:rPr>
-                <w:b w:val="false"/>
-                <w:bCs w:val="false"/>
-                <w:sz w:val="18"/>
-                <w:szCs w:val="18"/>
-              </w:rPr>
-            </w:pPr>
-            <w:r>
-              <w:rPr>
-                <w:rFonts w:ascii="Times New Roman" w:cs="Times New Roman" w:eastAsia="Times New Roman" w:hAnsi="Times New Roman"/>
-                <w:b w:val="false"/>
-                <w:bCs w:val="false"/>
-                <w:sz w:val="18"/>
-                <w:szCs w:val="18"/>
-              </w:rPr>
-              <w:t xml:space="preserve">14 (1.5%) unw.; 1.8% wtd</w:t>
-            </w:r>
-          </w:p>
-        </w:tc>
-        <w:tc>
-          <w:tcPr>
-            <w:tcW w:type="dxa" w:w="1700"/>
-            <w:tcBorders>
-              <w:top w:val="single" w:color="808080" w:sz="4"/>
-              <w:left w:val="single" w:color="808080" w:sz="4"/>
-              <w:bottom w:val="single" w:color="808080" w:sz="4"/>
-              <w:right w:val="single" w:color="808080" w:sz="4"/>
-            </w:tcBorders>
-            <w:tcMar>
-              <w:top w:type="dxa" w:w="40"/>
-              <w:left w:type="dxa" w:w="45"/>
-              <w:bottom w:type="dxa" w:w="40"/>
+              <w:jc w:val="center"/>
+              <w:rPr>
+                <w:b w:val="false"/>
+                <w:bCs w:val="false"/>
+                <w:sz w:val="18"/>
+                <w:szCs w:val="18"/>
+              </w:rPr>
+            </w:pPr>
+            <w:r>
+              <w:rPr>
+                <w:rFonts w:ascii="Times New Roman" w:cs="Times New Roman" w:eastAsia="Times New Roman" w:hAnsi="Times New Roman"/>
+                <w:b w:val="false"/>
+                <w:bCs w:val="false"/>
+                <w:sz w:val="18"/>
+                <w:szCs w:val="18"/>
+              </w:rPr>
+              <w:t xml:space="preserve">14 (1.5%)</w:t>
+            </w:r>
+          </w:p>
+        </w:tc>
+        <w:tc>
+          <w:tcPr>
+            <w:tcW w:type="dxa" w:w="840"/>
+            <w:gridSpan w:val="1"/>
+            <w:tcBorders>
+              <w:top w:val="single" w:color="808080" w:sz="4"/>
+              <w:left w:val="single" w:color="808080" w:sz="4"/>
+              <w:bottom w:val="single" w:color="808080" w:sz="4"/>
+              <w:right w:val="single" w:color="808080" w:sz="4"/>
+            </w:tcBorders>
+            <w:tcMar>
+              <w:top w:type="dxa" w:w="10"/>
+              <w:left w:type="dxa" w:w="45"/>
+              <w:bottom w:type="dxa" w:w="10"/>
               <w:right w:type="dxa" w:w="45"/>
             </w:tcMar>
             <w:vAlign w:val="center"/>
@@ -6298,23 +7083,107 @@
             <w:pPr>
               <w:keepNext w:val="false"/>
               <w:spacing w:after="0" w:before="0" w:line="240" w:lineRule="auto"/>
-              <w:jc w:val="left"/>
-              <w:rPr>
-                <w:b w:val="false"/>
-                <w:bCs w:val="false"/>
-                <w:sz w:val="18"/>
-                <w:szCs w:val="18"/>
-              </w:rPr>
-            </w:pPr>
-            <w:r>
-              <w:rPr>
-                <w:rFonts w:ascii="Times New Roman" w:cs="Times New Roman" w:eastAsia="Times New Roman" w:hAnsi="Times New Roman"/>
-                <w:b w:val="false"/>
-                <w:bCs w:val="false"/>
-                <w:sz w:val="18"/>
-                <w:szCs w:val="18"/>
-              </w:rPr>
-              <w:t xml:space="preserve">4 (6.0%) unw.; 7.2% wtd</w:t>
+              <w:jc w:val="center"/>
+              <w:rPr>
+                <w:b w:val="false"/>
+                <w:bCs w:val="false"/>
+                <w:sz w:val="18"/>
+                <w:szCs w:val="18"/>
+              </w:rPr>
+            </w:pPr>
+            <w:r>
+              <w:rPr>
+                <w:rFonts w:ascii="Times New Roman" w:cs="Times New Roman" w:eastAsia="Times New Roman" w:hAnsi="Times New Roman"/>
+                <w:b w:val="false"/>
+                <w:bCs w:val="false"/>
+                <w:sz w:val="18"/>
+                <w:szCs w:val="18"/>
+              </w:rPr>
+              <w:t xml:space="preserve">1.8%</w:t>
+            </w:r>
+          </w:p>
+        </w:tc>
+        <w:tc>
+          <w:tcPr>
+            <w:tcW w:type="dxa" w:w="1020"/>
+            <w:gridSpan w:val="1"/>
+            <w:tcBorders>
+              <w:top w:val="single" w:color="808080" w:sz="4"/>
+              <w:left w:val="single" w:color="808080" w:sz="4"/>
+              <w:bottom w:val="single" w:color="808080" w:sz="4"/>
+              <w:right w:val="single" w:color="808080" w:sz="4"/>
+            </w:tcBorders>
+            <w:tcMar>
+              <w:top w:type="dxa" w:w="10"/>
+              <w:left w:type="dxa" w:w="45"/>
+              <w:bottom w:type="dxa" w:w="10"/>
+              <w:right w:type="dxa" w:w="45"/>
+            </w:tcMar>
+            <w:vAlign w:val="center"/>
+          </w:tcPr>
+          <w:p>
+            <w:pPr>
+              <w:keepNext w:val="false"/>
+              <w:spacing w:after="0" w:before="0" w:line="240" w:lineRule="auto"/>
+              <w:jc w:val="center"/>
+              <w:rPr>
+                <w:b w:val="false"/>
+                <w:bCs w:val="false"/>
+                <w:sz w:val="18"/>
+                <w:szCs w:val="18"/>
+              </w:rPr>
+            </w:pPr>
+            <w:r>
+              <w:rPr>
+                <w:rFonts w:ascii="Times New Roman" w:cs="Times New Roman" w:eastAsia="Times New Roman" w:hAnsi="Times New Roman"/>
+                <w:b w:val="false"/>
+                <w:bCs w:val="false"/>
+                <w:sz w:val="18"/>
+                <w:szCs w:val="18"/>
+              </w:rPr>
+              <w:t xml:space="preserve">4 (6.0%)</w:t>
+            </w:r>
+          </w:p>
+        </w:tc>
+        <w:tc>
+          <w:tcPr>
+            <w:tcW w:type="dxa" w:w="840"/>
+            <w:gridSpan w:val="1"/>
+            <w:tcBorders>
+              <w:top w:val="single" w:color="808080" w:sz="4"/>
+              <w:left w:val="single" w:color="808080" w:sz="4"/>
+              <w:bottom w:val="single" w:color="808080" w:sz="4"/>
+              <w:right w:val="single" w:color="808080" w:sz="4"/>
+            </w:tcBorders>
+            <w:tcMar>
+              <w:top w:type="dxa" w:w="10"/>
+              <w:left w:type="dxa" w:w="45"/>
+              <w:bottom w:type="dxa" w:w="10"/>
+              <w:right w:type="dxa" w:w="45"/>
+            </w:tcMar>
+            <w:vAlign w:val="center"/>
+          </w:tcPr>
+          <w:p>
+            <w:pPr>
+              <w:keepNext w:val="false"/>
+              <w:spacing w:after="0" w:before="0" w:line="240" w:lineRule="auto"/>
+              <w:jc w:val="center"/>
+              <w:rPr>
+                <w:b w:val="false"/>
+                <w:bCs w:val="false"/>
+                <w:sz w:val="18"/>
+                <w:szCs w:val="18"/>
+              </w:rPr>
+            </w:pPr>
+            <w:r>
+              <w:rPr>
+                <w:rFonts w:ascii="Times New Roman" w:cs="Times New Roman" w:eastAsia="Times New Roman" w:hAnsi="Times New Roman"/>
+                <w:b w:val="false"/>
+                <w:bCs w:val="false"/>
+                <w:sz w:val="18"/>
+                <w:szCs w:val="18"/>
+              </w:rPr>
+              <w:t xml:space="preserve">7.2%</w:t>
             </w:r>
           </w:p>
         </w:tc>
@@ -6339,7 +7208,7 @@
           <w:sz w:val="16"/>
           <w:szCs w:val="16"/>
         </w:rPr>
-        <w:t xml:space="preserve">unw. is the unweighted count and percentage, or the unweighted mean age. wtd is the person-weighted percentage or mean. Missing predictors remain in the denominators. Supplementary Table S4 prints the unweighted and weighted values in separate columns. These summaries have no uncertainty intervals.</w:t>
+        <w:t xml:space="preserve">Unweighted cells show n (%) and weighted cells person-weighted percentages; age cells show means in completed years. N = 946 and N = 67 are sample sizes. Missing predictors remain in denominators. Values precede imputation; no uncertainty intervals were calculated. Supplementary Table S4 repeats these values.</w:t>
       </w:r>
     </w:p>
     <w:p>
@@ -15589,7 +16458,7 @@
           <w:sz w:val="20"/>
           <w:szCs w:val="20"/>
         </w:rPr>
-        <w:t xml:space="preserve">Screened non-receipt was 6.6% unweighted and 7.5% person-weighted; alternatives gave 7.1%–9.1%. Five predictor groups/six slopes gave AUC 0.752, AP 0.203 and Brier 0.0578. Shared rules make screening, receipt and prediction inspectable. Future work should independently validate the frozen model before updating it and test intended users’ task success, errors, time and perceived ease. Legal entitlement, causal explanations, human usability and external predictive validity remain unestablished.</w:t>
+        <w:t xml:space="preserve">Screened non-receipt was 6.6% unweighted and 7.5% person-weighted; alternatives gave 7.1%–9.1%. Five predictor groups/six slopes gave AUC 0.752, AP 0.203 and Brier 0.0578. The principal contribution is a reproducible, interpretable workflow linking observable screening, person-weighted description and exploratory prediction. Future work should independently validate the frozen model before updating it and test intended users’ task success, errors, time and perceived ease. Legal entitlement, causal explanations, human usability and external predictive validity remain unestablished.</w:t>
       </w:r>
     </w:p>
     <w:p>
@@ -16395,7 +17264,7 @@
           <w:sz w:val="16"/>
           <w:szCs w:val="16"/>
         </w:rPr>
-        <w:t xml:space="preserve">[24] Dept. of Social Development, “Increase in respect of social grants,” Government Notice 211, Government Gazette 37474, Mar. 28, 2014.</w:t>
+        <w:t xml:space="preserve">[24] Dept. of Social Development, “Increase in respect of social grants,” Government Notice 211, Government Gazette 37474, p. 3, Mar. 28, 2014.</w:t>
       </w:r>
     </w:p>
     <w:p>
@@ -16411,7 +17280,7 @@
           <w:sz w:val="16"/>
           <w:szCs w:val="16"/>
         </w:rPr>
-        <w:t xml:space="preserve">[25] Dept. of Social Development, “Increase in respect of social grants,” Government Notice 277, Government Gazette 38647, Mar. 30, 2015.</w:t>
+        <w:t xml:space="preserve">[25] Dept. of Social Development, “Increase in respect of social grants,” Government Notice 277, Government Gazette 38647, p. 3, Mar. 30, 2015.</w:t>
       </w:r>
     </w:p>
     <w:p>

</xml_diff>

<commit_message>
Include the complete S5 search record in the final eight-page paper
Display all eight exact historical queries, the search date and source-specific counts directly in the main Word/PDF. Use a full-width record and natural IEEE column flow to preserve the eight-page limit without cutting unrelated prose or changing results, existing tables, figures or references. Refresh final submission files, build instructions and exact inclusion checks.
</commit_message>
<xml_diff>
--- a/paper/Jawe_OPG_nonreceipt_KZN.docx
+++ b/paper/Jawe_OPG_nonreceipt_KZN.docx
@@ -301,8 +301,478 @@
           <w:sz w:val="20"/>
           <w:szCs w:val="20"/>
         </w:rPr>
-        <w:t xml:space="preserve">The searches identified 511 records. Removing 136 duplicates left 375 records for title and abstract screening; 222 were excluded. Full-text assessment of the remaining 153 records excluded 98 and retained 55 sources across grants and populations. Supplementary Table S5 provides the eight recorded search strings, search date and source-specific counts. The synthesis compared programme, setting, unit of analysis, outcome definition, findings and limitations; these differences prevented a pooled estimate.</w:t>
-      </w:r>
+        <w:t xml:space="preserve">The searches identified 511 records. Removing 136 duplicates left 375 records for title and abstract screening; 222 were excluded. Full-text assessment of the remaining 153 records excluded 98 and retained 55 sources across grants and populations. Table S5 lists the eight recorded search strings, search date and source-specific counts. The synthesis compared programme, setting, unit of analysis, outcome definition, findings and limitations; these differences prevented a pooled estimate.</w:t>
+      </w:r>
+    </w:p>
+    <w:p>
+      <w:pPr>
+        <w:sectPr>
+          <w:type w:val="continuous"/>
+          <w:pgSz w:w="12240" w:h="15840" w:orient="portrait"/>
+          <w:pgMar w:top="1080" w:right="900" w:bottom="1440" w:left="900" w:header="708" w:footer="708" w:gutter="0"/>
+          <w:pgNumType/>
+          <w:cols w:space="360" w:num="2" w:equalWidth="true"/>
+          <w:docGrid w:linePitch="360"/>
+        </w:sectPr>
+      </w:pPr>
+    </w:p>
+    <w:p>
+      <w:pPr>
+        <w:keepNext/>
+        <w:spacing w:after="40" w:before="80" w:line="240" w:lineRule="auto"/>
+        <w:jc w:val="center"/>
+        <w:rPr>
+          <w:i/>
+          <w:iCs/>
+          <w:sz w:val="16"/>
+          <w:szCs w:val="16"/>
+        </w:rPr>
+      </w:pPr>
+      <w:r>
+        <w:rPr>
+          <w:rFonts w:ascii="Times New Roman" w:cs="Times New Roman" w:eastAsia="Times New Roman" w:hAnsi="Times New Roman"/>
+          <w:i/>
+          <w:iCs/>
+          <w:sz w:val="16"/>
+          <w:szCs w:val="16"/>
+        </w:rPr>
+        <w:t xml:space="preserve">Table S5. Recorded literature searches (17 August 2026)</w:t>
+      </w:r>
+    </w:p>
+    <w:tbl>
+      <w:tblPr>
+        <w:tblW w:type="dxa" w:w="10440"/>
+        <w:tblBorders>
+          <w:top w:val="single" w:color="auto" w:sz="4"/>
+          <w:left w:val="single" w:color="auto" w:sz="4"/>
+          <w:bottom w:val="single" w:color="auto" w:sz="4"/>
+          <w:right w:val="single" w:color="auto" w:sz="4"/>
+          <w:insideH w:val="single" w:color="auto" w:sz="4"/>
+          <w:insideV w:val="single" w:color="auto" w:sz="4"/>
+        </w:tblBorders>
+        <w:tblLayout w:type="fixed"/>
+      </w:tblPr>
+      <w:tblGrid>
+        <w:gridCol w:w="10440"/>
+      </w:tblGrid>
+      <w:tr>
+        <w:trPr>
+          <w:cantSplit/>
+        </w:trPr>
+        <w:tc>
+          <w:tcPr>
+            <w:tcW w:type="dxa" w:w="10440"/>
+            <w:tcBorders>
+              <w:top w:val="single" w:color="808080" w:sz="4"/>
+              <w:left w:val="none" w:color="000000" w:sz="0"/>
+              <w:bottom w:val="none" w:color="000000" w:sz="0"/>
+              <w:right w:val="none" w:color="000000" w:sz="0"/>
+            </w:tcBorders>
+            <w:tcMar>
+              <w:top w:type="dxa" w:w="0"/>
+              <w:left w:type="dxa" w:w="45"/>
+              <w:bottom w:type="dxa" w:w="0"/>
+              <w:right w:type="dxa" w:w="45"/>
+            </w:tcMar>
+            <w:vAlign w:val="top"/>
+          </w:tcPr>
+          <w:p>
+            <w:pPr>
+              <w:keepNext/>
+              <w:spacing w:after="0" w:before="0" w:line="240" w:lineRule="auto"/>
+              <w:jc w:val="left"/>
+            </w:pPr>
+            <w:r>
+              <w:rPr>
+                <w:rFonts w:ascii="Times New Roman" w:cs="Times New Roman" w:eastAsia="Times New Roman" w:hAnsi="Times New Roman"/>
+                <w:b/>
+                <w:bCs/>
+                <w:sz w:val="16"/>
+                <w:szCs w:val="16"/>
+              </w:rPr>
+              <w:t xml:space="preserve">S1 — Scopus (43 hits; 9 retained): </w:t>
+            </w:r>
+            <w:r>
+              <w:rPr>
+                <w:rFonts w:ascii="Times New Roman" w:cs="Times New Roman" w:eastAsia="Times New Roman" w:hAnsi="Times New Roman"/>
+                <w:sz w:val="16"/>
+                <w:szCs w:val="16"/>
+              </w:rPr>
+              <w:t xml:space="preserve">TITLE-ABS-KEY(("social grant*" OR "social assistance" OR "cash transfer*" OR "social protection") AND (exclusion OR "non-take-up" OR "take-up" OR "coverage gap*" OR "targeting error*" OR "access barrier*") AND ("South Africa*" OR "KwaZulu-Natal"))</w:t>
+            </w:r>
+          </w:p>
+        </w:tc>
+      </w:tr>
+      <w:tr>
+        <w:trPr>
+          <w:cantSplit/>
+        </w:trPr>
+        <w:tc>
+          <w:tcPr>
+            <w:tcW w:type="dxa" w:w="10440"/>
+            <w:tcBorders>
+              <w:top w:val="none" w:color="000000" w:sz="0"/>
+              <w:left w:val="none" w:color="000000" w:sz="0"/>
+              <w:bottom w:val="none" w:color="000000" w:sz="0"/>
+              <w:right w:val="none" w:color="000000" w:sz="0"/>
+            </w:tcBorders>
+            <w:tcMar>
+              <w:top w:type="dxa" w:w="0"/>
+              <w:left w:type="dxa" w:w="45"/>
+              <w:bottom w:type="dxa" w:w="0"/>
+              <w:right w:type="dxa" w:w="45"/>
+            </w:tcMar>
+            <w:vAlign w:val="top"/>
+          </w:tcPr>
+          <w:p>
+            <w:pPr>
+              <w:keepNext/>
+              <w:spacing w:after="0" w:before="0" w:line="240" w:lineRule="auto"/>
+              <w:jc w:val="left"/>
+            </w:pPr>
+            <w:r>
+              <w:rPr>
+                <w:rFonts w:ascii="Times New Roman" w:cs="Times New Roman" w:eastAsia="Times New Roman" w:hAnsi="Times New Roman"/>
+                <w:b/>
+                <w:bCs/>
+                <w:sz w:val="16"/>
+                <w:szCs w:val="16"/>
+              </w:rPr>
+              <w:t xml:space="preserve">S1b — Scopus, widened (149 hits; 10 retained): </w:t>
+            </w:r>
+            <w:r>
+              <w:rPr>
+                <w:rFonts w:ascii="Times New Roman" w:cs="Times New Roman" w:eastAsia="Times New Roman" w:hAnsi="Times New Roman"/>
+                <w:sz w:val="16"/>
+                <w:szCs w:val="16"/>
+              </w:rPr>
+              <w:t xml:space="preserve">TITLE-ABS-KEY(("social grant*" OR "social assistance" OR "cash transfer*" OR "social protection" OR "social security" OR SASSA OR "child support grant" OR "social relief of distress" OR SRD) AND (exclusion OR exclud* OR "non-take-up" OR "take-up" OR uptake OR "coverage gap*" OR "targeting error*" OR "access barrier*" OR "non-receipt" OR eligib*) AND ("South Africa*" OR "KwaZulu-Natal"))</w:t>
+            </w:r>
+          </w:p>
+        </w:tc>
+      </w:tr>
+      <w:tr>
+        <w:trPr>
+          <w:cantSplit/>
+        </w:trPr>
+        <w:tc>
+          <w:tcPr>
+            <w:tcW w:type="dxa" w:w="10440"/>
+            <w:tcBorders>
+              <w:top w:val="none" w:color="000000" w:sz="0"/>
+              <w:left w:val="none" w:color="000000" w:sz="0"/>
+              <w:bottom w:val="none" w:color="000000" w:sz="0"/>
+              <w:right w:val="none" w:color="000000" w:sz="0"/>
+            </w:tcBorders>
+            <w:tcMar>
+              <w:top w:type="dxa" w:w="0"/>
+              <w:left w:type="dxa" w:w="45"/>
+              <w:bottom w:type="dxa" w:w="0"/>
+              <w:right w:type="dxa" w:w="45"/>
+            </w:tcMar>
+            <w:vAlign w:val="top"/>
+          </w:tcPr>
+          <w:p>
+            <w:pPr>
+              <w:keepNext/>
+              <w:spacing w:after="0" w:before="0" w:line="240" w:lineRule="auto"/>
+              <w:jc w:val="left"/>
+            </w:pPr>
+            <w:r>
+              <w:rPr>
+                <w:rFonts w:ascii="Times New Roman" w:cs="Times New Roman" w:eastAsia="Times New Roman" w:hAnsi="Times New Roman"/>
+                <w:b/>
+                <w:bCs/>
+                <w:sz w:val="16"/>
+                <w:szCs w:val="16"/>
+              </w:rPr>
+              <w:t xml:space="preserve">S2 — Scopus, method (100 hits; 11 retained): </w:t>
+            </w:r>
+            <w:r>
+              <w:rPr>
+                <w:rFonts w:ascii="Times New Roman" w:cs="Times New Roman" w:eastAsia="Times New Roman" w:hAnsi="Times New Roman"/>
+                <w:sz w:val="16"/>
+                <w:szCs w:val="16"/>
+              </w:rPr>
+              <w:t xml:space="preserve">TITLE-ABS-KEY(("machine learning" OR "random forest" OR XGBoost OR "gradient boosting" OR "proxy means test*" OR "predictive model*") AND (poverty OR "social protection" OR "social assistance" OR "cash transfer*" OR "food insecur*") AND ("household survey" OR "survey data" OR "household data")) AND NOT TITLE-ABS-KEY(cancer OR tumour OR HIV OR malaria OR clinical OR patient*)</w:t>
+            </w:r>
+          </w:p>
+        </w:tc>
+      </w:tr>
+      <w:tr>
+        <w:trPr>
+          <w:cantSplit/>
+        </w:trPr>
+        <w:tc>
+          <w:tcPr>
+            <w:tcW w:type="dxa" w:w="10440"/>
+            <w:tcBorders>
+              <w:top w:val="none" w:color="000000" w:sz="0"/>
+              <w:left w:val="none" w:color="000000" w:sz="0"/>
+              <w:bottom w:val="none" w:color="000000" w:sz="0"/>
+              <w:right w:val="none" w:color="000000" w:sz="0"/>
+            </w:tcBorders>
+            <w:tcMar>
+              <w:top w:type="dxa" w:w="0"/>
+              <w:left w:type="dxa" w:w="45"/>
+              <w:bottom w:type="dxa" w:w="0"/>
+              <w:right w:type="dxa" w:w="45"/>
+            </w:tcMar>
+            <w:vAlign w:val="top"/>
+          </w:tcPr>
+          <w:p>
+            <w:pPr>
+              <w:keepNext/>
+              <w:spacing w:after="0" w:before="0" w:line="240" w:lineRule="auto"/>
+              <w:jc w:val="left"/>
+            </w:pPr>
+            <w:r>
+              <w:rPr>
+                <w:rFonts w:ascii="Times New Roman" w:cs="Times New Roman" w:eastAsia="Times New Roman" w:hAnsi="Times New Roman"/>
+                <w:b/>
+                <w:bCs/>
+                <w:sz w:val="16"/>
+                <w:szCs w:val="16"/>
+              </w:rPr>
+              <w:t xml:space="preserve">S3 — Dimensions (36 hits; 5 retained): </w:t>
+            </w:r>
+            <w:r>
+              <w:rPr>
+                <w:rFonts w:ascii="Times New Roman" w:cs="Times New Roman" w:eastAsia="Times New Roman" w:hAnsi="Times New Roman"/>
+                <w:sz w:val="16"/>
+                <w:szCs w:val="16"/>
+              </w:rPr>
+              <w:t xml:space="preserve">("social grant" OR "social assistance" OR "cash transfer" OR "social protection") AND (exclusion OR "take-up" OR "non-receipt" OR "access barriers") AND ("South Africa" OR "KwaZulu-Natal")</w:t>
+            </w:r>
+          </w:p>
+        </w:tc>
+      </w:tr>
+      <w:tr>
+        <w:trPr>
+          <w:cantSplit/>
+        </w:trPr>
+        <w:tc>
+          <w:tcPr>
+            <w:tcW w:type="dxa" w:w="10440"/>
+            <w:tcBorders>
+              <w:top w:val="none" w:color="000000" w:sz="0"/>
+              <w:left w:val="none" w:color="000000" w:sz="0"/>
+              <w:bottom w:val="none" w:color="000000" w:sz="0"/>
+              <w:right w:val="none" w:color="000000" w:sz="0"/>
+            </w:tcBorders>
+            <w:tcMar>
+              <w:top w:type="dxa" w:w="0"/>
+              <w:left w:type="dxa" w:w="45"/>
+              <w:bottom w:type="dxa" w:w="0"/>
+              <w:right w:type="dxa" w:w="45"/>
+            </w:tcMar>
+            <w:vAlign w:val="top"/>
+          </w:tcPr>
+          <w:p>
+            <w:pPr>
+              <w:keepNext/>
+              <w:spacing w:after="0" w:before="0" w:line="240" w:lineRule="auto"/>
+              <w:jc w:val="left"/>
+            </w:pPr>
+            <w:r>
+              <w:rPr>
+                <w:rFonts w:ascii="Times New Roman" w:cs="Times New Roman" w:eastAsia="Times New Roman" w:hAnsi="Times New Roman"/>
+                <w:b/>
+                <w:bCs/>
+                <w:sz w:val="16"/>
+                <w:szCs w:val="16"/>
+              </w:rPr>
+              <w:t xml:space="preserve">S4 — IEEE Xplore (47 hits; 0 retained): </w:t>
+            </w:r>
+            <w:r>
+              <w:rPr>
+                <w:rFonts w:ascii="Times New Roman" w:cs="Times New Roman" w:eastAsia="Times New Roman" w:hAnsi="Times New Roman"/>
+                <w:sz w:val="16"/>
+                <w:szCs w:val="16"/>
+              </w:rPr>
+              <w:t xml:space="preserve">("machine learning" OR "classification") AND ("poverty" OR "social welfare" OR "socioeconomic") AND ("survey data")</w:t>
+            </w:r>
+          </w:p>
+        </w:tc>
+      </w:tr>
+      <w:tr>
+        <w:trPr>
+          <w:cantSplit/>
+        </w:trPr>
+        <w:tc>
+          <w:tcPr>
+            <w:tcW w:type="dxa" w:w="10440"/>
+            <w:tcBorders>
+              <w:top w:val="none" w:color="000000" w:sz="0"/>
+              <w:left w:val="none" w:color="000000" w:sz="0"/>
+              <w:bottom w:val="none" w:color="000000" w:sz="0"/>
+              <w:right w:val="none" w:color="000000" w:sz="0"/>
+            </w:tcBorders>
+            <w:tcMar>
+              <w:top w:type="dxa" w:w="0"/>
+              <w:left w:type="dxa" w:w="45"/>
+              <w:bottom w:type="dxa" w:w="0"/>
+              <w:right w:type="dxa" w:w="45"/>
+            </w:tcMar>
+            <w:vAlign w:val="top"/>
+          </w:tcPr>
+          <w:p>
+            <w:pPr>
+              <w:keepNext/>
+              <w:spacing w:after="0" w:before="0" w:line="240" w:lineRule="auto"/>
+              <w:jc w:val="left"/>
+            </w:pPr>
+            <w:r>
+              <w:rPr>
+                <w:rFonts w:ascii="Times New Roman" w:cs="Times New Roman" w:eastAsia="Times New Roman" w:hAnsi="Times New Roman"/>
+                <w:b/>
+                <w:bCs/>
+                <w:sz w:val="16"/>
+                <w:szCs w:val="16"/>
+              </w:rPr>
+              <w:t xml:space="preserve">S5 — SABINET/AJOL (100 hits; 9 retained): </w:t>
+            </w:r>
+            <w:r>
+              <w:rPr>
+                <w:rFonts w:ascii="Times New Roman" w:cs="Times New Roman" w:eastAsia="Times New Roman" w:hAnsi="Times New Roman"/>
+                <w:sz w:val="16"/>
+                <w:szCs w:val="16"/>
+              </w:rPr>
+              <w:t xml:space="preserve">social grant AND exclusion AND (KwaZulu-Natal OR "South Africa")</w:t>
+            </w:r>
+          </w:p>
+        </w:tc>
+      </w:tr>
+      <w:tr>
+        <w:trPr>
+          <w:cantSplit/>
+        </w:trPr>
+        <w:tc>
+          <w:tcPr>
+            <w:tcW w:type="dxa" w:w="10440"/>
+            <w:tcBorders>
+              <w:top w:val="none" w:color="000000" w:sz="0"/>
+              <w:left w:val="none" w:color="000000" w:sz="0"/>
+              <w:bottom w:val="none" w:color="000000" w:sz="0"/>
+              <w:right w:val="none" w:color="000000" w:sz="0"/>
+            </w:tcBorders>
+            <w:tcMar>
+              <w:top w:type="dxa" w:w="0"/>
+              <w:left w:type="dxa" w:w="45"/>
+              <w:bottom w:type="dxa" w:w="0"/>
+              <w:right w:type="dxa" w:w="45"/>
+            </w:tcMar>
+            <w:vAlign w:val="top"/>
+          </w:tcPr>
+          <w:p>
+            <w:pPr>
+              <w:keepNext/>
+              <w:spacing w:after="0" w:before="0" w:line="240" w:lineRule="auto"/>
+              <w:jc w:val="left"/>
+            </w:pPr>
+            <w:r>
+              <w:rPr>
+                <w:rFonts w:ascii="Times New Roman" w:cs="Times New Roman" w:eastAsia="Times New Roman" w:hAnsi="Times New Roman"/>
+                <w:b/>
+                <w:bCs/>
+                <w:sz w:val="16"/>
+                <w:szCs w:val="16"/>
+              </w:rPr>
+              <w:t xml:space="preserve">S6 — Google Scholar (35 hits; 11 retained): </w:t>
+            </w:r>
+            <w:r>
+              <w:rPr>
+                <w:rFonts w:ascii="Times New Roman" w:cs="Times New Roman" w:eastAsia="Times New Roman" w:hAnsi="Times New Roman"/>
+                <w:sz w:val="16"/>
+                <w:szCs w:val="16"/>
+              </w:rPr>
+              <w:t xml:space="preserve">"social grant" exclusion "South Africa" -site:pinterest.com</w:t>
+            </w:r>
+          </w:p>
+        </w:tc>
+      </w:tr>
+      <w:tr>
+        <w:trPr>
+          <w:cantSplit/>
+        </w:trPr>
+        <w:tc>
+          <w:tcPr>
+            <w:tcW w:type="dxa" w:w="10440"/>
+            <w:tcBorders>
+              <w:top w:val="none" w:color="000000" w:sz="0"/>
+              <w:left w:val="none" w:color="000000" w:sz="0"/>
+              <w:bottom w:val="single" w:color="808080" w:sz="4"/>
+              <w:right w:val="none" w:color="000000" w:sz="0"/>
+            </w:tcBorders>
+            <w:tcMar>
+              <w:top w:type="dxa" w:w="0"/>
+              <w:left w:type="dxa" w:w="45"/>
+              <w:bottom w:type="dxa" w:w="0"/>
+              <w:right w:type="dxa" w:w="45"/>
+            </w:tcMar>
+            <w:vAlign w:val="top"/>
+          </w:tcPr>
+          <w:p>
+            <w:pPr>
+              <w:keepNext w:val="false"/>
+              <w:spacing w:after="0" w:before="0" w:line="240" w:lineRule="auto"/>
+              <w:jc w:val="left"/>
+            </w:pPr>
+            <w:r>
+              <w:rPr>
+                <w:rFonts w:ascii="Times New Roman" w:cs="Times New Roman" w:eastAsia="Times New Roman" w:hAnsi="Times New Roman"/>
+                <w:b/>
+                <w:bCs/>
+                <w:sz w:val="16"/>
+                <w:szCs w:val="16"/>
+              </w:rPr>
+              <w:t xml:space="preserve">S7 — DataFirst/Stats SA (1 hits; 0 retained): </w:t>
+            </w:r>
+            <w:r>
+              <w:rPr>
+                <w:rFonts w:ascii="Times New Roman" w:cs="Times New Roman" w:eastAsia="Times New Roman" w:hAnsi="Times New Roman"/>
+                <w:sz w:val="16"/>
+                <w:szCs w:val="16"/>
+              </w:rPr>
+              <w:t xml:space="preserve">Living Conditions Survey 2014/2015 metadata KwaZulu-Natal</w:t>
+            </w:r>
+          </w:p>
+        </w:tc>
+      </w:tr>
+    </w:tbl>
+    <w:p>
+      <w:pPr>
+        <w:spacing w:after="0" w:before="0" w:line="240" w:lineRule="auto"/>
+        <w:jc w:val="both"/>
+        <w:rPr>
+          <w:i/>
+          <w:iCs/>
+          <w:sz w:val="16"/>
+          <w:szCs w:val="16"/>
+        </w:rPr>
+      </w:pPr>
+      <w:r>
+        <w:rPr>
+          <w:rFonts w:ascii="Times New Roman" w:cs="Times New Roman" w:eastAsia="Times New Roman" w:hAnsi="Times New Roman"/>
+          <w:i/>
+          <w:iCs/>
+          <w:sz w:val="16"/>
+          <w:szCs w:val="16"/>
+        </w:rPr>
+        <w:t xml:space="preserve">Counts refer to the recorded searches. Repeated retained sources are assigned to their first search; search and scenario IDs differ.</w:t>
+      </w:r>
+    </w:p>
+    <w:p>
+      <w:pPr>
+        <w:sectPr>
+          <w:type w:val="continuous"/>
+          <w:pgSz w:w="12240" w:h="15840" w:orient="portrait"/>
+          <w:pgMar w:top="1080" w:right="900" w:bottom="1440" w:left="900" w:header="708" w:footer="708" w:gutter="0"/>
+          <w:pgNumType/>
+          <w:cols w:space="360" w:num="1" w:equalWidth="true"/>
+          <w:docGrid w:linePitch="360"/>
+        </w:sectPr>
+      </w:pPr>
     </w:p>
     <w:p>
       <w:pPr>

</xml_diff>